<commit_message>
Starting developer documentation chapter in documentation.
</commit_message>
<xml_diff>
--- a/Documentation.docx
+++ b/Documentation.docx
@@ -104,23 +104,7 @@
                       <w:b/>
                       <w:bCs/>
                     </w:rPr>
-                    <w:t xml:space="preserve">Dr. </w:t>
-                  </w:r>
-                  <w:proofErr w:type="spellStart"/>
-                  <w:r>
-                    <w:rPr>
-                      <w:b/>
-                      <w:bCs/>
-                    </w:rPr>
-                    <w:t>Lócsi</w:t>
-                  </w:r>
-                  <w:proofErr w:type="spellEnd"/>
-                  <w:r>
-                    <w:rPr>
-                      <w:b/>
-                      <w:bCs/>
-                    </w:rPr>
-                    <w:t xml:space="preserve"> Levente</w:t>
+                    <w:t>Dr. Lócsi Levente</w:t>
                   </w:r>
                 </w:p>
                 <w:p>
@@ -165,13 +149,8 @@
                     <w:jc w:val="left"/>
                   </w:pPr>
                   <w:r>
-                    <w:t xml:space="preserve">programtervező informatikus </w:t>
+                    <w:t>programtervező informatikus BSc</w:t>
                   </w:r>
-                  <w:proofErr w:type="spellStart"/>
-                  <w:r>
-                    <w:t>BSc</w:t>
-                  </w:r>
-                  <w:proofErr w:type="spellEnd"/>
                 </w:p>
               </w:tc>
             </w:tr>
@@ -197,11 +176,196 @@
         </w:tc>
       </w:tr>
     </w:tbl>
-    <w:p>
-      <w:pPr>
-        <w:ind w:firstLine="0"/>
-      </w:pPr>
-    </w:p>
+    <w:bookmarkStart w:id="0" w:name="_Toc218192517" w:displacedByCustomXml="next"/>
+    <w:sdt>
+      <w:sdtPr>
+        <w:id w:val="-388042899"/>
+        <w:docPartObj>
+          <w:docPartGallery w:val="Table of Contents"/>
+          <w:docPartUnique/>
+        </w:docPartObj>
+      </w:sdtPr>
+      <w:sdtEndPr>
+        <w:rPr>
+          <w:rFonts w:eastAsiaTheme="minorHAnsi" w:cstheme="minorBidi"/>
+          <w:b/>
+          <w:bCs/>
+          <w:sz w:val="24"/>
+          <w:szCs w:val="22"/>
+        </w:rPr>
+      </w:sdtEndPr>
+      <w:sdtContent>
+        <w:p>
+          <w:pPr>
+            <w:pStyle w:val="Cmsor1"/>
+          </w:pPr>
+          <w:r>
+            <w:t>Tartalomjegyzék</w:t>
+          </w:r>
+          <w:bookmarkEnd w:id="0"/>
+        </w:p>
+        <w:p>
+          <w:pPr>
+            <w:pStyle w:val="TJ1"/>
+            <w:tabs>
+              <w:tab w:val="right" w:leader="dot" w:pos="9062"/>
+            </w:tabs>
+            <w:rPr>
+              <w:rFonts w:asciiTheme="minorHAnsi" w:eastAsiaTheme="minorEastAsia" w:hAnsiTheme="minorHAnsi"/>
+              <w:noProof/>
+              <w:szCs w:val="24"/>
+              <w:lang w:eastAsia="hu-HU"/>
+            </w:rPr>
+          </w:pPr>
+          <w:r>
+            <w:fldChar w:fldCharType="begin"/>
+          </w:r>
+          <w:r>
+            <w:instrText xml:space="preserve"> TOC \o "1-3" \h \z \u </w:instrText>
+          </w:r>
+          <w:r>
+            <w:fldChar w:fldCharType="separate"/>
+          </w:r>
+          <w:hyperlink w:anchor="_Toc218192517" w:history="1">
+            <w:r>
+              <w:rPr>
+                <w:rStyle w:val="Hiperhivatkozs"/>
+                <w:noProof/>
+              </w:rPr>
+              <w:t>Tartalomjegyzék</w:t>
+            </w:r>
+            <w:r>
+              <w:rPr>
+                <w:noProof/>
+                <w:webHidden/>
+              </w:rPr>
+              <w:tab/>
+            </w:r>
+            <w:r>
+              <w:rPr>
+                <w:noProof/>
+                <w:webHidden/>
+              </w:rPr>
+              <w:fldChar w:fldCharType="begin"/>
+            </w:r>
+            <w:r>
+              <w:rPr>
+                <w:noProof/>
+                <w:webHidden/>
+              </w:rPr>
+              <w:instrText xml:space="preserve"> PAGEREF _Toc218192517 \h </w:instrText>
+            </w:r>
+            <w:r>
+              <w:rPr>
+                <w:noProof/>
+                <w:webHidden/>
+              </w:rPr>
+            </w:r>
+            <w:r>
+              <w:rPr>
+                <w:noProof/>
+                <w:webHidden/>
+              </w:rPr>
+              <w:fldChar w:fldCharType="separate"/>
+            </w:r>
+            <w:r>
+              <w:rPr>
+                <w:noProof/>
+                <w:webHidden/>
+              </w:rPr>
+              <w:t>2</w:t>
+            </w:r>
+            <w:r>
+              <w:rPr>
+                <w:noProof/>
+                <w:webHidden/>
+              </w:rPr>
+              <w:fldChar w:fldCharType="end"/>
+            </w:r>
+          </w:hyperlink>
+        </w:p>
+        <w:p>
+          <w:pPr>
+            <w:pStyle w:val="TJ1"/>
+            <w:tabs>
+              <w:tab w:val="right" w:leader="dot" w:pos="9062"/>
+            </w:tabs>
+            <w:rPr>
+              <w:rFonts w:asciiTheme="minorHAnsi" w:eastAsiaTheme="minorEastAsia" w:hAnsiTheme="minorHAnsi"/>
+              <w:noProof/>
+              <w:szCs w:val="24"/>
+              <w:lang w:eastAsia="hu-HU"/>
+            </w:rPr>
+          </w:pPr>
+          <w:hyperlink w:anchor="_Toc218192518" w:history="1">
+            <w:r>
+              <w:rPr>
+                <w:rStyle w:val="Hiperhivatkozs"/>
+                <w:noProof/>
+              </w:rPr>
+              <w:t>Bevezető</w:t>
+            </w:r>
+            <w:r>
+              <w:rPr>
+                <w:noProof/>
+                <w:webHidden/>
+              </w:rPr>
+              <w:tab/>
+            </w:r>
+            <w:r>
+              <w:rPr>
+                <w:noProof/>
+                <w:webHidden/>
+              </w:rPr>
+              <w:fldChar w:fldCharType="begin"/>
+            </w:r>
+            <w:r>
+              <w:rPr>
+                <w:noProof/>
+                <w:webHidden/>
+              </w:rPr>
+              <w:instrText xml:space="preserve"> PAGEREF _Toc218192518 \h </w:instrText>
+            </w:r>
+            <w:r>
+              <w:rPr>
+                <w:noProof/>
+                <w:webHidden/>
+              </w:rPr>
+            </w:r>
+            <w:r>
+              <w:rPr>
+                <w:noProof/>
+                <w:webHidden/>
+              </w:rPr>
+              <w:fldChar w:fldCharType="separate"/>
+            </w:r>
+            <w:r>
+              <w:rPr>
+                <w:noProof/>
+                <w:webHidden/>
+              </w:rPr>
+              <w:t>3</w:t>
+            </w:r>
+            <w:r>
+              <w:rPr>
+                <w:noProof/>
+                <w:webHidden/>
+              </w:rPr>
+              <w:fldChar w:fldCharType="end"/>
+            </w:r>
+          </w:hyperlink>
+        </w:p>
+        <w:p>
+          <w:r>
+            <w:rPr>
+              <w:b/>
+              <w:bCs/>
+            </w:rPr>
+            <w:fldChar w:fldCharType="end"/>
+          </w:r>
+        </w:p>
+      </w:sdtContent>
+    </w:sdt>
     <w:p>
       <w:r>
         <w:br w:type="page"/>
@@ -211,27 +375,14 @@
       <w:pPr>
         <w:pStyle w:val="Cmsor1"/>
       </w:pPr>
+      <w:bookmarkStart w:id="1" w:name="_Toc218192518"/>
       <w:r>
         <w:lastRenderedPageBreak/>
-        <w:t>Tartalomjegyzék</w:t>
-      </w:r>
-    </w:p>
-    <w:p/>
-    <w:p>
-      <w:r>
-        <w:br w:type="page"/>
-      </w:r>
+        <w:t>Bevezető</w:t>
+      </w:r>
+      <w:bookmarkEnd w:id="1"/>
     </w:p>
     <w:p>
-      <w:pPr>
-        <w:pStyle w:val="Cmsor1"/>
-      </w:pPr>
-      <w:r>
-        <w:lastRenderedPageBreak/>
-        <w:t>Bevezető</w:t>
-      </w:r>
-    </w:p>
-    <w:p>
       <w:r>
         <w:t xml:space="preserve">Szakdolgozatomnak egy számológép megvalósítását választottam, amely képes kijavítani a </w:t>
       </w:r>
@@ -239,31 +390,7 @@
         <w:t>lebegőpontos</w:t>
       </w:r>
       <w:r>
-        <w:t xml:space="preserve"> számábrázolás alapvető hiányosságait és hibáit. Ezen cél eléréséhez egy BCD (</w:t>
-      </w:r>
-      <w:proofErr w:type="spellStart"/>
-      <w:r>
-        <w:t>Binary</w:t>
-      </w:r>
-      <w:proofErr w:type="spellEnd"/>
-      <w:r>
-        <w:t xml:space="preserve"> </w:t>
-      </w:r>
-      <w:proofErr w:type="spellStart"/>
-      <w:r>
-        <w:t>Coded</w:t>
-      </w:r>
-      <w:proofErr w:type="spellEnd"/>
-      <w:r>
-        <w:t xml:space="preserve"> </w:t>
-      </w:r>
-      <w:proofErr w:type="spellStart"/>
-      <w:r>
-        <w:t>Decimal</w:t>
-      </w:r>
-      <w:proofErr w:type="spellEnd"/>
-      <w:r>
-        <w:t>) típust hoztam létre amellyel különböző számtípusokat voltam képes definiálni. A hagyományos egész, előjeles és valós számokon kívül egy tört számtípust is beépítettem a könyvtárba, ami az osztás számításából származó esetleges pontatlanságakat teljes egészében kiküszöbölte.</w:t>
+        <w:t xml:space="preserve"> számábrázolás alapvető hiányosságait és hibáit. Ezen cél eléréséhez egy BCD (Binary Coded Decimal) típust hoztam létre amellyel különböző számtípusokat voltam képes definiálni. A hagyományos egész, előjeles és valós számokon kívül egy tört számtípust is beépítettem a könyvtárba, ami az osztás számításából származó esetleges pontatlanságakat teljes egészében kiküszöbölte.</w:t>
       </w:r>
     </w:p>
     <w:p>
@@ -295,10 +422,7 @@
         </w:numPr>
       </w:pPr>
       <w:r>
-        <w:t xml:space="preserve">Lagrange-interpolációs polinom előállítását </w:t>
-      </w:r>
-      <w:r>
-        <w:t>lehetővé tevő számológép</w:t>
+        <w:t>Lagrange-interpolációs polinom előállítását lehetővé tevő számológép</w:t>
       </w:r>
     </w:p>
     <w:p>
@@ -310,10 +434,7 @@
         </w:numPr>
       </w:pPr>
       <w:r>
-        <w:t xml:space="preserve">Integrálközelítés műveletét </w:t>
-      </w:r>
-      <w:r>
-        <w:t>lehetővé tevő számológép</w:t>
+        <w:t>Integrálközelítés műveletét lehetővé tevő számológép</w:t>
       </w:r>
     </w:p>
     <w:p>
@@ -330,23 +451,7 @@
     </w:p>
     <w:p>
       <w:r>
-        <w:t xml:space="preserve">Az egész eddig bemutatott munkámat pedig egy WPF (Windows </w:t>
-      </w:r>
-      <w:proofErr w:type="spellStart"/>
-      <w:r>
-        <w:t>Presentation</w:t>
-      </w:r>
-      <w:proofErr w:type="spellEnd"/>
-      <w:r>
-        <w:t xml:space="preserve"> </w:t>
-      </w:r>
-      <w:proofErr w:type="spellStart"/>
-      <w:r>
-        <w:t>Foundation</w:t>
-      </w:r>
-      <w:proofErr w:type="spellEnd"/>
-      <w:r>
-        <w:t xml:space="preserve">) segédkörnyezetben elkészített vizuális számológép felület foglalja magába, ami segíti a felhasználót a </w:t>
+        <w:t xml:space="preserve">Az egész eddig bemutatott munkámat pedig egy WPF (Windows Presentation Foundation) segédkörnyezetben elkészített vizuális számológép felület foglalja magába, ami segíti a felhasználót a </w:t>
       </w:r>
       <w:r>
         <w:t xml:space="preserve">háttérkönyvtárak használatában és aminek UI felületén </w:t>
@@ -363,14 +468,180 @@
         <w:t>Az átláthatóság érdekében és hogy a felhasználó megbizonyosodhasson arról, hogy nem csak szemfényvesztés történik, minden háttérben történő számítási lépés kilistázható időrendi sorrendben egyetlen kattintással.</w:t>
       </w:r>
     </w:p>
+    <w:p>
+      <w:pPr>
+        <w:spacing w:line="259" w:lineRule="auto"/>
+        <w:ind w:firstLine="0"/>
+        <w:jc w:val="left"/>
+      </w:pPr>
+      <w:r>
+        <w:br w:type="page"/>
+      </w:r>
+    </w:p>
+    <w:p>
+      <w:pPr>
+        <w:pStyle w:val="Cmsor1"/>
+      </w:pPr>
+      <w:r>
+        <w:lastRenderedPageBreak/>
+        <w:t>Fejlesztői dokumentáció</w:t>
+      </w:r>
+    </w:p>
+    <w:p>
+      <w:pPr>
+        <w:pStyle w:val="Cmsor2"/>
+      </w:pPr>
+      <w:r>
+        <w:t>BCD számábrázolás</w:t>
+      </w:r>
+    </w:p>
+    <w:p>
+      <w:r>
+        <w:t>A Binary Coded Decimal formátum, ahogy azt neve is mutatja, decimális formátumban tárolja el a számokat.</w:t>
+      </w:r>
+    </w:p>
+    <w:p>
+      <w:r>
+        <w:t xml:space="preserve">Egy számjegyet </w:t>
+      </w:r>
+      <w:r>
+        <w:t>4</w:t>
+      </w:r>
+      <w:r>
+        <w:t xml:space="preserve"> bit határoz meg, amik a hagyományos kettes számrendszerbeli egész szám számábrázolási elvét követik egy kitétellel: nem vehetnek fel</w:t>
+      </w:r>
+      <w:r>
+        <w:t>,</w:t>
+      </w:r>
+      <w:r>
+        <w:t xml:space="preserve"> csak </w:t>
+      </w:r>
+      <w:r>
+        <w:t>0 és 9 közötti értéket (a két határt beleértve). Ezen számjegyek tömbbe fűzésével már leírható a pozitív egész számok halmaza, a nullát is beleértve.</w:t>
+      </w:r>
+    </w:p>
+    <w:p>
+      <w:r>
+        <w:t>Ha hozzáveszünk egy igaz-hamis változót a pozitív egész számunkhoz, azzal el is készült a teljes egész számok halmaza. A könyvtár jelenleg nem követi az IEEE 754 előjeles nullákra tett szabványát és minden nulla érték pozitívra konvertálódik.</w:t>
+      </w:r>
+    </w:p>
+    <w:p>
+      <w:r>
+        <w:t xml:space="preserve">A </w:t>
+      </w:r>
+      <w:r>
+        <w:t xml:space="preserve">valós számok ábrázolásához csak be kell vezetni egy tizedesjegy számlálót, ami megmondja hogy az adott számjegy tömb elejéről hány darab számjegy jelöl törtértéket. Mivel az egész szám típus nem enged vezető nullákat, így megeshet, hogy a tömb hossza kisebb, mint a </w:t>
+      </w:r>
+      <w:r>
+        <w:t>tizedesjegy számláló</w:t>
+      </w:r>
+      <w:r>
+        <w:t xml:space="preserve"> értéke. Ilyenkor a megfelelő számú nullával kell kibővíteni kiíratáskor a számot.</w:t>
+      </w:r>
+    </w:p>
     <w:sectPr>
+      <w:footerReference w:type="default" r:id="rId7"/>
       <w:pgSz w:w="11906" w:h="16838"/>
       <w:pgMar w:top="1417" w:right="1417" w:bottom="1417" w:left="1417" w:header="708" w:footer="708" w:gutter="0"/>
+      <w:pgNumType w:start="0"/>
       <w:cols w:space="708"/>
+      <w:titlePg/>
       <w:docGrid w:linePitch="360"/>
     </w:sectPr>
   </w:body>
 </w:document>
+</file>
+
+<file path=word/endnotes.xml><?xml version="1.0" encoding="utf-8"?>
+<w:endnotes xmlns:wpc="http://schemas.microsoft.com/office/word/2010/wordprocessingCanvas" xmlns:cx="http://schemas.microsoft.com/office/drawing/2014/chartex" xmlns:cx1="http://schemas.microsoft.com/office/drawing/2015/9/8/chartex" xmlns:cx2="http://schemas.microsoft.com/office/drawing/2015/10/21/chartex" xmlns:cx3="http://schemas.microsoft.com/office/drawing/2016/5/9/chartex" xmlns:cx4="http://schemas.microsoft.com/office/drawing/2016/5/10/chartex" xmlns:cx5="http://schemas.microsoft.com/office/drawing/2016/5/11/chartex" xmlns:cx6="http://schemas.microsoft.com/office/drawing/2016/5/12/chartex" xmlns:cx7="http://schemas.microsoft.com/office/drawing/2016/5/13/chartex" xmlns:cx8="http://schemas.microsoft.com/office/drawing/2016/5/14/chartex" xmlns:mc="http://schemas.openxmlformats.org/markup-compatibility/2006" xmlns:aink="http://schemas.microsoft.com/office/drawing/2016/ink" xmlns:am3d="http://schemas.microsoft.com/office/drawing/2017/model3d" xmlns:o="urn:schemas-microsoft-com:office:office" xmlns:oel="http://schemas.microsoft.com/office/2019/extlst" xmlns:r="http://schemas.openxmlformats.org/officeDocument/2006/relationships" xmlns:m="http://schemas.openxmlformats.org/officeDocument/2006/math" xmlns:v="urn:schemas-microsoft-com:vml" xmlns:wp14="http://schemas.microsoft.com/office/word/2010/wordprocessingDrawing" xmlns:wp="http://schemas.openxmlformats.org/drawingml/2006/wordprocessingDrawing" xmlns:w10="urn:schemas-microsoft-com:office:word" xmlns:w="http://schemas.openxmlformats.org/wordprocessingml/2006/main" xmlns:w14="http://schemas.microsoft.com/office/word/2010/wordml" xmlns:w15="http://schemas.microsoft.com/office/word/2012/wordml" xmlns:w16cex="http://schemas.microsoft.com/office/word/2018/wordml/cex" xmlns:w16cid="http://schemas.microsoft.com/office/word/2016/wordml/cid" xmlns:w16="http://schemas.microsoft.com/office/word/2018/wordml" xmlns:w16du="http://schemas.microsoft.com/office/word/2023/wordml/word16du" xmlns:w16sdtdh="http://schemas.microsoft.com/office/word/2020/wordml/sdtdatahash" xmlns:w16sdtfl="http://schemas.microsoft.com/office/word/2024/wordml/sdtformatlock" xmlns:w16se="http://schemas.microsoft.com/office/word/2015/wordml/symex" xmlns:wpg="http://schemas.microsoft.com/office/word/2010/wordprocessingGroup" xmlns:wpi="http://schemas.microsoft.com/office/word/2010/wordprocessingInk" xmlns:wne="http://schemas.microsoft.com/office/word/2006/wordml" xmlns:wps="http://schemas.microsoft.com/office/word/2010/wordprocessingShape" mc:Ignorable="w14 w15 w16se w16cid w16 w16cex w16sdtdh w16sdtfl w16du wp14">
+  <w:endnote w:type="separator" w:id="-1">
+    <w:p>
+      <w:pPr>
+        <w:spacing w:after="0" w:line="240" w:lineRule="auto"/>
+      </w:pPr>
+      <w:r>
+        <w:separator/>
+      </w:r>
+    </w:p>
+  </w:endnote>
+  <w:endnote w:type="continuationSeparator" w:id="0">
+    <w:p>
+      <w:pPr>
+        <w:spacing w:after="0" w:line="240" w:lineRule="auto"/>
+      </w:pPr>
+      <w:r>
+        <w:continuationSeparator/>
+      </w:r>
+    </w:p>
+  </w:endnote>
+</w:endnotes>
+</file>
+
+<file path=word/footer1.xml><?xml version="1.0" encoding="utf-8"?>
+<w:ftr xmlns:wpc="http://schemas.microsoft.com/office/word/2010/wordprocessingCanvas" xmlns:cx="http://schemas.microsoft.com/office/drawing/2014/chartex" xmlns:cx1="http://schemas.microsoft.com/office/drawing/2015/9/8/chartex" xmlns:cx2="http://schemas.microsoft.com/office/drawing/2015/10/21/chartex" xmlns:cx3="http://schemas.microsoft.com/office/drawing/2016/5/9/chartex" xmlns:cx4="http://schemas.microsoft.com/office/drawing/2016/5/10/chartex" xmlns:cx5="http://schemas.microsoft.com/office/drawing/2016/5/11/chartex" xmlns:cx6="http://schemas.microsoft.com/office/drawing/2016/5/12/chartex" xmlns:cx7="http://schemas.microsoft.com/office/drawing/2016/5/13/chartex" xmlns:cx8="http://schemas.microsoft.com/office/drawing/2016/5/14/chartex" xmlns:mc="http://schemas.openxmlformats.org/markup-compatibility/2006" xmlns:aink="http://schemas.microsoft.com/office/drawing/2016/ink" xmlns:am3d="http://schemas.microsoft.com/office/drawing/2017/model3d" xmlns:o="urn:schemas-microsoft-com:office:office" xmlns:oel="http://schemas.microsoft.com/office/2019/extlst" xmlns:r="http://schemas.openxmlformats.org/officeDocument/2006/relationships" xmlns:m="http://schemas.openxmlformats.org/officeDocument/2006/math" xmlns:v="urn:schemas-microsoft-com:vml" xmlns:wp14="http://schemas.microsoft.com/office/word/2010/wordprocessingDrawing" xmlns:wp="http://schemas.openxmlformats.org/drawingml/2006/wordprocessingDrawing" xmlns:w10="urn:schemas-microsoft-com:office:word" xmlns:w="http://schemas.openxmlformats.org/wordprocessingml/2006/main" xmlns:w14="http://schemas.microsoft.com/office/word/2010/wordml" xmlns:w15="http://schemas.microsoft.com/office/word/2012/wordml" xmlns:w16cex="http://schemas.microsoft.com/office/word/2018/wordml/cex" xmlns:w16cid="http://schemas.microsoft.com/office/word/2016/wordml/cid" xmlns:w16="http://schemas.microsoft.com/office/word/2018/wordml" xmlns:w16du="http://schemas.microsoft.com/office/word/2023/wordml/word16du" xmlns:w16sdtdh="http://schemas.microsoft.com/office/word/2020/wordml/sdtdatahash" xmlns:w16sdtfl="http://schemas.microsoft.com/office/word/2024/wordml/sdtformatlock" xmlns:w16se="http://schemas.microsoft.com/office/word/2015/wordml/symex" xmlns:wpg="http://schemas.microsoft.com/office/word/2010/wordprocessingGroup" xmlns:wpi="http://schemas.microsoft.com/office/word/2010/wordprocessingInk" xmlns:wne="http://schemas.microsoft.com/office/word/2006/wordml" xmlns:wps="http://schemas.microsoft.com/office/word/2010/wordprocessingShape" mc:Ignorable="w14 w15 w16se w16cid w16 w16cex w16sdtdh w16sdtfl w16du wp14">
+  <w:sdt>
+    <w:sdtPr>
+      <w:id w:val="378829274"/>
+      <w:docPartObj>
+        <w:docPartGallery w:val="Page Numbers (Bottom of Page)"/>
+        <w:docPartUnique/>
+      </w:docPartObj>
+    </w:sdtPr>
+    <w:sdtContent>
+      <w:p>
+        <w:pPr>
+          <w:pStyle w:val="llb"/>
+          <w:jc w:val="center"/>
+        </w:pPr>
+        <w:r>
+          <w:fldChar w:fldCharType="begin"/>
+        </w:r>
+        <w:r>
+          <w:instrText>PAGE   \* MERGEFORMAT</w:instrText>
+        </w:r>
+        <w:r>
+          <w:fldChar w:fldCharType="separate"/>
+        </w:r>
+        <w:r>
+          <w:t>2</w:t>
+        </w:r>
+        <w:r>
+          <w:fldChar w:fldCharType="end"/>
+        </w:r>
+      </w:p>
+    </w:sdtContent>
+  </w:sdt>
+  <w:p>
+    <w:pPr>
+      <w:pStyle w:val="llb"/>
+    </w:pPr>
+  </w:p>
+</w:ftr>
+</file>
+
+<file path=word/footnotes.xml><?xml version="1.0" encoding="utf-8"?>
+<w:footnotes xmlns:wpc="http://schemas.microsoft.com/office/word/2010/wordprocessingCanvas" xmlns:cx="http://schemas.microsoft.com/office/drawing/2014/chartex" xmlns:cx1="http://schemas.microsoft.com/office/drawing/2015/9/8/chartex" xmlns:cx2="http://schemas.microsoft.com/office/drawing/2015/10/21/chartex" xmlns:cx3="http://schemas.microsoft.com/office/drawing/2016/5/9/chartex" xmlns:cx4="http://schemas.microsoft.com/office/drawing/2016/5/10/chartex" xmlns:cx5="http://schemas.microsoft.com/office/drawing/2016/5/11/chartex" xmlns:cx6="http://schemas.microsoft.com/office/drawing/2016/5/12/chartex" xmlns:cx7="http://schemas.microsoft.com/office/drawing/2016/5/13/chartex" xmlns:cx8="http://schemas.microsoft.com/office/drawing/2016/5/14/chartex" xmlns:mc="http://schemas.openxmlformats.org/markup-compatibility/2006" xmlns:aink="http://schemas.microsoft.com/office/drawing/2016/ink" xmlns:am3d="http://schemas.microsoft.com/office/drawing/2017/model3d" xmlns:o="urn:schemas-microsoft-com:office:office" xmlns:oel="http://schemas.microsoft.com/office/2019/extlst" xmlns:r="http://schemas.openxmlformats.org/officeDocument/2006/relationships" xmlns:m="http://schemas.openxmlformats.org/officeDocument/2006/math" xmlns:v="urn:schemas-microsoft-com:vml" xmlns:wp14="http://schemas.microsoft.com/office/word/2010/wordprocessingDrawing" xmlns:wp="http://schemas.openxmlformats.org/drawingml/2006/wordprocessingDrawing" xmlns:w10="urn:schemas-microsoft-com:office:word" xmlns:w="http://schemas.openxmlformats.org/wordprocessingml/2006/main" xmlns:w14="http://schemas.microsoft.com/office/word/2010/wordml" xmlns:w15="http://schemas.microsoft.com/office/word/2012/wordml" xmlns:w16cex="http://schemas.microsoft.com/office/word/2018/wordml/cex" xmlns:w16cid="http://schemas.microsoft.com/office/word/2016/wordml/cid" xmlns:w16="http://schemas.microsoft.com/office/word/2018/wordml" xmlns:w16du="http://schemas.microsoft.com/office/word/2023/wordml/word16du" xmlns:w16sdtdh="http://schemas.microsoft.com/office/word/2020/wordml/sdtdatahash" xmlns:w16sdtfl="http://schemas.microsoft.com/office/word/2024/wordml/sdtformatlock" xmlns:w16se="http://schemas.microsoft.com/office/word/2015/wordml/symex" xmlns:wpg="http://schemas.microsoft.com/office/word/2010/wordprocessingGroup" xmlns:wpi="http://schemas.microsoft.com/office/word/2010/wordprocessingInk" xmlns:wne="http://schemas.microsoft.com/office/word/2006/wordml" xmlns:wps="http://schemas.microsoft.com/office/word/2010/wordprocessingShape" mc:Ignorable="w14 w15 w16se w16cid w16 w16cex w16sdtdh w16sdtfl w16du wp14">
+  <w:footnote w:type="separator" w:id="-1">
+    <w:p>
+      <w:pPr>
+        <w:spacing w:after="0" w:line="240" w:lineRule="auto"/>
+      </w:pPr>
+      <w:r>
+        <w:separator/>
+      </w:r>
+    </w:p>
+  </w:footnote>
+  <w:footnote w:type="continuationSeparator" w:id="0">
+    <w:p>
+      <w:pPr>
+        <w:spacing w:after="0" w:line="240" w:lineRule="auto"/>
+      </w:pPr>
+      <w:r>
+        <w:continuationSeparator/>
+      </w:r>
+    </w:p>
+  </w:footnote>
+</w:footnotes>
 </file>
 
 <file path=word/numbering.xml><?xml version="1.0" encoding="utf-8"?>
@@ -933,7 +1204,7 @@
     <w:uiPriority w:val="9"/>
     <w:unhideWhenUsed/>
     <w:qFormat/>
-    <w:rsid w:val="005E0566"/>
+    <w:rsid w:val="00A80AD3"/>
     <w:pPr>
       <w:keepNext/>
       <w:keepLines/>
@@ -941,8 +1212,7 @@
       <w:outlineLvl w:val="1"/>
     </w:pPr>
     <w:rPr>
-      <w:rFonts w:asciiTheme="majorHAnsi" w:eastAsiaTheme="majorEastAsia" w:hAnsiTheme="majorHAnsi" w:cstheme="majorBidi"/>
-      <w:color w:val="0F4761" w:themeColor="accent1" w:themeShade="BF"/>
+      <w:rFonts w:eastAsiaTheme="majorEastAsia" w:cstheme="majorBidi"/>
       <w:sz w:val="32"/>
       <w:szCs w:val="32"/>
     </w:rPr>
@@ -1105,6 +1375,7 @@
   <w:style w:type="character" w:default="1" w:styleId="Bekezdsalapbettpusa">
     <w:name w:val="Default Paragraph Font"/>
     <w:uiPriority w:val="1"/>
+    <w:semiHidden/>
     <w:unhideWhenUsed/>
   </w:style>
   <w:style w:type="table" w:default="1" w:styleId="Normltblzat">
@@ -1145,10 +1416,9 @@
     <w:basedOn w:val="Bekezdsalapbettpusa"/>
     <w:link w:val="Cmsor2"/>
     <w:uiPriority w:val="9"/>
-    <w:rsid w:val="005E0566"/>
-    <w:rPr>
-      <w:rFonts w:asciiTheme="majorHAnsi" w:eastAsiaTheme="majorEastAsia" w:hAnsiTheme="majorHAnsi" w:cstheme="majorBidi"/>
-      <w:color w:val="0F4761" w:themeColor="accent1" w:themeShade="BF"/>
+    <w:rsid w:val="00A80AD3"/>
+    <w:rPr>
+      <w:rFonts w:ascii="Times New Roman" w:eastAsiaTheme="majorEastAsia" w:hAnsi="Times New Roman" w:cstheme="majorBidi"/>
       <w:sz w:val="32"/>
       <w:szCs w:val="32"/>
     </w:rPr>
@@ -1292,6 +1562,7 @@
       <w:numPr>
         <w:ilvl w:val="1"/>
       </w:numPr>
+      <w:ind w:firstLine="227"/>
     </w:pPr>
     <w:rPr>
       <w:rFonts w:eastAsiaTheme="majorEastAsia" w:cstheme="majorBidi"/>
@@ -1435,6 +1706,105 @@
         <w:insideV w:val="single" w:sz="4" w:space="0" w:color="auto"/>
       </w:tblBorders>
     </w:tblPr>
+  </w:style>
+  <w:style w:type="paragraph" w:styleId="Tartalomjegyzkcmsora">
+    <w:name w:val="TOC Heading"/>
+    <w:basedOn w:val="Cmsor1"/>
+    <w:next w:val="Norml"/>
+    <w:uiPriority w:val="39"/>
+    <w:unhideWhenUsed/>
+    <w:qFormat/>
+    <w:rsid w:val="008B2B65"/>
+    <w:pPr>
+      <w:spacing w:before="240" w:after="0" w:line="259" w:lineRule="auto"/>
+      <w:ind w:firstLine="0"/>
+      <w:jc w:val="left"/>
+      <w:outlineLvl w:val="9"/>
+    </w:pPr>
+    <w:rPr>
+      <w:rFonts w:asciiTheme="majorHAnsi" w:hAnsiTheme="majorHAnsi"/>
+      <w:color w:val="0F4761" w:themeColor="accent1" w:themeShade="BF"/>
+      <w:kern w:val="0"/>
+      <w:sz w:val="32"/>
+      <w:szCs w:val="32"/>
+      <w:lang w:eastAsia="hu-HU"/>
+      <w14:ligatures w14:val="none"/>
+    </w:rPr>
+  </w:style>
+  <w:style w:type="paragraph" w:styleId="TJ1">
+    <w:name w:val="toc 1"/>
+    <w:basedOn w:val="Norml"/>
+    <w:next w:val="Norml"/>
+    <w:autoRedefine/>
+    <w:uiPriority w:val="39"/>
+    <w:unhideWhenUsed/>
+    <w:rsid w:val="008B2B65"/>
+    <w:pPr>
+      <w:spacing w:after="100"/>
+    </w:pPr>
+  </w:style>
+  <w:style w:type="character" w:styleId="Hiperhivatkozs">
+    <w:name w:val="Hyperlink"/>
+    <w:basedOn w:val="Bekezdsalapbettpusa"/>
+    <w:uiPriority w:val="99"/>
+    <w:unhideWhenUsed/>
+    <w:rsid w:val="008B2B65"/>
+    <w:rPr>
+      <w:color w:val="467886" w:themeColor="hyperlink"/>
+      <w:u w:val="single"/>
+    </w:rPr>
+  </w:style>
+  <w:style w:type="paragraph" w:styleId="lfej">
+    <w:name w:val="header"/>
+    <w:basedOn w:val="Norml"/>
+    <w:link w:val="lfejChar"/>
+    <w:uiPriority w:val="99"/>
+    <w:unhideWhenUsed/>
+    <w:rsid w:val="008B2B65"/>
+    <w:pPr>
+      <w:tabs>
+        <w:tab w:val="center" w:pos="4536"/>
+        <w:tab w:val="right" w:pos="9072"/>
+      </w:tabs>
+      <w:spacing w:after="0" w:line="240" w:lineRule="auto"/>
+    </w:pPr>
+  </w:style>
+  <w:style w:type="character" w:customStyle="1" w:styleId="lfejChar">
+    <w:name w:val="Élőfej Char"/>
+    <w:basedOn w:val="Bekezdsalapbettpusa"/>
+    <w:link w:val="lfej"/>
+    <w:uiPriority w:val="99"/>
+    <w:rsid w:val="008B2B65"/>
+    <w:rPr>
+      <w:rFonts w:ascii="Times New Roman" w:hAnsi="Times New Roman"/>
+      <w:sz w:val="24"/>
+    </w:rPr>
+  </w:style>
+  <w:style w:type="paragraph" w:styleId="llb">
+    <w:name w:val="footer"/>
+    <w:basedOn w:val="Norml"/>
+    <w:link w:val="llbChar"/>
+    <w:uiPriority w:val="99"/>
+    <w:unhideWhenUsed/>
+    <w:rsid w:val="008B2B65"/>
+    <w:pPr>
+      <w:tabs>
+        <w:tab w:val="center" w:pos="4536"/>
+        <w:tab w:val="right" w:pos="9072"/>
+      </w:tabs>
+      <w:spacing w:after="0" w:line="240" w:lineRule="auto"/>
+    </w:pPr>
+  </w:style>
+  <w:style w:type="character" w:customStyle="1" w:styleId="llbChar">
+    <w:name w:val="Élőláb Char"/>
+    <w:basedOn w:val="Bekezdsalapbettpusa"/>
+    <w:link w:val="llb"/>
+    <w:uiPriority w:val="99"/>
+    <w:rsid w:val="008B2B65"/>
+    <w:rPr>
+      <w:rFonts w:ascii="Times New Roman" w:hAnsi="Times New Roman"/>
+      <w:sz w:val="24"/>
+    </w:rPr>
   </w:style>
 </w:styles>
 </file>

</xml_diff>

<commit_message>
Expalining the basics in the documentation.
</commit_message>
<xml_diff>
--- a/Documentation.docx
+++ b/Documentation.docx
@@ -176,9 +176,14 @@
         </w:tc>
       </w:tr>
     </w:tbl>
-    <w:bookmarkStart w:id="0" w:name="_Toc218192517" w:displacedByCustomXml="next"/>
+    <w:bookmarkStart w:id="0" w:name="_Toc218287241" w:displacedByCustomXml="next"/>
     <w:sdt>
       <w:sdtPr>
+        <w:rPr>
+          <w:rFonts w:eastAsiaTheme="minorHAnsi" w:cstheme="minorBidi"/>
+          <w:sz w:val="24"/>
+          <w:szCs w:val="22"/>
+        </w:rPr>
         <w:id w:val="-388042899"/>
         <w:docPartObj>
           <w:docPartGallery w:val="Table of Contents"/>
@@ -187,11 +192,8 @@
       </w:sdtPr>
       <w:sdtEndPr>
         <w:rPr>
-          <w:rFonts w:eastAsiaTheme="minorHAnsi" w:cstheme="minorBidi"/>
           <w:b/>
           <w:bCs/>
-          <w:sz w:val="24"/>
-          <w:szCs w:val="22"/>
         </w:rPr>
       </w:sdtEndPr>
       <w:sdtContent>
@@ -226,7 +228,7 @@
           <w:r>
             <w:fldChar w:fldCharType="separate"/>
           </w:r>
-          <w:hyperlink w:anchor="_Toc218192517" w:history="1">
+          <w:hyperlink w:anchor="_Toc218287241" w:history="1">
             <w:r>
               <w:rPr>
                 <w:rStyle w:val="Hiperhivatkozs"/>
@@ -253,7 +255,7 @@
                 <w:noProof/>
                 <w:webHidden/>
               </w:rPr>
-              <w:instrText xml:space="preserve"> PAGEREF _Toc218192517 \h </w:instrText>
+              <w:instrText xml:space="preserve"> PAGEREF _Toc218287241 \h </w:instrText>
             </w:r>
             <w:r>
               <w:rPr>
@@ -273,7 +275,7 @@
                 <w:noProof/>
                 <w:webHidden/>
               </w:rPr>
-              <w:t>2</w:t>
+              <w:t>1</w:t>
             </w:r>
             <w:r>
               <w:rPr>
@@ -297,7 +299,7 @@
               <w:lang w:eastAsia="hu-HU"/>
             </w:rPr>
           </w:pPr>
-          <w:hyperlink w:anchor="_Toc218192518" w:history="1">
+          <w:hyperlink w:anchor="_Toc218287242" w:history="1">
             <w:r>
               <w:rPr>
                 <w:rStyle w:val="Hiperhivatkozs"/>
@@ -324,7 +326,7 @@
                 <w:noProof/>
                 <w:webHidden/>
               </w:rPr>
-              <w:instrText xml:space="preserve"> PAGEREF _Toc218192518 \h </w:instrText>
+              <w:instrText xml:space="preserve"> PAGEREF _Toc218287242 \h </w:instrText>
             </w:r>
             <w:r>
               <w:rPr>
@@ -344,7 +346,489 @@
                 <w:noProof/>
                 <w:webHidden/>
               </w:rPr>
+              <w:t>2</w:t>
+            </w:r>
+            <w:r>
+              <w:rPr>
+                <w:noProof/>
+                <w:webHidden/>
+              </w:rPr>
+              <w:fldChar w:fldCharType="end"/>
+            </w:r>
+          </w:hyperlink>
+        </w:p>
+        <w:p>
+          <w:pPr>
+            <w:pStyle w:val="TJ1"/>
+            <w:tabs>
+              <w:tab w:val="right" w:leader="dot" w:pos="9062"/>
+            </w:tabs>
+            <w:rPr>
+              <w:rFonts w:asciiTheme="minorHAnsi" w:eastAsiaTheme="minorEastAsia" w:hAnsiTheme="minorHAnsi"/>
+              <w:noProof/>
+              <w:szCs w:val="24"/>
+              <w:lang w:eastAsia="hu-HU"/>
+            </w:rPr>
+          </w:pPr>
+          <w:hyperlink w:anchor="_Toc218287243" w:history="1">
+            <w:r>
+              <w:rPr>
+                <w:rStyle w:val="Hiperhivatkozs"/>
+                <w:noProof/>
+              </w:rPr>
+              <w:t>Probléma felvetés</w:t>
+            </w:r>
+            <w:r>
+              <w:rPr>
+                <w:noProof/>
+                <w:webHidden/>
+              </w:rPr>
+              <w:tab/>
+            </w:r>
+            <w:r>
+              <w:rPr>
+                <w:noProof/>
+                <w:webHidden/>
+              </w:rPr>
+              <w:fldChar w:fldCharType="begin"/>
+            </w:r>
+            <w:r>
+              <w:rPr>
+                <w:noProof/>
+                <w:webHidden/>
+              </w:rPr>
+              <w:instrText xml:space="preserve"> PAGEREF _Toc218287243 \h </w:instrText>
+            </w:r>
+            <w:r>
+              <w:rPr>
+                <w:noProof/>
+                <w:webHidden/>
+              </w:rPr>
+            </w:r>
+            <w:r>
+              <w:rPr>
+                <w:noProof/>
+                <w:webHidden/>
+              </w:rPr>
+              <w:fldChar w:fldCharType="separate"/>
+            </w:r>
+            <w:r>
+              <w:rPr>
+                <w:noProof/>
+                <w:webHidden/>
+              </w:rPr>
               <w:t>3</w:t>
+            </w:r>
+            <w:r>
+              <w:rPr>
+                <w:noProof/>
+                <w:webHidden/>
+              </w:rPr>
+              <w:fldChar w:fldCharType="end"/>
+            </w:r>
+          </w:hyperlink>
+        </w:p>
+        <w:p>
+          <w:pPr>
+            <w:pStyle w:val="TJ2"/>
+            <w:tabs>
+              <w:tab w:val="right" w:leader="dot" w:pos="9062"/>
+            </w:tabs>
+            <w:rPr>
+              <w:noProof/>
+            </w:rPr>
+          </w:pPr>
+          <w:hyperlink w:anchor="_Toc218287244" w:history="1">
+            <w:r>
+              <w:rPr>
+                <w:rStyle w:val="Hiperhivatkozs"/>
+                <w:noProof/>
+              </w:rPr>
+              <w:t>Bináris számrendszer</w:t>
+            </w:r>
+            <w:r>
+              <w:rPr>
+                <w:noProof/>
+                <w:webHidden/>
+              </w:rPr>
+              <w:tab/>
+            </w:r>
+            <w:r>
+              <w:rPr>
+                <w:noProof/>
+                <w:webHidden/>
+              </w:rPr>
+              <w:fldChar w:fldCharType="begin"/>
+            </w:r>
+            <w:r>
+              <w:rPr>
+                <w:noProof/>
+                <w:webHidden/>
+              </w:rPr>
+              <w:instrText xml:space="preserve"> PAGEREF _Toc218287244 \h </w:instrText>
+            </w:r>
+            <w:r>
+              <w:rPr>
+                <w:noProof/>
+                <w:webHidden/>
+              </w:rPr>
+            </w:r>
+            <w:r>
+              <w:rPr>
+                <w:noProof/>
+                <w:webHidden/>
+              </w:rPr>
+              <w:fldChar w:fldCharType="separate"/>
+            </w:r>
+            <w:r>
+              <w:rPr>
+                <w:noProof/>
+                <w:webHidden/>
+              </w:rPr>
+              <w:t>3</w:t>
+            </w:r>
+            <w:r>
+              <w:rPr>
+                <w:noProof/>
+                <w:webHidden/>
+              </w:rPr>
+              <w:fldChar w:fldCharType="end"/>
+            </w:r>
+          </w:hyperlink>
+        </w:p>
+        <w:p>
+          <w:pPr>
+            <w:pStyle w:val="TJ2"/>
+            <w:tabs>
+              <w:tab w:val="right" w:leader="dot" w:pos="9062"/>
+            </w:tabs>
+            <w:rPr>
+              <w:noProof/>
+            </w:rPr>
+          </w:pPr>
+          <w:hyperlink w:anchor="_Toc218287245" w:history="1">
+            <w:r>
+              <w:rPr>
+                <w:rStyle w:val="Hiperhivatkozs"/>
+                <w:noProof/>
+              </w:rPr>
+              <w:t>Lebegőpontos számábrázolás</w:t>
+            </w:r>
+            <w:r>
+              <w:rPr>
+                <w:noProof/>
+                <w:webHidden/>
+              </w:rPr>
+              <w:tab/>
+            </w:r>
+            <w:r>
+              <w:rPr>
+                <w:noProof/>
+                <w:webHidden/>
+              </w:rPr>
+              <w:fldChar w:fldCharType="begin"/>
+            </w:r>
+            <w:r>
+              <w:rPr>
+                <w:noProof/>
+                <w:webHidden/>
+              </w:rPr>
+              <w:instrText xml:space="preserve"> PAGEREF _Toc218287245 \h </w:instrText>
+            </w:r>
+            <w:r>
+              <w:rPr>
+                <w:noProof/>
+                <w:webHidden/>
+              </w:rPr>
+            </w:r>
+            <w:r>
+              <w:rPr>
+                <w:noProof/>
+                <w:webHidden/>
+              </w:rPr>
+              <w:fldChar w:fldCharType="separate"/>
+            </w:r>
+            <w:r>
+              <w:rPr>
+                <w:noProof/>
+                <w:webHidden/>
+              </w:rPr>
+              <w:t>3</w:t>
+            </w:r>
+            <w:r>
+              <w:rPr>
+                <w:noProof/>
+                <w:webHidden/>
+              </w:rPr>
+              <w:fldChar w:fldCharType="end"/>
+            </w:r>
+          </w:hyperlink>
+        </w:p>
+        <w:p>
+          <w:pPr>
+            <w:pStyle w:val="TJ1"/>
+            <w:tabs>
+              <w:tab w:val="right" w:leader="dot" w:pos="9062"/>
+            </w:tabs>
+            <w:rPr>
+              <w:rFonts w:asciiTheme="minorHAnsi" w:eastAsiaTheme="minorEastAsia" w:hAnsiTheme="minorHAnsi"/>
+              <w:noProof/>
+              <w:szCs w:val="24"/>
+              <w:lang w:eastAsia="hu-HU"/>
+            </w:rPr>
+          </w:pPr>
+          <w:hyperlink w:anchor="_Toc218287246" w:history="1">
+            <w:r>
+              <w:rPr>
+                <w:rStyle w:val="Hiperhivatkozs"/>
+                <w:noProof/>
+              </w:rPr>
+              <w:t>Fejlesztői dokumentáció</w:t>
+            </w:r>
+            <w:r>
+              <w:rPr>
+                <w:noProof/>
+                <w:webHidden/>
+              </w:rPr>
+              <w:tab/>
+            </w:r>
+            <w:r>
+              <w:rPr>
+                <w:noProof/>
+                <w:webHidden/>
+              </w:rPr>
+              <w:fldChar w:fldCharType="begin"/>
+            </w:r>
+            <w:r>
+              <w:rPr>
+                <w:noProof/>
+                <w:webHidden/>
+              </w:rPr>
+              <w:instrText xml:space="preserve"> PAGEREF _Toc218287246 \h </w:instrText>
+            </w:r>
+            <w:r>
+              <w:rPr>
+                <w:noProof/>
+                <w:webHidden/>
+              </w:rPr>
+            </w:r>
+            <w:r>
+              <w:rPr>
+                <w:noProof/>
+                <w:webHidden/>
+              </w:rPr>
+              <w:fldChar w:fldCharType="separate"/>
+            </w:r>
+            <w:r>
+              <w:rPr>
+                <w:noProof/>
+                <w:webHidden/>
+              </w:rPr>
+              <w:t>4</w:t>
+            </w:r>
+            <w:r>
+              <w:rPr>
+                <w:noProof/>
+                <w:webHidden/>
+              </w:rPr>
+              <w:fldChar w:fldCharType="end"/>
+            </w:r>
+          </w:hyperlink>
+        </w:p>
+        <w:p>
+          <w:pPr>
+            <w:pStyle w:val="TJ2"/>
+            <w:tabs>
+              <w:tab w:val="right" w:leader="dot" w:pos="9062"/>
+            </w:tabs>
+            <w:rPr>
+              <w:noProof/>
+            </w:rPr>
+          </w:pPr>
+          <w:hyperlink w:anchor="_Toc218287247" w:history="1">
+            <w:r>
+              <w:rPr>
+                <w:rStyle w:val="Hiperhivatkozs"/>
+                <w:noProof/>
+              </w:rPr>
+              <w:t>BCD számábrázolás</w:t>
+            </w:r>
+            <w:r>
+              <w:rPr>
+                <w:noProof/>
+                <w:webHidden/>
+              </w:rPr>
+              <w:tab/>
+            </w:r>
+            <w:r>
+              <w:rPr>
+                <w:noProof/>
+                <w:webHidden/>
+              </w:rPr>
+              <w:fldChar w:fldCharType="begin"/>
+            </w:r>
+            <w:r>
+              <w:rPr>
+                <w:noProof/>
+                <w:webHidden/>
+              </w:rPr>
+              <w:instrText xml:space="preserve"> PAGEREF _Toc218287247 \h </w:instrText>
+            </w:r>
+            <w:r>
+              <w:rPr>
+                <w:noProof/>
+                <w:webHidden/>
+              </w:rPr>
+            </w:r>
+            <w:r>
+              <w:rPr>
+                <w:noProof/>
+                <w:webHidden/>
+              </w:rPr>
+              <w:fldChar w:fldCharType="separate"/>
+            </w:r>
+            <w:r>
+              <w:rPr>
+                <w:noProof/>
+                <w:webHidden/>
+              </w:rPr>
+              <w:t>4</w:t>
+            </w:r>
+            <w:r>
+              <w:rPr>
+                <w:noProof/>
+                <w:webHidden/>
+              </w:rPr>
+              <w:fldChar w:fldCharType="end"/>
+            </w:r>
+          </w:hyperlink>
+        </w:p>
+        <w:p>
+          <w:pPr>
+            <w:pStyle w:val="TJ2"/>
+            <w:tabs>
+              <w:tab w:val="right" w:leader="dot" w:pos="9062"/>
+            </w:tabs>
+            <w:rPr>
+              <w:noProof/>
+            </w:rPr>
+          </w:pPr>
+          <w:hyperlink w:anchor="_Toc218287248" w:history="1">
+            <w:r>
+              <w:rPr>
+                <w:rStyle w:val="Hiperhivatkozs"/>
+                <w:noProof/>
+              </w:rPr>
+              <w:t>Megvalósítás</w:t>
+            </w:r>
+            <w:r>
+              <w:rPr>
+                <w:noProof/>
+                <w:webHidden/>
+              </w:rPr>
+              <w:tab/>
+            </w:r>
+            <w:r>
+              <w:rPr>
+                <w:noProof/>
+                <w:webHidden/>
+              </w:rPr>
+              <w:fldChar w:fldCharType="begin"/>
+            </w:r>
+            <w:r>
+              <w:rPr>
+                <w:noProof/>
+                <w:webHidden/>
+              </w:rPr>
+              <w:instrText xml:space="preserve"> PAGEREF _Toc218287248 \h </w:instrText>
+            </w:r>
+            <w:r>
+              <w:rPr>
+                <w:noProof/>
+                <w:webHidden/>
+              </w:rPr>
+            </w:r>
+            <w:r>
+              <w:rPr>
+                <w:noProof/>
+                <w:webHidden/>
+              </w:rPr>
+              <w:fldChar w:fldCharType="separate"/>
+            </w:r>
+            <w:r>
+              <w:rPr>
+                <w:noProof/>
+                <w:webHidden/>
+              </w:rPr>
+              <w:t>4</w:t>
+            </w:r>
+            <w:r>
+              <w:rPr>
+                <w:noProof/>
+                <w:webHidden/>
+              </w:rPr>
+              <w:fldChar w:fldCharType="end"/>
+            </w:r>
+          </w:hyperlink>
+        </w:p>
+        <w:p>
+          <w:pPr>
+            <w:pStyle w:val="TJ3"/>
+            <w:tabs>
+              <w:tab w:val="right" w:leader="dot" w:pos="9062"/>
+            </w:tabs>
+            <w:rPr>
+              <w:noProof/>
+            </w:rPr>
+          </w:pPr>
+          <w:hyperlink w:anchor="_Toc218287249" w:history="1">
+            <w:r>
+              <w:rPr>
+                <w:rStyle w:val="Hiperhivatkozs"/>
+                <w:noProof/>
+              </w:rPr>
+              <w:t>Számjegy típus (Digit)</w:t>
+            </w:r>
+            <w:r>
+              <w:rPr>
+                <w:noProof/>
+                <w:webHidden/>
+              </w:rPr>
+              <w:tab/>
+            </w:r>
+            <w:r>
+              <w:rPr>
+                <w:noProof/>
+                <w:webHidden/>
+              </w:rPr>
+              <w:fldChar w:fldCharType="begin"/>
+            </w:r>
+            <w:r>
+              <w:rPr>
+                <w:noProof/>
+                <w:webHidden/>
+              </w:rPr>
+              <w:instrText xml:space="preserve"> PAGEREF _Toc218287249 \h </w:instrText>
+            </w:r>
+            <w:r>
+              <w:rPr>
+                <w:noProof/>
+                <w:webHidden/>
+              </w:rPr>
+            </w:r>
+            <w:r>
+              <w:rPr>
+                <w:noProof/>
+                <w:webHidden/>
+              </w:rPr>
+              <w:fldChar w:fldCharType="separate"/>
+            </w:r>
+            <w:r>
+              <w:rPr>
+                <w:noProof/>
+                <w:webHidden/>
+              </w:rPr>
+              <w:t>4</w:t>
             </w:r>
             <w:r>
               <w:rPr>
@@ -375,7 +859,7 @@
       <w:pPr>
         <w:pStyle w:val="Cmsor1"/>
       </w:pPr>
-      <w:bookmarkStart w:id="1" w:name="_Toc218192518"/>
+      <w:bookmarkStart w:id="1" w:name="_Toc218287242"/>
       <w:r>
         <w:lastRenderedPageBreak/>
         <w:t>Bevezető</w:t>
@@ -482,18 +966,927 @@
       <w:pPr>
         <w:pStyle w:val="Cmsor1"/>
       </w:pPr>
+      <w:bookmarkStart w:id="2" w:name="_Toc218287243"/>
       <w:r>
         <w:lastRenderedPageBreak/>
-        <w:t>Fejlesztői dokumentáció</w:t>
-      </w:r>
+        <w:t>Probléma felvetés</w:t>
+      </w:r>
+      <w:bookmarkEnd w:id="2"/>
     </w:p>
     <w:p>
       <w:pPr>
         <w:pStyle w:val="Cmsor2"/>
       </w:pPr>
+      <w:bookmarkStart w:id="3" w:name="_Toc218287244"/>
+      <w:r>
+        <w:t>Bináris számrendszer</w:t>
+      </w:r>
+      <w:bookmarkEnd w:id="3"/>
+    </w:p>
+    <w:p>
+      <w:r>
+        <w:t>M</w:t>
+      </w:r>
+      <w:r>
+        <w:t xml:space="preserve">ielőtt </w:t>
+      </w:r>
+      <w:r>
+        <w:t>m</w:t>
+      </w:r>
+      <w:r>
+        <w:t>ég binárisba váltanánk, vegyük figyelembe, hogyan is épül fel a decimális,</w:t>
+      </w:r>
+      <w:r>
+        <w:t xml:space="preserve"> avagy</w:t>
+      </w:r>
+      <w:r>
+        <w:t xml:space="preserve"> tízes számrendszer.</w:t>
+      </w:r>
+    </w:p>
+    <w:p>
+      <m:oMath>
+        <m:r>
+          <w:rPr>
+            <w:rFonts w:ascii="Cambria Math" w:hAnsi="Cambria Math"/>
+          </w:rPr>
+          <m:t>123</m:t>
+        </m:r>
+      </m:oMath>
+      <w:r>
+        <w:t>. Ezt a tízes számrendszerbeli számot felírhatjuk ekvivalens módon úgy, hogy minden egyes számjegyének értékét beszorozzuk a neki megfelelő tízes hatvánnyal az alábbi módon:</w:t>
+      </w:r>
+    </w:p>
+    <w:p>
+      <m:oMathPara>
+        <m:oMath>
+          <m:r>
+            <w:rPr>
+              <w:rFonts w:ascii="Cambria Math" w:hAnsi="Cambria Math"/>
+            </w:rPr>
+            <m:t>123=1×10^2+2×10^1+3×10^0</m:t>
+          </m:r>
+        </m:oMath>
+      </m:oMathPara>
+    </w:p>
+    <w:p>
+      <w:r>
+        <w:t>Tört számok esetén ugyanez az eljárás, csak a tíz hatványait folytatjuk a negatív számokba is:</w:t>
+      </w:r>
+    </w:p>
+    <w:p>
+      <m:oMathPara>
+        <m:oMath>
+          <m:r>
+            <w:rPr>
+              <w:rFonts w:ascii="Cambria Math" w:hAnsi="Cambria Math"/>
+            </w:rPr>
+            <m:t>123.25=1×</m:t>
+          </m:r>
+          <m:sSup>
+            <m:sSupPr>
+              <m:ctrlPr>
+                <w:rPr>
+                  <w:rFonts w:ascii="Cambria Math" w:hAnsi="Cambria Math"/>
+                  <w:i/>
+                </w:rPr>
+              </m:ctrlPr>
+            </m:sSupPr>
+            <m:e>
+              <m:r>
+                <w:rPr>
+                  <w:rFonts w:ascii="Cambria Math" w:hAnsi="Cambria Math"/>
+                </w:rPr>
+                <m:t>10</m:t>
+              </m:r>
+            </m:e>
+            <m:sup>
+              <m:r>
+                <w:rPr>
+                  <w:rFonts w:ascii="Cambria Math" w:hAnsi="Cambria Math"/>
+                </w:rPr>
+                <m:t>2</m:t>
+              </m:r>
+            </m:sup>
+          </m:sSup>
+          <m:r>
+            <w:rPr>
+              <w:rFonts w:ascii="Cambria Math" w:hAnsi="Cambria Math"/>
+            </w:rPr>
+            <m:t>+2×</m:t>
+          </m:r>
+          <m:sSup>
+            <m:sSupPr>
+              <m:ctrlPr>
+                <w:rPr>
+                  <w:rFonts w:ascii="Cambria Math" w:hAnsi="Cambria Math"/>
+                  <w:i/>
+                </w:rPr>
+              </m:ctrlPr>
+            </m:sSupPr>
+            <m:e>
+              <m:r>
+                <w:rPr>
+                  <w:rFonts w:ascii="Cambria Math" w:hAnsi="Cambria Math"/>
+                </w:rPr>
+                <m:t>10</m:t>
+              </m:r>
+            </m:e>
+            <m:sup>
+              <m:r>
+                <w:rPr>
+                  <w:rFonts w:ascii="Cambria Math" w:hAnsi="Cambria Math"/>
+                </w:rPr>
+                <m:t>1</m:t>
+              </m:r>
+            </m:sup>
+          </m:sSup>
+          <m:r>
+            <w:rPr>
+              <w:rFonts w:ascii="Cambria Math" w:hAnsi="Cambria Math"/>
+            </w:rPr>
+            <m:t>+3×</m:t>
+          </m:r>
+          <m:sSup>
+            <m:sSupPr>
+              <m:ctrlPr>
+                <w:rPr>
+                  <w:rFonts w:ascii="Cambria Math" w:hAnsi="Cambria Math"/>
+                  <w:i/>
+                </w:rPr>
+              </m:ctrlPr>
+            </m:sSupPr>
+            <m:e>
+              <m:r>
+                <w:rPr>
+                  <w:rFonts w:ascii="Cambria Math" w:hAnsi="Cambria Math"/>
+                </w:rPr>
+                <m:t>10</m:t>
+              </m:r>
+            </m:e>
+            <m:sup>
+              <m:r>
+                <w:rPr>
+                  <w:rFonts w:ascii="Cambria Math" w:hAnsi="Cambria Math"/>
+                </w:rPr>
+                <m:t>0</m:t>
+              </m:r>
+            </m:sup>
+          </m:sSup>
+          <m:r>
+            <w:rPr>
+              <w:rFonts w:ascii="Cambria Math" w:hAnsi="Cambria Math"/>
+            </w:rPr>
+            <m:t>+2×</m:t>
+          </m:r>
+          <m:sSup>
+            <m:sSupPr>
+              <m:ctrlPr>
+                <w:rPr>
+                  <w:rFonts w:ascii="Cambria Math" w:hAnsi="Cambria Math"/>
+                  <w:i/>
+                </w:rPr>
+              </m:ctrlPr>
+            </m:sSupPr>
+            <m:e>
+              <m:r>
+                <w:rPr>
+                  <w:rFonts w:ascii="Cambria Math" w:hAnsi="Cambria Math"/>
+                </w:rPr>
+                <m:t>10</m:t>
+              </m:r>
+            </m:e>
+            <m:sup>
+              <m:r>
+                <w:rPr>
+                  <w:rFonts w:ascii="Cambria Math" w:hAnsi="Cambria Math"/>
+                </w:rPr>
+                <m:t>-1</m:t>
+              </m:r>
+            </m:sup>
+          </m:sSup>
+          <m:r>
+            <w:rPr>
+              <w:rFonts w:ascii="Cambria Math" w:hAnsi="Cambria Math"/>
+            </w:rPr>
+            <m:t>+5×</m:t>
+          </m:r>
+          <m:sSup>
+            <m:sSupPr>
+              <m:ctrlPr>
+                <w:rPr>
+                  <w:rFonts w:ascii="Cambria Math" w:hAnsi="Cambria Math"/>
+                  <w:i/>
+                </w:rPr>
+              </m:ctrlPr>
+            </m:sSupPr>
+            <m:e>
+              <m:r>
+                <w:rPr>
+                  <w:rFonts w:ascii="Cambria Math" w:hAnsi="Cambria Math"/>
+                </w:rPr>
+                <m:t>10</m:t>
+              </m:r>
+            </m:e>
+            <m:sup>
+              <m:r>
+                <w:rPr>
+                  <w:rFonts w:ascii="Cambria Math" w:hAnsi="Cambria Math"/>
+                </w:rPr>
+                <m:t>-2</m:t>
+              </m:r>
+            </m:sup>
+          </m:sSup>
+        </m:oMath>
+      </m:oMathPara>
+    </w:p>
+    <w:p>
+      <w:r>
+        <w:t>Ez a módszer azért érdekes, mert leírható vele minden n-es számrendszer</w:t>
+      </w:r>
+      <w:r>
+        <w:t>.</w:t>
+      </w:r>
+      <w:r>
+        <w:t xml:space="preserve"> </w:t>
+      </w:r>
+      <w:r>
+        <w:t>Az új számrendszer egy</w:t>
+      </w:r>
+      <w:r>
+        <w:t xml:space="preserve"> számjegyének maximális értéke </w:t>
+      </w:r>
+      <m:oMath>
+        <m:r>
+          <w:rPr>
+            <w:rFonts w:ascii="Cambria Math" w:hAnsi="Cambria Math"/>
+          </w:rPr>
+          <m:t>n-1</m:t>
+        </m:r>
+      </m:oMath>
+      <w:r>
+        <w:t>.</w:t>
+      </w:r>
+    </w:p>
+    <w:p>
+      <w:r>
+        <w:t>Ezek után már csak értelmeznünk kell mit is jelentenek ezek a szabályok a kettes számrendszerre nézve</w:t>
+      </w:r>
+      <w:r>
+        <w:t xml:space="preserve">. Egy számjegy maximális értéke </w:t>
+      </w:r>
+      <m:oMath>
+        <m:r>
+          <w:rPr>
+            <w:rFonts w:ascii="Cambria Math" w:hAnsi="Cambria Math"/>
+          </w:rPr>
+          <m:t>n</m:t>
+        </m:r>
+        <m:r>
+          <w:rPr>
+            <w:rFonts w:ascii="Cambria Math" w:hAnsi="Cambria Math"/>
+          </w:rPr>
+          <m:t>=</m:t>
+        </m:r>
+        <m:r>
+          <w:rPr>
+            <w:rFonts w:ascii="Cambria Math" w:hAnsi="Cambria Math"/>
+          </w:rPr>
+          <m:t>2</m:t>
+        </m:r>
+      </m:oMath>
+      <w:r>
+        <w:t xml:space="preserve"> esetén </w:t>
+      </w:r>
+      <m:oMath>
+        <m:r>
+          <w:rPr>
+            <w:rFonts w:ascii="Cambria Math" w:hAnsi="Cambria Math"/>
+          </w:rPr>
+          <m:t>1</m:t>
+        </m:r>
+      </m:oMath>
+      <w:r>
+        <w:t xml:space="preserve"> és a </w:t>
+      </w:r>
+      <m:oMath>
+        <m:r>
+          <w:rPr>
+            <w:rFonts w:ascii="Cambria Math" w:hAnsi="Cambria Math"/>
+          </w:rPr>
+          <m:t>2</m:t>
+        </m:r>
+      </m:oMath>
+      <w:r>
+        <w:t xml:space="preserve"> hatványaival szorozzuk be </w:t>
+      </w:r>
+      <w:proofErr w:type="spellStart"/>
+      <w:r>
+        <w:t>a</w:t>
+      </w:r>
+      <w:proofErr w:type="spellEnd"/>
+      <w:r>
+        <w:t xml:space="preserve"> számjegyeket.</w:t>
+      </w:r>
+    </w:p>
+    <w:p>
+      <w:pPr>
+        <w:rPr>
+          <w:rFonts w:ascii="Cambria Math" w:hAnsi="Cambria Math"/>
+          <w:oMath/>
+        </w:rPr>
+      </w:pPr>
+      <m:oMathPara>
+        <m:oMath>
+          <m:r>
+            <w:rPr>
+              <w:rFonts w:ascii="Cambria Math" w:hAnsi="Cambria Math"/>
+            </w:rPr>
+            <m:t>1011.11=1×</m:t>
+          </m:r>
+          <m:sSup>
+            <m:sSupPr>
+              <m:ctrlPr>
+                <w:rPr>
+                  <w:rFonts w:ascii="Cambria Math" w:hAnsi="Cambria Math"/>
+                  <w:i/>
+                </w:rPr>
+              </m:ctrlPr>
+            </m:sSupPr>
+            <m:e>
+              <m:r>
+                <w:rPr>
+                  <w:rFonts w:ascii="Cambria Math" w:hAnsi="Cambria Math"/>
+                </w:rPr>
+                <m:t>2</m:t>
+              </m:r>
+            </m:e>
+            <m:sup>
+              <m:r>
+                <w:rPr>
+                  <w:rFonts w:ascii="Cambria Math" w:hAnsi="Cambria Math"/>
+                </w:rPr>
+                <m:t>3</m:t>
+              </m:r>
+            </m:sup>
+          </m:sSup>
+          <m:r>
+            <w:rPr>
+              <w:rFonts w:ascii="Cambria Math" w:hAnsi="Cambria Math"/>
+            </w:rPr>
+            <m:t>+0×</m:t>
+          </m:r>
+          <m:sSup>
+            <m:sSupPr>
+              <m:ctrlPr>
+                <w:rPr>
+                  <w:rFonts w:ascii="Cambria Math" w:hAnsi="Cambria Math"/>
+                  <w:i/>
+                </w:rPr>
+              </m:ctrlPr>
+            </m:sSupPr>
+            <m:e>
+              <m:r>
+                <w:rPr>
+                  <w:rFonts w:ascii="Cambria Math" w:hAnsi="Cambria Math"/>
+                </w:rPr>
+                <m:t>2</m:t>
+              </m:r>
+            </m:e>
+            <m:sup>
+              <m:r>
+                <w:rPr>
+                  <w:rFonts w:ascii="Cambria Math" w:hAnsi="Cambria Math"/>
+                </w:rPr>
+                <m:t>2</m:t>
+              </m:r>
+            </m:sup>
+          </m:sSup>
+          <m:r>
+            <w:rPr>
+              <w:rFonts w:ascii="Cambria Math" w:hAnsi="Cambria Math"/>
+            </w:rPr>
+            <m:t>+1×</m:t>
+          </m:r>
+          <m:sSup>
+            <m:sSupPr>
+              <m:ctrlPr>
+                <w:rPr>
+                  <w:rFonts w:ascii="Cambria Math" w:hAnsi="Cambria Math"/>
+                  <w:i/>
+                </w:rPr>
+              </m:ctrlPr>
+            </m:sSupPr>
+            <m:e>
+              <m:r>
+                <w:rPr>
+                  <w:rFonts w:ascii="Cambria Math" w:hAnsi="Cambria Math"/>
+                </w:rPr>
+                <m:t>2</m:t>
+              </m:r>
+            </m:e>
+            <m:sup>
+              <m:r>
+                <w:rPr>
+                  <w:rFonts w:ascii="Cambria Math" w:hAnsi="Cambria Math"/>
+                </w:rPr>
+                <m:t>1</m:t>
+              </m:r>
+            </m:sup>
+          </m:sSup>
+          <m:r>
+            <w:rPr>
+              <w:rFonts w:ascii="Cambria Math" w:hAnsi="Cambria Math"/>
+            </w:rPr>
+            <m:t>+1×</m:t>
+          </m:r>
+          <m:sSup>
+            <m:sSupPr>
+              <m:ctrlPr>
+                <w:rPr>
+                  <w:rFonts w:ascii="Cambria Math" w:hAnsi="Cambria Math"/>
+                  <w:i/>
+                </w:rPr>
+              </m:ctrlPr>
+            </m:sSupPr>
+            <m:e>
+              <m:r>
+                <w:rPr>
+                  <w:rFonts w:ascii="Cambria Math" w:hAnsi="Cambria Math"/>
+                </w:rPr>
+                <m:t>2</m:t>
+              </m:r>
+            </m:e>
+            <m:sup>
+              <m:r>
+                <w:rPr>
+                  <w:rFonts w:ascii="Cambria Math" w:hAnsi="Cambria Math"/>
+                </w:rPr>
+                <m:t>0</m:t>
+              </m:r>
+            </m:sup>
+          </m:sSup>
+          <m:r>
+            <w:rPr>
+              <w:rFonts w:ascii="Cambria Math" w:hAnsi="Cambria Math"/>
+            </w:rPr>
+            <m:t>+1×</m:t>
+          </m:r>
+          <m:sSup>
+            <m:sSupPr>
+              <m:ctrlPr>
+                <w:rPr>
+                  <w:rFonts w:ascii="Cambria Math" w:hAnsi="Cambria Math"/>
+                  <w:i/>
+                </w:rPr>
+              </m:ctrlPr>
+            </m:sSupPr>
+            <m:e>
+              <m:r>
+                <w:rPr>
+                  <w:rFonts w:ascii="Cambria Math" w:hAnsi="Cambria Math"/>
+                </w:rPr>
+                <m:t>2</m:t>
+              </m:r>
+            </m:e>
+            <m:sup>
+              <m:r>
+                <w:rPr>
+                  <w:rFonts w:ascii="Cambria Math" w:hAnsi="Cambria Math"/>
+                </w:rPr>
+                <m:t>-1</m:t>
+              </m:r>
+            </m:sup>
+          </m:sSup>
+          <m:r>
+            <w:rPr>
+              <w:rFonts w:ascii="Cambria Math" w:hAnsi="Cambria Math"/>
+            </w:rPr>
+            <m:t>+1×</m:t>
+          </m:r>
+          <m:sSup>
+            <m:sSupPr>
+              <m:ctrlPr>
+                <w:rPr>
+                  <w:rFonts w:ascii="Cambria Math" w:hAnsi="Cambria Math"/>
+                  <w:i/>
+                </w:rPr>
+              </m:ctrlPr>
+            </m:sSupPr>
+            <m:e>
+              <m:r>
+                <w:rPr>
+                  <w:rFonts w:ascii="Cambria Math" w:hAnsi="Cambria Math"/>
+                </w:rPr>
+                <m:t>2</m:t>
+              </m:r>
+            </m:e>
+            <m:sup>
+              <m:r>
+                <w:rPr>
+                  <w:rFonts w:ascii="Cambria Math" w:hAnsi="Cambria Math"/>
+                </w:rPr>
+                <m:t>-2</m:t>
+              </m:r>
+            </m:sup>
+          </m:sSup>
+          <m:r>
+            <w:rPr>
+              <w:rFonts w:ascii="Cambria Math" w:hAnsi="Cambria Math"/>
+            </w:rPr>
+            <m:t>=</m:t>
+          </m:r>
+          <m:r>
+            <w:rPr>
+              <w:rFonts w:ascii="Cambria Math" w:hAnsi="Cambria Math"/>
+            </w:rPr>
+            <m:t>=</m:t>
+          </m:r>
+          <m:r>
+            <w:rPr>
+              <w:rFonts w:ascii="Cambria Math" w:hAnsi="Cambria Math"/>
+            </w:rPr>
+            <m:t>8+0+2+1+½+¼=20.75</m:t>
+          </m:r>
+        </m:oMath>
+      </m:oMathPara>
+    </w:p>
+    <w:p>
+      <w:r>
+        <w:t>Vagyis megteremtettük az átjárást bináris és decimális között az egyik irányba. A decimálisból binárisba váltást itt most nem taglaljuk.</w:t>
+      </w:r>
+    </w:p>
+    <w:p>
+      <w:pPr>
+        <w:pStyle w:val="Cmsor2"/>
+      </w:pPr>
+      <w:bookmarkStart w:id="4" w:name="_Toc218287245"/>
+      <w:r>
+        <w:t>Lebegőpontos számábrázolás</w:t>
+      </w:r>
+      <w:bookmarkEnd w:id="4"/>
+    </w:p>
+    <w:p>
+      <w:r>
+        <w:t>A lebegőpontos számábrázolás egy memóriahatékony módja a számok tárolásának, kettes számrendszerben</w:t>
+      </w:r>
+      <w:r>
+        <w:t>,</w:t>
+      </w:r>
+      <w:r>
+        <w:t xml:space="preserve"> mivel</w:t>
+      </w:r>
+      <w:r>
+        <w:t xml:space="preserve"> így</w:t>
+      </w:r>
+      <w:r>
+        <w:t xml:space="preserve"> </w:t>
+      </w:r>
+      <w:r>
+        <w:t xml:space="preserve">minden szám </w:t>
+      </w:r>
+      <w:r>
+        <w:t>fix hosszúságú területet igényel</w:t>
+      </w:r>
+      <w:r>
+        <w:t>.</w:t>
+      </w:r>
+      <w:r>
+        <w:t xml:space="preserve"> Három részből tevőd</w:t>
+      </w:r>
+      <w:r>
+        <w:t>ne</w:t>
+      </w:r>
+      <w:r>
+        <w:t xml:space="preserve">k össze, amik sorra a mantissza, az </w:t>
+      </w:r>
+      <w:r>
+        <w:t>előjel</w:t>
+      </w:r>
+      <w:r>
+        <w:t xml:space="preserve"> és a </w:t>
+      </w:r>
+      <w:r>
+        <w:t>karakterisztika</w:t>
+      </w:r>
+      <w:r>
+        <w:t>.</w:t>
+      </w:r>
+    </w:p>
+    <w:p>
+      <w:r>
+        <w:t>A mantissza határozza meg a számjegyek értékét. A legnagyobb helyiértékkel rendelkező számjegy az egész részét képviseli a mantisszának</w:t>
+      </w:r>
+      <w:r>
+        <w:t xml:space="preserve"> és mindig </w:t>
+      </w:r>
+      <m:oMath>
+        <m:r>
+          <w:rPr>
+            <w:rFonts w:ascii="Cambria Math" w:hAnsi="Cambria Math"/>
+          </w:rPr>
+          <m:t>1</m:t>
+        </m:r>
+      </m:oMath>
+      <w:r>
+        <w:rPr>
+          <w:rFonts w:eastAsiaTheme="minorEastAsia"/>
+        </w:rPr>
+        <w:t xml:space="preserve"> az értéke</w:t>
+      </w:r>
+      <w:r>
+        <w:t>.</w:t>
+      </w:r>
+      <w:r>
+        <w:t xml:space="preserve"> Redundancia miatt el szokás hagyni a tároását.</w:t>
+      </w:r>
+      <w:r>
+        <w:t xml:space="preserve"> Minden kisebb helyiérték</w:t>
+      </w:r>
+      <w:r>
+        <w:t xml:space="preserve"> pedig</w:t>
+      </w:r>
+      <w:r>
+        <w:t xml:space="preserve"> a törtértéket írja le.</w:t>
+      </w:r>
+    </w:p>
+    <w:p>
+      <w:r>
+        <w:lastRenderedPageBreak/>
+        <w:t>Az előjelet vagy egy előjelbiten szokták tárolni, vagy a kettes komplemens számábrázolás segítségével egybeolvasztják a mantisszával</w:t>
+      </w:r>
+      <w:r>
+        <w:t>.</w:t>
+      </w:r>
+    </w:p>
+    <w:p>
+      <w:r>
+        <w:t xml:space="preserve">Majd végül következik a karakterisztika, ami megmondja, hogy </w:t>
+      </w:r>
+      <w:r>
+        <w:t>hány számjeggyel</w:t>
+      </w:r>
+      <w:r>
+        <w:t xml:space="preserve"> kell eltolni </w:t>
+      </w:r>
+      <w:r>
+        <w:t>a tizedesvesszőt. Amennyiben pozitív, akkor a jobb irányba, ha pedig negatív, akkor balra.</w:t>
+      </w:r>
+    </w:p>
+    <w:p>
+      <w:pPr>
+        <w:jc w:val="center"/>
+      </w:pPr>
+      <w:r>
+        <w:t>&lt;kép a lebegőpontos számok bináris reprezentálásáról&gt;</w:t>
+      </w:r>
+    </w:p>
+    <w:p>
+      <w:pPr>
+        <w:pStyle w:val="Cmsor2"/>
+      </w:pPr>
+      <w:r>
+        <w:t>Implementációk</w:t>
+      </w:r>
+    </w:p>
+    <w:p>
+      <w:pPr>
+        <w:rPr>
+          <w:b/>
+          <w:bCs/>
+        </w:rPr>
+      </w:pPr>
+      <w:r>
+        <w:t xml:space="preserve">Az IEEE 754 </w:t>
+      </w:r>
+      <w:r>
+        <w:t>lebegőpontos számformátum</w:t>
+      </w:r>
+      <w:r>
+        <w:t xml:space="preserve"> meghatározásában az informatikában elterjedt „</w:t>
+      </w:r>
+      <w:proofErr w:type="spellStart"/>
+      <w:r>
+        <w:t>Single</w:t>
+      </w:r>
+      <w:proofErr w:type="spellEnd"/>
+      <w:r>
+        <w:t xml:space="preserve"> </w:t>
+      </w:r>
+      <w:proofErr w:type="spellStart"/>
+      <w:r>
+        <w:t>precision</w:t>
+      </w:r>
+      <w:proofErr w:type="spellEnd"/>
+      <w:r>
+        <w:t xml:space="preserve">” típusú lebegőpontos számformátum </w:t>
+      </w:r>
+      <m:oMath>
+        <m:r>
+          <w:rPr>
+            <w:rFonts w:ascii="Cambria Math" w:hAnsi="Cambria Math"/>
+          </w:rPr>
+          <m:t>32</m:t>
+        </m:r>
+      </m:oMath>
+      <w:r>
+        <w:t xml:space="preserve"> bitet használ. Ebből a </w:t>
+      </w:r>
+      <m:oMath>
+        <m:r>
+          <w:rPr>
+            <w:rFonts w:ascii="Cambria Math" w:hAnsi="Cambria Math"/>
+          </w:rPr>
+          <m:t>32</m:t>
+        </m:r>
+      </m:oMath>
+      <w:r>
+        <w:t xml:space="preserve"> bitből </w:t>
+      </w:r>
+      <m:oMath>
+        <m:r>
+          <w:rPr>
+            <w:rFonts w:ascii="Cambria Math" w:hAnsi="Cambria Math"/>
+          </w:rPr>
+          <m:t>1</m:t>
+        </m:r>
+      </m:oMath>
+      <w:r>
+        <w:t xml:space="preserve"> az előjel, </w:t>
+      </w:r>
+      <m:oMath>
+        <m:r>
+          <w:rPr>
+            <w:rFonts w:ascii="Cambria Math" w:hAnsi="Cambria Math"/>
+          </w:rPr>
+          <m:t>23</m:t>
+        </m:r>
+      </m:oMath>
+      <w:r>
+        <w:t xml:space="preserve"> a mantissza és </w:t>
+      </w:r>
+      <m:oMath>
+        <m:r>
+          <w:rPr>
+            <w:rFonts w:ascii="Cambria Math" w:hAnsi="Cambria Math"/>
+          </w:rPr>
+          <m:t>8</m:t>
+        </m:r>
+      </m:oMath>
+      <w:r>
+        <w:t xml:space="preserve"> a karakterisztika leírására szolgál. Ezekkel a tulajdonságokkal a legkisebb leírható pozitív</w:t>
+      </w:r>
+      <w:r>
+        <w:t xml:space="preserve"> normált</w:t>
+      </w:r>
+      <w:r>
+        <w:t xml:space="preserve"> érték a </w:t>
+      </w:r>
+      <m:oMath>
+        <m:sSup>
+          <m:sSupPr>
+            <m:ctrlPr>
+              <w:rPr>
+                <w:rFonts w:ascii="Cambria Math" w:hAnsi="Cambria Math"/>
+                <w:i/>
+              </w:rPr>
+            </m:ctrlPr>
+          </m:sSupPr>
+          <m:e>
+            <m:r>
+              <w:rPr>
+                <w:rFonts w:ascii="Cambria Math" w:hAnsi="Cambria Math"/>
+              </w:rPr>
+              <m:t>2</m:t>
+            </m:r>
+          </m:e>
+          <m:sup>
+            <m:r>
+              <w:rPr>
+                <w:rFonts w:ascii="Cambria Math" w:hAnsi="Cambria Math"/>
+              </w:rPr>
+              <m:t>-</m:t>
+            </m:r>
+            <m:r>
+              <w:rPr>
+                <w:rFonts w:ascii="Cambria Math" w:hAnsi="Cambria Math"/>
+              </w:rPr>
+              <m:t>126</m:t>
+            </m:r>
+          </m:sup>
+        </m:sSup>
+      </m:oMath>
+      <w:r>
+        <w:rPr>
+          <w:rFonts w:eastAsiaTheme="minorEastAsia"/>
+        </w:rPr>
+        <w:t xml:space="preserve">, a legnagyobb leírható pozitív érték pedig a </w:t>
+      </w:r>
+      <m:oMath>
+        <m:d>
+          <m:dPr>
+            <m:ctrlPr>
+              <w:rPr>
+                <w:rFonts w:ascii="Cambria Math" w:eastAsiaTheme="minorEastAsia" w:hAnsi="Cambria Math"/>
+                <w:i/>
+              </w:rPr>
+            </m:ctrlPr>
+          </m:dPr>
+          <m:e>
+            <m:r>
+              <w:rPr>
+                <w:rFonts w:ascii="Cambria Math" w:eastAsiaTheme="minorEastAsia" w:hAnsi="Cambria Math"/>
+              </w:rPr>
+              <m:t>2-</m:t>
+            </m:r>
+            <m:sSup>
+              <m:sSupPr>
+                <m:ctrlPr>
+                  <w:rPr>
+                    <w:rFonts w:ascii="Cambria Math" w:eastAsiaTheme="minorEastAsia" w:hAnsi="Cambria Math"/>
+                    <w:i/>
+                  </w:rPr>
+                </m:ctrlPr>
+              </m:sSupPr>
+              <m:e>
+                <m:r>
+                  <w:rPr>
+                    <w:rFonts w:ascii="Cambria Math" w:eastAsiaTheme="minorEastAsia" w:hAnsi="Cambria Math"/>
+                  </w:rPr>
+                  <m:t>2</m:t>
+                </m:r>
+              </m:e>
+              <m:sup>
+                <m:r>
+                  <w:rPr>
+                    <w:rFonts w:ascii="Cambria Math" w:eastAsiaTheme="minorEastAsia" w:hAnsi="Cambria Math"/>
+                    <w:vertAlign w:val="superscript"/>
+                  </w:rPr>
+                  <m:t>-23</m:t>
+                </m:r>
+              </m:sup>
+            </m:sSup>
+          </m:e>
+        </m:d>
+        <m:r>
+          <w:rPr>
+            <w:rFonts w:ascii="Cambria Math" w:eastAsiaTheme="minorEastAsia" w:hAnsi="Cambria Math"/>
+          </w:rPr>
+          <m:t>×</m:t>
+        </m:r>
+        <m:sSup>
+          <m:sSupPr>
+            <m:ctrlPr>
+              <w:rPr>
+                <w:rFonts w:ascii="Cambria Math" w:eastAsiaTheme="minorEastAsia" w:hAnsi="Cambria Math"/>
+                <w:i/>
+              </w:rPr>
+            </m:ctrlPr>
+          </m:sSupPr>
+          <m:e>
+            <m:r>
+              <w:rPr>
+                <w:rFonts w:ascii="Cambria Math" w:eastAsiaTheme="minorEastAsia" w:hAnsi="Cambria Math"/>
+              </w:rPr>
+              <m:t>2</m:t>
+            </m:r>
+          </m:e>
+          <m:sup>
+            <m:r>
+              <w:rPr>
+                <w:rFonts w:ascii="Cambria Math" w:eastAsiaTheme="minorEastAsia" w:hAnsi="Cambria Math"/>
+                <w:vertAlign w:val="superscript"/>
+              </w:rPr>
+              <m:t>127</m:t>
+            </m:r>
+          </m:sup>
+        </m:sSup>
+      </m:oMath>
+      <w:r>
+        <w:rPr>
+          <w:rFonts w:eastAsiaTheme="minorEastAsia"/>
+        </w:rPr>
+        <w:t>.</w:t>
+      </w:r>
+    </w:p>
+    <w:p>
+      <w:pPr>
+        <w:pStyle w:val="Cmsor1"/>
+      </w:pPr>
+      <w:bookmarkStart w:id="5" w:name="_Toc218287246"/>
+      <w:r>
+        <w:t>Fejlesztői dokumentáció</w:t>
+      </w:r>
+      <w:bookmarkEnd w:id="5"/>
+    </w:p>
+    <w:p>
+      <w:pPr>
+        <w:pStyle w:val="Cmsor2"/>
+      </w:pPr>
+      <w:bookmarkStart w:id="6" w:name="_Toc218287247"/>
       <w:r>
         <w:t>BCD számábrázolás</w:t>
       </w:r>
+      <w:bookmarkEnd w:id="6"/>
     </w:p>
     <w:p>
       <w:r>
@@ -522,7 +1915,7 @@
     </w:p>
     <w:p>
       <w:r>
-        <w:t>Ha hozzáveszünk egy igaz-hamis változót a pozitív egész számunkhoz, azzal el is készült a teljes egész számok halmaza. A könyvtár jelenleg nem követi az IEEE 754 előjeles nullákra tett szabványát és minden nulla érték pozitívra konvertálódik.</w:t>
+        <w:t>Ha hozzáveszünk egy igaz-hamis változót a pozitív egész számunkhoz, azzal el is készült a teljes egész számok halmaza.</w:t>
       </w:r>
     </w:p>
     <w:p>
@@ -530,13 +1923,46 @@
         <w:t xml:space="preserve">A </w:t>
       </w:r>
       <w:r>
-        <w:t xml:space="preserve">valós számok ábrázolásához csak be kell vezetni egy tizedesjegy számlálót, ami megmondja hogy az adott számjegy tömb elejéről hány darab számjegy jelöl törtértéket. Mivel az egész szám típus nem enged vezető nullákat, így megeshet, hogy a tömb hossza kisebb, mint a </w:t>
-      </w:r>
-      <w:r>
-        <w:t>tizedesjegy számláló</w:t>
-      </w:r>
-      <w:r>
-        <w:t xml:space="preserve"> értéke. Ilyenkor a megfelelő számú nullával kell kibővíteni kiíratáskor a számot.</w:t>
+        <w:t>valós számok ábrázolásához csak be kell vezetni egy tizedesjegy számlálót, ami megmondja hogy az adott számjegy tömb elejéről hány darab számjegy jelöl törtértéket. Mivel az egész szám típus nem enged vezető nullákat, így megeshet, hogy a tömb hossza kisebb, mint a tizedesjegy számláló értéke. Ilyenkor a megfelelő számú nullával kell kibővíteni kiíratáskor a számot.</w:t>
+      </w:r>
+    </w:p>
+    <w:p>
+      <w:r>
+        <w:lastRenderedPageBreak/>
+        <w:t>Ahhoz, hogy ténylegesen pontos legyen a legtöbb számítás, bevezethetünk egy racionális számtípust is, ami az osztás műveletének hibáját küszöböli ki, vagy csökkenti a minimumra. Mivel az osztás ebben a típusban visszavezethető a szorzás műveletére, így beállítástól függően, legfeljebb egyszer, a számítás legvégén kell valójában osztanunk és akkor is csak egyszer.</w:t>
+      </w:r>
+    </w:p>
+    <w:p>
+      <w:pPr>
+        <w:pStyle w:val="Cmsor2"/>
+      </w:pPr>
+      <w:bookmarkStart w:id="7" w:name="_Toc218287248"/>
+      <w:r>
+        <w:t>Megvalósítás</w:t>
+      </w:r>
+      <w:bookmarkEnd w:id="7"/>
+    </w:p>
+    <w:p>
+      <w:pPr>
+        <w:pStyle w:val="Cmsor3"/>
+      </w:pPr>
+      <w:bookmarkStart w:id="8" w:name="_Toc218287249"/>
+      <w:r>
+        <w:t>Számjegy típus (Digit)</w:t>
+      </w:r>
+      <w:bookmarkEnd w:id="8"/>
+    </w:p>
+    <w:p>
+      <w:r>
+        <w:t>E</w:t>
+      </w:r>
+      <w:r>
+        <w:t>z az osztály írja le egy számjegy viselkedését.</w:t>
+      </w:r>
+    </w:p>
+    <w:p>
+      <w:r>
+        <w:t xml:space="preserve">Mivel a BCD számábrázoláshoz 4 bit memória szükséges ezért egy bájtra </w:t>
       </w:r>
     </w:p>
     <w:sectPr>
@@ -1165,7 +2591,7 @@
   <w:style w:type="paragraph" w:default="1" w:styleId="Norml">
     <w:name w:val="Normal"/>
     <w:qFormat/>
-    <w:rsid w:val="006167EA"/>
+    <w:rsid w:val="00B413F5"/>
     <w:pPr>
       <w:spacing w:line="360" w:lineRule="auto"/>
       <w:ind w:firstLine="227"/>
@@ -1223,10 +2649,9 @@
     <w:next w:val="Norml"/>
     <w:link w:val="Cmsor3Char"/>
     <w:uiPriority w:val="9"/>
-    <w:semiHidden/>
     <w:unhideWhenUsed/>
     <w:qFormat/>
-    <w:rsid w:val="005E0566"/>
+    <w:rsid w:val="008D1B23"/>
     <w:pPr>
       <w:keepNext/>
       <w:keepLines/>
@@ -1235,7 +2660,6 @@
     </w:pPr>
     <w:rPr>
       <w:rFonts w:eastAsiaTheme="majorEastAsia" w:cstheme="majorBidi"/>
-      <w:color w:val="0F4761" w:themeColor="accent1" w:themeShade="BF"/>
       <w:sz w:val="28"/>
       <w:szCs w:val="28"/>
     </w:rPr>
@@ -1375,7 +2799,6 @@
   <w:style w:type="character" w:default="1" w:styleId="Bekezdsalapbettpusa">
     <w:name w:val="Default Paragraph Font"/>
     <w:uiPriority w:val="1"/>
-    <w:semiHidden/>
     <w:unhideWhenUsed/>
   </w:style>
   <w:style w:type="table" w:default="1" w:styleId="Normltblzat">
@@ -1428,11 +2851,9 @@
     <w:basedOn w:val="Bekezdsalapbettpusa"/>
     <w:link w:val="Cmsor3"/>
     <w:uiPriority w:val="9"/>
-    <w:semiHidden/>
-    <w:rsid w:val="005E0566"/>
+    <w:rsid w:val="008D1B23"/>
     <w:rPr>
-      <w:rFonts w:eastAsiaTheme="majorEastAsia" w:cstheme="majorBidi"/>
-      <w:color w:val="0F4761" w:themeColor="accent1" w:themeShade="BF"/>
+      <w:rFonts w:ascii="Times New Roman" w:eastAsiaTheme="majorEastAsia" w:hAnsi="Times New Roman" w:cstheme="majorBidi"/>
       <w:sz w:val="28"/>
       <w:szCs w:val="28"/>
     </w:rPr>
@@ -1804,6 +3225,42 @@
     <w:rPr>
       <w:rFonts w:ascii="Times New Roman" w:hAnsi="Times New Roman"/>
       <w:sz w:val="24"/>
+    </w:rPr>
+  </w:style>
+  <w:style w:type="paragraph" w:styleId="TJ2">
+    <w:name w:val="toc 2"/>
+    <w:basedOn w:val="Norml"/>
+    <w:next w:val="Norml"/>
+    <w:autoRedefine/>
+    <w:uiPriority w:val="39"/>
+    <w:unhideWhenUsed/>
+    <w:rsid w:val="00E82E7E"/>
+    <w:pPr>
+      <w:spacing w:after="100"/>
+      <w:ind w:left="240"/>
+    </w:pPr>
+  </w:style>
+  <w:style w:type="paragraph" w:styleId="TJ3">
+    <w:name w:val="toc 3"/>
+    <w:basedOn w:val="Norml"/>
+    <w:next w:val="Norml"/>
+    <w:autoRedefine/>
+    <w:uiPriority w:val="39"/>
+    <w:unhideWhenUsed/>
+    <w:rsid w:val="00E82E7E"/>
+    <w:pPr>
+      <w:spacing w:after="100"/>
+      <w:ind w:left="480"/>
+    </w:pPr>
+  </w:style>
+  <w:style w:type="character" w:styleId="Helyrzszveg">
+    <w:name w:val="Placeholder Text"/>
+    <w:basedOn w:val="Bekezdsalapbettpusa"/>
+    <w:uiPriority w:val="99"/>
+    <w:semiHidden/>
+    <w:rsid w:val="00FB502C"/>
+    <w:rPr>
+      <w:color w:val="666666"/>
     </w:rPr>
   </w:style>
 </w:styles>

</xml_diff>

<commit_message>
Finishing the first chapter of the documentation.
</commit_message>
<xml_diff>
--- a/Documentation.docx
+++ b/Documentation.docx
@@ -176,7 +176,7 @@
         </w:tc>
       </w:tr>
     </w:tbl>
-    <w:bookmarkStart w:id="0" w:name="_Toc218287241" w:displacedByCustomXml="next"/>
+    <w:bookmarkStart w:id="0" w:name="_Toc218308088" w:displacedByCustomXml="next"/>
     <w:sdt>
       <w:sdtPr>
         <w:rPr>
@@ -228,7 +228,7 @@
           <w:r>
             <w:fldChar w:fldCharType="separate"/>
           </w:r>
-          <w:hyperlink w:anchor="_Toc218287241" w:history="1">
+          <w:hyperlink w:anchor="_Toc218308088" w:history="1">
             <w:r>
               <w:rPr>
                 <w:rStyle w:val="Hiperhivatkozs"/>
@@ -255,7 +255,7 @@
                 <w:noProof/>
                 <w:webHidden/>
               </w:rPr>
-              <w:instrText xml:space="preserve"> PAGEREF _Toc218287241 \h </w:instrText>
+              <w:instrText xml:space="preserve"> PAGEREF _Toc218308088 \h </w:instrText>
             </w:r>
             <w:r>
               <w:rPr>
@@ -299,7 +299,7 @@
               <w:lang w:eastAsia="hu-HU"/>
             </w:rPr>
           </w:pPr>
-          <w:hyperlink w:anchor="_Toc218287242" w:history="1">
+          <w:hyperlink w:anchor="_Toc218308089" w:history="1">
             <w:r>
               <w:rPr>
                 <w:rStyle w:val="Hiperhivatkozs"/>
@@ -326,7 +326,7 @@
                 <w:noProof/>
                 <w:webHidden/>
               </w:rPr>
-              <w:instrText xml:space="preserve"> PAGEREF _Toc218287242 \h </w:instrText>
+              <w:instrText xml:space="preserve"> PAGEREF _Toc218308089 \h </w:instrText>
             </w:r>
             <w:r>
               <w:rPr>
@@ -346,7 +346,7 @@
                 <w:noProof/>
                 <w:webHidden/>
               </w:rPr>
-              <w:t>2</w:t>
+              <w:t>3</w:t>
             </w:r>
             <w:r>
               <w:rPr>
@@ -370,7 +370,7 @@
               <w:lang w:eastAsia="hu-HU"/>
             </w:rPr>
           </w:pPr>
-          <w:hyperlink w:anchor="_Toc218287243" w:history="1">
+          <w:hyperlink w:anchor="_Toc218308090" w:history="1">
             <w:r>
               <w:rPr>
                 <w:rStyle w:val="Hiperhivatkozs"/>
@@ -397,7 +397,7 @@
                 <w:noProof/>
                 <w:webHidden/>
               </w:rPr>
-              <w:instrText xml:space="preserve"> PAGEREF _Toc218287243 \h </w:instrText>
+              <w:instrText xml:space="preserve"> PAGEREF _Toc218308090 \h </w:instrText>
             </w:r>
             <w:r>
               <w:rPr>
@@ -417,7 +417,7 @@
                 <w:noProof/>
                 <w:webHidden/>
               </w:rPr>
-              <w:t>3</w:t>
+              <w:t>4</w:t>
             </w:r>
             <w:r>
               <w:rPr>
@@ -435,10 +435,13 @@
               <w:tab w:val="right" w:leader="dot" w:pos="9062"/>
             </w:tabs>
             <w:rPr>
+              <w:rFonts w:asciiTheme="minorHAnsi" w:eastAsiaTheme="minorEastAsia" w:hAnsiTheme="minorHAnsi"/>
               <w:noProof/>
+              <w:szCs w:val="24"/>
+              <w:lang w:eastAsia="hu-HU"/>
             </w:rPr>
           </w:pPr>
-          <w:hyperlink w:anchor="_Toc218287244" w:history="1">
+          <w:hyperlink w:anchor="_Toc218308091" w:history="1">
             <w:r>
               <w:rPr>
                 <w:rStyle w:val="Hiperhivatkozs"/>
@@ -465,7 +468,7 @@
                 <w:noProof/>
                 <w:webHidden/>
               </w:rPr>
-              <w:instrText xml:space="preserve"> PAGEREF _Toc218287244 \h </w:instrText>
+              <w:instrText xml:space="preserve"> PAGEREF _Toc218308091 \h </w:instrText>
             </w:r>
             <w:r>
               <w:rPr>
@@ -485,7 +488,7 @@
                 <w:noProof/>
                 <w:webHidden/>
               </w:rPr>
-              <w:t>3</w:t>
+              <w:t>4</w:t>
             </w:r>
             <w:r>
               <w:rPr>
@@ -503,10 +506,13 @@
               <w:tab w:val="right" w:leader="dot" w:pos="9062"/>
             </w:tabs>
             <w:rPr>
+              <w:rFonts w:asciiTheme="minorHAnsi" w:eastAsiaTheme="minorEastAsia" w:hAnsiTheme="minorHAnsi"/>
               <w:noProof/>
+              <w:szCs w:val="24"/>
+              <w:lang w:eastAsia="hu-HU"/>
             </w:rPr>
           </w:pPr>
-          <w:hyperlink w:anchor="_Toc218287245" w:history="1">
+          <w:hyperlink w:anchor="_Toc218308092" w:history="1">
             <w:r>
               <w:rPr>
                 <w:rStyle w:val="Hiperhivatkozs"/>
@@ -533,7 +539,7 @@
                 <w:noProof/>
                 <w:webHidden/>
               </w:rPr>
-              <w:instrText xml:space="preserve"> PAGEREF _Toc218287245 \h </w:instrText>
+              <w:instrText xml:space="preserve"> PAGEREF _Toc218308092 \h </w:instrText>
             </w:r>
             <w:r>
               <w:rPr>
@@ -553,7 +559,149 @@
                 <w:noProof/>
                 <w:webHidden/>
               </w:rPr>
-              <w:t>3</w:t>
+              <w:t>5</w:t>
+            </w:r>
+            <w:r>
+              <w:rPr>
+                <w:noProof/>
+                <w:webHidden/>
+              </w:rPr>
+              <w:fldChar w:fldCharType="end"/>
+            </w:r>
+          </w:hyperlink>
+        </w:p>
+        <w:p>
+          <w:pPr>
+            <w:pStyle w:val="TJ2"/>
+            <w:tabs>
+              <w:tab w:val="right" w:leader="dot" w:pos="9062"/>
+            </w:tabs>
+            <w:rPr>
+              <w:rFonts w:asciiTheme="minorHAnsi" w:eastAsiaTheme="minorEastAsia" w:hAnsiTheme="minorHAnsi"/>
+              <w:noProof/>
+              <w:szCs w:val="24"/>
+              <w:lang w:eastAsia="hu-HU"/>
+            </w:rPr>
+          </w:pPr>
+          <w:hyperlink w:anchor="_Toc218308093" w:history="1">
+            <w:r>
+              <w:rPr>
+                <w:rStyle w:val="Hiperhivatkozs"/>
+                <w:noProof/>
+              </w:rPr>
+              <w:t>Implementációk</w:t>
+            </w:r>
+            <w:r>
+              <w:rPr>
+                <w:noProof/>
+                <w:webHidden/>
+              </w:rPr>
+              <w:tab/>
+            </w:r>
+            <w:r>
+              <w:rPr>
+                <w:noProof/>
+                <w:webHidden/>
+              </w:rPr>
+              <w:fldChar w:fldCharType="begin"/>
+            </w:r>
+            <w:r>
+              <w:rPr>
+                <w:noProof/>
+                <w:webHidden/>
+              </w:rPr>
+              <w:instrText xml:space="preserve"> PAGEREF _Toc218308093 \h </w:instrText>
+            </w:r>
+            <w:r>
+              <w:rPr>
+                <w:noProof/>
+                <w:webHidden/>
+              </w:rPr>
+            </w:r>
+            <w:r>
+              <w:rPr>
+                <w:noProof/>
+                <w:webHidden/>
+              </w:rPr>
+              <w:fldChar w:fldCharType="separate"/>
+            </w:r>
+            <w:r>
+              <w:rPr>
+                <w:noProof/>
+                <w:webHidden/>
+              </w:rPr>
+              <w:t>5</w:t>
+            </w:r>
+            <w:r>
+              <w:rPr>
+                <w:noProof/>
+                <w:webHidden/>
+              </w:rPr>
+              <w:fldChar w:fldCharType="end"/>
+            </w:r>
+          </w:hyperlink>
+        </w:p>
+        <w:p>
+          <w:pPr>
+            <w:pStyle w:val="TJ2"/>
+            <w:tabs>
+              <w:tab w:val="right" w:leader="dot" w:pos="9062"/>
+            </w:tabs>
+            <w:rPr>
+              <w:rFonts w:asciiTheme="minorHAnsi" w:eastAsiaTheme="minorEastAsia" w:hAnsiTheme="minorHAnsi"/>
+              <w:noProof/>
+              <w:szCs w:val="24"/>
+              <w:lang w:eastAsia="hu-HU"/>
+            </w:rPr>
+          </w:pPr>
+          <w:hyperlink w:anchor="_Toc218308094" w:history="1">
+            <w:r>
+              <w:rPr>
+                <w:rStyle w:val="Hiperhivatkozs"/>
+                <w:noProof/>
+              </w:rPr>
+              <w:t>Konklúzió</w:t>
+            </w:r>
+            <w:r>
+              <w:rPr>
+                <w:noProof/>
+                <w:webHidden/>
+              </w:rPr>
+              <w:tab/>
+            </w:r>
+            <w:r>
+              <w:rPr>
+                <w:noProof/>
+                <w:webHidden/>
+              </w:rPr>
+              <w:fldChar w:fldCharType="begin"/>
+            </w:r>
+            <w:r>
+              <w:rPr>
+                <w:noProof/>
+                <w:webHidden/>
+              </w:rPr>
+              <w:instrText xml:space="preserve"> PAGEREF _Toc218308094 \h </w:instrText>
+            </w:r>
+            <w:r>
+              <w:rPr>
+                <w:noProof/>
+                <w:webHidden/>
+              </w:rPr>
+            </w:r>
+            <w:r>
+              <w:rPr>
+                <w:noProof/>
+                <w:webHidden/>
+              </w:rPr>
+              <w:fldChar w:fldCharType="separate"/>
+            </w:r>
+            <w:r>
+              <w:rPr>
+                <w:noProof/>
+                <w:webHidden/>
+              </w:rPr>
+              <w:t>6</w:t>
             </w:r>
             <w:r>
               <w:rPr>
@@ -577,7 +725,7 @@
               <w:lang w:eastAsia="hu-HU"/>
             </w:rPr>
           </w:pPr>
-          <w:hyperlink w:anchor="_Toc218287246" w:history="1">
+          <w:hyperlink w:anchor="_Toc218308095" w:history="1">
             <w:r>
               <w:rPr>
                 <w:rStyle w:val="Hiperhivatkozs"/>
@@ -604,7 +752,7 @@
                 <w:noProof/>
                 <w:webHidden/>
               </w:rPr>
-              <w:instrText xml:space="preserve"> PAGEREF _Toc218287246 \h </w:instrText>
+              <w:instrText xml:space="preserve"> PAGEREF _Toc218308095 \h </w:instrText>
             </w:r>
             <w:r>
               <w:rPr>
@@ -624,7 +772,7 @@
                 <w:noProof/>
                 <w:webHidden/>
               </w:rPr>
-              <w:t>4</w:t>
+              <w:t>7</w:t>
             </w:r>
             <w:r>
               <w:rPr>
@@ -642,10 +790,13 @@
               <w:tab w:val="right" w:leader="dot" w:pos="9062"/>
             </w:tabs>
             <w:rPr>
+              <w:rFonts w:asciiTheme="minorHAnsi" w:eastAsiaTheme="minorEastAsia" w:hAnsiTheme="minorHAnsi"/>
               <w:noProof/>
+              <w:szCs w:val="24"/>
+              <w:lang w:eastAsia="hu-HU"/>
             </w:rPr>
           </w:pPr>
-          <w:hyperlink w:anchor="_Toc218287247" w:history="1">
+          <w:hyperlink w:anchor="_Toc218308096" w:history="1">
             <w:r>
               <w:rPr>
                 <w:rStyle w:val="Hiperhivatkozs"/>
@@ -672,7 +823,7 @@
                 <w:noProof/>
                 <w:webHidden/>
               </w:rPr>
-              <w:instrText xml:space="preserve"> PAGEREF _Toc218287247 \h </w:instrText>
+              <w:instrText xml:space="preserve"> PAGEREF _Toc218308096 \h </w:instrText>
             </w:r>
             <w:r>
               <w:rPr>
@@ -692,7 +843,7 @@
                 <w:noProof/>
                 <w:webHidden/>
               </w:rPr>
-              <w:t>4</w:t>
+              <w:t>7</w:t>
             </w:r>
             <w:r>
               <w:rPr>
@@ -710,16 +861,19 @@
               <w:tab w:val="right" w:leader="dot" w:pos="9062"/>
             </w:tabs>
             <w:rPr>
+              <w:rFonts w:asciiTheme="minorHAnsi" w:eastAsiaTheme="minorEastAsia" w:hAnsiTheme="minorHAnsi"/>
               <w:noProof/>
+              <w:szCs w:val="24"/>
+              <w:lang w:eastAsia="hu-HU"/>
             </w:rPr>
           </w:pPr>
-          <w:hyperlink w:anchor="_Toc218287248" w:history="1">
+          <w:hyperlink w:anchor="_Toc218308097" w:history="1">
             <w:r>
               <w:rPr>
                 <w:rStyle w:val="Hiperhivatkozs"/>
                 <w:noProof/>
               </w:rPr>
-              <w:t>Megvalósítás</w:t>
+              <w:t>Számtípusok megvalósítása</w:t>
             </w:r>
             <w:r>
               <w:rPr>
@@ -740,7 +894,7 @@
                 <w:noProof/>
                 <w:webHidden/>
               </w:rPr>
-              <w:instrText xml:space="preserve"> PAGEREF _Toc218287248 \h </w:instrText>
+              <w:instrText xml:space="preserve"> PAGEREF _Toc218308097 \h </w:instrText>
             </w:r>
             <w:r>
               <w:rPr>
@@ -760,7 +914,7 @@
                 <w:noProof/>
                 <w:webHidden/>
               </w:rPr>
-              <w:t>4</w:t>
+              <w:t>7</w:t>
             </w:r>
             <w:r>
               <w:rPr>
@@ -778,10 +932,13 @@
               <w:tab w:val="right" w:leader="dot" w:pos="9062"/>
             </w:tabs>
             <w:rPr>
+              <w:rFonts w:asciiTheme="minorHAnsi" w:eastAsiaTheme="minorEastAsia" w:hAnsiTheme="minorHAnsi"/>
               <w:noProof/>
+              <w:szCs w:val="24"/>
+              <w:lang w:eastAsia="hu-HU"/>
             </w:rPr>
           </w:pPr>
-          <w:hyperlink w:anchor="_Toc218287249" w:history="1">
+          <w:hyperlink w:anchor="_Toc218308098" w:history="1">
             <w:r>
               <w:rPr>
                 <w:rStyle w:val="Hiperhivatkozs"/>
@@ -808,7 +965,7 @@
                 <w:noProof/>
                 <w:webHidden/>
               </w:rPr>
-              <w:instrText xml:space="preserve"> PAGEREF _Toc218287249 \h </w:instrText>
+              <w:instrText xml:space="preserve"> PAGEREF _Toc218308098 \h </w:instrText>
             </w:r>
             <w:r>
               <w:rPr>
@@ -828,7 +985,1285 @@
                 <w:noProof/>
                 <w:webHidden/>
               </w:rPr>
-              <w:t>4</w:t>
+              <w:t>7</w:t>
+            </w:r>
+            <w:r>
+              <w:rPr>
+                <w:noProof/>
+                <w:webHidden/>
+              </w:rPr>
+              <w:fldChar w:fldCharType="end"/>
+            </w:r>
+          </w:hyperlink>
+        </w:p>
+        <w:p>
+          <w:pPr>
+            <w:pStyle w:val="TJ3"/>
+            <w:tabs>
+              <w:tab w:val="right" w:leader="dot" w:pos="9062"/>
+            </w:tabs>
+            <w:rPr>
+              <w:rFonts w:asciiTheme="minorHAnsi" w:eastAsiaTheme="minorEastAsia" w:hAnsiTheme="minorHAnsi"/>
+              <w:noProof/>
+              <w:szCs w:val="24"/>
+              <w:lang w:eastAsia="hu-HU"/>
+            </w:rPr>
+          </w:pPr>
+          <w:hyperlink w:anchor="_Toc218308099" w:history="1">
+            <w:r>
+              <w:rPr>
+                <w:rStyle w:val="Hiperhivatkozs"/>
+                <w:noProof/>
+              </w:rPr>
+              <w:t>Természetes szám típus (Natural)</w:t>
+            </w:r>
+            <w:r>
+              <w:rPr>
+                <w:noProof/>
+                <w:webHidden/>
+              </w:rPr>
+              <w:tab/>
+            </w:r>
+            <w:r>
+              <w:rPr>
+                <w:noProof/>
+                <w:webHidden/>
+              </w:rPr>
+              <w:fldChar w:fldCharType="begin"/>
+            </w:r>
+            <w:r>
+              <w:rPr>
+                <w:noProof/>
+                <w:webHidden/>
+              </w:rPr>
+              <w:instrText xml:space="preserve"> PAGEREF _Toc218308099 \h </w:instrText>
+            </w:r>
+            <w:r>
+              <w:rPr>
+                <w:noProof/>
+                <w:webHidden/>
+              </w:rPr>
+            </w:r>
+            <w:r>
+              <w:rPr>
+                <w:noProof/>
+                <w:webHidden/>
+              </w:rPr>
+              <w:fldChar w:fldCharType="separate"/>
+            </w:r>
+            <w:r>
+              <w:rPr>
+                <w:noProof/>
+                <w:webHidden/>
+              </w:rPr>
+              <w:t>8</w:t>
+            </w:r>
+            <w:r>
+              <w:rPr>
+                <w:noProof/>
+                <w:webHidden/>
+              </w:rPr>
+              <w:fldChar w:fldCharType="end"/>
+            </w:r>
+          </w:hyperlink>
+        </w:p>
+        <w:p>
+          <w:pPr>
+            <w:pStyle w:val="TJ3"/>
+            <w:tabs>
+              <w:tab w:val="right" w:leader="dot" w:pos="9062"/>
+            </w:tabs>
+            <w:rPr>
+              <w:rFonts w:asciiTheme="minorHAnsi" w:eastAsiaTheme="minorEastAsia" w:hAnsiTheme="minorHAnsi"/>
+              <w:noProof/>
+              <w:szCs w:val="24"/>
+              <w:lang w:eastAsia="hu-HU"/>
+            </w:rPr>
+          </w:pPr>
+          <w:hyperlink w:anchor="_Toc218308100" w:history="1">
+            <w:r>
+              <w:rPr>
+                <w:rStyle w:val="Hiperhivatkozs"/>
+                <w:noProof/>
+              </w:rPr>
+              <w:t>Egész szám típus (Integer)</w:t>
+            </w:r>
+            <w:r>
+              <w:rPr>
+                <w:noProof/>
+                <w:webHidden/>
+              </w:rPr>
+              <w:tab/>
+            </w:r>
+            <w:r>
+              <w:rPr>
+                <w:noProof/>
+                <w:webHidden/>
+              </w:rPr>
+              <w:fldChar w:fldCharType="begin"/>
+            </w:r>
+            <w:r>
+              <w:rPr>
+                <w:noProof/>
+                <w:webHidden/>
+              </w:rPr>
+              <w:instrText xml:space="preserve"> PAGEREF _Toc218308100 \h </w:instrText>
+            </w:r>
+            <w:r>
+              <w:rPr>
+                <w:noProof/>
+                <w:webHidden/>
+              </w:rPr>
+            </w:r>
+            <w:r>
+              <w:rPr>
+                <w:noProof/>
+                <w:webHidden/>
+              </w:rPr>
+              <w:fldChar w:fldCharType="separate"/>
+            </w:r>
+            <w:r>
+              <w:rPr>
+                <w:noProof/>
+                <w:webHidden/>
+              </w:rPr>
+              <w:t>8</w:t>
+            </w:r>
+            <w:r>
+              <w:rPr>
+                <w:noProof/>
+                <w:webHidden/>
+              </w:rPr>
+              <w:fldChar w:fldCharType="end"/>
+            </w:r>
+          </w:hyperlink>
+        </w:p>
+        <w:p>
+          <w:pPr>
+            <w:pStyle w:val="TJ3"/>
+            <w:tabs>
+              <w:tab w:val="right" w:leader="dot" w:pos="9062"/>
+            </w:tabs>
+            <w:rPr>
+              <w:rFonts w:asciiTheme="minorHAnsi" w:eastAsiaTheme="minorEastAsia" w:hAnsiTheme="minorHAnsi"/>
+              <w:noProof/>
+              <w:szCs w:val="24"/>
+              <w:lang w:eastAsia="hu-HU"/>
+            </w:rPr>
+          </w:pPr>
+          <w:hyperlink w:anchor="_Toc218308101" w:history="1">
+            <w:r>
+              <w:rPr>
+                <w:rStyle w:val="Hiperhivatkozs"/>
+                <w:noProof/>
+              </w:rPr>
+              <w:t>Pozitív szám típus (Positive)</w:t>
+            </w:r>
+            <w:r>
+              <w:rPr>
+                <w:noProof/>
+                <w:webHidden/>
+              </w:rPr>
+              <w:tab/>
+            </w:r>
+            <w:r>
+              <w:rPr>
+                <w:noProof/>
+                <w:webHidden/>
+              </w:rPr>
+              <w:fldChar w:fldCharType="begin"/>
+            </w:r>
+            <w:r>
+              <w:rPr>
+                <w:noProof/>
+                <w:webHidden/>
+              </w:rPr>
+              <w:instrText xml:space="preserve"> PAGEREF _Toc218308101 \h </w:instrText>
+            </w:r>
+            <w:r>
+              <w:rPr>
+                <w:noProof/>
+                <w:webHidden/>
+              </w:rPr>
+            </w:r>
+            <w:r>
+              <w:rPr>
+                <w:noProof/>
+                <w:webHidden/>
+              </w:rPr>
+              <w:fldChar w:fldCharType="separate"/>
+            </w:r>
+            <w:r>
+              <w:rPr>
+                <w:noProof/>
+                <w:webHidden/>
+              </w:rPr>
+              <w:t>8</w:t>
+            </w:r>
+            <w:r>
+              <w:rPr>
+                <w:noProof/>
+                <w:webHidden/>
+              </w:rPr>
+              <w:fldChar w:fldCharType="end"/>
+            </w:r>
+          </w:hyperlink>
+        </w:p>
+        <w:p>
+          <w:pPr>
+            <w:pStyle w:val="TJ3"/>
+            <w:tabs>
+              <w:tab w:val="right" w:leader="dot" w:pos="9062"/>
+            </w:tabs>
+            <w:rPr>
+              <w:rFonts w:asciiTheme="minorHAnsi" w:eastAsiaTheme="minorEastAsia" w:hAnsiTheme="minorHAnsi"/>
+              <w:noProof/>
+              <w:szCs w:val="24"/>
+              <w:lang w:eastAsia="hu-HU"/>
+            </w:rPr>
+          </w:pPr>
+          <w:hyperlink w:anchor="_Toc218308102" w:history="1">
+            <w:r>
+              <w:rPr>
+                <w:rStyle w:val="Hiperhivatkozs"/>
+                <w:noProof/>
+              </w:rPr>
+              <w:t>Valós szám típus (Writable)</w:t>
+            </w:r>
+            <w:r>
+              <w:rPr>
+                <w:noProof/>
+                <w:webHidden/>
+              </w:rPr>
+              <w:tab/>
+            </w:r>
+            <w:r>
+              <w:rPr>
+                <w:noProof/>
+                <w:webHidden/>
+              </w:rPr>
+              <w:fldChar w:fldCharType="begin"/>
+            </w:r>
+            <w:r>
+              <w:rPr>
+                <w:noProof/>
+                <w:webHidden/>
+              </w:rPr>
+              <w:instrText xml:space="preserve"> PAGEREF _Toc218308102 \h </w:instrText>
+            </w:r>
+            <w:r>
+              <w:rPr>
+                <w:noProof/>
+                <w:webHidden/>
+              </w:rPr>
+            </w:r>
+            <w:r>
+              <w:rPr>
+                <w:noProof/>
+                <w:webHidden/>
+              </w:rPr>
+              <w:fldChar w:fldCharType="separate"/>
+            </w:r>
+            <w:r>
+              <w:rPr>
+                <w:noProof/>
+                <w:webHidden/>
+              </w:rPr>
+              <w:t>8</w:t>
+            </w:r>
+            <w:r>
+              <w:rPr>
+                <w:noProof/>
+                <w:webHidden/>
+              </w:rPr>
+              <w:fldChar w:fldCharType="end"/>
+            </w:r>
+          </w:hyperlink>
+        </w:p>
+        <w:p>
+          <w:pPr>
+            <w:pStyle w:val="TJ3"/>
+            <w:tabs>
+              <w:tab w:val="right" w:leader="dot" w:pos="9062"/>
+            </w:tabs>
+            <w:rPr>
+              <w:rFonts w:asciiTheme="minorHAnsi" w:eastAsiaTheme="minorEastAsia" w:hAnsiTheme="minorHAnsi"/>
+              <w:noProof/>
+              <w:szCs w:val="24"/>
+              <w:lang w:eastAsia="hu-HU"/>
+            </w:rPr>
+          </w:pPr>
+          <w:hyperlink w:anchor="_Toc218308103" w:history="1">
+            <w:r>
+              <w:rPr>
+                <w:rStyle w:val="Hiperhivatkozs"/>
+                <w:noProof/>
+              </w:rPr>
+              <w:t>Racionális szám típus (Rational)</w:t>
+            </w:r>
+            <w:r>
+              <w:rPr>
+                <w:noProof/>
+                <w:webHidden/>
+              </w:rPr>
+              <w:tab/>
+            </w:r>
+            <w:r>
+              <w:rPr>
+                <w:noProof/>
+                <w:webHidden/>
+              </w:rPr>
+              <w:fldChar w:fldCharType="begin"/>
+            </w:r>
+            <w:r>
+              <w:rPr>
+                <w:noProof/>
+                <w:webHidden/>
+              </w:rPr>
+              <w:instrText xml:space="preserve"> PAGEREF _Toc218308103 \h </w:instrText>
+            </w:r>
+            <w:r>
+              <w:rPr>
+                <w:noProof/>
+                <w:webHidden/>
+              </w:rPr>
+            </w:r>
+            <w:r>
+              <w:rPr>
+                <w:noProof/>
+                <w:webHidden/>
+              </w:rPr>
+              <w:fldChar w:fldCharType="separate"/>
+            </w:r>
+            <w:r>
+              <w:rPr>
+                <w:noProof/>
+                <w:webHidden/>
+              </w:rPr>
+              <w:t>8</w:t>
+            </w:r>
+            <w:r>
+              <w:rPr>
+                <w:noProof/>
+                <w:webHidden/>
+              </w:rPr>
+              <w:fldChar w:fldCharType="end"/>
+            </w:r>
+          </w:hyperlink>
+        </w:p>
+        <w:p>
+          <w:pPr>
+            <w:pStyle w:val="TJ2"/>
+            <w:tabs>
+              <w:tab w:val="right" w:leader="dot" w:pos="9062"/>
+            </w:tabs>
+            <w:rPr>
+              <w:rFonts w:asciiTheme="minorHAnsi" w:eastAsiaTheme="minorEastAsia" w:hAnsiTheme="minorHAnsi"/>
+              <w:noProof/>
+              <w:szCs w:val="24"/>
+              <w:lang w:eastAsia="hu-HU"/>
+            </w:rPr>
+          </w:pPr>
+          <w:hyperlink w:anchor="_Toc218308104" w:history="1">
+            <w:r>
+              <w:rPr>
+                <w:rStyle w:val="Hiperhivatkozs"/>
+                <w:noProof/>
+              </w:rPr>
+              <w:t>Számológép megvalósítása</w:t>
+            </w:r>
+            <w:r>
+              <w:rPr>
+                <w:noProof/>
+                <w:webHidden/>
+              </w:rPr>
+              <w:tab/>
+            </w:r>
+            <w:r>
+              <w:rPr>
+                <w:noProof/>
+                <w:webHidden/>
+              </w:rPr>
+              <w:fldChar w:fldCharType="begin"/>
+            </w:r>
+            <w:r>
+              <w:rPr>
+                <w:noProof/>
+                <w:webHidden/>
+              </w:rPr>
+              <w:instrText xml:space="preserve"> PAGEREF _Toc218308104 \h </w:instrText>
+            </w:r>
+            <w:r>
+              <w:rPr>
+                <w:noProof/>
+                <w:webHidden/>
+              </w:rPr>
+            </w:r>
+            <w:r>
+              <w:rPr>
+                <w:noProof/>
+                <w:webHidden/>
+              </w:rPr>
+              <w:fldChar w:fldCharType="separate"/>
+            </w:r>
+            <w:r>
+              <w:rPr>
+                <w:noProof/>
+                <w:webHidden/>
+              </w:rPr>
+              <w:t>8</w:t>
+            </w:r>
+            <w:r>
+              <w:rPr>
+                <w:noProof/>
+                <w:webHidden/>
+              </w:rPr>
+              <w:fldChar w:fldCharType="end"/>
+            </w:r>
+          </w:hyperlink>
+        </w:p>
+        <w:p>
+          <w:pPr>
+            <w:pStyle w:val="TJ3"/>
+            <w:tabs>
+              <w:tab w:val="right" w:leader="dot" w:pos="9062"/>
+            </w:tabs>
+            <w:rPr>
+              <w:rFonts w:asciiTheme="minorHAnsi" w:eastAsiaTheme="minorEastAsia" w:hAnsiTheme="minorHAnsi"/>
+              <w:noProof/>
+              <w:szCs w:val="24"/>
+              <w:lang w:eastAsia="hu-HU"/>
+            </w:rPr>
+          </w:pPr>
+          <w:hyperlink w:anchor="_Toc218308105" w:history="1">
+            <w:r>
+              <w:rPr>
+                <w:rStyle w:val="Hiperhivatkozs"/>
+                <w:noProof/>
+              </w:rPr>
+              <w:t>Parser</w:t>
+            </w:r>
+            <w:r>
+              <w:rPr>
+                <w:noProof/>
+                <w:webHidden/>
+              </w:rPr>
+              <w:tab/>
+            </w:r>
+            <w:r>
+              <w:rPr>
+                <w:noProof/>
+                <w:webHidden/>
+              </w:rPr>
+              <w:fldChar w:fldCharType="begin"/>
+            </w:r>
+            <w:r>
+              <w:rPr>
+                <w:noProof/>
+                <w:webHidden/>
+              </w:rPr>
+              <w:instrText xml:space="preserve"> PAGEREF _Toc218308105 \h </w:instrText>
+            </w:r>
+            <w:r>
+              <w:rPr>
+                <w:noProof/>
+                <w:webHidden/>
+              </w:rPr>
+            </w:r>
+            <w:r>
+              <w:rPr>
+                <w:noProof/>
+                <w:webHidden/>
+              </w:rPr>
+              <w:fldChar w:fldCharType="separate"/>
+            </w:r>
+            <w:r>
+              <w:rPr>
+                <w:noProof/>
+                <w:webHidden/>
+              </w:rPr>
+              <w:t>8</w:t>
+            </w:r>
+            <w:r>
+              <w:rPr>
+                <w:noProof/>
+                <w:webHidden/>
+              </w:rPr>
+              <w:fldChar w:fldCharType="end"/>
+            </w:r>
+          </w:hyperlink>
+        </w:p>
+        <w:p>
+          <w:pPr>
+            <w:pStyle w:val="TJ3"/>
+            <w:tabs>
+              <w:tab w:val="right" w:leader="dot" w:pos="9062"/>
+            </w:tabs>
+            <w:rPr>
+              <w:rFonts w:asciiTheme="minorHAnsi" w:eastAsiaTheme="minorEastAsia" w:hAnsiTheme="minorHAnsi"/>
+              <w:noProof/>
+              <w:szCs w:val="24"/>
+              <w:lang w:eastAsia="hu-HU"/>
+            </w:rPr>
+          </w:pPr>
+          <w:hyperlink w:anchor="_Toc218308106" w:history="1">
+            <w:r>
+              <w:rPr>
+                <w:rStyle w:val="Hiperhivatkozs"/>
+                <w:noProof/>
+              </w:rPr>
+              <w:t>Általános számológép (Standard)</w:t>
+            </w:r>
+            <w:r>
+              <w:rPr>
+                <w:noProof/>
+                <w:webHidden/>
+              </w:rPr>
+              <w:tab/>
+            </w:r>
+            <w:r>
+              <w:rPr>
+                <w:noProof/>
+                <w:webHidden/>
+              </w:rPr>
+              <w:fldChar w:fldCharType="begin"/>
+            </w:r>
+            <w:r>
+              <w:rPr>
+                <w:noProof/>
+                <w:webHidden/>
+              </w:rPr>
+              <w:instrText xml:space="preserve"> PAGEREF _Toc218308106 \h </w:instrText>
+            </w:r>
+            <w:r>
+              <w:rPr>
+                <w:noProof/>
+                <w:webHidden/>
+              </w:rPr>
+            </w:r>
+            <w:r>
+              <w:rPr>
+                <w:noProof/>
+                <w:webHidden/>
+              </w:rPr>
+              <w:fldChar w:fldCharType="separate"/>
+            </w:r>
+            <w:r>
+              <w:rPr>
+                <w:noProof/>
+                <w:webHidden/>
+              </w:rPr>
+              <w:t>8</w:t>
+            </w:r>
+            <w:r>
+              <w:rPr>
+                <w:noProof/>
+                <w:webHidden/>
+              </w:rPr>
+              <w:fldChar w:fldCharType="end"/>
+            </w:r>
+          </w:hyperlink>
+        </w:p>
+        <w:p>
+          <w:pPr>
+            <w:pStyle w:val="TJ3"/>
+            <w:tabs>
+              <w:tab w:val="right" w:leader="dot" w:pos="9062"/>
+            </w:tabs>
+            <w:rPr>
+              <w:rFonts w:asciiTheme="minorHAnsi" w:eastAsiaTheme="minorEastAsia" w:hAnsiTheme="minorHAnsi"/>
+              <w:noProof/>
+              <w:szCs w:val="24"/>
+              <w:lang w:eastAsia="hu-HU"/>
+            </w:rPr>
+          </w:pPr>
+          <w:hyperlink w:anchor="_Toc218308107" w:history="1">
+            <w:r>
+              <w:rPr>
+                <w:rStyle w:val="Hiperhivatkozs"/>
+                <w:noProof/>
+              </w:rPr>
+              <w:t>Euklideszi tér számológép (EuclideanSpace)</w:t>
+            </w:r>
+            <w:r>
+              <w:rPr>
+                <w:noProof/>
+                <w:webHidden/>
+              </w:rPr>
+              <w:tab/>
+            </w:r>
+            <w:r>
+              <w:rPr>
+                <w:noProof/>
+                <w:webHidden/>
+              </w:rPr>
+              <w:fldChar w:fldCharType="begin"/>
+            </w:r>
+            <w:r>
+              <w:rPr>
+                <w:noProof/>
+                <w:webHidden/>
+              </w:rPr>
+              <w:instrText xml:space="preserve"> PAGEREF _Toc218308107 \h </w:instrText>
+            </w:r>
+            <w:r>
+              <w:rPr>
+                <w:noProof/>
+                <w:webHidden/>
+              </w:rPr>
+            </w:r>
+            <w:r>
+              <w:rPr>
+                <w:noProof/>
+                <w:webHidden/>
+              </w:rPr>
+              <w:fldChar w:fldCharType="separate"/>
+            </w:r>
+            <w:r>
+              <w:rPr>
+                <w:noProof/>
+                <w:webHidden/>
+              </w:rPr>
+              <w:t>8</w:t>
+            </w:r>
+            <w:r>
+              <w:rPr>
+                <w:noProof/>
+                <w:webHidden/>
+              </w:rPr>
+              <w:fldChar w:fldCharType="end"/>
+            </w:r>
+          </w:hyperlink>
+        </w:p>
+        <w:p>
+          <w:pPr>
+            <w:pStyle w:val="TJ3"/>
+            <w:tabs>
+              <w:tab w:val="right" w:leader="dot" w:pos="9062"/>
+            </w:tabs>
+            <w:rPr>
+              <w:rFonts w:asciiTheme="minorHAnsi" w:eastAsiaTheme="minorEastAsia" w:hAnsiTheme="minorHAnsi"/>
+              <w:noProof/>
+              <w:szCs w:val="24"/>
+              <w:lang w:eastAsia="hu-HU"/>
+            </w:rPr>
+          </w:pPr>
+          <w:hyperlink w:anchor="_Toc218308108" w:history="1">
+            <w:r>
+              <w:rPr>
+                <w:rStyle w:val="Hiperhivatkozs"/>
+                <w:noProof/>
+              </w:rPr>
+              <w:t>Polinom számológép (Polynomials)</w:t>
+            </w:r>
+            <w:r>
+              <w:rPr>
+                <w:noProof/>
+                <w:webHidden/>
+              </w:rPr>
+              <w:tab/>
+            </w:r>
+            <w:r>
+              <w:rPr>
+                <w:noProof/>
+                <w:webHidden/>
+              </w:rPr>
+              <w:fldChar w:fldCharType="begin"/>
+            </w:r>
+            <w:r>
+              <w:rPr>
+                <w:noProof/>
+                <w:webHidden/>
+              </w:rPr>
+              <w:instrText xml:space="preserve"> PAGEREF _Toc218308108 \h </w:instrText>
+            </w:r>
+            <w:r>
+              <w:rPr>
+                <w:noProof/>
+                <w:webHidden/>
+              </w:rPr>
+            </w:r>
+            <w:r>
+              <w:rPr>
+                <w:noProof/>
+                <w:webHidden/>
+              </w:rPr>
+              <w:fldChar w:fldCharType="separate"/>
+            </w:r>
+            <w:r>
+              <w:rPr>
+                <w:noProof/>
+                <w:webHidden/>
+              </w:rPr>
+              <w:t>8</w:t>
+            </w:r>
+            <w:r>
+              <w:rPr>
+                <w:noProof/>
+                <w:webHidden/>
+              </w:rPr>
+              <w:fldChar w:fldCharType="end"/>
+            </w:r>
+          </w:hyperlink>
+        </w:p>
+        <w:p>
+          <w:pPr>
+            <w:pStyle w:val="TJ3"/>
+            <w:tabs>
+              <w:tab w:val="right" w:leader="dot" w:pos="9062"/>
+            </w:tabs>
+            <w:rPr>
+              <w:rFonts w:asciiTheme="minorHAnsi" w:eastAsiaTheme="minorEastAsia" w:hAnsiTheme="minorHAnsi"/>
+              <w:noProof/>
+              <w:szCs w:val="24"/>
+              <w:lang w:eastAsia="hu-HU"/>
+            </w:rPr>
+          </w:pPr>
+          <w:hyperlink w:anchor="_Toc218308109" w:history="1">
+            <w:r>
+              <w:rPr>
+                <w:rStyle w:val="Hiperhivatkozs"/>
+                <w:noProof/>
+              </w:rPr>
+              <w:t>Integrálközelítés számológép (Integral)</w:t>
+            </w:r>
+            <w:r>
+              <w:rPr>
+                <w:noProof/>
+                <w:webHidden/>
+              </w:rPr>
+              <w:tab/>
+            </w:r>
+            <w:r>
+              <w:rPr>
+                <w:noProof/>
+                <w:webHidden/>
+              </w:rPr>
+              <w:fldChar w:fldCharType="begin"/>
+            </w:r>
+            <w:r>
+              <w:rPr>
+                <w:noProof/>
+                <w:webHidden/>
+              </w:rPr>
+              <w:instrText xml:space="preserve"> PAGEREF _Toc218308109 \h </w:instrText>
+            </w:r>
+            <w:r>
+              <w:rPr>
+                <w:noProof/>
+                <w:webHidden/>
+              </w:rPr>
+            </w:r>
+            <w:r>
+              <w:rPr>
+                <w:noProof/>
+                <w:webHidden/>
+              </w:rPr>
+              <w:fldChar w:fldCharType="separate"/>
+            </w:r>
+            <w:r>
+              <w:rPr>
+                <w:noProof/>
+                <w:webHidden/>
+              </w:rPr>
+              <w:t>8</w:t>
+            </w:r>
+            <w:r>
+              <w:rPr>
+                <w:noProof/>
+                <w:webHidden/>
+              </w:rPr>
+              <w:fldChar w:fldCharType="end"/>
+            </w:r>
+          </w:hyperlink>
+        </w:p>
+        <w:p>
+          <w:pPr>
+            <w:pStyle w:val="TJ2"/>
+            <w:tabs>
+              <w:tab w:val="right" w:leader="dot" w:pos="9062"/>
+            </w:tabs>
+            <w:rPr>
+              <w:rFonts w:asciiTheme="minorHAnsi" w:eastAsiaTheme="minorEastAsia" w:hAnsiTheme="minorHAnsi"/>
+              <w:noProof/>
+              <w:szCs w:val="24"/>
+              <w:lang w:eastAsia="hu-HU"/>
+            </w:rPr>
+          </w:pPr>
+          <w:hyperlink w:anchor="_Toc218308110" w:history="1">
+            <w:r>
+              <w:rPr>
+                <w:rStyle w:val="Hiperhivatkozs"/>
+                <w:noProof/>
+              </w:rPr>
+              <w:t>Vizuális számológép megvalósítása</w:t>
+            </w:r>
+            <w:r>
+              <w:rPr>
+                <w:noProof/>
+                <w:webHidden/>
+              </w:rPr>
+              <w:tab/>
+            </w:r>
+            <w:r>
+              <w:rPr>
+                <w:noProof/>
+                <w:webHidden/>
+              </w:rPr>
+              <w:fldChar w:fldCharType="begin"/>
+            </w:r>
+            <w:r>
+              <w:rPr>
+                <w:noProof/>
+                <w:webHidden/>
+              </w:rPr>
+              <w:instrText xml:space="preserve"> PAGEREF _Toc218308110 \h </w:instrText>
+            </w:r>
+            <w:r>
+              <w:rPr>
+                <w:noProof/>
+                <w:webHidden/>
+              </w:rPr>
+            </w:r>
+            <w:r>
+              <w:rPr>
+                <w:noProof/>
+                <w:webHidden/>
+              </w:rPr>
+              <w:fldChar w:fldCharType="separate"/>
+            </w:r>
+            <w:r>
+              <w:rPr>
+                <w:noProof/>
+                <w:webHidden/>
+              </w:rPr>
+              <w:t>8</w:t>
+            </w:r>
+            <w:r>
+              <w:rPr>
+                <w:noProof/>
+                <w:webHidden/>
+              </w:rPr>
+              <w:fldChar w:fldCharType="end"/>
+            </w:r>
+          </w:hyperlink>
+        </w:p>
+        <w:p>
+          <w:pPr>
+            <w:pStyle w:val="TJ3"/>
+            <w:tabs>
+              <w:tab w:val="right" w:leader="dot" w:pos="9062"/>
+            </w:tabs>
+            <w:rPr>
+              <w:rFonts w:asciiTheme="minorHAnsi" w:eastAsiaTheme="minorEastAsia" w:hAnsiTheme="minorHAnsi"/>
+              <w:noProof/>
+              <w:szCs w:val="24"/>
+              <w:lang w:eastAsia="hu-HU"/>
+            </w:rPr>
+          </w:pPr>
+          <w:hyperlink w:anchor="_Toc218308111" w:history="1">
+            <w:r>
+              <w:rPr>
+                <w:rStyle w:val="Hiperhivatkozs"/>
+                <w:noProof/>
+              </w:rPr>
+              <w:t>Funkciók</w:t>
+            </w:r>
+            <w:r>
+              <w:rPr>
+                <w:noProof/>
+                <w:webHidden/>
+              </w:rPr>
+              <w:tab/>
+            </w:r>
+            <w:r>
+              <w:rPr>
+                <w:noProof/>
+                <w:webHidden/>
+              </w:rPr>
+              <w:fldChar w:fldCharType="begin"/>
+            </w:r>
+            <w:r>
+              <w:rPr>
+                <w:noProof/>
+                <w:webHidden/>
+              </w:rPr>
+              <w:instrText xml:space="preserve"> PAGEREF _Toc218308111 \h </w:instrText>
+            </w:r>
+            <w:r>
+              <w:rPr>
+                <w:noProof/>
+                <w:webHidden/>
+              </w:rPr>
+            </w:r>
+            <w:r>
+              <w:rPr>
+                <w:noProof/>
+                <w:webHidden/>
+              </w:rPr>
+              <w:fldChar w:fldCharType="separate"/>
+            </w:r>
+            <w:r>
+              <w:rPr>
+                <w:noProof/>
+                <w:webHidden/>
+              </w:rPr>
+              <w:t>8</w:t>
+            </w:r>
+            <w:r>
+              <w:rPr>
+                <w:noProof/>
+                <w:webHidden/>
+              </w:rPr>
+              <w:fldChar w:fldCharType="end"/>
+            </w:r>
+          </w:hyperlink>
+        </w:p>
+        <w:p>
+          <w:pPr>
+            <w:pStyle w:val="TJ2"/>
+            <w:tabs>
+              <w:tab w:val="right" w:leader="dot" w:pos="9062"/>
+            </w:tabs>
+            <w:rPr>
+              <w:rFonts w:asciiTheme="minorHAnsi" w:eastAsiaTheme="minorEastAsia" w:hAnsiTheme="minorHAnsi"/>
+              <w:noProof/>
+              <w:szCs w:val="24"/>
+              <w:lang w:eastAsia="hu-HU"/>
+            </w:rPr>
+          </w:pPr>
+          <w:hyperlink w:anchor="_Toc218308112" w:history="1">
+            <w:r>
+              <w:rPr>
+                <w:rStyle w:val="Hiperhivatkozs"/>
+                <w:noProof/>
+              </w:rPr>
+              <w:t>Jövőbeli fejlesztések</w:t>
+            </w:r>
+            <w:r>
+              <w:rPr>
+                <w:noProof/>
+                <w:webHidden/>
+              </w:rPr>
+              <w:tab/>
+            </w:r>
+            <w:r>
+              <w:rPr>
+                <w:noProof/>
+                <w:webHidden/>
+              </w:rPr>
+              <w:fldChar w:fldCharType="begin"/>
+            </w:r>
+            <w:r>
+              <w:rPr>
+                <w:noProof/>
+                <w:webHidden/>
+              </w:rPr>
+              <w:instrText xml:space="preserve"> PAGEREF _Toc218308112 \h </w:instrText>
+            </w:r>
+            <w:r>
+              <w:rPr>
+                <w:noProof/>
+                <w:webHidden/>
+              </w:rPr>
+            </w:r>
+            <w:r>
+              <w:rPr>
+                <w:noProof/>
+                <w:webHidden/>
+              </w:rPr>
+              <w:fldChar w:fldCharType="separate"/>
+            </w:r>
+            <w:r>
+              <w:rPr>
+                <w:noProof/>
+                <w:webHidden/>
+              </w:rPr>
+              <w:t>8</w:t>
+            </w:r>
+            <w:r>
+              <w:rPr>
+                <w:noProof/>
+                <w:webHidden/>
+              </w:rPr>
+              <w:fldChar w:fldCharType="end"/>
+            </w:r>
+          </w:hyperlink>
+        </w:p>
+        <w:p>
+          <w:pPr>
+            <w:pStyle w:val="TJ3"/>
+            <w:tabs>
+              <w:tab w:val="right" w:leader="dot" w:pos="9062"/>
+            </w:tabs>
+            <w:rPr>
+              <w:rFonts w:asciiTheme="minorHAnsi" w:eastAsiaTheme="minorEastAsia" w:hAnsiTheme="minorHAnsi"/>
+              <w:noProof/>
+              <w:szCs w:val="24"/>
+              <w:lang w:eastAsia="hu-HU"/>
+            </w:rPr>
+          </w:pPr>
+          <w:hyperlink w:anchor="_Toc218308113" w:history="1">
+            <w:r>
+              <w:rPr>
+                <w:rStyle w:val="Hiperhivatkozs"/>
+                <w:noProof/>
+              </w:rPr>
+              <w:t>Teljesítményt növelő fejlesztések</w:t>
+            </w:r>
+            <w:r>
+              <w:rPr>
+                <w:noProof/>
+                <w:webHidden/>
+              </w:rPr>
+              <w:tab/>
+            </w:r>
+            <w:r>
+              <w:rPr>
+                <w:noProof/>
+                <w:webHidden/>
+              </w:rPr>
+              <w:fldChar w:fldCharType="begin"/>
+            </w:r>
+            <w:r>
+              <w:rPr>
+                <w:noProof/>
+                <w:webHidden/>
+              </w:rPr>
+              <w:instrText xml:space="preserve"> PAGEREF _Toc218308113 \h </w:instrText>
+            </w:r>
+            <w:r>
+              <w:rPr>
+                <w:noProof/>
+                <w:webHidden/>
+              </w:rPr>
+            </w:r>
+            <w:r>
+              <w:rPr>
+                <w:noProof/>
+                <w:webHidden/>
+              </w:rPr>
+              <w:fldChar w:fldCharType="separate"/>
+            </w:r>
+            <w:r>
+              <w:rPr>
+                <w:noProof/>
+                <w:webHidden/>
+              </w:rPr>
+              <w:t>8</w:t>
+            </w:r>
+            <w:r>
+              <w:rPr>
+                <w:noProof/>
+                <w:webHidden/>
+              </w:rPr>
+              <w:fldChar w:fldCharType="end"/>
+            </w:r>
+          </w:hyperlink>
+        </w:p>
+        <w:p>
+          <w:pPr>
+            <w:pStyle w:val="TJ3"/>
+            <w:tabs>
+              <w:tab w:val="right" w:leader="dot" w:pos="9062"/>
+            </w:tabs>
+            <w:rPr>
+              <w:rFonts w:asciiTheme="minorHAnsi" w:eastAsiaTheme="minorEastAsia" w:hAnsiTheme="minorHAnsi"/>
+              <w:noProof/>
+              <w:szCs w:val="24"/>
+              <w:lang w:eastAsia="hu-HU"/>
+            </w:rPr>
+          </w:pPr>
+          <w:hyperlink w:anchor="_Toc218308114" w:history="1">
+            <w:r>
+              <w:rPr>
+                <w:rStyle w:val="Hiperhivatkozs"/>
+                <w:noProof/>
+              </w:rPr>
+              <w:t>Bővítmények</w:t>
+            </w:r>
+            <w:r>
+              <w:rPr>
+                <w:noProof/>
+                <w:webHidden/>
+              </w:rPr>
+              <w:tab/>
+            </w:r>
+            <w:r>
+              <w:rPr>
+                <w:noProof/>
+                <w:webHidden/>
+              </w:rPr>
+              <w:fldChar w:fldCharType="begin"/>
+            </w:r>
+            <w:r>
+              <w:rPr>
+                <w:noProof/>
+                <w:webHidden/>
+              </w:rPr>
+              <w:instrText xml:space="preserve"> PAGEREF _Toc218308114 \h </w:instrText>
+            </w:r>
+            <w:r>
+              <w:rPr>
+                <w:noProof/>
+                <w:webHidden/>
+              </w:rPr>
+            </w:r>
+            <w:r>
+              <w:rPr>
+                <w:noProof/>
+                <w:webHidden/>
+              </w:rPr>
+              <w:fldChar w:fldCharType="separate"/>
+            </w:r>
+            <w:r>
+              <w:rPr>
+                <w:noProof/>
+                <w:webHidden/>
+              </w:rPr>
+              <w:t>8</w:t>
+            </w:r>
+            <w:r>
+              <w:rPr>
+                <w:noProof/>
+                <w:webHidden/>
+              </w:rPr>
+              <w:fldChar w:fldCharType="end"/>
+            </w:r>
+          </w:hyperlink>
+        </w:p>
+        <w:p>
+          <w:pPr>
+            <w:pStyle w:val="TJ3"/>
+            <w:tabs>
+              <w:tab w:val="right" w:leader="dot" w:pos="9062"/>
+            </w:tabs>
+            <w:rPr>
+              <w:rFonts w:asciiTheme="minorHAnsi" w:eastAsiaTheme="minorEastAsia" w:hAnsiTheme="minorHAnsi"/>
+              <w:noProof/>
+              <w:szCs w:val="24"/>
+              <w:lang w:eastAsia="hu-HU"/>
+            </w:rPr>
+          </w:pPr>
+          <w:hyperlink w:anchor="_Toc218308115" w:history="1">
+            <w:r>
+              <w:rPr>
+                <w:rStyle w:val="Hiperhivatkozs"/>
+                <w:noProof/>
+              </w:rPr>
+              <w:t>Más nyelvekre kiterjesztés</w:t>
+            </w:r>
+            <w:r>
+              <w:rPr>
+                <w:noProof/>
+                <w:webHidden/>
+              </w:rPr>
+              <w:tab/>
+            </w:r>
+            <w:r>
+              <w:rPr>
+                <w:noProof/>
+                <w:webHidden/>
+              </w:rPr>
+              <w:fldChar w:fldCharType="begin"/>
+            </w:r>
+            <w:r>
+              <w:rPr>
+                <w:noProof/>
+                <w:webHidden/>
+              </w:rPr>
+              <w:instrText xml:space="preserve"> PAGEREF _Toc218308115 \h </w:instrText>
+            </w:r>
+            <w:r>
+              <w:rPr>
+                <w:noProof/>
+                <w:webHidden/>
+              </w:rPr>
+            </w:r>
+            <w:r>
+              <w:rPr>
+                <w:noProof/>
+                <w:webHidden/>
+              </w:rPr>
+              <w:fldChar w:fldCharType="separate"/>
+            </w:r>
+            <w:r>
+              <w:rPr>
+                <w:noProof/>
+                <w:webHidden/>
+              </w:rPr>
+              <w:t>8</w:t>
+            </w:r>
+            <w:r>
+              <w:rPr>
+                <w:noProof/>
+                <w:webHidden/>
+              </w:rPr>
+              <w:fldChar w:fldCharType="end"/>
+            </w:r>
+          </w:hyperlink>
+        </w:p>
+        <w:p>
+          <w:pPr>
+            <w:pStyle w:val="TJ2"/>
+            <w:tabs>
+              <w:tab w:val="right" w:leader="dot" w:pos="9062"/>
+            </w:tabs>
+            <w:rPr>
+              <w:rFonts w:asciiTheme="minorHAnsi" w:eastAsiaTheme="minorEastAsia" w:hAnsiTheme="minorHAnsi"/>
+              <w:noProof/>
+              <w:szCs w:val="24"/>
+              <w:lang w:eastAsia="hu-HU"/>
+            </w:rPr>
+          </w:pPr>
+          <w:hyperlink w:anchor="_Toc218308116" w:history="1">
+            <w:r>
+              <w:rPr>
+                <w:rStyle w:val="Hiperhivatkozs"/>
+                <w:noProof/>
+              </w:rPr>
+              <w:t>Köszönetnyilvánítás</w:t>
+            </w:r>
+            <w:r>
+              <w:rPr>
+                <w:noProof/>
+                <w:webHidden/>
+              </w:rPr>
+              <w:tab/>
+            </w:r>
+            <w:r>
+              <w:rPr>
+                <w:noProof/>
+                <w:webHidden/>
+              </w:rPr>
+              <w:fldChar w:fldCharType="begin"/>
+            </w:r>
+            <w:r>
+              <w:rPr>
+                <w:noProof/>
+                <w:webHidden/>
+              </w:rPr>
+              <w:instrText xml:space="preserve"> PAGEREF _Toc218308116 \h </w:instrText>
+            </w:r>
+            <w:r>
+              <w:rPr>
+                <w:noProof/>
+                <w:webHidden/>
+              </w:rPr>
+            </w:r>
+            <w:r>
+              <w:rPr>
+                <w:noProof/>
+                <w:webHidden/>
+              </w:rPr>
+              <w:fldChar w:fldCharType="separate"/>
+            </w:r>
+            <w:r>
+              <w:rPr>
+                <w:noProof/>
+                <w:webHidden/>
+              </w:rPr>
+              <w:t>8</w:t>
             </w:r>
             <w:r>
               <w:rPr>
@@ -859,7 +2294,7 @@
       <w:pPr>
         <w:pStyle w:val="Cmsor1"/>
       </w:pPr>
-      <w:bookmarkStart w:id="1" w:name="_Toc218287242"/>
+      <w:bookmarkStart w:id="1" w:name="_Toc218308089"/>
       <w:r>
         <w:lastRenderedPageBreak/>
         <w:t>Bevezető</w:t>
@@ -966,7 +2401,7 @@
       <w:pPr>
         <w:pStyle w:val="Cmsor1"/>
       </w:pPr>
-      <w:bookmarkStart w:id="2" w:name="_Toc218287243"/>
+      <w:bookmarkStart w:id="2" w:name="_Toc218308090"/>
       <w:r>
         <w:lastRenderedPageBreak/>
         <w:t>Probléma felvetés</w:t>
@@ -977,7 +2412,7 @@
       <w:pPr>
         <w:pStyle w:val="Cmsor2"/>
       </w:pPr>
-      <w:bookmarkStart w:id="3" w:name="_Toc218287244"/>
+      <w:bookmarkStart w:id="3" w:name="_Toc218308091"/>
       <w:r>
         <w:t>Bináris számrendszer</w:t>
       </w:r>
@@ -988,10 +2423,7 @@
         <w:t>M</w:t>
       </w:r>
       <w:r>
-        <w:t xml:space="preserve">ielőtt </w:t>
-      </w:r>
-      <w:r>
-        <w:t>m</w:t>
+        <w:t>ielőtt m</w:t>
       </w:r>
       <w:r>
         <w:t>ég binárisba váltanánk, vegyük figyelembe, hogyan is épül fel a decimális,</w:t>
@@ -1023,14 +2455,110 @@
             <w:rPr>
               <w:rFonts w:ascii="Cambria Math" w:hAnsi="Cambria Math"/>
             </w:rPr>
-            <m:t>123=1×10^2+2×10^1+3×10^0</m:t>
+            <m:t>123=1×</m:t>
           </m:r>
+          <m:sSup>
+            <m:sSupPr>
+              <m:ctrlPr>
+                <w:rPr>
+                  <w:rFonts w:ascii="Cambria Math" w:hAnsi="Cambria Math"/>
+                  <w:i/>
+                </w:rPr>
+              </m:ctrlPr>
+            </m:sSupPr>
+            <m:e>
+              <m:r>
+                <w:rPr>
+                  <w:rFonts w:ascii="Cambria Math" w:hAnsi="Cambria Math"/>
+                </w:rPr>
+                <m:t>10</m:t>
+              </m:r>
+            </m:e>
+            <m:sup>
+              <m:r>
+                <w:rPr>
+                  <w:rFonts w:ascii="Cambria Math" w:hAnsi="Cambria Math"/>
+                </w:rPr>
+                <m:t>2</m:t>
+              </m:r>
+            </m:sup>
+          </m:sSup>
+          <m:r>
+            <w:rPr>
+              <w:rFonts w:ascii="Cambria Math" w:hAnsi="Cambria Math"/>
+            </w:rPr>
+            <m:t>+2×</m:t>
+          </m:r>
+          <m:sSup>
+            <m:sSupPr>
+              <m:ctrlPr>
+                <w:rPr>
+                  <w:rFonts w:ascii="Cambria Math" w:hAnsi="Cambria Math"/>
+                  <w:i/>
+                </w:rPr>
+              </m:ctrlPr>
+            </m:sSupPr>
+            <m:e>
+              <m:r>
+                <w:rPr>
+                  <w:rFonts w:ascii="Cambria Math" w:hAnsi="Cambria Math"/>
+                </w:rPr>
+                <m:t>10</m:t>
+              </m:r>
+            </m:e>
+            <m:sup>
+              <m:r>
+                <w:rPr>
+                  <w:rFonts w:ascii="Cambria Math" w:hAnsi="Cambria Math"/>
+                </w:rPr>
+                <m:t>1</m:t>
+              </m:r>
+            </m:sup>
+          </m:sSup>
+          <m:r>
+            <w:rPr>
+              <w:rFonts w:ascii="Cambria Math" w:hAnsi="Cambria Math"/>
+            </w:rPr>
+            <m:t>+3×</m:t>
+          </m:r>
+          <m:sSup>
+            <m:sSupPr>
+              <m:ctrlPr>
+                <w:rPr>
+                  <w:rFonts w:ascii="Cambria Math" w:hAnsi="Cambria Math"/>
+                  <w:i/>
+                </w:rPr>
+              </m:ctrlPr>
+            </m:sSupPr>
+            <m:e>
+              <m:r>
+                <w:rPr>
+                  <w:rFonts w:ascii="Cambria Math" w:hAnsi="Cambria Math"/>
+                </w:rPr>
+                <m:t>10</m:t>
+              </m:r>
+            </m:e>
+            <m:sup>
+              <m:r>
+                <w:rPr>
+                  <w:rFonts w:ascii="Cambria Math" w:hAnsi="Cambria Math"/>
+                </w:rPr>
+                <m:t>0</m:t>
+              </m:r>
+            </m:sup>
+          </m:sSup>
         </m:oMath>
       </m:oMathPara>
     </w:p>
     <w:p>
       <w:r>
-        <w:t>Tört számok esetén ugyanez az eljárás, csak a tíz hatványait folytatjuk a negatív számokba is:</w:t>
+        <w:t>Tört számok esetén ugyanez az eljárás, csak folytatjuk</w:t>
+      </w:r>
+      <w:r>
+        <w:t xml:space="preserve"> a hatványozást</w:t>
+      </w:r>
+      <w:r>
+        <w:t xml:space="preserve"> a negatív számokba is:</w:t>
       </w:r>
     </w:p>
     <w:p>
@@ -1229,7 +2757,13 @@
     </w:p>
     <w:p>
       <w:r>
-        <w:t>Ezek után már csak értelmeznünk kell mit is jelentenek ezek a szabályok a kettes számrendszerre nézve</w:t>
+        <w:t>Ezek után már csak értelmeznünk kell</w:t>
+      </w:r>
+      <w:r>
+        <w:t>,</w:t>
+      </w:r>
+      <w:r>
+        <w:t xml:space="preserve"> mit is jelentenek ezek a szabályok a kettes számrendszerre nézve</w:t>
       </w:r>
       <w:r>
         <w:t xml:space="preserve">. Egy számjegy maximális értéke </w:t>
@@ -1239,19 +2773,7 @@
           <w:rPr>
             <w:rFonts w:ascii="Cambria Math" w:hAnsi="Cambria Math"/>
           </w:rPr>
-          <m:t>n</m:t>
-        </m:r>
-        <m:r>
-          <w:rPr>
-            <w:rFonts w:ascii="Cambria Math" w:hAnsi="Cambria Math"/>
-          </w:rPr>
-          <m:t>=</m:t>
-        </m:r>
-        <m:r>
-          <w:rPr>
-            <w:rFonts w:ascii="Cambria Math" w:hAnsi="Cambria Math"/>
-          </w:rPr>
-          <m:t>2</m:t>
+          <m:t>n=2</m:t>
         </m:r>
       </m:oMath>
       <w:r>
@@ -1264,9 +2786,27 @@
           </w:rPr>
           <m:t>1</m:t>
         </m:r>
+        <m:r>
+          <w:rPr>
+            <w:rFonts w:ascii="Cambria Math" w:hAnsi="Cambria Math"/>
+          </w:rPr>
+          <m:t>,</m:t>
+        </m:r>
       </m:oMath>
       <w:r>
-        <w:t xml:space="preserve"> és a </w:t>
+        <w:t xml:space="preserve"> a</w:t>
+      </w:r>
+      <w:r>
+        <w:t xml:space="preserve"> </w:t>
+      </w:r>
+      <w:r>
+        <w:t>számjegyeket</w:t>
+      </w:r>
+      <w:r>
+        <w:t xml:space="preserve"> pedig a</w:t>
+      </w:r>
+      <w:r>
+        <w:t xml:space="preserve"> </w:t>
       </w:r>
       <m:oMath>
         <m:r>
@@ -1277,15 +2817,7 @@
         </m:r>
       </m:oMath>
       <w:r>
-        <w:t xml:space="preserve"> hatványaival szorozzuk be </w:t>
-      </w:r>
-      <w:proofErr w:type="spellStart"/>
-      <w:r>
-        <w:t>a</w:t>
-      </w:r>
-      <w:proofErr w:type="spellEnd"/>
-      <w:r>
-        <w:t xml:space="preserve"> számjegyeket.</w:t>
+        <w:t xml:space="preserve"> hatványaival szorozzuk be.</w:t>
       </w:r>
     </w:p>
     <w:p>
@@ -1493,34 +3025,93 @@
             <w:rPr>
               <w:rFonts w:ascii="Cambria Math" w:hAnsi="Cambria Math"/>
             </w:rPr>
-            <m:t>=</m:t>
+            <m:t>==8+0+2+1+½+¼=20.75</m:t>
+          </m:r>
+        </m:oMath>
+      </m:oMathPara>
+    </w:p>
+    <w:p>
+      <w:r>
+        <w:t>Vagyis megteremtettük az átjárást bináris és decimális között az egyik irányba.</w:t>
+      </w:r>
+    </w:p>
+    <w:p>
+      <w:r>
+        <w:t>A decimálisból binárisba átváltásnak is megvannak a maga praktikái. Ám egy intuitív megközelítése a problémának, hogy mindig a legnagyobb olyan helyiértékértékét kivonjuk a decimális értékből ami megvolt benne, annak a helyére egyest írunk, majd addig ismételgetjük ezt az eljárást amíg, nulla nem lesz a maradék.</w:t>
+      </w:r>
+    </w:p>
+    <w:p>
+      <w:pPr>
+        <w:rPr>
+          <w:rFonts w:eastAsiaTheme="minorEastAsia"/>
+        </w:rPr>
+      </w:pPr>
+      <w:r>
+        <w:t>Ezzel jól láthatóan minden iterációval közelebb kerülünk a kívánt végeredményhez, azonban lehet olyan eset, amikor a sorozat csak a végtelenben konvergál a nulla maradékhoz.</w:t>
+      </w:r>
+    </w:p>
+    <w:p>
+      <w:pPr>
+        <w:rPr>
+          <w:rFonts w:eastAsiaTheme="minorEastAsia"/>
+        </w:rPr>
+      </w:pPr>
+      <m:oMathPara>
+        <m:oMath>
+          <m:r>
+            <w:rPr>
+              <w:rFonts w:ascii="Cambria Math" w:eastAsiaTheme="minorEastAsia" w:hAnsi="Cambria Math"/>
+            </w:rPr>
+            <m:t>0.3</m:t>
           </m:r>
           <m:r>
             <w:rPr>
-              <w:rFonts w:ascii="Cambria Math" w:hAnsi="Cambria Math"/>
+              <w:rFonts w:ascii="Cambria Math" w:eastAsiaTheme="minorEastAsia" w:hAnsi="Cambria Math"/>
             </w:rPr>
-            <m:t>=</m:t>
+            <m:t>→</m:t>
           </m:r>
           <m:r>
             <w:rPr>
-              <w:rFonts w:ascii="Cambria Math" w:hAnsi="Cambria Math"/>
+              <w:rFonts w:ascii="Cambria Math" w:eastAsiaTheme="minorEastAsia" w:hAnsi="Cambria Math"/>
             </w:rPr>
-            <m:t>8+0+2+1+½+¼=20.75</m:t>
+            <m:t>0.010011001100110011001100110011001100110011001100110011</m:t>
+          </m:r>
+          <m:r>
+            <w:rPr>
+              <w:rFonts w:ascii="Cambria Math" w:eastAsiaTheme="minorEastAsia" w:hAnsi="Cambria Math"/>
+            </w:rPr>
+            <m:t>→→</m:t>
+          </m:r>
+          <m:r>
+            <w:rPr>
+              <w:rFonts w:ascii="Cambria Math" w:eastAsiaTheme="minorEastAsia" w:hAnsi="Cambria Math"/>
+            </w:rPr>
+            <m:t>0.29999999999999998889776975374843459576368331909179687</m:t>
+          </m:r>
+          <m:r>
+            <w:rPr>
+              <w:rFonts w:ascii="Cambria Math" w:eastAsiaTheme="minorEastAsia" w:hAnsi="Cambria Math"/>
+            </w:rPr>
+            <m:t>5</m:t>
           </m:r>
         </m:oMath>
       </m:oMathPara>
     </w:p>
     <w:p>
       <w:r>
-        <w:t>Vagyis megteremtettük az átjárást bináris és decimális között az egyik irányba. A decimálisból binárisba váltást itt most nem taglaljuk.</w:t>
+        <w:rPr>
+          <w:rFonts w:eastAsiaTheme="minorEastAsia"/>
+        </w:rPr>
+        <w:t>Vagyis megtaláltuk egy hiányosságát ennek a számábrázolási módnak.</w:t>
       </w:r>
     </w:p>
     <w:p>
       <w:pPr>
         <w:pStyle w:val="Cmsor2"/>
       </w:pPr>
-      <w:bookmarkStart w:id="4" w:name="_Toc218287245"/>
-      <w:r>
+      <w:bookmarkStart w:id="4" w:name="_Toc218308092"/>
+      <w:r>
+        <w:lastRenderedPageBreak/>
         <w:t>Lebegőpontos számábrázolás</w:t>
       </w:r>
       <w:bookmarkEnd w:id="4"/>
@@ -1557,13 +3148,7 @@
         <w:t>ne</w:t>
       </w:r>
       <w:r>
-        <w:t xml:space="preserve">k össze, amik sorra a mantissza, az </w:t>
-      </w:r>
-      <w:r>
-        <w:t>előjel</w:t>
-      </w:r>
-      <w:r>
-        <w:t xml:space="preserve"> és a </w:t>
+        <w:t xml:space="preserve">k össze, amik sorra a mantissza, az előjel és a </w:t>
       </w:r>
       <w:r>
         <w:t>karakterisztika</w:t>
@@ -1611,7 +3196,6 @@
     </w:p>
     <w:p>
       <w:r>
-        <w:lastRenderedPageBreak/>
         <w:t>Az előjelet vagy egy előjelbiten szokták tárolni, vagy a kettes komplemens számábrázolás segítségével egybeolvasztják a mantisszával</w:t>
       </w:r>
       <w:r>
@@ -1644,15 +3228,16 @@
       <w:pPr>
         <w:pStyle w:val="Cmsor2"/>
       </w:pPr>
+      <w:bookmarkStart w:id="5" w:name="_Toc218308093"/>
       <w:r>
         <w:t>Implementációk</w:t>
       </w:r>
+      <w:bookmarkEnd w:id="5"/>
     </w:p>
     <w:p>
       <w:pPr>
         <w:rPr>
-          <w:b/>
-          <w:bCs/>
+          <w:rFonts w:eastAsiaTheme="minorEastAsia"/>
         </w:rPr>
       </w:pPr>
       <w:r>
@@ -1662,23 +3247,7 @@
         <w:t>lebegőpontos számformátum</w:t>
       </w:r>
       <w:r>
-        <w:t xml:space="preserve"> meghatározásában az informatikában elterjedt „</w:t>
-      </w:r>
-      <w:proofErr w:type="spellStart"/>
-      <w:r>
-        <w:t>Single</w:t>
-      </w:r>
-      <w:proofErr w:type="spellEnd"/>
-      <w:r>
-        <w:t xml:space="preserve"> </w:t>
-      </w:r>
-      <w:proofErr w:type="spellStart"/>
-      <w:r>
-        <w:t>precision</w:t>
-      </w:r>
-      <w:proofErr w:type="spellEnd"/>
-      <w:r>
-        <w:t xml:space="preserve">” típusú lebegőpontos számformátum </w:t>
+        <w:t xml:space="preserve"> meghatározásában az informatikában elterjedt „Single precision” típusú lebegőpontos számformátum </w:t>
       </w:r>
       <m:oMath>
         <m:r>
@@ -1689,7 +3258,13 @@
         </m:r>
       </m:oMath>
       <w:r>
-        <w:t xml:space="preserve"> bitet használ. Ebből a </w:t>
+        <w:t xml:space="preserve"> bitet használ</w:t>
+      </w:r>
+      <w:r>
+        <w:t>. (Köznyelvi nevén a C programozási nyelvből ismert „float”.)</w:t>
+      </w:r>
+      <w:r>
+        <w:t xml:space="preserve"> Ebből a </w:t>
       </w:r>
       <m:oMath>
         <m:r>
@@ -1764,13 +3339,7 @@
               <w:rPr>
                 <w:rFonts w:ascii="Cambria Math" w:hAnsi="Cambria Math"/>
               </w:rPr>
-              <m:t>-</m:t>
-            </m:r>
-            <m:r>
-              <w:rPr>
-                <w:rFonts w:ascii="Cambria Math" w:hAnsi="Cambria Math"/>
-              </w:rPr>
-              <m:t>126</m:t>
+              <m:t>-126</m:t>
             </m:r>
           </m:sup>
         </m:sSup>
@@ -1869,24 +3438,167 @@
       </w:r>
     </w:p>
     <w:p>
+      <w:r>
+        <w:rPr>
+          <w:rFonts w:eastAsiaTheme="minorEastAsia"/>
+        </w:rPr>
+        <w:t xml:space="preserve">De végtelen szám van a pozitív egész számok halmazában. Nem is beszélve a racionális számok halmazáról. </w:t>
+      </w:r>
+      <w:r>
+        <w:t>Vagyis</w:t>
+      </w:r>
+      <w:r>
+        <w:t xml:space="preserve"> ez azt jelenti, hogy nem tudunk leírni minden </w:t>
+      </w:r>
+      <w:r>
+        <w:t>számot</w:t>
+      </w:r>
+      <w:r>
+        <w:t>. Ami pedig aggasztóbb, nem tudjuk leírni minden számítás eredményét.</w:t>
+      </w:r>
+    </w:p>
+    <w:p>
+      <w:r>
+        <w:t>És a mantissza hosszából kifolyólag az ábrázolandó szám nem nulla számjegyeinek maximális távolsága a Single precision típus esetén</w:t>
+      </w:r>
+      <w:r>
+        <w:t xml:space="preserve"> nem lehet</w:t>
+      </w:r>
+      <w:r>
+        <w:t xml:space="preserve"> nagyobb </w:t>
+      </w:r>
+      <m:oMath>
+        <m:r>
+          <w:rPr>
+            <w:rFonts w:ascii="Cambria Math" w:hAnsi="Cambria Math"/>
+          </w:rPr>
+          <m:t>23</m:t>
+        </m:r>
+      </m:oMath>
+      <w:r>
+        <w:t xml:space="preserve">-nál. Minden olyan szám ami nem teljesíti ezt a feltételt, csak a legnagyobb helyiértéken szereplő számjegyétől számított következő </w:t>
+      </w:r>
+      <m:oMath>
+        <m:r>
+          <w:rPr>
+            <w:rFonts w:ascii="Cambria Math" w:hAnsi="Cambria Math"/>
+          </w:rPr>
+          <m:t>22</m:t>
+        </m:r>
+      </m:oMath>
+      <w:r>
+        <w:t xml:space="preserve"> számjegyét tarthatja meg. Minden más számjegy értéke elveszik.</w:t>
+      </w:r>
+    </w:p>
+    <w:p>
+      <w:pPr>
+        <w:rPr>
+          <w:rFonts w:eastAsiaTheme="minorEastAsia"/>
+        </w:rPr>
+      </w:pPr>
+      <w:r>
+        <w:rPr>
+          <w:rFonts w:eastAsiaTheme="minorEastAsia"/>
+        </w:rPr>
+        <w:t xml:space="preserve">Megoldásnak tűnhet hosszabb memóriával rendelkező </w:t>
+      </w:r>
+      <w:r>
+        <w:rPr>
+          <w:rFonts w:eastAsiaTheme="minorEastAsia"/>
+        </w:rPr>
+        <w:t xml:space="preserve">lebegőpontos számok használata, mint például a „Double precision” („double”) típus, ami már </w:t>
+      </w:r>
+      <w:r>
+        <w:rPr>
+          <w:rFonts w:eastAsiaTheme="minorEastAsia"/>
+        </w:rPr>
+        <w:t>53 bit</w:t>
+      </w:r>
+      <w:r>
+        <w:rPr>
+          <w:rFonts w:eastAsiaTheme="minorEastAsia"/>
+        </w:rPr>
+        <w:t>es mantisszával és</w:t>
+      </w:r>
+      <w:r>
+        <w:rPr>
+          <w:rFonts w:eastAsiaTheme="minorEastAsia"/>
+        </w:rPr>
+        <w:t xml:space="preserve"> 16</w:t>
+      </w:r>
+      <w:r>
+        <w:rPr>
+          <w:rFonts w:eastAsiaTheme="minorEastAsia"/>
+        </w:rPr>
+        <w:t xml:space="preserve"> bites karakterisztikával gazdálkodik. Viszont ennek a típusnak is véges a számábrázolási kapacitása.</w:t>
+      </w:r>
+    </w:p>
+    <w:p>
+      <w:pPr>
+        <w:pStyle w:val="Cmsor2"/>
+        <w:rPr>
+          <w:rFonts w:eastAsiaTheme="minorEastAsia"/>
+        </w:rPr>
+      </w:pPr>
+      <w:bookmarkStart w:id="6" w:name="_Toc218308094"/>
+      <w:r>
+        <w:rPr>
+          <w:rFonts w:eastAsiaTheme="minorEastAsia"/>
+        </w:rPr>
+        <w:lastRenderedPageBreak/>
+        <w:t>Konklúzió</w:t>
+      </w:r>
+      <w:bookmarkEnd w:id="6"/>
+    </w:p>
+    <w:p>
+      <w:r>
+        <w:t xml:space="preserve">Először is, le szeretném szögezni, hogy </w:t>
+      </w:r>
+      <w:r>
+        <w:t xml:space="preserve">a hétköznapi helyzetek többségére tökéletesen megfelelő a lebegőpontos számtípusok használata. Viszont remélem sikerült rámutatnom olyan szembetűnő </w:t>
+      </w:r>
+      <w:r>
+        <w:t>tulajdonságokra</w:t>
+      </w:r>
+      <w:r>
+        <w:t>, amik egyértelműsítik, hogy vannak olyan helyzetek, amikor nem ez a megfelelő eszköz a feladatra.</w:t>
+      </w:r>
+    </w:p>
+    <w:p>
+      <w:r>
+        <w:t>Én ezekre a helyzetekre próbálok kézenfekvő megoldást nyújtani.</w:t>
+      </w:r>
+    </w:p>
+    <w:p>
+      <w:pPr>
+        <w:spacing w:line="259" w:lineRule="auto"/>
+        <w:ind w:firstLine="0"/>
+        <w:jc w:val="left"/>
+      </w:pPr>
+      <w:r>
+        <w:br w:type="page"/>
+      </w:r>
+    </w:p>
+    <w:p>
       <w:pPr>
         <w:pStyle w:val="Cmsor1"/>
       </w:pPr>
-      <w:bookmarkStart w:id="5" w:name="_Toc218287246"/>
-      <w:r>
+      <w:bookmarkStart w:id="7" w:name="_Toc218308095"/>
+      <w:r>
+        <w:lastRenderedPageBreak/>
         <w:t>Fejlesztői dokumentáció</w:t>
       </w:r>
-      <w:bookmarkEnd w:id="5"/>
+      <w:bookmarkEnd w:id="7"/>
     </w:p>
     <w:p>
       <w:pPr>
         <w:pStyle w:val="Cmsor2"/>
       </w:pPr>
-      <w:bookmarkStart w:id="6" w:name="_Toc218287247"/>
+      <w:bookmarkStart w:id="8" w:name="_Toc218308096"/>
       <w:r>
         <w:t>BCD számábrázolás</w:t>
       </w:r>
-      <w:bookmarkEnd w:id="6"/>
+      <w:bookmarkEnd w:id="8"/>
     </w:p>
     <w:p>
       <w:r>
@@ -1928,7 +3640,6 @@
     </w:p>
     <w:p>
       <w:r>
-        <w:lastRenderedPageBreak/>
         <w:t>Ahhoz, hogy ténylegesen pontos legyen a legtöbb számítás, bevezethetünk egy racionális számtípust is, ami az osztás műveletének hibáját küszöböli ki, vagy csökkenti a minimumra. Mivel az osztás ebben a típusban visszavezethető a szorzás műveletére, így beállítástól függően, legfeljebb egyszer, a számítás legvégén kell valójában osztanunk és akkor is csak egyszer.</w:t>
       </w:r>
     </w:p>
@@ -1936,21 +3647,27 @@
       <w:pPr>
         <w:pStyle w:val="Cmsor2"/>
       </w:pPr>
-      <w:bookmarkStart w:id="7" w:name="_Toc218287248"/>
-      <w:r>
-        <w:t>Megvalósítás</w:t>
-      </w:r>
-      <w:bookmarkEnd w:id="7"/>
+      <w:bookmarkStart w:id="9" w:name="_Toc218308097"/>
+      <w:r>
+        <w:t>Számtípusok m</w:t>
+      </w:r>
+      <w:r>
+        <w:t>egvalósítás</w:t>
+      </w:r>
+      <w:r>
+        <w:t>a</w:t>
+      </w:r>
+      <w:bookmarkEnd w:id="9"/>
     </w:p>
     <w:p>
       <w:pPr>
         <w:pStyle w:val="Cmsor3"/>
       </w:pPr>
-      <w:bookmarkStart w:id="8" w:name="_Toc218287249"/>
+      <w:bookmarkStart w:id="10" w:name="_Toc218308098"/>
       <w:r>
         <w:t>Számjegy típus (Digit)</w:t>
       </w:r>
-      <w:bookmarkEnd w:id="8"/>
+      <w:bookmarkEnd w:id="10"/>
     </w:p>
     <w:p>
       <w:r>
@@ -1962,7 +3679,10 @@
     </w:p>
     <w:p>
       <w:r>
-        <w:t xml:space="preserve">Mivel a BCD számábrázoláshoz 4 bit memória szükséges ezért egy bájtra </w:t>
+        <w:t>Mivel a BCD számábrázoláshoz 4 bit memória szükséges ezért egy bájt</w:t>
+      </w:r>
+      <w:r>
+        <w:t>on elfér a szükséges adatmennyiség.</w:t>
       </w:r>
     </w:p>
     <w:sectPr>

</xml_diff>

<commit_message>
Adding all the titles of future content to the documentation.
</commit_message>
<xml_diff>
--- a/Documentation.docx
+++ b/Documentation.docx
@@ -3683,6 +3683,235 @@
       </w:r>
       <w:r>
         <w:t>on elfér a szükséges adatmennyiség.</w:t>
+      </w:r>
+    </w:p>
+    <w:p>
+      <w:pPr>
+        <w:pStyle w:val="Cmsor3"/>
+      </w:pPr>
+      <w:bookmarkStart w:id="11" w:name="_Toc218308099"/>
+      <w:r>
+        <w:lastRenderedPageBreak/>
+        <w:t>Természetes szám típus (Natural)</w:t>
+      </w:r>
+      <w:bookmarkEnd w:id="11"/>
+    </w:p>
+    <w:p>
+      <w:pPr>
+        <w:pStyle w:val="Cmsor3"/>
+      </w:pPr>
+      <w:bookmarkStart w:id="12" w:name="_Toc218308100"/>
+      <w:r>
+        <w:t>Egész szám típus (Integer)</w:t>
+      </w:r>
+      <w:bookmarkEnd w:id="12"/>
+    </w:p>
+    <w:p>
+      <w:pPr>
+        <w:pStyle w:val="Cmsor3"/>
+      </w:pPr>
+      <w:bookmarkStart w:id="13" w:name="_Toc218308101"/>
+      <w:r>
+        <w:t>Pozitív szám típus (Positive)</w:t>
+      </w:r>
+      <w:bookmarkEnd w:id="13"/>
+    </w:p>
+    <w:p>
+      <w:pPr>
+        <w:pStyle w:val="Cmsor3"/>
+      </w:pPr>
+      <w:bookmarkStart w:id="14" w:name="_Toc218308102"/>
+      <w:r>
+        <w:t>Valós szám típus (Writable)</w:t>
+      </w:r>
+      <w:bookmarkEnd w:id="14"/>
+    </w:p>
+    <w:p>
+      <w:pPr>
+        <w:pStyle w:val="Cmsor3"/>
+      </w:pPr>
+      <w:bookmarkStart w:id="15" w:name="_Toc218308103"/>
+      <w:r>
+        <w:t>Racionális szám típus (Rational)</w:t>
+      </w:r>
+      <w:bookmarkEnd w:id="15"/>
+    </w:p>
+    <w:p>
+      <w:pPr>
+        <w:pStyle w:val="Cmsor2"/>
+      </w:pPr>
+      <w:bookmarkStart w:id="16" w:name="_Toc218308104"/>
+      <w:r>
+        <w:t>Számológép megvalósítása</w:t>
+      </w:r>
+      <w:bookmarkEnd w:id="16"/>
+    </w:p>
+    <w:p>
+      <w:pPr>
+        <w:pStyle w:val="Cmsor3"/>
+      </w:pPr>
+      <w:bookmarkStart w:id="17" w:name="_Toc218308105"/>
+      <w:r>
+        <w:t>Parser</w:t>
+      </w:r>
+      <w:bookmarkEnd w:id="17"/>
+    </w:p>
+    <w:p>
+      <w:pPr>
+        <w:pStyle w:val="Cmsor3"/>
+      </w:pPr>
+      <w:bookmarkStart w:id="18" w:name="_Toc218308106"/>
+      <w:r>
+        <w:t>Általános számológép (Standard)</w:t>
+      </w:r>
+      <w:bookmarkEnd w:id="18"/>
+    </w:p>
+    <w:p>
+      <w:pPr>
+        <w:pStyle w:val="Cmsor3"/>
+      </w:pPr>
+      <w:bookmarkStart w:id="19" w:name="_Toc218308107"/>
+      <w:r>
+        <w:t>Euklideszi tér</w:t>
+      </w:r>
+      <w:r>
+        <w:t xml:space="preserve"> számológép (</w:t>
+      </w:r>
+      <w:proofErr w:type="spellStart"/>
+      <w:r>
+        <w:t>EuclideanSpace</w:t>
+      </w:r>
+      <w:proofErr w:type="spellEnd"/>
+      <w:r>
+        <w:t>)</w:t>
+      </w:r>
+      <w:bookmarkEnd w:id="19"/>
+    </w:p>
+    <w:p>
+      <w:pPr>
+        <w:pStyle w:val="Cmsor3"/>
+      </w:pPr>
+      <w:bookmarkStart w:id="20" w:name="_Toc218308108"/>
+      <w:r>
+        <w:t>Polinom</w:t>
+      </w:r>
+      <w:r>
+        <w:t xml:space="preserve"> számológép (</w:t>
+      </w:r>
+      <w:proofErr w:type="spellStart"/>
+      <w:r>
+        <w:t>Polynomials</w:t>
+      </w:r>
+      <w:proofErr w:type="spellEnd"/>
+      <w:r>
+        <w:t>)</w:t>
+      </w:r>
+      <w:bookmarkEnd w:id="20"/>
+    </w:p>
+    <w:p>
+      <w:pPr>
+        <w:pStyle w:val="Cmsor3"/>
+      </w:pPr>
+      <w:bookmarkStart w:id="21" w:name="_Toc218308109"/>
+      <w:r>
+        <w:t>Integrálközelítés</w:t>
+      </w:r>
+      <w:r>
+        <w:t xml:space="preserve"> számológép (</w:t>
+      </w:r>
+      <w:proofErr w:type="spellStart"/>
+      <w:r>
+        <w:t>Integral</w:t>
+      </w:r>
+      <w:proofErr w:type="spellEnd"/>
+      <w:r>
+        <w:t>)</w:t>
+      </w:r>
+      <w:bookmarkEnd w:id="21"/>
+    </w:p>
+    <w:p>
+      <w:pPr>
+        <w:pStyle w:val="Cmsor2"/>
+      </w:pPr>
+      <w:bookmarkStart w:id="22" w:name="_Toc218308110"/>
+      <w:r>
+        <w:t>Vizuális számológép megvalósítása</w:t>
+      </w:r>
+      <w:bookmarkEnd w:id="22"/>
+    </w:p>
+    <w:p>
+      <w:pPr>
+        <w:pStyle w:val="Cmsor3"/>
+      </w:pPr>
+      <w:bookmarkStart w:id="23" w:name="_Toc218308111"/>
+      <w:r>
+        <w:t>Funkciók</w:t>
+      </w:r>
+      <w:bookmarkEnd w:id="23"/>
+    </w:p>
+    <w:p>
+      <w:pPr>
+        <w:pStyle w:val="Cmsor2"/>
+      </w:pPr>
+      <w:bookmarkStart w:id="24" w:name="_Toc218308112"/>
+      <w:r>
+        <w:t>Jövőbeli fejlesztések</w:t>
+      </w:r>
+      <w:bookmarkEnd w:id="24"/>
+    </w:p>
+    <w:p>
+      <w:pPr>
+        <w:pStyle w:val="Cmsor3"/>
+      </w:pPr>
+      <w:bookmarkStart w:id="25" w:name="_Toc218308113"/>
+      <w:r>
+        <w:t>Teljesítményt növelő fejlesztések</w:t>
+      </w:r>
+      <w:bookmarkEnd w:id="25"/>
+    </w:p>
+    <w:p>
+      <w:pPr>
+        <w:pStyle w:val="Cmsor3"/>
+      </w:pPr>
+      <w:bookmarkStart w:id="26" w:name="_Toc218308114"/>
+      <w:r>
+        <w:t>Bővítmények</w:t>
+      </w:r>
+      <w:bookmarkEnd w:id="26"/>
+    </w:p>
+    <w:p>
+      <w:pPr>
+        <w:pStyle w:val="Cmsor3"/>
+      </w:pPr>
+      <w:bookmarkStart w:id="27" w:name="_Toc218308115"/>
+      <w:r>
+        <w:t>Más nyelvekre kiterjesztés</w:t>
+      </w:r>
+      <w:bookmarkEnd w:id="27"/>
+    </w:p>
+    <w:p>
+      <w:pPr>
+        <w:pStyle w:val="Cmsor2"/>
+      </w:pPr>
+      <w:bookmarkStart w:id="28" w:name="_Toc218308116"/>
+      <w:r>
+        <w:t>Köszönetnyilvánítás</w:t>
+      </w:r>
+      <w:bookmarkEnd w:id="28"/>
+    </w:p>
+    <w:p>
+      <w:r>
+        <w:t>Klenovszky Áron – Ötlet és támogatás</w:t>
+      </w:r>
+    </w:p>
+    <w:p>
+      <w:r>
+        <w:t>Lócsi Levente – Témavezetés, matematikai háttér ellenőrzése</w:t>
+      </w:r>
+    </w:p>
+    <w:p>
+      <w:r>
+        <w:t>Török Bálint Bence – Kutatásbeli segítség</w:t>
       </w:r>
     </w:p>
     <w:sectPr>

</xml_diff>

<commit_message>
Fixing test errors caused by removing the option to change the separator character. Addig description to every type in the documentation.
</commit_message>
<xml_diff>
--- a/Documentation.docx
+++ b/Documentation.docx
@@ -176,7 +176,7 @@
         </w:tc>
       </w:tr>
     </w:tbl>
-    <w:bookmarkStart w:id="0" w:name="_Toc218480679" w:displacedByCustomXml="next"/>
+    <w:bookmarkStart w:id="0" w:name="_Toc218619912" w:displacedByCustomXml="next"/>
     <w:sdt>
       <w:sdtPr>
         <w:rPr>
@@ -228,7 +228,7 @@
           <w:r>
             <w:fldChar w:fldCharType="separate"/>
           </w:r>
-          <w:hyperlink w:anchor="_Toc218480679" w:history="1">
+          <w:hyperlink w:anchor="_Toc218619912" w:history="1">
             <w:r>
               <w:rPr>
                 <w:rStyle w:val="Hiperhivatkozs"/>
@@ -255,7 +255,7 @@
                 <w:noProof/>
                 <w:webHidden/>
               </w:rPr>
-              <w:instrText xml:space="preserve"> PAGEREF _Toc218480679 \h </w:instrText>
+              <w:instrText xml:space="preserve"> PAGEREF _Toc218619912 \h </w:instrText>
             </w:r>
             <w:r>
               <w:rPr>
@@ -299,7 +299,7 @@
               <w:lang w:eastAsia="hu-HU"/>
             </w:rPr>
           </w:pPr>
-          <w:hyperlink w:anchor="_Toc218480680" w:history="1">
+          <w:hyperlink w:anchor="_Toc218619913" w:history="1">
             <w:r>
               <w:rPr>
                 <w:rStyle w:val="Hiperhivatkozs"/>
@@ -326,7 +326,7 @@
                 <w:noProof/>
                 <w:webHidden/>
               </w:rPr>
-              <w:instrText xml:space="preserve"> PAGEREF _Toc218480680 \h </w:instrText>
+              <w:instrText xml:space="preserve"> PAGEREF _Toc218619913 \h </w:instrText>
             </w:r>
             <w:r>
               <w:rPr>
@@ -370,7 +370,7 @@
               <w:lang w:eastAsia="hu-HU"/>
             </w:rPr>
           </w:pPr>
-          <w:hyperlink w:anchor="_Toc218480681" w:history="1">
+          <w:hyperlink w:anchor="_Toc218619914" w:history="1">
             <w:r>
               <w:rPr>
                 <w:rStyle w:val="Hiperhivatkozs"/>
@@ -397,7 +397,7 @@
                 <w:noProof/>
                 <w:webHidden/>
               </w:rPr>
-              <w:instrText xml:space="preserve"> PAGEREF _Toc218480681 \h </w:instrText>
+              <w:instrText xml:space="preserve"> PAGEREF _Toc218619914 \h </w:instrText>
             </w:r>
             <w:r>
               <w:rPr>
@@ -441,7 +441,7 @@
               <w:lang w:eastAsia="hu-HU"/>
             </w:rPr>
           </w:pPr>
-          <w:hyperlink w:anchor="_Toc218480682" w:history="1">
+          <w:hyperlink w:anchor="_Toc218619915" w:history="1">
             <w:r>
               <w:rPr>
                 <w:rStyle w:val="Hiperhivatkozs"/>
@@ -468,7 +468,7 @@
                 <w:noProof/>
                 <w:webHidden/>
               </w:rPr>
-              <w:instrText xml:space="preserve"> PAGEREF _Toc218480682 \h </w:instrText>
+              <w:instrText xml:space="preserve"> PAGEREF _Toc218619915 \h </w:instrText>
             </w:r>
             <w:r>
               <w:rPr>
@@ -512,7 +512,7 @@
               <w:lang w:eastAsia="hu-HU"/>
             </w:rPr>
           </w:pPr>
-          <w:hyperlink w:anchor="_Toc218480683" w:history="1">
+          <w:hyperlink w:anchor="_Toc218619916" w:history="1">
             <w:r>
               <w:rPr>
                 <w:rStyle w:val="Hiperhivatkozs"/>
@@ -539,7 +539,7 @@
                 <w:noProof/>
                 <w:webHidden/>
               </w:rPr>
-              <w:instrText xml:space="preserve"> PAGEREF _Toc218480683 \h </w:instrText>
+              <w:instrText xml:space="preserve"> PAGEREF _Toc218619916 \h </w:instrText>
             </w:r>
             <w:r>
               <w:rPr>
@@ -583,7 +583,7 @@
               <w:lang w:eastAsia="hu-HU"/>
             </w:rPr>
           </w:pPr>
-          <w:hyperlink w:anchor="_Toc218480684" w:history="1">
+          <w:hyperlink w:anchor="_Toc218619917" w:history="1">
             <w:r>
               <w:rPr>
                 <w:rStyle w:val="Hiperhivatkozs"/>
@@ -610,7 +610,7 @@
                 <w:noProof/>
                 <w:webHidden/>
               </w:rPr>
-              <w:instrText xml:space="preserve"> PAGEREF _Toc218480684 \h </w:instrText>
+              <w:instrText xml:space="preserve"> PAGEREF _Toc218619917 \h </w:instrText>
             </w:r>
             <w:r>
               <w:rPr>
@@ -654,7 +654,7 @@
               <w:lang w:eastAsia="hu-HU"/>
             </w:rPr>
           </w:pPr>
-          <w:hyperlink w:anchor="_Toc218480685" w:history="1">
+          <w:hyperlink w:anchor="_Toc218619918" w:history="1">
             <w:r>
               <w:rPr>
                 <w:rStyle w:val="Hiperhivatkozs"/>
@@ -681,7 +681,7 @@
                 <w:noProof/>
                 <w:webHidden/>
               </w:rPr>
-              <w:instrText xml:space="preserve"> PAGEREF _Toc218480685 \h </w:instrText>
+              <w:instrText xml:space="preserve"> PAGEREF _Toc218619918 \h </w:instrText>
             </w:r>
             <w:r>
               <w:rPr>
@@ -725,7 +725,7 @@
               <w:lang w:eastAsia="hu-HU"/>
             </w:rPr>
           </w:pPr>
-          <w:hyperlink w:anchor="_Toc218480686" w:history="1">
+          <w:hyperlink w:anchor="_Toc218619919" w:history="1">
             <w:r>
               <w:rPr>
                 <w:rStyle w:val="Hiperhivatkozs"/>
@@ -752,7 +752,7 @@
                 <w:noProof/>
                 <w:webHidden/>
               </w:rPr>
-              <w:instrText xml:space="preserve"> PAGEREF _Toc218480686 \h </w:instrText>
+              <w:instrText xml:space="preserve"> PAGEREF _Toc218619919 \h </w:instrText>
             </w:r>
             <w:r>
               <w:rPr>
@@ -796,7 +796,7 @@
               <w:lang w:eastAsia="hu-HU"/>
             </w:rPr>
           </w:pPr>
-          <w:hyperlink w:anchor="_Toc218480687" w:history="1">
+          <w:hyperlink w:anchor="_Toc218619920" w:history="1">
             <w:r>
               <w:rPr>
                 <w:rStyle w:val="Hiperhivatkozs"/>
@@ -823,7 +823,7 @@
                 <w:noProof/>
                 <w:webHidden/>
               </w:rPr>
-              <w:instrText xml:space="preserve"> PAGEREF _Toc218480687 \h </w:instrText>
+              <w:instrText xml:space="preserve"> PAGEREF _Toc218619920 \h </w:instrText>
             </w:r>
             <w:r>
               <w:rPr>
@@ -867,7 +867,7 @@
               <w:lang w:eastAsia="hu-HU"/>
             </w:rPr>
           </w:pPr>
-          <w:hyperlink w:anchor="_Toc218480688" w:history="1">
+          <w:hyperlink w:anchor="_Toc218619921" w:history="1">
             <w:r>
               <w:rPr>
                 <w:rStyle w:val="Hiperhivatkozs"/>
@@ -894,7 +894,7 @@
                 <w:noProof/>
                 <w:webHidden/>
               </w:rPr>
-              <w:instrText xml:space="preserve"> PAGEREF _Toc218480688 \h </w:instrText>
+              <w:instrText xml:space="preserve"> PAGEREF _Toc218619921 \h </w:instrText>
             </w:r>
             <w:r>
               <w:rPr>
@@ -938,7 +938,7 @@
               <w:lang w:eastAsia="hu-HU"/>
             </w:rPr>
           </w:pPr>
-          <w:hyperlink w:anchor="_Toc218480689" w:history="1">
+          <w:hyperlink w:anchor="_Toc218619922" w:history="1">
             <w:r>
               <w:rPr>
                 <w:rStyle w:val="Hiperhivatkozs"/>
@@ -965,7 +965,7 @@
                 <w:noProof/>
                 <w:webHidden/>
               </w:rPr>
-              <w:instrText xml:space="preserve"> PAGEREF _Toc218480689 \h </w:instrText>
+              <w:instrText xml:space="preserve"> PAGEREF _Toc218619922 \h </w:instrText>
             </w:r>
             <w:r>
               <w:rPr>
@@ -1009,7 +1009,7 @@
               <w:lang w:eastAsia="hu-HU"/>
             </w:rPr>
           </w:pPr>
-          <w:hyperlink w:anchor="_Toc218480690" w:history="1">
+          <w:hyperlink w:anchor="_Toc218619923" w:history="1">
             <w:r>
               <w:rPr>
                 <w:rStyle w:val="Hiperhivatkozs"/>
@@ -1036,7 +1036,7 @@
                 <w:noProof/>
                 <w:webHidden/>
               </w:rPr>
-              <w:instrText xml:space="preserve"> PAGEREF _Toc218480690 \h </w:instrText>
+              <w:instrText xml:space="preserve"> PAGEREF _Toc218619923 \h </w:instrText>
             </w:r>
             <w:r>
               <w:rPr>
@@ -1080,7 +1080,7 @@
               <w:lang w:eastAsia="hu-HU"/>
             </w:rPr>
           </w:pPr>
-          <w:hyperlink w:anchor="_Toc218480691" w:history="1">
+          <w:hyperlink w:anchor="_Toc218619924" w:history="1">
             <w:r>
               <w:rPr>
                 <w:rStyle w:val="Hiperhivatkozs"/>
@@ -1107,7 +1107,7 @@
                 <w:noProof/>
                 <w:webHidden/>
               </w:rPr>
-              <w:instrText xml:space="preserve"> PAGEREF _Toc218480691 \h </w:instrText>
+              <w:instrText xml:space="preserve"> PAGEREF _Toc218619924 \h </w:instrText>
             </w:r>
             <w:r>
               <w:rPr>
@@ -1151,7 +1151,7 @@
               <w:lang w:eastAsia="hu-HU"/>
             </w:rPr>
           </w:pPr>
-          <w:hyperlink w:anchor="_Toc218480692" w:history="1">
+          <w:hyperlink w:anchor="_Toc218619925" w:history="1">
             <w:r>
               <w:rPr>
                 <w:rStyle w:val="Hiperhivatkozs"/>
@@ -1178,7 +1178,7 @@
                 <w:noProof/>
                 <w:webHidden/>
               </w:rPr>
-              <w:instrText xml:space="preserve"> PAGEREF _Toc218480692 \h </w:instrText>
+              <w:instrText xml:space="preserve"> PAGEREF _Toc218619925 \h </w:instrText>
             </w:r>
             <w:r>
               <w:rPr>
@@ -1222,7 +1222,7 @@
               <w:lang w:eastAsia="hu-HU"/>
             </w:rPr>
           </w:pPr>
-          <w:hyperlink w:anchor="_Toc218480693" w:history="1">
+          <w:hyperlink w:anchor="_Toc218619926" w:history="1">
             <w:r>
               <w:rPr>
                 <w:rStyle w:val="Hiperhivatkozs"/>
@@ -1249,7 +1249,7 @@
                 <w:noProof/>
                 <w:webHidden/>
               </w:rPr>
-              <w:instrText xml:space="preserve"> PAGEREF _Toc218480693 \h </w:instrText>
+              <w:instrText xml:space="preserve"> PAGEREF _Toc218619926 \h </w:instrText>
             </w:r>
             <w:r>
               <w:rPr>
@@ -1293,7 +1293,7 @@
               <w:lang w:eastAsia="hu-HU"/>
             </w:rPr>
           </w:pPr>
-          <w:hyperlink w:anchor="_Toc218480694" w:history="1">
+          <w:hyperlink w:anchor="_Toc218619927" w:history="1">
             <w:r>
               <w:rPr>
                 <w:rStyle w:val="Hiperhivatkozs"/>
@@ -1320,7 +1320,7 @@
                 <w:noProof/>
                 <w:webHidden/>
               </w:rPr>
-              <w:instrText xml:space="preserve"> PAGEREF _Toc218480694 \h </w:instrText>
+              <w:instrText xml:space="preserve"> PAGEREF _Toc218619927 \h </w:instrText>
             </w:r>
             <w:r>
               <w:rPr>
@@ -1364,13 +1364,13 @@
               <w:lang w:eastAsia="hu-HU"/>
             </w:rPr>
           </w:pPr>
-          <w:hyperlink w:anchor="_Toc218480695" w:history="1">
+          <w:hyperlink w:anchor="_Toc218619928" w:history="1">
             <w:r>
               <w:rPr>
                 <w:rStyle w:val="Hiperhivatkozs"/>
                 <w:noProof/>
               </w:rPr>
-              <w:t>Valós szám típus (Writable)</w:t>
+              <w:t>Leírható szám típus (Writable)</w:t>
             </w:r>
             <w:r>
               <w:rPr>
@@ -1391,7 +1391,7 @@
                 <w:noProof/>
                 <w:webHidden/>
               </w:rPr>
-              <w:instrText xml:space="preserve"> PAGEREF _Toc218480695 \h </w:instrText>
+              <w:instrText xml:space="preserve"> PAGEREF _Toc218619928 \h </w:instrText>
             </w:r>
             <w:r>
               <w:rPr>
@@ -1411,7 +1411,7 @@
                 <w:noProof/>
                 <w:webHidden/>
               </w:rPr>
-              <w:t>9</w:t>
+              <w:t>10</w:t>
             </w:r>
             <w:r>
               <w:rPr>
@@ -1435,7 +1435,7 @@
               <w:lang w:eastAsia="hu-HU"/>
             </w:rPr>
           </w:pPr>
-          <w:hyperlink w:anchor="_Toc218480696" w:history="1">
+          <w:hyperlink w:anchor="_Toc218619929" w:history="1">
             <w:r>
               <w:rPr>
                 <w:rStyle w:val="Hiperhivatkozs"/>
@@ -1462,7 +1462,7 @@
                 <w:noProof/>
                 <w:webHidden/>
               </w:rPr>
-              <w:instrText xml:space="preserve"> PAGEREF _Toc218480696 \h </w:instrText>
+              <w:instrText xml:space="preserve"> PAGEREF _Toc218619929 \h </w:instrText>
             </w:r>
             <w:r>
               <w:rPr>
@@ -1482,7 +1482,7 @@
                 <w:noProof/>
                 <w:webHidden/>
               </w:rPr>
-              <w:t>9</w:t>
+              <w:t>11</w:t>
             </w:r>
             <w:r>
               <w:rPr>
@@ -1506,7 +1506,7 @@
               <w:lang w:eastAsia="hu-HU"/>
             </w:rPr>
           </w:pPr>
-          <w:hyperlink w:anchor="_Toc218480697" w:history="1">
+          <w:hyperlink w:anchor="_Toc218619930" w:history="1">
             <w:r>
               <w:rPr>
                 <w:rStyle w:val="Hiperhivatkozs"/>
@@ -1533,7 +1533,7 @@
                 <w:noProof/>
                 <w:webHidden/>
               </w:rPr>
-              <w:instrText xml:space="preserve"> PAGEREF _Toc218480697 \h </w:instrText>
+              <w:instrText xml:space="preserve"> PAGEREF _Toc218619930 \h </w:instrText>
             </w:r>
             <w:r>
               <w:rPr>
@@ -1553,7 +1553,7 @@
                 <w:noProof/>
                 <w:webHidden/>
               </w:rPr>
-              <w:t>9</w:t>
+              <w:t>11</w:t>
             </w:r>
             <w:r>
               <w:rPr>
@@ -1577,7 +1577,7 @@
               <w:lang w:eastAsia="hu-HU"/>
             </w:rPr>
           </w:pPr>
-          <w:hyperlink w:anchor="_Toc218480698" w:history="1">
+          <w:hyperlink w:anchor="_Toc218619931" w:history="1">
             <w:r>
               <w:rPr>
                 <w:rStyle w:val="Hiperhivatkozs"/>
@@ -1604,7 +1604,7 @@
                 <w:noProof/>
                 <w:webHidden/>
               </w:rPr>
-              <w:instrText xml:space="preserve"> PAGEREF _Toc218480698 \h </w:instrText>
+              <w:instrText xml:space="preserve"> PAGEREF _Toc218619931 \h </w:instrText>
             </w:r>
             <w:r>
               <w:rPr>
@@ -1624,7 +1624,7 @@
                 <w:noProof/>
                 <w:webHidden/>
               </w:rPr>
-              <w:t>9</w:t>
+              <w:t>11</w:t>
             </w:r>
             <w:r>
               <w:rPr>
@@ -1648,7 +1648,7 @@
               <w:lang w:eastAsia="hu-HU"/>
             </w:rPr>
           </w:pPr>
-          <w:hyperlink w:anchor="_Toc218480699" w:history="1">
+          <w:hyperlink w:anchor="_Toc218619932" w:history="1">
             <w:r>
               <w:rPr>
                 <w:rStyle w:val="Hiperhivatkozs"/>
@@ -1675,7 +1675,7 @@
                 <w:noProof/>
                 <w:webHidden/>
               </w:rPr>
-              <w:instrText xml:space="preserve"> PAGEREF _Toc218480699 \h </w:instrText>
+              <w:instrText xml:space="preserve"> PAGEREF _Toc218619932 \h </w:instrText>
             </w:r>
             <w:r>
               <w:rPr>
@@ -1695,7 +1695,7 @@
                 <w:noProof/>
                 <w:webHidden/>
               </w:rPr>
-              <w:t>9</w:t>
+              <w:t>11</w:t>
             </w:r>
             <w:r>
               <w:rPr>
@@ -1719,7 +1719,7 @@
               <w:lang w:eastAsia="hu-HU"/>
             </w:rPr>
           </w:pPr>
-          <w:hyperlink w:anchor="_Toc218480700" w:history="1">
+          <w:hyperlink w:anchor="_Toc218619933" w:history="1">
             <w:r>
               <w:rPr>
                 <w:rStyle w:val="Hiperhivatkozs"/>
@@ -1746,7 +1746,7 @@
                 <w:noProof/>
                 <w:webHidden/>
               </w:rPr>
-              <w:instrText xml:space="preserve"> PAGEREF _Toc218480700 \h </w:instrText>
+              <w:instrText xml:space="preserve"> PAGEREF _Toc218619933 \h </w:instrText>
             </w:r>
             <w:r>
               <w:rPr>
@@ -1766,7 +1766,7 @@
                 <w:noProof/>
                 <w:webHidden/>
               </w:rPr>
-              <w:t>9</w:t>
+              <w:t>11</w:t>
             </w:r>
             <w:r>
               <w:rPr>
@@ -1790,7 +1790,7 @@
               <w:lang w:eastAsia="hu-HU"/>
             </w:rPr>
           </w:pPr>
-          <w:hyperlink w:anchor="_Toc218480701" w:history="1">
+          <w:hyperlink w:anchor="_Toc218619934" w:history="1">
             <w:r>
               <w:rPr>
                 <w:rStyle w:val="Hiperhivatkozs"/>
@@ -1817,7 +1817,7 @@
                 <w:noProof/>
                 <w:webHidden/>
               </w:rPr>
-              <w:instrText xml:space="preserve"> PAGEREF _Toc218480701 \h </w:instrText>
+              <w:instrText xml:space="preserve"> PAGEREF _Toc218619934 \h </w:instrText>
             </w:r>
             <w:r>
               <w:rPr>
@@ -1837,7 +1837,7 @@
                 <w:noProof/>
                 <w:webHidden/>
               </w:rPr>
-              <w:t>9</w:t>
+              <w:t>11</w:t>
             </w:r>
             <w:r>
               <w:rPr>
@@ -1861,7 +1861,7 @@
               <w:lang w:eastAsia="hu-HU"/>
             </w:rPr>
           </w:pPr>
-          <w:hyperlink w:anchor="_Toc218480702" w:history="1">
+          <w:hyperlink w:anchor="_Toc218619935" w:history="1">
             <w:r>
               <w:rPr>
                 <w:rStyle w:val="Hiperhivatkozs"/>
@@ -1888,7 +1888,7 @@
                 <w:noProof/>
                 <w:webHidden/>
               </w:rPr>
-              <w:instrText xml:space="preserve"> PAGEREF _Toc218480702 \h </w:instrText>
+              <w:instrText xml:space="preserve"> PAGEREF _Toc218619935 \h </w:instrText>
             </w:r>
             <w:r>
               <w:rPr>
@@ -1908,7 +1908,7 @@
                 <w:noProof/>
                 <w:webHidden/>
               </w:rPr>
-              <w:t>9</w:t>
+              <w:t>11</w:t>
             </w:r>
             <w:r>
               <w:rPr>
@@ -1932,7 +1932,7 @@
               <w:lang w:eastAsia="hu-HU"/>
             </w:rPr>
           </w:pPr>
-          <w:hyperlink w:anchor="_Toc218480703" w:history="1">
+          <w:hyperlink w:anchor="_Toc218619936" w:history="1">
             <w:r>
               <w:rPr>
                 <w:rStyle w:val="Hiperhivatkozs"/>
@@ -1959,7 +1959,7 @@
                 <w:noProof/>
                 <w:webHidden/>
               </w:rPr>
-              <w:instrText xml:space="preserve"> PAGEREF _Toc218480703 \h </w:instrText>
+              <w:instrText xml:space="preserve"> PAGEREF _Toc218619936 \h </w:instrText>
             </w:r>
             <w:r>
               <w:rPr>
@@ -1979,7 +1979,7 @@
                 <w:noProof/>
                 <w:webHidden/>
               </w:rPr>
-              <w:t>9</w:t>
+              <w:t>11</w:t>
             </w:r>
             <w:r>
               <w:rPr>
@@ -2003,7 +2003,7 @@
               <w:lang w:eastAsia="hu-HU"/>
             </w:rPr>
           </w:pPr>
-          <w:hyperlink w:anchor="_Toc218480704" w:history="1">
+          <w:hyperlink w:anchor="_Toc218619937" w:history="1">
             <w:r>
               <w:rPr>
                 <w:rStyle w:val="Hiperhivatkozs"/>
@@ -2030,7 +2030,7 @@
                 <w:noProof/>
                 <w:webHidden/>
               </w:rPr>
-              <w:instrText xml:space="preserve"> PAGEREF _Toc218480704 \h </w:instrText>
+              <w:instrText xml:space="preserve"> PAGEREF _Toc218619937 \h </w:instrText>
             </w:r>
             <w:r>
               <w:rPr>
@@ -2050,7 +2050,7 @@
                 <w:noProof/>
                 <w:webHidden/>
               </w:rPr>
-              <w:t>9</w:t>
+              <w:t>11</w:t>
             </w:r>
             <w:r>
               <w:rPr>
@@ -2074,7 +2074,7 @@
               <w:lang w:eastAsia="hu-HU"/>
             </w:rPr>
           </w:pPr>
-          <w:hyperlink w:anchor="_Toc218480705" w:history="1">
+          <w:hyperlink w:anchor="_Toc218619938" w:history="1">
             <w:r>
               <w:rPr>
                 <w:rStyle w:val="Hiperhivatkozs"/>
@@ -2101,7 +2101,7 @@
                 <w:noProof/>
                 <w:webHidden/>
               </w:rPr>
-              <w:instrText xml:space="preserve"> PAGEREF _Toc218480705 \h </w:instrText>
+              <w:instrText xml:space="preserve"> PAGEREF _Toc218619938 \h </w:instrText>
             </w:r>
             <w:r>
               <w:rPr>
@@ -2121,7 +2121,7 @@
                 <w:noProof/>
                 <w:webHidden/>
               </w:rPr>
-              <w:t>9</w:t>
+              <w:t>11</w:t>
             </w:r>
             <w:r>
               <w:rPr>
@@ -2145,7 +2145,7 @@
               <w:lang w:eastAsia="hu-HU"/>
             </w:rPr>
           </w:pPr>
-          <w:hyperlink w:anchor="_Toc218480706" w:history="1">
+          <w:hyperlink w:anchor="_Toc218619939" w:history="1">
             <w:r>
               <w:rPr>
                 <w:rStyle w:val="Hiperhivatkozs"/>
@@ -2172,7 +2172,7 @@
                 <w:noProof/>
                 <w:webHidden/>
               </w:rPr>
-              <w:instrText xml:space="preserve"> PAGEREF _Toc218480706 \h </w:instrText>
+              <w:instrText xml:space="preserve"> PAGEREF _Toc218619939 \h </w:instrText>
             </w:r>
             <w:r>
               <w:rPr>
@@ -2192,7 +2192,7 @@
                 <w:noProof/>
                 <w:webHidden/>
               </w:rPr>
-              <w:t>9</w:t>
+              <w:t>11</w:t>
             </w:r>
             <w:r>
               <w:rPr>
@@ -2216,7 +2216,7 @@
               <w:lang w:eastAsia="hu-HU"/>
             </w:rPr>
           </w:pPr>
-          <w:hyperlink w:anchor="_Toc218480707" w:history="1">
+          <w:hyperlink w:anchor="_Toc218619940" w:history="1">
             <w:r>
               <w:rPr>
                 <w:rStyle w:val="Hiperhivatkozs"/>
@@ -2243,7 +2243,7 @@
                 <w:noProof/>
                 <w:webHidden/>
               </w:rPr>
-              <w:instrText xml:space="preserve"> PAGEREF _Toc218480707 \h </w:instrText>
+              <w:instrText xml:space="preserve"> PAGEREF _Toc218619940 \h </w:instrText>
             </w:r>
             <w:r>
               <w:rPr>
@@ -2263,7 +2263,7 @@
                 <w:noProof/>
                 <w:webHidden/>
               </w:rPr>
-              <w:t>9</w:t>
+              <w:t>11</w:t>
             </w:r>
             <w:r>
               <w:rPr>
@@ -2287,7 +2287,7 @@
               <w:lang w:eastAsia="hu-HU"/>
             </w:rPr>
           </w:pPr>
-          <w:hyperlink w:anchor="_Toc218480708" w:history="1">
+          <w:hyperlink w:anchor="_Toc218619941" w:history="1">
             <w:r>
               <w:rPr>
                 <w:rStyle w:val="Hiperhivatkozs"/>
@@ -2314,7 +2314,7 @@
                 <w:noProof/>
                 <w:webHidden/>
               </w:rPr>
-              <w:instrText xml:space="preserve"> PAGEREF _Toc218480708 \h </w:instrText>
+              <w:instrText xml:space="preserve"> PAGEREF _Toc218619941 \h </w:instrText>
             </w:r>
             <w:r>
               <w:rPr>
@@ -2334,7 +2334,7 @@
                 <w:noProof/>
                 <w:webHidden/>
               </w:rPr>
-              <w:t>9</w:t>
+              <w:t>11</w:t>
             </w:r>
             <w:r>
               <w:rPr>
@@ -2358,7 +2358,7 @@
               <w:lang w:eastAsia="hu-HU"/>
             </w:rPr>
           </w:pPr>
-          <w:hyperlink w:anchor="_Toc218480709" w:history="1">
+          <w:hyperlink w:anchor="_Toc218619942" w:history="1">
             <w:r>
               <w:rPr>
                 <w:rStyle w:val="Hiperhivatkozs"/>
@@ -2385,7 +2385,7 @@
                 <w:noProof/>
                 <w:webHidden/>
               </w:rPr>
-              <w:instrText xml:space="preserve"> PAGEREF _Toc218480709 \h </w:instrText>
+              <w:instrText xml:space="preserve"> PAGEREF _Toc218619942 \h </w:instrText>
             </w:r>
             <w:r>
               <w:rPr>
@@ -2405,7 +2405,7 @@
                 <w:noProof/>
                 <w:webHidden/>
               </w:rPr>
-              <w:t>9</w:t>
+              <w:t>11</w:t>
             </w:r>
             <w:r>
               <w:rPr>
@@ -2436,7 +2436,7 @@
       <w:pPr>
         <w:pStyle w:val="Cmsor1"/>
       </w:pPr>
-      <w:bookmarkStart w:id="1" w:name="_Toc218480680"/>
+      <w:bookmarkStart w:id="1" w:name="_Toc218619913"/>
       <w:r>
         <w:lastRenderedPageBreak/>
         <w:t>Bevezető</w:t>
@@ -2533,7 +2533,7 @@
       <w:pPr>
         <w:pStyle w:val="Cmsor2"/>
       </w:pPr>
-      <w:bookmarkStart w:id="2" w:name="_Toc218480681"/>
+      <w:bookmarkStart w:id="2" w:name="_Toc218619914"/>
       <w:r>
         <w:t>Probléma felvetés</w:t>
       </w:r>
@@ -2546,7 +2546,7 @@
       <w:pPr>
         <w:pStyle w:val="Cmsor3"/>
       </w:pPr>
-      <w:bookmarkStart w:id="3" w:name="_Toc218480682"/>
+      <w:bookmarkStart w:id="3" w:name="_Toc218619915"/>
       <w:r>
         <w:t>Bináris számrendszer</w:t>
       </w:r>
@@ -3202,7 +3202,7 @@
       <w:pPr>
         <w:pStyle w:val="Cmsor3"/>
       </w:pPr>
-      <w:bookmarkStart w:id="4" w:name="_Toc218480683"/>
+      <w:bookmarkStart w:id="4" w:name="_Toc218619916"/>
       <w:r>
         <w:t>Lebegőpontos számábrázolás</w:t>
       </w:r>
@@ -3321,7 +3321,7 @@
       <w:pPr>
         <w:pStyle w:val="Cmsor3"/>
       </w:pPr>
-      <w:bookmarkStart w:id="5" w:name="_Toc218480684"/>
+      <w:bookmarkStart w:id="5" w:name="_Toc218619917"/>
       <w:r>
         <w:t>Implementációk</w:t>
       </w:r>
@@ -3627,7 +3627,7 @@
           <w:rFonts w:eastAsiaTheme="minorEastAsia"/>
         </w:rPr>
       </w:pPr>
-      <w:bookmarkStart w:id="6" w:name="_Toc218480685"/>
+      <w:bookmarkStart w:id="6" w:name="_Toc218619918"/>
       <w:r>
         <w:rPr>
           <w:rFonts w:eastAsiaTheme="minorEastAsia"/>
@@ -3659,7 +3659,7 @@
       <w:pPr>
         <w:pStyle w:val="Cmsor2"/>
       </w:pPr>
-      <w:bookmarkStart w:id="7" w:name="_Toc218480686"/>
+      <w:bookmarkStart w:id="7" w:name="_Toc218619919"/>
       <w:r>
         <w:t>Megoldás megközelítése</w:t>
       </w:r>
@@ -3669,7 +3669,7 @@
       <w:pPr>
         <w:pStyle w:val="Cmsor3"/>
       </w:pPr>
-      <w:bookmarkStart w:id="8" w:name="_Toc218480687"/>
+      <w:bookmarkStart w:id="8" w:name="_Toc218619920"/>
       <w:r>
         <w:t>BCD számábrázolás</w:t>
       </w:r>
@@ -3701,15 +3701,7 @@
         <w:jc w:val="center"/>
       </w:pPr>
       <w:r>
-        <w:t xml:space="preserve">&lt;kép egy 0-nál kisebb számról ami rövidebb mint a </w:t>
-      </w:r>
-      <w:proofErr w:type="spellStart"/>
-      <w:r>
-        <w:t>fractionLength</w:t>
-      </w:r>
-      <w:proofErr w:type="spellEnd"/>
-      <w:r>
-        <w:t>&gt;</w:t>
+        <w:t>&lt;kép egy 0-nál kisebb számról ami rövidebb mint a fractionLength&gt;</w:t>
       </w:r>
     </w:p>
     <w:p>
@@ -3721,7 +3713,7 @@
       <w:pPr>
         <w:pStyle w:val="Cmsor3"/>
       </w:pPr>
-      <w:bookmarkStart w:id="9" w:name="_Toc218480688"/>
+      <w:bookmarkStart w:id="9" w:name="_Toc218619921"/>
       <w:r>
         <w:t>Előnyök és hátrányok</w:t>
       </w:r>
@@ -3741,10 +3733,7 @@
         </w:numPr>
       </w:pPr>
       <w:r>
-        <w:t xml:space="preserve">binárisba konvertálásból következő kerekítési </w:t>
-      </w:r>
-      <w:r>
-        <w:t>adatvesztés</w:t>
+        <w:t>binárisba konvertálásból következő kerekítési adatvesztés</w:t>
       </w:r>
     </w:p>
     <w:p>
@@ -3756,10 +3745,7 @@
         </w:numPr>
       </w:pPr>
       <w:r>
-        <w:t xml:space="preserve">műveletvégzésből </w:t>
-      </w:r>
-      <w:r>
-        <w:t>következő kerekítési adatvesztés</w:t>
+        <w:t>műveletvégzésből következő kerekítési adatvesztés</w:t>
       </w:r>
     </w:p>
     <w:p>
@@ -3771,13 +3757,7 @@
         </w:numPr>
       </w:pPr>
       <w:r>
-        <w:t>túlcsordulásból</w:t>
-      </w:r>
-      <w:r>
-        <w:t xml:space="preserve"> következő </w:t>
-      </w:r>
-      <w:r>
-        <w:t>csonkítási adatvesztés</w:t>
+        <w:t>túlcsordulásból következő csonkítási adatvesztés</w:t>
       </w:r>
     </w:p>
     <w:p>
@@ -3789,10 +3769,7 @@
         </w:numPr>
       </w:pPr>
       <w:r>
-        <w:t xml:space="preserve">a mantissza hosszából </w:t>
-      </w:r>
-      <w:r>
-        <w:t>következő kerekítési adatvesztés</w:t>
+        <w:t>a mantissza hosszából következő kerekítési adatvesztés</w:t>
       </w:r>
     </w:p>
     <w:p>
@@ -3836,13 +3813,7 @@
         </w:numPr>
       </w:pPr>
       <w:r>
-        <w:t xml:space="preserve">a racionális számtípus megoldja az osztásból adódó </w:t>
-      </w:r>
-      <w:r>
-        <w:t>kerekítési adatvesztés</w:t>
-      </w:r>
-      <w:r>
-        <w:t>t</w:t>
+        <w:t>a racionális számtípus megoldja az osztásból adódó kerekítési adatvesztést</w:t>
       </w:r>
     </w:p>
     <w:p>
@@ -3893,10 +3864,7 @@
         <w:t xml:space="preserve"> </w:t>
       </w:r>
       <w:r>
-        <w:t>az esetek döntő többségében</w:t>
-      </w:r>
-      <w:r>
-        <w:t xml:space="preserve"> szignifikánsan nagyobb a lebegőpontos számokénál</w:t>
+        <w:t>az esetek döntő többségében szignifikánsan nagyobb a lebegőpontos számokénál</w:t>
       </w:r>
     </w:p>
     <w:p>
@@ -3944,7 +3912,7 @@
       <w:pPr>
         <w:pStyle w:val="Cmsor1"/>
       </w:pPr>
-      <w:bookmarkStart w:id="10" w:name="_Toc218480689"/>
+      <w:bookmarkStart w:id="10" w:name="_Toc218619922"/>
       <w:r>
         <w:lastRenderedPageBreak/>
         <w:t>Fejlesztői dokumentáció</w:t>
@@ -3955,7 +3923,7 @@
       <w:pPr>
         <w:pStyle w:val="Cmsor2"/>
       </w:pPr>
-      <w:bookmarkStart w:id="11" w:name="_Toc218480690"/>
+      <w:bookmarkStart w:id="11" w:name="_Toc218619923"/>
       <w:r>
         <w:t>Számtípusok m</w:t>
       </w:r>
@@ -3971,7 +3939,7 @@
       <w:pPr>
         <w:pStyle w:val="Cmsor3"/>
       </w:pPr>
-      <w:bookmarkStart w:id="12" w:name="_Toc218480691"/>
+      <w:bookmarkStart w:id="12" w:name="_Toc218619924"/>
       <w:r>
         <w:t>Számjegy típus (Digit)</w:t>
       </w:r>
@@ -4221,7 +4189,7 @@
       <w:pPr>
         <w:pStyle w:val="Cmsor3"/>
       </w:pPr>
-      <w:bookmarkStart w:id="13" w:name="_Toc218480692"/>
+      <w:bookmarkStart w:id="13" w:name="_Toc218619925"/>
       <w:r>
         <w:t>Természetes szám típus (Natural)</w:t>
       </w:r>
@@ -4230,6 +4198,89 @@
     <w:p>
       <w:r>
         <w:t>Ennek a számtípusnak a halmazába a pozitív egész számok és a nulla tartozik.</w:t>
+      </w:r>
+    </w:p>
+    <w:p>
+      <w:r>
+        <w:t>Fontos kiemelni, hogy egész számok ábrázolása esetén sokkal memóriaigényesebb a BCD számábrázolás a binárisnál</w:t>
+      </w:r>
+      <w:r>
+        <w:t>. A lebegőpontos számtípusok hibái, a korlátoltságon kívül, nincsenek jelen az egész számokat ábrázoló típusokban.</w:t>
+      </w:r>
+      <w:r>
+        <w:t xml:space="preserve"> E</w:t>
+      </w:r>
+      <w:r>
+        <w:t xml:space="preserve">zért hacsak nem nagyobb számokkal van dolgunk, mint amit a </w:t>
+      </w:r>
+      <w:r>
+        <w:t xml:space="preserve">C nyelv </w:t>
+      </w:r>
+      <w:r>
+        <w:t xml:space="preserve">beépített </w:t>
+      </w:r>
+      <w:r>
+        <w:t xml:space="preserve">unsigned </w:t>
+      </w:r>
+      <w:r>
+        <w:t>long</w:t>
+      </w:r>
+      <w:r>
+        <w:t xml:space="preserve"> long</w:t>
+      </w:r>
+      <w:r>
+        <w:t xml:space="preserve"> számtípus</w:t>
+      </w:r>
+      <w:r>
+        <w:t>a</w:t>
+      </w:r>
+      <w:r>
+        <w:t xml:space="preserve"> képes tárolni (minimum </w:t>
+      </w:r>
+      <m:oMath>
+        <m:r>
+          <w:rPr>
+            <w:rFonts w:ascii="Cambria Math" w:hAnsi="Cambria Math"/>
+          </w:rPr>
+          <m:t>18×</m:t>
+        </m:r>
+        <m:sSup>
+          <m:sSupPr>
+            <m:ctrlPr>
+              <w:rPr>
+                <w:rFonts w:ascii="Cambria Math" w:hAnsi="Cambria Math"/>
+                <w:i/>
+              </w:rPr>
+            </m:ctrlPr>
+          </m:sSupPr>
+          <m:e>
+            <m:r>
+              <w:rPr>
+                <w:rFonts w:ascii="Cambria Math" w:hAnsi="Cambria Math"/>
+              </w:rPr>
+              <m:t>10</m:t>
+            </m:r>
+          </m:e>
+          <m:sup>
+            <m:r>
+              <w:rPr>
+                <w:rFonts w:ascii="Cambria Math" w:hAnsi="Cambria Math"/>
+              </w:rPr>
+              <m:t>18</m:t>
+            </m:r>
+          </m:sup>
+        </m:sSup>
+      </m:oMath>
+      <w:r>
+        <w:t>), addig nem ajánlott az önálló használata</w:t>
+      </w:r>
+      <w:r>
+        <w:t>.</w:t>
+      </w:r>
+    </w:p>
+    <w:p>
+      <w:r>
+        <w:t>Ugyanakkor minden további bemutatásra kerülő osztály ezen a típuson alapszik.</w:t>
       </w:r>
     </w:p>
     <w:p>
@@ -4246,6 +4297,7 @@
         </w:numPr>
       </w:pPr>
       <w:r>
+        <w:lastRenderedPageBreak/>
         <w:t>egyenlőség (</w:t>
       </w:r>
       <w:r>
@@ -4396,7 +4448,6 @@
         </w:numPr>
       </w:pPr>
       <w:r>
-        <w:lastRenderedPageBreak/>
         <w:t>osztás (</w:t>
       </w:r>
       <w:r>
@@ -4542,197 +4593,1689 @@
         <w:t>)</w:t>
       </w:r>
     </w:p>
-    <w:p/>
     <w:p>
       <w:pPr>
         <w:pStyle w:val="Cmsor3"/>
       </w:pPr>
-      <w:bookmarkStart w:id="14" w:name="_Toc218480693"/>
+      <w:bookmarkStart w:id="14" w:name="_Toc218619926"/>
+      <w:r>
+        <w:t>Egész szám típus (Integer)</w:t>
+      </w:r>
+      <w:bookmarkEnd w:id="14"/>
+    </w:p>
+    <w:p>
+      <w:r>
+        <w:t>Ennek a számtípusnak a halmazába a</w:t>
+      </w:r>
+      <w:r>
+        <w:t>z</w:t>
+      </w:r>
+      <w:r>
+        <w:t xml:space="preserve"> egész számok tartoz</w:t>
+      </w:r>
+      <w:r>
+        <w:t>nak</w:t>
+      </w:r>
+      <w:r>
+        <w:t>.</w:t>
+      </w:r>
+    </w:p>
+    <w:p>
+      <w:r>
+        <w:t>Előjeles számok esetén a nulla kivételt képez, mivel nem követi az IEEE 754 szabvány azon pontját, ami a halmazba fogadja a negatív nulla értéket is. Amennyiben ilyen bemenet érkezik, a konstruktor pozitívra egyszerűsíti le.</w:t>
+      </w:r>
+    </w:p>
+    <w:p>
+      <w:r>
+        <w:t>A típusra implementálva vannak az alábbi műveletek:</w:t>
+      </w:r>
+    </w:p>
+    <w:p>
+      <w:pPr>
+        <w:pStyle w:val="Listaszerbekezds"/>
+        <w:numPr>
+          <w:ilvl w:val="0"/>
+          <w:numId w:val="2"/>
+        </w:numPr>
+      </w:pPr>
+      <w:r>
+        <w:t>abszolút érték (</w:t>
+      </w:r>
+      <m:oMath>
+        <m:r>
+          <w:rPr>
+            <w:rFonts w:ascii="Cambria Math" w:hAnsi="Cambria Math"/>
+          </w:rPr>
+          <m:t>|x|</m:t>
+        </m:r>
+      </m:oMath>
+      <w:r>
+        <w:t>)</w:t>
+      </w:r>
+    </w:p>
+    <w:p>
+      <w:pPr>
+        <w:pStyle w:val="Listaszerbekezds"/>
+        <w:numPr>
+          <w:ilvl w:val="0"/>
+          <w:numId w:val="2"/>
+        </w:numPr>
+      </w:pPr>
+      <w:r>
+        <w:t>egyenlőség (</w:t>
+      </w:r>
+      <w:r>
+        <w:rPr>
+          <w:rFonts w:ascii="Cambria Math" w:hAnsi="Cambria Math"/>
+        </w:rPr>
+        <w:t>=</w:t>
+      </w:r>
+      <w:r>
+        <w:t>)</w:t>
+      </w:r>
+    </w:p>
+    <w:p>
+      <w:pPr>
+        <w:pStyle w:val="Listaszerbekezds"/>
+        <w:numPr>
+          <w:ilvl w:val="0"/>
+          <w:numId w:val="2"/>
+        </w:numPr>
+      </w:pPr>
+      <w:r>
+        <w:t>egyenlőtlenség (</w:t>
+      </w:r>
+      <w:r>
+        <w:rPr>
+          <w:rFonts w:ascii="Cambria Math" w:hAnsi="Cambria Math"/>
+        </w:rPr>
+        <w:t>≠</w:t>
+      </w:r>
+      <w:r>
+        <w:rPr>
+          <w:rFonts w:ascii="Cambria Math" w:hAnsi="Cambria Math"/>
+        </w:rPr>
+        <w:t xml:space="preserve">, </w:t>
+      </w:r>
+      <w:r>
+        <w:rPr>
+          <w:rFonts w:ascii="Cambria Math" w:hAnsi="Cambria Math"/>
+        </w:rPr>
+        <w:t>≥</w:t>
+      </w:r>
+      <w:r>
+        <w:rPr>
+          <w:rFonts w:ascii="Cambria Math" w:hAnsi="Cambria Math"/>
+        </w:rPr>
+        <w:t xml:space="preserve">, </w:t>
+      </w:r>
+      <w:r>
+        <w:rPr>
+          <w:rFonts w:ascii="Cambria Math" w:hAnsi="Cambria Math"/>
+        </w:rPr>
+        <w:t>≤</w:t>
+      </w:r>
+      <w:r>
+        <w:t>)</w:t>
+      </w:r>
+    </w:p>
+    <w:p>
+      <w:pPr>
+        <w:pStyle w:val="Listaszerbekezds"/>
+        <w:numPr>
+          <w:ilvl w:val="0"/>
+          <w:numId w:val="2"/>
+        </w:numPr>
+      </w:pPr>
+      <w:r>
+        <w:t>szigorú egyenlőtlenség (</w:t>
+      </w:r>
+      <w:r>
+        <w:rPr>
+          <w:rFonts w:ascii="Cambria Math" w:hAnsi="Cambria Math"/>
+        </w:rPr>
+        <w:t>&lt;, &gt;</w:t>
+      </w:r>
+      <w:r>
+        <w:t>)</w:t>
+      </w:r>
+    </w:p>
+    <w:p>
+      <w:pPr>
+        <w:pStyle w:val="Listaszerbekezds"/>
+        <w:numPr>
+          <w:ilvl w:val="0"/>
+          <w:numId w:val="2"/>
+        </w:numPr>
+      </w:pPr>
+      <w:r>
+        <w:t>összeadás (</w:t>
+      </w:r>
+      <w:r>
+        <w:rPr>
+          <w:rFonts w:ascii="Cambria Math" w:hAnsi="Cambria Math"/>
+        </w:rPr>
+        <w:t>+</w:t>
+      </w:r>
+      <w:r>
+        <w:t>)</w:t>
+      </w:r>
+    </w:p>
+    <w:p>
+      <w:pPr>
+        <w:pStyle w:val="Listaszerbekezds"/>
+        <w:numPr>
+          <w:ilvl w:val="0"/>
+          <w:numId w:val="2"/>
+        </w:numPr>
+      </w:pPr>
+      <w:r>
+        <w:t>kivonás (</w:t>
+      </w:r>
+      <w:r>
+        <w:rPr>
+          <w:rFonts w:ascii="Cambria Math" w:hAnsi="Cambria Math"/>
+        </w:rPr>
+        <w:t>–</w:t>
+      </w:r>
+      <w:r>
+        <w:t>)</w:t>
+      </w:r>
+    </w:p>
+    <w:p>
+      <w:pPr>
+        <w:pStyle w:val="Listaszerbekezds"/>
+        <w:numPr>
+          <w:ilvl w:val="0"/>
+          <w:numId w:val="2"/>
+        </w:numPr>
+      </w:pPr>
+      <w:r>
+        <w:t>szorzás (</w:t>
+      </w:r>
+      <w:r>
+        <w:rPr>
+          <w:rFonts w:ascii="Cambria Math" w:hAnsi="Cambria Math"/>
+        </w:rPr>
+        <w:t>×</w:t>
+      </w:r>
+      <w:r>
+        <w:t>)</w:t>
+      </w:r>
+    </w:p>
+    <w:p>
+      <w:pPr>
+        <w:pStyle w:val="Listaszerbekezds"/>
+        <w:numPr>
+          <w:ilvl w:val="0"/>
+          <w:numId w:val="2"/>
+        </w:numPr>
+      </w:pPr>
+      <w:r>
+        <w:t>osztás (</w:t>
+      </w:r>
+      <w:r>
+        <w:rPr>
+          <w:rFonts w:ascii="Cambria Math" w:hAnsi="Cambria Math"/>
+        </w:rPr>
+        <w:t>/</w:t>
+      </w:r>
+      <w:r>
+        <w:t>)</w:t>
+      </w:r>
+    </w:p>
+    <w:p>
+      <w:pPr>
+        <w:pStyle w:val="Listaszerbekezds"/>
+        <w:numPr>
+          <w:ilvl w:val="0"/>
+          <w:numId w:val="2"/>
+        </w:numPr>
+      </w:pPr>
+      <w:r>
+        <w:t>moduló (</w:t>
+      </w:r>
+      <w:r>
+        <w:rPr>
+          <w:rFonts w:ascii="Cambria Math" w:hAnsi="Cambria Math"/>
+        </w:rPr>
+        <w:t>%</w:t>
+      </w:r>
+      <w:r>
+        <w:t>)</w:t>
+      </w:r>
+    </w:p>
+    <w:p>
+      <w:pPr>
+        <w:pStyle w:val="Listaszerbekezds"/>
+        <w:numPr>
+          <w:ilvl w:val="0"/>
+          <w:numId w:val="2"/>
+        </w:numPr>
+      </w:pPr>
+      <w:r>
+        <w:t>hatványozás (</w:t>
+      </w:r>
+      <m:oMath>
+        <m:sSup>
+          <m:sSupPr>
+            <m:ctrlPr>
+              <w:rPr>
+                <w:rFonts w:ascii="Cambria Math" w:hAnsi="Cambria Math"/>
+                <w:i/>
+              </w:rPr>
+            </m:ctrlPr>
+          </m:sSupPr>
+          <m:e>
+            <m:r>
+              <w:rPr>
+                <w:rFonts w:ascii="Cambria Math" w:hAnsi="Cambria Math"/>
+              </w:rPr>
+              <m:t>x</m:t>
+            </m:r>
+          </m:e>
+          <m:sup>
+            <m:r>
+              <w:rPr>
+                <w:rFonts w:ascii="Cambria Math" w:hAnsi="Cambria Math"/>
+              </w:rPr>
+              <m:t>n</m:t>
+            </m:r>
+          </m:sup>
+        </m:sSup>
+      </m:oMath>
+      <w:r>
+        <w:t>)</w:t>
+      </w:r>
+    </w:p>
+    <w:p>
+      <w:pPr>
+        <w:pStyle w:val="Listaszerbekezds"/>
+        <w:numPr>
+          <w:ilvl w:val="0"/>
+          <w:numId w:val="2"/>
+        </w:numPr>
+      </w:pPr>
+      <w:r>
+        <w:t>gyökvonás (</w:t>
+      </w:r>
+      <m:oMath>
+        <m:rad>
+          <m:radPr>
+            <m:ctrlPr>
+              <w:rPr>
+                <w:rFonts w:ascii="Cambria Math" w:hAnsi="Cambria Math"/>
+                <w:i/>
+              </w:rPr>
+            </m:ctrlPr>
+          </m:radPr>
+          <m:deg>
+            <m:r>
+              <w:rPr>
+                <w:rFonts w:ascii="Cambria Math" w:hAnsi="Cambria Math"/>
+              </w:rPr>
+              <m:t>n</m:t>
+            </m:r>
+          </m:deg>
+          <m:e>
+            <m:r>
+              <w:rPr>
+                <w:rFonts w:ascii="Cambria Math" w:hAnsi="Cambria Math"/>
+              </w:rPr>
+              <m:t>x</m:t>
+            </m:r>
+          </m:e>
+        </m:rad>
+      </m:oMath>
+      <w:r>
+        <w:t>)</w:t>
+      </w:r>
+    </w:p>
+    <w:p>
+      <w:pPr>
+        <w:pStyle w:val="Cmsor3"/>
+      </w:pPr>
+      <w:bookmarkStart w:id="15" w:name="_Toc218619927"/>
+      <w:r>
+        <w:t>Pozitív szám típus (Positive)</w:t>
+      </w:r>
+      <w:bookmarkEnd w:id="15"/>
+    </w:p>
+    <w:p>
+      <w:r>
+        <w:t>Ennek a számtípusnak a halmazába a</w:t>
+      </w:r>
+      <w:r>
+        <w:t xml:space="preserve"> pozitív </w:t>
+      </w:r>
+      <w:r>
+        <w:t xml:space="preserve">számok </w:t>
+      </w:r>
+      <w:r>
+        <w:t>és a nulla tartozik</w:t>
+      </w:r>
+      <w:r>
+        <w:t>.</w:t>
+      </w:r>
+    </w:p>
+    <w:p>
       <w:r>
         <w:lastRenderedPageBreak/>
-        <w:t>Egész szám típus (Integer)</w:t>
-      </w:r>
-      <w:bookmarkEnd w:id="14"/>
+        <w:t>A típusra implementálva vannak az alábbi műveletek:</w:t>
+      </w:r>
+    </w:p>
+    <w:p>
+      <w:pPr>
+        <w:pStyle w:val="Listaszerbekezds"/>
+        <w:numPr>
+          <w:ilvl w:val="0"/>
+          <w:numId w:val="2"/>
+        </w:numPr>
+      </w:pPr>
+      <w:r>
+        <w:t>kerekítés (</w:t>
+      </w:r>
+      <w:r>
+        <w:t>a legközelebbi egészhez</w:t>
+      </w:r>
+      <w:r>
+        <w:rPr>
+          <w:rFonts w:eastAsiaTheme="minorEastAsia"/>
+        </w:rPr>
+        <w:t xml:space="preserve">, </w:t>
+      </w:r>
+      <m:oMath>
+        <m:d>
+          <m:dPr>
+            <m:begChr m:val="⌊"/>
+            <m:endChr m:val="⌋"/>
+            <m:ctrlPr>
+              <w:rPr>
+                <w:rFonts w:ascii="Cambria Math" w:hAnsi="Cambria Math"/>
+                <w:i/>
+              </w:rPr>
+            </m:ctrlPr>
+          </m:dPr>
+          <m:e>
+            <m:r>
+              <w:rPr>
+                <w:rFonts w:ascii="Cambria Math" w:hAnsi="Cambria Math"/>
+              </w:rPr>
+              <m:t>x</m:t>
+            </m:r>
+          </m:e>
+        </m:d>
+      </m:oMath>
+      <w:r>
+        <w:rPr>
+          <w:rFonts w:eastAsiaTheme="minorEastAsia"/>
+        </w:rPr>
+        <w:t xml:space="preserve">, </w:t>
+      </w:r>
+      <m:oMath>
+        <m:d>
+          <m:dPr>
+            <m:begChr m:val="⌈"/>
+            <m:endChr m:val="⌉"/>
+            <m:ctrlPr>
+              <w:rPr>
+                <w:rFonts w:ascii="Cambria Math" w:hAnsi="Cambria Math"/>
+                <w:i/>
+              </w:rPr>
+            </m:ctrlPr>
+          </m:dPr>
+          <m:e>
+            <m:r>
+              <w:rPr>
+                <w:rFonts w:ascii="Cambria Math" w:hAnsi="Cambria Math"/>
+              </w:rPr>
+              <m:t>x</m:t>
+            </m:r>
+          </m:e>
+        </m:d>
+      </m:oMath>
+      <w:r>
+        <w:t>)</w:t>
+      </w:r>
+    </w:p>
+    <w:p>
+      <w:pPr>
+        <w:pStyle w:val="Listaszerbekezds"/>
+        <w:numPr>
+          <w:ilvl w:val="0"/>
+          <w:numId w:val="2"/>
+        </w:numPr>
+      </w:pPr>
+      <w:r>
+        <w:t>egyenlőség (</w:t>
+      </w:r>
+      <w:r>
+        <w:rPr>
+          <w:rFonts w:ascii="Cambria Math" w:hAnsi="Cambria Math"/>
+        </w:rPr>
+        <w:t>=</w:t>
+      </w:r>
+      <w:r>
+        <w:t>)</w:t>
+      </w:r>
+    </w:p>
+    <w:p>
+      <w:pPr>
+        <w:pStyle w:val="Listaszerbekezds"/>
+        <w:numPr>
+          <w:ilvl w:val="0"/>
+          <w:numId w:val="2"/>
+        </w:numPr>
+      </w:pPr>
+      <w:r>
+        <w:t>egyenlőtlenség (</w:t>
+      </w:r>
+      <w:r>
+        <w:rPr>
+          <w:rFonts w:ascii="Cambria Math" w:hAnsi="Cambria Math"/>
+        </w:rPr>
+        <w:t>≠</w:t>
+      </w:r>
+      <w:r>
+        <w:rPr>
+          <w:rFonts w:ascii="Cambria Math" w:hAnsi="Cambria Math"/>
+        </w:rPr>
+        <w:t xml:space="preserve">, </w:t>
+      </w:r>
+      <w:r>
+        <w:rPr>
+          <w:rFonts w:ascii="Cambria Math" w:hAnsi="Cambria Math"/>
+        </w:rPr>
+        <w:t>≥</w:t>
+      </w:r>
+      <w:r>
+        <w:rPr>
+          <w:rFonts w:ascii="Cambria Math" w:hAnsi="Cambria Math"/>
+        </w:rPr>
+        <w:t xml:space="preserve">, </w:t>
+      </w:r>
+      <w:r>
+        <w:rPr>
+          <w:rFonts w:ascii="Cambria Math" w:hAnsi="Cambria Math"/>
+        </w:rPr>
+        <w:t>≤</w:t>
+      </w:r>
+      <w:r>
+        <w:t>)</w:t>
+      </w:r>
+    </w:p>
+    <w:p>
+      <w:pPr>
+        <w:pStyle w:val="Listaszerbekezds"/>
+        <w:numPr>
+          <w:ilvl w:val="0"/>
+          <w:numId w:val="2"/>
+        </w:numPr>
+      </w:pPr>
+      <w:r>
+        <w:t>szigorú egyenlőtlenség (</w:t>
+      </w:r>
+      <w:r>
+        <w:rPr>
+          <w:rFonts w:ascii="Cambria Math" w:hAnsi="Cambria Math"/>
+        </w:rPr>
+        <w:t>&lt;, &gt;</w:t>
+      </w:r>
+      <w:r>
+        <w:t>)</w:t>
+      </w:r>
+    </w:p>
+    <w:p>
+      <w:pPr>
+        <w:pStyle w:val="Listaszerbekezds"/>
+        <w:numPr>
+          <w:ilvl w:val="0"/>
+          <w:numId w:val="2"/>
+        </w:numPr>
+      </w:pPr>
+      <w:r>
+        <w:t>összeadás (</w:t>
+      </w:r>
+      <w:r>
+        <w:rPr>
+          <w:rFonts w:ascii="Cambria Math" w:hAnsi="Cambria Math"/>
+        </w:rPr>
+        <w:t>+</w:t>
+      </w:r>
+      <w:r>
+        <w:t>)</w:t>
+      </w:r>
+    </w:p>
+    <w:p>
+      <w:pPr>
+        <w:pStyle w:val="Listaszerbekezds"/>
+        <w:numPr>
+          <w:ilvl w:val="0"/>
+          <w:numId w:val="2"/>
+        </w:numPr>
+      </w:pPr>
+      <w:r>
+        <w:t>kivonás (</w:t>
+      </w:r>
+      <w:r>
+        <w:rPr>
+          <w:rFonts w:ascii="Cambria Math" w:hAnsi="Cambria Math"/>
+        </w:rPr>
+        <w:t>–</w:t>
+      </w:r>
+      <w:r>
+        <w:t>)</w:t>
+      </w:r>
+    </w:p>
+    <w:p>
+      <w:pPr>
+        <w:pStyle w:val="Listaszerbekezds"/>
+        <w:numPr>
+          <w:ilvl w:val="0"/>
+          <w:numId w:val="2"/>
+        </w:numPr>
+      </w:pPr>
+      <w:r>
+        <w:t>szorzás (</w:t>
+      </w:r>
+      <w:r>
+        <w:rPr>
+          <w:rFonts w:ascii="Cambria Math" w:hAnsi="Cambria Math"/>
+        </w:rPr>
+        <w:t>×</w:t>
+      </w:r>
+      <w:r>
+        <w:t>)</w:t>
+      </w:r>
+    </w:p>
+    <w:p>
+      <w:pPr>
+        <w:pStyle w:val="Listaszerbekezds"/>
+        <w:numPr>
+          <w:ilvl w:val="0"/>
+          <w:numId w:val="2"/>
+        </w:numPr>
+      </w:pPr>
+      <w:r>
+        <w:t>osztás (</w:t>
+      </w:r>
+      <w:r>
+        <w:rPr>
+          <w:rFonts w:ascii="Cambria Math" w:hAnsi="Cambria Math"/>
+        </w:rPr>
+        <w:t>/</w:t>
+      </w:r>
+      <w:r>
+        <w:t>)</w:t>
+      </w:r>
+    </w:p>
+    <w:p>
+      <w:pPr>
+        <w:pStyle w:val="Listaszerbekezds"/>
+        <w:numPr>
+          <w:ilvl w:val="0"/>
+          <w:numId w:val="2"/>
+        </w:numPr>
+      </w:pPr>
+      <w:r>
+        <w:t>moduló (</w:t>
+      </w:r>
+      <w:r>
+        <w:rPr>
+          <w:rFonts w:ascii="Cambria Math" w:hAnsi="Cambria Math"/>
+        </w:rPr>
+        <w:t>%</w:t>
+      </w:r>
+      <w:r>
+        <w:t>)</w:t>
+      </w:r>
+    </w:p>
+    <w:p>
+      <w:pPr>
+        <w:pStyle w:val="Listaszerbekezds"/>
+        <w:numPr>
+          <w:ilvl w:val="0"/>
+          <w:numId w:val="2"/>
+        </w:numPr>
+      </w:pPr>
+      <w:r>
+        <w:t>hatványozás (</w:t>
+      </w:r>
+      <m:oMath>
+        <m:sSup>
+          <m:sSupPr>
+            <m:ctrlPr>
+              <w:rPr>
+                <w:rFonts w:ascii="Cambria Math" w:hAnsi="Cambria Math"/>
+                <w:i/>
+              </w:rPr>
+            </m:ctrlPr>
+          </m:sSupPr>
+          <m:e>
+            <m:r>
+              <w:rPr>
+                <w:rFonts w:ascii="Cambria Math" w:hAnsi="Cambria Math"/>
+              </w:rPr>
+              <m:t>x</m:t>
+            </m:r>
+          </m:e>
+          <m:sup>
+            <m:r>
+              <w:rPr>
+                <w:rFonts w:ascii="Cambria Math" w:hAnsi="Cambria Math"/>
+              </w:rPr>
+              <m:t>n</m:t>
+            </m:r>
+          </m:sup>
+        </m:sSup>
+      </m:oMath>
+      <w:r>
+        <w:t>)</w:t>
+      </w:r>
+    </w:p>
+    <w:p>
+      <w:pPr>
+        <w:pStyle w:val="Listaszerbekezds"/>
+        <w:numPr>
+          <w:ilvl w:val="0"/>
+          <w:numId w:val="2"/>
+        </w:numPr>
+      </w:pPr>
+      <w:r>
+        <w:t>gyökvonás (</w:t>
+      </w:r>
+      <m:oMath>
+        <m:rad>
+          <m:radPr>
+            <m:ctrlPr>
+              <w:rPr>
+                <w:rFonts w:ascii="Cambria Math" w:hAnsi="Cambria Math"/>
+                <w:i/>
+              </w:rPr>
+            </m:ctrlPr>
+          </m:radPr>
+          <m:deg>
+            <m:r>
+              <w:rPr>
+                <w:rFonts w:ascii="Cambria Math" w:hAnsi="Cambria Math"/>
+              </w:rPr>
+              <m:t>n</m:t>
+            </m:r>
+          </m:deg>
+          <m:e>
+            <m:r>
+              <w:rPr>
+                <w:rFonts w:ascii="Cambria Math" w:hAnsi="Cambria Math"/>
+              </w:rPr>
+              <m:t>x</m:t>
+            </m:r>
+          </m:e>
+        </m:rad>
+      </m:oMath>
+      <w:r>
+        <w:t>)</w:t>
+      </w:r>
     </w:p>
     <w:p>
       <w:pPr>
         <w:pStyle w:val="Cmsor3"/>
       </w:pPr>
-      <w:bookmarkStart w:id="15" w:name="_Toc218480694"/>
-      <w:r>
-        <w:t>Pozitív szám típus (Positive)</w:t>
-      </w:r>
-      <w:bookmarkEnd w:id="15"/>
+      <w:bookmarkStart w:id="16" w:name="_Toc218619928"/>
+      <w:r>
+        <w:t>Leírható</w:t>
+      </w:r>
+      <w:r>
+        <w:t xml:space="preserve"> szám típus (Writable)</w:t>
+      </w:r>
+      <w:bookmarkEnd w:id="16"/>
+    </w:p>
+    <w:p>
+      <w:r>
+        <w:t>Ennek a számtípusnak</w:t>
+      </w:r>
+      <w:r>
+        <w:t xml:space="preserve"> </w:t>
+      </w:r>
+      <w:r>
+        <w:t xml:space="preserve">a halmazába a </w:t>
+      </w:r>
+      <w:r>
+        <w:t>véges sok számjeggyel rendelkező</w:t>
+      </w:r>
+      <w:r>
+        <w:t xml:space="preserve"> számok tartoz</w:t>
+      </w:r>
+      <w:r>
+        <w:t>nak</w:t>
+      </w:r>
+      <w:r>
+        <w:t>, vagyis amiknek akár szabad kézzel is le tudnánk írni az összes számjegyét.</w:t>
+      </w:r>
+    </w:p>
+    <w:p>
+      <w:r>
+        <w:t>Ez a típus a Pozitív szám típusra épül és az Egész szám típus előjel szabályait követi. Vagyis ez sem támogatja az IEEE 754 előjeles nullákra tett szabályozását.</w:t>
+      </w:r>
+    </w:p>
+    <w:p>
+      <w:r>
+        <w:t>A típusra implementálva vannak az alábbi műveletek:</w:t>
+      </w:r>
+    </w:p>
+    <w:p>
+      <w:pPr>
+        <w:pStyle w:val="Listaszerbekezds"/>
+        <w:numPr>
+          <w:ilvl w:val="0"/>
+          <w:numId w:val="2"/>
+        </w:numPr>
+      </w:pPr>
+      <w:r>
+        <w:t>kerekítés (a legközelebbi egészhez</w:t>
+      </w:r>
+      <w:r>
+        <w:rPr>
+          <w:rFonts w:eastAsiaTheme="minorEastAsia"/>
+        </w:rPr>
+        <w:t xml:space="preserve">, </w:t>
+      </w:r>
+      <m:oMath>
+        <m:d>
+          <m:dPr>
+            <m:begChr m:val="⌊"/>
+            <m:endChr m:val="⌋"/>
+            <m:ctrlPr>
+              <w:rPr>
+                <w:rFonts w:ascii="Cambria Math" w:hAnsi="Cambria Math"/>
+                <w:i/>
+              </w:rPr>
+            </m:ctrlPr>
+          </m:dPr>
+          <m:e>
+            <m:r>
+              <w:rPr>
+                <w:rFonts w:ascii="Cambria Math" w:hAnsi="Cambria Math"/>
+              </w:rPr>
+              <m:t>x</m:t>
+            </m:r>
+          </m:e>
+        </m:d>
+      </m:oMath>
+      <w:r>
+        <w:rPr>
+          <w:rFonts w:eastAsiaTheme="minorEastAsia"/>
+        </w:rPr>
+        <w:t xml:space="preserve">, </w:t>
+      </w:r>
+      <m:oMath>
+        <m:d>
+          <m:dPr>
+            <m:begChr m:val="⌈"/>
+            <m:endChr m:val="⌉"/>
+            <m:ctrlPr>
+              <w:rPr>
+                <w:rFonts w:ascii="Cambria Math" w:hAnsi="Cambria Math"/>
+                <w:i/>
+              </w:rPr>
+            </m:ctrlPr>
+          </m:dPr>
+          <m:e>
+            <m:r>
+              <w:rPr>
+                <w:rFonts w:ascii="Cambria Math" w:hAnsi="Cambria Math"/>
+              </w:rPr>
+              <m:t>x</m:t>
+            </m:r>
+          </m:e>
+        </m:d>
+      </m:oMath>
+      <w:r>
+        <w:t>)</w:t>
+      </w:r>
+    </w:p>
+    <w:p>
+      <w:pPr>
+        <w:pStyle w:val="Listaszerbekezds"/>
+        <w:numPr>
+          <w:ilvl w:val="0"/>
+          <w:numId w:val="2"/>
+        </w:numPr>
+      </w:pPr>
+      <w:r>
+        <w:t>abszolút érték (</w:t>
+      </w:r>
+      <m:oMath>
+        <m:r>
+          <w:rPr>
+            <w:rFonts w:ascii="Cambria Math" w:hAnsi="Cambria Math"/>
+          </w:rPr>
+          <m:t>|x|</m:t>
+        </m:r>
+      </m:oMath>
+      <w:r>
+        <w:t>)</w:t>
+      </w:r>
+    </w:p>
+    <w:p>
+      <w:pPr>
+        <w:pStyle w:val="Listaszerbekezds"/>
+        <w:numPr>
+          <w:ilvl w:val="0"/>
+          <w:numId w:val="2"/>
+        </w:numPr>
+      </w:pPr>
+      <w:r>
+        <w:t>egyenlőség (</w:t>
+      </w:r>
+      <w:r>
+        <w:rPr>
+          <w:rFonts w:ascii="Cambria Math" w:hAnsi="Cambria Math"/>
+        </w:rPr>
+        <w:t>=</w:t>
+      </w:r>
+      <w:r>
+        <w:t>)</w:t>
+      </w:r>
+    </w:p>
+    <w:p>
+      <w:pPr>
+        <w:pStyle w:val="Listaszerbekezds"/>
+        <w:numPr>
+          <w:ilvl w:val="0"/>
+          <w:numId w:val="2"/>
+        </w:numPr>
+      </w:pPr>
+      <w:r>
+        <w:t>egyenlőtlenség (</w:t>
+      </w:r>
+      <w:r>
+        <w:rPr>
+          <w:rFonts w:ascii="Cambria Math" w:hAnsi="Cambria Math"/>
+        </w:rPr>
+        <w:t>≠</w:t>
+      </w:r>
+      <w:r>
+        <w:rPr>
+          <w:rFonts w:ascii="Cambria Math" w:hAnsi="Cambria Math"/>
+        </w:rPr>
+        <w:t xml:space="preserve">, </w:t>
+      </w:r>
+      <w:r>
+        <w:rPr>
+          <w:rFonts w:ascii="Cambria Math" w:hAnsi="Cambria Math"/>
+        </w:rPr>
+        <w:t>≥</w:t>
+      </w:r>
+      <w:r>
+        <w:rPr>
+          <w:rFonts w:ascii="Cambria Math" w:hAnsi="Cambria Math"/>
+        </w:rPr>
+        <w:t xml:space="preserve">, </w:t>
+      </w:r>
+      <w:r>
+        <w:rPr>
+          <w:rFonts w:ascii="Cambria Math" w:hAnsi="Cambria Math"/>
+        </w:rPr>
+        <w:t>≤</w:t>
+      </w:r>
+      <w:r>
+        <w:t>)</w:t>
+      </w:r>
+    </w:p>
+    <w:p>
+      <w:pPr>
+        <w:pStyle w:val="Listaszerbekezds"/>
+        <w:numPr>
+          <w:ilvl w:val="0"/>
+          <w:numId w:val="2"/>
+        </w:numPr>
+      </w:pPr>
+      <w:r>
+        <w:t>szigorú egyenlőtlenség (</w:t>
+      </w:r>
+      <w:r>
+        <w:rPr>
+          <w:rFonts w:ascii="Cambria Math" w:hAnsi="Cambria Math"/>
+        </w:rPr>
+        <w:t>&lt;, &gt;</w:t>
+      </w:r>
+      <w:r>
+        <w:t>)</w:t>
+      </w:r>
+    </w:p>
+    <w:p>
+      <w:pPr>
+        <w:pStyle w:val="Listaszerbekezds"/>
+        <w:numPr>
+          <w:ilvl w:val="0"/>
+          <w:numId w:val="2"/>
+        </w:numPr>
+      </w:pPr>
+      <w:r>
+        <w:t>összeadás (</w:t>
+      </w:r>
+      <w:r>
+        <w:rPr>
+          <w:rFonts w:ascii="Cambria Math" w:hAnsi="Cambria Math"/>
+        </w:rPr>
+        <w:t>+</w:t>
+      </w:r>
+      <w:r>
+        <w:t>)</w:t>
+      </w:r>
+    </w:p>
+    <w:p>
+      <w:pPr>
+        <w:pStyle w:val="Listaszerbekezds"/>
+        <w:numPr>
+          <w:ilvl w:val="0"/>
+          <w:numId w:val="2"/>
+        </w:numPr>
+      </w:pPr>
+      <w:r>
+        <w:t>kivonás (</w:t>
+      </w:r>
+      <w:r>
+        <w:rPr>
+          <w:rFonts w:ascii="Cambria Math" w:hAnsi="Cambria Math"/>
+        </w:rPr>
+        <w:t>–</w:t>
+      </w:r>
+      <w:r>
+        <w:t>)</w:t>
+      </w:r>
+    </w:p>
+    <w:p>
+      <w:pPr>
+        <w:pStyle w:val="Listaszerbekezds"/>
+        <w:numPr>
+          <w:ilvl w:val="0"/>
+          <w:numId w:val="2"/>
+        </w:numPr>
+      </w:pPr>
+      <w:r>
+        <w:t>szorzás (</w:t>
+      </w:r>
+      <w:r>
+        <w:rPr>
+          <w:rFonts w:ascii="Cambria Math" w:hAnsi="Cambria Math"/>
+        </w:rPr>
+        <w:t>×</w:t>
+      </w:r>
+      <w:r>
+        <w:t>)</w:t>
+      </w:r>
+    </w:p>
+    <w:p>
+      <w:pPr>
+        <w:pStyle w:val="Listaszerbekezds"/>
+        <w:numPr>
+          <w:ilvl w:val="0"/>
+          <w:numId w:val="2"/>
+        </w:numPr>
+      </w:pPr>
+      <w:r>
+        <w:t>osztás (</w:t>
+      </w:r>
+      <w:r>
+        <w:rPr>
+          <w:rFonts w:ascii="Cambria Math" w:hAnsi="Cambria Math"/>
+        </w:rPr>
+        <w:t>/</w:t>
+      </w:r>
+      <w:r>
+        <w:t>)</w:t>
+      </w:r>
+    </w:p>
+    <w:p>
+      <w:pPr>
+        <w:pStyle w:val="Listaszerbekezds"/>
+        <w:numPr>
+          <w:ilvl w:val="0"/>
+          <w:numId w:val="2"/>
+        </w:numPr>
+      </w:pPr>
+      <w:r>
+        <w:t>moduló (</w:t>
+      </w:r>
+      <w:r>
+        <w:rPr>
+          <w:rFonts w:ascii="Cambria Math" w:hAnsi="Cambria Math"/>
+        </w:rPr>
+        <w:t>%</w:t>
+      </w:r>
+      <w:r>
+        <w:t>)</w:t>
+      </w:r>
+    </w:p>
+    <w:p>
+      <w:pPr>
+        <w:pStyle w:val="Listaszerbekezds"/>
+        <w:numPr>
+          <w:ilvl w:val="0"/>
+          <w:numId w:val="2"/>
+        </w:numPr>
+      </w:pPr>
+      <w:r>
+        <w:t>hatványozás (</w:t>
+      </w:r>
+      <m:oMath>
+        <m:sSup>
+          <m:sSupPr>
+            <m:ctrlPr>
+              <w:rPr>
+                <w:rFonts w:ascii="Cambria Math" w:hAnsi="Cambria Math"/>
+                <w:i/>
+              </w:rPr>
+            </m:ctrlPr>
+          </m:sSupPr>
+          <m:e>
+            <m:r>
+              <w:rPr>
+                <w:rFonts w:ascii="Cambria Math" w:hAnsi="Cambria Math"/>
+              </w:rPr>
+              <m:t>x</m:t>
+            </m:r>
+          </m:e>
+          <m:sup>
+            <m:r>
+              <w:rPr>
+                <w:rFonts w:ascii="Cambria Math" w:hAnsi="Cambria Math"/>
+              </w:rPr>
+              <m:t>n</m:t>
+            </m:r>
+          </m:sup>
+        </m:sSup>
+      </m:oMath>
+      <w:r>
+        <w:t>)</w:t>
+      </w:r>
+    </w:p>
+    <w:p>
+      <w:pPr>
+        <w:pStyle w:val="Listaszerbekezds"/>
+        <w:numPr>
+          <w:ilvl w:val="0"/>
+          <w:numId w:val="2"/>
+        </w:numPr>
+      </w:pPr>
+      <w:r>
+        <w:t>gyökvonás (</w:t>
+      </w:r>
+      <m:oMath>
+        <m:rad>
+          <m:radPr>
+            <m:ctrlPr>
+              <w:rPr>
+                <w:rFonts w:ascii="Cambria Math" w:hAnsi="Cambria Math"/>
+                <w:i/>
+              </w:rPr>
+            </m:ctrlPr>
+          </m:radPr>
+          <m:deg>
+            <m:r>
+              <w:rPr>
+                <w:rFonts w:ascii="Cambria Math" w:hAnsi="Cambria Math"/>
+              </w:rPr>
+              <m:t>n</m:t>
+            </m:r>
+          </m:deg>
+          <m:e>
+            <m:r>
+              <w:rPr>
+                <w:rFonts w:ascii="Cambria Math" w:hAnsi="Cambria Math"/>
+              </w:rPr>
+              <m:t>x</m:t>
+            </m:r>
+          </m:e>
+        </m:rad>
+      </m:oMath>
+      <w:r>
+        <w:t>)</w:t>
+      </w:r>
     </w:p>
     <w:p>
       <w:pPr>
         <w:pStyle w:val="Cmsor3"/>
       </w:pPr>
-      <w:bookmarkStart w:id="16" w:name="_Toc218480695"/>
-      <w:r>
-        <w:t>Valós szám típus (Writable)</w:t>
-      </w:r>
-      <w:bookmarkEnd w:id="16"/>
+      <w:bookmarkStart w:id="17" w:name="_Toc218619929"/>
+      <w:r>
+        <w:lastRenderedPageBreak/>
+        <w:t>Racionális szám típus (Rational)</w:t>
+      </w:r>
+      <w:bookmarkEnd w:id="17"/>
+    </w:p>
+    <w:p>
+      <w:r>
+        <w:t xml:space="preserve">Ennek a számtípusnak a halmazába a </w:t>
+      </w:r>
+      <w:r>
+        <w:t>racionális</w:t>
+      </w:r>
+      <w:r>
+        <w:t xml:space="preserve"> számok </w:t>
+      </w:r>
+      <w:r>
+        <w:t>tartoznak</w:t>
+      </w:r>
+      <w:r>
+        <w:t>.</w:t>
+      </w:r>
+    </w:p>
+    <w:p>
+      <w:r>
+        <w:t xml:space="preserve">A típus számlálónak Leírható, nevezőnek pedig Pozitív </w:t>
+      </w:r>
+      <w:r>
+        <w:t>számtípust</w:t>
+      </w:r>
+      <w:r>
+        <w:t xml:space="preserve"> használ, így gondoskodva a hatékonyan lekérdezhető előjelről.</w:t>
+      </w:r>
+    </w:p>
+    <w:p>
+      <w:r>
+        <w:t>A típusra implementálva vannak az alábbi műveletek:</w:t>
+      </w:r>
+    </w:p>
+    <w:p>
+      <w:pPr>
+        <w:pStyle w:val="Listaszerbekezds"/>
+        <w:numPr>
+          <w:ilvl w:val="0"/>
+          <w:numId w:val="2"/>
+        </w:numPr>
+      </w:pPr>
+      <w:r>
+        <w:t>kerekítés (a legközelebbi egészhez</w:t>
+      </w:r>
+      <w:r>
+        <w:rPr>
+          <w:rFonts w:eastAsiaTheme="minorEastAsia"/>
+        </w:rPr>
+        <w:t xml:space="preserve">, </w:t>
+      </w:r>
+      <m:oMath>
+        <m:d>
+          <m:dPr>
+            <m:begChr m:val="⌊"/>
+            <m:endChr m:val="⌋"/>
+            <m:ctrlPr>
+              <w:rPr>
+                <w:rFonts w:ascii="Cambria Math" w:hAnsi="Cambria Math"/>
+                <w:i/>
+              </w:rPr>
+            </m:ctrlPr>
+          </m:dPr>
+          <m:e>
+            <m:r>
+              <w:rPr>
+                <w:rFonts w:ascii="Cambria Math" w:hAnsi="Cambria Math"/>
+              </w:rPr>
+              <m:t>x</m:t>
+            </m:r>
+          </m:e>
+        </m:d>
+      </m:oMath>
+      <w:r>
+        <w:rPr>
+          <w:rFonts w:eastAsiaTheme="minorEastAsia"/>
+        </w:rPr>
+        <w:t xml:space="preserve">, </w:t>
+      </w:r>
+      <m:oMath>
+        <m:d>
+          <m:dPr>
+            <m:begChr m:val="⌈"/>
+            <m:endChr m:val="⌉"/>
+            <m:ctrlPr>
+              <w:rPr>
+                <w:rFonts w:ascii="Cambria Math" w:hAnsi="Cambria Math"/>
+                <w:i/>
+              </w:rPr>
+            </m:ctrlPr>
+          </m:dPr>
+          <m:e>
+            <m:r>
+              <w:rPr>
+                <w:rFonts w:ascii="Cambria Math" w:hAnsi="Cambria Math"/>
+              </w:rPr>
+              <m:t>x</m:t>
+            </m:r>
+          </m:e>
+        </m:d>
+      </m:oMath>
+      <w:r>
+        <w:t>)</w:t>
+      </w:r>
+    </w:p>
+    <w:p>
+      <w:pPr>
+        <w:pStyle w:val="Listaszerbekezds"/>
+        <w:numPr>
+          <w:ilvl w:val="0"/>
+          <w:numId w:val="2"/>
+        </w:numPr>
+      </w:pPr>
+      <w:r>
+        <w:t>abszolút érték (</w:t>
+      </w:r>
+      <m:oMath>
+        <m:r>
+          <w:rPr>
+            <w:rFonts w:ascii="Cambria Math" w:hAnsi="Cambria Math"/>
+          </w:rPr>
+          <m:t>|x|</m:t>
+        </m:r>
+      </m:oMath>
+      <w:r>
+        <w:t>)</w:t>
+      </w:r>
+    </w:p>
+    <w:p>
+      <w:pPr>
+        <w:pStyle w:val="Listaszerbekezds"/>
+        <w:numPr>
+          <w:ilvl w:val="0"/>
+          <w:numId w:val="2"/>
+        </w:numPr>
+      </w:pPr>
+      <w:r>
+        <w:t>egyenlőség (</w:t>
+      </w:r>
+      <w:r>
+        <w:rPr>
+          <w:rFonts w:ascii="Cambria Math" w:hAnsi="Cambria Math"/>
+        </w:rPr>
+        <w:t>=</w:t>
+      </w:r>
+      <w:r>
+        <w:t>)</w:t>
+      </w:r>
+    </w:p>
+    <w:p>
+      <w:pPr>
+        <w:pStyle w:val="Listaszerbekezds"/>
+        <w:numPr>
+          <w:ilvl w:val="0"/>
+          <w:numId w:val="2"/>
+        </w:numPr>
+      </w:pPr>
+      <w:r>
+        <w:t>egyenlőtlenség (</w:t>
+      </w:r>
+      <w:r>
+        <w:rPr>
+          <w:rFonts w:ascii="Cambria Math" w:hAnsi="Cambria Math"/>
+        </w:rPr>
+        <w:t>≠</w:t>
+      </w:r>
+      <w:r>
+        <w:rPr>
+          <w:rFonts w:ascii="Cambria Math" w:hAnsi="Cambria Math"/>
+        </w:rPr>
+        <w:t xml:space="preserve">, </w:t>
+      </w:r>
+      <w:r>
+        <w:rPr>
+          <w:rFonts w:ascii="Cambria Math" w:hAnsi="Cambria Math"/>
+        </w:rPr>
+        <w:t>≥</w:t>
+      </w:r>
+      <w:r>
+        <w:rPr>
+          <w:rFonts w:ascii="Cambria Math" w:hAnsi="Cambria Math"/>
+        </w:rPr>
+        <w:t xml:space="preserve">, </w:t>
+      </w:r>
+      <w:r>
+        <w:rPr>
+          <w:rFonts w:ascii="Cambria Math" w:hAnsi="Cambria Math"/>
+        </w:rPr>
+        <w:t>≤</w:t>
+      </w:r>
+      <w:r>
+        <w:t>)</w:t>
+      </w:r>
+    </w:p>
+    <w:p>
+      <w:pPr>
+        <w:pStyle w:val="Listaszerbekezds"/>
+        <w:numPr>
+          <w:ilvl w:val="0"/>
+          <w:numId w:val="2"/>
+        </w:numPr>
+      </w:pPr>
+      <w:r>
+        <w:t>szigorú egyenlőtlenség (</w:t>
+      </w:r>
+      <w:r>
+        <w:rPr>
+          <w:rFonts w:ascii="Cambria Math" w:hAnsi="Cambria Math"/>
+        </w:rPr>
+        <w:t>&lt;, &gt;</w:t>
+      </w:r>
+      <w:r>
+        <w:t>)</w:t>
+      </w:r>
+    </w:p>
+    <w:p>
+      <w:pPr>
+        <w:pStyle w:val="Listaszerbekezds"/>
+        <w:numPr>
+          <w:ilvl w:val="0"/>
+          <w:numId w:val="2"/>
+        </w:numPr>
+      </w:pPr>
+      <w:r>
+        <w:t>összeadás (</w:t>
+      </w:r>
+      <w:r>
+        <w:rPr>
+          <w:rFonts w:ascii="Cambria Math" w:hAnsi="Cambria Math"/>
+        </w:rPr>
+        <w:t>+</w:t>
+      </w:r>
+      <w:r>
+        <w:t>)</w:t>
+      </w:r>
+    </w:p>
+    <w:p>
+      <w:pPr>
+        <w:pStyle w:val="Listaszerbekezds"/>
+        <w:numPr>
+          <w:ilvl w:val="0"/>
+          <w:numId w:val="2"/>
+        </w:numPr>
+      </w:pPr>
+      <w:r>
+        <w:t>kivonás (</w:t>
+      </w:r>
+      <w:r>
+        <w:rPr>
+          <w:rFonts w:ascii="Cambria Math" w:hAnsi="Cambria Math"/>
+        </w:rPr>
+        <w:t>–</w:t>
+      </w:r>
+      <w:r>
+        <w:t>)</w:t>
+      </w:r>
+    </w:p>
+    <w:p>
+      <w:pPr>
+        <w:pStyle w:val="Listaszerbekezds"/>
+        <w:numPr>
+          <w:ilvl w:val="0"/>
+          <w:numId w:val="2"/>
+        </w:numPr>
+      </w:pPr>
+      <w:r>
+        <w:t>szorzás (</w:t>
+      </w:r>
+      <w:r>
+        <w:rPr>
+          <w:rFonts w:ascii="Cambria Math" w:hAnsi="Cambria Math"/>
+        </w:rPr>
+        <w:t>×</w:t>
+      </w:r>
+      <w:r>
+        <w:t>)</w:t>
+      </w:r>
+    </w:p>
+    <w:p>
+      <w:pPr>
+        <w:pStyle w:val="Listaszerbekezds"/>
+        <w:numPr>
+          <w:ilvl w:val="0"/>
+          <w:numId w:val="2"/>
+        </w:numPr>
+      </w:pPr>
+      <w:r>
+        <w:t>osztás (</w:t>
+      </w:r>
+      <w:r>
+        <w:rPr>
+          <w:rFonts w:ascii="Cambria Math" w:hAnsi="Cambria Math"/>
+        </w:rPr>
+        <w:t>/</w:t>
+      </w:r>
+      <w:r>
+        <w:t>)</w:t>
+      </w:r>
+    </w:p>
+    <w:p>
+      <w:pPr>
+        <w:pStyle w:val="Listaszerbekezds"/>
+        <w:numPr>
+          <w:ilvl w:val="0"/>
+          <w:numId w:val="2"/>
+        </w:numPr>
+      </w:pPr>
+      <w:r>
+        <w:t>moduló (</w:t>
+      </w:r>
+      <w:r>
+        <w:rPr>
+          <w:rFonts w:ascii="Cambria Math" w:hAnsi="Cambria Math"/>
+        </w:rPr>
+        <w:t>%</w:t>
+      </w:r>
+      <w:r>
+        <w:t>)</w:t>
+      </w:r>
+    </w:p>
+    <w:p>
+      <w:pPr>
+        <w:pStyle w:val="Listaszerbekezds"/>
+        <w:numPr>
+          <w:ilvl w:val="0"/>
+          <w:numId w:val="2"/>
+        </w:numPr>
+      </w:pPr>
+      <w:r>
+        <w:t>hatványozás (</w:t>
+      </w:r>
+      <m:oMath>
+        <m:sSup>
+          <m:sSupPr>
+            <m:ctrlPr>
+              <w:rPr>
+                <w:rFonts w:ascii="Cambria Math" w:hAnsi="Cambria Math"/>
+                <w:i/>
+              </w:rPr>
+            </m:ctrlPr>
+          </m:sSupPr>
+          <m:e>
+            <m:r>
+              <w:rPr>
+                <w:rFonts w:ascii="Cambria Math" w:hAnsi="Cambria Math"/>
+              </w:rPr>
+              <m:t>x</m:t>
+            </m:r>
+          </m:e>
+          <m:sup>
+            <m:r>
+              <w:rPr>
+                <w:rFonts w:ascii="Cambria Math" w:hAnsi="Cambria Math"/>
+              </w:rPr>
+              <m:t>n</m:t>
+            </m:r>
+          </m:sup>
+        </m:sSup>
+      </m:oMath>
+      <w:r>
+        <w:t>)</w:t>
+      </w:r>
+    </w:p>
+    <w:p>
+      <w:pPr>
+        <w:pStyle w:val="Listaszerbekezds"/>
+        <w:numPr>
+          <w:ilvl w:val="0"/>
+          <w:numId w:val="2"/>
+        </w:numPr>
+      </w:pPr>
+      <w:r>
+        <w:t>gyökvonás (</w:t>
+      </w:r>
+      <m:oMath>
+        <m:rad>
+          <m:radPr>
+            <m:ctrlPr>
+              <w:rPr>
+                <w:rFonts w:ascii="Cambria Math" w:hAnsi="Cambria Math"/>
+                <w:i/>
+              </w:rPr>
+            </m:ctrlPr>
+          </m:radPr>
+          <m:deg>
+            <m:r>
+              <w:rPr>
+                <w:rFonts w:ascii="Cambria Math" w:hAnsi="Cambria Math"/>
+              </w:rPr>
+              <m:t>n</m:t>
+            </m:r>
+          </m:deg>
+          <m:e>
+            <m:r>
+              <w:rPr>
+                <w:rFonts w:ascii="Cambria Math" w:hAnsi="Cambria Math"/>
+              </w:rPr>
+              <m:t>x</m:t>
+            </m:r>
+          </m:e>
+        </m:rad>
+      </m:oMath>
+      <w:r>
+        <w:t>)</w:t>
+      </w:r>
+    </w:p>
+    <w:p>
+      <w:pPr>
+        <w:pStyle w:val="Cmsor2"/>
+      </w:pPr>
+      <w:bookmarkStart w:id="18" w:name="_Toc218619930"/>
+      <w:r>
+        <w:lastRenderedPageBreak/>
+        <w:t>Számológép megvalósítása</w:t>
+      </w:r>
+      <w:bookmarkEnd w:id="18"/>
     </w:p>
     <w:p>
       <w:pPr>
         <w:pStyle w:val="Cmsor3"/>
       </w:pPr>
-      <w:bookmarkStart w:id="17" w:name="_Toc218480696"/>
-      <w:r>
-        <w:t>Racionális szám típus (Rational)</w:t>
-      </w:r>
-      <w:bookmarkEnd w:id="17"/>
+      <w:bookmarkStart w:id="19" w:name="_Toc218619931"/>
+      <w:r>
+        <w:t>Parser</w:t>
+      </w:r>
+      <w:bookmarkEnd w:id="19"/>
+    </w:p>
+    <w:p>
+      <w:pPr>
+        <w:pStyle w:val="Cmsor3"/>
+      </w:pPr>
+      <w:bookmarkStart w:id="20" w:name="_Toc218619932"/>
+      <w:r>
+        <w:t>Általános számológép (Standard)</w:t>
+      </w:r>
+      <w:bookmarkEnd w:id="20"/>
+    </w:p>
+    <w:p>
+      <w:pPr>
+        <w:pStyle w:val="Cmsor3"/>
+      </w:pPr>
+      <w:bookmarkStart w:id="21" w:name="_Toc218619933"/>
+      <w:r>
+        <w:t>Euklideszi tér számológép (EuclideanSpace)</w:t>
+      </w:r>
+      <w:bookmarkEnd w:id="21"/>
+    </w:p>
+    <w:p>
+      <w:pPr>
+        <w:pStyle w:val="Cmsor3"/>
+      </w:pPr>
+      <w:bookmarkStart w:id="22" w:name="_Toc218619934"/>
+      <w:r>
+        <w:t>Polinom számológép (Polynomials)</w:t>
+      </w:r>
+      <w:bookmarkEnd w:id="22"/>
+    </w:p>
+    <w:p>
+      <w:pPr>
+        <w:pStyle w:val="Cmsor3"/>
+      </w:pPr>
+      <w:bookmarkStart w:id="23" w:name="_Toc218619935"/>
+      <w:r>
+        <w:t>Integrálközelítés számológép (Integral)</w:t>
+      </w:r>
+      <w:bookmarkEnd w:id="23"/>
     </w:p>
     <w:p>
       <w:pPr>
         <w:pStyle w:val="Cmsor2"/>
       </w:pPr>
-      <w:bookmarkStart w:id="18" w:name="_Toc218480697"/>
-      <w:r>
-        <w:t>Számológép megvalósítása</w:t>
-      </w:r>
-      <w:bookmarkEnd w:id="18"/>
+      <w:bookmarkStart w:id="24" w:name="_Toc218619936"/>
+      <w:r>
+        <w:t>Vizuális számológép megvalósítása</w:t>
+      </w:r>
+      <w:bookmarkEnd w:id="24"/>
     </w:p>
     <w:p>
       <w:pPr>
         <w:pStyle w:val="Cmsor3"/>
       </w:pPr>
-      <w:bookmarkStart w:id="19" w:name="_Toc218480698"/>
-      <w:r>
-        <w:t>Parser</w:t>
-      </w:r>
-      <w:bookmarkEnd w:id="19"/>
+      <w:bookmarkStart w:id="25" w:name="_Toc218619937"/>
+      <w:r>
+        <w:t>Funkciók</w:t>
+      </w:r>
+      <w:bookmarkEnd w:id="25"/>
+    </w:p>
+    <w:p>
+      <w:pPr>
+        <w:pStyle w:val="Cmsor2"/>
+      </w:pPr>
+      <w:bookmarkStart w:id="26" w:name="_Toc218619938"/>
+      <w:r>
+        <w:t>Jövőbeli fejlesztések</w:t>
+      </w:r>
+      <w:bookmarkEnd w:id="26"/>
     </w:p>
     <w:p>
       <w:pPr>
         <w:pStyle w:val="Cmsor3"/>
       </w:pPr>
-      <w:bookmarkStart w:id="20" w:name="_Toc218480699"/>
-      <w:r>
-        <w:t>Általános számológép (Standard)</w:t>
-      </w:r>
-      <w:bookmarkEnd w:id="20"/>
+      <w:bookmarkStart w:id="27" w:name="_Toc218619939"/>
+      <w:r>
+        <w:t>Teljesítményt növelő fejlesztések</w:t>
+      </w:r>
+      <w:bookmarkEnd w:id="27"/>
     </w:p>
     <w:p>
       <w:pPr>
         <w:pStyle w:val="Cmsor3"/>
       </w:pPr>
-      <w:bookmarkStart w:id="21" w:name="_Toc218480700"/>
-      <w:r>
-        <w:t>Euklideszi tér számológép (</w:t>
-      </w:r>
-      <w:proofErr w:type="spellStart"/>
-      <w:r>
-        <w:t>EuclideanSpace</w:t>
-      </w:r>
-      <w:proofErr w:type="spellEnd"/>
-      <w:r>
-        <w:t>)</w:t>
-      </w:r>
-      <w:bookmarkEnd w:id="21"/>
+      <w:bookmarkStart w:id="28" w:name="_Toc218619940"/>
+      <w:r>
+        <w:t>Bővítmények</w:t>
+      </w:r>
+      <w:bookmarkEnd w:id="28"/>
     </w:p>
     <w:p>
       <w:pPr>
         <w:pStyle w:val="Cmsor3"/>
       </w:pPr>
-      <w:bookmarkStart w:id="22" w:name="_Toc218480701"/>
-      <w:r>
-        <w:t>Polinom számológép (</w:t>
-      </w:r>
-      <w:proofErr w:type="spellStart"/>
-      <w:r>
-        <w:t>Polynomials</w:t>
-      </w:r>
-      <w:proofErr w:type="spellEnd"/>
-      <w:r>
-        <w:t>)</w:t>
-      </w:r>
-      <w:bookmarkEnd w:id="22"/>
-    </w:p>
-    <w:p>
-      <w:pPr>
-        <w:pStyle w:val="Cmsor3"/>
-      </w:pPr>
-      <w:bookmarkStart w:id="23" w:name="_Toc218480702"/>
-      <w:r>
-        <w:t>Integrálközelítés számológép (</w:t>
-      </w:r>
-      <w:proofErr w:type="spellStart"/>
-      <w:r>
-        <w:t>Integral</w:t>
-      </w:r>
-      <w:proofErr w:type="spellEnd"/>
-      <w:r>
-        <w:t>)</w:t>
-      </w:r>
-      <w:bookmarkEnd w:id="23"/>
+      <w:bookmarkStart w:id="29" w:name="_Toc218619941"/>
+      <w:r>
+        <w:t>Más nyelvekre kiterjesztés</w:t>
+      </w:r>
+      <w:bookmarkEnd w:id="29"/>
     </w:p>
     <w:p>
       <w:pPr>
         <w:pStyle w:val="Cmsor2"/>
       </w:pPr>
-      <w:bookmarkStart w:id="24" w:name="_Toc218480703"/>
-      <w:r>
-        <w:t>Vizuális számológép megvalósítása</w:t>
-      </w:r>
-      <w:bookmarkEnd w:id="24"/>
-    </w:p>
-    <w:p>
-      <w:pPr>
-        <w:pStyle w:val="Cmsor3"/>
-      </w:pPr>
-      <w:bookmarkStart w:id="25" w:name="_Toc218480704"/>
-      <w:r>
-        <w:t>Funkciók</w:t>
-      </w:r>
-      <w:bookmarkEnd w:id="25"/>
-    </w:p>
-    <w:p>
-      <w:pPr>
-        <w:pStyle w:val="Cmsor2"/>
-      </w:pPr>
-      <w:bookmarkStart w:id="26" w:name="_Toc218480705"/>
-      <w:r>
-        <w:t>Jövőbeli fejlesztések</w:t>
-      </w:r>
-      <w:bookmarkEnd w:id="26"/>
-    </w:p>
-    <w:p>
-      <w:pPr>
-        <w:pStyle w:val="Cmsor3"/>
-      </w:pPr>
-      <w:bookmarkStart w:id="27" w:name="_Toc218480706"/>
-      <w:r>
-        <w:t>Teljesítményt növelő fejlesztések</w:t>
-      </w:r>
-      <w:bookmarkEnd w:id="27"/>
-    </w:p>
-    <w:p>
-      <w:pPr>
-        <w:pStyle w:val="Cmsor3"/>
-      </w:pPr>
-      <w:bookmarkStart w:id="28" w:name="_Toc218480707"/>
-      <w:r>
-        <w:t>Bővítmények</w:t>
-      </w:r>
-      <w:bookmarkEnd w:id="28"/>
-    </w:p>
-    <w:p>
-      <w:pPr>
-        <w:pStyle w:val="Cmsor3"/>
-      </w:pPr>
-      <w:bookmarkStart w:id="29" w:name="_Toc218480708"/>
-      <w:r>
-        <w:t>Más nyelvekre kiterjesztés</w:t>
-      </w:r>
-      <w:bookmarkEnd w:id="29"/>
-    </w:p>
-    <w:p>
-      <w:pPr>
-        <w:pStyle w:val="Cmsor2"/>
-      </w:pPr>
-      <w:bookmarkStart w:id="30" w:name="_Toc218480709"/>
+      <w:bookmarkStart w:id="30" w:name="_Toc218619942"/>
       <w:r>
         <w:t>Köszönetnyilvánítás</w:t>
       </w:r>
@@ -4754,7 +6297,7 @@
       </w:r>
     </w:p>
     <w:sectPr>
-      <w:footerReference w:type="default" r:id="rId7"/>
+      <w:footerReference w:type="default" r:id="rId8"/>
       <w:pgSz w:w="11906" w:h="16838"/>
       <w:pgMar w:top="1417" w:right="1417" w:bottom="1417" w:left="1417" w:header="708" w:footer="708" w:gutter="0"/>
       <w:pgNumType w:start="0"/>
@@ -5843,7 +7386,7 @@
   <w:style w:type="paragraph" w:default="1" w:styleId="Norml">
     <w:name w:val="Normal"/>
     <w:qFormat/>
-    <w:rsid w:val="00132E91"/>
+    <w:rsid w:val="001B48FA"/>
     <w:pPr>
       <w:spacing w:line="360" w:lineRule="auto"/>
       <w:ind w:firstLine="227"/>
@@ -6810,4 +8353,16 @@
     </a:ext>
   </a:extLst>
 </a:theme>
+</file>
+
+<file path=customXml/item1.xml><?xml version="1.0" encoding="utf-8"?>
+<b:Sources xmlns:b="http://schemas.openxmlformats.org/officeDocument/2006/bibliography" xmlns="http://schemas.openxmlformats.org/officeDocument/2006/bibliography" SelectedStyle="\APASixthEditionOfficeOnline.xsl" StyleName="APA" Version="6"/>
+</file>
+
+<file path=customXml/itemProps1.xml><?xml version="1.0" encoding="utf-8"?>
+<ds:datastoreItem xmlns:ds="http://schemas.openxmlformats.org/officeDocument/2006/customXml" ds:itemID="{3880EDC1-3ABD-4269-A144-22FDE4C82904}">
+  <ds:schemaRefs>
+    <ds:schemaRef ds:uri="http://schemas.openxmlformats.org/officeDocument/2006/bibliography"/>
+  </ds:schemaRefs>
+</ds:datastoreItem>
 </file>
</xml_diff>

<commit_message>
Adding the basics of DerivativeCalculator.
</commit_message>
<xml_diff>
--- a/Documentation.docx
+++ b/Documentation.docx
@@ -3644,7 +3644,7 @@
         <w:t xml:space="preserve">a hétköznapi helyzetek többségére tökéletesen megfelelő a lebegőpontos számtípusok használata. Viszont remélem sikerült rámutatnom olyan szembetűnő </w:t>
       </w:r>
       <w:r>
-        <w:t>tulajdonságokra</w:t>
+        <w:t>tökéletlenségekre</w:t>
       </w:r>
       <w:r>
         <w:t>, amik egyértelműsítik, hogy vannak olyan helyzetek, amikor nem ez a megfelelő eszköz a feladatra.</w:t>
@@ -4605,19 +4605,7 @@
     </w:p>
     <w:p>
       <w:r>
-        <w:t>Ennek a számtípusnak a halmazába a</w:t>
-      </w:r>
-      <w:r>
-        <w:t>z</w:t>
-      </w:r>
-      <w:r>
-        <w:t xml:space="preserve"> egész számok tartoz</w:t>
-      </w:r>
-      <w:r>
-        <w:t>nak</w:t>
-      </w:r>
-      <w:r>
-        <w:t>.</w:t>
+        <w:t>Ennek a számtípusnak a halmazába az egész számok tartoznak.</w:t>
       </w:r>
     </w:p>
     <w:p>
@@ -5337,16 +5325,7 @@
         <w:t xml:space="preserve"> </w:t>
       </w:r>
       <w:r>
-        <w:t xml:space="preserve">a halmazába a </w:t>
-      </w:r>
-      <w:r>
-        <w:t>véges sok számjeggyel rendelkező</w:t>
-      </w:r>
-      <w:r>
-        <w:t xml:space="preserve"> számok tartoz</w:t>
-      </w:r>
-      <w:r>
-        <w:t>nak</w:t>
+        <w:t>a halmazába a véges sok számjeggyel rendelkező számok tartoznak</w:t>
       </w:r>
       <w:r>
         <w:t>, vagyis amiknek akár szabad kézzel is le tudnánk írni az összes számjegyét.</w:t>
@@ -5747,30 +5726,12 @@
     </w:p>
     <w:p>
       <w:r>
-        <w:t xml:space="preserve">Ennek a számtípusnak a halmazába a </w:t>
-      </w:r>
-      <w:r>
-        <w:t>racionális</w:t>
-      </w:r>
-      <w:r>
-        <w:t xml:space="preserve"> számok </w:t>
-      </w:r>
-      <w:r>
-        <w:t>tartoznak</w:t>
-      </w:r>
-      <w:r>
-        <w:t>.</w:t>
-      </w:r>
-    </w:p>
-    <w:p>
-      <w:r>
-        <w:t xml:space="preserve">A típus számlálónak Leírható, nevezőnek pedig Pozitív </w:t>
-      </w:r>
-      <w:r>
-        <w:t>számtípust</w:t>
-      </w:r>
-      <w:r>
-        <w:t xml:space="preserve"> használ, így gondoskodva a hatékonyan lekérdezhető előjelről.</w:t>
+        <w:t>Ennek a számtípusnak a halmazába a racionális számok tartoznak.</w:t>
+      </w:r>
+    </w:p>
+    <w:p>
+      <w:r>
+        <w:t>A típus számlálónak Leírható, nevezőnek pedig Pozitív számtípust használ, így gondoskodva a hatékonyan lekérdezhető előjelről.</w:t>
       </w:r>
     </w:p>
     <w:p>

</xml_diff>

<commit_message>
Adding explanation to the power method of the Natural type in the documentation.
</commit_message>
<xml_diff>
--- a/Documentation.docx
+++ b/Documentation.docx
@@ -3701,7 +3701,15 @@
         <w:jc w:val="center"/>
       </w:pPr>
       <w:r>
-        <w:t>&lt;kép egy 0-nál kisebb számról ami rövidebb mint a fractionLength&gt;</w:t>
+        <w:t xml:space="preserve">&lt;kép egy 0-nál kisebb számról ami rövidebb mint a </w:t>
+      </w:r>
+      <w:proofErr w:type="spellStart"/>
+      <w:r>
+        <w:t>fractionLength</w:t>
+      </w:r>
+      <w:proofErr w:type="spellEnd"/>
+      <w:r>
+        <w:t>&gt;</w:t>
       </w:r>
     </w:p>
     <w:p>
@@ -4226,8 +4234,13 @@
         <w:t>long</w:t>
       </w:r>
       <w:r>
-        <w:t xml:space="preserve"> long</w:t>
-      </w:r>
+        <w:t xml:space="preserve"> </w:t>
+      </w:r>
+      <w:proofErr w:type="spellStart"/>
+      <w:r>
+        <w:t>long</w:t>
+      </w:r>
+      <w:proofErr w:type="spellEnd"/>
       <w:r>
         <w:t xml:space="preserve"> számtípus</w:t>
       </w:r>
@@ -4594,10 +4607,896 @@
       </w:r>
     </w:p>
     <w:p>
+      <w:bookmarkStart w:id="14" w:name="_Toc218619926"/>
+      <w:r>
+        <w:t>Érdemes még pár szót ejteni a hatványozás és a gyökvonás megvalósításáról, ugyanis ezen értékek számítási technikája eltér az iskolában tanult módszerekétől.</w:t>
+      </w:r>
+    </w:p>
+    <w:p>
+      <w:r>
+        <w:rPr>
+          <w:b/>
+          <w:bCs/>
+        </w:rPr>
+        <w:t>Hatványozásnál</w:t>
+      </w:r>
+      <w:r>
+        <w:t xml:space="preserve"> alapesetben annyi szorzást kellene végeznünk amennyi a kitevő értéke. Magas hatványkitevők esetén ez a módszer borzasztó költséges és lassú. A szorzatok csoportosításával azonban jól láthatóvá válik, hogy ez a technika fölöslegesen végez ennyi szorzást:</w:t>
+      </w:r>
+    </w:p>
+    <w:p>
+      <w:pPr>
+        <w:ind w:left="227"/>
+        <w:rPr>
+          <w:rFonts w:eastAsiaTheme="minorEastAsia"/>
+        </w:rPr>
+      </w:pPr>
+      <m:oMathPara>
+        <m:oMath>
+          <m:sSup>
+            <m:sSupPr>
+              <m:ctrlPr>
+                <w:rPr>
+                  <w:rFonts w:ascii="Cambria Math" w:hAnsi="Cambria Math"/>
+                  <w:i/>
+                </w:rPr>
+              </m:ctrlPr>
+            </m:sSupPr>
+            <m:e>
+              <m:r>
+                <w:rPr>
+                  <w:rFonts w:ascii="Cambria Math" w:hAnsi="Cambria Math"/>
+                </w:rPr>
+                <m:t>2</m:t>
+              </m:r>
+            </m:e>
+            <m:sup>
+              <m:r>
+                <w:rPr>
+                  <w:rFonts w:ascii="Cambria Math" w:hAnsi="Cambria Math"/>
+                </w:rPr>
+                <m:t>8</m:t>
+              </m:r>
+            </m:sup>
+          </m:sSup>
+          <m:r>
+            <w:rPr>
+              <w:rFonts w:ascii="Cambria Math" w:hAnsi="Cambria Math"/>
+            </w:rPr>
+            <m:t>=2×2×2×2×2×2×2×2</m:t>
+          </m:r>
+          <m:r>
+            <w:rPr>
+              <w:rFonts w:ascii="Cambria Math" w:eastAsiaTheme="minorEastAsia" w:hAnsi="Cambria Math"/>
+            </w:rPr>
+            <m:t>=</m:t>
+          </m:r>
+          <m:d>
+            <m:dPr>
+              <m:ctrlPr>
+                <w:rPr>
+                  <w:rFonts w:ascii="Cambria Math" w:eastAsiaTheme="minorEastAsia" w:hAnsi="Cambria Math"/>
+                  <w:i/>
+                </w:rPr>
+              </m:ctrlPr>
+            </m:dPr>
+            <m:e>
+              <m:r>
+                <w:rPr>
+                  <w:rFonts w:ascii="Cambria Math" w:eastAsiaTheme="minorEastAsia" w:hAnsi="Cambria Math"/>
+                </w:rPr>
+                <m:t>2×2×2×2</m:t>
+              </m:r>
+            </m:e>
+          </m:d>
+          <m:r>
+            <w:rPr>
+              <w:rFonts w:ascii="Cambria Math" w:eastAsiaTheme="minorEastAsia" w:hAnsi="Cambria Math"/>
+            </w:rPr>
+            <m:t>×</m:t>
+          </m:r>
+          <m:d>
+            <m:dPr>
+              <m:ctrlPr>
+                <w:rPr>
+                  <w:rFonts w:ascii="Cambria Math" w:eastAsiaTheme="minorEastAsia" w:hAnsi="Cambria Math"/>
+                  <w:i/>
+                </w:rPr>
+              </m:ctrlPr>
+            </m:dPr>
+            <m:e>
+              <m:r>
+                <w:rPr>
+                  <w:rFonts w:ascii="Cambria Math" w:eastAsiaTheme="minorEastAsia" w:hAnsi="Cambria Math"/>
+                </w:rPr>
+                <m:t>2×2×</m:t>
+              </m:r>
+              <m:r>
+                <w:rPr>
+                  <w:rFonts w:ascii="Cambria Math" w:eastAsiaTheme="minorEastAsia" w:hAnsi="Cambria Math"/>
+                </w:rPr>
+                <m:t>2×2</m:t>
+              </m:r>
+            </m:e>
+          </m:d>
+          <m:r>
+            <w:rPr>
+              <w:rFonts w:ascii="Cambria Math" w:eastAsiaTheme="minorEastAsia" w:hAnsi="Cambria Math"/>
+            </w:rPr>
+            <m:t>=</m:t>
+          </m:r>
+          <m:sSup>
+            <m:sSupPr>
+              <m:ctrlPr>
+                <w:rPr>
+                  <w:rFonts w:ascii="Cambria Math" w:eastAsiaTheme="minorEastAsia" w:hAnsi="Cambria Math"/>
+                  <w:i/>
+                </w:rPr>
+              </m:ctrlPr>
+            </m:sSupPr>
+            <m:e>
+              <m:r>
+                <w:rPr>
+                  <w:rFonts w:ascii="Cambria Math" w:eastAsiaTheme="minorEastAsia" w:hAnsi="Cambria Math"/>
+                </w:rPr>
+                <m:t>(</m:t>
+              </m:r>
+              <m:sSup>
+                <m:sSupPr>
+                  <m:ctrlPr>
+                    <w:rPr>
+                      <w:rFonts w:ascii="Cambria Math" w:eastAsiaTheme="minorEastAsia" w:hAnsi="Cambria Math"/>
+                      <w:i/>
+                    </w:rPr>
+                  </m:ctrlPr>
+                </m:sSupPr>
+                <m:e>
+                  <m:r>
+                    <w:rPr>
+                      <w:rFonts w:ascii="Cambria Math" w:eastAsiaTheme="minorEastAsia" w:hAnsi="Cambria Math"/>
+                    </w:rPr>
+                    <m:t>2</m:t>
+                  </m:r>
+                </m:e>
+                <m:sup>
+                  <m:r>
+                    <w:rPr>
+                      <w:rFonts w:ascii="Cambria Math" w:eastAsiaTheme="minorEastAsia" w:hAnsi="Cambria Math"/>
+                    </w:rPr>
+                    <m:t>4</m:t>
+                  </m:r>
+                </m:sup>
+              </m:sSup>
+              <m:r>
+                <w:rPr>
+                  <w:rFonts w:ascii="Cambria Math" w:eastAsiaTheme="minorEastAsia" w:hAnsi="Cambria Math"/>
+                </w:rPr>
+                <m:t>)</m:t>
+              </m:r>
+            </m:e>
+            <m:sup>
+              <m:r>
+                <w:rPr>
+                  <w:rFonts w:ascii="Cambria Math" w:eastAsiaTheme="minorEastAsia" w:hAnsi="Cambria Math"/>
+                </w:rPr>
+                <m:t>2</m:t>
+              </m:r>
+            </m:sup>
+          </m:sSup>
+        </m:oMath>
+      </m:oMathPara>
+    </w:p>
+    <w:p>
+      <w:r>
+        <w:t xml:space="preserve">Ezzel az eljárással </w:t>
+      </w:r>
+      <w:r>
+        <w:t>máris a felére (5 a 8 helyett) csökkentettük a szükséges lépések számát.</w:t>
+      </w:r>
+      <w:r>
+        <w:t xml:space="preserve"> Ha megismételjük még egyszer, akkor még jobb eredményt érhetünk el:</w:t>
+      </w:r>
+    </w:p>
+    <w:p>
+      <w:pPr>
+        <w:rPr>
+          <w:rFonts w:eastAsiaTheme="minorEastAsia"/>
+        </w:rPr>
+      </w:pPr>
+      <m:oMathPara>
+        <m:oMathParaPr>
+          <m:jc m:val="center"/>
+        </m:oMathParaPr>
+        <m:oMath>
+          <m:sSup>
+            <m:sSupPr>
+              <m:ctrlPr>
+                <w:rPr>
+                  <w:rFonts w:ascii="Cambria Math" w:hAnsi="Cambria Math"/>
+                  <w:i/>
+                </w:rPr>
+              </m:ctrlPr>
+            </m:sSupPr>
+            <m:e>
+              <m:r>
+                <w:rPr>
+                  <w:rFonts w:ascii="Cambria Math" w:hAnsi="Cambria Math"/>
+                </w:rPr>
+                <m:t>2</m:t>
+              </m:r>
+            </m:e>
+            <m:sup>
+              <m:r>
+                <w:rPr>
+                  <w:rFonts w:ascii="Cambria Math" w:hAnsi="Cambria Math"/>
+                </w:rPr>
+                <m:t>8</m:t>
+              </m:r>
+            </m:sup>
+          </m:sSup>
+          <m:r>
+            <w:rPr>
+              <w:rFonts w:ascii="Cambria Math" w:eastAsiaTheme="minorEastAsia" w:hAnsi="Cambria Math"/>
+            </w:rPr>
+            <m:t>=</m:t>
+          </m:r>
+          <m:r>
+            <w:rPr>
+              <w:rFonts w:ascii="Cambria Math" w:hAnsi="Cambria Math"/>
+            </w:rPr>
+            <m:t>2×2×2×2×2×2×2×2</m:t>
+          </m:r>
+          <m:r>
+            <w:rPr>
+              <w:rFonts w:ascii="Cambria Math" w:eastAsiaTheme="minorEastAsia" w:hAnsi="Cambria Math"/>
+            </w:rPr>
+            <m:t>=</m:t>
+          </m:r>
+          <m:d>
+            <m:dPr>
+              <m:ctrlPr>
+                <w:rPr>
+                  <w:rFonts w:ascii="Cambria Math" w:eastAsiaTheme="minorEastAsia" w:hAnsi="Cambria Math"/>
+                  <w:i/>
+                </w:rPr>
+              </m:ctrlPr>
+            </m:dPr>
+            <m:e>
+              <m:r>
+                <w:rPr>
+                  <w:rFonts w:ascii="Cambria Math" w:eastAsiaTheme="minorEastAsia" w:hAnsi="Cambria Math"/>
+                </w:rPr>
+                <m:t>2×2×2×2</m:t>
+              </m:r>
+            </m:e>
+          </m:d>
+          <m:r>
+            <w:rPr>
+              <w:rFonts w:ascii="Cambria Math" w:eastAsiaTheme="minorEastAsia" w:hAnsi="Cambria Math"/>
+            </w:rPr>
+            <m:t>×</m:t>
+          </m:r>
+          <m:d>
+            <m:dPr>
+              <m:ctrlPr>
+                <w:rPr>
+                  <w:rFonts w:ascii="Cambria Math" w:eastAsiaTheme="minorEastAsia" w:hAnsi="Cambria Math"/>
+                  <w:i/>
+                </w:rPr>
+              </m:ctrlPr>
+            </m:dPr>
+            <m:e>
+              <m:r>
+                <w:rPr>
+                  <w:rFonts w:ascii="Cambria Math" w:eastAsiaTheme="minorEastAsia" w:hAnsi="Cambria Math"/>
+                </w:rPr>
+                <m:t>2×2×2×2</m:t>
+              </m:r>
+            </m:e>
+          </m:d>
+          <m:r>
+            <w:rPr>
+              <w:rFonts w:ascii="Cambria Math" w:eastAsiaTheme="minorEastAsia" w:hAnsi="Cambria Math"/>
+            </w:rPr>
+            <m:t>=</m:t>
+          </m:r>
+          <m:r>
+            <w:rPr>
+              <w:rFonts w:ascii="Cambria Math" w:eastAsiaTheme="minorEastAsia" w:hAnsi="Cambria Math"/>
+            </w:rPr>
+            <m:t>=</m:t>
+          </m:r>
+          <m:d>
+            <m:dPr>
+              <m:ctrlPr>
+                <w:rPr>
+                  <w:rFonts w:ascii="Cambria Math" w:eastAsiaTheme="minorEastAsia" w:hAnsi="Cambria Math"/>
+                  <w:i/>
+                </w:rPr>
+              </m:ctrlPr>
+            </m:dPr>
+            <m:e>
+              <m:d>
+                <m:dPr>
+                  <m:ctrlPr>
+                    <w:rPr>
+                      <w:rFonts w:ascii="Cambria Math" w:eastAsiaTheme="minorEastAsia" w:hAnsi="Cambria Math"/>
+                      <w:i/>
+                    </w:rPr>
+                  </m:ctrlPr>
+                </m:dPr>
+                <m:e>
+                  <m:r>
+                    <w:rPr>
+                      <w:rFonts w:ascii="Cambria Math" w:eastAsiaTheme="minorEastAsia" w:hAnsi="Cambria Math"/>
+                    </w:rPr>
+                    <m:t>2×2</m:t>
+                  </m:r>
+                </m:e>
+              </m:d>
+              <m:r>
+                <w:rPr>
+                  <w:rFonts w:ascii="Cambria Math" w:eastAsiaTheme="minorEastAsia" w:hAnsi="Cambria Math"/>
+                </w:rPr>
+                <m:t>×</m:t>
+              </m:r>
+              <m:d>
+                <m:dPr>
+                  <m:ctrlPr>
+                    <w:rPr>
+                      <w:rFonts w:ascii="Cambria Math" w:eastAsiaTheme="minorEastAsia" w:hAnsi="Cambria Math"/>
+                      <w:i/>
+                    </w:rPr>
+                  </m:ctrlPr>
+                </m:dPr>
+                <m:e>
+                  <m:r>
+                    <w:rPr>
+                      <w:rFonts w:ascii="Cambria Math" w:eastAsiaTheme="minorEastAsia" w:hAnsi="Cambria Math"/>
+                    </w:rPr>
+                    <m:t>2×2</m:t>
+                  </m:r>
+                </m:e>
+              </m:d>
+            </m:e>
+          </m:d>
+          <m:r>
+            <w:rPr>
+              <w:rFonts w:ascii="Cambria Math" w:eastAsiaTheme="minorEastAsia" w:hAnsi="Cambria Math"/>
+            </w:rPr>
+            <m:t>×</m:t>
+          </m:r>
+          <m:d>
+            <m:dPr>
+              <m:ctrlPr>
+                <w:rPr>
+                  <w:rFonts w:ascii="Cambria Math" w:eastAsiaTheme="minorEastAsia" w:hAnsi="Cambria Math"/>
+                  <w:i/>
+                </w:rPr>
+              </m:ctrlPr>
+            </m:dPr>
+            <m:e>
+              <m:d>
+                <m:dPr>
+                  <m:ctrlPr>
+                    <w:rPr>
+                      <w:rFonts w:ascii="Cambria Math" w:eastAsiaTheme="minorEastAsia" w:hAnsi="Cambria Math"/>
+                      <w:i/>
+                    </w:rPr>
+                  </m:ctrlPr>
+                </m:dPr>
+                <m:e>
+                  <m:r>
+                    <w:rPr>
+                      <w:rFonts w:ascii="Cambria Math" w:eastAsiaTheme="minorEastAsia" w:hAnsi="Cambria Math"/>
+                    </w:rPr>
+                    <m:t>2×2</m:t>
+                  </m:r>
+                </m:e>
+              </m:d>
+              <m:r>
+                <w:rPr>
+                  <w:rFonts w:ascii="Cambria Math" w:eastAsiaTheme="minorEastAsia" w:hAnsi="Cambria Math"/>
+                </w:rPr>
+                <m:t>×</m:t>
+              </m:r>
+              <m:d>
+                <m:dPr>
+                  <m:ctrlPr>
+                    <w:rPr>
+                      <w:rFonts w:ascii="Cambria Math" w:eastAsiaTheme="minorEastAsia" w:hAnsi="Cambria Math"/>
+                      <w:i/>
+                    </w:rPr>
+                  </m:ctrlPr>
+                </m:dPr>
+                <m:e>
+                  <m:r>
+                    <w:rPr>
+                      <w:rFonts w:ascii="Cambria Math" w:eastAsiaTheme="minorEastAsia" w:hAnsi="Cambria Math"/>
+                    </w:rPr>
+                    <m:t>2×2</m:t>
+                  </m:r>
+                </m:e>
+              </m:d>
+            </m:e>
+          </m:d>
+          <m:r>
+            <w:rPr>
+              <w:rFonts w:ascii="Cambria Math" w:eastAsiaTheme="minorEastAsia" w:hAnsi="Cambria Math"/>
+            </w:rPr>
+            <m:t>=</m:t>
+          </m:r>
+          <m:sSup>
+            <m:sSupPr>
+              <m:ctrlPr>
+                <w:rPr>
+                  <w:rFonts w:ascii="Cambria Math" w:eastAsiaTheme="minorEastAsia" w:hAnsi="Cambria Math"/>
+                  <w:i/>
+                </w:rPr>
+              </m:ctrlPr>
+            </m:sSupPr>
+            <m:e>
+              <m:d>
+                <m:dPr>
+                  <m:ctrlPr>
+                    <w:rPr>
+                      <w:rFonts w:ascii="Cambria Math" w:eastAsiaTheme="minorEastAsia" w:hAnsi="Cambria Math"/>
+                      <w:i/>
+                    </w:rPr>
+                  </m:ctrlPr>
+                </m:dPr>
+                <m:e>
+                  <m:sSup>
+                    <m:sSupPr>
+                      <m:ctrlPr>
+                        <w:rPr>
+                          <w:rFonts w:ascii="Cambria Math" w:eastAsiaTheme="minorEastAsia" w:hAnsi="Cambria Math"/>
+                          <w:i/>
+                        </w:rPr>
+                      </m:ctrlPr>
+                    </m:sSupPr>
+                    <m:e>
+                      <m:d>
+                        <m:dPr>
+                          <m:ctrlPr>
+                            <w:rPr>
+                              <w:rFonts w:ascii="Cambria Math" w:eastAsiaTheme="minorEastAsia" w:hAnsi="Cambria Math"/>
+                              <w:i/>
+                            </w:rPr>
+                          </m:ctrlPr>
+                        </m:dPr>
+                        <m:e>
+                          <m:sSup>
+                            <m:sSupPr>
+                              <m:ctrlPr>
+                                <w:rPr>
+                                  <w:rFonts w:ascii="Cambria Math" w:eastAsiaTheme="minorEastAsia" w:hAnsi="Cambria Math"/>
+                                  <w:i/>
+                                </w:rPr>
+                              </m:ctrlPr>
+                            </m:sSupPr>
+                            <m:e>
+                              <m:r>
+                                <w:rPr>
+                                  <w:rFonts w:ascii="Cambria Math" w:eastAsiaTheme="minorEastAsia" w:hAnsi="Cambria Math"/>
+                                </w:rPr>
+                                <m:t>2</m:t>
+                              </m:r>
+                            </m:e>
+                            <m:sup>
+                              <m:r>
+                                <w:rPr>
+                                  <w:rFonts w:ascii="Cambria Math" w:eastAsiaTheme="minorEastAsia" w:hAnsi="Cambria Math"/>
+                                </w:rPr>
+                                <m:t>2</m:t>
+                              </m:r>
+                            </m:sup>
+                          </m:sSup>
+                        </m:e>
+                      </m:d>
+                    </m:e>
+                    <m:sup>
+                      <m:r>
+                        <w:rPr>
+                          <w:rFonts w:ascii="Cambria Math" w:eastAsiaTheme="minorEastAsia" w:hAnsi="Cambria Math"/>
+                        </w:rPr>
+                        <m:t>2</m:t>
+                      </m:r>
+                    </m:sup>
+                  </m:sSup>
+                </m:e>
+              </m:d>
+            </m:e>
+            <m:sup>
+              <m:r>
+                <w:rPr>
+                  <w:rFonts w:ascii="Cambria Math" w:eastAsiaTheme="minorEastAsia" w:hAnsi="Cambria Math"/>
+                </w:rPr>
+                <m:t>2</m:t>
+              </m:r>
+            </m:sup>
+          </m:sSup>
+        </m:oMath>
+      </m:oMathPara>
+    </w:p>
+    <w:p>
+      <w:r>
+        <w:t xml:space="preserve">Ezzel pedig minimalizáltuk a lépések számát 3-ra. Persze itt „szerencsénk” volt, mert a 8 pont hatványszáma a 2-nek. Más szituációban már nehezebb dolgunk lenne a </w:t>
+      </w:r>
+      <w:r>
+        <w:t>felbontással is, az ideális felbontás megtalálásáról nem is beszélve.</w:t>
+      </w:r>
+    </w:p>
+    <w:p>
+      <w:r>
+        <w:t>Viszont</w:t>
+      </w:r>
+      <w:r>
+        <w:t xml:space="preserve"> a hatványkitevő binárisra bontása </w:t>
+      </w:r>
+      <w:r>
+        <w:t xml:space="preserve">már </w:t>
+      </w:r>
+      <w:r>
+        <w:t>egy elég hatékony felbontást ad ahhoz, hogy az alap hatványozásánál a legtöbb esetre ideális is legyen a felbontás. Nézzünk is egy példát rá, hogy miről van szó</w:t>
+      </w:r>
+      <w:r>
+        <w:t>, a</w:t>
+      </w:r>
+      <w:r>
+        <w:t>z</w:t>
+      </w:r>
+      <w:r>
+        <w:t xml:space="preserve"> </w:t>
+      </w:r>
+      <m:oMath>
+        <m:sSup>
+          <m:sSupPr>
+            <m:ctrlPr>
+              <w:rPr>
+                <w:rFonts w:ascii="Cambria Math" w:hAnsi="Cambria Math"/>
+                <w:i/>
+              </w:rPr>
+            </m:ctrlPr>
+          </m:sSupPr>
+          <m:e>
+            <m:r>
+              <w:rPr>
+                <w:rFonts w:ascii="Cambria Math" w:hAnsi="Cambria Math"/>
+              </w:rPr>
+              <m:t>x</m:t>
+            </m:r>
+          </m:e>
+          <m:sup>
+            <m:r>
+              <w:rPr>
+                <w:rFonts w:ascii="Cambria Math" w:hAnsi="Cambria Math"/>
+              </w:rPr>
+              <m:t>100</m:t>
+            </m:r>
+          </m:sup>
+        </m:sSup>
+      </m:oMath>
+      <w:r>
+        <w:t xml:space="preserve"> személyében:</w:t>
+      </w:r>
+    </w:p>
+    <w:p>
+      <w:pPr>
+        <w:ind w:firstLine="0"/>
+        <w:rPr>
+          <w:rFonts w:eastAsiaTheme="minorEastAsia"/>
+        </w:rPr>
+      </w:pPr>
+      <m:oMathPara>
+        <m:oMathParaPr>
+          <m:jc m:val="center"/>
+        </m:oMathParaPr>
+        <m:oMath>
+          <m:r>
+            <w:rPr>
+              <w:rFonts w:ascii="Cambria Math" w:eastAsiaTheme="minorEastAsia" w:hAnsi="Cambria Math"/>
+            </w:rPr>
+            <m:t>100</m:t>
+          </m:r>
+          <m:r>
+            <w:rPr>
+              <w:rFonts w:ascii="Cambria Math" w:eastAsiaTheme="minorEastAsia" w:hAnsi="Cambria Math"/>
+            </w:rPr>
+            <m:t>→</m:t>
+          </m:r>
+          <m:r>
+            <w:rPr>
+              <w:rFonts w:ascii="Cambria Math" w:eastAsiaTheme="minorEastAsia" w:hAnsi="Cambria Math"/>
+            </w:rPr>
+            <m:t>1100100</m:t>
+          </m:r>
+        </m:oMath>
+      </m:oMathPara>
+    </w:p>
+    <w:p>
+      <w:r>
+        <w:lastRenderedPageBreak/>
+        <w:t>Ezek szerint</w:t>
+      </w:r>
+    </w:p>
+    <w:p>
+      <w:pPr>
+        <w:rPr>
+          <w:rFonts w:eastAsiaTheme="minorEastAsia"/>
+        </w:rPr>
+      </w:pPr>
+      <m:oMathPara>
+        <m:oMathParaPr>
+          <m:jc m:val="center"/>
+        </m:oMathParaPr>
+        <m:oMath>
+          <m:r>
+            <w:rPr>
+              <w:rFonts w:ascii="Cambria Math" w:hAnsi="Cambria Math"/>
+            </w:rPr>
+            <m:t>100=</m:t>
+          </m:r>
+          <m:sSup>
+            <m:sSupPr>
+              <m:ctrlPr>
+                <w:rPr>
+                  <w:rFonts w:ascii="Cambria Math" w:hAnsi="Cambria Math"/>
+                  <w:i/>
+                </w:rPr>
+              </m:ctrlPr>
+            </m:sSupPr>
+            <m:e>
+              <m:r>
+                <w:rPr>
+                  <w:rFonts w:ascii="Cambria Math" w:hAnsi="Cambria Math"/>
+                </w:rPr>
+                <m:t>2</m:t>
+              </m:r>
+            </m:e>
+            <m:sup>
+              <m:r>
+                <w:rPr>
+                  <w:rFonts w:ascii="Cambria Math" w:hAnsi="Cambria Math"/>
+                </w:rPr>
+                <m:t>2</m:t>
+              </m:r>
+            </m:sup>
+          </m:sSup>
+          <m:r>
+            <w:rPr>
+              <w:rFonts w:ascii="Cambria Math" w:hAnsi="Cambria Math"/>
+            </w:rPr>
+            <m:t>+</m:t>
+          </m:r>
+          <m:sSup>
+            <m:sSupPr>
+              <m:ctrlPr>
+                <w:rPr>
+                  <w:rFonts w:ascii="Cambria Math" w:eastAsiaTheme="minorEastAsia" w:hAnsi="Cambria Math"/>
+                  <w:i/>
+                </w:rPr>
+              </m:ctrlPr>
+            </m:sSupPr>
+            <m:e>
+              <m:r>
+                <w:rPr>
+                  <w:rFonts w:ascii="Cambria Math" w:eastAsiaTheme="minorEastAsia" w:hAnsi="Cambria Math"/>
+                </w:rPr>
+                <m:t>2</m:t>
+              </m:r>
+            </m:e>
+            <m:sup>
+              <m:r>
+                <w:rPr>
+                  <w:rFonts w:ascii="Cambria Math" w:eastAsiaTheme="minorEastAsia" w:hAnsi="Cambria Math"/>
+                </w:rPr>
+                <m:t>5</m:t>
+              </m:r>
+            </m:sup>
+          </m:sSup>
+          <m:r>
+            <w:rPr>
+              <w:rFonts w:ascii="Cambria Math" w:eastAsiaTheme="minorEastAsia" w:hAnsi="Cambria Math"/>
+            </w:rPr>
+            <m:t>+</m:t>
+          </m:r>
+          <m:sSup>
+            <m:sSupPr>
+              <m:ctrlPr>
+                <w:rPr>
+                  <w:rFonts w:ascii="Cambria Math" w:eastAsiaTheme="minorEastAsia" w:hAnsi="Cambria Math"/>
+                  <w:i/>
+                </w:rPr>
+              </m:ctrlPr>
+            </m:sSupPr>
+            <m:e>
+              <m:r>
+                <w:rPr>
+                  <w:rFonts w:ascii="Cambria Math" w:eastAsiaTheme="minorEastAsia" w:hAnsi="Cambria Math"/>
+                </w:rPr>
+                <m:t>2</m:t>
+              </m:r>
+            </m:e>
+            <m:sup>
+              <m:r>
+                <w:rPr>
+                  <w:rFonts w:ascii="Cambria Math" w:eastAsiaTheme="minorEastAsia" w:hAnsi="Cambria Math"/>
+                </w:rPr>
+                <m:t>6</m:t>
+              </m:r>
+            </m:sup>
+          </m:sSup>
+        </m:oMath>
+      </m:oMathPara>
+    </w:p>
+    <w:p>
+      <w:r>
+        <w:t>Ez</w:t>
+      </w:r>
+      <w:r>
+        <w:t xml:space="preserve"> a felbontás</w:t>
+      </w:r>
+      <w:r>
+        <w:t xml:space="preserve"> pedig azt jelenti, hogy a következő eljárással megkapható az eredmény:</w:t>
+      </w:r>
+    </w:p>
+    <w:p>
+      <w:pPr>
+        <w:pStyle w:val="Listaszerbekezds"/>
+        <w:numPr>
+          <w:ilvl w:val="0"/>
+          <w:numId w:val="6"/>
+        </w:numPr>
+      </w:pPr>
+      <w:r>
+        <w:t xml:space="preserve">Emeljük hatványra a jelenlegi </w:t>
+      </w:r>
+      <w:r>
+        <w:t>alapunkat</w:t>
+      </w:r>
+      <w:r>
+        <w:t xml:space="preserve"> (kezdetben a hatványalap)</w:t>
+      </w:r>
+    </w:p>
+    <w:p>
+      <w:pPr>
+        <w:pStyle w:val="Listaszerbekezds"/>
+        <w:numPr>
+          <w:ilvl w:val="0"/>
+          <w:numId w:val="6"/>
+        </w:numPr>
+      </w:pPr>
+      <w:r>
+        <w:t xml:space="preserve">Ha </w:t>
+      </w:r>
+      <w:r>
+        <w:t>a</w:t>
+      </w:r>
+      <w:r>
+        <w:t xml:space="preserve"> felbontásban szerepel olyan számú kitevő, mint ahányszor elvégeztük a négyzetre emelést adjuk hozzá az eredményhez az új értékünket</w:t>
+      </w:r>
+    </w:p>
+    <w:p>
+      <w:pPr>
+        <w:pStyle w:val="Listaszerbekezds"/>
+        <w:numPr>
+          <w:ilvl w:val="0"/>
+          <w:numId w:val="6"/>
+        </w:numPr>
+      </w:pPr>
+      <w:r>
+        <w:t>Az</w:t>
+      </w:r>
+      <w:r>
+        <w:t xml:space="preserve"> előbbi négyzetre emelés értéke lesz az új alap</w:t>
+      </w:r>
+    </w:p>
+    <w:p>
+      <w:r>
+        <w:t>Vagyis az algoritmus a következőt fogja kiszámolni:</w:t>
+      </w:r>
+    </w:p>
+    <w:p>
+      <w:pPr>
+        <w:rPr>
+          <w:rFonts w:ascii="Cambria Math" w:hAnsi="Cambria Math"/>
+          <w:oMath/>
+        </w:rPr>
+      </w:pPr>
+      <m:oMathPara>
+        <m:oMath>
+          <m:r>
+            <w:rPr>
+              <w:rFonts w:ascii="Cambria Math" w:hAnsi="Cambria Math"/>
+            </w:rPr>
+            <m:t>y=(x^2)^2</m:t>
+          </m:r>
+        </m:oMath>
+      </m:oMathPara>
+    </w:p>
+    <w:p>
+      <w:pPr>
+        <w:rPr>
+          <w:rFonts w:ascii="Cambria Math" w:hAnsi="Cambria Math"/>
+          <w:oMath/>
+        </w:rPr>
+      </w:pPr>
+      <m:oMathPara>
+        <m:oMath>
+          <m:r>
+            <w:rPr>
+              <w:rFonts w:ascii="Cambria Math" w:hAnsi="Cambria Math"/>
+            </w:rPr>
+            <m:t>z=((y^2)^2)^2</m:t>
+          </m:r>
+        </m:oMath>
+      </m:oMathPara>
+    </w:p>
+    <w:p>
+      <w:pPr>
+        <w:rPr>
+          <w:rFonts w:eastAsiaTheme="minorEastAsia"/>
+        </w:rPr>
+      </w:pPr>
+      <m:oMathPara>
+        <m:oMath>
+          <m:r>
+            <w:rPr>
+              <w:rFonts w:ascii="Cambria Math" w:hAnsi="Cambria Math"/>
+            </w:rPr>
+            <m:t>w=z^2</m:t>
+          </m:r>
+        </m:oMath>
+      </m:oMathPara>
+    </w:p>
+    <w:p>
+      <w:pPr>
+        <w:rPr>
+          <w:rFonts w:eastAsiaTheme="minorEastAsia"/>
+        </w:rPr>
+      </w:pPr>
+      <m:oMathPara>
+        <m:oMath>
+          <m:sSup>
+            <m:sSupPr>
+              <m:ctrlPr>
+                <w:rPr>
+                  <w:rFonts w:ascii="Cambria Math" w:eastAsiaTheme="minorEastAsia" w:hAnsi="Cambria Math"/>
+                  <w:i/>
+                </w:rPr>
+              </m:ctrlPr>
+            </m:sSupPr>
+            <m:e>
+              <m:r>
+                <w:rPr>
+                  <w:rFonts w:ascii="Cambria Math" w:eastAsiaTheme="minorEastAsia" w:hAnsi="Cambria Math"/>
+                </w:rPr>
+                <m:t>x</m:t>
+              </m:r>
+            </m:e>
+            <m:sup>
+              <m:r>
+                <w:rPr>
+                  <w:rFonts w:ascii="Cambria Math" w:eastAsiaTheme="minorEastAsia" w:hAnsi="Cambria Math"/>
+                </w:rPr>
+                <m:t>100</m:t>
+              </m:r>
+            </m:sup>
+          </m:sSup>
+          <m:r>
+            <w:rPr>
+              <w:rFonts w:ascii="Cambria Math" w:eastAsiaTheme="minorEastAsia" w:hAnsi="Cambria Math"/>
+            </w:rPr>
+            <m:t>=y+z+w</m:t>
+          </m:r>
+        </m:oMath>
+      </m:oMathPara>
+    </w:p>
+    <w:p>
       <w:pPr>
         <w:pStyle w:val="Cmsor3"/>
       </w:pPr>
-      <w:bookmarkStart w:id="14" w:name="_Toc218619926"/>
       <w:r>
         <w:t>Egész szám típus (Integer)</w:t>
       </w:r>
@@ -4885,6 +5784,7 @@
         </w:numPr>
       </w:pPr>
       <w:r>
+        <w:lastRenderedPageBreak/>
         <w:t>gyökvonás (</w:t>
       </w:r>
       <m:oMath>
@@ -4948,7 +5848,6 @@
     </w:p>
     <w:p>
       <w:r>
-        <w:lastRenderedPageBreak/>
         <w:t>A típusra implementálva vannak az alábbi műveletek:</w:t>
       </w:r>
     </w:p>
@@ -5594,6 +6493,7 @@
         </w:numPr>
       </w:pPr>
       <w:r>
+        <w:lastRenderedPageBreak/>
         <w:t>osztás (</w:t>
       </w:r>
       <w:r>
@@ -5719,7 +6619,6 @@
       </w:pPr>
       <w:bookmarkStart w:id="17" w:name="_Toc218619929"/>
       <w:r>
-        <w:lastRenderedPageBreak/>
         <w:t>Racionális szám típus (Rational)</w:t>
       </w:r>
       <w:bookmarkEnd w:id="17"/>
@@ -6148,7 +7047,15 @@
       </w:pPr>
       <w:bookmarkStart w:id="21" w:name="_Toc218619933"/>
       <w:r>
-        <w:t>Euklideszi tér számológép (EuclideanSpace)</w:t>
+        <w:t>Euklideszi tér számológép (</w:t>
+      </w:r>
+      <w:proofErr w:type="spellStart"/>
+      <w:r>
+        <w:t>EuclideanSpace</w:t>
+      </w:r>
+      <w:proofErr w:type="spellEnd"/>
+      <w:r>
+        <w:t>)</w:t>
       </w:r>
       <w:bookmarkEnd w:id="21"/>
     </w:p>
@@ -6158,7 +7065,15 @@
       </w:pPr>
       <w:bookmarkStart w:id="22" w:name="_Toc218619934"/>
       <w:r>
-        <w:t>Polinom számológép (Polynomials)</w:t>
+        <w:t>Polinom számológép (</w:t>
+      </w:r>
+      <w:proofErr w:type="spellStart"/>
+      <w:r>
+        <w:t>Polynomials</w:t>
+      </w:r>
+      <w:proofErr w:type="spellEnd"/>
+      <w:r>
+        <w:t>)</w:t>
       </w:r>
       <w:bookmarkEnd w:id="22"/>
     </w:p>
@@ -6168,7 +7083,15 @@
       </w:pPr>
       <w:bookmarkStart w:id="23" w:name="_Toc218619935"/>
       <w:r>
-        <w:t>Integrálközelítés számológép (Integral)</w:t>
+        <w:t>Integrálközelítés számológép (</w:t>
+      </w:r>
+      <w:proofErr w:type="spellStart"/>
+      <w:r>
+        <w:t>Integral</w:t>
+      </w:r>
+      <w:proofErr w:type="spellEnd"/>
+      <w:r>
+        <w:t>)</w:t>
       </w:r>
       <w:bookmarkEnd w:id="23"/>
     </w:p>
@@ -6704,9 +7627,9 @@
     </w:lvl>
   </w:abstractNum>
   <w:abstractNum w:abstractNumId="3" w15:restartNumberingAfterBreak="0">
-    <w:nsid w:val="5D525599"/>
+    <w:nsid w:val="44BF1291"/>
     <w:multiLevelType w:val="hybridMultilevel"/>
-    <w:tmpl w:val="1B60AFBA"/>
+    <w:tmpl w:val="F97E0F68"/>
     <w:lvl w:ilvl="0" w:tplc="040E0001">
       <w:start w:val="1"/>
       <w:numFmt w:val="bullet"/>
@@ -6817,9 +7740,9 @@
     </w:lvl>
   </w:abstractNum>
   <w:abstractNum w:abstractNumId="4" w15:restartNumberingAfterBreak="0">
-    <w:nsid w:val="6CB36125"/>
+    <w:nsid w:val="5D525599"/>
     <w:multiLevelType w:val="hybridMultilevel"/>
-    <w:tmpl w:val="47ACECFC"/>
+    <w:tmpl w:val="1B60AFBA"/>
     <w:lvl w:ilvl="0" w:tplc="040E0001">
       <w:start w:val="1"/>
       <w:numFmt w:val="bullet"/>
@@ -6929,11 +7852,124 @@
       </w:rPr>
     </w:lvl>
   </w:abstractNum>
+  <w:abstractNum w:abstractNumId="5" w15:restartNumberingAfterBreak="0">
+    <w:nsid w:val="6CB36125"/>
+    <w:multiLevelType w:val="hybridMultilevel"/>
+    <w:tmpl w:val="47ACECFC"/>
+    <w:lvl w:ilvl="0" w:tplc="040E0001">
+      <w:start w:val="1"/>
+      <w:numFmt w:val="bullet"/>
+      <w:lvlText w:val=""/>
+      <w:lvlJc w:val="left"/>
+      <w:pPr>
+        <w:ind w:left="947" w:hanging="360"/>
+      </w:pPr>
+      <w:rPr>
+        <w:rFonts w:ascii="Symbol" w:hAnsi="Symbol" w:hint="default"/>
+      </w:rPr>
+    </w:lvl>
+    <w:lvl w:ilvl="1" w:tplc="040E0003" w:tentative="1">
+      <w:start w:val="1"/>
+      <w:numFmt w:val="bullet"/>
+      <w:lvlText w:val="o"/>
+      <w:lvlJc w:val="left"/>
+      <w:pPr>
+        <w:ind w:left="1667" w:hanging="360"/>
+      </w:pPr>
+      <w:rPr>
+        <w:rFonts w:ascii="Courier New" w:hAnsi="Courier New" w:cs="Courier New" w:hint="default"/>
+      </w:rPr>
+    </w:lvl>
+    <w:lvl w:ilvl="2" w:tplc="040E0005" w:tentative="1">
+      <w:start w:val="1"/>
+      <w:numFmt w:val="bullet"/>
+      <w:lvlText w:val=""/>
+      <w:lvlJc w:val="left"/>
+      <w:pPr>
+        <w:ind w:left="2387" w:hanging="360"/>
+      </w:pPr>
+      <w:rPr>
+        <w:rFonts w:ascii="Wingdings" w:hAnsi="Wingdings" w:hint="default"/>
+      </w:rPr>
+    </w:lvl>
+    <w:lvl w:ilvl="3" w:tplc="040E0001" w:tentative="1">
+      <w:start w:val="1"/>
+      <w:numFmt w:val="bullet"/>
+      <w:lvlText w:val=""/>
+      <w:lvlJc w:val="left"/>
+      <w:pPr>
+        <w:ind w:left="3107" w:hanging="360"/>
+      </w:pPr>
+      <w:rPr>
+        <w:rFonts w:ascii="Symbol" w:hAnsi="Symbol" w:hint="default"/>
+      </w:rPr>
+    </w:lvl>
+    <w:lvl w:ilvl="4" w:tplc="040E0003" w:tentative="1">
+      <w:start w:val="1"/>
+      <w:numFmt w:val="bullet"/>
+      <w:lvlText w:val="o"/>
+      <w:lvlJc w:val="left"/>
+      <w:pPr>
+        <w:ind w:left="3827" w:hanging="360"/>
+      </w:pPr>
+      <w:rPr>
+        <w:rFonts w:ascii="Courier New" w:hAnsi="Courier New" w:cs="Courier New" w:hint="default"/>
+      </w:rPr>
+    </w:lvl>
+    <w:lvl w:ilvl="5" w:tplc="040E0005" w:tentative="1">
+      <w:start w:val="1"/>
+      <w:numFmt w:val="bullet"/>
+      <w:lvlText w:val=""/>
+      <w:lvlJc w:val="left"/>
+      <w:pPr>
+        <w:ind w:left="4547" w:hanging="360"/>
+      </w:pPr>
+      <w:rPr>
+        <w:rFonts w:ascii="Wingdings" w:hAnsi="Wingdings" w:hint="default"/>
+      </w:rPr>
+    </w:lvl>
+    <w:lvl w:ilvl="6" w:tplc="040E0001" w:tentative="1">
+      <w:start w:val="1"/>
+      <w:numFmt w:val="bullet"/>
+      <w:lvlText w:val=""/>
+      <w:lvlJc w:val="left"/>
+      <w:pPr>
+        <w:ind w:left="5267" w:hanging="360"/>
+      </w:pPr>
+      <w:rPr>
+        <w:rFonts w:ascii="Symbol" w:hAnsi="Symbol" w:hint="default"/>
+      </w:rPr>
+    </w:lvl>
+    <w:lvl w:ilvl="7" w:tplc="040E0003" w:tentative="1">
+      <w:start w:val="1"/>
+      <w:numFmt w:val="bullet"/>
+      <w:lvlText w:val="o"/>
+      <w:lvlJc w:val="left"/>
+      <w:pPr>
+        <w:ind w:left="5987" w:hanging="360"/>
+      </w:pPr>
+      <w:rPr>
+        <w:rFonts w:ascii="Courier New" w:hAnsi="Courier New" w:cs="Courier New" w:hint="default"/>
+      </w:rPr>
+    </w:lvl>
+    <w:lvl w:ilvl="8" w:tplc="040E0005" w:tentative="1">
+      <w:start w:val="1"/>
+      <w:numFmt w:val="bullet"/>
+      <w:lvlText w:val=""/>
+      <w:lvlJc w:val="left"/>
+      <w:pPr>
+        <w:ind w:left="6707" w:hanging="360"/>
+      </w:pPr>
+      <w:rPr>
+        <w:rFonts w:ascii="Wingdings" w:hAnsi="Wingdings" w:hint="default"/>
+      </w:rPr>
+    </w:lvl>
+  </w:abstractNum>
   <w:num w:numId="1" w16cid:durableId="789907295">
-    <w:abstractNumId w:val="4"/>
+    <w:abstractNumId w:val="5"/>
   </w:num>
   <w:num w:numId="2" w16cid:durableId="1912694649">
-    <w:abstractNumId w:val="3"/>
+    <w:abstractNumId w:val="4"/>
   </w:num>
   <w:num w:numId="3" w16cid:durableId="2093620482">
     <w:abstractNumId w:val="0"/>
@@ -6943,6 +7979,9 @@
   </w:num>
   <w:num w:numId="5" w16cid:durableId="779377634">
     <w:abstractNumId w:val="2"/>
+  </w:num>
+  <w:num w:numId="6" w16cid:durableId="1060136177">
+    <w:abstractNumId w:val="3"/>
   </w:num>
 </w:numbering>
 </file>
@@ -8018,6 +9057,21 @@
       <w:color w:val="666666"/>
     </w:rPr>
   </w:style>
+  <w:style w:type="paragraph" w:styleId="Nincstrkz">
+    <w:name w:val="No Spacing"/>
+    <w:uiPriority w:val="1"/>
+    <w:qFormat/>
+    <w:rsid w:val="00BA54E1"/>
+    <w:pPr>
+      <w:spacing w:after="0" w:line="240" w:lineRule="auto"/>
+      <w:ind w:firstLine="227"/>
+      <w:jc w:val="both"/>
+    </w:pPr>
+    <w:rPr>
+      <w:rFonts w:ascii="Times New Roman" w:hAnsi="Times New Roman"/>
+      <w:sz w:val="24"/>
+    </w:rPr>
+  </w:style>
 </w:styles>
 </file>
 

</xml_diff>

<commit_message>
Adding explanation to the root method of the Natural type in the documentation.
</commit_message>
<xml_diff>
--- a/Documentation.docx
+++ b/Documentation.docx
@@ -2952,11 +2952,37 @@
       </w:pPr>
       <m:oMathPara>
         <m:oMath>
+          <m:sSub>
+            <m:sSubPr>
+              <m:ctrlPr>
+                <w:rPr>
+                  <w:rFonts w:ascii="Cambria Math" w:hAnsi="Cambria Math"/>
+                  <w:i/>
+                </w:rPr>
+              </m:ctrlPr>
+            </m:sSubPr>
+            <m:e>
+              <m:r>
+                <w:rPr>
+                  <w:rFonts w:ascii="Cambria Math" w:hAnsi="Cambria Math"/>
+                </w:rPr>
+                <m:t>1011.11</m:t>
+              </m:r>
+            </m:e>
+            <m:sub>
+              <m:r>
+                <w:rPr>
+                  <w:rFonts w:ascii="Cambria Math" w:hAnsi="Cambria Math"/>
+                </w:rPr>
+                <m:t>2</m:t>
+              </m:r>
+            </m:sub>
+          </m:sSub>
           <m:r>
             <w:rPr>
               <w:rFonts w:ascii="Cambria Math" w:hAnsi="Cambria Math"/>
             </w:rPr>
-            <m:t>1011.11=1×</m:t>
+            <m:t>=1×</m:t>
           </m:r>
           <m:sSup>
             <m:sSupPr>
@@ -3180,13 +3206,114 @@
         </w:rPr>
       </w:pPr>
       <m:oMathPara>
+        <m:oMathParaPr>
+          <m:jc m:val="center"/>
+        </m:oMathParaPr>
+        <m:oMath>
+          <m:sSub>
+            <m:sSubPr>
+              <m:ctrlPr>
+                <w:rPr>
+                  <w:rFonts w:ascii="Cambria Math" w:eastAsiaTheme="minorEastAsia" w:hAnsi="Cambria Math"/>
+                  <w:i/>
+                </w:rPr>
+              </m:ctrlPr>
+            </m:sSubPr>
+            <m:e>
+              <m:r>
+                <w:rPr>
+                  <w:rFonts w:ascii="Cambria Math" w:eastAsiaTheme="minorEastAsia" w:hAnsi="Cambria Math"/>
+                </w:rPr>
+                <m:t>0.3</m:t>
+              </m:r>
+            </m:e>
+            <m:sub>
+              <m:r>
+                <w:rPr>
+                  <w:rFonts w:ascii="Cambria Math" w:eastAsiaTheme="minorEastAsia" w:hAnsi="Cambria Math"/>
+                </w:rPr>
+                <m:t>10</m:t>
+              </m:r>
+            </m:sub>
+          </m:sSub>
+          <m:r>
+            <w:rPr>
+              <w:rFonts w:ascii="Cambria Math" w:eastAsiaTheme="minorEastAsia" w:hAnsi="Cambria Math"/>
+            </w:rPr>
+            <m:t>→</m:t>
+          </m:r>
+          <m:sSub>
+            <m:sSubPr>
+              <m:ctrlPr>
+                <w:rPr>
+                  <w:rFonts w:ascii="Cambria Math" w:eastAsiaTheme="minorEastAsia" w:hAnsi="Cambria Math"/>
+                  <w:i/>
+                </w:rPr>
+              </m:ctrlPr>
+            </m:sSubPr>
+            <m:e>
+              <m:r>
+                <w:rPr>
+                  <w:rFonts w:ascii="Cambria Math" w:eastAsiaTheme="minorEastAsia" w:hAnsi="Cambria Math"/>
+                </w:rPr>
+                <m:t>0.010011001100110011001100110011001100110011001100110011</m:t>
+              </m:r>
+            </m:e>
+            <m:sub>
+              <m:r>
+                <w:rPr>
+                  <w:rFonts w:ascii="Cambria Math" w:eastAsiaTheme="minorEastAsia" w:hAnsi="Cambria Math"/>
+                </w:rPr>
+                <m:t>2</m:t>
+              </m:r>
+            </m:sub>
+          </m:sSub>
+          <m:r>
+            <w:rPr>
+              <w:rFonts w:ascii="Cambria Math" w:eastAsiaTheme="minorEastAsia" w:hAnsi="Cambria Math"/>
+            </w:rPr>
+            <m:t>→</m:t>
+          </m:r>
+          <m:r>
+            <w:rPr>
+              <w:rFonts w:ascii="Cambria Math" w:eastAsiaTheme="minorEastAsia" w:hAnsi="Cambria Math"/>
+            </w:rPr>
+            <w:br/>
+          </m:r>
+        </m:oMath>
         <m:oMath>
           <m:r>
             <w:rPr>
               <w:rFonts w:ascii="Cambria Math" w:eastAsiaTheme="minorEastAsia" w:hAnsi="Cambria Math"/>
             </w:rPr>
-            <m:t>0.3→0.010011001100110011001100110011001100110011001100110011→→0.299999999999999988897769753748434595763683319091796875</m:t>
+            <m:t>→</m:t>
           </m:r>
+          <m:sSub>
+            <m:sSubPr>
+              <m:ctrlPr>
+                <w:rPr>
+                  <w:rFonts w:ascii="Cambria Math" w:eastAsiaTheme="minorEastAsia" w:hAnsi="Cambria Math"/>
+                  <w:i/>
+                </w:rPr>
+              </m:ctrlPr>
+            </m:sSubPr>
+            <m:e>
+              <m:r>
+                <w:rPr>
+                  <w:rFonts w:ascii="Cambria Math" w:eastAsiaTheme="minorEastAsia" w:hAnsi="Cambria Math"/>
+                </w:rPr>
+                <m:t>0.299999999999999988897769753748434595763683319091796875</m:t>
+              </m:r>
+            </m:e>
+            <m:sub>
+              <m:r>
+                <w:rPr>
+                  <w:rFonts w:ascii="Cambria Math" w:eastAsiaTheme="minorEastAsia" w:hAnsi="Cambria Math"/>
+                </w:rPr>
+                <m:t>10</m:t>
+              </m:r>
+            </m:sub>
+          </m:sSub>
         </m:oMath>
       </m:oMathPara>
     </w:p>
@@ -4709,13 +4836,7 @@
                 <w:rPr>
                   <w:rFonts w:ascii="Cambria Math" w:eastAsiaTheme="minorEastAsia" w:hAnsi="Cambria Math"/>
                 </w:rPr>
-                <m:t>2×2×</m:t>
-              </m:r>
-              <m:r>
-                <w:rPr>
-                  <w:rFonts w:ascii="Cambria Math" w:eastAsiaTheme="minorEastAsia" w:hAnsi="Cambria Math"/>
-                </w:rPr>
-                <m:t>2×2</m:t>
+                <m:t>2×2×2×2</m:t>
               </m:r>
             </m:e>
           </m:d>
@@ -4791,7 +4912,19 @@
         <w:t xml:space="preserve">Ezzel az eljárással </w:t>
       </w:r>
       <w:r>
-        <w:t>máris a felére (5 a 8 helyett) csökkentettük a szükséges lépések számát.</w:t>
+        <w:t>máris a felére (</w:t>
+      </w:r>
+      <w:r>
+        <w:t>4</w:t>
+      </w:r>
+      <w:r>
+        <w:t xml:space="preserve"> a </w:t>
+      </w:r>
+      <w:r>
+        <w:t>7</w:t>
+      </w:r>
+      <w:r>
+        <w:t xml:space="preserve"> helyett) csökkentettük a szükséges lépések számát.</w:t>
       </w:r>
       <w:r>
         <w:t xml:space="preserve"> Ha megismételjük még egyszer, akkor még jobb eredményt érhetünk el:</w:t>
@@ -4898,13 +5031,7 @@
             <w:rPr>
               <w:rFonts w:ascii="Cambria Math" w:eastAsiaTheme="minorEastAsia" w:hAnsi="Cambria Math"/>
             </w:rPr>
-            <m:t>=</m:t>
-          </m:r>
-          <m:r>
-            <w:rPr>
-              <w:rFonts w:ascii="Cambria Math" w:eastAsiaTheme="minorEastAsia" w:hAnsi="Cambria Math"/>
-            </w:rPr>
-            <m:t>=</m:t>
+            <m:t>==</m:t>
           </m:r>
           <m:d>
             <m:dPr>
@@ -5193,24 +5320,64 @@
           <m:jc m:val="center"/>
         </m:oMathParaPr>
         <m:oMath>
-          <m:r>
-            <w:rPr>
-              <w:rFonts w:ascii="Cambria Math" w:eastAsiaTheme="minorEastAsia" w:hAnsi="Cambria Math"/>
-            </w:rPr>
-            <m:t>100</m:t>
-          </m:r>
+          <m:sSub>
+            <m:sSubPr>
+              <m:ctrlPr>
+                <w:rPr>
+                  <w:rFonts w:ascii="Cambria Math" w:eastAsiaTheme="minorEastAsia" w:hAnsi="Cambria Math"/>
+                  <w:i/>
+                </w:rPr>
+              </m:ctrlPr>
+            </m:sSubPr>
+            <m:e>
+              <m:r>
+                <w:rPr>
+                  <w:rFonts w:ascii="Cambria Math" w:eastAsiaTheme="minorEastAsia" w:hAnsi="Cambria Math"/>
+                </w:rPr>
+                <m:t>100</m:t>
+              </m:r>
+            </m:e>
+            <m:sub>
+              <m:r>
+                <w:rPr>
+                  <w:rFonts w:ascii="Cambria Math" w:eastAsiaTheme="minorEastAsia" w:hAnsi="Cambria Math"/>
+                </w:rPr>
+                <m:t>10</m:t>
+              </m:r>
+            </m:sub>
+          </m:sSub>
           <m:r>
             <w:rPr>
               <w:rFonts w:ascii="Cambria Math" w:eastAsiaTheme="minorEastAsia" w:hAnsi="Cambria Math"/>
             </w:rPr>
             <m:t>→</m:t>
           </m:r>
-          <m:r>
-            <w:rPr>
-              <w:rFonts w:ascii="Cambria Math" w:eastAsiaTheme="minorEastAsia" w:hAnsi="Cambria Math"/>
-            </w:rPr>
-            <m:t>1100100</m:t>
-          </m:r>
+          <m:sSub>
+            <m:sSubPr>
+              <m:ctrlPr>
+                <w:rPr>
+                  <w:rFonts w:ascii="Cambria Math" w:eastAsiaTheme="minorEastAsia" w:hAnsi="Cambria Math"/>
+                  <w:i/>
+                </w:rPr>
+              </m:ctrlPr>
+            </m:sSubPr>
+            <m:e>
+              <m:r>
+                <w:rPr>
+                  <w:rFonts w:ascii="Cambria Math" w:eastAsiaTheme="minorEastAsia" w:hAnsi="Cambria Math"/>
+                </w:rPr>
+                <m:t>1100100</m:t>
+              </m:r>
+            </m:e>
+            <m:sub>
+              <m:r>
+                <w:rPr>
+                  <w:rFonts w:ascii="Cambria Math" w:eastAsiaTheme="minorEastAsia" w:hAnsi="Cambria Math"/>
+                </w:rPr>
+                <m:t>2</m:t>
+              </m:r>
+            </m:sub>
+          </m:sSub>
         </m:oMath>
       </m:oMathPara>
     </w:p>
@@ -5219,17 +5386,18 @@
         <w:lastRenderedPageBreak/>
         <w:t>Ezek szerint</w:t>
       </w:r>
-    </w:p>
-    <w:p>
-      <w:pPr>
+      <w:r>
+        <w:t>:</w:t>
+      </w:r>
+    </w:p>
+    <w:p>
+      <w:pPr>
+        <w:jc w:val="center"/>
         <w:rPr>
           <w:rFonts w:eastAsiaTheme="minorEastAsia"/>
         </w:rPr>
       </w:pPr>
       <m:oMathPara>
-        <m:oMathParaPr>
-          <m:jc m:val="center"/>
-        </m:oMathParaPr>
         <m:oMath>
           <m:r>
             <w:rPr>
@@ -5495,6 +5663,1394 @@
     </w:p>
     <w:p>
       <w:pPr>
+        <w:rPr>
+          <w:rFonts w:eastAsiaTheme="minorEastAsia"/>
+        </w:rPr>
+      </w:pPr>
+      <w:r>
+        <w:rPr>
+          <w:rFonts w:eastAsiaTheme="minorEastAsia"/>
+        </w:rPr>
+        <w:t>Ez az eljárás a 99 szorzás helyett, csak 6 szorzást és 2 összeadást használ, ami nagy mértékben javít a teljesítményen.</w:t>
+      </w:r>
+    </w:p>
+    <w:p>
+      <w:pPr>
+        <w:rPr>
+          <w:rFonts w:eastAsiaTheme="minorEastAsia"/>
+        </w:rPr>
+      </w:pPr>
+      <w:r>
+        <w:rPr>
+          <w:rFonts w:eastAsiaTheme="minorEastAsia"/>
+          <w:b/>
+          <w:bCs/>
+        </w:rPr>
+        <w:t>Gyökvonásnál</w:t>
+      </w:r>
+      <w:r>
+        <w:rPr>
+          <w:rFonts w:eastAsiaTheme="minorEastAsia"/>
+        </w:rPr>
+        <w:t xml:space="preserve"> egy </w:t>
+      </w:r>
+      <w:r>
+        <w:rPr>
+          <w:rFonts w:eastAsiaTheme="minorEastAsia"/>
+        </w:rPr>
+        <w:t xml:space="preserve">François </w:t>
+      </w:r>
+      <w:proofErr w:type="spellStart"/>
+      <w:r>
+        <w:rPr>
+          <w:rFonts w:eastAsiaTheme="minorEastAsia"/>
+        </w:rPr>
+        <w:t>Viète</w:t>
+      </w:r>
+      <w:proofErr w:type="spellEnd"/>
+      <w:r>
+        <w:rPr>
+          <w:rFonts w:eastAsiaTheme="minorEastAsia"/>
+        </w:rPr>
+        <w:t>, híres matematikus</w:t>
+      </w:r>
+      <w:r>
+        <w:rPr>
+          <w:rFonts w:eastAsiaTheme="minorEastAsia"/>
+        </w:rPr>
+        <w:t xml:space="preserve"> által </w:t>
+      </w:r>
+      <w:r>
+        <w:rPr>
+          <w:rFonts w:eastAsiaTheme="minorEastAsia"/>
+        </w:rPr>
+        <w:t xml:space="preserve">kifejlesztett </w:t>
+      </w:r>
+      <w:r>
+        <w:rPr>
+          <w:rFonts w:eastAsiaTheme="minorEastAsia"/>
+        </w:rPr>
+        <w:t xml:space="preserve">módszert </w:t>
+      </w:r>
+      <w:r>
+        <w:rPr>
+          <w:rFonts w:eastAsiaTheme="minorEastAsia"/>
+        </w:rPr>
+        <w:t>alkalmaz a könyvtár</w:t>
+      </w:r>
+      <w:r>
+        <w:rPr>
+          <w:rFonts w:eastAsiaTheme="minorEastAsia"/>
+        </w:rPr>
+        <w:t xml:space="preserve">, </w:t>
+      </w:r>
+      <w:r>
+        <w:rPr>
+          <w:rFonts w:eastAsiaTheme="minorEastAsia"/>
+        </w:rPr>
+        <w:t xml:space="preserve">amit </w:t>
+      </w:r>
+      <w:proofErr w:type="spellStart"/>
+      <w:r>
+        <w:rPr>
+          <w:rFonts w:eastAsiaTheme="minorEastAsia"/>
+        </w:rPr>
+        <w:t>Viète</w:t>
+      </w:r>
+      <w:proofErr w:type="spellEnd"/>
+      <w:r>
+        <w:rPr>
+          <w:rFonts w:eastAsiaTheme="minorEastAsia"/>
+        </w:rPr>
+        <w:t xml:space="preserve"> </w:t>
+      </w:r>
+      <w:r>
+        <w:rPr>
+          <w:rFonts w:eastAsiaTheme="minorEastAsia"/>
+        </w:rPr>
+        <w:t>technik</w:t>
+      </w:r>
+      <w:r>
+        <w:rPr>
+          <w:rFonts w:eastAsiaTheme="minorEastAsia"/>
+        </w:rPr>
+        <w:t>ának is neveznek</w:t>
+      </w:r>
+      <w:r>
+        <w:rPr>
+          <w:rFonts w:eastAsiaTheme="minorEastAsia"/>
+        </w:rPr>
+        <w:t>.</w:t>
+      </w:r>
+      <w:r>
+        <w:rPr>
+          <w:rFonts w:eastAsiaTheme="minorEastAsia"/>
+        </w:rPr>
+        <w:t xml:space="preserve"> A módszer a binomiális tételen és az alábbi észrevételen alapszik:</w:t>
+      </w:r>
+    </w:p>
+    <w:p>
+      <w:pPr>
+        <w:jc w:val="center"/>
+        <w:rPr>
+          <w:rFonts w:eastAsiaTheme="minorEastAsia"/>
+        </w:rPr>
+      </w:pPr>
+      <w:r>
+        <w:rPr>
+          <w:rFonts w:eastAsiaTheme="minorEastAsia"/>
+        </w:rPr>
+        <w:t>&lt;kép a Pascal háromszögről&gt;</w:t>
+      </w:r>
+    </w:p>
+    <w:p>
+      <w:pPr>
+        <w:rPr>
+          <w:rFonts w:eastAsiaTheme="minorEastAsia"/>
+        </w:rPr>
+      </w:pPr>
+      <m:oMathPara>
+        <m:oMath>
+          <m:sSup>
+            <m:sSupPr>
+              <m:ctrlPr>
+                <w:rPr>
+                  <w:rFonts w:ascii="Cambria Math" w:eastAsiaTheme="minorEastAsia" w:hAnsi="Cambria Math"/>
+                  <w:i/>
+                </w:rPr>
+              </m:ctrlPr>
+            </m:sSupPr>
+            <m:e>
+              <m:d>
+                <m:dPr>
+                  <m:ctrlPr>
+                    <w:rPr>
+                      <w:rFonts w:ascii="Cambria Math" w:eastAsiaTheme="minorEastAsia" w:hAnsi="Cambria Math"/>
+                      <w:i/>
+                    </w:rPr>
+                  </m:ctrlPr>
+                </m:dPr>
+                <m:e>
+                  <m:r>
+                    <w:rPr>
+                      <w:rFonts w:ascii="Cambria Math" w:eastAsiaTheme="minorEastAsia" w:hAnsi="Cambria Math"/>
+                    </w:rPr>
+                    <m:t>10x+y</m:t>
+                  </m:r>
+                </m:e>
+              </m:d>
+            </m:e>
+            <m:sup>
+              <m:r>
+                <w:rPr>
+                  <w:rFonts w:ascii="Cambria Math" w:eastAsiaTheme="minorEastAsia" w:hAnsi="Cambria Math"/>
+                </w:rPr>
+                <m:t>n</m:t>
+              </m:r>
+            </m:sup>
+          </m:sSup>
+          <m:r>
+            <w:rPr>
+              <w:rFonts w:ascii="Cambria Math" w:eastAsiaTheme="minorEastAsia" w:hAnsi="Cambria Math"/>
+            </w:rPr>
+            <m:t>=</m:t>
+          </m:r>
+          <m:nary>
+            <m:naryPr>
+              <m:chr m:val="∑"/>
+              <m:limLoc m:val="undOvr"/>
+              <m:grow m:val="1"/>
+              <m:ctrlPr>
+                <w:rPr>
+                  <w:rFonts w:ascii="Cambria Math" w:eastAsiaTheme="minorEastAsia" w:hAnsi="Cambria Math"/>
+                  <w:i/>
+                </w:rPr>
+              </m:ctrlPr>
+            </m:naryPr>
+            <m:sub>
+              <m:r>
+                <w:rPr>
+                  <w:rFonts w:ascii="Cambria Math" w:eastAsiaTheme="minorEastAsia" w:hAnsi="Cambria Math"/>
+                </w:rPr>
+                <m:t>k</m:t>
+              </m:r>
+              <m:r>
+                <w:rPr>
+                  <w:rFonts w:ascii="Cambria Math" w:eastAsiaTheme="minorEastAsia" w:hAnsi="Cambria Math"/>
+                </w:rPr>
+                <m:t>=0</m:t>
+              </m:r>
+            </m:sub>
+            <m:sup>
+              <m:r>
+                <w:rPr>
+                  <w:rFonts w:ascii="Cambria Math" w:eastAsiaTheme="minorEastAsia" w:hAnsi="Cambria Math"/>
+                </w:rPr>
+                <m:t>n</m:t>
+              </m:r>
+            </m:sup>
+            <m:e>
+              <m:r>
+                <w:rPr>
+                  <w:rFonts w:ascii="Cambria Math" w:eastAsiaTheme="minorEastAsia" w:hAnsi="Cambria Math"/>
+                </w:rPr>
+                <m:t>P</m:t>
+              </m:r>
+              <m:d>
+                <m:dPr>
+                  <m:ctrlPr>
+                    <w:rPr>
+                      <w:rFonts w:ascii="Cambria Math" w:eastAsiaTheme="minorEastAsia" w:hAnsi="Cambria Math"/>
+                      <w:i/>
+                    </w:rPr>
+                  </m:ctrlPr>
+                </m:dPr>
+                <m:e>
+                  <m:r>
+                    <w:rPr>
+                      <w:rFonts w:ascii="Cambria Math" w:eastAsiaTheme="minorEastAsia" w:hAnsi="Cambria Math"/>
+                    </w:rPr>
+                    <m:t>n,k</m:t>
+                  </m:r>
+                </m:e>
+              </m:d>
+              <m:sSup>
+                <m:sSupPr>
+                  <m:ctrlPr>
+                    <w:rPr>
+                      <w:rFonts w:ascii="Cambria Math" w:eastAsiaTheme="minorEastAsia" w:hAnsi="Cambria Math"/>
+                      <w:i/>
+                    </w:rPr>
+                  </m:ctrlPr>
+                </m:sSupPr>
+                <m:e>
+                  <m:d>
+                    <m:dPr>
+                      <m:ctrlPr>
+                        <w:rPr>
+                          <w:rFonts w:ascii="Cambria Math" w:eastAsiaTheme="minorEastAsia" w:hAnsi="Cambria Math"/>
+                          <w:i/>
+                        </w:rPr>
+                      </m:ctrlPr>
+                    </m:dPr>
+                    <m:e>
+                      <m:r>
+                        <w:rPr>
+                          <w:rFonts w:ascii="Cambria Math" w:eastAsiaTheme="minorEastAsia" w:hAnsi="Cambria Math"/>
+                        </w:rPr>
+                        <m:t>10x</m:t>
+                      </m:r>
+                    </m:e>
+                  </m:d>
+                </m:e>
+                <m:sup>
+                  <m:r>
+                    <w:rPr>
+                      <w:rFonts w:ascii="Cambria Math" w:eastAsiaTheme="minorEastAsia" w:hAnsi="Cambria Math"/>
+                    </w:rPr>
+                    <m:t>n</m:t>
+                  </m:r>
+                  <m:r>
+                    <w:rPr>
+                      <w:rFonts w:ascii="Cambria Math" w:eastAsiaTheme="minorEastAsia" w:hAnsi="Cambria Math"/>
+                    </w:rPr>
+                    <m:t>-k</m:t>
+                  </m:r>
+                </m:sup>
+              </m:sSup>
+              <m:sSup>
+                <m:sSupPr>
+                  <m:ctrlPr>
+                    <w:rPr>
+                      <w:rFonts w:ascii="Cambria Math" w:eastAsiaTheme="minorEastAsia" w:hAnsi="Cambria Math"/>
+                      <w:i/>
+                    </w:rPr>
+                  </m:ctrlPr>
+                </m:sSupPr>
+                <m:e>
+                  <m:r>
+                    <w:rPr>
+                      <w:rFonts w:ascii="Cambria Math" w:eastAsiaTheme="minorEastAsia" w:hAnsi="Cambria Math"/>
+                    </w:rPr>
+                    <m:t>y</m:t>
+                  </m:r>
+                </m:e>
+                <m:sup>
+                  <m:r>
+                    <w:rPr>
+                      <w:rFonts w:ascii="Cambria Math" w:eastAsiaTheme="minorEastAsia" w:hAnsi="Cambria Math"/>
+                    </w:rPr>
+                    <m:t>k</m:t>
+                  </m:r>
+                </m:sup>
+              </m:sSup>
+              <m:r>
+                <w:rPr>
+                  <w:rFonts w:ascii="Cambria Math" w:eastAsiaTheme="minorEastAsia" w:hAnsi="Cambria Math"/>
+                </w:rPr>
+                <m:t xml:space="preserve"> </m:t>
+              </m:r>
+            </m:e>
+          </m:nary>
+        </m:oMath>
+      </m:oMathPara>
+    </w:p>
+    <w:p>
+      <w:r>
+        <w:t xml:space="preserve">A képlet </w:t>
+      </w:r>
+      <m:oMath>
+        <m:r>
+          <w:rPr>
+            <w:rFonts w:ascii="Cambria Math" w:hAnsi="Cambria Math"/>
+          </w:rPr>
+          <m:t>P</m:t>
+        </m:r>
+      </m:oMath>
+      <w:r>
+        <w:t xml:space="preserve"> függvénye valójában a binomiális együtthatót adja meg, vagyis a Pascal háromszög </w:t>
+      </w:r>
+      <m:oMath>
+        <m:r>
+          <w:rPr>
+            <w:rFonts w:ascii="Cambria Math" w:hAnsi="Cambria Math"/>
+          </w:rPr>
+          <m:t>n</m:t>
+        </m:r>
+      </m:oMath>
+      <w:r>
+        <w:t xml:space="preserve">. sorának </w:t>
+      </w:r>
+      <m:oMath>
+        <m:r>
+          <w:rPr>
+            <w:rFonts w:ascii="Cambria Math" w:hAnsi="Cambria Math"/>
+          </w:rPr>
+          <m:t>k</m:t>
+        </m:r>
+      </m:oMath>
+      <w:r>
+        <w:t>. elemét.</w:t>
+      </w:r>
+      <w:r>
+        <w:t xml:space="preserve"> A bal oldal zárójeles része pedig bármilyen egész szám leírására alkalmas. Ezzel a képlettel igaz, még nem tudunk gyököt számolni. Ahhoz még kelleni fog egy fontos részlet.</w:t>
+      </w:r>
+    </w:p>
+    <w:p>
+      <w:pPr>
+        <w:rPr>
+          <w:rFonts w:eastAsiaTheme="minorEastAsia"/>
+        </w:rPr>
+      </w:pPr>
+      <w:r>
+        <w:t>Válasszunk egy egész számot</w:t>
+      </w:r>
+      <w:r>
+        <w:t xml:space="preserve">, </w:t>
+      </w:r>
+      <w:r>
+        <w:t xml:space="preserve">amit </w:t>
+      </w:r>
+      <m:oMath>
+        <m:r>
+          <w:rPr>
+            <w:rFonts w:ascii="Cambria Math" w:hAnsi="Cambria Math"/>
+          </w:rPr>
+          <m:t>C</m:t>
+        </m:r>
+      </m:oMath>
+      <w:r>
+        <w:t xml:space="preserve">-nek </w:t>
+      </w:r>
+      <w:r>
+        <w:t>nevezünk</w:t>
+      </w:r>
+      <w:r>
+        <w:t xml:space="preserve"> és</w:t>
+      </w:r>
+      <w:r>
+        <w:t xml:space="preserve"> </w:t>
+      </w:r>
+      <w:r>
+        <w:t xml:space="preserve">aminek ki szeretnénk számolni az </w:t>
+      </w:r>
+      <m:oMath>
+        <m:r>
+          <w:rPr>
+            <w:rFonts w:ascii="Cambria Math" w:hAnsi="Cambria Math"/>
+          </w:rPr>
+          <m:t>n</m:t>
+        </m:r>
+      </m:oMath>
+      <w:r>
+        <w:t>. gyökét</w:t>
+      </w:r>
+      <w:r>
+        <w:t>.</w:t>
+      </w:r>
+      <w:r>
+        <w:t xml:space="preserve"> </w:t>
+      </w:r>
+      <w:r>
+        <w:t>Ezután</w:t>
+      </w:r>
+      <w:r>
+        <w:t xml:space="preserve"> válasszunk ki egy </w:t>
+      </w:r>
+      <m:oMath>
+        <m:sSubSup>
+          <m:sSubSupPr>
+            <m:ctrlPr>
+              <w:rPr>
+                <w:rFonts w:ascii="Cambria Math" w:hAnsi="Cambria Math"/>
+                <w:i/>
+              </w:rPr>
+            </m:ctrlPr>
+          </m:sSubSupPr>
+          <m:e>
+            <m:r>
+              <w:rPr>
+                <w:rFonts w:ascii="Cambria Math" w:hAnsi="Cambria Math"/>
+              </w:rPr>
+              <m:t>x</m:t>
+            </m:r>
+          </m:e>
+          <m:sub>
+            <m:r>
+              <w:rPr>
+                <w:rFonts w:ascii="Cambria Math" w:hAnsi="Cambria Math"/>
+              </w:rPr>
+              <m:t>i</m:t>
+            </m:r>
+          </m:sub>
+          <m:sup>
+            <m:r>
+              <w:rPr>
+                <w:rFonts w:ascii="Cambria Math" w:hAnsi="Cambria Math"/>
+              </w:rPr>
+              <m:t>n</m:t>
+            </m:r>
+          </m:sup>
+        </m:sSubSup>
+        <m:r>
+          <w:rPr>
+            <w:rFonts w:ascii="Cambria Math" w:hAnsi="Cambria Math"/>
+          </w:rPr>
+          <m:t>, i=0,</m:t>
+        </m:r>
+        <m:r>
+          <w:rPr>
+            <w:rFonts w:ascii="Cambria Math" w:hAnsi="Cambria Math"/>
+          </w:rPr>
+          <m:t xml:space="preserve"> </m:t>
+        </m:r>
+        <m:r>
+          <w:rPr>
+            <w:rFonts w:ascii="Cambria Math" w:hAnsi="Cambria Math"/>
+          </w:rPr>
+          <m:t>1…</m:t>
+        </m:r>
+      </m:oMath>
+      <w:r>
+        <w:rPr>
+          <w:rFonts w:eastAsiaTheme="minorEastAsia"/>
+        </w:rPr>
+        <w:t xml:space="preserve"> sorozatot</w:t>
+      </w:r>
+      <w:r>
+        <w:rPr>
+          <w:rFonts w:eastAsiaTheme="minorEastAsia"/>
+        </w:rPr>
+        <w:t>,</w:t>
+      </w:r>
+      <w:r>
+        <w:rPr>
+          <w:rFonts w:eastAsiaTheme="minorEastAsia"/>
+        </w:rPr>
+        <w:t xml:space="preserve"> aminek </w:t>
+      </w:r>
+    </w:p>
+    <w:p>
+      <w:pPr>
+        <w:pStyle w:val="Listaszerbekezds"/>
+        <w:numPr>
+          <w:ilvl w:val="0"/>
+          <w:numId w:val="7"/>
+        </w:numPr>
+        <w:rPr>
+          <w:rFonts w:eastAsiaTheme="minorEastAsia"/>
+        </w:rPr>
+      </w:pPr>
+      <w:r>
+        <w:rPr>
+          <w:rFonts w:eastAsiaTheme="minorEastAsia"/>
+        </w:rPr>
+        <w:t>a kezdő eleme</w:t>
+      </w:r>
+      <w:r>
+        <w:rPr>
+          <w:rFonts w:eastAsiaTheme="minorEastAsia"/>
+        </w:rPr>
+        <w:t xml:space="preserve"> 0, vagyis</w:t>
+      </w:r>
+      <w:r>
+        <w:rPr>
+          <w:rFonts w:eastAsiaTheme="minorEastAsia"/>
+        </w:rPr>
+        <w:t xml:space="preserve"> </w:t>
+      </w:r>
+      <m:oMath>
+        <m:sSub>
+          <m:sSubPr>
+            <m:ctrlPr>
+              <w:rPr>
+                <w:rFonts w:ascii="Cambria Math" w:eastAsiaTheme="minorEastAsia" w:hAnsi="Cambria Math"/>
+                <w:i/>
+              </w:rPr>
+            </m:ctrlPr>
+          </m:sSubPr>
+          <m:e>
+            <m:r>
+              <w:rPr>
+                <w:rFonts w:ascii="Cambria Math" w:eastAsiaTheme="minorEastAsia" w:hAnsi="Cambria Math"/>
+              </w:rPr>
+              <m:t>x</m:t>
+            </m:r>
+          </m:e>
+          <m:sub>
+            <m:r>
+              <w:rPr>
+                <w:rFonts w:ascii="Cambria Math" w:eastAsiaTheme="minorEastAsia" w:hAnsi="Cambria Math"/>
+              </w:rPr>
+              <m:t>0</m:t>
+            </m:r>
+          </m:sub>
+        </m:sSub>
+        <m:r>
+          <w:rPr>
+            <w:rFonts w:ascii="Cambria Math" w:eastAsiaTheme="minorEastAsia" w:hAnsi="Cambria Math"/>
+          </w:rPr>
+          <m:t>=0</m:t>
+        </m:r>
+      </m:oMath>
+      <w:r>
+        <w:rPr>
+          <w:rFonts w:eastAsiaTheme="minorEastAsia"/>
+        </w:rPr>
+        <w:t xml:space="preserve"> és</w:t>
+      </w:r>
+      <w:r>
+        <w:rPr>
+          <w:rFonts w:eastAsiaTheme="minorEastAsia"/>
+        </w:rPr>
+        <w:t xml:space="preserve"> </w:t>
+      </w:r>
+    </w:p>
+    <w:p>
+      <w:pPr>
+        <w:pStyle w:val="Listaszerbekezds"/>
+        <w:numPr>
+          <w:ilvl w:val="0"/>
+          <w:numId w:val="7"/>
+        </w:numPr>
+        <w:rPr>
+          <w:rFonts w:eastAsiaTheme="minorEastAsia"/>
+        </w:rPr>
+      </w:pPr>
+      <w:r>
+        <w:rPr>
+          <w:rFonts w:eastAsiaTheme="minorEastAsia"/>
+        </w:rPr>
+        <w:lastRenderedPageBreak/>
+        <w:t xml:space="preserve">minden </w:t>
+      </w:r>
+      <m:oMath>
+        <m:r>
+          <w:rPr>
+            <w:rFonts w:ascii="Cambria Math" w:eastAsiaTheme="minorEastAsia" w:hAnsi="Cambria Math"/>
+          </w:rPr>
+          <m:t>i=0, 1…</m:t>
+        </m:r>
+      </m:oMath>
+      <w:r>
+        <w:rPr>
+          <w:rFonts w:eastAsiaTheme="minorEastAsia"/>
+        </w:rPr>
+        <w:t xml:space="preserve"> esetén </w:t>
+      </w:r>
+      <m:oMath>
+        <m:sSubSup>
+          <m:sSubSupPr>
+            <m:ctrlPr>
+              <w:rPr>
+                <w:rFonts w:ascii="Cambria Math" w:eastAsiaTheme="minorEastAsia" w:hAnsi="Cambria Math"/>
+                <w:i/>
+              </w:rPr>
+            </m:ctrlPr>
+          </m:sSubSupPr>
+          <m:e>
+            <m:r>
+              <w:rPr>
+                <w:rFonts w:ascii="Cambria Math" w:eastAsiaTheme="minorEastAsia" w:hAnsi="Cambria Math"/>
+              </w:rPr>
+              <m:t>x</m:t>
+            </m:r>
+          </m:e>
+          <m:sub>
+            <m:r>
+              <w:rPr>
+                <w:rFonts w:ascii="Cambria Math" w:eastAsiaTheme="minorEastAsia" w:hAnsi="Cambria Math"/>
+              </w:rPr>
+              <m:t>i</m:t>
+            </m:r>
+          </m:sub>
+          <m:sup>
+            <m:r>
+              <w:rPr>
+                <w:rFonts w:ascii="Cambria Math" w:eastAsiaTheme="minorEastAsia" w:hAnsi="Cambria Math"/>
+              </w:rPr>
+              <m:t>n</m:t>
+            </m:r>
+          </m:sup>
+        </m:sSubSup>
+        <m:r>
+          <w:rPr>
+            <w:rFonts w:ascii="Cambria Math" w:eastAsiaTheme="minorEastAsia" w:hAnsi="Cambria Math"/>
+          </w:rPr>
+          <m:t>≤</m:t>
+        </m:r>
+        <m:r>
+          <w:rPr>
+            <w:rFonts w:ascii="Cambria Math" w:eastAsiaTheme="minorEastAsia" w:hAnsi="Cambria Math"/>
+          </w:rPr>
+          <m:t>C</m:t>
+        </m:r>
+      </m:oMath>
+      <w:r>
+        <w:rPr>
+          <w:rFonts w:eastAsiaTheme="minorEastAsia"/>
+        </w:rPr>
+        <w:t xml:space="preserve">. </w:t>
+      </w:r>
+    </w:p>
+    <w:p>
+      <w:r>
+        <w:t xml:space="preserve">Ekkor a közelítés számjegyei az </w:t>
+      </w:r>
+      <m:oMath>
+        <m:sSub>
+          <m:sSubPr>
+            <m:ctrlPr>
+              <w:rPr>
+                <w:rFonts w:ascii="Cambria Math" w:hAnsi="Cambria Math"/>
+                <w:i/>
+              </w:rPr>
+            </m:ctrlPr>
+          </m:sSubPr>
+          <m:e>
+            <m:r>
+              <w:rPr>
+                <w:rFonts w:ascii="Cambria Math" w:hAnsi="Cambria Math"/>
+              </w:rPr>
+              <m:t>x</m:t>
+            </m:r>
+          </m:e>
+          <m:sub>
+            <m:r>
+              <w:rPr>
+                <w:rFonts w:ascii="Cambria Math" w:hAnsi="Cambria Math"/>
+              </w:rPr>
+              <m:t>i+1</m:t>
+            </m:r>
+          </m:sub>
+        </m:sSub>
+      </m:oMath>
+      <w:r>
+        <w:t xml:space="preserve"> és </w:t>
+      </w:r>
+      <m:oMath>
+        <m:sSub>
+          <m:sSubPr>
+            <m:ctrlPr>
+              <w:rPr>
+                <w:rFonts w:ascii="Cambria Math" w:hAnsi="Cambria Math"/>
+                <w:i/>
+              </w:rPr>
+            </m:ctrlPr>
+          </m:sSubPr>
+          <m:e>
+            <m:r>
+              <w:rPr>
+                <w:rFonts w:ascii="Cambria Math" w:hAnsi="Cambria Math"/>
+              </w:rPr>
+              <m:t>x</m:t>
+            </m:r>
+          </m:e>
+          <m:sub>
+            <m:r>
+              <w:rPr>
+                <w:rFonts w:ascii="Cambria Math" w:hAnsi="Cambria Math"/>
+              </w:rPr>
+              <m:t>i</m:t>
+            </m:r>
+          </m:sub>
+        </m:sSub>
+      </m:oMath>
+      <w:r>
+        <w:t xml:space="preserve"> elemek különbségének sorozatából adódnak.</w:t>
+      </w:r>
+      <w:r>
+        <w:t xml:space="preserve"> </w:t>
+      </w:r>
+      <m:oMath>
+        <m:sSub>
+          <m:sSubPr>
+            <m:ctrlPr>
+              <w:rPr>
+                <w:rFonts w:ascii="Cambria Math" w:hAnsi="Cambria Math"/>
+                <w:i/>
+              </w:rPr>
+            </m:ctrlPr>
+          </m:sSubPr>
+          <m:e>
+            <m:r>
+              <w:rPr>
+                <w:rFonts w:ascii="Cambria Math" w:hAnsi="Cambria Math"/>
+              </w:rPr>
+              <m:t>y</m:t>
+            </m:r>
+          </m:e>
+          <m:sub>
+            <m:r>
+              <w:rPr>
+                <w:rFonts w:ascii="Cambria Math" w:hAnsi="Cambria Math"/>
+              </w:rPr>
+              <m:t>i</m:t>
+            </m:r>
+          </m:sub>
+        </m:sSub>
+      </m:oMath>
+      <w:r>
+        <w:t xml:space="preserve"> megválasztását úgy intézzük, hogy a lehető legnagyobb olyan egy számjegyű szám legyen, amire teljesül, hogy </w:t>
+      </w:r>
+      <m:oMath>
+        <m:r>
+          <w:rPr>
+            <w:rFonts w:ascii="Cambria Math" w:hAnsi="Cambria Math"/>
+          </w:rPr>
+          <m:t>10</m:t>
+        </m:r>
+        <m:sSub>
+          <m:sSubPr>
+            <m:ctrlPr>
+              <w:rPr>
+                <w:rFonts w:ascii="Cambria Math" w:hAnsi="Cambria Math"/>
+                <w:i/>
+              </w:rPr>
+            </m:ctrlPr>
+          </m:sSubPr>
+          <m:e>
+            <m:r>
+              <w:rPr>
+                <w:rFonts w:ascii="Cambria Math" w:hAnsi="Cambria Math"/>
+              </w:rPr>
+              <m:t>x</m:t>
+            </m:r>
+          </m:e>
+          <m:sub>
+            <m:r>
+              <w:rPr>
+                <w:rFonts w:ascii="Cambria Math" w:hAnsi="Cambria Math"/>
+              </w:rPr>
+              <m:t>i</m:t>
+            </m:r>
+          </m:sub>
+        </m:sSub>
+        <m:r>
+          <w:rPr>
+            <w:rFonts w:ascii="Cambria Math" w:hAnsi="Cambria Math"/>
+          </w:rPr>
+          <m:t>+</m:t>
+        </m:r>
+        <m:sSub>
+          <m:sSubPr>
+            <m:ctrlPr>
+              <w:rPr>
+                <w:rFonts w:ascii="Cambria Math" w:hAnsi="Cambria Math"/>
+                <w:i/>
+              </w:rPr>
+            </m:ctrlPr>
+          </m:sSubPr>
+          <m:e>
+            <m:r>
+              <w:rPr>
+                <w:rFonts w:ascii="Cambria Math" w:hAnsi="Cambria Math"/>
+              </w:rPr>
+              <m:t>y</m:t>
+            </m:r>
+          </m:e>
+          <m:sub>
+            <m:r>
+              <w:rPr>
+                <w:rFonts w:ascii="Cambria Math" w:hAnsi="Cambria Math"/>
+              </w:rPr>
+              <m:t>i</m:t>
+            </m:r>
+          </m:sub>
+        </m:sSub>
+        <m:r>
+          <w:rPr>
+            <w:rFonts w:ascii="Cambria Math" w:hAnsi="Cambria Math"/>
+          </w:rPr>
+          <m:t>=10</m:t>
+        </m:r>
+        <m:sSub>
+          <m:sSubPr>
+            <m:ctrlPr>
+              <w:rPr>
+                <w:rFonts w:ascii="Cambria Math" w:hAnsi="Cambria Math"/>
+                <w:i/>
+              </w:rPr>
+            </m:ctrlPr>
+          </m:sSubPr>
+          <m:e>
+            <m:r>
+              <w:rPr>
+                <w:rFonts w:ascii="Cambria Math" w:hAnsi="Cambria Math"/>
+              </w:rPr>
+              <m:t>x</m:t>
+            </m:r>
+          </m:e>
+          <m:sub>
+            <m:r>
+              <w:rPr>
+                <w:rFonts w:ascii="Cambria Math" w:hAnsi="Cambria Math"/>
+              </w:rPr>
+              <m:t>i+1</m:t>
+            </m:r>
+          </m:sub>
+        </m:sSub>
+      </m:oMath>
+      <w:r>
+        <w:t xml:space="preserve">. Ez a legnehezebb része a számításnak, mivel nincs egyenes út </w:t>
+      </w:r>
+      <m:oMath>
+        <m:sSub>
+          <m:sSubPr>
+            <m:ctrlPr>
+              <w:rPr>
+                <w:rFonts w:ascii="Cambria Math" w:hAnsi="Cambria Math"/>
+                <w:i/>
+              </w:rPr>
+            </m:ctrlPr>
+          </m:sSubPr>
+          <m:e>
+            <m:r>
+              <w:rPr>
+                <w:rFonts w:ascii="Cambria Math" w:hAnsi="Cambria Math"/>
+              </w:rPr>
+              <m:t>y</m:t>
+            </m:r>
+          </m:e>
+          <m:sub>
+            <m:r>
+              <w:rPr>
+                <w:rFonts w:ascii="Cambria Math" w:hAnsi="Cambria Math"/>
+              </w:rPr>
+              <m:t>i</m:t>
+            </m:r>
+          </m:sub>
+        </m:sSub>
+      </m:oMath>
+      <w:r>
+        <w:t xml:space="preserve"> kiválasztásához. Viszont mivel 10 számjegy közül választhatunk összesen, bináris kereséssel elég gyorsan megtalálható a keresett szám. </w:t>
+      </w:r>
+    </w:p>
+    <w:p>
+      <w:r>
+        <w:t>Ezeket a szabályokat belefogalmazva, a következő egyenlőtlenséget kapjuk:</w:t>
+      </w:r>
+    </w:p>
+    <w:p>
+      <m:oMathPara>
+        <m:oMath>
+          <m:sSup>
+            <m:sSupPr>
+              <m:ctrlPr>
+                <w:rPr>
+                  <w:rFonts w:ascii="Cambria Math" w:hAnsi="Cambria Math"/>
+                </w:rPr>
+              </m:ctrlPr>
+            </m:sSupPr>
+            <m:e>
+              <m:d>
+                <m:dPr>
+                  <m:ctrlPr>
+                    <w:rPr>
+                      <w:rFonts w:ascii="Cambria Math" w:hAnsi="Cambria Math"/>
+                    </w:rPr>
+                  </m:ctrlPr>
+                </m:dPr>
+                <m:e>
+                  <m:r>
+                    <m:rPr>
+                      <m:sty m:val="p"/>
+                    </m:rPr>
+                    <w:rPr>
+                      <w:rFonts w:ascii="Cambria Math" w:hAnsi="Cambria Math"/>
+                    </w:rPr>
+                    <m:t>10</m:t>
+                  </m:r>
+                  <m:sSub>
+                    <m:sSubPr>
+                      <m:ctrlPr>
+                        <w:rPr>
+                          <w:rFonts w:ascii="Cambria Math" w:hAnsi="Cambria Math"/>
+                        </w:rPr>
+                      </m:ctrlPr>
+                    </m:sSubPr>
+                    <m:e>
+                      <m:r>
+                        <w:rPr>
+                          <w:rFonts w:ascii="Cambria Math" w:hAnsi="Cambria Math"/>
+                        </w:rPr>
+                        <m:t>x</m:t>
+                      </m:r>
+                    </m:e>
+                    <m:sub>
+                      <m:r>
+                        <w:rPr>
+                          <w:rFonts w:ascii="Cambria Math" w:hAnsi="Cambria Math"/>
+                        </w:rPr>
+                        <m:t>i</m:t>
+                      </m:r>
+                    </m:sub>
+                  </m:sSub>
+                  <m:r>
+                    <m:rPr>
+                      <m:sty m:val="p"/>
+                    </m:rPr>
+                    <w:rPr>
+                      <w:rFonts w:ascii="Cambria Math" w:hAnsi="Cambria Math"/>
+                    </w:rPr>
+                    <m:t>+</m:t>
+                  </m:r>
+                  <m:r>
+                    <w:rPr>
+                      <w:rFonts w:ascii="Cambria Math" w:hAnsi="Cambria Math"/>
+                    </w:rPr>
+                    <m:t>y</m:t>
+                  </m:r>
+                </m:e>
+              </m:d>
+            </m:e>
+            <m:sup>
+              <m:r>
+                <w:rPr>
+                  <w:rFonts w:ascii="Cambria Math" w:hAnsi="Cambria Math"/>
+                </w:rPr>
+                <m:t>n</m:t>
+              </m:r>
+            </m:sup>
+          </m:sSup>
+          <m:r>
+            <m:rPr>
+              <m:sty m:val="p"/>
+            </m:rPr>
+            <w:rPr>
+              <w:rFonts w:ascii="Cambria Math" w:hAnsi="Cambria Math"/>
+            </w:rPr>
+            <m:t>-</m:t>
+          </m:r>
+          <m:sSup>
+            <m:sSupPr>
+              <m:ctrlPr>
+                <w:rPr>
+                  <w:rFonts w:ascii="Cambria Math" w:hAnsi="Cambria Math"/>
+                </w:rPr>
+              </m:ctrlPr>
+            </m:sSupPr>
+            <m:e>
+              <m:d>
+                <m:dPr>
+                  <m:ctrlPr>
+                    <w:rPr>
+                      <w:rFonts w:ascii="Cambria Math" w:hAnsi="Cambria Math"/>
+                    </w:rPr>
+                  </m:ctrlPr>
+                </m:dPr>
+                <m:e>
+                  <m:r>
+                    <m:rPr>
+                      <m:sty m:val="p"/>
+                    </m:rPr>
+                    <w:rPr>
+                      <w:rFonts w:ascii="Cambria Math" w:hAnsi="Cambria Math"/>
+                    </w:rPr>
+                    <m:t>10</m:t>
+                  </m:r>
+                  <m:sSub>
+                    <m:sSubPr>
+                      <m:ctrlPr>
+                        <w:rPr>
+                          <w:rFonts w:ascii="Cambria Math" w:hAnsi="Cambria Math"/>
+                        </w:rPr>
+                      </m:ctrlPr>
+                    </m:sSubPr>
+                    <m:e>
+                      <m:r>
+                        <w:rPr>
+                          <w:rFonts w:ascii="Cambria Math" w:hAnsi="Cambria Math"/>
+                        </w:rPr>
+                        <m:t>x</m:t>
+                      </m:r>
+                    </m:e>
+                    <m:sub>
+                      <m:r>
+                        <w:rPr>
+                          <w:rFonts w:ascii="Cambria Math" w:hAnsi="Cambria Math"/>
+                        </w:rPr>
+                        <m:t>i</m:t>
+                      </m:r>
+                    </m:sub>
+                  </m:sSub>
+                </m:e>
+              </m:d>
+            </m:e>
+            <m:sup>
+              <m:r>
+                <w:rPr>
+                  <w:rFonts w:ascii="Cambria Math" w:hAnsi="Cambria Math"/>
+                </w:rPr>
+                <m:t>n</m:t>
+              </m:r>
+            </m:sup>
+          </m:sSup>
+          <m:r>
+            <m:rPr>
+              <m:sty m:val="p"/>
+            </m:rPr>
+            <w:rPr>
+              <w:rFonts w:ascii="Cambria Math" w:hAnsi="Cambria Math"/>
+            </w:rPr>
+            <m:t>=</m:t>
+          </m:r>
+          <m:nary>
+            <m:naryPr>
+              <m:chr m:val="∑"/>
+              <m:limLoc m:val="undOvr"/>
+              <m:grow m:val="1"/>
+              <m:ctrlPr>
+                <w:rPr>
+                  <w:rFonts w:ascii="Cambria Math" w:hAnsi="Cambria Math"/>
+                </w:rPr>
+              </m:ctrlPr>
+            </m:naryPr>
+            <m:sub>
+              <m:r>
+                <w:rPr>
+                  <w:rFonts w:ascii="Cambria Math" w:hAnsi="Cambria Math"/>
+                </w:rPr>
+                <m:t>k</m:t>
+              </m:r>
+              <m:r>
+                <m:rPr>
+                  <m:sty m:val="p"/>
+                </m:rPr>
+                <w:rPr>
+                  <w:rFonts w:ascii="Cambria Math" w:hAnsi="Cambria Math"/>
+                </w:rPr>
+                <m:t>=0</m:t>
+              </m:r>
+            </m:sub>
+            <m:sup>
+              <m:r>
+                <w:rPr>
+                  <w:rFonts w:ascii="Cambria Math" w:hAnsi="Cambria Math"/>
+                </w:rPr>
+                <m:t>n</m:t>
+              </m:r>
+              <m:r>
+                <w:rPr>
+                  <w:rFonts w:ascii="Cambria Math" w:hAnsi="Cambria Math"/>
+                </w:rPr>
+                <m:t>-1</m:t>
+              </m:r>
+            </m:sup>
+            <m:e>
+              <m:r>
+                <w:rPr>
+                  <w:rFonts w:ascii="Cambria Math" w:hAnsi="Cambria Math"/>
+                </w:rPr>
+                <m:t>P</m:t>
+              </m:r>
+              <m:d>
+                <m:dPr>
+                  <m:ctrlPr>
+                    <w:rPr>
+                      <w:rFonts w:ascii="Cambria Math" w:hAnsi="Cambria Math"/>
+                    </w:rPr>
+                  </m:ctrlPr>
+                </m:dPr>
+                <m:e>
+                  <m:r>
+                    <w:rPr>
+                      <w:rFonts w:ascii="Cambria Math" w:hAnsi="Cambria Math"/>
+                    </w:rPr>
+                    <m:t>n</m:t>
+                  </m:r>
+                  <m:r>
+                    <m:rPr>
+                      <m:sty m:val="p"/>
+                    </m:rPr>
+                    <w:rPr>
+                      <w:rFonts w:ascii="Cambria Math" w:hAnsi="Cambria Math"/>
+                    </w:rPr>
+                    <m:t>,</m:t>
+                  </m:r>
+                  <m:r>
+                    <w:rPr>
+                      <w:rFonts w:ascii="Cambria Math" w:hAnsi="Cambria Math"/>
+                    </w:rPr>
+                    <m:t>k</m:t>
+                  </m:r>
+                </m:e>
+              </m:d>
+              <m:sSup>
+                <m:sSupPr>
+                  <m:ctrlPr>
+                    <w:rPr>
+                      <w:rFonts w:ascii="Cambria Math" w:hAnsi="Cambria Math"/>
+                    </w:rPr>
+                  </m:ctrlPr>
+                </m:sSupPr>
+                <m:e>
+                  <m:d>
+                    <m:dPr>
+                      <m:ctrlPr>
+                        <w:rPr>
+                          <w:rFonts w:ascii="Cambria Math" w:hAnsi="Cambria Math"/>
+                        </w:rPr>
+                      </m:ctrlPr>
+                    </m:dPr>
+                    <m:e>
+                      <m:r>
+                        <m:rPr>
+                          <m:sty m:val="p"/>
+                        </m:rPr>
+                        <w:rPr>
+                          <w:rFonts w:ascii="Cambria Math" w:hAnsi="Cambria Math"/>
+                        </w:rPr>
+                        <m:t>10</m:t>
+                      </m:r>
+                      <m:sSub>
+                        <m:sSubPr>
+                          <m:ctrlPr>
+                            <w:rPr>
+                              <w:rFonts w:ascii="Cambria Math" w:hAnsi="Cambria Math"/>
+                            </w:rPr>
+                          </m:ctrlPr>
+                        </m:sSubPr>
+                        <m:e>
+                          <m:r>
+                            <w:rPr>
+                              <w:rFonts w:ascii="Cambria Math" w:hAnsi="Cambria Math"/>
+                            </w:rPr>
+                            <m:t>x</m:t>
+                          </m:r>
+                        </m:e>
+                        <m:sub>
+                          <m:r>
+                            <w:rPr>
+                              <w:rFonts w:ascii="Cambria Math" w:hAnsi="Cambria Math"/>
+                            </w:rPr>
+                            <m:t>i</m:t>
+                          </m:r>
+                        </m:sub>
+                      </m:sSub>
+                    </m:e>
+                  </m:d>
+                </m:e>
+                <m:sup>
+                  <m:r>
+                    <w:rPr>
+                      <w:rFonts w:ascii="Cambria Math" w:hAnsi="Cambria Math"/>
+                    </w:rPr>
+                    <m:t>n</m:t>
+                  </m:r>
+                  <m:r>
+                    <m:rPr>
+                      <m:sty m:val="p"/>
+                    </m:rPr>
+                    <w:rPr>
+                      <w:rFonts w:ascii="Cambria Math" w:hAnsi="Cambria Math"/>
+                    </w:rPr>
+                    <m:t>-</m:t>
+                  </m:r>
+                  <m:r>
+                    <w:rPr>
+                      <w:rFonts w:ascii="Cambria Math" w:hAnsi="Cambria Math"/>
+                    </w:rPr>
+                    <m:t>k</m:t>
+                  </m:r>
+                </m:sup>
+              </m:sSup>
+              <m:sSubSup>
+                <m:sSubSupPr>
+                  <m:ctrlPr>
+                    <w:rPr>
+                      <w:rFonts w:ascii="Cambria Math" w:hAnsi="Cambria Math"/>
+                    </w:rPr>
+                  </m:ctrlPr>
+                </m:sSubSupPr>
+                <m:e>
+                  <m:r>
+                    <w:rPr>
+                      <w:rFonts w:ascii="Cambria Math" w:hAnsi="Cambria Math"/>
+                    </w:rPr>
+                    <m:t>y</m:t>
+                  </m:r>
+                </m:e>
+                <m:sub>
+                  <m:r>
+                    <w:rPr>
+                      <w:rFonts w:ascii="Cambria Math" w:hAnsi="Cambria Math"/>
+                    </w:rPr>
+                    <m:t>i</m:t>
+                  </m:r>
+                </m:sub>
+                <m:sup>
+                  <m:r>
+                    <w:rPr>
+                      <w:rFonts w:ascii="Cambria Math" w:hAnsi="Cambria Math"/>
+                    </w:rPr>
+                    <m:t>k</m:t>
+                  </m:r>
+                </m:sup>
+              </m:sSubSup>
+            </m:e>
+          </m:nary>
+          <m:r>
+            <m:rPr>
+              <m:sty m:val="p"/>
+            </m:rPr>
+            <w:rPr>
+              <w:rFonts w:ascii="Cambria Math" w:hAnsi="Cambria Math"/>
+            </w:rPr>
+            <m:t>≤</m:t>
+          </m:r>
+          <m:sSup>
+            <m:sSupPr>
+              <m:ctrlPr>
+                <w:rPr>
+                  <w:rFonts w:ascii="Cambria Math" w:hAnsi="Cambria Math"/>
+                </w:rPr>
+              </m:ctrlPr>
+            </m:sSupPr>
+            <m:e>
+              <m:r>
+                <m:rPr>
+                  <m:sty m:val="p"/>
+                </m:rPr>
+                <w:rPr>
+                  <w:rFonts w:ascii="Cambria Math" w:hAnsi="Cambria Math"/>
+                </w:rPr>
+                <m:t>10</m:t>
+              </m:r>
+            </m:e>
+            <m:sup>
+              <m:r>
+                <w:rPr>
+                  <w:rFonts w:ascii="Cambria Math" w:hAnsi="Cambria Math"/>
+                </w:rPr>
+                <m:t>n</m:t>
+              </m:r>
+            </m:sup>
+          </m:sSup>
+          <m:r>
+            <m:rPr>
+              <m:sty m:val="p"/>
+            </m:rPr>
+            <w:rPr>
+              <w:rFonts w:ascii="Cambria Math" w:hAnsi="Cambria Math"/>
+            </w:rPr>
+            <m:t>(</m:t>
+          </m:r>
+          <m:r>
+            <w:rPr>
+              <w:rFonts w:ascii="Cambria Math" w:hAnsi="Cambria Math"/>
+            </w:rPr>
+            <m:t>C</m:t>
+          </m:r>
+          <m:r>
+            <m:rPr>
+              <m:sty m:val="p"/>
+            </m:rPr>
+            <w:rPr>
+              <w:rFonts w:ascii="Cambria Math" w:hAnsi="Cambria Math"/>
+            </w:rPr>
+            <m:t>-</m:t>
+          </m:r>
+          <m:sSubSup>
+            <m:sSubSupPr>
+              <m:ctrlPr>
+                <w:rPr>
+                  <w:rFonts w:ascii="Cambria Math" w:hAnsi="Cambria Math"/>
+                </w:rPr>
+              </m:ctrlPr>
+            </m:sSubSupPr>
+            <m:e>
+              <m:r>
+                <w:rPr>
+                  <w:rFonts w:ascii="Cambria Math" w:hAnsi="Cambria Math"/>
+                </w:rPr>
+                <m:t>x</m:t>
+              </m:r>
+            </m:e>
+            <m:sub>
+              <m:r>
+                <w:rPr>
+                  <w:rFonts w:ascii="Cambria Math" w:hAnsi="Cambria Math"/>
+                </w:rPr>
+                <m:t>i</m:t>
+              </m:r>
+            </m:sub>
+            <m:sup>
+              <m:r>
+                <w:rPr>
+                  <w:rFonts w:ascii="Cambria Math" w:hAnsi="Cambria Math"/>
+                </w:rPr>
+                <m:t>n</m:t>
+              </m:r>
+            </m:sup>
+          </m:sSubSup>
+          <m:r>
+            <m:rPr>
+              <m:sty m:val="p"/>
+            </m:rPr>
+            <w:rPr>
+              <w:rFonts w:ascii="Cambria Math" w:hAnsi="Cambria Math"/>
+            </w:rPr>
+            <m:t>)</m:t>
+          </m:r>
+        </m:oMath>
+      </m:oMathPara>
+    </w:p>
+    <w:p>
+      <w:r>
+        <w:t xml:space="preserve">Egyszerűbben úgy tudnánk elképzelni a fenti számítást, mint a kézi osztás (long </w:t>
+      </w:r>
+      <w:proofErr w:type="spellStart"/>
+      <w:r>
+        <w:t>division</w:t>
+      </w:r>
+      <w:proofErr w:type="spellEnd"/>
+      <w:r>
+        <w:t>) műveletsorát. Itt is a legnagyobb helyiértékű számjegytől kezdve folyamatosan alulról közelítjük az eredményünket a valós értékhez. Pontosan ezért itt is megadható a maradék a számítás végén, amivel mindig visszaállítható a pontos eredeti érték.</w:t>
+      </w:r>
+    </w:p>
+    <w:p>
+      <w:pPr>
         <w:pStyle w:val="Cmsor3"/>
       </w:pPr>
       <w:r>
@@ -5820,6 +7376,11 @@
       </w:r>
     </w:p>
     <w:p>
+      <w:r>
+        <w:t>Mivel ez a számtípus csak az előjelek bevezetésében tér el a természetes számoktól, minden művelet erősen épít az abban a típusban definiált függvényekre.</w:t>
+      </w:r>
+    </w:p>
+    <w:p>
       <w:pPr>
         <w:pStyle w:val="Cmsor3"/>
       </w:pPr>
@@ -6451,6 +8012,7 @@
         </w:numPr>
       </w:pPr>
       <w:r>
+        <w:lastRenderedPageBreak/>
         <w:t>kivonás (</w:t>
       </w:r>
       <w:r>
@@ -6493,7 +8055,6 @@
         </w:numPr>
       </w:pPr>
       <w:r>
-        <w:lastRenderedPageBreak/>
         <w:t>osztás (</w:t>
       </w:r>
       <w:r>
@@ -7853,9 +9414,9 @@
     </w:lvl>
   </w:abstractNum>
   <w:abstractNum w:abstractNumId="5" w15:restartNumberingAfterBreak="0">
-    <w:nsid w:val="6CB36125"/>
+    <w:nsid w:val="66230B17"/>
     <w:multiLevelType w:val="hybridMultilevel"/>
-    <w:tmpl w:val="47ACECFC"/>
+    <w:tmpl w:val="3F062B98"/>
     <w:lvl w:ilvl="0" w:tplc="040E0001">
       <w:start w:val="1"/>
       <w:numFmt w:val="bullet"/>
@@ -7965,8 +9526,121 @@
       </w:rPr>
     </w:lvl>
   </w:abstractNum>
+  <w:abstractNum w:abstractNumId="6" w15:restartNumberingAfterBreak="0">
+    <w:nsid w:val="6CB36125"/>
+    <w:multiLevelType w:val="hybridMultilevel"/>
+    <w:tmpl w:val="47ACECFC"/>
+    <w:lvl w:ilvl="0" w:tplc="040E0001">
+      <w:start w:val="1"/>
+      <w:numFmt w:val="bullet"/>
+      <w:lvlText w:val=""/>
+      <w:lvlJc w:val="left"/>
+      <w:pPr>
+        <w:ind w:left="947" w:hanging="360"/>
+      </w:pPr>
+      <w:rPr>
+        <w:rFonts w:ascii="Symbol" w:hAnsi="Symbol" w:hint="default"/>
+      </w:rPr>
+    </w:lvl>
+    <w:lvl w:ilvl="1" w:tplc="040E0003" w:tentative="1">
+      <w:start w:val="1"/>
+      <w:numFmt w:val="bullet"/>
+      <w:lvlText w:val="o"/>
+      <w:lvlJc w:val="left"/>
+      <w:pPr>
+        <w:ind w:left="1667" w:hanging="360"/>
+      </w:pPr>
+      <w:rPr>
+        <w:rFonts w:ascii="Courier New" w:hAnsi="Courier New" w:cs="Courier New" w:hint="default"/>
+      </w:rPr>
+    </w:lvl>
+    <w:lvl w:ilvl="2" w:tplc="040E0005" w:tentative="1">
+      <w:start w:val="1"/>
+      <w:numFmt w:val="bullet"/>
+      <w:lvlText w:val=""/>
+      <w:lvlJc w:val="left"/>
+      <w:pPr>
+        <w:ind w:left="2387" w:hanging="360"/>
+      </w:pPr>
+      <w:rPr>
+        <w:rFonts w:ascii="Wingdings" w:hAnsi="Wingdings" w:hint="default"/>
+      </w:rPr>
+    </w:lvl>
+    <w:lvl w:ilvl="3" w:tplc="040E0001" w:tentative="1">
+      <w:start w:val="1"/>
+      <w:numFmt w:val="bullet"/>
+      <w:lvlText w:val=""/>
+      <w:lvlJc w:val="left"/>
+      <w:pPr>
+        <w:ind w:left="3107" w:hanging="360"/>
+      </w:pPr>
+      <w:rPr>
+        <w:rFonts w:ascii="Symbol" w:hAnsi="Symbol" w:hint="default"/>
+      </w:rPr>
+    </w:lvl>
+    <w:lvl w:ilvl="4" w:tplc="040E0003" w:tentative="1">
+      <w:start w:val="1"/>
+      <w:numFmt w:val="bullet"/>
+      <w:lvlText w:val="o"/>
+      <w:lvlJc w:val="left"/>
+      <w:pPr>
+        <w:ind w:left="3827" w:hanging="360"/>
+      </w:pPr>
+      <w:rPr>
+        <w:rFonts w:ascii="Courier New" w:hAnsi="Courier New" w:cs="Courier New" w:hint="default"/>
+      </w:rPr>
+    </w:lvl>
+    <w:lvl w:ilvl="5" w:tplc="040E0005" w:tentative="1">
+      <w:start w:val="1"/>
+      <w:numFmt w:val="bullet"/>
+      <w:lvlText w:val=""/>
+      <w:lvlJc w:val="left"/>
+      <w:pPr>
+        <w:ind w:left="4547" w:hanging="360"/>
+      </w:pPr>
+      <w:rPr>
+        <w:rFonts w:ascii="Wingdings" w:hAnsi="Wingdings" w:hint="default"/>
+      </w:rPr>
+    </w:lvl>
+    <w:lvl w:ilvl="6" w:tplc="040E0001" w:tentative="1">
+      <w:start w:val="1"/>
+      <w:numFmt w:val="bullet"/>
+      <w:lvlText w:val=""/>
+      <w:lvlJc w:val="left"/>
+      <w:pPr>
+        <w:ind w:left="5267" w:hanging="360"/>
+      </w:pPr>
+      <w:rPr>
+        <w:rFonts w:ascii="Symbol" w:hAnsi="Symbol" w:hint="default"/>
+      </w:rPr>
+    </w:lvl>
+    <w:lvl w:ilvl="7" w:tplc="040E0003" w:tentative="1">
+      <w:start w:val="1"/>
+      <w:numFmt w:val="bullet"/>
+      <w:lvlText w:val="o"/>
+      <w:lvlJc w:val="left"/>
+      <w:pPr>
+        <w:ind w:left="5987" w:hanging="360"/>
+      </w:pPr>
+      <w:rPr>
+        <w:rFonts w:ascii="Courier New" w:hAnsi="Courier New" w:cs="Courier New" w:hint="default"/>
+      </w:rPr>
+    </w:lvl>
+    <w:lvl w:ilvl="8" w:tplc="040E0005" w:tentative="1">
+      <w:start w:val="1"/>
+      <w:numFmt w:val="bullet"/>
+      <w:lvlText w:val=""/>
+      <w:lvlJc w:val="left"/>
+      <w:pPr>
+        <w:ind w:left="6707" w:hanging="360"/>
+      </w:pPr>
+      <w:rPr>
+        <w:rFonts w:ascii="Wingdings" w:hAnsi="Wingdings" w:hint="default"/>
+      </w:rPr>
+    </w:lvl>
+  </w:abstractNum>
   <w:num w:numId="1" w16cid:durableId="789907295">
-    <w:abstractNumId w:val="5"/>
+    <w:abstractNumId w:val="6"/>
   </w:num>
   <w:num w:numId="2" w16cid:durableId="1912694649">
     <w:abstractNumId w:val="4"/>
@@ -7982,6 +9656,9 @@
   </w:num>
   <w:num w:numId="6" w16cid:durableId="1060136177">
     <w:abstractNumId w:val="3"/>
+  </w:num>
+  <w:num w:numId="7" w16cid:durableId="1975480359">
+    <w:abstractNumId w:val="5"/>
   </w:num>
 </w:numbering>
 </file>
@@ -8386,7 +10063,7 @@
   <w:style w:type="paragraph" w:default="1" w:styleId="Norml">
     <w:name w:val="Normal"/>
     <w:qFormat/>
-    <w:rsid w:val="001B48FA"/>
+    <w:rsid w:val="00D4366F"/>
     <w:pPr>
       <w:spacing w:line="360" w:lineRule="auto"/>
       <w:ind w:firstLine="227"/>
@@ -8593,7 +10270,6 @@
   <w:style w:type="character" w:default="1" w:styleId="Bekezdsalapbettpusa">
     <w:name w:val="Default Paragraph Font"/>
     <w:uiPriority w:val="1"/>
-    <w:semiHidden/>
     <w:unhideWhenUsed/>
   </w:style>
   <w:style w:type="table" w:default="1" w:styleId="Normltblzat">

</xml_diff>

<commit_message>
Adding explanation to the Positive and Writable types in the documentation.
</commit_message>
<xml_diff>
--- a/Documentation.docx
+++ b/Documentation.docx
@@ -3275,6 +3275,9 @@
             <m:t>→</m:t>
           </m:r>
           <m:r>
+            <m:rPr>
+              <m:sty m:val="p"/>
+            </m:rPr>
             <w:rPr>
               <w:rFonts w:ascii="Cambria Math" w:eastAsiaTheme="minorEastAsia" w:hAnsi="Cambria Math"/>
             </w:rPr>
@@ -3828,15 +3831,7 @@
         <w:jc w:val="center"/>
       </w:pPr>
       <w:r>
-        <w:t xml:space="preserve">&lt;kép egy 0-nál kisebb számról ami rövidebb mint a </w:t>
-      </w:r>
-      <w:proofErr w:type="spellStart"/>
-      <w:r>
-        <w:t>fractionLength</w:t>
-      </w:r>
-      <w:proofErr w:type="spellEnd"/>
-      <w:r>
-        <w:t>&gt;</w:t>
+        <w:t>&lt;kép egy 0-nál kisebb számról ami rövidebb mint a fractionLength&gt;</w:t>
       </w:r>
     </w:p>
     <w:p>
@@ -4361,13 +4356,8 @@
         <w:t>long</w:t>
       </w:r>
       <w:r>
-        <w:t xml:space="preserve"> </w:t>
-      </w:r>
-      <w:proofErr w:type="spellStart"/>
-      <w:r>
-        <w:t>long</w:t>
-      </w:r>
-      <w:proofErr w:type="spellEnd"/>
+        <w:t xml:space="preserve"> long</w:t>
+      </w:r>
       <w:r>
         <w:t xml:space="preserve"> számtípus</w:t>
       </w:r>
@@ -5698,83 +5688,55 @@
         <w:rPr>
           <w:rFonts w:eastAsiaTheme="minorEastAsia"/>
         </w:rPr>
-        <w:t xml:space="preserve">François </w:t>
-      </w:r>
-      <w:proofErr w:type="spellStart"/>
+        <w:t>François Viète</w:t>
+      </w:r>
       <w:r>
         <w:rPr>
           <w:rFonts w:eastAsiaTheme="minorEastAsia"/>
         </w:rPr>
-        <w:t>Viète</w:t>
-      </w:r>
-      <w:proofErr w:type="spellEnd"/>
+        <w:t>, híres matematikus</w:t>
+      </w:r>
       <w:r>
         <w:rPr>
           <w:rFonts w:eastAsiaTheme="minorEastAsia"/>
         </w:rPr>
-        <w:t>, híres matematikus</w:t>
+        <w:t xml:space="preserve"> által </w:t>
       </w:r>
       <w:r>
         <w:rPr>
           <w:rFonts w:eastAsiaTheme="minorEastAsia"/>
         </w:rPr>
-        <w:t xml:space="preserve"> által </w:t>
+        <w:t xml:space="preserve">kifejlesztett </w:t>
       </w:r>
       <w:r>
         <w:rPr>
           <w:rFonts w:eastAsiaTheme="minorEastAsia"/>
         </w:rPr>
-        <w:t xml:space="preserve">kifejlesztett </w:t>
+        <w:t xml:space="preserve">módszert </w:t>
       </w:r>
       <w:r>
         <w:rPr>
           <w:rFonts w:eastAsiaTheme="minorEastAsia"/>
         </w:rPr>
-        <w:t xml:space="preserve">módszert </w:t>
+        <w:t>alkalmaz a könyvtár</w:t>
       </w:r>
       <w:r>
         <w:rPr>
           <w:rFonts w:eastAsiaTheme="minorEastAsia"/>
         </w:rPr>
-        <w:t>alkalmaz a könyvtár</w:t>
+        <w:t xml:space="preserve">, </w:t>
       </w:r>
       <w:r>
         <w:rPr>
           <w:rFonts w:eastAsiaTheme="minorEastAsia"/>
         </w:rPr>
-        <w:t xml:space="preserve">, </w:t>
+        <w:t xml:space="preserve">amit Viète </w:t>
       </w:r>
       <w:r>
         <w:rPr>
           <w:rFonts w:eastAsiaTheme="minorEastAsia"/>
         </w:rPr>
-        <w:t xml:space="preserve">amit </w:t>
-      </w:r>
-      <w:proofErr w:type="spellStart"/>
-      <w:r>
-        <w:rPr>
-          <w:rFonts w:eastAsiaTheme="minorEastAsia"/>
-        </w:rPr>
-        <w:t>Viète</w:t>
-      </w:r>
-      <w:proofErr w:type="spellEnd"/>
-      <w:r>
-        <w:rPr>
-          <w:rFonts w:eastAsiaTheme="minorEastAsia"/>
-        </w:rPr>
-        <w:t xml:space="preserve"> </w:t>
-      </w:r>
-      <w:r>
-        <w:rPr>
-          <w:rFonts w:eastAsiaTheme="minorEastAsia"/>
-        </w:rPr>
-        <w:t>technik</w:t>
-      </w:r>
-      <w:r>
-        <w:rPr>
-          <w:rFonts w:eastAsiaTheme="minorEastAsia"/>
-        </w:rPr>
-        <w:t>ának is neveznek</w:t>
+        <w:t>technikának is neveznek</w:t>
       </w:r>
       <w:r>
         <w:rPr>
@@ -5872,13 +5834,7 @@
                 <w:rPr>
                   <w:rFonts w:ascii="Cambria Math" w:eastAsiaTheme="minorEastAsia" w:hAnsi="Cambria Math"/>
                 </w:rPr>
-                <m:t>k</m:t>
-              </m:r>
-              <m:r>
-                <w:rPr>
-                  <w:rFonts w:ascii="Cambria Math" w:eastAsiaTheme="minorEastAsia" w:hAnsi="Cambria Math"/>
-                </w:rPr>
-                <m:t>=0</m:t>
+                <m:t>k=0</m:t>
               </m:r>
             </m:sub>
             <m:sup>
@@ -5948,13 +5904,7 @@
                     <w:rPr>
                       <w:rFonts w:ascii="Cambria Math" w:eastAsiaTheme="minorEastAsia" w:hAnsi="Cambria Math"/>
                     </w:rPr>
-                    <m:t>n</m:t>
-                  </m:r>
-                  <m:r>
-                    <w:rPr>
-                      <w:rFonts w:ascii="Cambria Math" w:eastAsiaTheme="minorEastAsia" w:hAnsi="Cambria Math"/>
-                    </w:rPr>
-                    <m:t>-k</m:t>
+                    <m:t>n-k</m:t>
                   </m:r>
                 </m:sup>
               </m:sSup>
@@ -6060,10 +6010,7 @@
         </m:r>
       </m:oMath>
       <w:r>
-        <w:t xml:space="preserve">-nek </w:t>
-      </w:r>
-      <w:r>
-        <w:t>nevezünk</w:t>
+        <w:t>-nek nevezünk</w:t>
       </w:r>
       <w:r>
         <w:t xml:space="preserve"> és</w:t>
@@ -6083,10 +6030,7 @@
         </m:r>
       </m:oMath>
       <w:r>
-        <w:t>. gyökét</w:t>
-      </w:r>
-      <w:r>
-        <w:t>.</w:t>
+        <w:t>. gyökét.</w:t>
       </w:r>
       <w:r>
         <w:t xml:space="preserve"> </w:t>
@@ -6136,19 +6080,7 @@
           <w:rPr>
             <w:rFonts w:ascii="Cambria Math" w:hAnsi="Cambria Math"/>
           </w:rPr>
-          <m:t>, i=0,</m:t>
-        </m:r>
-        <m:r>
-          <w:rPr>
-            <w:rFonts w:ascii="Cambria Math" w:hAnsi="Cambria Math"/>
-          </w:rPr>
-          <m:t xml:space="preserve"> </m:t>
-        </m:r>
-        <m:r>
-          <w:rPr>
-            <w:rFonts w:ascii="Cambria Math" w:hAnsi="Cambria Math"/>
-          </w:rPr>
-          <m:t>1…</m:t>
+          <m:t>, i=0, 1…</m:t>
         </m:r>
       </m:oMath>
       <w:r>
@@ -6317,13 +6249,7 @@
           <w:rPr>
             <w:rFonts w:ascii="Cambria Math" w:eastAsiaTheme="minorEastAsia" w:hAnsi="Cambria Math"/>
           </w:rPr>
-          <m:t>≤</m:t>
-        </m:r>
-        <m:r>
-          <w:rPr>
-            <w:rFonts w:ascii="Cambria Math" w:eastAsiaTheme="minorEastAsia" w:hAnsi="Cambria Math"/>
-          </w:rPr>
-          <m:t>C</m:t>
+          <m:t>≤C</m:t>
         </m:r>
       </m:oMath>
       <w:r>
@@ -6768,13 +6694,7 @@
                 <w:rPr>
                   <w:rFonts w:ascii="Cambria Math" w:hAnsi="Cambria Math"/>
                 </w:rPr>
-                <m:t>n</m:t>
-              </m:r>
-              <m:r>
-                <w:rPr>
-                  <w:rFonts w:ascii="Cambria Math" w:hAnsi="Cambria Math"/>
-                </w:rPr>
-                <m:t>-1</m:t>
+                <m:t>n-1</m:t>
               </m:r>
             </m:sup>
             <m:e>
@@ -7038,15 +6958,7 @@
     </w:p>
     <w:p>
       <w:r>
-        <w:t xml:space="preserve">Egyszerűbben úgy tudnánk elképzelni a fenti számítást, mint a kézi osztás (long </w:t>
-      </w:r>
-      <w:proofErr w:type="spellStart"/>
-      <w:r>
-        <w:t>division</w:t>
-      </w:r>
-      <w:proofErr w:type="spellEnd"/>
-      <w:r>
-        <w:t>) műveletsorát. Itt is a legnagyobb helyiértékű számjegytől kezdve folyamatosan alulról közelítjük az eredményünket a valós értékhez. Pontosan ezért itt is megadható a maradék a számítás végén, amivel mindig visszaállítható a pontos eredeti érték.</w:t>
+        <w:t>Egyszerűbben úgy tudnánk elképzelni a fenti számítást, mint a kézi osztás (long division) műveletsorát. Itt is a legnagyobb helyiértékű számjegytől kezdve folyamatosan alulról közelítjük az eredményünket a valós értékhez. Pontosan ezért itt is megadható a maradék a számítás végén, amivel mindig visszaállítható a pontos eredeti érték.</w:t>
       </w:r>
     </w:p>
     <w:p>
@@ -7765,6 +7677,303 @@
       </w:r>
     </w:p>
     <w:p>
+      <w:r>
+        <w:t>Mivel a pozitív törtszámok leírásához nem kell más, mint a természetes számok használata és egy tizedesvessző bevezetése, így a könyvtár ezt a megközelítést alkalmazza. A műveletek implementálásához a legtöbb esetben elég a természetes számokra definiált műveletek alkalmazása és a tizedesvessző megfelelő mértékű elmozdítása.</w:t>
+      </w:r>
+    </w:p>
+    <w:p>
+      <w:r>
+        <w:rPr>
+          <w:b/>
+          <w:bCs/>
+        </w:rPr>
+        <w:t>Összeadásnál</w:t>
+      </w:r>
+      <w:r>
+        <w:t xml:space="preserve"> kipótoljuk a kevesebb tizedesjegyű tagot nullákkal úgy, hogy végül megegyezzen a tizedes tagok száma mindkét számban, majd elvégezzük a műveletet, figyelmen kívül hagyva, hogy valójában nem egész számokkal dolgozunk. Ezt követően már csak hozzávesszük, hogy hány tizedesjegye is volt az eredeti kipótolt számoknak. Pontosan annyi tizedesjegye lesz az eredményünknek is. A fölösleges nullák eltávolításról a konstruktor gondoskodik.</w:t>
+      </w:r>
+    </w:p>
+    <w:p>
+      <w:pPr>
+        <w:jc w:val="center"/>
+      </w:pPr>
+      <w:r>
+        <w:t>&lt;kép az eljárásról&gt;</w:t>
+      </w:r>
+    </w:p>
+    <w:p>
+      <w:r>
+        <w:rPr>
+          <w:b/>
+          <w:bCs/>
+        </w:rPr>
+        <w:t>Kivonásnál</w:t>
+      </w:r>
+      <w:r>
+        <w:t xml:space="preserve"> hasonlóan járunk el.</w:t>
+      </w:r>
+    </w:p>
+    <w:p>
+      <w:r>
+        <w:rPr>
+          <w:b/>
+          <w:bCs/>
+        </w:rPr>
+        <w:lastRenderedPageBreak/>
+        <w:t>Szorzásnál</w:t>
+      </w:r>
+      <w:r>
+        <w:t xml:space="preserve"> annyival egyszerűbb a helyzet, hogy nem kell kipótolnunk nullákkal egyik tagot sem. A számokat egészként kezelve és összeszorozva megkapjuk a szám törzsét, a tizedesvessző helyét pedig</w:t>
+      </w:r>
+      <w:r>
+        <w:t xml:space="preserve"> helyesen</w:t>
+      </w:r>
+      <w:r>
+        <w:t xml:space="preserve"> a két eredeti szám tizedesjegy számának összege adja meg.</w:t>
+      </w:r>
+    </w:p>
+    <w:p>
+      <w:pPr>
+        <w:jc w:val="center"/>
+      </w:pPr>
+      <w:r>
+        <w:t>&lt;kép az eljárásról&gt;</w:t>
+      </w:r>
+    </w:p>
+    <w:p>
+      <w:r>
+        <w:rPr>
+          <w:b/>
+          <w:bCs/>
+        </w:rPr>
+        <w:t>Osztásnál</w:t>
+      </w:r>
+      <w:r>
+        <w:t xml:space="preserve"> nincs ekkora szerencsénk. Az eljárás elég memóriaigényes abból a szempontból, hogy nem csak a tizedesjegy szám különbségével kell bővítenünk mindkét tagot, de még a kiszámolandó tizedesjegyek számát is bele kell vennünk a bal oldali érték bővítésébe. Minden egyes plusz tizedesjegy egyel nagyobb bővítést jelent.</w:t>
+      </w:r>
+    </w:p>
+    <w:p>
+      <w:pPr>
+        <w:jc w:val="center"/>
+      </w:pPr>
+      <w:r>
+        <w:t>&lt;kép az eljárásról&gt;</w:t>
+      </w:r>
+    </w:p>
+    <w:p>
+      <w:r>
+        <w:rPr>
+          <w:b/>
+          <w:bCs/>
+        </w:rPr>
+        <w:t>Hatványozásnál</w:t>
+      </w:r>
+      <w:r>
+        <w:t xml:space="preserve"> amennyiben a hatványkitevő értéke egész szám, az eredmény tizedesjegy száma </w:t>
+      </w:r>
+      <w:r>
+        <w:t>egyenesen arányos a hatványalap tizedesjegy számának és a hatványkitevő értékének a szorzatával. Észre lehet venni, hogy míg összeadásnál nem változott a tizedesjegy szám, szorzásnál pedig a két tizedesjegy szám összege lett az új érték, addig itt már szorzás szerepel a számításban folytatva a mintát, miszerint egyre összetettebb műveletek esetén fokozatosan gyors</w:t>
+      </w:r>
+      <w:r>
+        <w:t>ul</w:t>
+      </w:r>
+      <w:r>
+        <w:t xml:space="preserve"> a tizedesjegyek számának növekvése.</w:t>
+      </w:r>
+    </w:p>
+    <w:p>
+      <w:r>
+        <w:t>Nem egész hatványkitevő esetén</w:t>
+      </w:r>
+      <w:r>
+        <w:t xml:space="preserve"> viszont</w:t>
+      </w:r>
+      <w:r>
+        <w:t xml:space="preserve"> sajnos</w:t>
+      </w:r>
+      <w:r>
+        <w:t xml:space="preserve"> nem tudjuk alkalmazni az eddigi tizedesvessző mágiát</w:t>
+      </w:r>
+      <w:r>
+        <w:t>.</w:t>
+      </w:r>
+      <w:r>
+        <w:t xml:space="preserve"> Ami viszont lehetséges az az, hogy mégis egész számot csinálunk a törtünkből. Mivel a számtípus csak véges számjegyből álló számokat tud reprezentálni, így ezt kihasználva fel tudjuk írni két szám hányadosaként az eddigi értékünk az alábbi módon:</w:t>
+      </w:r>
+    </w:p>
+    <w:p>
+      <w:pPr>
+        <w:jc w:val="center"/>
+      </w:pPr>
+      <w:r>
+        <w:t>&lt;kép egy törtszám 10^n hányadossal való egészekre hozásáról&gt;</w:t>
+      </w:r>
+    </w:p>
+    <w:p>
+      <w:r>
+        <w:t>Ezzel a módszerrel az eddig a természetes számoknál implementált függvényekkel könnyedén leírható lenne, viszont a számítás annál költségesebb. Hiszen egy tizedesjegy esetén például 10. gyököt, két tizedesjegy esetén pedig már 100. gyököt kellene vonnunk.</w:t>
+      </w:r>
+    </w:p>
+    <w:p>
+      <w:r>
+        <w:t>Egy másik módszerrel viszont gyökvonás használata nélkül megkaphatjuk a helyes eredményt, mégpedig a hatványozás modern definícióit használva</w:t>
+      </w:r>
+      <w:r>
+        <w:t>, miszerint:</w:t>
+      </w:r>
+    </w:p>
+    <w:p>
+      <w:pPr>
+        <w:jc w:val="center"/>
+        <w:rPr>
+          <w:rFonts w:eastAsiaTheme="minorEastAsia"/>
+        </w:rPr>
+      </w:pPr>
+      <m:oMathPara>
+        <m:oMath>
+          <m:sSup>
+            <m:sSupPr>
+              <m:ctrlPr>
+                <w:rPr>
+                  <w:rFonts w:ascii="Cambria Math" w:hAnsi="Cambria Math"/>
+                  <w:i/>
+                </w:rPr>
+              </m:ctrlPr>
+            </m:sSupPr>
+            <m:e>
+              <m:r>
+                <w:rPr>
+                  <w:rFonts w:ascii="Cambria Math" w:hAnsi="Cambria Math"/>
+                </w:rPr>
+                <m:t>x</m:t>
+              </m:r>
+            </m:e>
+            <m:sup>
+              <m:r>
+                <w:rPr>
+                  <w:rFonts w:ascii="Cambria Math" w:hAnsi="Cambria Math"/>
+                </w:rPr>
+                <m:t>a</m:t>
+              </m:r>
+            </m:sup>
+          </m:sSup>
+          <m:r>
+            <w:rPr>
+              <w:rFonts w:ascii="Cambria Math" w:hAnsi="Cambria Math"/>
+            </w:rPr>
+            <m:t>=</m:t>
+          </m:r>
+          <m:func>
+            <m:funcPr>
+              <m:ctrlPr>
+                <w:rPr>
+                  <w:rFonts w:ascii="Cambria Math" w:hAnsi="Cambria Math"/>
+                </w:rPr>
+              </m:ctrlPr>
+            </m:funcPr>
+            <m:fName>
+              <m:r>
+                <m:rPr>
+                  <m:sty m:val="p"/>
+                </m:rPr>
+                <w:rPr>
+                  <w:rFonts w:ascii="Cambria Math" w:hAnsi="Cambria Math"/>
+                </w:rPr>
+                <m:t>exp</m:t>
+              </m:r>
+            </m:fName>
+            <m:e>
+              <m:d>
+                <m:dPr>
+                  <m:ctrlPr>
+                    <w:rPr>
+                      <w:rFonts w:ascii="Cambria Math" w:hAnsi="Cambria Math"/>
+                      <w:i/>
+                    </w:rPr>
+                  </m:ctrlPr>
+                </m:dPr>
+                <m:e>
+                  <m:r>
+                    <w:rPr>
+                      <w:rFonts w:ascii="Cambria Math" w:hAnsi="Cambria Math"/>
+                    </w:rPr>
+                    <m:t>a×</m:t>
+                  </m:r>
+                  <m:func>
+                    <m:funcPr>
+                      <m:ctrlPr>
+                        <w:rPr>
+                          <w:rFonts w:ascii="Cambria Math" w:hAnsi="Cambria Math"/>
+                        </w:rPr>
+                      </m:ctrlPr>
+                    </m:funcPr>
+                    <m:fName>
+                      <m:r>
+                        <m:rPr>
+                          <m:sty m:val="p"/>
+                        </m:rPr>
+                        <w:rPr>
+                          <w:rFonts w:ascii="Cambria Math" w:hAnsi="Cambria Math"/>
+                        </w:rPr>
+                        <m:t>ln</m:t>
+                      </m:r>
+                      <m:ctrlPr>
+                        <w:rPr>
+                          <w:rFonts w:ascii="Cambria Math" w:hAnsi="Cambria Math"/>
+                          <w:i/>
+                        </w:rPr>
+                      </m:ctrlPr>
+                    </m:fName>
+                    <m:e>
+                      <m:d>
+                        <m:dPr>
+                          <m:ctrlPr>
+                            <w:rPr>
+                              <w:rFonts w:ascii="Cambria Math" w:hAnsi="Cambria Math"/>
+                              <w:i/>
+                            </w:rPr>
+                          </m:ctrlPr>
+                        </m:dPr>
+                        <m:e>
+                          <m:r>
+                            <w:rPr>
+                              <w:rFonts w:ascii="Cambria Math" w:hAnsi="Cambria Math"/>
+                            </w:rPr>
+                            <m:t>x</m:t>
+                          </m:r>
+                        </m:e>
+                      </m:d>
+                    </m:e>
+                  </m:func>
+                </m:e>
+              </m:d>
+            </m:e>
+          </m:func>
+          <m:r>
+            <w:rPr>
+              <w:rFonts w:ascii="Cambria Math" w:hAnsi="Cambria Math"/>
+            </w:rPr>
+            <m:t xml:space="preserve">    (x&gt;0</m:t>
+          </m:r>
+          <m:r>
+            <w:rPr>
+              <w:rFonts w:ascii="Cambria Math" w:eastAsiaTheme="minorEastAsia" w:hAnsi="Cambria Math"/>
+            </w:rPr>
+            <m:t>)</m:t>
+          </m:r>
+        </m:oMath>
+      </m:oMathPara>
+    </w:p>
+    <w:p>
+      <w:r>
+        <w:t xml:space="preserve">Ez a számítási módszer már minden pozitív szám esetén működik a logaritmus függvény folytonosságából adódóan, viszont azt jelentené, hogy szükségünk van exponenciális függvény és természetes alapú logaritmus implementációkra is. A racionális számok definiálásánál még </w:t>
+      </w:r>
+      <w:r>
+        <w:lastRenderedPageBreak/>
+        <w:t>visszatekintünk erre a problémára, de egyelőre fogadjuk el, hogy jelenleg csak részlegesen van definiálva a hatványozás a számtípusainkra.</w:t>
+      </w:r>
+    </w:p>
+    <w:p>
       <w:pPr>
         <w:pStyle w:val="Cmsor3"/>
       </w:pPr>
@@ -8012,7 +8221,6 @@
         </w:numPr>
       </w:pPr>
       <w:r>
-        <w:lastRenderedPageBreak/>
         <w:t>kivonás (</w:t>
       </w:r>
       <w:r>
@@ -8172,6 +8380,11 @@
       </m:oMath>
       <w:r>
         <w:t>)</w:t>
+      </w:r>
+    </w:p>
+    <w:p>
+      <w:r>
+        <w:t>Ugyanúgy ahogy azt az egész számok definiálásánál tettük, itt is hozzáveszünk egy előjel bitet a pozitív számtípushoz és már kész is az új típus.</w:t>
       </w:r>
     </w:p>
     <w:p>
@@ -8302,6 +8515,7 @@
         </w:numPr>
       </w:pPr>
       <w:r>
+        <w:lastRenderedPageBreak/>
         <w:t>egyenlőség (</w:t>
       </w:r>
       <w:r>
@@ -8577,167 +8791,143 @@
       </w:pPr>
       <w:bookmarkStart w:id="18" w:name="_Toc218619930"/>
       <w:r>
+        <w:t>Számológép megvalósítása</w:t>
+      </w:r>
+      <w:bookmarkEnd w:id="18"/>
+    </w:p>
+    <w:p>
+      <w:pPr>
+        <w:pStyle w:val="Cmsor3"/>
+      </w:pPr>
+      <w:bookmarkStart w:id="19" w:name="_Toc218619931"/>
+      <w:r>
+        <w:t>Parser</w:t>
+      </w:r>
+      <w:bookmarkEnd w:id="19"/>
+    </w:p>
+    <w:p>
+      <w:pPr>
+        <w:pStyle w:val="Cmsor3"/>
+      </w:pPr>
+      <w:bookmarkStart w:id="20" w:name="_Toc218619932"/>
+      <w:r>
+        <w:t>Általános számológép (Standard)</w:t>
+      </w:r>
+      <w:bookmarkEnd w:id="20"/>
+    </w:p>
+    <w:p>
+      <w:pPr>
+        <w:pStyle w:val="Cmsor3"/>
+      </w:pPr>
+      <w:bookmarkStart w:id="21" w:name="_Toc218619933"/>
+      <w:r>
+        <w:t>Euklideszi tér számológép (EuclideanSpace)</w:t>
+      </w:r>
+      <w:bookmarkEnd w:id="21"/>
+    </w:p>
+    <w:p>
+      <w:pPr>
+        <w:pStyle w:val="Cmsor3"/>
+      </w:pPr>
+      <w:bookmarkStart w:id="22" w:name="_Toc218619934"/>
+      <w:r>
+        <w:t>Polinom számológép (Polynomials)</w:t>
+      </w:r>
+      <w:bookmarkEnd w:id="22"/>
+    </w:p>
+    <w:p>
+      <w:pPr>
+        <w:pStyle w:val="Cmsor3"/>
+      </w:pPr>
+      <w:bookmarkStart w:id="23" w:name="_Toc218619935"/>
+      <w:r>
+        <w:t>Integrálközelítés számológép (Integral)</w:t>
+      </w:r>
+      <w:bookmarkEnd w:id="23"/>
+    </w:p>
+    <w:p>
+      <w:pPr>
+        <w:pStyle w:val="Cmsor2"/>
+      </w:pPr>
+      <w:bookmarkStart w:id="24" w:name="_Toc218619936"/>
+      <w:r>
+        <w:t>Vizuális számológép megvalósítása</w:t>
+      </w:r>
+      <w:bookmarkEnd w:id="24"/>
+    </w:p>
+    <w:p>
+      <w:pPr>
+        <w:pStyle w:val="Cmsor3"/>
+      </w:pPr>
+      <w:bookmarkStart w:id="25" w:name="_Toc218619937"/>
+      <w:r>
+        <w:t>Funkciók</w:t>
+      </w:r>
+      <w:bookmarkEnd w:id="25"/>
+    </w:p>
+    <w:p>
+      <w:pPr>
+        <w:pStyle w:val="Cmsor2"/>
+      </w:pPr>
+      <w:bookmarkStart w:id="26" w:name="_Toc218619938"/>
+      <w:r>
+        <w:t>Jövőbeli fejlesztések</w:t>
+      </w:r>
+      <w:bookmarkEnd w:id="26"/>
+    </w:p>
+    <w:p>
+      <w:pPr>
+        <w:pStyle w:val="Cmsor3"/>
+      </w:pPr>
+      <w:bookmarkStart w:id="27" w:name="_Toc218619939"/>
+      <w:r>
+        <w:t>Teljesítményt növelő fejlesztések</w:t>
+      </w:r>
+      <w:bookmarkEnd w:id="27"/>
+    </w:p>
+    <w:p>
+      <w:pPr>
+        <w:pStyle w:val="Cmsor3"/>
+      </w:pPr>
+      <w:bookmarkStart w:id="28" w:name="_Toc218619940"/>
+      <w:r>
+        <w:t>Bővítmények</w:t>
+      </w:r>
+      <w:bookmarkEnd w:id="28"/>
+    </w:p>
+    <w:p>
+      <w:pPr>
+        <w:pStyle w:val="Cmsor3"/>
+      </w:pPr>
+      <w:bookmarkStart w:id="29" w:name="_Toc218619941"/>
+      <w:r>
+        <w:t>Más nyelvekre kiterjesztés</w:t>
+      </w:r>
+      <w:bookmarkEnd w:id="29"/>
+    </w:p>
+    <w:p>
+      <w:pPr>
+        <w:pStyle w:val="Cmsor2"/>
+      </w:pPr>
+      <w:bookmarkStart w:id="30" w:name="_Toc218619942"/>
+      <w:r>
+        <w:t>Köszönetnyilvánítás</w:t>
+      </w:r>
+      <w:bookmarkEnd w:id="30"/>
+    </w:p>
+    <w:p>
+      <w:r>
+        <w:t>Klenovszky Áron – Ötlet és támogatás</w:t>
+      </w:r>
+    </w:p>
+    <w:p>
+      <w:r>
+        <w:t>Lócsi Levente – Témavezetés, matematikai háttér ellenőrzése</w:t>
+      </w:r>
+    </w:p>
+    <w:p>
+      <w:r>
         <w:lastRenderedPageBreak/>
-        <w:t>Számológép megvalósítása</w:t>
-      </w:r>
-      <w:bookmarkEnd w:id="18"/>
-    </w:p>
-    <w:p>
-      <w:pPr>
-        <w:pStyle w:val="Cmsor3"/>
-      </w:pPr>
-      <w:bookmarkStart w:id="19" w:name="_Toc218619931"/>
-      <w:r>
-        <w:t>Parser</w:t>
-      </w:r>
-      <w:bookmarkEnd w:id="19"/>
-    </w:p>
-    <w:p>
-      <w:pPr>
-        <w:pStyle w:val="Cmsor3"/>
-      </w:pPr>
-      <w:bookmarkStart w:id="20" w:name="_Toc218619932"/>
-      <w:r>
-        <w:t>Általános számológép (Standard)</w:t>
-      </w:r>
-      <w:bookmarkEnd w:id="20"/>
-    </w:p>
-    <w:p>
-      <w:pPr>
-        <w:pStyle w:val="Cmsor3"/>
-      </w:pPr>
-      <w:bookmarkStart w:id="21" w:name="_Toc218619933"/>
-      <w:r>
-        <w:t>Euklideszi tér számológép (</w:t>
-      </w:r>
-      <w:proofErr w:type="spellStart"/>
-      <w:r>
-        <w:t>EuclideanSpace</w:t>
-      </w:r>
-      <w:proofErr w:type="spellEnd"/>
-      <w:r>
-        <w:t>)</w:t>
-      </w:r>
-      <w:bookmarkEnd w:id="21"/>
-    </w:p>
-    <w:p>
-      <w:pPr>
-        <w:pStyle w:val="Cmsor3"/>
-      </w:pPr>
-      <w:bookmarkStart w:id="22" w:name="_Toc218619934"/>
-      <w:r>
-        <w:t>Polinom számológép (</w:t>
-      </w:r>
-      <w:proofErr w:type="spellStart"/>
-      <w:r>
-        <w:t>Polynomials</w:t>
-      </w:r>
-      <w:proofErr w:type="spellEnd"/>
-      <w:r>
-        <w:t>)</w:t>
-      </w:r>
-      <w:bookmarkEnd w:id="22"/>
-    </w:p>
-    <w:p>
-      <w:pPr>
-        <w:pStyle w:val="Cmsor3"/>
-      </w:pPr>
-      <w:bookmarkStart w:id="23" w:name="_Toc218619935"/>
-      <w:r>
-        <w:t>Integrálközelítés számológép (</w:t>
-      </w:r>
-      <w:proofErr w:type="spellStart"/>
-      <w:r>
-        <w:t>Integral</w:t>
-      </w:r>
-      <w:proofErr w:type="spellEnd"/>
-      <w:r>
-        <w:t>)</w:t>
-      </w:r>
-      <w:bookmarkEnd w:id="23"/>
-    </w:p>
-    <w:p>
-      <w:pPr>
-        <w:pStyle w:val="Cmsor2"/>
-      </w:pPr>
-      <w:bookmarkStart w:id="24" w:name="_Toc218619936"/>
-      <w:r>
-        <w:t>Vizuális számológép megvalósítása</w:t>
-      </w:r>
-      <w:bookmarkEnd w:id="24"/>
-    </w:p>
-    <w:p>
-      <w:pPr>
-        <w:pStyle w:val="Cmsor3"/>
-      </w:pPr>
-      <w:bookmarkStart w:id="25" w:name="_Toc218619937"/>
-      <w:r>
-        <w:t>Funkciók</w:t>
-      </w:r>
-      <w:bookmarkEnd w:id="25"/>
-    </w:p>
-    <w:p>
-      <w:pPr>
-        <w:pStyle w:val="Cmsor2"/>
-      </w:pPr>
-      <w:bookmarkStart w:id="26" w:name="_Toc218619938"/>
-      <w:r>
-        <w:t>Jövőbeli fejlesztések</w:t>
-      </w:r>
-      <w:bookmarkEnd w:id="26"/>
-    </w:p>
-    <w:p>
-      <w:pPr>
-        <w:pStyle w:val="Cmsor3"/>
-      </w:pPr>
-      <w:bookmarkStart w:id="27" w:name="_Toc218619939"/>
-      <w:r>
-        <w:t>Teljesítményt növelő fejlesztések</w:t>
-      </w:r>
-      <w:bookmarkEnd w:id="27"/>
-    </w:p>
-    <w:p>
-      <w:pPr>
-        <w:pStyle w:val="Cmsor3"/>
-      </w:pPr>
-      <w:bookmarkStart w:id="28" w:name="_Toc218619940"/>
-      <w:r>
-        <w:t>Bővítmények</w:t>
-      </w:r>
-      <w:bookmarkEnd w:id="28"/>
-    </w:p>
-    <w:p>
-      <w:pPr>
-        <w:pStyle w:val="Cmsor3"/>
-      </w:pPr>
-      <w:bookmarkStart w:id="29" w:name="_Toc218619941"/>
-      <w:r>
-        <w:t>Más nyelvekre kiterjesztés</w:t>
-      </w:r>
-      <w:bookmarkEnd w:id="29"/>
-    </w:p>
-    <w:p>
-      <w:pPr>
-        <w:pStyle w:val="Cmsor2"/>
-      </w:pPr>
-      <w:bookmarkStart w:id="30" w:name="_Toc218619942"/>
-      <w:r>
-        <w:t>Köszönetnyilvánítás</w:t>
-      </w:r>
-      <w:bookmarkEnd w:id="30"/>
-    </w:p>
-    <w:p>
-      <w:r>
-        <w:t>Klenovszky Áron – Ötlet és támogatás</w:t>
-      </w:r>
-    </w:p>
-    <w:p>
-      <w:r>
-        <w:t>Lócsi Levente – Témavezetés, matematikai háttér ellenőrzése</w:t>
-      </w:r>
-    </w:p>
-    <w:p>
-      <w:r>
         <w:t>Török Bálint Bence – Kutatásbeli segítség</w:t>
       </w:r>
     </w:p>
@@ -10063,7 +10253,7 @@
   <w:style w:type="paragraph" w:default="1" w:styleId="Norml">
     <w:name w:val="Normal"/>
     <w:qFormat/>
-    <w:rsid w:val="00D4366F"/>
+    <w:rsid w:val="009E62A8"/>
     <w:pPr>
       <w:spacing w:line="360" w:lineRule="auto"/>
       <w:ind w:firstLine="227"/>
@@ -10081,11 +10271,12 @@
     <w:link w:val="Cmsor1Char"/>
     <w:uiPriority w:val="9"/>
     <w:qFormat/>
-    <w:rsid w:val="00A521B8"/>
+    <w:rsid w:val="00CD5C39"/>
     <w:pPr>
       <w:keepNext/>
       <w:keepLines/>
       <w:spacing w:before="360" w:after="480"/>
+      <w:ind w:firstLine="0"/>
       <w:outlineLvl w:val="0"/>
     </w:pPr>
     <w:rPr>
@@ -10102,11 +10293,12 @@
     <w:uiPriority w:val="9"/>
     <w:unhideWhenUsed/>
     <w:qFormat/>
-    <w:rsid w:val="00A80AD3"/>
+    <w:rsid w:val="00CD5C39"/>
     <w:pPr>
       <w:keepNext/>
       <w:keepLines/>
       <w:spacing w:before="160" w:after="80"/>
+      <w:ind w:firstLine="0"/>
       <w:outlineLvl w:val="1"/>
     </w:pPr>
     <w:rPr>
@@ -10123,11 +10315,12 @@
     <w:uiPriority w:val="9"/>
     <w:unhideWhenUsed/>
     <w:qFormat/>
-    <w:rsid w:val="008D1B23"/>
+    <w:rsid w:val="00CD5C39"/>
     <w:pPr>
       <w:keepNext/>
       <w:keepLines/>
       <w:spacing w:before="160" w:after="80"/>
+      <w:ind w:firstLine="0"/>
       <w:outlineLvl w:val="2"/>
     </w:pPr>
     <w:rPr>
@@ -10270,6 +10463,7 @@
   <w:style w:type="character" w:default="1" w:styleId="Bekezdsalapbettpusa">
     <w:name w:val="Default Paragraph Font"/>
     <w:uiPriority w:val="1"/>
+    <w:semiHidden/>
     <w:unhideWhenUsed/>
   </w:style>
   <w:style w:type="table" w:default="1" w:styleId="Normltblzat">
@@ -10298,7 +10492,7 @@
     <w:basedOn w:val="Bekezdsalapbettpusa"/>
     <w:link w:val="Cmsor1"/>
     <w:uiPriority w:val="9"/>
-    <w:rsid w:val="00A521B8"/>
+    <w:rsid w:val="00CD5C39"/>
     <w:rPr>
       <w:rFonts w:ascii="Times New Roman" w:eastAsiaTheme="majorEastAsia" w:hAnsi="Times New Roman" w:cstheme="majorBidi"/>
       <w:sz w:val="40"/>
@@ -10310,7 +10504,7 @@
     <w:basedOn w:val="Bekezdsalapbettpusa"/>
     <w:link w:val="Cmsor2"/>
     <w:uiPriority w:val="9"/>
-    <w:rsid w:val="00A80AD3"/>
+    <w:rsid w:val="00CD5C39"/>
     <w:rPr>
       <w:rFonts w:ascii="Times New Roman" w:eastAsiaTheme="majorEastAsia" w:hAnsi="Times New Roman" w:cstheme="majorBidi"/>
       <w:sz w:val="32"/>
@@ -10322,7 +10516,7 @@
     <w:basedOn w:val="Bekezdsalapbettpusa"/>
     <w:link w:val="Cmsor3"/>
     <w:uiPriority w:val="9"/>
-    <w:rsid w:val="008D1B23"/>
+    <w:rsid w:val="00CD5C39"/>
     <w:rPr>
       <w:rFonts w:ascii="Times New Roman" w:eastAsiaTheme="majorEastAsia" w:hAnsi="Times New Roman" w:cstheme="majorBidi"/>
       <w:sz w:val="28"/>
@@ -10608,7 +10802,6 @@
     <w:rsid w:val="008B2B65"/>
     <w:pPr>
       <w:spacing w:before="240" w:after="0" w:line="259" w:lineRule="auto"/>
-      <w:ind w:firstLine="0"/>
       <w:jc w:val="left"/>
       <w:outlineLvl w:val="9"/>
     </w:pPr>

</xml_diff>

<commit_message>
Starting to explain the binary splitting algorithm of the Rational type in the documentation.
</commit_message>
<xml_diff>
--- a/Documentation.docx
+++ b/Documentation.docx
@@ -3831,7 +3831,15 @@
         <w:jc w:val="center"/>
       </w:pPr>
       <w:r>
-        <w:t>&lt;kép egy 0-nál kisebb számról ami rövidebb mint a fractionLength&gt;</w:t>
+        <w:t xml:space="preserve">&lt;kép egy 0-nál kisebb számról ami rövidebb mint a </w:t>
+      </w:r>
+      <w:proofErr w:type="spellStart"/>
+      <w:r>
+        <w:t>fractionLength</w:t>
+      </w:r>
+      <w:proofErr w:type="spellEnd"/>
+      <w:r>
+        <w:t>&gt;</w:t>
       </w:r>
     </w:p>
     <w:p>
@@ -4356,8 +4364,13 @@
         <w:t>long</w:t>
       </w:r>
       <w:r>
-        <w:t xml:space="preserve"> long</w:t>
-      </w:r>
+        <w:t xml:space="preserve"> </w:t>
+      </w:r>
+      <w:proofErr w:type="spellStart"/>
+      <w:r>
+        <w:t>long</w:t>
+      </w:r>
+      <w:proofErr w:type="spellEnd"/>
       <w:r>
         <w:t xml:space="preserve"> számtípus</w:t>
       </w:r>
@@ -5688,12 +5701,20 @@
         <w:rPr>
           <w:rFonts w:eastAsiaTheme="minorEastAsia"/>
         </w:rPr>
-        <w:t>François Viète</w:t>
-      </w:r>
+        <w:t xml:space="preserve">François </w:t>
+      </w:r>
+      <w:proofErr w:type="spellStart"/>
       <w:r>
         <w:rPr>
           <w:rFonts w:eastAsiaTheme="minorEastAsia"/>
         </w:rPr>
+        <w:t>Viète</w:t>
+      </w:r>
+      <w:proofErr w:type="spellEnd"/>
+      <w:r>
+        <w:rPr>
+          <w:rFonts w:eastAsiaTheme="minorEastAsia"/>
+        </w:rPr>
         <w:t>, híres matematikus</w:t>
       </w:r>
       <w:r>
@@ -5730,7 +5751,21 @@
         <w:rPr>
           <w:rFonts w:eastAsiaTheme="minorEastAsia"/>
         </w:rPr>
-        <w:t xml:space="preserve">amit Viète </w:t>
+        <w:t xml:space="preserve">amit </w:t>
+      </w:r>
+      <w:proofErr w:type="spellStart"/>
+      <w:r>
+        <w:rPr>
+          <w:rFonts w:eastAsiaTheme="minorEastAsia"/>
+        </w:rPr>
+        <w:t>Viète</w:t>
+      </w:r>
+      <w:proofErr w:type="spellEnd"/>
+      <w:r>
+        <w:rPr>
+          <w:rFonts w:eastAsiaTheme="minorEastAsia"/>
+        </w:rPr>
+        <w:t xml:space="preserve"> </w:t>
       </w:r>
       <w:r>
         <w:rPr>
@@ -6958,7 +6993,21 @@
     </w:p>
     <w:p>
       <w:r>
-        <w:t>Egyszerűbben úgy tudnánk elképzelni a fenti számítást, mint a kézi osztás (long division) műveletsorát. Itt is a legnagyobb helyiértékű számjegytől kezdve folyamatosan alulról közelítjük az eredményünket a valós értékhez. Pontosan ezért itt is megadható a maradék a számítás végén, amivel mindig visszaállítható a pontos eredeti érték.</w:t>
+        <w:t xml:space="preserve">Egyszerűbben úgy tudnánk elképzelni a fenti számítást, mint a kézi osztás (long </w:t>
+      </w:r>
+      <w:proofErr w:type="spellStart"/>
+      <w:r>
+        <w:t>division</w:t>
+      </w:r>
+      <w:proofErr w:type="spellEnd"/>
+      <w:r>
+        <w:t xml:space="preserve">) műveletsorát. Itt is a legnagyobb helyiértékű számjegytől kezdve folyamatosan alulról közelítjük az eredményünket a valós értékhez. </w:t>
+      </w:r>
+      <w:r>
+        <w:t>Éppen</w:t>
+      </w:r>
+      <w:r>
+        <w:t xml:space="preserve"> ezért itt is megadható a maradék a számítás végén, amivel mindig visszaállítható a pontos eredeti érték.</w:t>
       </w:r>
     </w:p>
     <w:p>
@@ -7723,13 +7772,7 @@
         <w:t>Szorzásnál</w:t>
       </w:r>
       <w:r>
-        <w:t xml:space="preserve"> annyival egyszerűbb a helyzet, hogy nem kell kipótolnunk nullákkal egyik tagot sem. A számokat egészként kezelve és összeszorozva megkapjuk a szám törzsét, a tizedesvessző helyét pedig</w:t>
-      </w:r>
-      <w:r>
-        <w:t xml:space="preserve"> helyesen</w:t>
-      </w:r>
-      <w:r>
-        <w:t xml:space="preserve"> a két eredeti szám tizedesjegy számának összege adja meg.</w:t>
+        <w:t xml:space="preserve"> annyival egyszerűbb a helyzet, hogy nem kell kipótolnunk nullákkal egyik tagot sem. A számokat egészként kezelve és összeszorozva megkapjuk a szám törzsét, a tizedesvessző helyét pedig helyesen a két eredeti szám tizedesjegy számának összege adja meg.</w:t>
       </w:r>
     </w:p>
     <w:p>
@@ -7966,11 +8009,17 @@
     </w:p>
     <w:p>
       <w:r>
-        <w:t xml:space="preserve">Ez a számítási módszer már minden pozitív szám esetén működik a logaritmus függvény folytonosságából adódóan, viszont azt jelentené, hogy szükségünk van exponenciális függvény és természetes alapú logaritmus implementációkra is. A racionális számok definiálásánál még </w:t>
+        <w:t>Ez a számítási módszer már minden pozitív szám esetén működik a logaritmus</w:t>
+      </w:r>
+      <w:r>
+        <w:t xml:space="preserve"> és az exponenciális</w:t>
+      </w:r>
+      <w:r>
+        <w:t xml:space="preserve"> függvény folytonosságából adódóan, viszont azt jelentené, hogy szükségünk van exponenciális függvény és természetes alapú logaritmus implementációkra is. A racionális </w:t>
       </w:r>
       <w:r>
         <w:lastRenderedPageBreak/>
-        <w:t>visszatekintünk erre a problémára, de egyelőre fogadjuk el, hogy jelenleg csak részlegesen van definiálva a hatványozás a számtípusainkra.</w:t>
+        <w:t>számok definiálásánál még visszatekintünk erre a problémára, de egyelőre fogadjuk el, hogy jelenleg csak részlegesen van definiálva a hatványozás a számtípusainkra.</w:t>
       </w:r>
     </w:p>
     <w:p>
@@ -8384,7 +8433,13 @@
     </w:p>
     <w:p>
       <w:r>
-        <w:t>Ugyanúgy ahogy azt az egész számok definiálásánál tettük, itt is hozzáveszünk egy előjel bitet a pozitív számtípushoz és már kész is az új típus.</w:t>
+        <w:t>Ugyanúgy ahogy azt az egész számok definiálásánál tettük, itt is hozzáveszünk egy előjel</w:t>
+      </w:r>
+      <w:r>
+        <w:t>et</w:t>
+      </w:r>
+      <w:r>
+        <w:t xml:space="preserve"> bitet a pozitív számtípushoz és már kész is az új típus.</w:t>
       </w:r>
     </w:p>
     <w:p>
@@ -8787,10 +8842,2000 @@
     </w:p>
     <w:p>
       <w:pPr>
+        <w:pStyle w:val="Listaszerbekezds"/>
+        <w:numPr>
+          <w:ilvl w:val="0"/>
+          <w:numId w:val="2"/>
+        </w:numPr>
+      </w:pPr>
+      <w:r>
+        <w:t>pi (</w:t>
+      </w:r>
+      <m:oMath>
+        <m:r>
+          <w:rPr>
+            <w:rFonts w:ascii="Cambria Math" w:hAnsi="Cambria Math"/>
+          </w:rPr>
+          <m:t>π</m:t>
+        </m:r>
+      </m:oMath>
+      <w:r>
+        <w:t>)</w:t>
+      </w:r>
+    </w:p>
+    <w:p>
+      <w:pPr>
+        <w:pStyle w:val="Listaszerbekezds"/>
+        <w:numPr>
+          <w:ilvl w:val="0"/>
+          <w:numId w:val="2"/>
+        </w:numPr>
+      </w:pPr>
+      <w:r>
+        <w:t>e szám (</w:t>
+      </w:r>
+      <m:oMath>
+        <m:r>
+          <w:rPr>
+            <w:rFonts w:ascii="Cambria Math" w:hAnsi="Cambria Math"/>
+          </w:rPr>
+          <m:t>e</m:t>
+        </m:r>
+      </m:oMath>
+      <w:r>
+        <w:t>)</w:t>
+      </w:r>
+    </w:p>
+    <w:p>
+      <w:pPr>
+        <w:pStyle w:val="Listaszerbekezds"/>
+        <w:numPr>
+          <w:ilvl w:val="0"/>
+          <w:numId w:val="2"/>
+        </w:numPr>
+      </w:pPr>
+      <w:r>
+        <w:t>exponenciális függvény (</w:t>
+      </w:r>
+      <m:oMath>
+        <m:r>
+          <w:rPr>
+            <w:rFonts w:ascii="Cambria Math" w:hAnsi="Cambria Math"/>
+          </w:rPr>
+          <m:t>exp</m:t>
+        </m:r>
+      </m:oMath>
+      <w:r>
+        <w:rPr>
+          <w:rFonts w:eastAsiaTheme="minorEastAsia"/>
+        </w:rPr>
+        <w:t xml:space="preserve"> vagy </w:t>
+      </w:r>
+      <m:oMath>
+        <m:sSup>
+          <m:sSupPr>
+            <m:ctrlPr>
+              <w:rPr>
+                <w:rFonts w:ascii="Cambria Math" w:eastAsiaTheme="minorEastAsia" w:hAnsi="Cambria Math"/>
+                <w:i/>
+              </w:rPr>
+            </m:ctrlPr>
+          </m:sSupPr>
+          <m:e>
+            <m:r>
+              <w:rPr>
+                <w:rFonts w:ascii="Cambria Math" w:eastAsiaTheme="minorEastAsia" w:hAnsi="Cambria Math"/>
+              </w:rPr>
+              <m:t>e</m:t>
+            </m:r>
+          </m:e>
+          <m:sup>
+            <m:r>
+              <w:rPr>
+                <w:rFonts w:ascii="Cambria Math" w:eastAsiaTheme="minorEastAsia" w:hAnsi="Cambria Math"/>
+              </w:rPr>
+              <m:t>x</m:t>
+            </m:r>
+          </m:sup>
+        </m:sSup>
+      </m:oMath>
+      <w:r>
+        <w:t>)</w:t>
+      </w:r>
+    </w:p>
+    <w:p>
+      <w:pPr>
+        <w:pStyle w:val="Listaszerbekezds"/>
+        <w:numPr>
+          <w:ilvl w:val="0"/>
+          <w:numId w:val="2"/>
+        </w:numPr>
+      </w:pPr>
+      <w:r>
+        <w:t>természetes alapú logaritmus (</w:t>
+      </w:r>
+      <m:oMath>
+        <m:r>
+          <w:rPr>
+            <w:rFonts w:ascii="Cambria Math" w:hAnsi="Cambria Math"/>
+          </w:rPr>
+          <m:t>ln</m:t>
+        </m:r>
+      </m:oMath>
+      <w:r>
+        <w:t>)</w:t>
+      </w:r>
+    </w:p>
+    <w:p>
+      <w:pPr>
+        <w:pStyle w:val="Listaszerbekezds"/>
+        <w:numPr>
+          <w:ilvl w:val="0"/>
+          <w:numId w:val="2"/>
+        </w:numPr>
+      </w:pPr>
+      <w:r>
+        <w:t>szinusz (</w:t>
+      </w:r>
+      <m:oMath>
+        <m:r>
+          <w:rPr>
+            <w:rFonts w:ascii="Cambria Math" w:hAnsi="Cambria Math"/>
+          </w:rPr>
+          <m:t>sin</m:t>
+        </m:r>
+      </m:oMath>
+      <w:r>
+        <w:t>)</w:t>
+      </w:r>
+    </w:p>
+    <w:p>
+      <w:pPr>
+        <w:pStyle w:val="Listaszerbekezds"/>
+        <w:numPr>
+          <w:ilvl w:val="0"/>
+          <w:numId w:val="2"/>
+        </w:numPr>
+      </w:pPr>
+      <w:r>
+        <w:t>koszinusz (cos)</w:t>
+      </w:r>
+    </w:p>
+    <w:p>
+      <w:r>
+        <w:t>Ennél a típusnál egyből feltűnhet, hogy szignifikánsan több függvénye van, mint a többi típusnak. Ez azért van, mert ez a típus küszöböli ki leginkább a lebegőpontos számoknál tapasztalt problémákat.</w:t>
+      </w:r>
+    </w:p>
+    <w:p>
+      <w:r>
+        <w:t xml:space="preserve">A racionális számok előnye, hogy mivel a szám két részből – számlálóból és nevezőből – áll, az </w:t>
+      </w:r>
+      <w:r>
+        <w:rPr>
+          <w:b/>
+          <w:bCs/>
+        </w:rPr>
+        <w:t>osztás</w:t>
+      </w:r>
+      <w:r>
+        <w:t xml:space="preserve"> műveletét felírhatjuk egy reciprokkal szorzásként az alábbi módon:</w:t>
+      </w:r>
+    </w:p>
+    <w:p>
+      <w:pPr>
+        <w:rPr>
+          <w:rFonts w:eastAsiaTheme="minorEastAsia"/>
+        </w:rPr>
+      </w:pPr>
+      <m:oMathPara>
+        <m:oMath>
+          <m:f>
+            <m:fPr>
+              <m:ctrlPr>
+                <w:rPr>
+                  <w:rFonts w:ascii="Cambria Math" w:hAnsi="Cambria Math"/>
+                  <w:i/>
+                </w:rPr>
+              </m:ctrlPr>
+            </m:fPr>
+            <m:num>
+              <m:r>
+                <w:rPr>
+                  <w:rFonts w:ascii="Cambria Math" w:hAnsi="Cambria Math"/>
+                </w:rPr>
+                <m:t>a</m:t>
+              </m:r>
+            </m:num>
+            <m:den>
+              <m:r>
+                <w:rPr>
+                  <w:rFonts w:ascii="Cambria Math" w:hAnsi="Cambria Math"/>
+                </w:rPr>
+                <m:t>b</m:t>
+              </m:r>
+            </m:den>
+          </m:f>
+          <m:r>
+            <w:rPr>
+              <w:rFonts w:ascii="Cambria Math" w:hAnsi="Cambria Math"/>
+            </w:rPr>
+            <m:t>/</m:t>
+          </m:r>
+          <m:f>
+            <m:fPr>
+              <m:ctrlPr>
+                <w:rPr>
+                  <w:rFonts w:ascii="Cambria Math" w:eastAsiaTheme="minorEastAsia" w:hAnsi="Cambria Math"/>
+                  <w:i/>
+                </w:rPr>
+              </m:ctrlPr>
+            </m:fPr>
+            <m:num>
+              <m:r>
+                <w:rPr>
+                  <w:rFonts w:ascii="Cambria Math" w:eastAsiaTheme="minorEastAsia" w:hAnsi="Cambria Math"/>
+                </w:rPr>
+                <m:t>c</m:t>
+              </m:r>
+            </m:num>
+            <m:den>
+              <m:r>
+                <w:rPr>
+                  <w:rFonts w:ascii="Cambria Math" w:eastAsiaTheme="minorEastAsia" w:hAnsi="Cambria Math"/>
+                </w:rPr>
+                <m:t>d</m:t>
+              </m:r>
+            </m:den>
+          </m:f>
+          <m:r>
+            <w:rPr>
+              <w:rFonts w:ascii="Cambria Math" w:eastAsiaTheme="minorEastAsia" w:hAnsi="Cambria Math"/>
+            </w:rPr>
+            <m:t xml:space="preserve"> =</m:t>
+          </m:r>
+          <m:f>
+            <m:fPr>
+              <m:ctrlPr>
+                <w:rPr>
+                  <w:rFonts w:ascii="Cambria Math" w:eastAsiaTheme="minorEastAsia" w:hAnsi="Cambria Math"/>
+                  <w:i/>
+                </w:rPr>
+              </m:ctrlPr>
+            </m:fPr>
+            <m:num>
+              <m:r>
+                <w:rPr>
+                  <w:rFonts w:ascii="Cambria Math" w:eastAsiaTheme="minorEastAsia" w:hAnsi="Cambria Math"/>
+                </w:rPr>
+                <m:t>a</m:t>
+              </m:r>
+            </m:num>
+            <m:den>
+              <m:r>
+                <w:rPr>
+                  <w:rFonts w:ascii="Cambria Math" w:eastAsiaTheme="minorEastAsia" w:hAnsi="Cambria Math"/>
+                </w:rPr>
+                <m:t>b</m:t>
+              </m:r>
+            </m:den>
+          </m:f>
+          <m:r>
+            <w:rPr>
+              <w:rFonts w:ascii="Cambria Math" w:eastAsiaTheme="minorEastAsia" w:hAnsi="Cambria Math"/>
+            </w:rPr>
+            <m:t>×</m:t>
+          </m:r>
+          <m:f>
+            <m:fPr>
+              <m:ctrlPr>
+                <w:rPr>
+                  <w:rFonts w:ascii="Cambria Math" w:eastAsiaTheme="minorEastAsia" w:hAnsi="Cambria Math"/>
+                  <w:i/>
+                </w:rPr>
+              </m:ctrlPr>
+            </m:fPr>
+            <m:num>
+              <m:r>
+                <w:rPr>
+                  <w:rFonts w:ascii="Cambria Math" w:eastAsiaTheme="minorEastAsia" w:hAnsi="Cambria Math"/>
+                </w:rPr>
+                <m:t>d</m:t>
+              </m:r>
+              <m:ctrlPr>
+                <w:rPr>
+                  <w:rFonts w:ascii="Cambria Math" w:hAnsi="Cambria Math"/>
+                  <w:i/>
+                </w:rPr>
+              </m:ctrlPr>
+            </m:num>
+            <m:den>
+              <m:r>
+                <w:rPr>
+                  <w:rFonts w:ascii="Cambria Math" w:hAnsi="Cambria Math"/>
+                </w:rPr>
+                <m:t>c</m:t>
+              </m:r>
+            </m:den>
+          </m:f>
+          <m:r>
+            <w:rPr>
+              <w:rFonts w:ascii="Cambria Math" w:eastAsiaTheme="minorEastAsia" w:hAnsi="Cambria Math"/>
+            </w:rPr>
+            <m:t>=</m:t>
+          </m:r>
+          <m:f>
+            <m:fPr>
+              <m:ctrlPr>
+                <w:rPr>
+                  <w:rFonts w:ascii="Cambria Math" w:eastAsiaTheme="minorEastAsia" w:hAnsi="Cambria Math"/>
+                  <w:i/>
+                </w:rPr>
+              </m:ctrlPr>
+            </m:fPr>
+            <m:num>
+              <m:r>
+                <w:rPr>
+                  <w:rFonts w:ascii="Cambria Math" w:eastAsiaTheme="minorEastAsia" w:hAnsi="Cambria Math"/>
+                </w:rPr>
+                <m:t>a×d</m:t>
+              </m:r>
+            </m:num>
+            <m:den>
+              <m:r>
+                <w:rPr>
+                  <w:rFonts w:ascii="Cambria Math" w:eastAsiaTheme="minorEastAsia" w:hAnsi="Cambria Math"/>
+                </w:rPr>
+                <m:t>b×c</m:t>
+              </m:r>
+            </m:den>
+          </m:f>
+        </m:oMath>
+      </m:oMathPara>
+    </w:p>
+    <w:p>
+      <w:r>
+        <w:t>Mivel a szorzás numerikusan stabil művelet, az egyetlen komponens, ami numerikus instabilitást okozhat a számítás során az a gyökvonás. Erre ez a típus még nem nyújt megoldást.</w:t>
+      </w:r>
+    </w:p>
+    <w:p>
+      <w:pPr>
+        <w:rPr>
+          <w:rFonts w:eastAsiaTheme="minorEastAsia"/>
+          <w:iCs/>
+        </w:rPr>
+      </w:pPr>
+      <w:r>
+        <w:rPr>
+          <w:b/>
+          <w:bCs/>
+        </w:rPr>
+        <w:t>Hatványozásnál</w:t>
+      </w:r>
+      <w:r>
+        <w:t xml:space="preserve"> a pozitív típus esetén említett</w:t>
+      </w:r>
+      <w:r>
+        <w:rPr>
+          <w:rFonts w:ascii="Cambria Math" w:hAnsi="Cambria Math"/>
+          <w:i/>
+        </w:rPr>
+        <w:t xml:space="preserve"> </w:t>
+      </w:r>
+      <m:oMath>
+        <m:sSup>
+          <m:sSupPr>
+            <m:ctrlPr>
+              <w:rPr>
+                <w:rFonts w:ascii="Cambria Math" w:hAnsi="Cambria Math"/>
+                <w:i/>
+              </w:rPr>
+            </m:ctrlPr>
+          </m:sSupPr>
+          <m:e>
+            <m:r>
+              <w:rPr>
+                <w:rFonts w:ascii="Cambria Math" w:hAnsi="Cambria Math"/>
+              </w:rPr>
+              <m:t>x</m:t>
+            </m:r>
+          </m:e>
+          <m:sup>
+            <m:r>
+              <w:rPr>
+                <w:rFonts w:ascii="Cambria Math" w:hAnsi="Cambria Math"/>
+              </w:rPr>
+              <m:t>a</m:t>
+            </m:r>
+          </m:sup>
+        </m:sSup>
+        <m:r>
+          <w:rPr>
+            <w:rFonts w:ascii="Cambria Math" w:hAnsi="Cambria Math"/>
+          </w:rPr>
+          <m:t>=</m:t>
+        </m:r>
+        <m:func>
+          <m:funcPr>
+            <m:ctrlPr>
+              <w:rPr>
+                <w:rFonts w:ascii="Cambria Math" w:hAnsi="Cambria Math"/>
+              </w:rPr>
+            </m:ctrlPr>
+          </m:funcPr>
+          <m:fName>
+            <m:r>
+              <m:rPr>
+                <m:sty m:val="p"/>
+              </m:rPr>
+              <w:rPr>
+                <w:rFonts w:ascii="Cambria Math" w:hAnsi="Cambria Math"/>
+              </w:rPr>
+              <m:t>exp</m:t>
+            </m:r>
+          </m:fName>
+          <m:e>
+            <m:d>
+              <m:dPr>
+                <m:ctrlPr>
+                  <w:rPr>
+                    <w:rFonts w:ascii="Cambria Math" w:hAnsi="Cambria Math"/>
+                    <w:i/>
+                  </w:rPr>
+                </m:ctrlPr>
+              </m:dPr>
+              <m:e>
+                <m:r>
+                  <w:rPr>
+                    <w:rFonts w:ascii="Cambria Math" w:hAnsi="Cambria Math"/>
+                  </w:rPr>
+                  <m:t>a×</m:t>
+                </m:r>
+                <m:func>
+                  <m:funcPr>
+                    <m:ctrlPr>
+                      <w:rPr>
+                        <w:rFonts w:ascii="Cambria Math" w:hAnsi="Cambria Math"/>
+                      </w:rPr>
+                    </m:ctrlPr>
+                  </m:funcPr>
+                  <m:fName>
+                    <m:r>
+                      <m:rPr>
+                        <m:sty m:val="p"/>
+                      </m:rPr>
+                      <w:rPr>
+                        <w:rFonts w:ascii="Cambria Math" w:hAnsi="Cambria Math"/>
+                      </w:rPr>
+                      <m:t>ln</m:t>
+                    </m:r>
+                    <m:ctrlPr>
+                      <w:rPr>
+                        <w:rFonts w:ascii="Cambria Math" w:hAnsi="Cambria Math"/>
+                        <w:i/>
+                      </w:rPr>
+                    </m:ctrlPr>
+                  </m:fName>
+                  <m:e>
+                    <m:d>
+                      <m:dPr>
+                        <m:ctrlPr>
+                          <w:rPr>
+                            <w:rFonts w:ascii="Cambria Math" w:hAnsi="Cambria Math"/>
+                            <w:i/>
+                          </w:rPr>
+                        </m:ctrlPr>
+                      </m:dPr>
+                      <m:e>
+                        <m:r>
+                          <w:rPr>
+                            <w:rFonts w:ascii="Cambria Math" w:hAnsi="Cambria Math"/>
+                          </w:rPr>
+                          <m:t>x</m:t>
+                        </m:r>
+                      </m:e>
+                    </m:d>
+                  </m:e>
+                </m:func>
+              </m:e>
+            </m:d>
+          </m:e>
+        </m:func>
+      </m:oMath>
+      <w:r>
+        <w:rPr>
+          <w:rFonts w:eastAsiaTheme="minorEastAsia"/>
+          <w:iCs/>
+        </w:rPr>
+        <w:t xml:space="preserve"> képlet itt alkalmazásra kerül.</w:t>
+      </w:r>
+      <w:r>
+        <w:rPr>
+          <w:rFonts w:eastAsiaTheme="minorEastAsia"/>
+          <w:iCs/>
+        </w:rPr>
+        <w:t xml:space="preserve"> Ezáltal az egyetlen hiányosság nem egész negatív szám hatványkitevőknél lép fel, amik esetén az eredmények komplex számok, így érthető módon kerülnek kihagyásra.</w:t>
+      </w:r>
+    </w:p>
+    <w:p>
+      <w:pPr>
+        <w:rPr>
+          <w:rFonts w:eastAsiaTheme="minorEastAsia"/>
+          <w:iCs/>
+        </w:rPr>
+      </w:pPr>
+      <w:r>
+        <w:rPr>
+          <w:rFonts w:eastAsiaTheme="minorEastAsia"/>
+          <w:iCs/>
+        </w:rPr>
+        <w:t>A továbbiak ismertetéséhez</w:t>
+      </w:r>
+      <w:r>
+        <w:rPr>
+          <w:rFonts w:eastAsiaTheme="minorEastAsia"/>
+          <w:iCs/>
+        </w:rPr>
+        <w:t xml:space="preserve"> egy kis kitérőt kell tennünk, mivel</w:t>
+      </w:r>
+      <w:r>
+        <w:rPr>
+          <w:rFonts w:eastAsiaTheme="minorEastAsia"/>
+          <w:iCs/>
+        </w:rPr>
+        <w:t xml:space="preserve"> előismeret szükséges a bináris szétválasztás (</w:t>
+      </w:r>
+      <w:proofErr w:type="spellStart"/>
+      <w:r>
+        <w:rPr>
+          <w:rFonts w:eastAsiaTheme="minorEastAsia"/>
+          <w:iCs/>
+        </w:rPr>
+        <w:t>binary</w:t>
+      </w:r>
+      <w:proofErr w:type="spellEnd"/>
+      <w:r>
+        <w:rPr>
+          <w:rFonts w:eastAsiaTheme="minorEastAsia"/>
+          <w:iCs/>
+        </w:rPr>
+        <w:t xml:space="preserve"> </w:t>
+      </w:r>
+      <w:proofErr w:type="spellStart"/>
+      <w:r>
+        <w:rPr>
+          <w:rFonts w:eastAsiaTheme="minorEastAsia"/>
+          <w:iCs/>
+        </w:rPr>
+        <w:t>splitting</w:t>
+      </w:r>
+      <w:proofErr w:type="spellEnd"/>
+      <w:r>
+        <w:rPr>
+          <w:rFonts w:eastAsiaTheme="minorEastAsia"/>
+          <w:iCs/>
+        </w:rPr>
+        <w:t>) alkalmazásá</w:t>
+      </w:r>
+      <w:r>
+        <w:rPr>
+          <w:rFonts w:eastAsiaTheme="minorEastAsia"/>
+          <w:iCs/>
+        </w:rPr>
+        <w:t>ban</w:t>
+      </w:r>
+      <w:r>
+        <w:rPr>
+          <w:rFonts w:eastAsiaTheme="minorEastAsia"/>
+          <w:iCs/>
+        </w:rPr>
+        <w:t>.</w:t>
+      </w:r>
+      <w:r>
+        <w:rPr>
+          <w:rFonts w:eastAsiaTheme="minorEastAsia"/>
+          <w:iCs/>
+        </w:rPr>
+        <w:t xml:space="preserve"> A módszer minden lineárisan konvergáló végtelen összegsor esetén</w:t>
+      </w:r>
+      <w:r>
+        <w:rPr>
+          <w:rFonts w:eastAsiaTheme="minorEastAsia"/>
+          <w:iCs/>
+        </w:rPr>
+        <w:t xml:space="preserve"> felírható és</w:t>
+      </w:r>
+      <w:r>
+        <w:rPr>
+          <w:rFonts w:eastAsiaTheme="minorEastAsia"/>
+          <w:iCs/>
+        </w:rPr>
+        <w:t xml:space="preserve"> alkalmazható</w:t>
+      </w:r>
+      <w:r>
+        <w:rPr>
+          <w:rFonts w:eastAsiaTheme="minorEastAsia"/>
+          <w:iCs/>
+        </w:rPr>
+        <w:t>,</w:t>
+      </w:r>
+      <w:r>
+        <w:rPr>
+          <w:rFonts w:eastAsiaTheme="minorEastAsia"/>
+          <w:iCs/>
+        </w:rPr>
+        <w:t xml:space="preserve"> ami ráhúzható a következő sablonra:</w:t>
+      </w:r>
+    </w:p>
+    <w:p>
+      <w:pPr>
+        <w:rPr>
+          <w:rFonts w:eastAsiaTheme="minorEastAsia"/>
+          <w:iCs/>
+        </w:rPr>
+      </w:pPr>
+      <m:oMathPara>
+        <m:oMath>
+          <m:r>
+            <w:rPr>
+              <w:rFonts w:ascii="Cambria Math" w:eastAsiaTheme="minorEastAsia" w:hAnsi="Cambria Math"/>
+            </w:rPr>
+            <w:lastRenderedPageBreak/>
+            <m:t>S=</m:t>
+          </m:r>
+          <m:nary>
+            <m:naryPr>
+              <m:chr m:val="∑"/>
+              <m:limLoc m:val="undOvr"/>
+              <m:ctrlPr>
+                <w:rPr>
+                  <w:rFonts w:ascii="Cambria Math" w:eastAsiaTheme="minorEastAsia" w:hAnsi="Cambria Math"/>
+                  <w:i/>
+                  <w:iCs/>
+                </w:rPr>
+              </m:ctrlPr>
+            </m:naryPr>
+            <m:sub>
+              <m:r>
+                <w:rPr>
+                  <w:rFonts w:ascii="Cambria Math" w:eastAsiaTheme="minorEastAsia" w:hAnsi="Cambria Math"/>
+                </w:rPr>
+                <m:t>k=0</m:t>
+              </m:r>
+            </m:sub>
+            <m:sup>
+              <m:r>
+                <w:rPr>
+                  <w:rFonts w:ascii="Cambria Math" w:eastAsiaTheme="minorEastAsia" w:hAnsi="Cambria Math"/>
+                </w:rPr>
+                <m:t>∞</m:t>
+              </m:r>
+            </m:sup>
+            <m:e>
+              <m:f>
+                <m:fPr>
+                  <m:ctrlPr>
+                    <w:rPr>
+                      <w:rFonts w:ascii="Cambria Math" w:eastAsiaTheme="minorEastAsia" w:hAnsi="Cambria Math"/>
+                      <w:i/>
+                      <w:iCs/>
+                    </w:rPr>
+                  </m:ctrlPr>
+                </m:fPr>
+                <m:num>
+                  <m:sSub>
+                    <m:sSubPr>
+                      <m:ctrlPr>
+                        <w:rPr>
+                          <w:rFonts w:ascii="Cambria Math" w:eastAsiaTheme="minorEastAsia" w:hAnsi="Cambria Math"/>
+                          <w:i/>
+                          <w:iCs/>
+                        </w:rPr>
+                      </m:ctrlPr>
+                    </m:sSubPr>
+                    <m:e>
+                      <m:r>
+                        <w:rPr>
+                          <w:rFonts w:ascii="Cambria Math" w:eastAsiaTheme="minorEastAsia" w:hAnsi="Cambria Math"/>
+                        </w:rPr>
+                        <m:t>a</m:t>
+                      </m:r>
+                    </m:e>
+                    <m:sub>
+                      <m:r>
+                        <w:rPr>
+                          <w:rFonts w:ascii="Cambria Math" w:eastAsiaTheme="minorEastAsia" w:hAnsi="Cambria Math"/>
+                        </w:rPr>
+                        <m:t>k</m:t>
+                      </m:r>
+                    </m:sub>
+                  </m:sSub>
+                </m:num>
+                <m:den>
+                  <m:sSub>
+                    <m:sSubPr>
+                      <m:ctrlPr>
+                        <w:rPr>
+                          <w:rFonts w:ascii="Cambria Math" w:eastAsiaTheme="minorEastAsia" w:hAnsi="Cambria Math"/>
+                          <w:i/>
+                          <w:iCs/>
+                        </w:rPr>
+                      </m:ctrlPr>
+                    </m:sSubPr>
+                    <m:e>
+                      <m:r>
+                        <w:rPr>
+                          <w:rFonts w:ascii="Cambria Math" w:eastAsiaTheme="minorEastAsia" w:hAnsi="Cambria Math"/>
+                        </w:rPr>
+                        <m:t>b</m:t>
+                      </m:r>
+                    </m:e>
+                    <m:sub>
+                      <m:r>
+                        <w:rPr>
+                          <w:rFonts w:ascii="Cambria Math" w:eastAsiaTheme="minorEastAsia" w:hAnsi="Cambria Math"/>
+                        </w:rPr>
+                        <m:t>k</m:t>
+                      </m:r>
+                    </m:sub>
+                  </m:sSub>
+                </m:den>
+              </m:f>
+              <m:f>
+                <m:fPr>
+                  <m:ctrlPr>
+                    <w:rPr>
+                      <w:rFonts w:ascii="Cambria Math" w:eastAsiaTheme="minorEastAsia" w:hAnsi="Cambria Math"/>
+                      <w:i/>
+                      <w:iCs/>
+                    </w:rPr>
+                  </m:ctrlPr>
+                </m:fPr>
+                <m:num>
+                  <m:sSub>
+                    <m:sSubPr>
+                      <m:ctrlPr>
+                        <w:rPr>
+                          <w:rFonts w:ascii="Cambria Math" w:eastAsiaTheme="minorEastAsia" w:hAnsi="Cambria Math"/>
+                          <w:i/>
+                          <w:iCs/>
+                        </w:rPr>
+                      </m:ctrlPr>
+                    </m:sSubPr>
+                    <m:e>
+                      <m:r>
+                        <w:rPr>
+                          <w:rFonts w:ascii="Cambria Math" w:eastAsiaTheme="minorEastAsia" w:hAnsi="Cambria Math"/>
+                        </w:rPr>
+                        <m:t>p</m:t>
+                      </m:r>
+                    </m:e>
+                    <m:sub>
+                      <m:r>
+                        <w:rPr>
+                          <w:rFonts w:ascii="Cambria Math" w:eastAsiaTheme="minorEastAsia" w:hAnsi="Cambria Math"/>
+                        </w:rPr>
+                        <m:t>0</m:t>
+                      </m:r>
+                    </m:sub>
+                  </m:sSub>
+                  <m:r>
+                    <w:rPr>
+                      <w:rFonts w:ascii="Cambria Math" w:eastAsiaTheme="minorEastAsia" w:hAnsi="Cambria Math"/>
+                    </w:rPr>
+                    <m:t>…</m:t>
+                  </m:r>
+                  <m:sSub>
+                    <m:sSubPr>
+                      <m:ctrlPr>
+                        <w:rPr>
+                          <w:rFonts w:ascii="Cambria Math" w:eastAsiaTheme="minorEastAsia" w:hAnsi="Cambria Math"/>
+                          <w:i/>
+                          <w:iCs/>
+                        </w:rPr>
+                      </m:ctrlPr>
+                    </m:sSubPr>
+                    <m:e>
+                      <m:r>
+                        <w:rPr>
+                          <w:rFonts w:ascii="Cambria Math" w:eastAsiaTheme="minorEastAsia" w:hAnsi="Cambria Math"/>
+                        </w:rPr>
+                        <m:t>p</m:t>
+                      </m:r>
+                    </m:e>
+                    <m:sub>
+                      <m:r>
+                        <w:rPr>
+                          <w:rFonts w:ascii="Cambria Math" w:eastAsiaTheme="minorEastAsia" w:hAnsi="Cambria Math"/>
+                        </w:rPr>
+                        <m:t>k</m:t>
+                      </m:r>
+                    </m:sub>
+                  </m:sSub>
+                </m:num>
+                <m:den>
+                  <m:sSub>
+                    <m:sSubPr>
+                      <m:ctrlPr>
+                        <w:rPr>
+                          <w:rFonts w:ascii="Cambria Math" w:eastAsiaTheme="minorEastAsia" w:hAnsi="Cambria Math"/>
+                          <w:i/>
+                          <w:iCs/>
+                        </w:rPr>
+                      </m:ctrlPr>
+                    </m:sSubPr>
+                    <m:e>
+                      <m:r>
+                        <w:rPr>
+                          <w:rFonts w:ascii="Cambria Math" w:eastAsiaTheme="minorEastAsia" w:hAnsi="Cambria Math"/>
+                        </w:rPr>
+                        <m:t>q</m:t>
+                      </m:r>
+                    </m:e>
+                    <m:sub>
+                      <m:r>
+                        <w:rPr>
+                          <w:rFonts w:ascii="Cambria Math" w:eastAsiaTheme="minorEastAsia" w:hAnsi="Cambria Math"/>
+                        </w:rPr>
+                        <m:t>0</m:t>
+                      </m:r>
+                    </m:sub>
+                  </m:sSub>
+                  <m:r>
+                    <w:rPr>
+                      <w:rFonts w:ascii="Cambria Math" w:eastAsiaTheme="minorEastAsia" w:hAnsi="Cambria Math"/>
+                    </w:rPr>
+                    <m:t>…</m:t>
+                  </m:r>
+                  <m:sSub>
+                    <m:sSubPr>
+                      <m:ctrlPr>
+                        <w:rPr>
+                          <w:rFonts w:ascii="Cambria Math" w:eastAsiaTheme="minorEastAsia" w:hAnsi="Cambria Math"/>
+                          <w:i/>
+                          <w:iCs/>
+                        </w:rPr>
+                      </m:ctrlPr>
+                    </m:sSubPr>
+                    <m:e>
+                      <m:r>
+                        <w:rPr>
+                          <w:rFonts w:ascii="Cambria Math" w:eastAsiaTheme="minorEastAsia" w:hAnsi="Cambria Math"/>
+                        </w:rPr>
+                        <m:t>q</m:t>
+                      </m:r>
+                    </m:e>
+                    <m:sub>
+                      <m:r>
+                        <w:rPr>
+                          <w:rFonts w:ascii="Cambria Math" w:eastAsiaTheme="minorEastAsia" w:hAnsi="Cambria Math"/>
+                        </w:rPr>
+                        <m:t>k</m:t>
+                      </m:r>
+                    </m:sub>
+                  </m:sSub>
+                </m:den>
+              </m:f>
+            </m:e>
+          </m:nary>
+          <m:r>
+            <w:rPr>
+              <w:rFonts w:ascii="Cambria Math" w:eastAsiaTheme="minorEastAsia" w:hAnsi="Cambria Math"/>
+            </w:rPr>
+            <m:t xml:space="preserve"> </m:t>
+          </m:r>
+        </m:oMath>
+      </m:oMathPara>
+    </w:p>
+    <w:p>
+      <w:pPr>
+        <w:rPr>
+          <w:rFonts w:eastAsiaTheme="minorEastAsia"/>
+          <w:iCs/>
+        </w:rPr>
+      </w:pPr>
+      <w:r>
+        <w:rPr>
+          <w:rFonts w:eastAsiaTheme="minorEastAsia"/>
+          <w:iCs/>
+        </w:rPr>
+        <w:t xml:space="preserve">A képletben szereplő </w:t>
+      </w:r>
+      <m:oMath>
+        <m:sSub>
+          <m:sSubPr>
+            <m:ctrlPr>
+              <w:rPr>
+                <w:rFonts w:ascii="Cambria Math" w:eastAsiaTheme="minorEastAsia" w:hAnsi="Cambria Math"/>
+                <w:i/>
+                <w:iCs/>
+              </w:rPr>
+            </m:ctrlPr>
+          </m:sSubPr>
+          <m:e>
+            <m:r>
+              <w:rPr>
+                <w:rFonts w:ascii="Cambria Math" w:eastAsiaTheme="minorEastAsia" w:hAnsi="Cambria Math"/>
+              </w:rPr>
+              <m:t>a</m:t>
+            </m:r>
+          </m:e>
+          <m:sub>
+            <m:r>
+              <w:rPr>
+                <w:rFonts w:ascii="Cambria Math" w:eastAsiaTheme="minorEastAsia" w:hAnsi="Cambria Math"/>
+              </w:rPr>
+              <m:t>n</m:t>
+            </m:r>
+          </m:sub>
+        </m:sSub>
+      </m:oMath>
+      <w:r>
+        <w:rPr>
+          <w:rFonts w:eastAsiaTheme="minorEastAsia"/>
+          <w:iCs/>
+        </w:rPr>
+        <w:t xml:space="preserve">, </w:t>
+      </w:r>
+      <m:oMath>
+        <m:sSub>
+          <m:sSubPr>
+            <m:ctrlPr>
+              <w:rPr>
+                <w:rFonts w:ascii="Cambria Math" w:eastAsiaTheme="minorEastAsia" w:hAnsi="Cambria Math"/>
+                <w:i/>
+                <w:iCs/>
+              </w:rPr>
+            </m:ctrlPr>
+          </m:sSubPr>
+          <m:e>
+            <m:r>
+              <w:rPr>
+                <w:rFonts w:ascii="Cambria Math" w:eastAsiaTheme="minorEastAsia" w:hAnsi="Cambria Math"/>
+              </w:rPr>
+              <m:t>b</m:t>
+            </m:r>
+          </m:e>
+          <m:sub>
+            <m:r>
+              <w:rPr>
+                <w:rFonts w:ascii="Cambria Math" w:eastAsiaTheme="minorEastAsia" w:hAnsi="Cambria Math"/>
+              </w:rPr>
+              <m:t>n</m:t>
+            </m:r>
+          </m:sub>
+        </m:sSub>
+      </m:oMath>
+      <w:r>
+        <w:rPr>
+          <w:rFonts w:eastAsiaTheme="minorEastAsia"/>
+          <w:iCs/>
+        </w:rPr>
+        <w:t xml:space="preserve">, </w:t>
+      </w:r>
+      <m:oMath>
+        <m:sSub>
+          <m:sSubPr>
+            <m:ctrlPr>
+              <w:rPr>
+                <w:rFonts w:ascii="Cambria Math" w:eastAsiaTheme="minorEastAsia" w:hAnsi="Cambria Math"/>
+                <w:i/>
+                <w:iCs/>
+              </w:rPr>
+            </m:ctrlPr>
+          </m:sSubPr>
+          <m:e>
+            <m:r>
+              <w:rPr>
+                <w:rFonts w:ascii="Cambria Math" w:eastAsiaTheme="minorEastAsia" w:hAnsi="Cambria Math"/>
+              </w:rPr>
+              <m:t>p</m:t>
+            </m:r>
+          </m:e>
+          <m:sub>
+            <m:r>
+              <w:rPr>
+                <w:rFonts w:ascii="Cambria Math" w:eastAsiaTheme="minorEastAsia" w:hAnsi="Cambria Math"/>
+              </w:rPr>
+              <m:t>n</m:t>
+            </m:r>
+          </m:sub>
+        </m:sSub>
+      </m:oMath>
+      <w:r>
+        <w:rPr>
+          <w:rFonts w:eastAsiaTheme="minorEastAsia"/>
+          <w:iCs/>
+        </w:rPr>
+        <w:t xml:space="preserve"> és </w:t>
+      </w:r>
+      <m:oMath>
+        <m:sSub>
+          <m:sSubPr>
+            <m:ctrlPr>
+              <w:rPr>
+                <w:rFonts w:ascii="Cambria Math" w:eastAsiaTheme="minorEastAsia" w:hAnsi="Cambria Math"/>
+                <w:i/>
+                <w:iCs/>
+              </w:rPr>
+            </m:ctrlPr>
+          </m:sSubPr>
+          <m:e>
+            <m:r>
+              <w:rPr>
+                <w:rFonts w:ascii="Cambria Math" w:eastAsiaTheme="minorEastAsia" w:hAnsi="Cambria Math"/>
+              </w:rPr>
+              <m:t>q</m:t>
+            </m:r>
+          </m:e>
+          <m:sub>
+            <m:r>
+              <w:rPr>
+                <w:rFonts w:ascii="Cambria Math" w:eastAsiaTheme="minorEastAsia" w:hAnsi="Cambria Math"/>
+              </w:rPr>
+              <m:t>n</m:t>
+            </m:r>
+          </m:sub>
+        </m:sSub>
+      </m:oMath>
+      <w:r>
+        <w:rPr>
+          <w:rFonts w:eastAsiaTheme="minorEastAsia"/>
+          <w:iCs/>
+        </w:rPr>
+        <w:t xml:space="preserve"> értékek egész számokat jelölnek.</w:t>
+      </w:r>
+      <w:r>
+        <w:rPr>
+          <w:rFonts w:eastAsiaTheme="minorEastAsia"/>
+          <w:iCs/>
+        </w:rPr>
+        <w:t xml:space="preserve"> Az algoritmus a következőképp működik: Legyenek </w:t>
+      </w:r>
+      <m:oMath>
+        <m:sSub>
+          <m:sSubPr>
+            <m:ctrlPr>
+              <w:rPr>
+                <w:rFonts w:ascii="Cambria Math" w:eastAsiaTheme="minorEastAsia" w:hAnsi="Cambria Math"/>
+                <w:i/>
+                <w:iCs/>
+              </w:rPr>
+            </m:ctrlPr>
+          </m:sSubPr>
+          <m:e>
+            <m:r>
+              <w:rPr>
+                <w:rFonts w:ascii="Cambria Math" w:eastAsiaTheme="minorEastAsia" w:hAnsi="Cambria Math"/>
+              </w:rPr>
+              <m:t>n</m:t>
+            </m:r>
+          </m:e>
+          <m:sub>
+            <m:r>
+              <w:rPr>
+                <w:rFonts w:ascii="Cambria Math" w:eastAsiaTheme="minorEastAsia" w:hAnsi="Cambria Math"/>
+              </w:rPr>
+              <m:t>1</m:t>
+            </m:r>
+          </m:sub>
+        </m:sSub>
+      </m:oMath>
+      <w:r>
+        <w:rPr>
+          <w:rFonts w:eastAsiaTheme="minorEastAsia"/>
+          <w:iCs/>
+        </w:rPr>
+        <w:t xml:space="preserve"> és </w:t>
+      </w:r>
+      <m:oMath>
+        <m:sSub>
+          <m:sSubPr>
+            <m:ctrlPr>
+              <w:rPr>
+                <w:rFonts w:ascii="Cambria Math" w:eastAsiaTheme="minorEastAsia" w:hAnsi="Cambria Math"/>
+                <w:i/>
+                <w:iCs/>
+              </w:rPr>
+            </m:ctrlPr>
+          </m:sSubPr>
+          <m:e>
+            <m:r>
+              <w:rPr>
+                <w:rFonts w:ascii="Cambria Math" w:eastAsiaTheme="minorEastAsia" w:hAnsi="Cambria Math"/>
+              </w:rPr>
+              <m:t>n</m:t>
+            </m:r>
+          </m:e>
+          <m:sub>
+            <m:r>
+              <w:rPr>
+                <w:rFonts w:ascii="Cambria Math" w:eastAsiaTheme="minorEastAsia" w:hAnsi="Cambria Math"/>
+              </w:rPr>
+              <m:t>2</m:t>
+            </m:r>
+          </m:sub>
+        </m:sSub>
+      </m:oMath>
+      <w:r>
+        <w:rPr>
+          <w:rFonts w:eastAsiaTheme="minorEastAsia"/>
+          <w:iCs/>
+        </w:rPr>
+        <w:t xml:space="preserve"> </w:t>
+      </w:r>
+      <w:r>
+        <w:rPr>
+          <w:rFonts w:eastAsiaTheme="minorEastAsia"/>
+          <w:iCs/>
+        </w:rPr>
+        <w:t>természetes számok</w:t>
+      </w:r>
+      <w:r>
+        <w:rPr>
+          <w:rFonts w:eastAsiaTheme="minorEastAsia"/>
+          <w:iCs/>
+        </w:rPr>
+        <w:t xml:space="preserve"> a határok, amik közt ki szeretnénk számolni a</w:t>
+      </w:r>
+      <w:r>
+        <w:rPr>
+          <w:rFonts w:eastAsiaTheme="minorEastAsia"/>
+          <w:iCs/>
+        </w:rPr>
+        <w:t xml:space="preserve"> sorösszeget.</w:t>
+      </w:r>
+    </w:p>
+    <w:p>
+      <w:pPr>
+        <w:rPr>
+          <w:rFonts w:eastAsiaTheme="minorEastAsia"/>
+          <w:iCs/>
+        </w:rPr>
+      </w:pPr>
+      <m:oMathPara>
+        <m:oMath>
+          <m:r>
+            <w:rPr>
+              <w:rFonts w:ascii="Cambria Math" w:eastAsiaTheme="minorEastAsia" w:hAnsi="Cambria Math"/>
+            </w:rPr>
+            <m:t>S</m:t>
+          </m:r>
+          <m:r>
+            <w:rPr>
+              <w:rFonts w:ascii="Cambria Math" w:eastAsiaTheme="minorEastAsia" w:hAnsi="Cambria Math"/>
+            </w:rPr>
+            <m:t>=</m:t>
+          </m:r>
+          <m:nary>
+            <m:naryPr>
+              <m:chr m:val="∑"/>
+              <m:limLoc m:val="undOvr"/>
+              <m:supHide m:val="1"/>
+              <m:ctrlPr>
+                <w:rPr>
+                  <w:rFonts w:ascii="Cambria Math" w:eastAsiaTheme="minorEastAsia" w:hAnsi="Cambria Math"/>
+                  <w:i/>
+                  <w:iCs/>
+                </w:rPr>
+              </m:ctrlPr>
+            </m:naryPr>
+            <m:sub>
+              <m:sSub>
+                <m:sSubPr>
+                  <m:ctrlPr>
+                    <w:rPr>
+                      <w:rFonts w:ascii="Cambria Math" w:eastAsiaTheme="minorEastAsia" w:hAnsi="Cambria Math"/>
+                      <w:i/>
+                      <w:iCs/>
+                    </w:rPr>
+                  </m:ctrlPr>
+                </m:sSubPr>
+                <m:e>
+                  <m:r>
+                    <w:rPr>
+                      <w:rFonts w:ascii="Cambria Math" w:eastAsiaTheme="minorEastAsia" w:hAnsi="Cambria Math"/>
+                    </w:rPr>
+                    <m:t>n</m:t>
+                  </m:r>
+                </m:e>
+                <m:sub>
+                  <m:r>
+                    <w:rPr>
+                      <w:rFonts w:ascii="Cambria Math" w:eastAsiaTheme="minorEastAsia" w:hAnsi="Cambria Math"/>
+                    </w:rPr>
+                    <m:t>1</m:t>
+                  </m:r>
+                </m:sub>
+              </m:sSub>
+              <m:r>
+                <w:rPr>
+                  <w:rFonts w:ascii="Cambria Math" w:eastAsiaTheme="minorEastAsia" w:hAnsi="Cambria Math"/>
+                </w:rPr>
+                <m:t>≤k&lt;</m:t>
+              </m:r>
+              <m:sSub>
+                <m:sSubPr>
+                  <m:ctrlPr>
+                    <w:rPr>
+                      <w:rFonts w:ascii="Cambria Math" w:eastAsiaTheme="minorEastAsia" w:hAnsi="Cambria Math"/>
+                      <w:i/>
+                      <w:iCs/>
+                    </w:rPr>
+                  </m:ctrlPr>
+                </m:sSubPr>
+                <m:e>
+                  <m:r>
+                    <w:rPr>
+                      <w:rFonts w:ascii="Cambria Math" w:eastAsiaTheme="minorEastAsia" w:hAnsi="Cambria Math"/>
+                    </w:rPr>
+                    <m:t>n</m:t>
+                  </m:r>
+                </m:e>
+                <m:sub>
+                  <m:r>
+                    <w:rPr>
+                      <w:rFonts w:ascii="Cambria Math" w:eastAsiaTheme="minorEastAsia" w:hAnsi="Cambria Math"/>
+                    </w:rPr>
+                    <m:t>2</m:t>
+                  </m:r>
+                </m:sub>
+              </m:sSub>
+            </m:sub>
+            <m:sup/>
+            <m:e>
+              <m:f>
+                <m:fPr>
+                  <m:ctrlPr>
+                    <w:rPr>
+                      <w:rFonts w:ascii="Cambria Math" w:eastAsiaTheme="minorEastAsia" w:hAnsi="Cambria Math"/>
+                      <w:i/>
+                      <w:iCs/>
+                    </w:rPr>
+                  </m:ctrlPr>
+                </m:fPr>
+                <m:num>
+                  <m:sSub>
+                    <m:sSubPr>
+                      <m:ctrlPr>
+                        <w:rPr>
+                          <w:rFonts w:ascii="Cambria Math" w:eastAsiaTheme="minorEastAsia" w:hAnsi="Cambria Math"/>
+                          <w:i/>
+                          <w:iCs/>
+                        </w:rPr>
+                      </m:ctrlPr>
+                    </m:sSubPr>
+                    <m:e>
+                      <m:r>
+                        <w:rPr>
+                          <w:rFonts w:ascii="Cambria Math" w:eastAsiaTheme="minorEastAsia" w:hAnsi="Cambria Math"/>
+                        </w:rPr>
+                        <m:t>a</m:t>
+                      </m:r>
+                    </m:e>
+                    <m:sub>
+                      <m:r>
+                        <w:rPr>
+                          <w:rFonts w:ascii="Cambria Math" w:eastAsiaTheme="minorEastAsia" w:hAnsi="Cambria Math"/>
+                        </w:rPr>
+                        <m:t>k</m:t>
+                      </m:r>
+                    </m:sub>
+                  </m:sSub>
+                </m:num>
+                <m:den>
+                  <m:sSub>
+                    <m:sSubPr>
+                      <m:ctrlPr>
+                        <w:rPr>
+                          <w:rFonts w:ascii="Cambria Math" w:eastAsiaTheme="minorEastAsia" w:hAnsi="Cambria Math"/>
+                          <w:i/>
+                          <w:iCs/>
+                        </w:rPr>
+                      </m:ctrlPr>
+                    </m:sSubPr>
+                    <m:e>
+                      <m:r>
+                        <w:rPr>
+                          <w:rFonts w:ascii="Cambria Math" w:eastAsiaTheme="minorEastAsia" w:hAnsi="Cambria Math"/>
+                        </w:rPr>
+                        <m:t>b</m:t>
+                      </m:r>
+                    </m:e>
+                    <m:sub>
+                      <m:r>
+                        <w:rPr>
+                          <w:rFonts w:ascii="Cambria Math" w:eastAsiaTheme="minorEastAsia" w:hAnsi="Cambria Math"/>
+                        </w:rPr>
+                        <m:t>k</m:t>
+                      </m:r>
+                    </m:sub>
+                  </m:sSub>
+                </m:den>
+              </m:f>
+              <m:f>
+                <m:fPr>
+                  <m:ctrlPr>
+                    <w:rPr>
+                      <w:rFonts w:ascii="Cambria Math" w:eastAsiaTheme="minorEastAsia" w:hAnsi="Cambria Math"/>
+                      <w:i/>
+                      <w:iCs/>
+                    </w:rPr>
+                  </m:ctrlPr>
+                </m:fPr>
+                <m:num>
+                  <m:sSub>
+                    <m:sSubPr>
+                      <m:ctrlPr>
+                        <w:rPr>
+                          <w:rFonts w:ascii="Cambria Math" w:eastAsiaTheme="minorEastAsia" w:hAnsi="Cambria Math"/>
+                          <w:i/>
+                          <w:iCs/>
+                        </w:rPr>
+                      </m:ctrlPr>
+                    </m:sSubPr>
+                    <m:e>
+                      <m:r>
+                        <w:rPr>
+                          <w:rFonts w:ascii="Cambria Math" w:eastAsiaTheme="minorEastAsia" w:hAnsi="Cambria Math"/>
+                        </w:rPr>
+                        <m:t>p</m:t>
+                      </m:r>
+                    </m:e>
+                    <m:sub>
+                      <m:sSub>
+                        <m:sSubPr>
+                          <m:ctrlPr>
+                            <w:rPr>
+                              <w:rFonts w:ascii="Cambria Math" w:eastAsiaTheme="minorEastAsia" w:hAnsi="Cambria Math"/>
+                              <w:i/>
+                              <w:iCs/>
+                            </w:rPr>
+                          </m:ctrlPr>
+                        </m:sSubPr>
+                        <m:e>
+                          <m:r>
+                            <w:rPr>
+                              <w:rFonts w:ascii="Cambria Math" w:eastAsiaTheme="minorEastAsia" w:hAnsi="Cambria Math"/>
+                            </w:rPr>
+                            <m:t>n</m:t>
+                          </m:r>
+                        </m:e>
+                        <m:sub>
+                          <m:r>
+                            <w:rPr>
+                              <w:rFonts w:ascii="Cambria Math" w:eastAsiaTheme="minorEastAsia" w:hAnsi="Cambria Math"/>
+                            </w:rPr>
+                            <m:t>1</m:t>
+                          </m:r>
+                        </m:sub>
+                      </m:sSub>
+                    </m:sub>
+                  </m:sSub>
+                  <m:r>
+                    <w:rPr>
+                      <w:rFonts w:ascii="Cambria Math" w:eastAsiaTheme="minorEastAsia" w:hAnsi="Cambria Math"/>
+                    </w:rPr>
+                    <m:t>…</m:t>
+                  </m:r>
+                  <m:sSub>
+                    <m:sSubPr>
+                      <m:ctrlPr>
+                        <w:rPr>
+                          <w:rFonts w:ascii="Cambria Math" w:eastAsiaTheme="minorEastAsia" w:hAnsi="Cambria Math"/>
+                          <w:i/>
+                          <w:iCs/>
+                        </w:rPr>
+                      </m:ctrlPr>
+                    </m:sSubPr>
+                    <m:e>
+                      <m:r>
+                        <w:rPr>
+                          <w:rFonts w:ascii="Cambria Math" w:eastAsiaTheme="minorEastAsia" w:hAnsi="Cambria Math"/>
+                        </w:rPr>
+                        <m:t>p</m:t>
+                      </m:r>
+                    </m:e>
+                    <m:sub>
+                      <m:r>
+                        <w:rPr>
+                          <w:rFonts w:ascii="Cambria Math" w:eastAsiaTheme="minorEastAsia" w:hAnsi="Cambria Math"/>
+                        </w:rPr>
+                        <m:t>k</m:t>
+                      </m:r>
+                    </m:sub>
+                  </m:sSub>
+                </m:num>
+                <m:den>
+                  <m:sSub>
+                    <m:sSubPr>
+                      <m:ctrlPr>
+                        <w:rPr>
+                          <w:rFonts w:ascii="Cambria Math" w:eastAsiaTheme="minorEastAsia" w:hAnsi="Cambria Math"/>
+                          <w:i/>
+                          <w:iCs/>
+                        </w:rPr>
+                      </m:ctrlPr>
+                    </m:sSubPr>
+                    <m:e>
+                      <m:r>
+                        <w:rPr>
+                          <w:rFonts w:ascii="Cambria Math" w:eastAsiaTheme="minorEastAsia" w:hAnsi="Cambria Math"/>
+                        </w:rPr>
+                        <m:t>q</m:t>
+                      </m:r>
+                    </m:e>
+                    <m:sub>
+                      <m:sSub>
+                        <m:sSubPr>
+                          <m:ctrlPr>
+                            <w:rPr>
+                              <w:rFonts w:ascii="Cambria Math" w:eastAsiaTheme="minorEastAsia" w:hAnsi="Cambria Math"/>
+                              <w:i/>
+                              <w:iCs/>
+                            </w:rPr>
+                          </m:ctrlPr>
+                        </m:sSubPr>
+                        <m:e>
+                          <m:r>
+                            <w:rPr>
+                              <w:rFonts w:ascii="Cambria Math" w:eastAsiaTheme="minorEastAsia" w:hAnsi="Cambria Math"/>
+                            </w:rPr>
+                            <m:t>n</m:t>
+                          </m:r>
+                        </m:e>
+                        <m:sub>
+                          <m:r>
+                            <w:rPr>
+                              <w:rFonts w:ascii="Cambria Math" w:eastAsiaTheme="minorEastAsia" w:hAnsi="Cambria Math"/>
+                            </w:rPr>
+                            <m:t>1</m:t>
+                          </m:r>
+                        </m:sub>
+                      </m:sSub>
+                    </m:sub>
+                  </m:sSub>
+                  <m:r>
+                    <w:rPr>
+                      <w:rFonts w:ascii="Cambria Math" w:eastAsiaTheme="minorEastAsia" w:hAnsi="Cambria Math"/>
+                    </w:rPr>
+                    <m:t>…</m:t>
+                  </m:r>
+                  <m:sSub>
+                    <m:sSubPr>
+                      <m:ctrlPr>
+                        <w:rPr>
+                          <w:rFonts w:ascii="Cambria Math" w:eastAsiaTheme="minorEastAsia" w:hAnsi="Cambria Math"/>
+                          <w:i/>
+                          <w:iCs/>
+                        </w:rPr>
+                      </m:ctrlPr>
+                    </m:sSubPr>
+                    <m:e>
+                      <m:r>
+                        <w:rPr>
+                          <w:rFonts w:ascii="Cambria Math" w:eastAsiaTheme="minorEastAsia" w:hAnsi="Cambria Math"/>
+                        </w:rPr>
+                        <m:t>q</m:t>
+                      </m:r>
+                    </m:e>
+                    <m:sub>
+                      <m:r>
+                        <w:rPr>
+                          <w:rFonts w:ascii="Cambria Math" w:eastAsiaTheme="minorEastAsia" w:hAnsi="Cambria Math"/>
+                        </w:rPr>
+                        <m:t>k</m:t>
+                      </m:r>
+                    </m:sub>
+                  </m:sSub>
+                </m:den>
+              </m:f>
+            </m:e>
+          </m:nary>
+          <m:r>
+            <w:rPr>
+              <w:rFonts w:ascii="Cambria Math" w:eastAsiaTheme="minorEastAsia" w:hAnsi="Cambria Math"/>
+            </w:rPr>
+            <m:t xml:space="preserve">    (</m:t>
+          </m:r>
+          <m:sSub>
+            <m:sSubPr>
+              <m:ctrlPr>
+                <w:rPr>
+                  <w:rFonts w:ascii="Cambria Math" w:eastAsiaTheme="minorEastAsia" w:hAnsi="Cambria Math"/>
+                  <w:i/>
+                  <w:iCs/>
+                </w:rPr>
+              </m:ctrlPr>
+            </m:sSubPr>
+            <m:e>
+              <m:r>
+                <w:rPr>
+                  <w:rFonts w:ascii="Cambria Math" w:eastAsiaTheme="minorEastAsia" w:hAnsi="Cambria Math"/>
+                </w:rPr>
+                <m:t>n</m:t>
+              </m:r>
+            </m:e>
+            <m:sub>
+              <m:r>
+                <w:rPr>
+                  <w:rFonts w:ascii="Cambria Math" w:eastAsiaTheme="minorEastAsia" w:hAnsi="Cambria Math"/>
+                </w:rPr>
+                <m:t>1</m:t>
+              </m:r>
+            </m:sub>
+          </m:sSub>
+          <m:r>
+            <w:rPr>
+              <w:rFonts w:ascii="Cambria Math" w:eastAsiaTheme="minorEastAsia" w:hAnsi="Cambria Math"/>
+            </w:rPr>
+            <m:t xml:space="preserve">, </m:t>
+          </m:r>
+          <m:sSub>
+            <m:sSubPr>
+              <m:ctrlPr>
+                <w:rPr>
+                  <w:rFonts w:ascii="Cambria Math" w:eastAsiaTheme="minorEastAsia" w:hAnsi="Cambria Math"/>
+                  <w:i/>
+                  <w:iCs/>
+                </w:rPr>
+              </m:ctrlPr>
+            </m:sSubPr>
+            <m:e>
+              <m:r>
+                <w:rPr>
+                  <w:rFonts w:ascii="Cambria Math" w:eastAsiaTheme="minorEastAsia" w:hAnsi="Cambria Math"/>
+                </w:rPr>
+                <m:t>n</m:t>
+              </m:r>
+            </m:e>
+            <m:sub>
+              <m:r>
+                <w:rPr>
+                  <w:rFonts w:ascii="Cambria Math" w:eastAsiaTheme="minorEastAsia" w:hAnsi="Cambria Math"/>
+                </w:rPr>
+                <m:t>2</m:t>
+              </m:r>
+            </m:sub>
+          </m:sSub>
+          <m:r>
+            <w:rPr>
+              <w:rFonts w:ascii="Cambria Math" w:eastAsiaTheme="minorEastAsia" w:hAnsi="Cambria Math"/>
+            </w:rPr>
+            <m:t>∈</m:t>
+          </m:r>
+          <m:r>
+            <m:rPr>
+              <m:scr m:val="double-struck"/>
+            </m:rPr>
+            <w:rPr>
+              <w:rFonts w:ascii="Cambria Math" w:eastAsiaTheme="minorEastAsia" w:hAnsi="Cambria Math"/>
+            </w:rPr>
+            <m:t>N</m:t>
+          </m:r>
+          <m:r>
+            <w:rPr>
+              <w:rFonts w:ascii="Cambria Math" w:eastAsiaTheme="minorEastAsia" w:hAnsi="Cambria Math"/>
+            </w:rPr>
+            <m:t>)</m:t>
+          </m:r>
+        </m:oMath>
+      </m:oMathPara>
+    </w:p>
+    <w:p>
+      <w:pPr>
+        <w:rPr>
+          <w:rFonts w:eastAsiaTheme="minorEastAsia"/>
+          <w:iCs/>
+        </w:rPr>
+      </w:pPr>
+    </w:p>
+    <w:p>
+      <w:pPr>
+        <w:rPr>
+          <w:rFonts w:eastAsiaTheme="minorEastAsia"/>
+          <w:iCs/>
+        </w:rPr>
+      </w:pPr>
+      <w:r>
+        <w:rPr>
+          <w:rFonts w:eastAsiaTheme="minorEastAsia"/>
+          <w:iCs/>
+        </w:rPr>
+        <w:t xml:space="preserve">A </w:t>
+      </w:r>
+      <w:r>
+        <w:rPr>
+          <w:rFonts w:eastAsiaTheme="minorEastAsia"/>
+          <w:b/>
+          <w:bCs/>
+          <w:iCs/>
+        </w:rPr>
+        <w:t>pi</w:t>
+      </w:r>
+      <w:r>
+        <w:rPr>
+          <w:rFonts w:eastAsiaTheme="minorEastAsia"/>
+          <w:iCs/>
+        </w:rPr>
+        <w:t xml:space="preserve"> számjegyeinek számolásához</w:t>
+      </w:r>
+      <w:r>
+        <w:rPr>
+          <w:rFonts w:eastAsiaTheme="minorEastAsia"/>
+          <w:iCs/>
+        </w:rPr>
+        <w:t xml:space="preserve"> a könyvtár a</w:t>
+      </w:r>
+      <w:r>
+        <w:rPr>
+          <w:rFonts w:eastAsiaTheme="minorEastAsia"/>
+          <w:iCs/>
+        </w:rPr>
+        <w:t xml:space="preserve"> </w:t>
+      </w:r>
+      <w:proofErr w:type="spellStart"/>
+      <w:r>
+        <w:rPr>
+          <w:rFonts w:eastAsiaTheme="minorEastAsia"/>
+          <w:iCs/>
+        </w:rPr>
+        <w:t>Srinivasa</w:t>
+      </w:r>
+      <w:proofErr w:type="spellEnd"/>
+      <w:r>
+        <w:rPr>
+          <w:rFonts w:eastAsiaTheme="minorEastAsia"/>
+          <w:iCs/>
+        </w:rPr>
+        <w:t xml:space="preserve"> </w:t>
+      </w:r>
+      <w:proofErr w:type="spellStart"/>
+      <w:r>
+        <w:rPr>
+          <w:rFonts w:eastAsiaTheme="minorEastAsia"/>
+          <w:iCs/>
+        </w:rPr>
+        <w:t>Ramanujan</w:t>
+      </w:r>
+      <w:proofErr w:type="spellEnd"/>
+      <w:r>
+        <w:rPr>
+          <w:rFonts w:eastAsiaTheme="minorEastAsia"/>
+          <w:iCs/>
+        </w:rPr>
+        <w:t xml:space="preserve"> </w:t>
+      </w:r>
+      <w:r>
+        <w:rPr>
+          <w:rFonts w:eastAsiaTheme="minorEastAsia"/>
+          <w:iCs/>
+        </w:rPr>
+        <w:t xml:space="preserve">által inspirált, </w:t>
+      </w:r>
+      <w:proofErr w:type="spellStart"/>
+      <w:r>
+        <w:rPr>
+          <w:rFonts w:eastAsiaTheme="minorEastAsia"/>
+          <w:iCs/>
+        </w:rPr>
+        <w:t>Chudnovsky</w:t>
+      </w:r>
+      <w:proofErr w:type="spellEnd"/>
+      <w:r>
+        <w:rPr>
+          <w:rFonts w:eastAsiaTheme="minorEastAsia"/>
+          <w:iCs/>
+        </w:rPr>
+        <w:t xml:space="preserve"> fivérek</w:t>
+      </w:r>
+      <w:r>
+        <w:rPr>
+          <w:rFonts w:eastAsiaTheme="minorEastAsia"/>
+          <w:iCs/>
+        </w:rPr>
+        <w:t xml:space="preserve"> </w:t>
+      </w:r>
+      <w:r>
+        <w:rPr>
+          <w:rFonts w:eastAsiaTheme="minorEastAsia"/>
+          <w:iCs/>
+        </w:rPr>
+        <w:t>által megalkotott</w:t>
+      </w:r>
+      <w:r>
+        <w:rPr>
+          <w:rFonts w:eastAsiaTheme="minorEastAsia"/>
+          <w:iCs/>
+        </w:rPr>
+        <w:t xml:space="preserve"> </w:t>
+      </w:r>
+      <w:r>
+        <w:rPr>
+          <w:rFonts w:eastAsiaTheme="minorEastAsia"/>
+          <w:iCs/>
+        </w:rPr>
+        <w:t>formulát</w:t>
+      </w:r>
+      <w:r>
+        <w:rPr>
+          <w:rFonts w:eastAsiaTheme="minorEastAsia"/>
+          <w:iCs/>
+        </w:rPr>
+        <w:t xml:space="preserve"> </w:t>
+      </w:r>
+      <w:r>
+        <w:rPr>
+          <w:rFonts w:eastAsiaTheme="minorEastAsia"/>
+          <w:iCs/>
+        </w:rPr>
+        <w:t>használja, miszerint:</w:t>
+      </w:r>
+    </w:p>
+    <w:p>
+      <w:pPr>
+        <w:rPr>
+          <w:rFonts w:eastAsiaTheme="minorEastAsia"/>
+          <w:iCs/>
+        </w:rPr>
+      </w:pPr>
+      <m:oMathPara>
+        <m:oMath>
+          <m:f>
+            <m:fPr>
+              <m:ctrlPr>
+                <w:rPr>
+                  <w:rFonts w:ascii="Cambria Math" w:eastAsiaTheme="minorEastAsia" w:hAnsi="Cambria Math"/>
+                  <w:i/>
+                  <w:iCs/>
+                </w:rPr>
+              </m:ctrlPr>
+            </m:fPr>
+            <m:num>
+              <m:r>
+                <w:rPr>
+                  <w:rFonts w:ascii="Cambria Math" w:eastAsiaTheme="minorEastAsia" w:hAnsi="Cambria Math"/>
+                </w:rPr>
+                <m:t>1</m:t>
+              </m:r>
+            </m:num>
+            <m:den>
+              <m:r>
+                <w:rPr>
+                  <w:rFonts w:ascii="Cambria Math" w:eastAsiaTheme="minorEastAsia" w:hAnsi="Cambria Math"/>
+                </w:rPr>
+                <m:t>π</m:t>
+              </m:r>
+            </m:den>
+          </m:f>
+          <m:r>
+            <w:rPr>
+              <w:rFonts w:ascii="Cambria Math" w:eastAsiaTheme="minorEastAsia" w:hAnsi="Cambria Math"/>
+            </w:rPr>
+            <m:t>=</m:t>
+          </m:r>
+          <m:f>
+            <m:fPr>
+              <m:ctrlPr>
+                <w:rPr>
+                  <w:rFonts w:ascii="Cambria Math" w:eastAsiaTheme="minorEastAsia" w:hAnsi="Cambria Math"/>
+                  <w:i/>
+                  <w:iCs/>
+                </w:rPr>
+              </m:ctrlPr>
+            </m:fPr>
+            <m:num>
+              <m:rad>
+                <m:radPr>
+                  <m:degHide m:val="1"/>
+                  <m:ctrlPr>
+                    <w:rPr>
+                      <w:rFonts w:ascii="Cambria Math" w:eastAsiaTheme="minorEastAsia" w:hAnsi="Cambria Math"/>
+                      <w:i/>
+                      <w:iCs/>
+                    </w:rPr>
+                  </m:ctrlPr>
+                </m:radPr>
+                <m:deg/>
+                <m:e>
+                  <m:r>
+                    <w:rPr>
+                      <w:rFonts w:ascii="Cambria Math" w:eastAsiaTheme="minorEastAsia" w:hAnsi="Cambria Math"/>
+                    </w:rPr>
+                    <m:t>10005</m:t>
+                  </m:r>
+                </m:e>
+              </m:rad>
+            </m:num>
+            <m:den>
+              <m:r>
+                <w:rPr>
+                  <w:rFonts w:ascii="Cambria Math" w:eastAsiaTheme="minorEastAsia" w:hAnsi="Cambria Math"/>
+                </w:rPr>
+                <m:t>4270934400</m:t>
+              </m:r>
+            </m:den>
+          </m:f>
+          <m:nary>
+            <m:naryPr>
+              <m:chr m:val="∑"/>
+              <m:limLoc m:val="undOvr"/>
+              <m:ctrlPr>
+                <w:rPr>
+                  <w:rFonts w:ascii="Cambria Math" w:eastAsiaTheme="minorEastAsia" w:hAnsi="Cambria Math"/>
+                  <w:i/>
+                  <w:iCs/>
+                </w:rPr>
+              </m:ctrlPr>
+            </m:naryPr>
+            <m:sub>
+              <m:r>
+                <w:rPr>
+                  <w:rFonts w:ascii="Cambria Math" w:eastAsiaTheme="minorEastAsia" w:hAnsi="Cambria Math"/>
+                </w:rPr>
+                <m:t>k=0</m:t>
+              </m:r>
+            </m:sub>
+            <m:sup>
+              <m:r>
+                <w:rPr>
+                  <w:rFonts w:ascii="Cambria Math" w:eastAsiaTheme="minorEastAsia" w:hAnsi="Cambria Math"/>
+                </w:rPr>
+                <m:t>∞</m:t>
+              </m:r>
+            </m:sup>
+            <m:e>
+              <m:f>
+                <m:fPr>
+                  <m:ctrlPr>
+                    <w:rPr>
+                      <w:rFonts w:ascii="Cambria Math" w:eastAsiaTheme="minorEastAsia" w:hAnsi="Cambria Math"/>
+                      <w:i/>
+                      <w:iCs/>
+                    </w:rPr>
+                  </m:ctrlPr>
+                </m:fPr>
+                <m:num>
+                  <m:d>
+                    <m:dPr>
+                      <m:ctrlPr>
+                        <w:rPr>
+                          <w:rFonts w:ascii="Cambria Math" w:eastAsiaTheme="minorEastAsia" w:hAnsi="Cambria Math"/>
+                          <w:i/>
+                          <w:iCs/>
+                        </w:rPr>
+                      </m:ctrlPr>
+                    </m:dPr>
+                    <m:e>
+                      <m:r>
+                        <w:rPr>
+                          <w:rFonts w:ascii="Cambria Math" w:eastAsiaTheme="minorEastAsia" w:hAnsi="Cambria Math"/>
+                        </w:rPr>
+                        <m:t>6k</m:t>
+                      </m:r>
+                    </m:e>
+                  </m:d>
+                  <m:r>
+                    <w:rPr>
+                      <w:rFonts w:ascii="Cambria Math" w:eastAsiaTheme="minorEastAsia" w:hAnsi="Cambria Math"/>
+                    </w:rPr>
+                    <m:t>!(13591409+545140134k)</m:t>
+                  </m:r>
+                </m:num>
+                <m:den>
+                  <m:d>
+                    <m:dPr>
+                      <m:ctrlPr>
+                        <w:rPr>
+                          <w:rFonts w:ascii="Cambria Math" w:eastAsiaTheme="minorEastAsia" w:hAnsi="Cambria Math"/>
+                          <w:i/>
+                          <w:iCs/>
+                        </w:rPr>
+                      </m:ctrlPr>
+                    </m:dPr>
+                    <m:e>
+                      <m:r>
+                        <w:rPr>
+                          <w:rFonts w:ascii="Cambria Math" w:eastAsiaTheme="minorEastAsia" w:hAnsi="Cambria Math"/>
+                        </w:rPr>
+                        <m:t>3k</m:t>
+                      </m:r>
+                    </m:e>
+                  </m:d>
+                  <m:r>
+                    <w:rPr>
+                      <w:rFonts w:ascii="Cambria Math" w:eastAsiaTheme="minorEastAsia" w:hAnsi="Cambria Math"/>
+                    </w:rPr>
+                    <m:t>!</m:t>
+                  </m:r>
+                  <m:sSup>
+                    <m:sSupPr>
+                      <m:ctrlPr>
+                        <w:rPr>
+                          <w:rFonts w:ascii="Cambria Math" w:eastAsiaTheme="minorEastAsia" w:hAnsi="Cambria Math"/>
+                          <w:i/>
+                          <w:iCs/>
+                        </w:rPr>
+                      </m:ctrlPr>
+                    </m:sSupPr>
+                    <m:e>
+                      <m:r>
+                        <w:rPr>
+                          <w:rFonts w:ascii="Cambria Math" w:eastAsiaTheme="minorEastAsia" w:hAnsi="Cambria Math"/>
+                        </w:rPr>
+                        <m:t>k!</m:t>
+                      </m:r>
+                    </m:e>
+                    <m:sup>
+                      <m:r>
+                        <w:rPr>
+                          <w:rFonts w:ascii="Cambria Math" w:eastAsiaTheme="minorEastAsia" w:hAnsi="Cambria Math"/>
+                        </w:rPr>
+                        <m:t>3</m:t>
+                      </m:r>
+                    </m:sup>
+                  </m:sSup>
+                  <m:sSup>
+                    <m:sSupPr>
+                      <m:ctrlPr>
+                        <w:rPr>
+                          <w:rFonts w:ascii="Cambria Math" w:eastAsiaTheme="minorEastAsia" w:hAnsi="Cambria Math"/>
+                          <w:i/>
+                          <w:iCs/>
+                        </w:rPr>
+                      </m:ctrlPr>
+                    </m:sSupPr>
+                    <m:e>
+                      <m:d>
+                        <m:dPr>
+                          <m:ctrlPr>
+                            <w:rPr>
+                              <w:rFonts w:ascii="Cambria Math" w:eastAsiaTheme="minorEastAsia" w:hAnsi="Cambria Math"/>
+                              <w:i/>
+                              <w:iCs/>
+                            </w:rPr>
+                          </m:ctrlPr>
+                        </m:dPr>
+                        <m:e>
+                          <m:r>
+                            <w:rPr>
+                              <w:rFonts w:ascii="Cambria Math" w:eastAsiaTheme="minorEastAsia" w:hAnsi="Cambria Math"/>
+                            </w:rPr>
+                            <m:t>-640320k</m:t>
+                          </m:r>
+                        </m:e>
+                      </m:d>
+                    </m:e>
+                    <m:sup>
+                      <m:r>
+                        <w:rPr>
+                          <w:rFonts w:ascii="Cambria Math" w:eastAsiaTheme="minorEastAsia" w:hAnsi="Cambria Math"/>
+                        </w:rPr>
+                        <m:t>3k</m:t>
+                      </m:r>
+                    </m:sup>
+                  </m:sSup>
+                </m:den>
+              </m:f>
+            </m:e>
+          </m:nary>
+        </m:oMath>
+      </m:oMathPara>
+    </w:p>
+    <w:p>
+      <w:pPr>
+        <w:rPr>
+          <w:rFonts w:eastAsiaTheme="minorEastAsia"/>
+          <w:iCs/>
+        </w:rPr>
+      </w:pPr>
+    </w:p>
+    <w:p>
+      <w:pPr>
         <w:pStyle w:val="Cmsor2"/>
       </w:pPr>
       <w:bookmarkStart w:id="18" w:name="_Toc218619930"/>
       <w:r>
+        <w:lastRenderedPageBreak/>
         <w:t>Számológép megvalósítása</w:t>
       </w:r>
       <w:bookmarkEnd w:id="18"/>
@@ -8821,7 +10866,15 @@
       </w:pPr>
       <w:bookmarkStart w:id="21" w:name="_Toc218619933"/>
       <w:r>
-        <w:t>Euklideszi tér számológép (EuclideanSpace)</w:t>
+        <w:t>Euklideszi tér számológép (</w:t>
+      </w:r>
+      <w:proofErr w:type="spellStart"/>
+      <w:r>
+        <w:t>EuclideanSpace</w:t>
+      </w:r>
+      <w:proofErr w:type="spellEnd"/>
+      <w:r>
+        <w:t>)</w:t>
       </w:r>
       <w:bookmarkEnd w:id="21"/>
     </w:p>
@@ -8831,7 +10884,15 @@
       </w:pPr>
       <w:bookmarkStart w:id="22" w:name="_Toc218619934"/>
       <w:r>
-        <w:t>Polinom számológép (Polynomials)</w:t>
+        <w:t>Polinom számológép (</w:t>
+      </w:r>
+      <w:proofErr w:type="spellStart"/>
+      <w:r>
+        <w:t>Polynomials</w:t>
+      </w:r>
+      <w:proofErr w:type="spellEnd"/>
+      <w:r>
+        <w:t>)</w:t>
       </w:r>
       <w:bookmarkEnd w:id="22"/>
     </w:p>
@@ -8841,7 +10902,15 @@
       </w:pPr>
       <w:bookmarkStart w:id="23" w:name="_Toc218619935"/>
       <w:r>
-        <w:t>Integrálközelítés számológép (Integral)</w:t>
+        <w:t>Integrálközelítés számológép (</w:t>
+      </w:r>
+      <w:proofErr w:type="spellStart"/>
+      <w:r>
+        <w:t>Integral</w:t>
+      </w:r>
+      <w:proofErr w:type="spellEnd"/>
+      <w:r>
+        <w:t>)</w:t>
       </w:r>
       <w:bookmarkEnd w:id="23"/>
     </w:p>
@@ -8927,7 +10996,6 @@
     </w:p>
     <w:p>
       <w:r>
-        <w:lastRenderedPageBreak/>
         <w:t>Török Bálint Bence – Kutatásbeli segítség</w:t>
       </w:r>
     </w:p>
@@ -10253,7 +12321,7 @@
   <w:style w:type="paragraph" w:default="1" w:styleId="Norml">
     <w:name w:val="Normal"/>
     <w:qFormat/>
-    <w:rsid w:val="009E62A8"/>
+    <w:rsid w:val="00DF2404"/>
     <w:pPr>
       <w:spacing w:line="360" w:lineRule="auto"/>
       <w:ind w:firstLine="227"/>
@@ -10463,7 +12531,6 @@
   <w:style w:type="character" w:default="1" w:styleId="Bekezdsalapbettpusa">
     <w:name w:val="Default Paragraph Font"/>
     <w:uiPriority w:val="1"/>
-    <w:semiHidden/>
     <w:unhideWhenUsed/>
   </w:style>
   <w:style w:type="table" w:default="1" w:styleId="Normltblzat">

</xml_diff>

<commit_message>
Adding full explanation to the binary splitting algorithm.
</commit_message>
<xml_diff>
--- a/Documentation.docx
+++ b/Documentation.docx
@@ -2589,7 +2589,13 @@
             <w:rPr>
               <w:rFonts w:ascii="Cambria Math" w:hAnsi="Cambria Math"/>
             </w:rPr>
-            <m:t>123=1×</m:t>
+            <m:t>123=1</m:t>
+          </m:r>
+          <m:r>
+            <w:rPr>
+              <w:rFonts w:ascii="Cambria Math" w:hAnsi="Cambria Math"/>
+            </w:rPr>
+            <m:t>∙</m:t>
           </m:r>
           <m:sSup>
             <m:sSupPr>
@@ -2621,7 +2627,13 @@
             <w:rPr>
               <w:rFonts w:ascii="Cambria Math" w:hAnsi="Cambria Math"/>
             </w:rPr>
-            <m:t>+2×</m:t>
+            <m:t>+2</m:t>
+          </m:r>
+          <m:r>
+            <w:rPr>
+              <w:rFonts w:ascii="Cambria Math" w:hAnsi="Cambria Math"/>
+            </w:rPr>
+            <m:t>∙</m:t>
           </m:r>
           <m:sSup>
             <m:sSupPr>
@@ -2653,7 +2665,13 @@
             <w:rPr>
               <w:rFonts w:ascii="Cambria Math" w:hAnsi="Cambria Math"/>
             </w:rPr>
-            <m:t>+3×</m:t>
+            <m:t>+3</m:t>
+          </m:r>
+          <m:r>
+            <w:rPr>
+              <w:rFonts w:ascii="Cambria Math" w:hAnsi="Cambria Math"/>
+            </w:rPr>
+            <m:t>∙</m:t>
           </m:r>
           <m:sSup>
             <m:sSupPr>
@@ -2703,7 +2721,13 @@
             <w:rPr>
               <w:rFonts w:ascii="Cambria Math" w:hAnsi="Cambria Math"/>
             </w:rPr>
-            <m:t>123.25=1×</m:t>
+            <m:t>123.25=1</m:t>
+          </m:r>
+          <m:r>
+            <w:rPr>
+              <w:rFonts w:ascii="Cambria Math" w:hAnsi="Cambria Math"/>
+            </w:rPr>
+            <m:t>∙</m:t>
           </m:r>
           <m:sSup>
             <m:sSupPr>
@@ -2735,7 +2759,13 @@
             <w:rPr>
               <w:rFonts w:ascii="Cambria Math" w:hAnsi="Cambria Math"/>
             </w:rPr>
-            <m:t>+2×</m:t>
+            <m:t>+2</m:t>
+          </m:r>
+          <m:r>
+            <w:rPr>
+              <w:rFonts w:ascii="Cambria Math" w:hAnsi="Cambria Math"/>
+            </w:rPr>
+            <m:t>∙</m:t>
           </m:r>
           <m:sSup>
             <m:sSupPr>
@@ -2767,7 +2797,13 @@
             <w:rPr>
               <w:rFonts w:ascii="Cambria Math" w:hAnsi="Cambria Math"/>
             </w:rPr>
-            <m:t>+3×</m:t>
+            <m:t>+3</m:t>
+          </m:r>
+          <m:r>
+            <w:rPr>
+              <w:rFonts w:ascii="Cambria Math" w:hAnsi="Cambria Math"/>
+            </w:rPr>
+            <m:t>∙</m:t>
           </m:r>
           <m:sSup>
             <m:sSupPr>
@@ -2799,7 +2835,13 @@
             <w:rPr>
               <w:rFonts w:ascii="Cambria Math" w:hAnsi="Cambria Math"/>
             </w:rPr>
-            <m:t>+2×</m:t>
+            <m:t>+2</m:t>
+          </m:r>
+          <m:r>
+            <w:rPr>
+              <w:rFonts w:ascii="Cambria Math" w:hAnsi="Cambria Math"/>
+            </w:rPr>
+            <m:t>∙</m:t>
           </m:r>
           <m:sSup>
             <m:sSupPr>
@@ -2831,7 +2873,13 @@
             <w:rPr>
               <w:rFonts w:ascii="Cambria Math" w:hAnsi="Cambria Math"/>
             </w:rPr>
-            <m:t>+5×</m:t>
+            <m:t>+5</m:t>
+          </m:r>
+          <m:r>
+            <w:rPr>
+              <w:rFonts w:ascii="Cambria Math" w:hAnsi="Cambria Math"/>
+            </w:rPr>
+            <m:t>∙</m:t>
           </m:r>
           <m:sSup>
             <m:sSupPr>
@@ -2951,6 +2999,9 @@
         </w:rPr>
       </w:pPr>
       <m:oMathPara>
+        <m:oMathParaPr>
+          <m:jc m:val="center"/>
+        </m:oMathParaPr>
         <m:oMath>
           <m:sSub>
             <m:sSubPr>
@@ -2980,9 +3031,21 @@
           </m:sSub>
           <m:r>
             <w:rPr>
+              <w:rFonts w:ascii="Cambria Math" w:eastAsiaTheme="minorEastAsia" w:hAnsi="Cambria Math"/>
+            </w:rPr>
+            <m:t>→</m:t>
+          </m:r>
+          <m:r>
+            <w:rPr>
               <w:rFonts w:ascii="Cambria Math" w:hAnsi="Cambria Math"/>
             </w:rPr>
-            <m:t>=1×</m:t>
+            <m:t>1</m:t>
+          </m:r>
+          <m:r>
+            <w:rPr>
+              <w:rFonts w:ascii="Cambria Math" w:hAnsi="Cambria Math"/>
+            </w:rPr>
+            <m:t>∙</m:t>
           </m:r>
           <m:sSup>
             <m:sSupPr>
@@ -3014,7 +3077,13 @@
             <w:rPr>
               <w:rFonts w:ascii="Cambria Math" w:hAnsi="Cambria Math"/>
             </w:rPr>
-            <m:t>+0×</m:t>
+            <m:t>+0</m:t>
+          </m:r>
+          <m:r>
+            <w:rPr>
+              <w:rFonts w:ascii="Cambria Math" w:hAnsi="Cambria Math"/>
+            </w:rPr>
+            <m:t>∙</m:t>
           </m:r>
           <m:sSup>
             <m:sSupPr>
@@ -3046,7 +3115,13 @@
             <w:rPr>
               <w:rFonts w:ascii="Cambria Math" w:hAnsi="Cambria Math"/>
             </w:rPr>
-            <m:t>+1×</m:t>
+            <m:t>+1</m:t>
+          </m:r>
+          <m:r>
+            <w:rPr>
+              <w:rFonts w:ascii="Cambria Math" w:hAnsi="Cambria Math"/>
+            </w:rPr>
+            <m:t>∙</m:t>
           </m:r>
           <m:sSup>
             <m:sSupPr>
@@ -3078,7 +3153,13 @@
             <w:rPr>
               <w:rFonts w:ascii="Cambria Math" w:hAnsi="Cambria Math"/>
             </w:rPr>
-            <m:t>+1×</m:t>
+            <m:t>+1</m:t>
+          </m:r>
+          <m:r>
+            <w:rPr>
+              <w:rFonts w:ascii="Cambria Math" w:hAnsi="Cambria Math"/>
+            </w:rPr>
+            <m:t>∙</m:t>
           </m:r>
           <m:sSup>
             <m:sSupPr>
@@ -3110,7 +3191,13 @@
             <w:rPr>
               <w:rFonts w:ascii="Cambria Math" w:hAnsi="Cambria Math"/>
             </w:rPr>
-            <m:t>+1×</m:t>
+            <m:t>+1</m:t>
+          </m:r>
+          <m:r>
+            <w:rPr>
+              <w:rFonts w:ascii="Cambria Math" w:hAnsi="Cambria Math"/>
+            </w:rPr>
+            <m:t>∙</m:t>
           </m:r>
           <m:sSup>
             <m:sSupPr>
@@ -3142,7 +3229,13 @@
             <w:rPr>
               <w:rFonts w:ascii="Cambria Math" w:hAnsi="Cambria Math"/>
             </w:rPr>
-            <m:t>+1×</m:t>
+            <m:t>+1</m:t>
+          </m:r>
+          <m:r>
+            <w:rPr>
+              <w:rFonts w:ascii="Cambria Math" w:hAnsi="Cambria Math"/>
+            </w:rPr>
+            <m:t>∙</m:t>
           </m:r>
           <m:sSup>
             <m:sSupPr>
@@ -3174,7 +3267,27 @@
             <w:rPr>
               <w:rFonts w:ascii="Cambria Math" w:hAnsi="Cambria Math"/>
             </w:rPr>
-            <m:t>==8+0+2+1+½+¼=20.75</m:t>
+            <m:t>=</m:t>
+          </m:r>
+          <m:r>
+            <w:rPr>
+              <w:rFonts w:ascii="Cambria Math" w:hAnsi="Cambria Math"/>
+            </w:rPr>
+            <w:br/>
+          </m:r>
+        </m:oMath>
+        <m:oMath>
+          <m:r>
+            <w:rPr>
+              <w:rFonts w:ascii="Cambria Math" w:hAnsi="Cambria Math"/>
+            </w:rPr>
+            <m:t>=</m:t>
+          </m:r>
+          <m:r>
+            <w:rPr>
+              <w:rFonts w:ascii="Cambria Math" w:hAnsi="Cambria Math"/>
+            </w:rPr>
+            <m:t>8+0+2+1+½+¼=20.75</m:t>
           </m:r>
         </m:oMath>
       </m:oMathPara>
@@ -3623,7 +3736,7 @@
           <w:rPr>
             <w:rFonts w:ascii="Cambria Math" w:eastAsiaTheme="minorEastAsia" w:hAnsi="Cambria Math"/>
           </w:rPr>
-          <m:t>×</m:t>
+          <m:t>∙</m:t>
         </m:r>
         <m:sSup>
           <m:sSupPr>
@@ -3831,15 +3944,7 @@
         <w:jc w:val="center"/>
       </w:pPr>
       <w:r>
-        <w:t xml:space="preserve">&lt;kép egy 0-nál kisebb számról ami rövidebb mint a </w:t>
-      </w:r>
-      <w:proofErr w:type="spellStart"/>
-      <w:r>
-        <w:t>fractionLength</w:t>
-      </w:r>
-      <w:proofErr w:type="spellEnd"/>
-      <w:r>
-        <w:t>&gt;</w:t>
+        <w:t>&lt;kép egy 0-nál kisebb számról ami rövidebb mint a fractionLength&gt;</w:t>
       </w:r>
     </w:p>
     <w:p>
@@ -4364,13 +4469,8 @@
         <w:t>long</w:t>
       </w:r>
       <w:r>
-        <w:t xml:space="preserve"> </w:t>
-      </w:r>
-      <w:proofErr w:type="spellStart"/>
-      <w:r>
-        <w:t>long</w:t>
-      </w:r>
-      <w:proofErr w:type="spellEnd"/>
+        <w:t xml:space="preserve"> long</w:t>
+      </w:r>
       <w:r>
         <w:t xml:space="preserve"> számtípus</w:t>
       </w:r>
@@ -4385,7 +4485,13 @@
           <w:rPr>
             <w:rFonts w:ascii="Cambria Math" w:hAnsi="Cambria Math"/>
           </w:rPr>
-          <m:t>18×</m:t>
+          <m:t>18</m:t>
+        </m:r>
+        <m:r>
+          <w:rPr>
+            <w:rFonts w:ascii="Cambria Math" w:hAnsi="Cambria Math"/>
+          </w:rPr>
+          <m:t>∙</m:t>
         </m:r>
         <m:sSup>
           <m:sSupPr>
@@ -4793,7 +4899,91 @@
             <w:rPr>
               <w:rFonts w:ascii="Cambria Math" w:hAnsi="Cambria Math"/>
             </w:rPr>
-            <m:t>=2×2×2×2×2×2×2×2</m:t>
+            <m:t>=2</m:t>
+          </m:r>
+          <m:r>
+            <w:rPr>
+              <w:rFonts w:ascii="Cambria Math" w:hAnsi="Cambria Math"/>
+            </w:rPr>
+            <m:t>∙</m:t>
+          </m:r>
+          <m:r>
+            <w:rPr>
+              <w:rFonts w:ascii="Cambria Math" w:hAnsi="Cambria Math"/>
+            </w:rPr>
+            <m:t>2</m:t>
+          </m:r>
+          <m:r>
+            <w:rPr>
+              <w:rFonts w:ascii="Cambria Math" w:hAnsi="Cambria Math"/>
+            </w:rPr>
+            <m:t>∙</m:t>
+          </m:r>
+          <m:r>
+            <w:rPr>
+              <w:rFonts w:ascii="Cambria Math" w:hAnsi="Cambria Math"/>
+            </w:rPr>
+            <m:t>2</m:t>
+          </m:r>
+          <m:r>
+            <w:rPr>
+              <w:rFonts w:ascii="Cambria Math" w:hAnsi="Cambria Math"/>
+            </w:rPr>
+            <m:t>∙</m:t>
+          </m:r>
+          <m:r>
+            <w:rPr>
+              <w:rFonts w:ascii="Cambria Math" w:hAnsi="Cambria Math"/>
+            </w:rPr>
+            <m:t>2</m:t>
+          </m:r>
+          <m:r>
+            <w:rPr>
+              <w:rFonts w:ascii="Cambria Math" w:hAnsi="Cambria Math"/>
+            </w:rPr>
+            <m:t>∙</m:t>
+          </m:r>
+          <m:r>
+            <w:rPr>
+              <w:rFonts w:ascii="Cambria Math" w:hAnsi="Cambria Math"/>
+            </w:rPr>
+            <m:t>2</m:t>
+          </m:r>
+          <m:r>
+            <w:rPr>
+              <w:rFonts w:ascii="Cambria Math" w:hAnsi="Cambria Math"/>
+            </w:rPr>
+            <m:t>∙</m:t>
+          </m:r>
+          <m:r>
+            <w:rPr>
+              <w:rFonts w:ascii="Cambria Math" w:hAnsi="Cambria Math"/>
+            </w:rPr>
+            <m:t>2</m:t>
+          </m:r>
+          <m:r>
+            <w:rPr>
+              <w:rFonts w:ascii="Cambria Math" w:hAnsi="Cambria Math"/>
+            </w:rPr>
+            <m:t>∙</m:t>
+          </m:r>
+          <m:r>
+            <w:rPr>
+              <w:rFonts w:ascii="Cambria Math" w:hAnsi="Cambria Math"/>
+            </w:rPr>
+            <m:t>2</m:t>
+          </m:r>
+          <m:r>
+            <w:rPr>
+              <w:rFonts w:ascii="Cambria Math" w:hAnsi="Cambria Math"/>
+            </w:rPr>
+            <m:t>∙</m:t>
+          </m:r>
+          <m:r>
+            <w:rPr>
+              <w:rFonts w:ascii="Cambria Math" w:hAnsi="Cambria Math"/>
+            </w:rPr>
+            <m:t>2</m:t>
           </m:r>
           <m:r>
             <w:rPr>
@@ -4815,7 +5005,43 @@
                 <w:rPr>
                   <w:rFonts w:ascii="Cambria Math" w:eastAsiaTheme="minorEastAsia" w:hAnsi="Cambria Math"/>
                 </w:rPr>
-                <m:t>2×2×2×2</m:t>
+                <m:t>2</m:t>
+              </m:r>
+              <m:r>
+                <w:rPr>
+                  <w:rFonts w:ascii="Cambria Math" w:eastAsiaTheme="minorEastAsia" w:hAnsi="Cambria Math"/>
+                </w:rPr>
+                <m:t>∙</m:t>
+              </m:r>
+              <m:r>
+                <w:rPr>
+                  <w:rFonts w:ascii="Cambria Math" w:eastAsiaTheme="minorEastAsia" w:hAnsi="Cambria Math"/>
+                </w:rPr>
+                <m:t>2</m:t>
+              </m:r>
+              <m:r>
+                <w:rPr>
+                  <w:rFonts w:ascii="Cambria Math" w:eastAsiaTheme="minorEastAsia" w:hAnsi="Cambria Math"/>
+                </w:rPr>
+                <m:t>∙</m:t>
+              </m:r>
+              <m:r>
+                <w:rPr>
+                  <w:rFonts w:ascii="Cambria Math" w:eastAsiaTheme="minorEastAsia" w:hAnsi="Cambria Math"/>
+                </w:rPr>
+                <m:t>2</m:t>
+              </m:r>
+              <m:r>
+                <w:rPr>
+                  <w:rFonts w:ascii="Cambria Math" w:eastAsiaTheme="minorEastAsia" w:hAnsi="Cambria Math"/>
+                </w:rPr>
+                <m:t>∙</m:t>
+              </m:r>
+              <m:r>
+                <w:rPr>
+                  <w:rFonts w:ascii="Cambria Math" w:eastAsiaTheme="minorEastAsia" w:hAnsi="Cambria Math"/>
+                </w:rPr>
+                <m:t>2</m:t>
               </m:r>
             </m:e>
           </m:d>
@@ -4823,7 +5049,7 @@
             <w:rPr>
               <w:rFonts w:ascii="Cambria Math" w:eastAsiaTheme="minorEastAsia" w:hAnsi="Cambria Math"/>
             </w:rPr>
-            <m:t>×</m:t>
+            <m:t>∙</m:t>
           </m:r>
           <m:d>
             <m:dPr>
@@ -4839,7 +5065,43 @@
                 <w:rPr>
                   <w:rFonts w:ascii="Cambria Math" w:eastAsiaTheme="minorEastAsia" w:hAnsi="Cambria Math"/>
                 </w:rPr>
-                <m:t>2×2×2×2</m:t>
+                <m:t>2</m:t>
+              </m:r>
+              <m:r>
+                <w:rPr>
+                  <w:rFonts w:ascii="Cambria Math" w:eastAsiaTheme="minorEastAsia" w:hAnsi="Cambria Math"/>
+                </w:rPr>
+                <m:t>∙</m:t>
+              </m:r>
+              <m:r>
+                <w:rPr>
+                  <w:rFonts w:ascii="Cambria Math" w:eastAsiaTheme="minorEastAsia" w:hAnsi="Cambria Math"/>
+                </w:rPr>
+                <m:t>2</m:t>
+              </m:r>
+              <m:r>
+                <w:rPr>
+                  <w:rFonts w:ascii="Cambria Math" w:eastAsiaTheme="minorEastAsia" w:hAnsi="Cambria Math"/>
+                </w:rPr>
+                <m:t>∙</m:t>
+              </m:r>
+              <m:r>
+                <w:rPr>
+                  <w:rFonts w:ascii="Cambria Math" w:eastAsiaTheme="minorEastAsia" w:hAnsi="Cambria Math"/>
+                </w:rPr>
+                <m:t>2</m:t>
+              </m:r>
+              <m:r>
+                <w:rPr>
+                  <w:rFonts w:ascii="Cambria Math" w:eastAsiaTheme="minorEastAsia" w:hAnsi="Cambria Math"/>
+                </w:rPr>
+                <m:t>∙</m:t>
+              </m:r>
+              <m:r>
+                <w:rPr>
+                  <w:rFonts w:ascii="Cambria Math" w:eastAsiaTheme="minorEastAsia" w:hAnsi="Cambria Math"/>
+                </w:rPr>
+                <m:t>2</m:t>
               </m:r>
             </m:e>
           </m:d>
@@ -4980,7 +5242,91 @@
             <w:rPr>
               <w:rFonts w:ascii="Cambria Math" w:hAnsi="Cambria Math"/>
             </w:rPr>
-            <m:t>2×2×2×2×2×2×2×2</m:t>
+            <m:t>2</m:t>
+          </m:r>
+          <m:r>
+            <w:rPr>
+              <w:rFonts w:ascii="Cambria Math" w:hAnsi="Cambria Math"/>
+            </w:rPr>
+            <m:t>∙</m:t>
+          </m:r>
+          <m:r>
+            <w:rPr>
+              <w:rFonts w:ascii="Cambria Math" w:hAnsi="Cambria Math"/>
+            </w:rPr>
+            <m:t>2</m:t>
+          </m:r>
+          <m:r>
+            <w:rPr>
+              <w:rFonts w:ascii="Cambria Math" w:hAnsi="Cambria Math"/>
+            </w:rPr>
+            <m:t>∙</m:t>
+          </m:r>
+          <m:r>
+            <w:rPr>
+              <w:rFonts w:ascii="Cambria Math" w:hAnsi="Cambria Math"/>
+            </w:rPr>
+            <m:t>2</m:t>
+          </m:r>
+          <m:r>
+            <w:rPr>
+              <w:rFonts w:ascii="Cambria Math" w:hAnsi="Cambria Math"/>
+            </w:rPr>
+            <m:t>∙</m:t>
+          </m:r>
+          <m:r>
+            <w:rPr>
+              <w:rFonts w:ascii="Cambria Math" w:hAnsi="Cambria Math"/>
+            </w:rPr>
+            <m:t>2</m:t>
+          </m:r>
+          <m:r>
+            <w:rPr>
+              <w:rFonts w:ascii="Cambria Math" w:hAnsi="Cambria Math"/>
+            </w:rPr>
+            <m:t>∙</m:t>
+          </m:r>
+          <m:r>
+            <w:rPr>
+              <w:rFonts w:ascii="Cambria Math" w:hAnsi="Cambria Math"/>
+            </w:rPr>
+            <m:t>2</m:t>
+          </m:r>
+          <m:r>
+            <w:rPr>
+              <w:rFonts w:ascii="Cambria Math" w:hAnsi="Cambria Math"/>
+            </w:rPr>
+            <m:t>∙</m:t>
+          </m:r>
+          <m:r>
+            <w:rPr>
+              <w:rFonts w:ascii="Cambria Math" w:hAnsi="Cambria Math"/>
+            </w:rPr>
+            <m:t>2</m:t>
+          </m:r>
+          <m:r>
+            <w:rPr>
+              <w:rFonts w:ascii="Cambria Math" w:hAnsi="Cambria Math"/>
+            </w:rPr>
+            <m:t>∙</m:t>
+          </m:r>
+          <m:r>
+            <w:rPr>
+              <w:rFonts w:ascii="Cambria Math" w:hAnsi="Cambria Math"/>
+            </w:rPr>
+            <m:t>2</m:t>
+          </m:r>
+          <m:r>
+            <w:rPr>
+              <w:rFonts w:ascii="Cambria Math" w:hAnsi="Cambria Math"/>
+            </w:rPr>
+            <m:t>∙</m:t>
+          </m:r>
+          <m:r>
+            <w:rPr>
+              <w:rFonts w:ascii="Cambria Math" w:hAnsi="Cambria Math"/>
+            </w:rPr>
+            <m:t>2</m:t>
           </m:r>
           <m:r>
             <w:rPr>
@@ -5002,7 +5348,43 @@
                 <w:rPr>
                   <w:rFonts w:ascii="Cambria Math" w:eastAsiaTheme="minorEastAsia" w:hAnsi="Cambria Math"/>
                 </w:rPr>
-                <m:t>2×2×2×2</m:t>
+                <m:t>2</m:t>
+              </m:r>
+              <m:r>
+                <w:rPr>
+                  <w:rFonts w:ascii="Cambria Math" w:eastAsiaTheme="minorEastAsia" w:hAnsi="Cambria Math"/>
+                </w:rPr>
+                <m:t>∙</m:t>
+              </m:r>
+              <m:r>
+                <w:rPr>
+                  <w:rFonts w:ascii="Cambria Math" w:eastAsiaTheme="minorEastAsia" w:hAnsi="Cambria Math"/>
+                </w:rPr>
+                <m:t>2</m:t>
+              </m:r>
+              <m:r>
+                <w:rPr>
+                  <w:rFonts w:ascii="Cambria Math" w:eastAsiaTheme="minorEastAsia" w:hAnsi="Cambria Math"/>
+                </w:rPr>
+                <m:t>∙</m:t>
+              </m:r>
+              <m:r>
+                <w:rPr>
+                  <w:rFonts w:ascii="Cambria Math" w:eastAsiaTheme="minorEastAsia" w:hAnsi="Cambria Math"/>
+                </w:rPr>
+                <m:t>2</m:t>
+              </m:r>
+              <m:r>
+                <w:rPr>
+                  <w:rFonts w:ascii="Cambria Math" w:eastAsiaTheme="minorEastAsia" w:hAnsi="Cambria Math"/>
+                </w:rPr>
+                <m:t>∙</m:t>
+              </m:r>
+              <m:r>
+                <w:rPr>
+                  <w:rFonts w:ascii="Cambria Math" w:eastAsiaTheme="minorEastAsia" w:hAnsi="Cambria Math"/>
+                </w:rPr>
+                <m:t>2</m:t>
               </m:r>
             </m:e>
           </m:d>
@@ -5010,7 +5392,7 @@
             <w:rPr>
               <w:rFonts w:ascii="Cambria Math" w:eastAsiaTheme="minorEastAsia" w:hAnsi="Cambria Math"/>
             </w:rPr>
-            <m:t>×</m:t>
+            <m:t>∙</m:t>
           </m:r>
           <m:d>
             <m:dPr>
@@ -5026,7 +5408,43 @@
                 <w:rPr>
                   <w:rFonts w:ascii="Cambria Math" w:eastAsiaTheme="minorEastAsia" w:hAnsi="Cambria Math"/>
                 </w:rPr>
-                <m:t>2×2×2×2</m:t>
+                <m:t>2</m:t>
+              </m:r>
+              <m:r>
+                <w:rPr>
+                  <w:rFonts w:ascii="Cambria Math" w:eastAsiaTheme="minorEastAsia" w:hAnsi="Cambria Math"/>
+                </w:rPr>
+                <m:t>∙</m:t>
+              </m:r>
+              <m:r>
+                <w:rPr>
+                  <w:rFonts w:ascii="Cambria Math" w:eastAsiaTheme="minorEastAsia" w:hAnsi="Cambria Math"/>
+                </w:rPr>
+                <m:t>2</m:t>
+              </m:r>
+              <m:r>
+                <w:rPr>
+                  <w:rFonts w:ascii="Cambria Math" w:eastAsiaTheme="minorEastAsia" w:hAnsi="Cambria Math"/>
+                </w:rPr>
+                <m:t>∙</m:t>
+              </m:r>
+              <m:r>
+                <w:rPr>
+                  <w:rFonts w:ascii="Cambria Math" w:eastAsiaTheme="minorEastAsia" w:hAnsi="Cambria Math"/>
+                </w:rPr>
+                <m:t>2</m:t>
+              </m:r>
+              <m:r>
+                <w:rPr>
+                  <w:rFonts w:ascii="Cambria Math" w:eastAsiaTheme="minorEastAsia" w:hAnsi="Cambria Math"/>
+                </w:rPr>
+                <m:t>∙</m:t>
+              </m:r>
+              <m:r>
+                <w:rPr>
+                  <w:rFonts w:ascii="Cambria Math" w:eastAsiaTheme="minorEastAsia" w:hAnsi="Cambria Math"/>
+                </w:rPr>
+                <m:t>2</m:t>
               </m:r>
             </m:e>
           </m:d>
@@ -5060,7 +5478,19 @@
                     <w:rPr>
                       <w:rFonts w:ascii="Cambria Math" w:eastAsiaTheme="minorEastAsia" w:hAnsi="Cambria Math"/>
                     </w:rPr>
-                    <m:t>2×2</m:t>
+                    <m:t>2</m:t>
+                  </m:r>
+                  <m:r>
+                    <w:rPr>
+                      <w:rFonts w:ascii="Cambria Math" w:eastAsiaTheme="minorEastAsia" w:hAnsi="Cambria Math"/>
+                    </w:rPr>
+                    <m:t>∙</m:t>
+                  </m:r>
+                  <m:r>
+                    <w:rPr>
+                      <w:rFonts w:ascii="Cambria Math" w:eastAsiaTheme="minorEastAsia" w:hAnsi="Cambria Math"/>
+                    </w:rPr>
+                    <m:t>2</m:t>
                   </m:r>
                 </m:e>
               </m:d>
@@ -5068,7 +5498,7 @@
                 <w:rPr>
                   <w:rFonts w:ascii="Cambria Math" w:eastAsiaTheme="minorEastAsia" w:hAnsi="Cambria Math"/>
                 </w:rPr>
-                <m:t>×</m:t>
+                <m:t>∙</m:t>
               </m:r>
               <m:d>
                 <m:dPr>
@@ -5084,7 +5514,19 @@
                     <w:rPr>
                       <w:rFonts w:ascii="Cambria Math" w:eastAsiaTheme="minorEastAsia" w:hAnsi="Cambria Math"/>
                     </w:rPr>
-                    <m:t>2×2</m:t>
+                    <m:t>2</m:t>
+                  </m:r>
+                  <m:r>
+                    <w:rPr>
+                      <w:rFonts w:ascii="Cambria Math" w:eastAsiaTheme="minorEastAsia" w:hAnsi="Cambria Math"/>
+                    </w:rPr>
+                    <m:t>∙</m:t>
+                  </m:r>
+                  <m:r>
+                    <w:rPr>
+                      <w:rFonts w:ascii="Cambria Math" w:eastAsiaTheme="minorEastAsia" w:hAnsi="Cambria Math"/>
+                    </w:rPr>
+                    <m:t>2</m:t>
                   </m:r>
                 </m:e>
               </m:d>
@@ -5094,7 +5536,7 @@
             <w:rPr>
               <w:rFonts w:ascii="Cambria Math" w:eastAsiaTheme="minorEastAsia" w:hAnsi="Cambria Math"/>
             </w:rPr>
-            <m:t>×</m:t>
+            <m:t>∙</m:t>
           </m:r>
           <m:d>
             <m:dPr>
@@ -5120,7 +5562,19 @@
                     <w:rPr>
                       <w:rFonts w:ascii="Cambria Math" w:eastAsiaTheme="minorEastAsia" w:hAnsi="Cambria Math"/>
                     </w:rPr>
-                    <m:t>2×2</m:t>
+                    <m:t>2</m:t>
+                  </m:r>
+                  <m:r>
+                    <w:rPr>
+                      <w:rFonts w:ascii="Cambria Math" w:eastAsiaTheme="minorEastAsia" w:hAnsi="Cambria Math"/>
+                    </w:rPr>
+                    <m:t>∙</m:t>
+                  </m:r>
+                  <m:r>
+                    <w:rPr>
+                      <w:rFonts w:ascii="Cambria Math" w:eastAsiaTheme="minorEastAsia" w:hAnsi="Cambria Math"/>
+                    </w:rPr>
+                    <m:t>2</m:t>
                   </m:r>
                 </m:e>
               </m:d>
@@ -5128,7 +5582,7 @@
                 <w:rPr>
                   <w:rFonts w:ascii="Cambria Math" w:eastAsiaTheme="minorEastAsia" w:hAnsi="Cambria Math"/>
                 </w:rPr>
-                <m:t>×</m:t>
+                <m:t>∙</m:t>
               </m:r>
               <m:d>
                 <m:dPr>
@@ -5144,7 +5598,19 @@
                     <w:rPr>
                       <w:rFonts w:ascii="Cambria Math" w:eastAsiaTheme="minorEastAsia" w:hAnsi="Cambria Math"/>
                     </w:rPr>
-                    <m:t>2×2</m:t>
+                    <m:t>2</m:t>
+                  </m:r>
+                  <m:r>
+                    <w:rPr>
+                      <w:rFonts w:ascii="Cambria Math" w:eastAsiaTheme="minorEastAsia" w:hAnsi="Cambria Math"/>
+                    </w:rPr>
+                    <m:t>∙</m:t>
+                  </m:r>
+                  <m:r>
+                    <w:rPr>
+                      <w:rFonts w:ascii="Cambria Math" w:eastAsiaTheme="minorEastAsia" w:hAnsi="Cambria Math"/>
+                    </w:rPr>
+                    <m:t>2</m:t>
                   </m:r>
                 </m:e>
               </m:d>
@@ -5701,71 +6167,49 @@
         <w:rPr>
           <w:rFonts w:eastAsiaTheme="minorEastAsia"/>
         </w:rPr>
-        <w:t xml:space="preserve">François </w:t>
-      </w:r>
-      <w:proofErr w:type="spellStart"/>
+        <w:t>François Viète</w:t>
+      </w:r>
       <w:r>
         <w:rPr>
           <w:rFonts w:eastAsiaTheme="minorEastAsia"/>
         </w:rPr>
-        <w:t>Viète</w:t>
-      </w:r>
-      <w:proofErr w:type="spellEnd"/>
+        <w:t>, híres matematikus</w:t>
+      </w:r>
       <w:r>
         <w:rPr>
           <w:rFonts w:eastAsiaTheme="minorEastAsia"/>
         </w:rPr>
-        <w:t>, híres matematikus</w:t>
+        <w:t xml:space="preserve"> által </w:t>
       </w:r>
       <w:r>
         <w:rPr>
           <w:rFonts w:eastAsiaTheme="minorEastAsia"/>
         </w:rPr>
-        <w:t xml:space="preserve"> által </w:t>
+        <w:t xml:space="preserve">kifejlesztett </w:t>
       </w:r>
       <w:r>
         <w:rPr>
           <w:rFonts w:eastAsiaTheme="minorEastAsia"/>
         </w:rPr>
-        <w:t xml:space="preserve">kifejlesztett </w:t>
+        <w:t xml:space="preserve">módszert </w:t>
       </w:r>
       <w:r>
         <w:rPr>
           <w:rFonts w:eastAsiaTheme="minorEastAsia"/>
         </w:rPr>
-        <w:t xml:space="preserve">módszert </w:t>
+        <w:t>alkalmaz a könyvtár</w:t>
       </w:r>
       <w:r>
         <w:rPr>
           <w:rFonts w:eastAsiaTheme="minorEastAsia"/>
         </w:rPr>
-        <w:t>alkalmaz a könyvtár</w:t>
+        <w:t xml:space="preserve">, </w:t>
       </w:r>
       <w:r>
         <w:rPr>
           <w:rFonts w:eastAsiaTheme="minorEastAsia"/>
         </w:rPr>
-        <w:t xml:space="preserve">, </w:t>
-      </w:r>
-      <w:r>
-        <w:rPr>
-          <w:rFonts w:eastAsiaTheme="minorEastAsia"/>
-        </w:rPr>
-        <w:t xml:space="preserve">amit </w:t>
-      </w:r>
-      <w:proofErr w:type="spellStart"/>
-      <w:r>
-        <w:rPr>
-          <w:rFonts w:eastAsiaTheme="minorEastAsia"/>
-        </w:rPr>
-        <w:t>Viète</w:t>
-      </w:r>
-      <w:proofErr w:type="spellEnd"/>
-      <w:r>
-        <w:rPr>
-          <w:rFonts w:eastAsiaTheme="minorEastAsia"/>
-        </w:rPr>
-        <w:t xml:space="preserve"> </w:t>
+        <w:t xml:space="preserve">amit Viète </w:t>
       </w:r>
       <w:r>
         <w:rPr>
@@ -6993,15 +7437,7 @@
     </w:p>
     <w:p>
       <w:r>
-        <w:t xml:space="preserve">Egyszerűbben úgy tudnánk elképzelni a fenti számítást, mint a kézi osztás (long </w:t>
-      </w:r>
-      <w:proofErr w:type="spellStart"/>
-      <w:r>
-        <w:t>division</w:t>
-      </w:r>
-      <w:proofErr w:type="spellEnd"/>
-      <w:r>
-        <w:t xml:space="preserve">) műveletsorát. Itt is a legnagyobb helyiértékű számjegytől kezdve folyamatosan alulról közelítjük az eredményünket a valós értékhez. </w:t>
+        <w:t xml:space="preserve">Egyszerűbben úgy tudnánk elképzelni a fenti számítást, mint a kézi osztás (long division) műveletsorát. Itt is a legnagyobb helyiértékű számjegytől kezdve folyamatosan alulról közelítjük az eredményünket a valós értékhez. </w:t>
       </w:r>
       <w:r>
         <w:t>Éppen</w:t>
@@ -7940,7 +8376,13 @@
                     <w:rPr>
                       <w:rFonts w:ascii="Cambria Math" w:hAnsi="Cambria Math"/>
                     </w:rPr>
-                    <m:t>a×</m:t>
+                    <m:t>a</m:t>
+                  </m:r>
+                  <m:r>
+                    <w:rPr>
+                      <w:rFonts w:ascii="Cambria Math" w:hAnsi="Cambria Math"/>
+                    </w:rPr>
+                    <m:t>∙</m:t>
                   </m:r>
                   <m:func>
                     <m:funcPr>
@@ -9123,7 +9565,7 @@
             <w:rPr>
               <w:rFonts w:ascii="Cambria Math" w:eastAsiaTheme="minorEastAsia" w:hAnsi="Cambria Math"/>
             </w:rPr>
-            <m:t>×</m:t>
+            <m:t>∙</m:t>
           </m:r>
           <m:f>
             <m:fPr>
@@ -9177,7 +9619,19 @@
                 <w:rPr>
                   <w:rFonts w:ascii="Cambria Math" w:eastAsiaTheme="minorEastAsia" w:hAnsi="Cambria Math"/>
                 </w:rPr>
-                <m:t>a×d</m:t>
+                <m:t>a</m:t>
+              </m:r>
+              <m:r>
+                <w:rPr>
+                  <w:rFonts w:ascii="Cambria Math" w:eastAsiaTheme="minorEastAsia" w:hAnsi="Cambria Math"/>
+                </w:rPr>
+                <m:t>∙</m:t>
+              </m:r>
+              <m:r>
+                <w:rPr>
+                  <w:rFonts w:ascii="Cambria Math" w:eastAsiaTheme="minorEastAsia" w:hAnsi="Cambria Math"/>
+                </w:rPr>
+                <m:t>d</m:t>
               </m:r>
             </m:num>
             <m:den>
@@ -9185,7 +9639,19 @@
                 <w:rPr>
                   <w:rFonts w:ascii="Cambria Math" w:eastAsiaTheme="minorEastAsia" w:hAnsi="Cambria Math"/>
                 </w:rPr>
-                <m:t>b×c</m:t>
+                <m:t>b</m:t>
+              </m:r>
+              <m:r>
+                <w:rPr>
+                  <w:rFonts w:ascii="Cambria Math" w:eastAsiaTheme="minorEastAsia" w:hAnsi="Cambria Math"/>
+                </w:rPr>
+                <m:t>∙</m:t>
+              </m:r>
+              <m:r>
+                <w:rPr>
+                  <w:rFonts w:ascii="Cambria Math" w:eastAsiaTheme="minorEastAsia" w:hAnsi="Cambria Math"/>
+                </w:rPr>
+                <m:t>c</m:t>
               </m:r>
             </m:den>
           </m:f>
@@ -9288,7 +9754,13 @@
                   <w:rPr>
                     <w:rFonts w:ascii="Cambria Math" w:hAnsi="Cambria Math"/>
                   </w:rPr>
-                  <m:t>a×</m:t>
+                  <m:t>a</m:t>
+                </m:r>
+                <m:r>
+                  <w:rPr>
+                    <w:rFonts w:ascii="Cambria Math" w:hAnsi="Cambria Math"/>
+                  </w:rPr>
+                  <m:t>∙</m:t>
                 </m:r>
                 <m:func>
                   <m:funcPr>
@@ -9382,60 +9854,50 @@
           <w:rFonts w:eastAsiaTheme="minorEastAsia"/>
           <w:iCs/>
         </w:rPr>
-        <w:t xml:space="preserve"> előismeret szükséges a bináris szétválasztás (</w:t>
-      </w:r>
-      <w:proofErr w:type="spellStart"/>
+        <w:t xml:space="preserve"> előismeret szükséges</w:t>
+      </w:r>
       <w:r>
         <w:rPr>
           <w:rFonts w:eastAsiaTheme="minorEastAsia"/>
           <w:iCs/>
         </w:rPr>
-        <w:t>binary</w:t>
-      </w:r>
-      <w:proofErr w:type="spellEnd"/>
+        <w:t xml:space="preserve"> a végtelen sorösszegek és</w:t>
+      </w:r>
       <w:r>
         <w:rPr>
           <w:rFonts w:eastAsiaTheme="minorEastAsia"/>
           <w:iCs/>
         </w:rPr>
-        <w:t xml:space="preserve"> </w:t>
-      </w:r>
-      <w:proofErr w:type="spellStart"/>
+        <w:t xml:space="preserve"> a bináris szétválasztás (binary splitting) alkalmazásá</w:t>
+      </w:r>
       <w:r>
         <w:rPr>
           <w:rFonts w:eastAsiaTheme="minorEastAsia"/>
           <w:iCs/>
         </w:rPr>
-        <w:t>splitting</w:t>
-      </w:r>
-      <w:proofErr w:type="spellEnd"/>
+        <w:t>ban</w:t>
+      </w:r>
       <w:r>
         <w:rPr>
           <w:rFonts w:eastAsiaTheme="minorEastAsia"/>
           <w:iCs/>
         </w:rPr>
-        <w:t>) alkalmazásá</w:t>
+        <w:t>.</w:t>
       </w:r>
       <w:r>
         <w:rPr>
           <w:rFonts w:eastAsiaTheme="minorEastAsia"/>
           <w:iCs/>
         </w:rPr>
-        <w:t>ban</w:t>
+        <w:t xml:space="preserve"> A módszer </w:t>
       </w:r>
       <w:r>
         <w:rPr>
           <w:rFonts w:eastAsiaTheme="minorEastAsia"/>
           <w:iCs/>
         </w:rPr>
-        <w:t>.</w:t>
-      </w:r>
-      <w:r>
-        <w:rPr>
-          <w:rFonts w:eastAsiaTheme="minorEastAsia"/>
-          <w:iCs/>
-        </w:rPr>
-        <w:t xml:space="preserve"> A módszer minden lineárisan konvergáló végtelen összegsor esetén</w:t>
+        <w:lastRenderedPageBreak/>
+        <w:t>minden lineárisan konvergáló végtelen összegsor esetén</w:t>
       </w:r>
       <w:r>
         <w:rPr>
@@ -9479,7 +9941,6 @@
             <w:rPr>
               <w:rFonts w:ascii="Cambria Math" w:eastAsiaTheme="minorEastAsia" w:hAnsi="Cambria Math"/>
             </w:rPr>
-            <w:lastRenderedPageBreak/>
             <m:t>S=</m:t>
           </m:r>
           <m:nary>
@@ -9998,13 +10459,7 @@
             <w:rPr>
               <w:rFonts w:ascii="Cambria Math" w:eastAsiaTheme="minorEastAsia" w:hAnsi="Cambria Math"/>
             </w:rPr>
-            <m:t>S</m:t>
-          </m:r>
-          <m:r>
-            <w:rPr>
-              <w:rFonts w:ascii="Cambria Math" w:eastAsiaTheme="minorEastAsia" w:hAnsi="Cambria Math"/>
-            </w:rPr>
-            <m:t>=</m:t>
+            <m:t>S=</m:t>
           </m:r>
           <m:nary>
             <m:naryPr>
@@ -10215,7 +10670,7 @@
                     <w:rPr>
                       <w:rFonts w:ascii="Cambria Math" w:eastAsiaTheme="minorEastAsia" w:hAnsi="Cambria Math"/>
                     </w:rPr>
-                    <m:t>…</m:t>
+                    <m:t>∙∙∙</m:t>
                   </m:r>
                   <m:sSub>
                     <m:sSubPr>
@@ -10298,7 +10753,7 @@
                     <w:rPr>
                       <w:rFonts w:ascii="Cambria Math" w:eastAsiaTheme="minorEastAsia" w:hAnsi="Cambria Math"/>
                     </w:rPr>
-                    <m:t>…</m:t>
+                    <m:t>∙∙∙</m:t>
                   </m:r>
                   <m:sSub>
                     <m:sSubPr>
@@ -10398,49 +10853,1831 @@
             </m:sub>
           </m:sSub>
           <m:r>
-            <w:rPr>
-              <w:rFonts w:ascii="Cambria Math" w:eastAsiaTheme="minorEastAsia" w:hAnsi="Cambria Math"/>
-            </w:rPr>
-            <m:t>∈</m:t>
-          </m:r>
-          <m:r>
             <m:rPr>
               <m:scr m:val="double-struck"/>
             </m:rPr>
             <w:rPr>
               <w:rFonts w:ascii="Cambria Math" w:eastAsiaTheme="minorEastAsia" w:hAnsi="Cambria Math"/>
             </w:rPr>
-            <m:t>N</m:t>
+            <m:t>∈N)</m:t>
           </m:r>
+        </m:oMath>
+      </m:oMathPara>
+    </w:p>
+    <w:p>
+      <w:pPr>
+        <w:rPr>
+          <w:rFonts w:eastAsiaTheme="minorEastAsia"/>
+          <w:iCs/>
+        </w:rPr>
+      </w:pPr>
+      <w:r>
+        <w:rPr>
+          <w:rFonts w:eastAsiaTheme="minorEastAsia"/>
+          <w:iCs/>
+        </w:rPr>
+        <w:t xml:space="preserve">Ezt a képletet nem direkt módon </w:t>
+      </w:r>
+      <w:r>
+        <w:rPr>
+          <w:rFonts w:eastAsiaTheme="minorEastAsia"/>
+          <w:iCs/>
+        </w:rPr>
+        <w:t>oldjuk meg</w:t>
+      </w:r>
+      <w:r>
+        <w:rPr>
+          <w:rFonts w:eastAsiaTheme="minorEastAsia"/>
+          <w:iCs/>
+        </w:rPr>
+        <w:t>, hanem először kiszámoljuk a</w:t>
+      </w:r>
+      <w:r>
+        <w:rPr>
+          <w:rFonts w:eastAsiaTheme="minorEastAsia"/>
+          <w:iCs/>
+        </w:rPr>
+        <w:t>z alábbi értékeket:</w:t>
+      </w:r>
+    </w:p>
+    <w:p>
+      <w:pPr>
+        <w:rPr>
+          <w:rFonts w:eastAsiaTheme="minorEastAsia"/>
+          <w:iCs/>
+        </w:rPr>
+      </w:pPr>
+      <m:oMathPara>
+        <m:oMath>
           <m:r>
             <w:rPr>
               <w:rFonts w:ascii="Cambria Math" w:eastAsiaTheme="minorEastAsia" w:hAnsi="Cambria Math"/>
             </w:rPr>
-            <m:t>)</m:t>
+            <m:t>P=</m:t>
+          </m:r>
+          <m:sSub>
+            <m:sSubPr>
+              <m:ctrlPr>
+                <w:rPr>
+                  <w:rFonts w:ascii="Cambria Math" w:eastAsiaTheme="minorEastAsia" w:hAnsi="Cambria Math"/>
+                  <w:i/>
+                  <w:iCs/>
+                </w:rPr>
+              </m:ctrlPr>
+            </m:sSubPr>
+            <m:e>
+              <m:r>
+                <w:rPr>
+                  <w:rFonts w:ascii="Cambria Math" w:eastAsiaTheme="minorEastAsia" w:hAnsi="Cambria Math"/>
+                </w:rPr>
+                <m:t>p</m:t>
+              </m:r>
+            </m:e>
+            <m:sub>
+              <m:sSub>
+                <m:sSubPr>
+                  <m:ctrlPr>
+                    <w:rPr>
+                      <w:rFonts w:ascii="Cambria Math" w:eastAsiaTheme="minorEastAsia" w:hAnsi="Cambria Math"/>
+                      <w:i/>
+                      <w:iCs/>
+                    </w:rPr>
+                  </m:ctrlPr>
+                </m:sSubPr>
+                <m:e>
+                  <m:r>
+                    <w:rPr>
+                      <w:rFonts w:ascii="Cambria Math" w:eastAsiaTheme="minorEastAsia" w:hAnsi="Cambria Math"/>
+                    </w:rPr>
+                    <m:t>n</m:t>
+                  </m:r>
+                </m:e>
+                <m:sub>
+                  <m:r>
+                    <w:rPr>
+                      <w:rFonts w:ascii="Cambria Math" w:eastAsiaTheme="minorEastAsia" w:hAnsi="Cambria Math"/>
+                    </w:rPr>
+                    <m:t>1</m:t>
+                  </m:r>
+                </m:sub>
+              </m:sSub>
+            </m:sub>
+          </m:sSub>
+          <m:r>
+            <w:rPr>
+              <w:rFonts w:ascii="Cambria Math" w:eastAsiaTheme="minorEastAsia" w:hAnsi="Cambria Math"/>
+            </w:rPr>
+            <m:t>∙∙∙</m:t>
+          </m:r>
+          <m:sSub>
+            <m:sSubPr>
+              <m:ctrlPr>
+                <w:rPr>
+                  <w:rFonts w:ascii="Cambria Math" w:eastAsiaTheme="minorEastAsia" w:hAnsi="Cambria Math"/>
+                  <w:i/>
+                  <w:iCs/>
+                </w:rPr>
+              </m:ctrlPr>
+            </m:sSubPr>
+            <m:e>
+              <m:r>
+                <w:rPr>
+                  <w:rFonts w:ascii="Cambria Math" w:eastAsiaTheme="minorEastAsia" w:hAnsi="Cambria Math"/>
+                </w:rPr>
+                <m:t>p</m:t>
+              </m:r>
+            </m:e>
+            <m:sub>
+              <m:sSub>
+                <m:sSubPr>
+                  <m:ctrlPr>
+                    <w:rPr>
+                      <w:rFonts w:ascii="Cambria Math" w:eastAsiaTheme="minorEastAsia" w:hAnsi="Cambria Math"/>
+                      <w:i/>
+                      <w:iCs/>
+                    </w:rPr>
+                  </m:ctrlPr>
+                </m:sSubPr>
+                <m:e>
+                  <m:r>
+                    <w:rPr>
+                      <w:rFonts w:ascii="Cambria Math" w:eastAsiaTheme="minorEastAsia" w:hAnsi="Cambria Math"/>
+                    </w:rPr>
+                    <m:t>n</m:t>
+                  </m:r>
+                </m:e>
+                <m:sub>
+                  <m:r>
+                    <w:rPr>
+                      <w:rFonts w:ascii="Cambria Math" w:eastAsiaTheme="minorEastAsia" w:hAnsi="Cambria Math"/>
+                    </w:rPr>
+                    <m:t>2</m:t>
+                  </m:r>
+                </m:sub>
+              </m:sSub>
+              <m:r>
+                <w:rPr>
+                  <w:rFonts w:ascii="Cambria Math" w:eastAsiaTheme="minorEastAsia" w:hAnsi="Cambria Math"/>
+                </w:rPr>
+                <m:t>-1</m:t>
+              </m:r>
+            </m:sub>
+          </m:sSub>
+        </m:oMath>
+      </m:oMathPara>
+    </w:p>
+    <w:p>
+      <w:pPr>
+        <w:rPr>
+          <w:rFonts w:eastAsiaTheme="minorEastAsia"/>
+          <w:iCs/>
+        </w:rPr>
+      </w:pPr>
+      <m:oMathPara>
+        <m:oMath>
+          <m:r>
+            <w:rPr>
+              <w:rFonts w:ascii="Cambria Math" w:eastAsiaTheme="minorEastAsia" w:hAnsi="Cambria Math"/>
+            </w:rPr>
+            <m:t>Q=</m:t>
+          </m:r>
+          <m:sSub>
+            <m:sSubPr>
+              <m:ctrlPr>
+                <w:rPr>
+                  <w:rFonts w:ascii="Cambria Math" w:eastAsiaTheme="minorEastAsia" w:hAnsi="Cambria Math"/>
+                  <w:i/>
+                  <w:iCs/>
+                </w:rPr>
+              </m:ctrlPr>
+            </m:sSubPr>
+            <m:e>
+              <m:r>
+                <w:rPr>
+                  <w:rFonts w:ascii="Cambria Math" w:eastAsiaTheme="minorEastAsia" w:hAnsi="Cambria Math"/>
+                </w:rPr>
+                <m:t>q</m:t>
+              </m:r>
+            </m:e>
+            <m:sub>
+              <m:sSub>
+                <m:sSubPr>
+                  <m:ctrlPr>
+                    <w:rPr>
+                      <w:rFonts w:ascii="Cambria Math" w:eastAsiaTheme="minorEastAsia" w:hAnsi="Cambria Math"/>
+                      <w:i/>
+                      <w:iCs/>
+                    </w:rPr>
+                  </m:ctrlPr>
+                </m:sSubPr>
+                <m:e>
+                  <m:r>
+                    <w:rPr>
+                      <w:rFonts w:ascii="Cambria Math" w:eastAsiaTheme="minorEastAsia" w:hAnsi="Cambria Math"/>
+                    </w:rPr>
+                    <m:t>n</m:t>
+                  </m:r>
+                </m:e>
+                <m:sub>
+                  <m:r>
+                    <w:rPr>
+                      <w:rFonts w:ascii="Cambria Math" w:eastAsiaTheme="minorEastAsia" w:hAnsi="Cambria Math"/>
+                    </w:rPr>
+                    <m:t>1</m:t>
+                  </m:r>
+                </m:sub>
+              </m:sSub>
+            </m:sub>
+          </m:sSub>
+          <m:r>
+            <w:rPr>
+              <w:rFonts w:ascii="Cambria Math" w:eastAsiaTheme="minorEastAsia" w:hAnsi="Cambria Math"/>
+            </w:rPr>
+            <m:t>∙∙∙</m:t>
+          </m:r>
+          <m:sSub>
+            <m:sSubPr>
+              <m:ctrlPr>
+                <w:rPr>
+                  <w:rFonts w:ascii="Cambria Math" w:eastAsiaTheme="minorEastAsia" w:hAnsi="Cambria Math"/>
+                  <w:i/>
+                  <w:iCs/>
+                </w:rPr>
+              </m:ctrlPr>
+            </m:sSubPr>
+            <m:e>
+              <m:r>
+                <w:rPr>
+                  <w:rFonts w:ascii="Cambria Math" w:eastAsiaTheme="minorEastAsia" w:hAnsi="Cambria Math"/>
+                </w:rPr>
+                <m:t>q</m:t>
+              </m:r>
+            </m:e>
+            <m:sub>
+              <m:sSub>
+                <m:sSubPr>
+                  <m:ctrlPr>
+                    <w:rPr>
+                      <w:rFonts w:ascii="Cambria Math" w:eastAsiaTheme="minorEastAsia" w:hAnsi="Cambria Math"/>
+                      <w:i/>
+                      <w:iCs/>
+                    </w:rPr>
+                  </m:ctrlPr>
+                </m:sSubPr>
+                <m:e>
+                  <m:r>
+                    <w:rPr>
+                      <w:rFonts w:ascii="Cambria Math" w:eastAsiaTheme="minorEastAsia" w:hAnsi="Cambria Math"/>
+                    </w:rPr>
+                    <m:t>n</m:t>
+                  </m:r>
+                </m:e>
+                <m:sub>
+                  <m:r>
+                    <w:rPr>
+                      <w:rFonts w:ascii="Cambria Math" w:eastAsiaTheme="minorEastAsia" w:hAnsi="Cambria Math"/>
+                    </w:rPr>
+                    <m:t>2</m:t>
+                  </m:r>
+                </m:sub>
+              </m:sSub>
+              <m:r>
+                <w:rPr>
+                  <w:rFonts w:ascii="Cambria Math" w:eastAsiaTheme="minorEastAsia" w:hAnsi="Cambria Math"/>
+                </w:rPr>
+                <m:t>-1</m:t>
+              </m:r>
+            </m:sub>
+          </m:sSub>
+        </m:oMath>
+      </m:oMathPara>
+    </w:p>
+    <w:p>
+      <w:pPr>
+        <w:rPr>
+          <w:rFonts w:eastAsiaTheme="minorEastAsia"/>
+          <w:iCs/>
+        </w:rPr>
+      </w:pPr>
+      <m:oMathPara>
+        <m:oMath>
+          <m:r>
+            <w:rPr>
+              <w:rFonts w:ascii="Cambria Math" w:eastAsiaTheme="minorEastAsia" w:hAnsi="Cambria Math"/>
+            </w:rPr>
+            <m:t>B=</m:t>
+          </m:r>
+          <m:sSub>
+            <m:sSubPr>
+              <m:ctrlPr>
+                <w:rPr>
+                  <w:rFonts w:ascii="Cambria Math" w:eastAsiaTheme="minorEastAsia" w:hAnsi="Cambria Math"/>
+                  <w:i/>
+                  <w:iCs/>
+                </w:rPr>
+              </m:ctrlPr>
+            </m:sSubPr>
+            <m:e>
+              <m:r>
+                <w:rPr>
+                  <w:rFonts w:ascii="Cambria Math" w:eastAsiaTheme="minorEastAsia" w:hAnsi="Cambria Math"/>
+                </w:rPr>
+                <m:t>b</m:t>
+              </m:r>
+            </m:e>
+            <m:sub>
+              <m:sSub>
+                <m:sSubPr>
+                  <m:ctrlPr>
+                    <w:rPr>
+                      <w:rFonts w:ascii="Cambria Math" w:eastAsiaTheme="minorEastAsia" w:hAnsi="Cambria Math"/>
+                      <w:i/>
+                      <w:iCs/>
+                    </w:rPr>
+                  </m:ctrlPr>
+                </m:sSubPr>
+                <m:e>
+                  <m:r>
+                    <w:rPr>
+                      <w:rFonts w:ascii="Cambria Math" w:eastAsiaTheme="minorEastAsia" w:hAnsi="Cambria Math"/>
+                    </w:rPr>
+                    <m:t>n</m:t>
+                  </m:r>
+                </m:e>
+                <m:sub>
+                  <m:r>
+                    <w:rPr>
+                      <w:rFonts w:ascii="Cambria Math" w:eastAsiaTheme="minorEastAsia" w:hAnsi="Cambria Math"/>
+                    </w:rPr>
+                    <m:t>1</m:t>
+                  </m:r>
+                </m:sub>
+              </m:sSub>
+            </m:sub>
+          </m:sSub>
+          <m:r>
+            <w:rPr>
+              <w:rFonts w:ascii="Cambria Math" w:eastAsiaTheme="minorEastAsia" w:hAnsi="Cambria Math"/>
+            </w:rPr>
+            <m:t>∙∙∙</m:t>
+          </m:r>
+          <m:sSub>
+            <m:sSubPr>
+              <m:ctrlPr>
+                <w:rPr>
+                  <w:rFonts w:ascii="Cambria Math" w:eastAsiaTheme="minorEastAsia" w:hAnsi="Cambria Math"/>
+                  <w:i/>
+                  <w:iCs/>
+                </w:rPr>
+              </m:ctrlPr>
+            </m:sSubPr>
+            <m:e>
+              <m:r>
+                <w:rPr>
+                  <w:rFonts w:ascii="Cambria Math" w:eastAsiaTheme="minorEastAsia" w:hAnsi="Cambria Math"/>
+                </w:rPr>
+                <m:t>b</m:t>
+              </m:r>
+            </m:e>
+            <m:sub>
+              <m:sSub>
+                <m:sSubPr>
+                  <m:ctrlPr>
+                    <w:rPr>
+                      <w:rFonts w:ascii="Cambria Math" w:eastAsiaTheme="minorEastAsia" w:hAnsi="Cambria Math"/>
+                      <w:i/>
+                      <w:iCs/>
+                    </w:rPr>
+                  </m:ctrlPr>
+                </m:sSubPr>
+                <m:e>
+                  <m:r>
+                    <w:rPr>
+                      <w:rFonts w:ascii="Cambria Math" w:eastAsiaTheme="minorEastAsia" w:hAnsi="Cambria Math"/>
+                    </w:rPr>
+                    <m:t>n</m:t>
+                  </m:r>
+                </m:e>
+                <m:sub>
+                  <m:r>
+                    <w:rPr>
+                      <w:rFonts w:ascii="Cambria Math" w:eastAsiaTheme="minorEastAsia" w:hAnsi="Cambria Math"/>
+                    </w:rPr>
+                    <m:t>2</m:t>
+                  </m:r>
+                </m:sub>
+              </m:sSub>
+              <m:r>
+                <w:rPr>
+                  <w:rFonts w:ascii="Cambria Math" w:eastAsiaTheme="minorEastAsia" w:hAnsi="Cambria Math"/>
+                </w:rPr>
+                <m:t>-1</m:t>
+              </m:r>
+            </m:sub>
+          </m:sSub>
+        </m:oMath>
+      </m:oMathPara>
+    </w:p>
+    <w:p>
+      <w:pPr>
+        <w:rPr>
+          <w:rFonts w:eastAsiaTheme="minorEastAsia"/>
+          <w:iCs/>
+        </w:rPr>
+      </w:pPr>
+      <m:oMathPara>
+        <m:oMath>
+          <m:r>
+            <w:rPr>
+              <w:rFonts w:ascii="Cambria Math" w:eastAsiaTheme="minorEastAsia" w:hAnsi="Cambria Math"/>
+            </w:rPr>
+            <m:t>T=BQS</m:t>
           </m:r>
         </m:oMath>
       </m:oMathPara>
     </w:p>
     <w:p>
+      <w:r>
+        <w:t xml:space="preserve">Ha </w:t>
+      </w:r>
+      <m:oMath>
+        <m:sSub>
+          <m:sSubPr>
+            <m:ctrlPr>
+              <w:rPr>
+                <w:rFonts w:ascii="Cambria Math" w:hAnsi="Cambria Math"/>
+              </w:rPr>
+            </m:ctrlPr>
+          </m:sSubPr>
+          <m:e>
+            <m:r>
+              <w:rPr>
+                <w:rFonts w:ascii="Cambria Math" w:hAnsi="Cambria Math"/>
+              </w:rPr>
+              <m:t>n</m:t>
+            </m:r>
+          </m:e>
+          <m:sub>
+            <m:r>
+              <m:rPr>
+                <m:sty m:val="p"/>
+              </m:rPr>
+              <w:rPr>
+                <w:rFonts w:ascii="Cambria Math" w:hAnsi="Cambria Math"/>
+              </w:rPr>
+              <m:t>2</m:t>
+            </m:r>
+          </m:sub>
+        </m:sSub>
+        <m:r>
+          <m:rPr>
+            <m:sty m:val="p"/>
+          </m:rPr>
+          <w:rPr>
+            <w:rFonts w:ascii="Cambria Math" w:hAnsi="Cambria Math"/>
+          </w:rPr>
+          <m:t>-</m:t>
+        </m:r>
+        <m:sSub>
+          <m:sSubPr>
+            <m:ctrlPr>
+              <w:rPr>
+                <w:rFonts w:ascii="Cambria Math" w:hAnsi="Cambria Math"/>
+              </w:rPr>
+            </m:ctrlPr>
+          </m:sSubPr>
+          <m:e>
+            <m:r>
+              <w:rPr>
+                <w:rFonts w:ascii="Cambria Math" w:hAnsi="Cambria Math"/>
+              </w:rPr>
+              <m:t>n</m:t>
+            </m:r>
+          </m:e>
+          <m:sub>
+            <m:r>
+              <m:rPr>
+                <m:sty m:val="p"/>
+              </m:rPr>
+              <w:rPr>
+                <w:rFonts w:ascii="Cambria Math" w:hAnsi="Cambria Math"/>
+              </w:rPr>
+              <m:t>1</m:t>
+            </m:r>
+          </m:sub>
+        </m:sSub>
+        <m:r>
+          <m:rPr>
+            <m:sty m:val="p"/>
+          </m:rPr>
+          <w:rPr>
+            <w:rFonts w:ascii="Cambria Math" w:hAnsi="Cambria Math"/>
+          </w:rPr>
+          <m:t>&lt;5</m:t>
+        </m:r>
+      </m:oMath>
+      <w:r>
+        <w:t xml:space="preserve">, ezeket direkt módon számoljuk ki. Amennyiben </w:t>
+      </w:r>
+      <m:oMath>
+        <m:sSub>
+          <m:sSubPr>
+            <m:ctrlPr>
+              <w:rPr>
+                <w:rFonts w:ascii="Cambria Math" w:hAnsi="Cambria Math"/>
+              </w:rPr>
+            </m:ctrlPr>
+          </m:sSubPr>
+          <m:e>
+            <m:r>
+              <w:rPr>
+                <w:rFonts w:ascii="Cambria Math" w:hAnsi="Cambria Math"/>
+              </w:rPr>
+              <m:t>n</m:t>
+            </m:r>
+          </m:e>
+          <m:sub>
+            <m:r>
+              <m:rPr>
+                <m:sty m:val="p"/>
+              </m:rPr>
+              <w:rPr>
+                <w:rFonts w:ascii="Cambria Math" w:hAnsi="Cambria Math"/>
+              </w:rPr>
+              <m:t>2</m:t>
+            </m:r>
+          </m:sub>
+        </m:sSub>
+        <m:r>
+          <m:rPr>
+            <m:sty m:val="p"/>
+          </m:rPr>
+          <w:rPr>
+            <w:rFonts w:ascii="Cambria Math" w:hAnsi="Cambria Math"/>
+          </w:rPr>
+          <m:t>-</m:t>
+        </m:r>
+        <m:sSub>
+          <m:sSubPr>
+            <m:ctrlPr>
+              <w:rPr>
+                <w:rFonts w:ascii="Cambria Math" w:hAnsi="Cambria Math"/>
+              </w:rPr>
+            </m:ctrlPr>
+          </m:sSubPr>
+          <m:e>
+            <m:r>
+              <w:rPr>
+                <w:rFonts w:ascii="Cambria Math" w:hAnsi="Cambria Math"/>
+              </w:rPr>
+              <m:t>n</m:t>
+            </m:r>
+          </m:e>
+          <m:sub>
+            <m:r>
+              <m:rPr>
+                <m:sty m:val="p"/>
+              </m:rPr>
+              <w:rPr>
+                <w:rFonts w:ascii="Cambria Math" w:hAnsi="Cambria Math"/>
+              </w:rPr>
+              <m:t>1</m:t>
+            </m:r>
+          </m:sub>
+        </m:sSub>
+        <m:r>
+          <m:rPr>
+            <m:sty m:val="p"/>
+          </m:rPr>
+          <w:rPr>
+            <w:rFonts w:ascii="Cambria Math" w:hAnsi="Cambria Math"/>
+          </w:rPr>
+          <m:t>≥5</m:t>
+        </m:r>
+      </m:oMath>
+      <w:r>
+        <w:t xml:space="preserve">, abban az esetben bináris szétválasztást alkalmazunk: Válasszuk ki az </w:t>
+      </w:r>
+      <m:oMath>
+        <m:sSub>
+          <m:sSubPr>
+            <m:ctrlPr>
+              <w:rPr>
+                <w:rFonts w:ascii="Cambria Math" w:hAnsi="Cambria Math"/>
+              </w:rPr>
+            </m:ctrlPr>
+          </m:sSubPr>
+          <m:e>
+            <m:r>
+              <w:rPr>
+                <w:rFonts w:ascii="Cambria Math" w:hAnsi="Cambria Math"/>
+              </w:rPr>
+              <m:t>n</m:t>
+            </m:r>
+          </m:e>
+          <m:sub>
+            <m:r>
+              <w:rPr>
+                <w:rFonts w:ascii="Cambria Math" w:hAnsi="Cambria Math"/>
+              </w:rPr>
+              <m:t>m</m:t>
+            </m:r>
+          </m:sub>
+        </m:sSub>
+      </m:oMath>
+      <w:r>
+        <w:t xml:space="preserve"> indexet </w:t>
+      </w:r>
+      <m:oMath>
+        <m:sSub>
+          <m:sSubPr>
+            <m:ctrlPr>
+              <w:rPr>
+                <w:rFonts w:ascii="Cambria Math" w:hAnsi="Cambria Math"/>
+              </w:rPr>
+            </m:ctrlPr>
+          </m:sSubPr>
+          <m:e>
+            <m:r>
+              <w:rPr>
+                <w:rFonts w:ascii="Cambria Math" w:hAnsi="Cambria Math"/>
+              </w:rPr>
+              <m:t>n</m:t>
+            </m:r>
+          </m:e>
+          <m:sub>
+            <m:r>
+              <m:rPr>
+                <m:sty m:val="p"/>
+              </m:rPr>
+              <w:rPr>
+                <w:rFonts w:ascii="Cambria Math" w:hAnsi="Cambria Math"/>
+              </w:rPr>
+              <m:t>1</m:t>
+            </m:r>
+          </m:sub>
+        </m:sSub>
+      </m:oMath>
+      <w:r>
+        <w:t xml:space="preserve"> és </w:t>
+      </w:r>
+      <m:oMath>
+        <m:sSub>
+          <m:sSubPr>
+            <m:ctrlPr>
+              <w:rPr>
+                <w:rFonts w:ascii="Cambria Math" w:hAnsi="Cambria Math"/>
+              </w:rPr>
+            </m:ctrlPr>
+          </m:sSubPr>
+          <m:e>
+            <m:r>
+              <w:rPr>
+                <w:rFonts w:ascii="Cambria Math" w:hAnsi="Cambria Math"/>
+              </w:rPr>
+              <m:t>n</m:t>
+            </m:r>
+          </m:e>
+          <m:sub>
+            <m:r>
+              <m:rPr>
+                <m:sty m:val="p"/>
+              </m:rPr>
+              <w:rPr>
+                <w:rFonts w:ascii="Cambria Math" w:hAnsi="Cambria Math"/>
+              </w:rPr>
+              <m:t>2</m:t>
+            </m:r>
+          </m:sub>
+        </m:sSub>
+      </m:oMath>
+      <w:r>
+        <w:t xml:space="preserve"> közepén, vagyis </w:t>
+      </w:r>
+      <m:oMath>
+        <m:sSub>
+          <m:sSubPr>
+            <m:ctrlPr>
+              <w:rPr>
+                <w:rFonts w:ascii="Cambria Math" w:hAnsi="Cambria Math"/>
+              </w:rPr>
+            </m:ctrlPr>
+          </m:sSubPr>
+          <m:e>
+            <m:r>
+              <w:rPr>
+                <w:rFonts w:ascii="Cambria Math" w:hAnsi="Cambria Math"/>
+              </w:rPr>
+              <m:t>n</m:t>
+            </m:r>
+          </m:e>
+          <m:sub>
+            <m:r>
+              <w:rPr>
+                <w:rFonts w:ascii="Cambria Math" w:hAnsi="Cambria Math"/>
+              </w:rPr>
+              <m:t>m</m:t>
+            </m:r>
+          </m:sub>
+        </m:sSub>
+        <m:r>
+          <m:rPr>
+            <m:sty m:val="p"/>
+          </m:rPr>
+          <w:rPr>
+            <w:rFonts w:ascii="Cambria Math" w:hAnsi="Cambria Math"/>
+          </w:rPr>
+          <m:t>=</m:t>
+        </m:r>
+        <m:d>
+          <m:dPr>
+            <m:begChr m:val="⌊"/>
+            <m:endChr m:val="⌋"/>
+            <m:ctrlPr>
+              <w:rPr>
+                <w:rFonts w:ascii="Cambria Math" w:hAnsi="Cambria Math"/>
+              </w:rPr>
+            </m:ctrlPr>
+          </m:dPr>
+          <m:e>
+            <m:f>
+              <m:fPr>
+                <m:ctrlPr>
+                  <w:rPr>
+                    <w:rFonts w:ascii="Cambria Math" w:hAnsi="Cambria Math"/>
+                  </w:rPr>
+                </m:ctrlPr>
+              </m:fPr>
+              <m:num>
+                <m:sSub>
+                  <m:sSubPr>
+                    <m:ctrlPr>
+                      <w:rPr>
+                        <w:rFonts w:ascii="Cambria Math" w:hAnsi="Cambria Math"/>
+                      </w:rPr>
+                    </m:ctrlPr>
+                  </m:sSubPr>
+                  <m:e>
+                    <m:r>
+                      <w:rPr>
+                        <w:rFonts w:ascii="Cambria Math" w:hAnsi="Cambria Math"/>
+                      </w:rPr>
+                      <m:t>n</m:t>
+                    </m:r>
+                  </m:e>
+                  <m:sub>
+                    <m:r>
+                      <m:rPr>
+                        <m:sty m:val="p"/>
+                      </m:rPr>
+                      <w:rPr>
+                        <w:rFonts w:ascii="Cambria Math" w:hAnsi="Cambria Math"/>
+                      </w:rPr>
+                      <m:t>1</m:t>
+                    </m:r>
+                  </m:sub>
+                </m:sSub>
+                <m:r>
+                  <m:rPr>
+                    <m:sty m:val="p"/>
+                  </m:rPr>
+                  <w:rPr>
+                    <w:rFonts w:ascii="Cambria Math" w:hAnsi="Cambria Math"/>
+                  </w:rPr>
+                  <m:t>+</m:t>
+                </m:r>
+                <m:sSub>
+                  <m:sSubPr>
+                    <m:ctrlPr>
+                      <w:rPr>
+                        <w:rFonts w:ascii="Cambria Math" w:hAnsi="Cambria Math"/>
+                      </w:rPr>
+                    </m:ctrlPr>
+                  </m:sSubPr>
+                  <m:e>
+                    <m:r>
+                      <w:rPr>
+                        <w:rFonts w:ascii="Cambria Math" w:hAnsi="Cambria Math"/>
+                      </w:rPr>
+                      <m:t>n</m:t>
+                    </m:r>
+                  </m:e>
+                  <m:sub>
+                    <m:r>
+                      <m:rPr>
+                        <m:sty m:val="p"/>
+                      </m:rPr>
+                      <w:rPr>
+                        <w:rFonts w:ascii="Cambria Math" w:hAnsi="Cambria Math"/>
+                      </w:rPr>
+                      <m:t>2</m:t>
+                    </m:r>
+                  </m:sub>
+                </m:sSub>
+              </m:num>
+              <m:den>
+                <m:r>
+                  <m:rPr>
+                    <m:sty m:val="p"/>
+                  </m:rPr>
+                  <w:rPr>
+                    <w:rFonts w:ascii="Cambria Math" w:hAnsi="Cambria Math"/>
+                  </w:rPr>
+                  <m:t>2</m:t>
+                </m:r>
+              </m:den>
+            </m:f>
+          </m:e>
+        </m:d>
+      </m:oMath>
+      <w:r>
+        <w:t xml:space="preserve"> és számítsuk ki a </w:t>
+      </w:r>
+      <m:oMath>
+        <m:sSub>
+          <m:sSubPr>
+            <m:ctrlPr>
+              <w:rPr>
+                <w:rFonts w:ascii="Cambria Math" w:hAnsi="Cambria Math"/>
+              </w:rPr>
+            </m:ctrlPr>
+          </m:sSubPr>
+          <m:e>
+            <m:r>
+              <w:rPr>
+                <w:rFonts w:ascii="Cambria Math" w:hAnsi="Cambria Math"/>
+              </w:rPr>
+              <m:t>P</m:t>
+            </m:r>
+          </m:e>
+          <m:sub>
+            <m:r>
+              <w:rPr>
+                <w:rFonts w:ascii="Cambria Math" w:hAnsi="Cambria Math"/>
+              </w:rPr>
+              <m:t>l</m:t>
+            </m:r>
+          </m:sub>
+        </m:sSub>
+      </m:oMath>
+      <w:r>
+        <w:t xml:space="preserve">, </w:t>
+      </w:r>
+      <m:oMath>
+        <m:sSub>
+          <m:sSubPr>
+            <m:ctrlPr>
+              <w:rPr>
+                <w:rFonts w:ascii="Cambria Math" w:hAnsi="Cambria Math"/>
+              </w:rPr>
+            </m:ctrlPr>
+          </m:sSubPr>
+          <m:e>
+            <m:r>
+              <w:rPr>
+                <w:rFonts w:ascii="Cambria Math" w:hAnsi="Cambria Math"/>
+              </w:rPr>
+              <m:t>Q</m:t>
+            </m:r>
+          </m:e>
+          <m:sub>
+            <m:r>
+              <w:rPr>
+                <w:rFonts w:ascii="Cambria Math" w:hAnsi="Cambria Math"/>
+              </w:rPr>
+              <m:t>l</m:t>
+            </m:r>
+          </m:sub>
+        </m:sSub>
+      </m:oMath>
+      <w:r>
+        <w:t xml:space="preserve">, </w:t>
+      </w:r>
+      <m:oMath>
+        <m:sSub>
+          <m:sSubPr>
+            <m:ctrlPr>
+              <w:rPr>
+                <w:rFonts w:ascii="Cambria Math" w:hAnsi="Cambria Math"/>
+              </w:rPr>
+            </m:ctrlPr>
+          </m:sSubPr>
+          <m:e>
+            <m:r>
+              <w:rPr>
+                <w:rFonts w:ascii="Cambria Math" w:hAnsi="Cambria Math"/>
+              </w:rPr>
+              <m:t>B</m:t>
+            </m:r>
+          </m:e>
+          <m:sub>
+            <m:r>
+              <w:rPr>
+                <w:rFonts w:ascii="Cambria Math" w:hAnsi="Cambria Math"/>
+              </w:rPr>
+              <m:t>l</m:t>
+            </m:r>
+          </m:sub>
+        </m:sSub>
+      </m:oMath>
+      <w:r>
+        <w:t xml:space="preserve"> és </w:t>
+      </w:r>
+      <m:oMath>
+        <m:sSub>
+          <m:sSubPr>
+            <m:ctrlPr>
+              <w:rPr>
+                <w:rFonts w:ascii="Cambria Math" w:hAnsi="Cambria Math"/>
+              </w:rPr>
+            </m:ctrlPr>
+          </m:sSubPr>
+          <m:e>
+            <m:r>
+              <w:rPr>
+                <w:rFonts w:ascii="Cambria Math" w:hAnsi="Cambria Math"/>
+              </w:rPr>
+              <m:t>T</m:t>
+            </m:r>
+          </m:e>
+          <m:sub>
+            <m:r>
+              <w:rPr>
+                <w:rFonts w:ascii="Cambria Math" w:hAnsi="Cambria Math"/>
+              </w:rPr>
+              <m:t>l</m:t>
+            </m:r>
+          </m:sub>
+        </m:sSub>
+      </m:oMath>
+      <w:r>
+        <w:t xml:space="preserve"> értékeket az </w:t>
+      </w:r>
+      <m:oMath>
+        <m:sSub>
+          <m:sSubPr>
+            <m:ctrlPr>
+              <w:rPr>
+                <w:rFonts w:ascii="Cambria Math" w:hAnsi="Cambria Math"/>
+              </w:rPr>
+            </m:ctrlPr>
+          </m:sSubPr>
+          <m:e>
+            <m:r>
+              <w:rPr>
+                <w:rFonts w:ascii="Cambria Math" w:hAnsi="Cambria Math"/>
+              </w:rPr>
+              <m:t>n</m:t>
+            </m:r>
+          </m:e>
+          <m:sub>
+            <m:r>
+              <m:rPr>
+                <m:sty m:val="p"/>
+              </m:rPr>
+              <w:rPr>
+                <w:rFonts w:ascii="Cambria Math" w:hAnsi="Cambria Math"/>
+              </w:rPr>
+              <m:t>1</m:t>
+            </m:r>
+          </m:sub>
+        </m:sSub>
+        <m:r>
+          <m:rPr>
+            <m:sty m:val="p"/>
+          </m:rPr>
+          <w:rPr>
+            <w:rFonts w:ascii="Cambria Math" w:hAnsi="Cambria Math"/>
+          </w:rPr>
+          <m:t>≤</m:t>
+        </m:r>
+        <m:r>
+          <w:rPr>
+            <w:rFonts w:ascii="Cambria Math" w:hAnsi="Cambria Math"/>
+          </w:rPr>
+          <m:t>k</m:t>
+        </m:r>
+        <m:r>
+          <m:rPr>
+            <m:sty m:val="p"/>
+          </m:rPr>
+          <w:rPr>
+            <w:rFonts w:ascii="Cambria Math" w:hAnsi="Cambria Math"/>
+          </w:rPr>
+          <m:t>&lt;</m:t>
+        </m:r>
+        <m:sSub>
+          <m:sSubPr>
+            <m:ctrlPr>
+              <w:rPr>
+                <w:rFonts w:ascii="Cambria Math" w:hAnsi="Cambria Math"/>
+              </w:rPr>
+            </m:ctrlPr>
+          </m:sSubPr>
+          <m:e>
+            <m:r>
+              <w:rPr>
+                <w:rFonts w:ascii="Cambria Math" w:hAnsi="Cambria Math"/>
+              </w:rPr>
+              <m:t>n</m:t>
+            </m:r>
+          </m:e>
+          <m:sub>
+            <m:r>
+              <w:rPr>
+                <w:rFonts w:ascii="Cambria Math" w:hAnsi="Cambria Math"/>
+              </w:rPr>
+              <m:t>m</m:t>
+            </m:r>
+          </m:sub>
+        </m:sSub>
+      </m:oMath>
+      <w:r>
+        <w:t xml:space="preserve">, majd a </w:t>
+      </w:r>
+      <m:oMath>
+        <m:sSub>
+          <m:sSubPr>
+            <m:ctrlPr>
+              <w:rPr>
+                <w:rFonts w:ascii="Cambria Math" w:hAnsi="Cambria Math"/>
+              </w:rPr>
+            </m:ctrlPr>
+          </m:sSubPr>
+          <m:e>
+            <m:r>
+              <w:rPr>
+                <w:rFonts w:ascii="Cambria Math" w:hAnsi="Cambria Math"/>
+              </w:rPr>
+              <m:t>P</m:t>
+            </m:r>
+          </m:e>
+          <m:sub>
+            <m:r>
+              <w:rPr>
+                <w:rFonts w:ascii="Cambria Math" w:hAnsi="Cambria Math"/>
+              </w:rPr>
+              <m:t>r</m:t>
+            </m:r>
+          </m:sub>
+        </m:sSub>
+      </m:oMath>
+      <w:r>
+        <w:t xml:space="preserve">, </w:t>
+      </w:r>
+      <m:oMath>
+        <m:sSub>
+          <m:sSubPr>
+            <m:ctrlPr>
+              <w:rPr>
+                <w:rFonts w:ascii="Cambria Math" w:hAnsi="Cambria Math"/>
+              </w:rPr>
+            </m:ctrlPr>
+          </m:sSubPr>
+          <m:e>
+            <m:r>
+              <w:rPr>
+                <w:rFonts w:ascii="Cambria Math" w:hAnsi="Cambria Math"/>
+              </w:rPr>
+              <m:t>Q</m:t>
+            </m:r>
+          </m:e>
+          <m:sub>
+            <m:r>
+              <w:rPr>
+                <w:rFonts w:ascii="Cambria Math" w:hAnsi="Cambria Math"/>
+              </w:rPr>
+              <m:t>r</m:t>
+            </m:r>
+          </m:sub>
+        </m:sSub>
+      </m:oMath>
+      <w:r>
+        <w:t xml:space="preserve">, </w:t>
+      </w:r>
+      <m:oMath>
+        <m:sSub>
+          <m:sSubPr>
+            <m:ctrlPr>
+              <w:rPr>
+                <w:rFonts w:ascii="Cambria Math" w:hAnsi="Cambria Math"/>
+              </w:rPr>
+            </m:ctrlPr>
+          </m:sSubPr>
+          <m:e>
+            <m:r>
+              <w:rPr>
+                <w:rFonts w:ascii="Cambria Math" w:hAnsi="Cambria Math"/>
+              </w:rPr>
+              <m:t>B</m:t>
+            </m:r>
+          </m:e>
+          <m:sub>
+            <m:r>
+              <w:rPr>
+                <w:rFonts w:ascii="Cambria Math" w:hAnsi="Cambria Math"/>
+              </w:rPr>
+              <m:t>r</m:t>
+            </m:r>
+          </m:sub>
+        </m:sSub>
+      </m:oMath>
+      <w:r>
+        <w:t xml:space="preserve"> és </w:t>
+      </w:r>
+      <m:oMath>
+        <m:sSub>
+          <m:sSubPr>
+            <m:ctrlPr>
+              <w:rPr>
+                <w:rFonts w:ascii="Cambria Math" w:hAnsi="Cambria Math"/>
+              </w:rPr>
+            </m:ctrlPr>
+          </m:sSubPr>
+          <m:e>
+            <m:r>
+              <w:rPr>
+                <w:rFonts w:ascii="Cambria Math" w:hAnsi="Cambria Math"/>
+              </w:rPr>
+              <m:t>T</m:t>
+            </m:r>
+          </m:e>
+          <m:sub>
+            <m:r>
+              <w:rPr>
+                <w:rFonts w:ascii="Cambria Math" w:hAnsi="Cambria Math"/>
+              </w:rPr>
+              <m:t>r</m:t>
+            </m:r>
+          </m:sub>
+        </m:sSub>
+      </m:oMath>
+      <w:r>
+        <w:t xml:space="preserve"> értékeket az </w:t>
+      </w:r>
+      <m:oMath>
+        <m:sSub>
+          <m:sSubPr>
+            <m:ctrlPr>
+              <w:rPr>
+                <w:rFonts w:ascii="Cambria Math" w:hAnsi="Cambria Math"/>
+              </w:rPr>
+            </m:ctrlPr>
+          </m:sSubPr>
+          <m:e>
+            <m:r>
+              <w:rPr>
+                <w:rFonts w:ascii="Cambria Math" w:hAnsi="Cambria Math"/>
+              </w:rPr>
+              <m:t>n</m:t>
+            </m:r>
+          </m:e>
+          <m:sub>
+            <m:r>
+              <w:rPr>
+                <w:rFonts w:ascii="Cambria Math" w:hAnsi="Cambria Math"/>
+              </w:rPr>
+              <m:t>m</m:t>
+            </m:r>
+          </m:sub>
+        </m:sSub>
+        <m:r>
+          <m:rPr>
+            <m:sty m:val="p"/>
+          </m:rPr>
+          <w:rPr>
+            <w:rFonts w:ascii="Cambria Math" w:hAnsi="Cambria Math"/>
+          </w:rPr>
+          <m:t>≤</m:t>
+        </m:r>
+        <m:r>
+          <w:rPr>
+            <w:rFonts w:ascii="Cambria Math" w:hAnsi="Cambria Math"/>
+          </w:rPr>
+          <m:t>k</m:t>
+        </m:r>
+        <m:r>
+          <m:rPr>
+            <m:sty m:val="p"/>
+          </m:rPr>
+          <w:rPr>
+            <w:rFonts w:ascii="Cambria Math" w:hAnsi="Cambria Math"/>
+          </w:rPr>
+          <m:t>&lt;</m:t>
+        </m:r>
+        <m:sSub>
+          <m:sSubPr>
+            <m:ctrlPr>
+              <w:rPr>
+                <w:rFonts w:ascii="Cambria Math" w:hAnsi="Cambria Math"/>
+              </w:rPr>
+            </m:ctrlPr>
+          </m:sSubPr>
+          <m:e>
+            <m:r>
+              <w:rPr>
+                <w:rFonts w:ascii="Cambria Math" w:hAnsi="Cambria Math"/>
+              </w:rPr>
+              <m:t>n</m:t>
+            </m:r>
+          </m:e>
+          <m:sub>
+            <m:r>
+              <m:rPr>
+                <m:sty m:val="p"/>
+              </m:rPr>
+              <w:rPr>
+                <w:rFonts w:ascii="Cambria Math" w:hAnsi="Cambria Math"/>
+              </w:rPr>
+              <m:t>2</m:t>
+            </m:r>
+          </m:sub>
+        </m:sSub>
+      </m:oMath>
+      <w:r>
+        <w:t xml:space="preserve"> intervallumon. Ezt követően összegezzük az egyes intervallumok részeredményeit úgy, hogy</w:t>
+      </w:r>
+      <w:r>
+        <w:t>:</w:t>
+      </w:r>
+    </w:p>
+    <w:p>
+      <m:oMathPara>
+        <m:oMath>
+          <m:r>
+            <w:rPr>
+              <w:rFonts w:ascii="Cambria Math" w:hAnsi="Cambria Math"/>
+            </w:rPr>
+            <m:t>P</m:t>
+          </m:r>
+          <m:r>
+            <m:rPr>
+              <m:sty m:val="p"/>
+            </m:rPr>
+            <w:rPr>
+              <w:rFonts w:ascii="Cambria Math" w:hAnsi="Cambria Math"/>
+            </w:rPr>
+            <m:t>=</m:t>
+          </m:r>
+          <m:sSub>
+            <m:sSubPr>
+              <m:ctrlPr>
+                <w:rPr>
+                  <w:rFonts w:ascii="Cambria Math" w:hAnsi="Cambria Math"/>
+                </w:rPr>
+              </m:ctrlPr>
+            </m:sSubPr>
+            <m:e>
+              <m:r>
+                <w:rPr>
+                  <w:rFonts w:ascii="Cambria Math" w:hAnsi="Cambria Math"/>
+                </w:rPr>
+                <m:t>P</m:t>
+              </m:r>
+            </m:e>
+            <m:sub>
+              <m:r>
+                <w:rPr>
+                  <w:rFonts w:ascii="Cambria Math" w:hAnsi="Cambria Math"/>
+                </w:rPr>
+                <m:t>l</m:t>
+              </m:r>
+            </m:sub>
+          </m:sSub>
+          <m:sSub>
+            <m:sSubPr>
+              <m:ctrlPr>
+                <w:rPr>
+                  <w:rFonts w:ascii="Cambria Math" w:hAnsi="Cambria Math"/>
+                </w:rPr>
+              </m:ctrlPr>
+            </m:sSubPr>
+            <m:e>
+              <m:r>
+                <w:rPr>
+                  <w:rFonts w:ascii="Cambria Math" w:hAnsi="Cambria Math"/>
+                </w:rPr>
+                <m:t>P</m:t>
+              </m:r>
+            </m:e>
+            <m:sub>
+              <m:r>
+                <w:rPr>
+                  <w:rFonts w:ascii="Cambria Math" w:hAnsi="Cambria Math"/>
+                </w:rPr>
+                <m:t>r</m:t>
+              </m:r>
+            </m:sub>
+          </m:sSub>
+        </m:oMath>
+      </m:oMathPara>
+    </w:p>
+    <w:p>
+      <m:oMathPara>
+        <m:oMath>
+          <m:r>
+            <w:rPr>
+              <w:rFonts w:ascii="Cambria Math" w:hAnsi="Cambria Math"/>
+            </w:rPr>
+            <m:t>Q</m:t>
+          </m:r>
+          <m:r>
+            <m:rPr>
+              <m:sty m:val="p"/>
+            </m:rPr>
+            <w:rPr>
+              <w:rFonts w:ascii="Cambria Math" w:hAnsi="Cambria Math"/>
+            </w:rPr>
+            <m:t>=</m:t>
+          </m:r>
+          <m:sSub>
+            <m:sSubPr>
+              <m:ctrlPr>
+                <w:rPr>
+                  <w:rFonts w:ascii="Cambria Math" w:hAnsi="Cambria Math"/>
+                </w:rPr>
+              </m:ctrlPr>
+            </m:sSubPr>
+            <m:e>
+              <m:r>
+                <w:rPr>
+                  <w:rFonts w:ascii="Cambria Math" w:hAnsi="Cambria Math"/>
+                </w:rPr>
+                <m:t>Q</m:t>
+              </m:r>
+            </m:e>
+            <m:sub>
+              <m:r>
+                <w:rPr>
+                  <w:rFonts w:ascii="Cambria Math" w:hAnsi="Cambria Math"/>
+                </w:rPr>
+                <m:t>l</m:t>
+              </m:r>
+            </m:sub>
+          </m:sSub>
+          <m:sSub>
+            <m:sSubPr>
+              <m:ctrlPr>
+                <w:rPr>
+                  <w:rFonts w:ascii="Cambria Math" w:hAnsi="Cambria Math"/>
+                </w:rPr>
+              </m:ctrlPr>
+            </m:sSubPr>
+            <m:e>
+              <m:r>
+                <w:rPr>
+                  <w:rFonts w:ascii="Cambria Math" w:hAnsi="Cambria Math"/>
+                </w:rPr>
+                <m:t>Q</m:t>
+              </m:r>
+            </m:e>
+            <m:sub>
+              <m:r>
+                <w:rPr>
+                  <w:rFonts w:ascii="Cambria Math" w:hAnsi="Cambria Math"/>
+                </w:rPr>
+                <m:t>r</m:t>
+              </m:r>
+            </m:sub>
+          </m:sSub>
+        </m:oMath>
+      </m:oMathPara>
+    </w:p>
+    <w:p>
+      <m:oMathPara>
+        <m:oMath>
+          <m:r>
+            <w:rPr>
+              <w:rFonts w:ascii="Cambria Math" w:hAnsi="Cambria Math"/>
+            </w:rPr>
+            <m:t>B</m:t>
+          </m:r>
+          <m:r>
+            <m:rPr>
+              <m:sty m:val="p"/>
+            </m:rPr>
+            <w:rPr>
+              <w:rFonts w:ascii="Cambria Math" w:hAnsi="Cambria Math"/>
+            </w:rPr>
+            <m:t>=</m:t>
+          </m:r>
+          <m:sSub>
+            <m:sSubPr>
+              <m:ctrlPr>
+                <w:rPr>
+                  <w:rFonts w:ascii="Cambria Math" w:hAnsi="Cambria Math"/>
+                </w:rPr>
+              </m:ctrlPr>
+            </m:sSubPr>
+            <m:e>
+              <m:r>
+                <w:rPr>
+                  <w:rFonts w:ascii="Cambria Math" w:hAnsi="Cambria Math"/>
+                </w:rPr>
+                <m:t>B</m:t>
+              </m:r>
+            </m:e>
+            <m:sub>
+              <m:r>
+                <w:rPr>
+                  <w:rFonts w:ascii="Cambria Math" w:hAnsi="Cambria Math"/>
+                </w:rPr>
+                <m:t>l</m:t>
+              </m:r>
+            </m:sub>
+          </m:sSub>
+          <m:sSub>
+            <m:sSubPr>
+              <m:ctrlPr>
+                <w:rPr>
+                  <w:rFonts w:ascii="Cambria Math" w:hAnsi="Cambria Math"/>
+                </w:rPr>
+              </m:ctrlPr>
+            </m:sSubPr>
+            <m:e>
+              <m:r>
+                <w:rPr>
+                  <w:rFonts w:ascii="Cambria Math" w:hAnsi="Cambria Math"/>
+                </w:rPr>
+                <m:t>B</m:t>
+              </m:r>
+            </m:e>
+            <m:sub>
+              <m:r>
+                <w:rPr>
+                  <w:rFonts w:ascii="Cambria Math" w:hAnsi="Cambria Math"/>
+                </w:rPr>
+                <m:t>r</m:t>
+              </m:r>
+            </m:sub>
+          </m:sSub>
+        </m:oMath>
+      </m:oMathPara>
+    </w:p>
+    <w:p>
+      <m:oMathPara>
+        <m:oMath>
+          <m:r>
+            <w:rPr>
+              <w:rFonts w:ascii="Cambria Math" w:hAnsi="Cambria Math"/>
+            </w:rPr>
+            <m:t>T</m:t>
+          </m:r>
+          <m:r>
+            <m:rPr>
+              <m:sty m:val="p"/>
+            </m:rPr>
+            <w:rPr>
+              <w:rFonts w:ascii="Cambria Math" w:hAnsi="Cambria Math"/>
+            </w:rPr>
+            <m:t>=</m:t>
+          </m:r>
+          <m:sSub>
+            <m:sSubPr>
+              <m:ctrlPr>
+                <w:rPr>
+                  <w:rFonts w:ascii="Cambria Math" w:hAnsi="Cambria Math"/>
+                </w:rPr>
+              </m:ctrlPr>
+            </m:sSubPr>
+            <m:e>
+              <m:r>
+                <w:rPr>
+                  <w:rFonts w:ascii="Cambria Math" w:hAnsi="Cambria Math"/>
+                </w:rPr>
+                <m:t>B</m:t>
+              </m:r>
+            </m:e>
+            <m:sub>
+              <m:r>
+                <w:rPr>
+                  <w:rFonts w:ascii="Cambria Math" w:hAnsi="Cambria Math"/>
+                </w:rPr>
+                <m:t>r</m:t>
+              </m:r>
+            </m:sub>
+          </m:sSub>
+          <m:sSub>
+            <m:sSubPr>
+              <m:ctrlPr>
+                <w:rPr>
+                  <w:rFonts w:ascii="Cambria Math" w:hAnsi="Cambria Math"/>
+                </w:rPr>
+              </m:ctrlPr>
+            </m:sSubPr>
+            <m:e>
+              <m:r>
+                <w:rPr>
+                  <w:rFonts w:ascii="Cambria Math" w:hAnsi="Cambria Math"/>
+                </w:rPr>
+                <m:t>Q</m:t>
+              </m:r>
+            </m:e>
+            <m:sub>
+              <m:r>
+                <w:rPr>
+                  <w:rFonts w:ascii="Cambria Math" w:hAnsi="Cambria Math"/>
+                </w:rPr>
+                <m:t>r</m:t>
+              </m:r>
+            </m:sub>
+          </m:sSub>
+          <m:sSub>
+            <m:sSubPr>
+              <m:ctrlPr>
+                <w:rPr>
+                  <w:rFonts w:ascii="Cambria Math" w:hAnsi="Cambria Math"/>
+                </w:rPr>
+              </m:ctrlPr>
+            </m:sSubPr>
+            <m:e>
+              <m:r>
+                <w:rPr>
+                  <w:rFonts w:ascii="Cambria Math" w:hAnsi="Cambria Math"/>
+                </w:rPr>
+                <m:t>T</m:t>
+              </m:r>
+            </m:e>
+            <m:sub>
+              <m:r>
+                <w:rPr>
+                  <w:rFonts w:ascii="Cambria Math" w:hAnsi="Cambria Math"/>
+                </w:rPr>
+                <m:t>l</m:t>
+              </m:r>
+            </m:sub>
+          </m:sSub>
+          <m:r>
+            <m:rPr>
+              <m:sty m:val="p"/>
+            </m:rPr>
+            <w:rPr>
+              <w:rFonts w:ascii="Cambria Math" w:hAnsi="Cambria Math"/>
+            </w:rPr>
+            <m:t>+</m:t>
+          </m:r>
+          <m:sSub>
+            <m:sSubPr>
+              <m:ctrlPr>
+                <w:rPr>
+                  <w:rFonts w:ascii="Cambria Math" w:hAnsi="Cambria Math"/>
+                </w:rPr>
+              </m:ctrlPr>
+            </m:sSubPr>
+            <m:e>
+              <m:r>
+                <w:rPr>
+                  <w:rFonts w:ascii="Cambria Math" w:hAnsi="Cambria Math"/>
+                </w:rPr>
+                <m:t>B</m:t>
+              </m:r>
+            </m:e>
+            <m:sub>
+              <m:r>
+                <w:rPr>
+                  <w:rFonts w:ascii="Cambria Math" w:hAnsi="Cambria Math"/>
+                </w:rPr>
+                <m:t>l</m:t>
+              </m:r>
+            </m:sub>
+          </m:sSub>
+          <m:sSub>
+            <m:sSubPr>
+              <m:ctrlPr>
+                <w:rPr>
+                  <w:rFonts w:ascii="Cambria Math" w:hAnsi="Cambria Math"/>
+                </w:rPr>
+              </m:ctrlPr>
+            </m:sSubPr>
+            <m:e>
+              <m:r>
+                <w:rPr>
+                  <w:rFonts w:ascii="Cambria Math" w:hAnsi="Cambria Math"/>
+                </w:rPr>
+                <m:t>P</m:t>
+              </m:r>
+            </m:e>
+            <m:sub>
+              <m:r>
+                <w:rPr>
+                  <w:rFonts w:ascii="Cambria Math" w:hAnsi="Cambria Math"/>
+                </w:rPr>
+                <m:t>l</m:t>
+              </m:r>
+            </m:sub>
+          </m:sSub>
+          <m:sSub>
+            <m:sSubPr>
+              <m:ctrlPr>
+                <w:rPr>
+                  <w:rFonts w:ascii="Cambria Math" w:hAnsi="Cambria Math"/>
+                </w:rPr>
+              </m:ctrlPr>
+            </m:sSubPr>
+            <m:e>
+              <m:r>
+                <w:rPr>
+                  <w:rFonts w:ascii="Cambria Math" w:hAnsi="Cambria Math"/>
+                </w:rPr>
+                <m:t>T</m:t>
+              </m:r>
+            </m:e>
+            <m:sub>
+              <m:r>
+                <w:rPr>
+                  <w:rFonts w:ascii="Cambria Math" w:hAnsi="Cambria Math"/>
+                </w:rPr>
+                <m:t>r</m:t>
+              </m:r>
+            </m:sub>
+          </m:sSub>
+        </m:oMath>
+      </m:oMathPara>
+    </w:p>
+    <w:p>
       <w:pPr>
         <w:rPr>
           <w:rFonts w:eastAsiaTheme="minorEastAsia"/>
           <w:iCs/>
         </w:rPr>
       </w:pPr>
-    </w:p>
-    <w:p>
-      <w:pPr>
+      <w:r>
         <w:rPr>
           <w:rFonts w:eastAsiaTheme="minorEastAsia"/>
           <w:iCs/>
         </w:rPr>
-      </w:pPr>
+        <w:t xml:space="preserve">Végezetül az algoritmus az </w:t>
+      </w:r>
+      <m:oMath>
+        <m:sSub>
+          <m:sSubPr>
+            <m:ctrlPr>
+              <w:rPr>
+                <w:rFonts w:ascii="Cambria Math" w:eastAsiaTheme="minorEastAsia" w:hAnsi="Cambria Math"/>
+                <w:i/>
+                <w:iCs/>
+              </w:rPr>
+            </m:ctrlPr>
+          </m:sSubPr>
+          <m:e>
+            <m:r>
+              <w:rPr>
+                <w:rFonts w:ascii="Cambria Math" w:eastAsiaTheme="minorEastAsia" w:hAnsi="Cambria Math"/>
+              </w:rPr>
+              <m:t>n</m:t>
+            </m:r>
+          </m:e>
+          <m:sub>
+            <m:r>
+              <w:rPr>
+                <w:rFonts w:ascii="Cambria Math" w:eastAsiaTheme="minorEastAsia" w:hAnsi="Cambria Math"/>
+              </w:rPr>
+              <m:t>1</m:t>
+            </m:r>
+          </m:sub>
+        </m:sSub>
+        <m:r>
+          <w:rPr>
+            <w:rFonts w:ascii="Cambria Math" w:eastAsiaTheme="minorEastAsia" w:hAnsi="Cambria Math"/>
+          </w:rPr>
+          <m:t>=0</m:t>
+        </m:r>
+      </m:oMath>
       <w:r>
         <w:rPr>
           <w:rFonts w:eastAsiaTheme="minorEastAsia"/>
           <w:iCs/>
         </w:rPr>
+        <w:t xml:space="preserve"> és </w:t>
+      </w:r>
+      <m:oMath>
+        <m:sSub>
+          <m:sSubPr>
+            <m:ctrlPr>
+              <w:rPr>
+                <w:rFonts w:ascii="Cambria Math" w:eastAsiaTheme="minorEastAsia" w:hAnsi="Cambria Math"/>
+                <w:i/>
+                <w:iCs/>
+              </w:rPr>
+            </m:ctrlPr>
+          </m:sSubPr>
+          <m:e>
+            <m:r>
+              <w:rPr>
+                <w:rFonts w:ascii="Cambria Math" w:eastAsiaTheme="minorEastAsia" w:hAnsi="Cambria Math"/>
+              </w:rPr>
+              <m:t>n</m:t>
+            </m:r>
+          </m:e>
+          <m:sub>
+            <m:r>
+              <w:rPr>
+                <w:rFonts w:ascii="Cambria Math" w:eastAsiaTheme="minorEastAsia" w:hAnsi="Cambria Math"/>
+              </w:rPr>
+              <m:t>2</m:t>
+            </m:r>
+          </m:sub>
+        </m:sSub>
+        <m:r>
+          <w:rPr>
+            <w:rFonts w:ascii="Cambria Math" w:eastAsiaTheme="minorEastAsia" w:hAnsi="Cambria Math"/>
+          </w:rPr>
+          <m:t>=</m:t>
+        </m:r>
+        <m:sSub>
+          <m:sSubPr>
+            <m:ctrlPr>
+              <w:rPr>
+                <w:rFonts w:ascii="Cambria Math" w:eastAsiaTheme="minorEastAsia" w:hAnsi="Cambria Math"/>
+                <w:i/>
+                <w:iCs/>
+              </w:rPr>
+            </m:ctrlPr>
+          </m:sSubPr>
+          <m:e>
+            <m:r>
+              <w:rPr>
+                <w:rFonts w:ascii="Cambria Math" w:eastAsiaTheme="minorEastAsia" w:hAnsi="Cambria Math"/>
+              </w:rPr>
+              <m:t>n</m:t>
+            </m:r>
+          </m:e>
+          <m:sub>
+            <m:r>
+              <w:rPr>
+                <w:rFonts w:ascii="Cambria Math" w:eastAsiaTheme="minorEastAsia" w:hAnsi="Cambria Math"/>
+              </w:rPr>
+              <m:t>max</m:t>
+            </m:r>
+          </m:sub>
+        </m:sSub>
+      </m:oMath>
+      <w:r>
+        <w:rPr>
+          <w:rFonts w:eastAsiaTheme="minorEastAsia"/>
+          <w:iCs/>
+        </w:rPr>
+        <w:t xml:space="preserve"> végpontokra is kiszámolja az értékeket és az eredmény megadható egyetlen osztás elvégzésével:</w:t>
+      </w:r>
+    </w:p>
+    <w:p>
+      <w:pPr>
+        <w:rPr>
+          <w:rFonts w:eastAsiaTheme="minorEastAsia"/>
+          <w:iCs/>
+        </w:rPr>
+      </w:pPr>
+      <m:oMathPara>
+        <m:oMath>
+          <m:r>
+            <w:rPr>
+              <w:rFonts w:ascii="Cambria Math" w:eastAsiaTheme="minorEastAsia" w:hAnsi="Cambria Math"/>
+            </w:rPr>
+            <m:t>S=</m:t>
+          </m:r>
+          <m:f>
+            <m:fPr>
+              <m:ctrlPr>
+                <w:rPr>
+                  <w:rFonts w:ascii="Cambria Math" w:eastAsiaTheme="minorEastAsia" w:hAnsi="Cambria Math"/>
+                  <w:i/>
+                  <w:iCs/>
+                </w:rPr>
+              </m:ctrlPr>
+            </m:fPr>
+            <m:num>
+              <m:r>
+                <w:rPr>
+                  <w:rFonts w:ascii="Cambria Math" w:eastAsiaTheme="minorEastAsia" w:hAnsi="Cambria Math"/>
+                </w:rPr>
+                <m:t>T</m:t>
+              </m:r>
+            </m:num>
+            <m:den>
+              <m:r>
+                <w:rPr>
+                  <w:rFonts w:ascii="Cambria Math" w:eastAsiaTheme="minorEastAsia" w:hAnsi="Cambria Math"/>
+                </w:rPr>
+                <m:t>BQ</m:t>
+              </m:r>
+            </m:den>
+          </m:f>
+        </m:oMath>
+      </m:oMathPara>
+    </w:p>
+    <w:p>
+      <w:pPr>
+        <w:rPr>
+          <w:rFonts w:eastAsiaTheme="minorEastAsia"/>
+          <w:iCs/>
+        </w:rPr>
+      </w:pPr>
+      <w:r>
+        <w:rPr>
+          <w:rFonts w:eastAsiaTheme="minorEastAsia"/>
+          <w:iCs/>
+        </w:rPr>
+        <w:lastRenderedPageBreak/>
         <w:t xml:space="preserve">A </w:t>
       </w:r>
       <w:r>
@@ -10473,15 +12710,13 @@
         </w:rPr>
         <w:t xml:space="preserve"> </w:t>
       </w:r>
-      <w:proofErr w:type="spellStart"/>
       <w:r>
         <w:rPr>
           <w:rFonts w:eastAsiaTheme="minorEastAsia"/>
           <w:iCs/>
         </w:rPr>
-        <w:t>Srinivasa</w:t>
-      </w:r>
-      <w:proofErr w:type="spellEnd"/>
+        <w:t>Srinivasa Ramanujan</w:t>
+      </w:r>
       <w:r>
         <w:rPr>
           <w:rFonts w:eastAsiaTheme="minorEastAsia"/>
@@ -10489,44 +12724,12 @@
         </w:rPr>
         <w:t xml:space="preserve"> </w:t>
       </w:r>
-      <w:proofErr w:type="spellStart"/>
       <w:r>
         <w:rPr>
           <w:rFonts w:eastAsiaTheme="minorEastAsia"/>
           <w:iCs/>
         </w:rPr>
-        <w:t>Ramanujan</w:t>
-      </w:r>
-      <w:proofErr w:type="spellEnd"/>
-      <w:r>
-        <w:rPr>
-          <w:rFonts w:eastAsiaTheme="minorEastAsia"/>
-          <w:iCs/>
-        </w:rPr>
-        <w:t xml:space="preserve"> </w:t>
-      </w:r>
-      <w:r>
-        <w:rPr>
-          <w:rFonts w:eastAsiaTheme="minorEastAsia"/>
-          <w:iCs/>
-        </w:rPr>
-        <w:t xml:space="preserve">által inspirált, </w:t>
-      </w:r>
-      <w:proofErr w:type="spellStart"/>
-      <w:r>
-        <w:rPr>
-          <w:rFonts w:eastAsiaTheme="minorEastAsia"/>
-          <w:iCs/>
-        </w:rPr>
-        <w:t>Chudnovsky</w:t>
-      </w:r>
-      <w:proofErr w:type="spellEnd"/>
-      <w:r>
-        <w:rPr>
-          <w:rFonts w:eastAsiaTheme="minorEastAsia"/>
-          <w:iCs/>
-        </w:rPr>
-        <w:t xml:space="preserve"> fivérek</w:t>
+        <w:t>által inspirált, Chudnovsky fivérek</w:t>
       </w:r>
       <w:r>
         <w:rPr>
@@ -10835,7 +13038,6 @@
       </w:pPr>
       <w:bookmarkStart w:id="18" w:name="_Toc218619930"/>
       <w:r>
-        <w:lastRenderedPageBreak/>
         <w:t>Számológép megvalósítása</w:t>
       </w:r>
       <w:bookmarkEnd w:id="18"/>
@@ -10866,15 +13068,7 @@
       </w:pPr>
       <w:bookmarkStart w:id="21" w:name="_Toc218619933"/>
       <w:r>
-        <w:t>Euklideszi tér számológép (</w:t>
-      </w:r>
-      <w:proofErr w:type="spellStart"/>
-      <w:r>
-        <w:t>EuclideanSpace</w:t>
-      </w:r>
-      <w:proofErr w:type="spellEnd"/>
-      <w:r>
-        <w:t>)</w:t>
+        <w:t>Euklideszi tér számológép (EuclideanSpace)</w:t>
       </w:r>
       <w:bookmarkEnd w:id="21"/>
     </w:p>
@@ -10884,15 +13078,7 @@
       </w:pPr>
       <w:bookmarkStart w:id="22" w:name="_Toc218619934"/>
       <w:r>
-        <w:t>Polinom számológép (</w:t>
-      </w:r>
-      <w:proofErr w:type="spellStart"/>
-      <w:r>
-        <w:t>Polynomials</w:t>
-      </w:r>
-      <w:proofErr w:type="spellEnd"/>
-      <w:r>
-        <w:t>)</w:t>
+        <w:t>Polinom számológép (Polynomials)</w:t>
       </w:r>
       <w:bookmarkEnd w:id="22"/>
     </w:p>
@@ -10902,15 +13088,7 @@
       </w:pPr>
       <w:bookmarkStart w:id="23" w:name="_Toc218619935"/>
       <w:r>
-        <w:t>Integrálközelítés számológép (</w:t>
-      </w:r>
-      <w:proofErr w:type="spellStart"/>
-      <w:r>
-        <w:t>Integral</w:t>
-      </w:r>
-      <w:proofErr w:type="spellEnd"/>
-      <w:r>
-        <w:t>)</w:t>
+        <w:t>Integrálközelítés számológép (Integral)</w:t>
       </w:r>
       <w:bookmarkEnd w:id="23"/>
     </w:p>

</xml_diff>

<commit_message>
Adding full explanation to pi and partial explanation to the exponantial function in the documentation.
</commit_message>
<xml_diff>
--- a/Documentation.docx
+++ b/Documentation.docx
@@ -2589,13 +2589,7 @@
             <w:rPr>
               <w:rFonts w:ascii="Cambria Math" w:hAnsi="Cambria Math"/>
             </w:rPr>
-            <m:t>123=1</m:t>
-          </m:r>
-          <m:r>
-            <w:rPr>
-              <w:rFonts w:ascii="Cambria Math" w:hAnsi="Cambria Math"/>
-            </w:rPr>
-            <m:t>∙</m:t>
+            <m:t>123=1∙</m:t>
           </m:r>
           <m:sSup>
             <m:sSupPr>
@@ -2627,13 +2621,7 @@
             <w:rPr>
               <w:rFonts w:ascii="Cambria Math" w:hAnsi="Cambria Math"/>
             </w:rPr>
-            <m:t>+2</m:t>
-          </m:r>
-          <m:r>
-            <w:rPr>
-              <w:rFonts w:ascii="Cambria Math" w:hAnsi="Cambria Math"/>
-            </w:rPr>
-            <m:t>∙</m:t>
+            <m:t>+2∙</m:t>
           </m:r>
           <m:sSup>
             <m:sSupPr>
@@ -2665,13 +2653,7 @@
             <w:rPr>
               <w:rFonts w:ascii="Cambria Math" w:hAnsi="Cambria Math"/>
             </w:rPr>
-            <m:t>+3</m:t>
-          </m:r>
-          <m:r>
-            <w:rPr>
-              <w:rFonts w:ascii="Cambria Math" w:hAnsi="Cambria Math"/>
-            </w:rPr>
-            <m:t>∙</m:t>
+            <m:t>+3∙</m:t>
           </m:r>
           <m:sSup>
             <m:sSupPr>
@@ -2721,13 +2703,7 @@
             <w:rPr>
               <w:rFonts w:ascii="Cambria Math" w:hAnsi="Cambria Math"/>
             </w:rPr>
-            <m:t>123.25=1</m:t>
-          </m:r>
-          <m:r>
-            <w:rPr>
-              <w:rFonts w:ascii="Cambria Math" w:hAnsi="Cambria Math"/>
-            </w:rPr>
-            <m:t>∙</m:t>
+            <m:t>123.25=1∙</m:t>
           </m:r>
           <m:sSup>
             <m:sSupPr>
@@ -2759,13 +2735,7 @@
             <w:rPr>
               <w:rFonts w:ascii="Cambria Math" w:hAnsi="Cambria Math"/>
             </w:rPr>
-            <m:t>+2</m:t>
-          </m:r>
-          <m:r>
-            <w:rPr>
-              <w:rFonts w:ascii="Cambria Math" w:hAnsi="Cambria Math"/>
-            </w:rPr>
-            <m:t>∙</m:t>
+            <m:t>+2∙</m:t>
           </m:r>
           <m:sSup>
             <m:sSupPr>
@@ -2797,13 +2767,7 @@
             <w:rPr>
               <w:rFonts w:ascii="Cambria Math" w:hAnsi="Cambria Math"/>
             </w:rPr>
-            <m:t>+3</m:t>
-          </m:r>
-          <m:r>
-            <w:rPr>
-              <w:rFonts w:ascii="Cambria Math" w:hAnsi="Cambria Math"/>
-            </w:rPr>
-            <m:t>∙</m:t>
+            <m:t>+3∙</m:t>
           </m:r>
           <m:sSup>
             <m:sSupPr>
@@ -2835,13 +2799,7 @@
             <w:rPr>
               <w:rFonts w:ascii="Cambria Math" w:hAnsi="Cambria Math"/>
             </w:rPr>
-            <m:t>+2</m:t>
-          </m:r>
-          <m:r>
-            <w:rPr>
-              <w:rFonts w:ascii="Cambria Math" w:hAnsi="Cambria Math"/>
-            </w:rPr>
-            <m:t>∙</m:t>
+            <m:t>+2∙</m:t>
           </m:r>
           <m:sSup>
             <m:sSupPr>
@@ -2873,13 +2831,7 @@
             <w:rPr>
               <w:rFonts w:ascii="Cambria Math" w:hAnsi="Cambria Math"/>
             </w:rPr>
-            <m:t>+5</m:t>
-          </m:r>
-          <m:r>
-            <w:rPr>
-              <w:rFonts w:ascii="Cambria Math" w:hAnsi="Cambria Math"/>
-            </w:rPr>
-            <m:t>∙</m:t>
+            <m:t>+5∙</m:t>
           </m:r>
           <m:sSup>
             <m:sSupPr>
@@ -3039,13 +2991,7 @@
             <w:rPr>
               <w:rFonts w:ascii="Cambria Math" w:hAnsi="Cambria Math"/>
             </w:rPr>
-            <m:t>1</m:t>
-          </m:r>
-          <m:r>
-            <w:rPr>
-              <w:rFonts w:ascii="Cambria Math" w:hAnsi="Cambria Math"/>
-            </w:rPr>
-            <m:t>∙</m:t>
+            <m:t>1∙</m:t>
           </m:r>
           <m:sSup>
             <m:sSupPr>
@@ -3077,13 +3023,7 @@
             <w:rPr>
               <w:rFonts w:ascii="Cambria Math" w:hAnsi="Cambria Math"/>
             </w:rPr>
-            <m:t>+0</m:t>
-          </m:r>
-          <m:r>
-            <w:rPr>
-              <w:rFonts w:ascii="Cambria Math" w:hAnsi="Cambria Math"/>
-            </w:rPr>
-            <m:t>∙</m:t>
+            <m:t>+0∙</m:t>
           </m:r>
           <m:sSup>
             <m:sSupPr>
@@ -3115,13 +3055,7 @@
             <w:rPr>
               <w:rFonts w:ascii="Cambria Math" w:hAnsi="Cambria Math"/>
             </w:rPr>
-            <m:t>+1</m:t>
-          </m:r>
-          <m:r>
-            <w:rPr>
-              <w:rFonts w:ascii="Cambria Math" w:hAnsi="Cambria Math"/>
-            </w:rPr>
-            <m:t>∙</m:t>
+            <m:t>+1∙</m:t>
           </m:r>
           <m:sSup>
             <m:sSupPr>
@@ -3153,13 +3087,7 @@
             <w:rPr>
               <w:rFonts w:ascii="Cambria Math" w:hAnsi="Cambria Math"/>
             </w:rPr>
-            <m:t>+1</m:t>
-          </m:r>
-          <m:r>
-            <w:rPr>
-              <w:rFonts w:ascii="Cambria Math" w:hAnsi="Cambria Math"/>
-            </w:rPr>
-            <m:t>∙</m:t>
+            <m:t>+1∙</m:t>
           </m:r>
           <m:sSup>
             <m:sSupPr>
@@ -3191,13 +3119,7 @@
             <w:rPr>
               <w:rFonts w:ascii="Cambria Math" w:hAnsi="Cambria Math"/>
             </w:rPr>
-            <m:t>+1</m:t>
-          </m:r>
-          <m:r>
-            <w:rPr>
-              <w:rFonts w:ascii="Cambria Math" w:hAnsi="Cambria Math"/>
-            </w:rPr>
-            <m:t>∙</m:t>
+            <m:t>+1∙</m:t>
           </m:r>
           <m:sSup>
             <m:sSupPr>
@@ -3229,13 +3151,7 @@
             <w:rPr>
               <w:rFonts w:ascii="Cambria Math" w:hAnsi="Cambria Math"/>
             </w:rPr>
-            <m:t>+1</m:t>
-          </m:r>
-          <m:r>
-            <w:rPr>
-              <w:rFonts w:ascii="Cambria Math" w:hAnsi="Cambria Math"/>
-            </w:rPr>
-            <m:t>∙</m:t>
+            <m:t>+1∙</m:t>
           </m:r>
           <m:sSup>
             <m:sSupPr>
@@ -3270,6 +3186,9 @@
             <m:t>=</m:t>
           </m:r>
           <m:r>
+            <m:rPr>
+              <m:sty m:val="p"/>
+            </m:rPr>
             <w:rPr>
               <w:rFonts w:ascii="Cambria Math" w:hAnsi="Cambria Math"/>
             </w:rPr>
@@ -3281,13 +3200,7 @@
             <w:rPr>
               <w:rFonts w:ascii="Cambria Math" w:hAnsi="Cambria Math"/>
             </w:rPr>
-            <m:t>=</m:t>
-          </m:r>
-          <m:r>
-            <w:rPr>
-              <w:rFonts w:ascii="Cambria Math" w:hAnsi="Cambria Math"/>
-            </w:rPr>
-            <m:t>8+0+2+1+½+¼=20.75</m:t>
+            <m:t>=8+0+2+1+½+¼=20.75</m:t>
           </m:r>
         </m:oMath>
       </m:oMathPara>
@@ -3944,7 +3857,15 @@
         <w:jc w:val="center"/>
       </w:pPr>
       <w:r>
-        <w:t>&lt;kép egy 0-nál kisebb számról ami rövidebb mint a fractionLength&gt;</w:t>
+        <w:t xml:space="preserve">&lt;kép egy 0-nál kisebb számról ami rövidebb mint a </w:t>
+      </w:r>
+      <w:proofErr w:type="spellStart"/>
+      <w:r>
+        <w:t>fractionLength</w:t>
+      </w:r>
+      <w:proofErr w:type="spellEnd"/>
+      <w:r>
+        <w:t>&gt;</w:t>
       </w:r>
     </w:p>
     <w:p>
@@ -4469,8 +4390,13 @@
         <w:t>long</w:t>
       </w:r>
       <w:r>
-        <w:t xml:space="preserve"> long</w:t>
-      </w:r>
+        <w:t xml:space="preserve"> </w:t>
+      </w:r>
+      <w:proofErr w:type="spellStart"/>
+      <w:r>
+        <w:t>long</w:t>
+      </w:r>
+      <w:proofErr w:type="spellEnd"/>
       <w:r>
         <w:t xml:space="preserve"> számtípus</w:t>
       </w:r>
@@ -4485,13 +4411,7 @@
           <w:rPr>
             <w:rFonts w:ascii="Cambria Math" w:hAnsi="Cambria Math"/>
           </w:rPr>
-          <m:t>18</m:t>
-        </m:r>
-        <m:r>
-          <w:rPr>
-            <w:rFonts w:ascii="Cambria Math" w:hAnsi="Cambria Math"/>
-          </w:rPr>
-          <m:t>∙</m:t>
+          <m:t>18∙</m:t>
         </m:r>
         <m:sSup>
           <m:sSupPr>
@@ -4899,91 +4819,7 @@
             <w:rPr>
               <w:rFonts w:ascii="Cambria Math" w:hAnsi="Cambria Math"/>
             </w:rPr>
-            <m:t>=2</m:t>
-          </m:r>
-          <m:r>
-            <w:rPr>
-              <w:rFonts w:ascii="Cambria Math" w:hAnsi="Cambria Math"/>
-            </w:rPr>
-            <m:t>∙</m:t>
-          </m:r>
-          <m:r>
-            <w:rPr>
-              <w:rFonts w:ascii="Cambria Math" w:hAnsi="Cambria Math"/>
-            </w:rPr>
-            <m:t>2</m:t>
-          </m:r>
-          <m:r>
-            <w:rPr>
-              <w:rFonts w:ascii="Cambria Math" w:hAnsi="Cambria Math"/>
-            </w:rPr>
-            <m:t>∙</m:t>
-          </m:r>
-          <m:r>
-            <w:rPr>
-              <w:rFonts w:ascii="Cambria Math" w:hAnsi="Cambria Math"/>
-            </w:rPr>
-            <m:t>2</m:t>
-          </m:r>
-          <m:r>
-            <w:rPr>
-              <w:rFonts w:ascii="Cambria Math" w:hAnsi="Cambria Math"/>
-            </w:rPr>
-            <m:t>∙</m:t>
-          </m:r>
-          <m:r>
-            <w:rPr>
-              <w:rFonts w:ascii="Cambria Math" w:hAnsi="Cambria Math"/>
-            </w:rPr>
-            <m:t>2</m:t>
-          </m:r>
-          <m:r>
-            <w:rPr>
-              <w:rFonts w:ascii="Cambria Math" w:hAnsi="Cambria Math"/>
-            </w:rPr>
-            <m:t>∙</m:t>
-          </m:r>
-          <m:r>
-            <w:rPr>
-              <w:rFonts w:ascii="Cambria Math" w:hAnsi="Cambria Math"/>
-            </w:rPr>
-            <m:t>2</m:t>
-          </m:r>
-          <m:r>
-            <w:rPr>
-              <w:rFonts w:ascii="Cambria Math" w:hAnsi="Cambria Math"/>
-            </w:rPr>
-            <m:t>∙</m:t>
-          </m:r>
-          <m:r>
-            <w:rPr>
-              <w:rFonts w:ascii="Cambria Math" w:hAnsi="Cambria Math"/>
-            </w:rPr>
-            <m:t>2</m:t>
-          </m:r>
-          <m:r>
-            <w:rPr>
-              <w:rFonts w:ascii="Cambria Math" w:hAnsi="Cambria Math"/>
-            </w:rPr>
-            <m:t>∙</m:t>
-          </m:r>
-          <m:r>
-            <w:rPr>
-              <w:rFonts w:ascii="Cambria Math" w:hAnsi="Cambria Math"/>
-            </w:rPr>
-            <m:t>2</m:t>
-          </m:r>
-          <m:r>
-            <w:rPr>
-              <w:rFonts w:ascii="Cambria Math" w:hAnsi="Cambria Math"/>
-            </w:rPr>
-            <m:t>∙</m:t>
-          </m:r>
-          <m:r>
-            <w:rPr>
-              <w:rFonts w:ascii="Cambria Math" w:hAnsi="Cambria Math"/>
-            </w:rPr>
-            <m:t>2</m:t>
+            <m:t>=2∙2∙2∙2∙2∙2∙2∙2</m:t>
           </m:r>
           <m:r>
             <w:rPr>
@@ -5005,43 +4841,7 @@
                 <w:rPr>
                   <w:rFonts w:ascii="Cambria Math" w:eastAsiaTheme="minorEastAsia" w:hAnsi="Cambria Math"/>
                 </w:rPr>
-                <m:t>2</m:t>
-              </m:r>
-              <m:r>
-                <w:rPr>
-                  <w:rFonts w:ascii="Cambria Math" w:eastAsiaTheme="minorEastAsia" w:hAnsi="Cambria Math"/>
-                </w:rPr>
-                <m:t>∙</m:t>
-              </m:r>
-              <m:r>
-                <w:rPr>
-                  <w:rFonts w:ascii="Cambria Math" w:eastAsiaTheme="minorEastAsia" w:hAnsi="Cambria Math"/>
-                </w:rPr>
-                <m:t>2</m:t>
-              </m:r>
-              <m:r>
-                <w:rPr>
-                  <w:rFonts w:ascii="Cambria Math" w:eastAsiaTheme="minorEastAsia" w:hAnsi="Cambria Math"/>
-                </w:rPr>
-                <m:t>∙</m:t>
-              </m:r>
-              <m:r>
-                <w:rPr>
-                  <w:rFonts w:ascii="Cambria Math" w:eastAsiaTheme="minorEastAsia" w:hAnsi="Cambria Math"/>
-                </w:rPr>
-                <m:t>2</m:t>
-              </m:r>
-              <m:r>
-                <w:rPr>
-                  <w:rFonts w:ascii="Cambria Math" w:eastAsiaTheme="minorEastAsia" w:hAnsi="Cambria Math"/>
-                </w:rPr>
-                <m:t>∙</m:t>
-              </m:r>
-              <m:r>
-                <w:rPr>
-                  <w:rFonts w:ascii="Cambria Math" w:eastAsiaTheme="minorEastAsia" w:hAnsi="Cambria Math"/>
-                </w:rPr>
-                <m:t>2</m:t>
+                <m:t>2∙2∙2∙2</m:t>
               </m:r>
             </m:e>
           </m:d>
@@ -5065,43 +4865,7 @@
                 <w:rPr>
                   <w:rFonts w:ascii="Cambria Math" w:eastAsiaTheme="minorEastAsia" w:hAnsi="Cambria Math"/>
                 </w:rPr>
-                <m:t>2</m:t>
-              </m:r>
-              <m:r>
-                <w:rPr>
-                  <w:rFonts w:ascii="Cambria Math" w:eastAsiaTheme="minorEastAsia" w:hAnsi="Cambria Math"/>
-                </w:rPr>
-                <m:t>∙</m:t>
-              </m:r>
-              <m:r>
-                <w:rPr>
-                  <w:rFonts w:ascii="Cambria Math" w:eastAsiaTheme="minorEastAsia" w:hAnsi="Cambria Math"/>
-                </w:rPr>
-                <m:t>2</m:t>
-              </m:r>
-              <m:r>
-                <w:rPr>
-                  <w:rFonts w:ascii="Cambria Math" w:eastAsiaTheme="minorEastAsia" w:hAnsi="Cambria Math"/>
-                </w:rPr>
-                <m:t>∙</m:t>
-              </m:r>
-              <m:r>
-                <w:rPr>
-                  <w:rFonts w:ascii="Cambria Math" w:eastAsiaTheme="minorEastAsia" w:hAnsi="Cambria Math"/>
-                </w:rPr>
-                <m:t>2</m:t>
-              </m:r>
-              <m:r>
-                <w:rPr>
-                  <w:rFonts w:ascii="Cambria Math" w:eastAsiaTheme="minorEastAsia" w:hAnsi="Cambria Math"/>
-                </w:rPr>
-                <m:t>∙</m:t>
-              </m:r>
-              <m:r>
-                <w:rPr>
-                  <w:rFonts w:ascii="Cambria Math" w:eastAsiaTheme="minorEastAsia" w:hAnsi="Cambria Math"/>
-                </w:rPr>
-                <m:t>2</m:t>
+                <m:t>2∙2∙2∙2</m:t>
               </m:r>
             </m:e>
           </m:d>
@@ -5242,91 +5006,7 @@
             <w:rPr>
               <w:rFonts w:ascii="Cambria Math" w:hAnsi="Cambria Math"/>
             </w:rPr>
-            <m:t>2</m:t>
-          </m:r>
-          <m:r>
-            <w:rPr>
-              <w:rFonts w:ascii="Cambria Math" w:hAnsi="Cambria Math"/>
-            </w:rPr>
-            <m:t>∙</m:t>
-          </m:r>
-          <m:r>
-            <w:rPr>
-              <w:rFonts w:ascii="Cambria Math" w:hAnsi="Cambria Math"/>
-            </w:rPr>
-            <m:t>2</m:t>
-          </m:r>
-          <m:r>
-            <w:rPr>
-              <w:rFonts w:ascii="Cambria Math" w:hAnsi="Cambria Math"/>
-            </w:rPr>
-            <m:t>∙</m:t>
-          </m:r>
-          <m:r>
-            <w:rPr>
-              <w:rFonts w:ascii="Cambria Math" w:hAnsi="Cambria Math"/>
-            </w:rPr>
-            <m:t>2</m:t>
-          </m:r>
-          <m:r>
-            <w:rPr>
-              <w:rFonts w:ascii="Cambria Math" w:hAnsi="Cambria Math"/>
-            </w:rPr>
-            <m:t>∙</m:t>
-          </m:r>
-          <m:r>
-            <w:rPr>
-              <w:rFonts w:ascii="Cambria Math" w:hAnsi="Cambria Math"/>
-            </w:rPr>
-            <m:t>2</m:t>
-          </m:r>
-          <m:r>
-            <w:rPr>
-              <w:rFonts w:ascii="Cambria Math" w:hAnsi="Cambria Math"/>
-            </w:rPr>
-            <m:t>∙</m:t>
-          </m:r>
-          <m:r>
-            <w:rPr>
-              <w:rFonts w:ascii="Cambria Math" w:hAnsi="Cambria Math"/>
-            </w:rPr>
-            <m:t>2</m:t>
-          </m:r>
-          <m:r>
-            <w:rPr>
-              <w:rFonts w:ascii="Cambria Math" w:hAnsi="Cambria Math"/>
-            </w:rPr>
-            <m:t>∙</m:t>
-          </m:r>
-          <m:r>
-            <w:rPr>
-              <w:rFonts w:ascii="Cambria Math" w:hAnsi="Cambria Math"/>
-            </w:rPr>
-            <m:t>2</m:t>
-          </m:r>
-          <m:r>
-            <w:rPr>
-              <w:rFonts w:ascii="Cambria Math" w:hAnsi="Cambria Math"/>
-            </w:rPr>
-            <m:t>∙</m:t>
-          </m:r>
-          <m:r>
-            <w:rPr>
-              <w:rFonts w:ascii="Cambria Math" w:hAnsi="Cambria Math"/>
-            </w:rPr>
-            <m:t>2</m:t>
-          </m:r>
-          <m:r>
-            <w:rPr>
-              <w:rFonts w:ascii="Cambria Math" w:hAnsi="Cambria Math"/>
-            </w:rPr>
-            <m:t>∙</m:t>
-          </m:r>
-          <m:r>
-            <w:rPr>
-              <w:rFonts w:ascii="Cambria Math" w:hAnsi="Cambria Math"/>
-            </w:rPr>
-            <m:t>2</m:t>
+            <m:t>2∙2∙2∙2∙2∙2∙2∙2</m:t>
           </m:r>
           <m:r>
             <w:rPr>
@@ -5348,43 +5028,7 @@
                 <w:rPr>
                   <w:rFonts w:ascii="Cambria Math" w:eastAsiaTheme="minorEastAsia" w:hAnsi="Cambria Math"/>
                 </w:rPr>
-                <m:t>2</m:t>
-              </m:r>
-              <m:r>
-                <w:rPr>
-                  <w:rFonts w:ascii="Cambria Math" w:eastAsiaTheme="minorEastAsia" w:hAnsi="Cambria Math"/>
-                </w:rPr>
-                <m:t>∙</m:t>
-              </m:r>
-              <m:r>
-                <w:rPr>
-                  <w:rFonts w:ascii="Cambria Math" w:eastAsiaTheme="minorEastAsia" w:hAnsi="Cambria Math"/>
-                </w:rPr>
-                <m:t>2</m:t>
-              </m:r>
-              <m:r>
-                <w:rPr>
-                  <w:rFonts w:ascii="Cambria Math" w:eastAsiaTheme="minorEastAsia" w:hAnsi="Cambria Math"/>
-                </w:rPr>
-                <m:t>∙</m:t>
-              </m:r>
-              <m:r>
-                <w:rPr>
-                  <w:rFonts w:ascii="Cambria Math" w:eastAsiaTheme="minorEastAsia" w:hAnsi="Cambria Math"/>
-                </w:rPr>
-                <m:t>2</m:t>
-              </m:r>
-              <m:r>
-                <w:rPr>
-                  <w:rFonts w:ascii="Cambria Math" w:eastAsiaTheme="minorEastAsia" w:hAnsi="Cambria Math"/>
-                </w:rPr>
-                <m:t>∙</m:t>
-              </m:r>
-              <m:r>
-                <w:rPr>
-                  <w:rFonts w:ascii="Cambria Math" w:eastAsiaTheme="minorEastAsia" w:hAnsi="Cambria Math"/>
-                </w:rPr>
-                <m:t>2</m:t>
+                <m:t>2∙2∙2∙2</m:t>
               </m:r>
             </m:e>
           </m:d>
@@ -5408,43 +5052,7 @@
                 <w:rPr>
                   <w:rFonts w:ascii="Cambria Math" w:eastAsiaTheme="minorEastAsia" w:hAnsi="Cambria Math"/>
                 </w:rPr>
-                <m:t>2</m:t>
-              </m:r>
-              <m:r>
-                <w:rPr>
-                  <w:rFonts w:ascii="Cambria Math" w:eastAsiaTheme="minorEastAsia" w:hAnsi="Cambria Math"/>
-                </w:rPr>
-                <m:t>∙</m:t>
-              </m:r>
-              <m:r>
-                <w:rPr>
-                  <w:rFonts w:ascii="Cambria Math" w:eastAsiaTheme="minorEastAsia" w:hAnsi="Cambria Math"/>
-                </w:rPr>
-                <m:t>2</m:t>
-              </m:r>
-              <m:r>
-                <w:rPr>
-                  <w:rFonts w:ascii="Cambria Math" w:eastAsiaTheme="minorEastAsia" w:hAnsi="Cambria Math"/>
-                </w:rPr>
-                <m:t>∙</m:t>
-              </m:r>
-              <m:r>
-                <w:rPr>
-                  <w:rFonts w:ascii="Cambria Math" w:eastAsiaTheme="minorEastAsia" w:hAnsi="Cambria Math"/>
-                </w:rPr>
-                <m:t>2</m:t>
-              </m:r>
-              <m:r>
-                <w:rPr>
-                  <w:rFonts w:ascii="Cambria Math" w:eastAsiaTheme="minorEastAsia" w:hAnsi="Cambria Math"/>
-                </w:rPr>
-                <m:t>∙</m:t>
-              </m:r>
-              <m:r>
-                <w:rPr>
-                  <w:rFonts w:ascii="Cambria Math" w:eastAsiaTheme="minorEastAsia" w:hAnsi="Cambria Math"/>
-                </w:rPr>
-                <m:t>2</m:t>
+                <m:t>2∙2∙2∙2</m:t>
               </m:r>
             </m:e>
           </m:d>
@@ -5478,19 +5086,7 @@
                     <w:rPr>
                       <w:rFonts w:ascii="Cambria Math" w:eastAsiaTheme="minorEastAsia" w:hAnsi="Cambria Math"/>
                     </w:rPr>
-                    <m:t>2</m:t>
-                  </m:r>
-                  <m:r>
-                    <w:rPr>
-                      <w:rFonts w:ascii="Cambria Math" w:eastAsiaTheme="minorEastAsia" w:hAnsi="Cambria Math"/>
-                    </w:rPr>
-                    <m:t>∙</m:t>
-                  </m:r>
-                  <m:r>
-                    <w:rPr>
-                      <w:rFonts w:ascii="Cambria Math" w:eastAsiaTheme="minorEastAsia" w:hAnsi="Cambria Math"/>
-                    </w:rPr>
-                    <m:t>2</m:t>
+                    <m:t>2∙2</m:t>
                   </m:r>
                 </m:e>
               </m:d>
@@ -5514,19 +5110,7 @@
                     <w:rPr>
                       <w:rFonts w:ascii="Cambria Math" w:eastAsiaTheme="minorEastAsia" w:hAnsi="Cambria Math"/>
                     </w:rPr>
-                    <m:t>2</m:t>
-                  </m:r>
-                  <m:r>
-                    <w:rPr>
-                      <w:rFonts w:ascii="Cambria Math" w:eastAsiaTheme="minorEastAsia" w:hAnsi="Cambria Math"/>
-                    </w:rPr>
-                    <m:t>∙</m:t>
-                  </m:r>
-                  <m:r>
-                    <w:rPr>
-                      <w:rFonts w:ascii="Cambria Math" w:eastAsiaTheme="minorEastAsia" w:hAnsi="Cambria Math"/>
-                    </w:rPr>
-                    <m:t>2</m:t>
+                    <m:t>2∙2</m:t>
                   </m:r>
                 </m:e>
               </m:d>
@@ -5562,19 +5146,7 @@
                     <w:rPr>
                       <w:rFonts w:ascii="Cambria Math" w:eastAsiaTheme="minorEastAsia" w:hAnsi="Cambria Math"/>
                     </w:rPr>
-                    <m:t>2</m:t>
-                  </m:r>
-                  <m:r>
-                    <w:rPr>
-                      <w:rFonts w:ascii="Cambria Math" w:eastAsiaTheme="minorEastAsia" w:hAnsi="Cambria Math"/>
-                    </w:rPr>
-                    <m:t>∙</m:t>
-                  </m:r>
-                  <m:r>
-                    <w:rPr>
-                      <w:rFonts w:ascii="Cambria Math" w:eastAsiaTheme="minorEastAsia" w:hAnsi="Cambria Math"/>
-                    </w:rPr>
-                    <m:t>2</m:t>
+                    <m:t>2∙2</m:t>
                   </m:r>
                 </m:e>
               </m:d>
@@ -5598,19 +5170,7 @@
                     <w:rPr>
                       <w:rFonts w:ascii="Cambria Math" w:eastAsiaTheme="minorEastAsia" w:hAnsi="Cambria Math"/>
                     </w:rPr>
-                    <m:t>2</m:t>
-                  </m:r>
-                  <m:r>
-                    <w:rPr>
-                      <w:rFonts w:ascii="Cambria Math" w:eastAsiaTheme="minorEastAsia" w:hAnsi="Cambria Math"/>
-                    </w:rPr>
-                    <m:t>∙</m:t>
-                  </m:r>
-                  <m:r>
-                    <w:rPr>
-                      <w:rFonts w:ascii="Cambria Math" w:eastAsiaTheme="minorEastAsia" w:hAnsi="Cambria Math"/>
-                    </w:rPr>
-                    <m:t>2</m:t>
+                    <m:t>2∙2</m:t>
                   </m:r>
                 </m:e>
               </m:d>
@@ -6167,8 +5727,16 @@
         <w:rPr>
           <w:rFonts w:eastAsiaTheme="minorEastAsia"/>
         </w:rPr>
-        <w:t>François Viète</w:t>
-      </w:r>
+        <w:t xml:space="preserve">François </w:t>
+      </w:r>
+      <w:proofErr w:type="spellStart"/>
+      <w:r>
+        <w:rPr>
+          <w:rFonts w:eastAsiaTheme="minorEastAsia"/>
+        </w:rPr>
+        <w:t>Viète</w:t>
+      </w:r>
+      <w:proofErr w:type="spellEnd"/>
       <w:r>
         <w:rPr>
           <w:rFonts w:eastAsiaTheme="minorEastAsia"/>
@@ -6209,7 +5777,21 @@
         <w:rPr>
           <w:rFonts w:eastAsiaTheme="minorEastAsia"/>
         </w:rPr>
-        <w:t xml:space="preserve">amit Viète </w:t>
+        <w:t xml:space="preserve">amit </w:t>
+      </w:r>
+      <w:proofErr w:type="spellStart"/>
+      <w:r>
+        <w:rPr>
+          <w:rFonts w:eastAsiaTheme="minorEastAsia"/>
+        </w:rPr>
+        <w:t>Viète</w:t>
+      </w:r>
+      <w:proofErr w:type="spellEnd"/>
+      <w:r>
+        <w:rPr>
+          <w:rFonts w:eastAsiaTheme="minorEastAsia"/>
+        </w:rPr>
+        <w:t xml:space="preserve"> </w:t>
       </w:r>
       <w:r>
         <w:rPr>
@@ -7437,7 +7019,15 @@
     </w:p>
     <w:p>
       <w:r>
-        <w:t xml:space="preserve">Egyszerűbben úgy tudnánk elképzelni a fenti számítást, mint a kézi osztás (long division) műveletsorát. Itt is a legnagyobb helyiértékű számjegytől kezdve folyamatosan alulról közelítjük az eredményünket a valós értékhez. </w:t>
+        <w:t xml:space="preserve">Egyszerűbben úgy tudnánk elképzelni a fenti számítást, mint a kézi osztás (long </w:t>
+      </w:r>
+      <w:proofErr w:type="spellStart"/>
+      <w:r>
+        <w:t>division</w:t>
+      </w:r>
+      <w:proofErr w:type="spellEnd"/>
+      <w:r>
+        <w:t xml:space="preserve">) műveletsorát. Itt is a legnagyobb helyiértékű számjegytől kezdve folyamatosan alulról közelítjük az eredményünket a valós értékhez. </w:t>
       </w:r>
       <w:r>
         <w:t>Éppen</w:t>
@@ -8376,13 +7966,7 @@
                     <w:rPr>
                       <w:rFonts w:ascii="Cambria Math" w:hAnsi="Cambria Math"/>
                     </w:rPr>
-                    <m:t>a</m:t>
-                  </m:r>
-                  <m:r>
-                    <w:rPr>
-                      <w:rFonts w:ascii="Cambria Math" w:hAnsi="Cambria Math"/>
-                    </w:rPr>
-                    <m:t>∙</m:t>
+                    <m:t>a∙</m:t>
                   </m:r>
                   <m:func>
                     <m:funcPr>
@@ -8438,7 +8022,13 @@
             <w:rPr>
               <w:rFonts w:ascii="Cambria Math" w:hAnsi="Cambria Math"/>
             </w:rPr>
-            <m:t xml:space="preserve">    (x&gt;0</m:t>
+            <m:t xml:space="preserve">   </m:t>
+          </m:r>
+          <m:r>
+            <w:rPr>
+              <w:rFonts w:ascii="Cambria Math" w:hAnsi="Cambria Math"/>
+            </w:rPr>
+            <m:t>(x&gt;0</m:t>
           </m:r>
           <m:r>
             <w:rPr>
@@ -9619,19 +9209,7 @@
                 <w:rPr>
                   <w:rFonts w:ascii="Cambria Math" w:eastAsiaTheme="minorEastAsia" w:hAnsi="Cambria Math"/>
                 </w:rPr>
-                <m:t>a</m:t>
-              </m:r>
-              <m:r>
-                <w:rPr>
-                  <w:rFonts w:ascii="Cambria Math" w:eastAsiaTheme="minorEastAsia" w:hAnsi="Cambria Math"/>
-                </w:rPr>
-                <m:t>∙</m:t>
-              </m:r>
-              <m:r>
-                <w:rPr>
-                  <w:rFonts w:ascii="Cambria Math" w:eastAsiaTheme="minorEastAsia" w:hAnsi="Cambria Math"/>
-                </w:rPr>
-                <m:t>d</m:t>
+                <m:t>a∙d</m:t>
               </m:r>
             </m:num>
             <m:den>
@@ -9639,19 +9217,7 @@
                 <w:rPr>
                   <w:rFonts w:ascii="Cambria Math" w:eastAsiaTheme="minorEastAsia" w:hAnsi="Cambria Math"/>
                 </w:rPr>
-                <m:t>b</m:t>
-              </m:r>
-              <m:r>
-                <w:rPr>
-                  <w:rFonts w:ascii="Cambria Math" w:eastAsiaTheme="minorEastAsia" w:hAnsi="Cambria Math"/>
-                </w:rPr>
-                <m:t>∙</m:t>
-              </m:r>
-              <m:r>
-                <w:rPr>
-                  <w:rFonts w:ascii="Cambria Math" w:eastAsiaTheme="minorEastAsia" w:hAnsi="Cambria Math"/>
-                </w:rPr>
-                <m:t>c</m:t>
+                <m:t>b∙c</m:t>
               </m:r>
             </m:den>
           </m:f>
@@ -9754,13 +9320,7 @@
                   <w:rPr>
                     <w:rFonts w:ascii="Cambria Math" w:hAnsi="Cambria Math"/>
                   </w:rPr>
-                  <m:t>a</m:t>
-                </m:r>
-                <m:r>
-                  <w:rPr>
-                    <w:rFonts w:ascii="Cambria Math" w:hAnsi="Cambria Math"/>
-                  </w:rPr>
-                  <m:t>∙</m:t>
+                  <m:t>a∙</m:t>
                 </m:r>
                 <m:func>
                   <m:funcPr>
@@ -9868,7 +9428,39 @@
           <w:rFonts w:eastAsiaTheme="minorEastAsia"/>
           <w:iCs/>
         </w:rPr>
-        <w:t xml:space="preserve"> a bináris szétválasztás (binary splitting) alkalmazásá</w:t>
+        <w:t xml:space="preserve"> a bináris szétválasztás (</w:t>
+      </w:r>
+      <w:proofErr w:type="spellStart"/>
+      <w:r>
+        <w:rPr>
+          <w:rFonts w:eastAsiaTheme="minorEastAsia"/>
+          <w:iCs/>
+        </w:rPr>
+        <w:t>binary</w:t>
+      </w:r>
+      <w:proofErr w:type="spellEnd"/>
+      <w:r>
+        <w:rPr>
+          <w:rFonts w:eastAsiaTheme="minorEastAsia"/>
+          <w:iCs/>
+        </w:rPr>
+        <w:t xml:space="preserve"> </w:t>
+      </w:r>
+      <w:proofErr w:type="spellStart"/>
+      <w:r>
+        <w:rPr>
+          <w:rFonts w:eastAsiaTheme="minorEastAsia"/>
+          <w:iCs/>
+        </w:rPr>
+        <w:t>splitting</w:t>
+      </w:r>
+      <w:proofErr w:type="spellEnd"/>
+      <w:r>
+        <w:rPr>
+          <w:rFonts w:eastAsiaTheme="minorEastAsia"/>
+          <w:iCs/>
+        </w:rPr>
+        <w:t>) alkalmazásá</w:t>
       </w:r>
       <w:r>
         <w:rPr>
@@ -10790,7 +10382,13 @@
             <w:rPr>
               <w:rFonts w:ascii="Cambria Math" w:eastAsiaTheme="minorEastAsia" w:hAnsi="Cambria Math"/>
             </w:rPr>
-            <m:t xml:space="preserve">    (</m:t>
+            <m:t xml:space="preserve">    </m:t>
+          </m:r>
+          <m:r>
+            <w:rPr>
+              <w:rFonts w:ascii="Cambria Math" w:eastAsiaTheme="minorEastAsia" w:hAnsi="Cambria Math"/>
+            </w:rPr>
+            <m:t>(</m:t>
           </m:r>
           <m:sSub>
             <m:sSubPr>
@@ -12701,7 +12299,7 @@
           <w:rFonts w:eastAsiaTheme="minorEastAsia"/>
           <w:iCs/>
         </w:rPr>
-        <w:t xml:space="preserve"> a könyvtár a</w:t>
+        <w:t xml:space="preserve"> a könyvtár</w:t>
       </w:r>
       <w:r>
         <w:rPr>
@@ -12710,13 +12308,15 @@
         </w:rPr>
         <w:t xml:space="preserve"> </w:t>
       </w:r>
+      <w:proofErr w:type="spellStart"/>
       <w:r>
         <w:rPr>
           <w:rFonts w:eastAsiaTheme="minorEastAsia"/>
           <w:iCs/>
         </w:rPr>
-        <w:t>Srinivasa Ramanujan</w:t>
-      </w:r>
+        <w:t>Srinivasa</w:t>
+      </w:r>
+      <w:proofErr w:type="spellEnd"/>
       <w:r>
         <w:rPr>
           <w:rFonts w:eastAsiaTheme="minorEastAsia"/>
@@ -12724,12 +12324,58 @@
         </w:rPr>
         <w:t xml:space="preserve"> </w:t>
       </w:r>
+      <w:proofErr w:type="spellStart"/>
       <w:r>
         <w:rPr>
           <w:rFonts w:eastAsiaTheme="minorEastAsia"/>
           <w:iCs/>
         </w:rPr>
-        <w:t>által inspirált, Chudnovsky fivérek</w:t>
+        <w:t>Ramanujan</w:t>
+      </w:r>
+      <w:proofErr w:type="spellEnd"/>
+      <w:r>
+        <w:rPr>
+          <w:rFonts w:eastAsiaTheme="minorEastAsia"/>
+          <w:iCs/>
+        </w:rPr>
+        <w:t xml:space="preserve"> </w:t>
+      </w:r>
+      <w:r>
+        <w:rPr>
+          <w:rFonts w:eastAsiaTheme="minorEastAsia"/>
+          <w:iCs/>
+        </w:rPr>
+        <w:t>inspirált</w:t>
+      </w:r>
+      <w:r>
+        <w:rPr>
+          <w:rFonts w:eastAsiaTheme="minorEastAsia"/>
+          <w:iCs/>
+        </w:rPr>
+        <w:t>a</w:t>
+      </w:r>
+      <w:r>
+        <w:rPr>
+          <w:rFonts w:eastAsiaTheme="minorEastAsia"/>
+          <w:iCs/>
+        </w:rPr>
+        <w:t xml:space="preserve">, </w:t>
+      </w:r>
+      <w:proofErr w:type="spellStart"/>
+      <w:r>
+        <w:rPr>
+          <w:rFonts w:eastAsiaTheme="minorEastAsia"/>
+          <w:iCs/>
+        </w:rPr>
+        <w:t>Chudnovsky</w:t>
+      </w:r>
+      <w:proofErr w:type="spellEnd"/>
+      <w:r>
+        <w:rPr>
+          <w:rFonts w:eastAsiaTheme="minorEastAsia"/>
+          <w:iCs/>
+        </w:rPr>
+        <w:t xml:space="preserve"> fivérek</w:t>
       </w:r>
       <w:r>
         <w:rPr>
@@ -13031,6 +12677,1548 @@
           <w:iCs/>
         </w:rPr>
       </w:pPr>
+      <w:r>
+        <w:rPr>
+          <w:rFonts w:eastAsiaTheme="minorEastAsia"/>
+          <w:iCs/>
+        </w:rPr>
+        <w:t xml:space="preserve">Ez a formula tökéletesen illik a fentebb említett sorösszegre, így az algoritmus alkalmazható </w:t>
+      </w:r>
+      <m:oMath>
+        <m:r>
+          <w:rPr>
+            <w:rFonts w:ascii="Cambria Math" w:eastAsiaTheme="minorEastAsia" w:hAnsi="Cambria Math"/>
+          </w:rPr>
+          <m:t>n&gt;0</m:t>
+        </m:r>
+      </m:oMath>
+      <w:r>
+        <w:rPr>
+          <w:rFonts w:eastAsiaTheme="minorEastAsia"/>
+          <w:iCs/>
+        </w:rPr>
+        <w:t xml:space="preserve"> esetén </w:t>
+      </w:r>
+      <w:r>
+        <w:rPr>
+          <w:rFonts w:eastAsiaTheme="minorEastAsia"/>
+          <w:iCs/>
+        </w:rPr>
+        <w:t>a következő értékek megválasztásával:</w:t>
+      </w:r>
+    </w:p>
+    <w:p>
+      <w:pPr>
+        <w:rPr>
+          <w:rFonts w:eastAsiaTheme="minorEastAsia"/>
+          <w:iCs/>
+        </w:rPr>
+      </w:pPr>
+      <m:oMathPara>
+        <m:oMath>
+          <m:sSub>
+            <m:sSubPr>
+              <m:ctrlPr>
+                <w:rPr>
+                  <w:rFonts w:ascii="Cambria Math" w:eastAsiaTheme="minorEastAsia" w:hAnsi="Cambria Math"/>
+                  <w:i/>
+                  <w:iCs/>
+                </w:rPr>
+              </m:ctrlPr>
+            </m:sSubPr>
+            <m:e>
+              <m:r>
+                <w:rPr>
+                  <w:rFonts w:ascii="Cambria Math" w:eastAsiaTheme="minorEastAsia" w:hAnsi="Cambria Math"/>
+                </w:rPr>
+                <m:t>a</m:t>
+              </m:r>
+            </m:e>
+            <m:sub>
+              <m:r>
+                <w:rPr>
+                  <w:rFonts w:ascii="Cambria Math" w:eastAsiaTheme="minorEastAsia" w:hAnsi="Cambria Math"/>
+                </w:rPr>
+                <m:t>n</m:t>
+              </m:r>
+            </m:sub>
+          </m:sSub>
+          <m:r>
+            <w:rPr>
+              <w:rFonts w:ascii="Cambria Math" w:eastAsiaTheme="minorEastAsia" w:hAnsi="Cambria Math"/>
+            </w:rPr>
+            <m:t>=</m:t>
+          </m:r>
+          <m:r>
+            <w:rPr>
+              <w:rFonts w:ascii="Cambria Math" w:eastAsiaTheme="minorEastAsia" w:hAnsi="Cambria Math"/>
+            </w:rPr>
+            <m:t>13591409</m:t>
+          </m:r>
+          <m:r>
+            <w:rPr>
+              <w:rFonts w:ascii="Cambria Math" w:eastAsiaTheme="minorEastAsia" w:hAnsi="Cambria Math"/>
+            </w:rPr>
+            <m:t>+</m:t>
+          </m:r>
+          <m:r>
+            <w:rPr>
+              <w:rFonts w:ascii="Cambria Math" w:eastAsiaTheme="minorEastAsia" w:hAnsi="Cambria Math"/>
+            </w:rPr>
+            <m:t>545140134</m:t>
+          </m:r>
+          <m:r>
+            <w:rPr>
+              <w:rFonts w:ascii="Cambria Math" w:eastAsiaTheme="minorEastAsia" w:hAnsi="Cambria Math"/>
+            </w:rPr>
+            <m:t>n</m:t>
+          </m:r>
+        </m:oMath>
+      </m:oMathPara>
+    </w:p>
+    <w:p>
+      <w:pPr>
+        <w:rPr>
+          <w:rFonts w:eastAsiaTheme="minorEastAsia"/>
+          <w:iCs/>
+        </w:rPr>
+      </w:pPr>
+      <m:oMathPara>
+        <m:oMath>
+          <m:sSub>
+            <m:sSubPr>
+              <m:ctrlPr>
+                <w:rPr>
+                  <w:rFonts w:ascii="Cambria Math" w:eastAsiaTheme="minorEastAsia" w:hAnsi="Cambria Math"/>
+                  <w:i/>
+                  <w:iCs/>
+                </w:rPr>
+              </m:ctrlPr>
+            </m:sSubPr>
+            <m:e>
+              <m:r>
+                <w:rPr>
+                  <w:rFonts w:ascii="Cambria Math" w:eastAsiaTheme="minorEastAsia" w:hAnsi="Cambria Math"/>
+                </w:rPr>
+                <m:t>b</m:t>
+              </m:r>
+            </m:e>
+            <m:sub>
+              <m:r>
+                <w:rPr>
+                  <w:rFonts w:ascii="Cambria Math" w:eastAsiaTheme="minorEastAsia" w:hAnsi="Cambria Math"/>
+                </w:rPr>
+                <m:t>n</m:t>
+              </m:r>
+            </m:sub>
+          </m:sSub>
+          <m:r>
+            <w:rPr>
+              <w:rFonts w:ascii="Cambria Math" w:eastAsiaTheme="minorEastAsia" w:hAnsi="Cambria Math"/>
+            </w:rPr>
+            <m:t>=</m:t>
+          </m:r>
+          <m:r>
+            <w:rPr>
+              <w:rFonts w:ascii="Cambria Math" w:eastAsiaTheme="minorEastAsia" w:hAnsi="Cambria Math"/>
+            </w:rPr>
+            <m:t>1</m:t>
+          </m:r>
+        </m:oMath>
+      </m:oMathPara>
+    </w:p>
+    <w:p>
+      <w:pPr>
+        <w:rPr>
+          <w:rFonts w:eastAsiaTheme="minorEastAsia"/>
+          <w:iCs/>
+        </w:rPr>
+      </w:pPr>
+      <m:oMathPara>
+        <m:oMath>
+          <m:sSub>
+            <m:sSubPr>
+              <m:ctrlPr>
+                <w:rPr>
+                  <w:rFonts w:ascii="Cambria Math" w:eastAsiaTheme="minorEastAsia" w:hAnsi="Cambria Math"/>
+                  <w:i/>
+                  <w:iCs/>
+                </w:rPr>
+              </m:ctrlPr>
+            </m:sSubPr>
+            <m:e>
+              <m:r>
+                <w:rPr>
+                  <w:rFonts w:ascii="Cambria Math" w:eastAsiaTheme="minorEastAsia" w:hAnsi="Cambria Math"/>
+                </w:rPr>
+                <m:t>p</m:t>
+              </m:r>
+            </m:e>
+            <m:sub>
+              <m:r>
+                <w:rPr>
+                  <w:rFonts w:ascii="Cambria Math" w:eastAsiaTheme="minorEastAsia" w:hAnsi="Cambria Math"/>
+                </w:rPr>
+                <m:t>0</m:t>
+              </m:r>
+            </m:sub>
+          </m:sSub>
+          <m:r>
+            <w:rPr>
+              <w:rFonts w:ascii="Cambria Math" w:eastAsiaTheme="minorEastAsia" w:hAnsi="Cambria Math"/>
+            </w:rPr>
+            <m:t>=</m:t>
+          </m:r>
+          <m:r>
+            <w:rPr>
+              <w:rFonts w:ascii="Cambria Math" w:eastAsiaTheme="minorEastAsia" w:hAnsi="Cambria Math"/>
+            </w:rPr>
+            <m:t xml:space="preserve">1,  </m:t>
+          </m:r>
+          <m:sSub>
+            <m:sSubPr>
+              <m:ctrlPr>
+                <w:rPr>
+                  <w:rFonts w:ascii="Cambria Math" w:eastAsiaTheme="minorEastAsia" w:hAnsi="Cambria Math"/>
+                  <w:i/>
+                  <w:iCs/>
+                </w:rPr>
+              </m:ctrlPr>
+            </m:sSubPr>
+            <m:e>
+              <m:r>
+                <w:rPr>
+                  <w:rFonts w:ascii="Cambria Math" w:eastAsiaTheme="minorEastAsia" w:hAnsi="Cambria Math"/>
+                </w:rPr>
+                <m:t>p</m:t>
+              </m:r>
+            </m:e>
+            <m:sub>
+              <m:r>
+                <w:rPr>
+                  <w:rFonts w:ascii="Cambria Math" w:eastAsiaTheme="minorEastAsia" w:hAnsi="Cambria Math"/>
+                </w:rPr>
+                <m:t>n</m:t>
+              </m:r>
+            </m:sub>
+          </m:sSub>
+          <m:r>
+            <w:rPr>
+              <w:rFonts w:ascii="Cambria Math" w:eastAsiaTheme="minorEastAsia" w:hAnsi="Cambria Math"/>
+            </w:rPr>
+            <m:t>=</m:t>
+          </m:r>
+          <m:r>
+            <w:rPr>
+              <w:rFonts w:ascii="Cambria Math" w:eastAsiaTheme="minorEastAsia" w:hAnsi="Cambria Math"/>
+            </w:rPr>
+            <m:t>-</m:t>
+          </m:r>
+          <m:r>
+            <w:rPr>
+              <w:rFonts w:ascii="Cambria Math" w:eastAsiaTheme="minorEastAsia" w:hAnsi="Cambria Math"/>
+            </w:rPr>
+            <m:t>(6</m:t>
+          </m:r>
+          <m:r>
+            <w:rPr>
+              <w:rFonts w:ascii="Cambria Math" w:eastAsiaTheme="minorEastAsia" w:hAnsi="Cambria Math"/>
+            </w:rPr>
+            <m:t>n</m:t>
+          </m:r>
+          <m:r>
+            <w:rPr>
+              <w:rFonts w:ascii="Cambria Math" w:eastAsiaTheme="minorEastAsia" w:hAnsi="Cambria Math"/>
+            </w:rPr>
+            <m:t>-5)(2</m:t>
+          </m:r>
+          <m:r>
+            <w:rPr>
+              <w:rFonts w:ascii="Cambria Math" w:eastAsiaTheme="minorEastAsia" w:hAnsi="Cambria Math"/>
+            </w:rPr>
+            <m:t>n</m:t>
+          </m:r>
+          <m:r>
+            <w:rPr>
+              <w:rFonts w:ascii="Cambria Math" w:eastAsiaTheme="minorEastAsia" w:hAnsi="Cambria Math"/>
+            </w:rPr>
+            <m:t>-1)(6</m:t>
+          </m:r>
+          <m:r>
+            <w:rPr>
+              <w:rFonts w:ascii="Cambria Math" w:eastAsiaTheme="minorEastAsia" w:hAnsi="Cambria Math"/>
+            </w:rPr>
+            <m:t>n</m:t>
+          </m:r>
+          <m:r>
+            <w:rPr>
+              <w:rFonts w:ascii="Cambria Math" w:eastAsiaTheme="minorEastAsia" w:hAnsi="Cambria Math"/>
+            </w:rPr>
+            <m:t>-1)</m:t>
+          </m:r>
+        </m:oMath>
+      </m:oMathPara>
+    </w:p>
+    <w:p>
+      <w:pPr>
+        <w:rPr>
+          <w:rFonts w:eastAsiaTheme="minorEastAsia"/>
+          <w:iCs/>
+        </w:rPr>
+      </w:pPr>
+      <m:oMathPara>
+        <m:oMath>
+          <m:sSub>
+            <m:sSubPr>
+              <m:ctrlPr>
+                <w:rPr>
+                  <w:rFonts w:ascii="Cambria Math" w:eastAsiaTheme="minorEastAsia" w:hAnsi="Cambria Math"/>
+                  <w:i/>
+                  <w:iCs/>
+                </w:rPr>
+              </m:ctrlPr>
+            </m:sSubPr>
+            <m:e>
+              <m:r>
+                <w:rPr>
+                  <w:rFonts w:ascii="Cambria Math" w:eastAsiaTheme="minorEastAsia" w:hAnsi="Cambria Math"/>
+                </w:rPr>
+                <m:t>q</m:t>
+              </m:r>
+            </m:e>
+            <m:sub>
+              <m:r>
+                <w:rPr>
+                  <w:rFonts w:ascii="Cambria Math" w:eastAsiaTheme="minorEastAsia" w:hAnsi="Cambria Math"/>
+                </w:rPr>
+                <m:t>0</m:t>
+              </m:r>
+            </m:sub>
+          </m:sSub>
+          <m:r>
+            <w:rPr>
+              <w:rFonts w:ascii="Cambria Math" w:eastAsiaTheme="minorEastAsia" w:hAnsi="Cambria Math"/>
+            </w:rPr>
+            <m:t>=</m:t>
+          </m:r>
+          <m:r>
+            <w:rPr>
+              <w:rFonts w:ascii="Cambria Math" w:eastAsiaTheme="minorEastAsia" w:hAnsi="Cambria Math"/>
+            </w:rPr>
+            <m:t xml:space="preserve">1,  </m:t>
+          </m:r>
+          <m:sSub>
+            <m:sSubPr>
+              <m:ctrlPr>
+                <w:rPr>
+                  <w:rFonts w:ascii="Cambria Math" w:eastAsiaTheme="minorEastAsia" w:hAnsi="Cambria Math"/>
+                  <w:i/>
+                  <w:iCs/>
+                </w:rPr>
+              </m:ctrlPr>
+            </m:sSubPr>
+            <m:e>
+              <m:r>
+                <w:rPr>
+                  <w:rFonts w:ascii="Cambria Math" w:eastAsiaTheme="minorEastAsia" w:hAnsi="Cambria Math"/>
+                </w:rPr>
+                <m:t>q</m:t>
+              </m:r>
+            </m:e>
+            <m:sub>
+              <m:r>
+                <w:rPr>
+                  <w:rFonts w:ascii="Cambria Math" w:eastAsiaTheme="minorEastAsia" w:hAnsi="Cambria Math"/>
+                </w:rPr>
+                <m:t>n</m:t>
+              </m:r>
+            </m:sub>
+          </m:sSub>
+          <m:r>
+            <w:rPr>
+              <w:rFonts w:ascii="Cambria Math" w:eastAsiaTheme="minorEastAsia" w:hAnsi="Cambria Math"/>
+            </w:rPr>
+            <m:t>=</m:t>
+          </m:r>
+          <m:f>
+            <m:fPr>
+              <m:ctrlPr>
+                <w:rPr>
+                  <w:rFonts w:ascii="Cambria Math" w:eastAsiaTheme="minorEastAsia" w:hAnsi="Cambria Math"/>
+                  <w:i/>
+                  <w:iCs/>
+                </w:rPr>
+              </m:ctrlPr>
+            </m:fPr>
+            <m:num>
+              <m:sSup>
+                <m:sSupPr>
+                  <m:ctrlPr>
+                    <w:rPr>
+                      <w:rFonts w:ascii="Cambria Math" w:eastAsiaTheme="minorEastAsia" w:hAnsi="Cambria Math"/>
+                      <w:i/>
+                      <w:iCs/>
+                    </w:rPr>
+                  </m:ctrlPr>
+                </m:sSupPr>
+                <m:e>
+                  <m:r>
+                    <w:rPr>
+                      <w:rFonts w:ascii="Cambria Math" w:eastAsiaTheme="minorEastAsia" w:hAnsi="Cambria Math"/>
+                    </w:rPr>
+                    <m:t>640320</m:t>
+                  </m:r>
+                </m:e>
+                <m:sup>
+                  <m:r>
+                    <w:rPr>
+                      <w:rFonts w:ascii="Cambria Math" w:eastAsiaTheme="minorEastAsia" w:hAnsi="Cambria Math"/>
+                    </w:rPr>
+                    <m:t>3</m:t>
+                  </m:r>
+                </m:sup>
+              </m:sSup>
+            </m:num>
+            <m:den>
+              <m:r>
+                <w:rPr>
+                  <w:rFonts w:ascii="Cambria Math" w:eastAsiaTheme="minorEastAsia" w:hAnsi="Cambria Math"/>
+                </w:rPr>
+                <m:t>24</m:t>
+              </m:r>
+            </m:den>
+          </m:f>
+          <m:sSup>
+            <m:sSupPr>
+              <m:ctrlPr>
+                <w:rPr>
+                  <w:rFonts w:ascii="Cambria Math" w:eastAsiaTheme="minorEastAsia" w:hAnsi="Cambria Math"/>
+                  <w:i/>
+                  <w:iCs/>
+                </w:rPr>
+              </m:ctrlPr>
+            </m:sSupPr>
+            <m:e>
+              <m:r>
+                <w:rPr>
+                  <w:rFonts w:ascii="Cambria Math" w:eastAsiaTheme="minorEastAsia" w:hAnsi="Cambria Math"/>
+                </w:rPr>
+                <m:t>n</m:t>
+              </m:r>
+            </m:e>
+            <m:sup>
+              <m:r>
+                <w:rPr>
+                  <w:rFonts w:ascii="Cambria Math" w:eastAsiaTheme="minorEastAsia" w:hAnsi="Cambria Math"/>
+                </w:rPr>
+                <m:t>3</m:t>
+              </m:r>
+            </m:sup>
+          </m:sSup>
+          <m:r>
+            <w:rPr>
+              <w:rFonts w:ascii="Cambria Math" w:eastAsiaTheme="minorEastAsia" w:hAnsi="Cambria Math"/>
+            </w:rPr>
+            <m:t>=</m:t>
+          </m:r>
+          <m:r>
+            <w:rPr>
+              <w:rFonts w:ascii="Cambria Math" w:eastAsiaTheme="minorEastAsia" w:hAnsi="Cambria Math"/>
+            </w:rPr>
+            <m:t>10939058860032000</m:t>
+          </m:r>
+          <m:sSup>
+            <m:sSupPr>
+              <m:ctrlPr>
+                <w:rPr>
+                  <w:rFonts w:ascii="Cambria Math" w:eastAsiaTheme="minorEastAsia" w:hAnsi="Cambria Math"/>
+                  <w:i/>
+                  <w:iCs/>
+                </w:rPr>
+              </m:ctrlPr>
+            </m:sSupPr>
+            <m:e>
+              <m:r>
+                <w:rPr>
+                  <w:rFonts w:ascii="Cambria Math" w:eastAsiaTheme="minorEastAsia" w:hAnsi="Cambria Math"/>
+                </w:rPr>
+                <m:t>n</m:t>
+              </m:r>
+            </m:e>
+            <m:sup>
+              <m:r>
+                <w:rPr>
+                  <w:rFonts w:ascii="Cambria Math" w:eastAsiaTheme="minorEastAsia" w:hAnsi="Cambria Math"/>
+                </w:rPr>
+                <m:t>3</m:t>
+              </m:r>
+            </m:sup>
+          </m:sSup>
+        </m:oMath>
+      </m:oMathPara>
+    </w:p>
+    <w:p>
+      <w:pPr>
+        <w:rPr>
+          <w:rFonts w:eastAsiaTheme="minorEastAsia"/>
+          <w:iCs/>
+        </w:rPr>
+      </w:pPr>
+      <w:r>
+        <w:rPr>
+          <w:rFonts w:eastAsiaTheme="minorEastAsia"/>
+          <w:iCs/>
+        </w:rPr>
+        <w:t xml:space="preserve">Mivel a </w:t>
+      </w:r>
+      <m:oMath>
+        <m:sSub>
+          <m:sSubPr>
+            <m:ctrlPr>
+              <w:rPr>
+                <w:rFonts w:ascii="Cambria Math" w:eastAsiaTheme="minorEastAsia" w:hAnsi="Cambria Math"/>
+                <w:i/>
+                <w:iCs/>
+              </w:rPr>
+            </m:ctrlPr>
+          </m:sSubPr>
+          <m:e>
+            <m:r>
+              <w:rPr>
+                <w:rFonts w:ascii="Cambria Math" w:eastAsiaTheme="minorEastAsia" w:hAnsi="Cambria Math"/>
+              </w:rPr>
+              <m:t>b</m:t>
+            </m:r>
+          </m:e>
+          <m:sub>
+            <m:r>
+              <w:rPr>
+                <w:rFonts w:ascii="Cambria Math" w:eastAsiaTheme="minorEastAsia" w:hAnsi="Cambria Math"/>
+              </w:rPr>
+              <m:t>n</m:t>
+            </m:r>
+          </m:sub>
+        </m:sSub>
+      </m:oMath>
+      <w:r>
+        <w:rPr>
+          <w:rFonts w:eastAsiaTheme="minorEastAsia"/>
+          <w:iCs/>
+        </w:rPr>
+        <w:t xml:space="preserve"> sorozat folytonosan 1 és mivel csak szorzásokban vesz részt, így az algoritmusból elhagyható.</w:t>
+      </w:r>
+      <w:r>
+        <w:rPr>
+          <w:rFonts w:eastAsiaTheme="minorEastAsia"/>
+          <w:iCs/>
+        </w:rPr>
+        <w:t xml:space="preserve"> A fenti képletből adódóan az egyszerűsödött képlet így néz ki:</w:t>
+      </w:r>
+    </w:p>
+    <w:p>
+      <w:pPr>
+        <w:rPr>
+          <w:rFonts w:eastAsiaTheme="minorEastAsia"/>
+          <w:iCs/>
+        </w:rPr>
+      </w:pPr>
+      <m:oMathPara>
+        <m:oMath>
+          <m:f>
+            <m:fPr>
+              <m:ctrlPr>
+                <w:rPr>
+                  <w:rFonts w:ascii="Cambria Math" w:eastAsiaTheme="minorEastAsia" w:hAnsi="Cambria Math"/>
+                  <w:i/>
+                  <w:iCs/>
+                </w:rPr>
+              </m:ctrlPr>
+            </m:fPr>
+            <m:num>
+              <m:r>
+                <w:rPr>
+                  <w:rFonts w:ascii="Cambria Math" w:eastAsiaTheme="minorEastAsia" w:hAnsi="Cambria Math"/>
+                </w:rPr>
+                <m:t>1</m:t>
+              </m:r>
+            </m:num>
+            <m:den>
+              <m:r>
+                <w:rPr>
+                  <w:rFonts w:ascii="Cambria Math" w:eastAsiaTheme="minorEastAsia" w:hAnsi="Cambria Math"/>
+                </w:rPr>
+                <m:t>π</m:t>
+              </m:r>
+            </m:den>
+          </m:f>
+          <m:r>
+            <w:rPr>
+              <w:rFonts w:ascii="Cambria Math" w:eastAsiaTheme="minorEastAsia" w:hAnsi="Cambria Math"/>
+            </w:rPr>
+            <m:t>=</m:t>
+          </m:r>
+          <m:f>
+            <m:fPr>
+              <m:ctrlPr>
+                <w:rPr>
+                  <w:rFonts w:ascii="Cambria Math" w:eastAsiaTheme="minorEastAsia" w:hAnsi="Cambria Math"/>
+                  <w:i/>
+                  <w:iCs/>
+                </w:rPr>
+              </m:ctrlPr>
+            </m:fPr>
+            <m:num>
+              <m:rad>
+                <m:radPr>
+                  <m:degHide m:val="1"/>
+                  <m:ctrlPr>
+                    <w:rPr>
+                      <w:rFonts w:ascii="Cambria Math" w:eastAsiaTheme="minorEastAsia" w:hAnsi="Cambria Math"/>
+                      <w:i/>
+                      <w:iCs/>
+                    </w:rPr>
+                  </m:ctrlPr>
+                </m:radPr>
+                <m:deg/>
+                <m:e>
+                  <m:r>
+                    <w:rPr>
+                      <w:rFonts w:ascii="Cambria Math" w:eastAsiaTheme="minorEastAsia" w:hAnsi="Cambria Math"/>
+                    </w:rPr>
+                    <m:t>10005</m:t>
+                  </m:r>
+                </m:e>
+              </m:rad>
+            </m:num>
+            <m:den>
+              <m:r>
+                <w:rPr>
+                  <w:rFonts w:ascii="Cambria Math" w:eastAsiaTheme="minorEastAsia" w:hAnsi="Cambria Math"/>
+                </w:rPr>
+                <m:t>427093440</m:t>
+              </m:r>
+              <m:r>
+                <w:rPr>
+                  <w:rFonts w:ascii="Cambria Math" w:eastAsiaTheme="minorEastAsia" w:hAnsi="Cambria Math"/>
+                </w:rPr>
+                <m:t>0</m:t>
+              </m:r>
+            </m:den>
+          </m:f>
+          <m:r>
+            <w:rPr>
+              <w:rFonts w:ascii="Cambria Math" w:eastAsiaTheme="minorEastAsia" w:hAnsi="Cambria Math"/>
+            </w:rPr>
+            <m:t>∙</m:t>
+          </m:r>
+          <m:f>
+            <m:fPr>
+              <m:ctrlPr>
+                <w:rPr>
+                  <w:rFonts w:ascii="Cambria Math" w:eastAsiaTheme="minorEastAsia" w:hAnsi="Cambria Math"/>
+                  <w:i/>
+                  <w:iCs/>
+                </w:rPr>
+              </m:ctrlPr>
+            </m:fPr>
+            <m:num>
+              <m:r>
+                <w:rPr>
+                  <w:rFonts w:ascii="Cambria Math" w:eastAsiaTheme="minorEastAsia" w:hAnsi="Cambria Math"/>
+                </w:rPr>
+                <m:t>T</m:t>
+              </m:r>
+            </m:num>
+            <m:den>
+              <m:r>
+                <w:rPr>
+                  <w:rFonts w:ascii="Cambria Math" w:eastAsiaTheme="minorEastAsia" w:hAnsi="Cambria Math"/>
+                </w:rPr>
+                <m:t>Q</m:t>
+              </m:r>
+            </m:den>
+          </m:f>
+          <m:r>
+            <w:rPr>
+              <w:rFonts w:ascii="Cambria Math" w:eastAsiaTheme="minorEastAsia" w:hAnsi="Cambria Math"/>
+            </w:rPr>
+            <m:t xml:space="preserve"> =</m:t>
+          </m:r>
+          <m:f>
+            <m:fPr>
+              <m:ctrlPr>
+                <w:rPr>
+                  <w:rFonts w:ascii="Cambria Math" w:eastAsiaTheme="minorEastAsia" w:hAnsi="Cambria Math"/>
+                  <w:i/>
+                  <w:iCs/>
+                </w:rPr>
+              </m:ctrlPr>
+            </m:fPr>
+            <m:num>
+              <m:rad>
+                <m:radPr>
+                  <m:degHide m:val="1"/>
+                  <m:ctrlPr>
+                    <w:rPr>
+                      <w:rFonts w:ascii="Cambria Math" w:eastAsiaTheme="minorEastAsia" w:hAnsi="Cambria Math"/>
+                      <w:i/>
+                      <w:iCs/>
+                    </w:rPr>
+                  </m:ctrlPr>
+                </m:radPr>
+                <m:deg/>
+                <m:e>
+                  <m:r>
+                    <w:rPr>
+                      <w:rFonts w:ascii="Cambria Math" w:eastAsiaTheme="minorEastAsia" w:hAnsi="Cambria Math"/>
+                    </w:rPr>
+                    <m:t>10005</m:t>
+                  </m:r>
+                </m:e>
+              </m:rad>
+              <m:r>
+                <w:rPr>
+                  <w:rFonts w:ascii="Cambria Math" w:eastAsiaTheme="minorEastAsia" w:hAnsi="Cambria Math"/>
+                </w:rPr>
+                <m:t>∙</m:t>
+              </m:r>
+              <m:r>
+                <w:rPr>
+                  <w:rFonts w:ascii="Cambria Math" w:eastAsiaTheme="minorEastAsia" w:hAnsi="Cambria Math"/>
+                </w:rPr>
+                <m:t>T</m:t>
+              </m:r>
+            </m:num>
+            <m:den>
+              <m:r>
+                <w:rPr>
+                  <w:rFonts w:ascii="Cambria Math" w:eastAsiaTheme="minorEastAsia" w:hAnsi="Cambria Math"/>
+                </w:rPr>
+                <m:t>4270934400</m:t>
+              </m:r>
+              <m:r>
+                <w:rPr>
+                  <w:rFonts w:ascii="Cambria Math" w:eastAsiaTheme="minorEastAsia" w:hAnsi="Cambria Math"/>
+                </w:rPr>
+                <m:t>∙</m:t>
+              </m:r>
+              <m:r>
+                <w:rPr>
+                  <w:rFonts w:ascii="Cambria Math" w:eastAsiaTheme="minorEastAsia" w:hAnsi="Cambria Math"/>
+                </w:rPr>
+                <m:t>Q</m:t>
+              </m:r>
+            </m:den>
+          </m:f>
+        </m:oMath>
+      </m:oMathPara>
+    </w:p>
+    <w:p>
+      <w:pPr>
+        <w:rPr>
+          <w:rFonts w:eastAsiaTheme="minorEastAsia"/>
+          <w:iCs/>
+        </w:rPr>
+      </w:pPr>
+      <w:r>
+        <w:rPr>
+          <w:rFonts w:eastAsiaTheme="minorEastAsia"/>
+          <w:iCs/>
+        </w:rPr>
+        <w:t>A végeredmény pedig úgy jön ki, hogy reciprokot vonunk</w:t>
+      </w:r>
+      <w:r>
+        <w:rPr>
+          <w:rFonts w:eastAsiaTheme="minorEastAsia"/>
+          <w:iCs/>
+        </w:rPr>
+        <w:t xml:space="preserve"> és egyszerűsítünk</w:t>
+      </w:r>
+      <w:r>
+        <w:rPr>
+          <w:rFonts w:eastAsiaTheme="minorEastAsia"/>
+          <w:iCs/>
+        </w:rPr>
+        <w:t>, vagyis:</w:t>
+      </w:r>
+    </w:p>
+    <w:p>
+      <w:pPr>
+        <w:rPr>
+          <w:rFonts w:eastAsiaTheme="minorEastAsia"/>
+          <w:iCs/>
+        </w:rPr>
+      </w:pPr>
+      <m:oMathPara>
+        <m:oMathParaPr>
+          <m:jc m:val="center"/>
+        </m:oMathParaPr>
+        <m:oMath>
+          <m:r>
+            <w:rPr>
+              <w:rFonts w:ascii="Cambria Math" w:eastAsiaTheme="minorEastAsia" w:hAnsi="Cambria Math"/>
+            </w:rPr>
+            <m:t>π=</m:t>
+          </m:r>
+          <m:f>
+            <m:fPr>
+              <m:ctrlPr>
+                <w:rPr>
+                  <w:rFonts w:ascii="Cambria Math" w:eastAsiaTheme="minorEastAsia" w:hAnsi="Cambria Math"/>
+                  <w:i/>
+                  <w:iCs/>
+                </w:rPr>
+              </m:ctrlPr>
+            </m:fPr>
+            <m:num>
+              <m:r>
+                <w:rPr>
+                  <w:rFonts w:ascii="Cambria Math" w:eastAsiaTheme="minorEastAsia" w:hAnsi="Cambria Math"/>
+                </w:rPr>
+                <m:t>4270934400</m:t>
+              </m:r>
+              <m:r>
+                <w:rPr>
+                  <w:rFonts w:ascii="Cambria Math" w:eastAsiaTheme="minorEastAsia" w:hAnsi="Cambria Math"/>
+                </w:rPr>
+                <m:t>∙</m:t>
+              </m:r>
+              <m:r>
+                <w:rPr>
+                  <w:rFonts w:ascii="Cambria Math" w:eastAsiaTheme="minorEastAsia" w:hAnsi="Cambria Math"/>
+                </w:rPr>
+                <m:t>Q</m:t>
+              </m:r>
+            </m:num>
+            <m:den>
+              <m:rad>
+                <m:radPr>
+                  <m:degHide m:val="1"/>
+                  <m:ctrlPr>
+                    <w:rPr>
+                      <w:rFonts w:ascii="Cambria Math" w:eastAsiaTheme="minorEastAsia" w:hAnsi="Cambria Math"/>
+                      <w:i/>
+                      <w:iCs/>
+                    </w:rPr>
+                  </m:ctrlPr>
+                </m:radPr>
+                <m:deg/>
+                <m:e>
+                  <m:r>
+                    <w:rPr>
+                      <w:rFonts w:ascii="Cambria Math" w:eastAsiaTheme="minorEastAsia" w:hAnsi="Cambria Math"/>
+                    </w:rPr>
+                    <m:t>10005</m:t>
+                  </m:r>
+                </m:e>
+              </m:rad>
+              <m:r>
+                <w:rPr>
+                  <w:rFonts w:ascii="Cambria Math" w:eastAsiaTheme="minorEastAsia" w:hAnsi="Cambria Math"/>
+                </w:rPr>
+                <m:t>∙</m:t>
+              </m:r>
+              <m:r>
+                <w:rPr>
+                  <w:rFonts w:ascii="Cambria Math" w:eastAsiaTheme="minorEastAsia" w:hAnsi="Cambria Math"/>
+                </w:rPr>
+                <m:t>T</m:t>
+              </m:r>
+            </m:den>
+          </m:f>
+          <m:r>
+            <w:rPr>
+              <w:rFonts w:ascii="Cambria Math" w:eastAsiaTheme="minorEastAsia" w:hAnsi="Cambria Math"/>
+            </w:rPr>
+            <m:t>=</m:t>
+          </m:r>
+          <m:f>
+            <m:fPr>
+              <m:ctrlPr>
+                <w:rPr>
+                  <w:rFonts w:ascii="Cambria Math" w:eastAsiaTheme="minorEastAsia" w:hAnsi="Cambria Math"/>
+                  <w:i/>
+                  <w:iCs/>
+                </w:rPr>
+              </m:ctrlPr>
+            </m:fPr>
+            <m:num>
+              <m:rad>
+                <m:radPr>
+                  <m:degHide m:val="1"/>
+                  <m:ctrlPr>
+                    <w:rPr>
+                      <w:rFonts w:ascii="Cambria Math" w:eastAsiaTheme="minorEastAsia" w:hAnsi="Cambria Math"/>
+                      <w:i/>
+                      <w:iCs/>
+                    </w:rPr>
+                  </m:ctrlPr>
+                </m:radPr>
+                <m:deg/>
+                <m:e>
+                  <m:r>
+                    <w:rPr>
+                      <w:rFonts w:ascii="Cambria Math" w:eastAsiaTheme="minorEastAsia" w:hAnsi="Cambria Math"/>
+                    </w:rPr>
+                    <m:t>10005</m:t>
+                  </m:r>
+                </m:e>
+              </m:rad>
+              <m:r>
+                <w:rPr>
+                  <w:rFonts w:ascii="Cambria Math" w:eastAsiaTheme="minorEastAsia" w:hAnsi="Cambria Math"/>
+                </w:rPr>
+                <m:t>∙</m:t>
+              </m:r>
+              <m:r>
+                <w:rPr>
+                  <w:rFonts w:ascii="Cambria Math" w:eastAsiaTheme="minorEastAsia" w:hAnsi="Cambria Math"/>
+                </w:rPr>
+                <m:t>4270934400</m:t>
+              </m:r>
+              <m:r>
+                <w:rPr>
+                  <w:rFonts w:ascii="Cambria Math" w:eastAsiaTheme="minorEastAsia" w:hAnsi="Cambria Math"/>
+                </w:rPr>
+                <m:t>∙</m:t>
+              </m:r>
+              <m:r>
+                <w:rPr>
+                  <w:rFonts w:ascii="Cambria Math" w:eastAsiaTheme="minorEastAsia" w:hAnsi="Cambria Math"/>
+                </w:rPr>
+                <m:t>Q</m:t>
+              </m:r>
+            </m:num>
+            <m:den>
+              <m:rad>
+                <m:radPr>
+                  <m:degHide m:val="1"/>
+                  <m:ctrlPr>
+                    <w:rPr>
+                      <w:rFonts w:ascii="Cambria Math" w:eastAsiaTheme="minorEastAsia" w:hAnsi="Cambria Math"/>
+                      <w:i/>
+                      <w:iCs/>
+                    </w:rPr>
+                  </m:ctrlPr>
+                </m:radPr>
+                <m:deg/>
+                <m:e>
+                  <m:r>
+                    <w:rPr>
+                      <w:rFonts w:ascii="Cambria Math" w:eastAsiaTheme="minorEastAsia" w:hAnsi="Cambria Math"/>
+                    </w:rPr>
+                    <m:t>10005</m:t>
+                  </m:r>
+                </m:e>
+              </m:rad>
+              <m:r>
+                <w:rPr>
+                  <w:rFonts w:ascii="Cambria Math" w:eastAsiaTheme="minorEastAsia" w:hAnsi="Cambria Math"/>
+                </w:rPr>
+                <m:t>∙</m:t>
+              </m:r>
+              <m:rad>
+                <m:radPr>
+                  <m:degHide m:val="1"/>
+                  <m:ctrlPr>
+                    <w:rPr>
+                      <w:rFonts w:ascii="Cambria Math" w:eastAsiaTheme="minorEastAsia" w:hAnsi="Cambria Math"/>
+                      <w:i/>
+                      <w:iCs/>
+                    </w:rPr>
+                  </m:ctrlPr>
+                </m:radPr>
+                <m:deg/>
+                <m:e>
+                  <m:r>
+                    <w:rPr>
+                      <w:rFonts w:ascii="Cambria Math" w:eastAsiaTheme="minorEastAsia" w:hAnsi="Cambria Math"/>
+                    </w:rPr>
+                    <m:t>10005</m:t>
+                  </m:r>
+                </m:e>
+              </m:rad>
+              <m:r>
+                <w:rPr>
+                  <w:rFonts w:ascii="Cambria Math" w:eastAsiaTheme="minorEastAsia" w:hAnsi="Cambria Math"/>
+                </w:rPr>
+                <m:t>∙</m:t>
+              </m:r>
+              <m:r>
+                <w:rPr>
+                  <w:rFonts w:ascii="Cambria Math" w:eastAsiaTheme="minorEastAsia" w:hAnsi="Cambria Math"/>
+                </w:rPr>
+                <m:t>T</m:t>
+              </m:r>
+            </m:den>
+          </m:f>
+          <m:r>
+            <w:rPr>
+              <w:rFonts w:ascii="Cambria Math" w:eastAsiaTheme="minorEastAsia" w:hAnsi="Cambria Math"/>
+            </w:rPr>
+            <m:t>=</m:t>
+          </m:r>
+          <m:f>
+            <m:fPr>
+              <m:ctrlPr>
+                <w:rPr>
+                  <w:rFonts w:ascii="Cambria Math" w:eastAsiaTheme="minorEastAsia" w:hAnsi="Cambria Math"/>
+                  <w:i/>
+                  <w:iCs/>
+                </w:rPr>
+              </m:ctrlPr>
+            </m:fPr>
+            <m:num>
+              <m:rad>
+                <m:radPr>
+                  <m:degHide m:val="1"/>
+                  <m:ctrlPr>
+                    <w:rPr>
+                      <w:rFonts w:ascii="Cambria Math" w:eastAsiaTheme="minorEastAsia" w:hAnsi="Cambria Math"/>
+                      <w:i/>
+                      <w:iCs/>
+                    </w:rPr>
+                  </m:ctrlPr>
+                </m:radPr>
+                <m:deg/>
+                <m:e>
+                  <m:r>
+                    <w:rPr>
+                      <w:rFonts w:ascii="Cambria Math" w:eastAsiaTheme="minorEastAsia" w:hAnsi="Cambria Math"/>
+                    </w:rPr>
+                    <m:t>10005</m:t>
+                  </m:r>
+                </m:e>
+              </m:rad>
+              <m:r>
+                <w:rPr>
+                  <w:rFonts w:ascii="Cambria Math" w:eastAsiaTheme="minorEastAsia" w:hAnsi="Cambria Math"/>
+                </w:rPr>
+                <m:t>∙</m:t>
+              </m:r>
+              <m:r>
+                <w:rPr>
+                  <w:rFonts w:ascii="Cambria Math" w:eastAsiaTheme="minorEastAsia" w:hAnsi="Cambria Math"/>
+                </w:rPr>
+                <m:t>4270934400</m:t>
+              </m:r>
+              <m:r>
+                <w:rPr>
+                  <w:rFonts w:ascii="Cambria Math" w:eastAsiaTheme="minorEastAsia" w:hAnsi="Cambria Math"/>
+                </w:rPr>
+                <m:t>∙</m:t>
+              </m:r>
+              <m:r>
+                <w:rPr>
+                  <w:rFonts w:ascii="Cambria Math" w:eastAsiaTheme="minorEastAsia" w:hAnsi="Cambria Math"/>
+                </w:rPr>
+                <m:t>Q</m:t>
+              </m:r>
+            </m:num>
+            <m:den>
+              <m:r>
+                <w:rPr>
+                  <w:rFonts w:ascii="Cambria Math" w:eastAsiaTheme="minorEastAsia" w:hAnsi="Cambria Math"/>
+                </w:rPr>
+                <m:t>10005</m:t>
+              </m:r>
+              <m:r>
+                <w:rPr>
+                  <w:rFonts w:ascii="Cambria Math" w:eastAsiaTheme="minorEastAsia" w:hAnsi="Cambria Math"/>
+                </w:rPr>
+                <m:t>∙</m:t>
+              </m:r>
+              <m:r>
+                <w:rPr>
+                  <w:rFonts w:ascii="Cambria Math" w:eastAsiaTheme="minorEastAsia" w:hAnsi="Cambria Math"/>
+                </w:rPr>
+                <m:t>T</m:t>
+              </m:r>
+            </m:den>
+          </m:f>
+          <m:r>
+            <w:rPr>
+              <w:rFonts w:ascii="Cambria Math" w:eastAsiaTheme="minorEastAsia" w:hAnsi="Cambria Math"/>
+            </w:rPr>
+            <m:t>=</m:t>
+          </m:r>
+          <m:r>
+            <w:rPr>
+              <w:rFonts w:ascii="Cambria Math" w:eastAsiaTheme="minorEastAsia" w:hAnsi="Cambria Math"/>
+            </w:rPr>
+            <w:br/>
+          </m:r>
+        </m:oMath>
+        <m:oMath>
+          <m:r>
+            <w:rPr>
+              <w:rFonts w:ascii="Cambria Math" w:eastAsiaTheme="minorEastAsia" w:hAnsi="Cambria Math"/>
+            </w:rPr>
+            <m:t>=</m:t>
+          </m:r>
+          <m:f>
+            <m:fPr>
+              <m:ctrlPr>
+                <w:rPr>
+                  <w:rFonts w:ascii="Cambria Math" w:eastAsiaTheme="minorEastAsia" w:hAnsi="Cambria Math"/>
+                  <w:i/>
+                  <w:iCs/>
+                </w:rPr>
+              </m:ctrlPr>
+            </m:fPr>
+            <m:num>
+              <m:rad>
+                <m:radPr>
+                  <m:degHide m:val="1"/>
+                  <m:ctrlPr>
+                    <w:rPr>
+                      <w:rFonts w:ascii="Cambria Math" w:eastAsiaTheme="minorEastAsia" w:hAnsi="Cambria Math"/>
+                      <w:i/>
+                      <w:iCs/>
+                    </w:rPr>
+                  </m:ctrlPr>
+                </m:radPr>
+                <m:deg/>
+                <m:e>
+                  <m:r>
+                    <w:rPr>
+                      <w:rFonts w:ascii="Cambria Math" w:eastAsiaTheme="minorEastAsia" w:hAnsi="Cambria Math"/>
+                    </w:rPr>
+                    <m:t>10005</m:t>
+                  </m:r>
+                </m:e>
+              </m:rad>
+              <m:r>
+                <w:rPr>
+                  <w:rFonts w:ascii="Cambria Math" w:eastAsiaTheme="minorEastAsia" w:hAnsi="Cambria Math"/>
+                </w:rPr>
+                <m:t>∙</m:t>
+              </m:r>
+              <m:r>
+                <w:rPr>
+                  <w:rFonts w:ascii="Cambria Math" w:eastAsiaTheme="minorEastAsia" w:hAnsi="Cambria Math"/>
+                </w:rPr>
+                <m:t>426880</m:t>
+              </m:r>
+              <m:r>
+                <w:rPr>
+                  <w:rFonts w:ascii="Cambria Math" w:eastAsiaTheme="minorEastAsia" w:hAnsi="Cambria Math"/>
+                </w:rPr>
+                <m:t>∙</m:t>
+              </m:r>
+              <m:r>
+                <w:rPr>
+                  <w:rFonts w:ascii="Cambria Math" w:eastAsiaTheme="minorEastAsia" w:hAnsi="Cambria Math"/>
+                </w:rPr>
+                <m:t>Q</m:t>
+              </m:r>
+            </m:num>
+            <m:den>
+              <m:r>
+                <w:rPr>
+                  <w:rFonts w:ascii="Cambria Math" w:eastAsiaTheme="minorEastAsia" w:hAnsi="Cambria Math"/>
+                </w:rPr>
+                <m:t>T</m:t>
+              </m:r>
+            </m:den>
+          </m:f>
+        </m:oMath>
+      </m:oMathPara>
+    </w:p>
+    <w:p>
+      <w:pPr>
+        <w:rPr>
+          <w:rFonts w:eastAsiaTheme="minorEastAsia"/>
+          <w:iCs/>
+        </w:rPr>
+      </w:pPr>
+      <w:r>
+        <w:rPr>
+          <w:rFonts w:eastAsiaTheme="minorEastAsia"/>
+          <w:b/>
+          <w:bCs/>
+          <w:iCs/>
+        </w:rPr>
+        <w:t>Exponenciális függvény</w:t>
+      </w:r>
+      <w:r>
+        <w:rPr>
+          <w:rFonts w:eastAsiaTheme="minorEastAsia"/>
+          <w:iCs/>
+        </w:rPr>
+        <w:t xml:space="preserve"> számítása esetén</w:t>
+      </w:r>
+      <w:r>
+        <w:rPr>
+          <w:rFonts w:eastAsiaTheme="minorEastAsia"/>
+          <w:iCs/>
+        </w:rPr>
+        <w:t xml:space="preserve"> </w:t>
+      </w:r>
+      <m:oMath>
+        <m:r>
+          <w:rPr>
+            <w:rFonts w:ascii="Cambria Math" w:eastAsiaTheme="minorEastAsia" w:hAnsi="Cambria Math"/>
+          </w:rPr>
+          <m:t>x=</m:t>
+        </m:r>
+        <m:f>
+          <m:fPr>
+            <m:ctrlPr>
+              <w:rPr>
+                <w:rFonts w:ascii="Cambria Math" w:eastAsiaTheme="minorEastAsia" w:hAnsi="Cambria Math"/>
+                <w:i/>
+                <w:iCs/>
+              </w:rPr>
+            </m:ctrlPr>
+          </m:fPr>
+          <m:num>
+            <m:r>
+              <w:rPr>
+                <w:rFonts w:ascii="Cambria Math" w:eastAsiaTheme="minorEastAsia" w:hAnsi="Cambria Math"/>
+              </w:rPr>
+              <m:t>u</m:t>
+            </m:r>
+          </m:num>
+          <m:den>
+            <m:r>
+              <w:rPr>
+                <w:rFonts w:ascii="Cambria Math" w:eastAsiaTheme="minorEastAsia" w:hAnsi="Cambria Math"/>
+              </w:rPr>
+              <m:t>v</m:t>
+            </m:r>
+          </m:den>
+        </m:f>
+      </m:oMath>
+      <w:r>
+        <w:rPr>
+          <w:rFonts w:eastAsiaTheme="minorEastAsia"/>
+          <w:iCs/>
+        </w:rPr>
+        <w:t xml:space="preserve"> alakú</w:t>
+      </w:r>
+      <w:r>
+        <w:rPr>
+          <w:rFonts w:eastAsiaTheme="minorEastAsia"/>
+          <w:iCs/>
+        </w:rPr>
+        <w:t xml:space="preserve"> </w:t>
+      </w:r>
+      <w:r>
+        <w:rPr>
+          <w:rFonts w:eastAsiaTheme="minorEastAsia"/>
+          <w:iCs/>
+        </w:rPr>
+        <w:t xml:space="preserve">racionális számok használatánál </w:t>
+      </w:r>
+      <w:r>
+        <w:rPr>
+          <w:rFonts w:eastAsiaTheme="minorEastAsia"/>
+          <w:iCs/>
+        </w:rPr>
+        <w:t>a következő értékek</w:t>
+      </w:r>
+      <w:r>
+        <w:rPr>
+          <w:rFonts w:eastAsiaTheme="minorEastAsia"/>
+          <w:iCs/>
+        </w:rPr>
+        <w:t xml:space="preserve">re lesz szükség, </w:t>
+      </w:r>
+      <m:oMath>
+        <m:r>
+          <w:rPr>
+            <w:rFonts w:ascii="Cambria Math" w:eastAsiaTheme="minorEastAsia" w:hAnsi="Cambria Math"/>
+          </w:rPr>
+          <m:t>n&gt;0</m:t>
+        </m:r>
+      </m:oMath>
+      <w:r>
+        <w:rPr>
+          <w:rFonts w:eastAsiaTheme="minorEastAsia"/>
+          <w:iCs/>
+        </w:rPr>
+        <w:t xml:space="preserve"> esetén</w:t>
+      </w:r>
+      <w:r>
+        <w:rPr>
+          <w:rFonts w:eastAsiaTheme="minorEastAsia"/>
+          <w:iCs/>
+        </w:rPr>
+        <w:t>:</w:t>
+      </w:r>
+    </w:p>
+    <w:p>
+      <w:pPr>
+        <w:rPr>
+          <w:rFonts w:eastAsiaTheme="minorEastAsia"/>
+          <w:iCs/>
+        </w:rPr>
+      </w:pPr>
+      <m:oMathPara>
+        <m:oMath>
+          <m:sSub>
+            <m:sSubPr>
+              <m:ctrlPr>
+                <w:rPr>
+                  <w:rFonts w:ascii="Cambria Math" w:eastAsiaTheme="minorEastAsia" w:hAnsi="Cambria Math"/>
+                  <w:i/>
+                  <w:iCs/>
+                </w:rPr>
+              </m:ctrlPr>
+            </m:sSubPr>
+            <m:e>
+              <m:r>
+                <w:rPr>
+                  <w:rFonts w:ascii="Cambria Math" w:eastAsiaTheme="minorEastAsia" w:hAnsi="Cambria Math"/>
+                </w:rPr>
+                <m:t>a</m:t>
+              </m:r>
+            </m:e>
+            <m:sub>
+              <m:r>
+                <w:rPr>
+                  <w:rFonts w:ascii="Cambria Math" w:eastAsiaTheme="minorEastAsia" w:hAnsi="Cambria Math"/>
+                </w:rPr>
+                <m:t>n</m:t>
+              </m:r>
+            </m:sub>
+          </m:sSub>
+          <m:r>
+            <w:rPr>
+              <w:rFonts w:ascii="Cambria Math" w:eastAsiaTheme="minorEastAsia" w:hAnsi="Cambria Math"/>
+            </w:rPr>
+            <m:t>=</m:t>
+          </m:r>
+          <m:r>
+            <w:rPr>
+              <w:rFonts w:ascii="Cambria Math" w:eastAsiaTheme="minorEastAsia" w:hAnsi="Cambria Math"/>
+            </w:rPr>
+            <m:t>1</m:t>
+          </m:r>
+        </m:oMath>
+      </m:oMathPara>
+    </w:p>
+    <w:p>
+      <w:pPr>
+        <w:rPr>
+          <w:rFonts w:eastAsiaTheme="minorEastAsia"/>
+          <w:iCs/>
+        </w:rPr>
+      </w:pPr>
+      <m:oMathPara>
+        <m:oMath>
+          <m:sSub>
+            <m:sSubPr>
+              <m:ctrlPr>
+                <w:rPr>
+                  <w:rFonts w:ascii="Cambria Math" w:eastAsiaTheme="minorEastAsia" w:hAnsi="Cambria Math"/>
+                  <w:i/>
+                  <w:iCs/>
+                </w:rPr>
+              </m:ctrlPr>
+            </m:sSubPr>
+            <m:e>
+              <m:r>
+                <w:rPr>
+                  <w:rFonts w:ascii="Cambria Math" w:eastAsiaTheme="minorEastAsia" w:hAnsi="Cambria Math"/>
+                </w:rPr>
+                <m:t>b</m:t>
+              </m:r>
+            </m:e>
+            <m:sub>
+              <m:r>
+                <w:rPr>
+                  <w:rFonts w:ascii="Cambria Math" w:eastAsiaTheme="minorEastAsia" w:hAnsi="Cambria Math"/>
+                </w:rPr>
+                <m:t>n</m:t>
+              </m:r>
+            </m:sub>
+          </m:sSub>
+          <m:r>
+            <w:rPr>
+              <w:rFonts w:ascii="Cambria Math" w:eastAsiaTheme="minorEastAsia" w:hAnsi="Cambria Math"/>
+            </w:rPr>
+            <m:t>=1</m:t>
+          </m:r>
+        </m:oMath>
+      </m:oMathPara>
+    </w:p>
+    <w:p>
+      <w:pPr>
+        <w:rPr>
+          <w:rFonts w:eastAsiaTheme="minorEastAsia"/>
+          <w:iCs/>
+        </w:rPr>
+      </w:pPr>
+      <m:oMathPara>
+        <m:oMath>
+          <m:sSub>
+            <m:sSubPr>
+              <m:ctrlPr>
+                <w:rPr>
+                  <w:rFonts w:ascii="Cambria Math" w:eastAsiaTheme="minorEastAsia" w:hAnsi="Cambria Math"/>
+                  <w:i/>
+                  <w:iCs/>
+                </w:rPr>
+              </m:ctrlPr>
+            </m:sSubPr>
+            <m:e>
+              <m:r>
+                <w:rPr>
+                  <w:rFonts w:ascii="Cambria Math" w:eastAsiaTheme="minorEastAsia" w:hAnsi="Cambria Math"/>
+                </w:rPr>
+                <m:t>p</m:t>
+              </m:r>
+            </m:e>
+            <m:sub>
+              <m:r>
+                <w:rPr>
+                  <w:rFonts w:ascii="Cambria Math" w:eastAsiaTheme="minorEastAsia" w:hAnsi="Cambria Math"/>
+                </w:rPr>
+                <m:t>0</m:t>
+              </m:r>
+            </m:sub>
+          </m:sSub>
+          <m:r>
+            <w:rPr>
+              <w:rFonts w:ascii="Cambria Math" w:eastAsiaTheme="minorEastAsia" w:hAnsi="Cambria Math"/>
+            </w:rPr>
+            <m:t xml:space="preserve">=1,  </m:t>
+          </m:r>
+          <m:sSub>
+            <m:sSubPr>
+              <m:ctrlPr>
+                <w:rPr>
+                  <w:rFonts w:ascii="Cambria Math" w:eastAsiaTheme="minorEastAsia" w:hAnsi="Cambria Math"/>
+                  <w:i/>
+                  <w:iCs/>
+                </w:rPr>
+              </m:ctrlPr>
+            </m:sSubPr>
+            <m:e>
+              <m:r>
+                <w:rPr>
+                  <w:rFonts w:ascii="Cambria Math" w:eastAsiaTheme="minorEastAsia" w:hAnsi="Cambria Math"/>
+                </w:rPr>
+                <m:t>p</m:t>
+              </m:r>
+            </m:e>
+            <m:sub>
+              <m:r>
+                <w:rPr>
+                  <w:rFonts w:ascii="Cambria Math" w:eastAsiaTheme="minorEastAsia" w:hAnsi="Cambria Math"/>
+                </w:rPr>
+                <m:t>n</m:t>
+              </m:r>
+            </m:sub>
+          </m:sSub>
+          <m:r>
+            <w:rPr>
+              <w:rFonts w:ascii="Cambria Math" w:eastAsiaTheme="minorEastAsia" w:hAnsi="Cambria Math"/>
+            </w:rPr>
+            <m:t>=</m:t>
+          </m:r>
+          <m:r>
+            <w:rPr>
+              <w:rFonts w:ascii="Cambria Math" w:eastAsiaTheme="minorEastAsia" w:hAnsi="Cambria Math"/>
+            </w:rPr>
+            <m:t>u</m:t>
+          </m:r>
+        </m:oMath>
+      </m:oMathPara>
+    </w:p>
+    <w:p>
+      <w:pPr>
+        <w:rPr>
+          <w:rFonts w:eastAsiaTheme="minorEastAsia"/>
+          <w:iCs/>
+        </w:rPr>
+      </w:pPr>
+      <m:oMathPara>
+        <m:oMath>
+          <m:sSub>
+            <m:sSubPr>
+              <m:ctrlPr>
+                <w:rPr>
+                  <w:rFonts w:ascii="Cambria Math" w:eastAsiaTheme="minorEastAsia" w:hAnsi="Cambria Math"/>
+                  <w:i/>
+                  <w:iCs/>
+                </w:rPr>
+              </m:ctrlPr>
+            </m:sSubPr>
+            <m:e>
+              <m:r>
+                <w:rPr>
+                  <w:rFonts w:ascii="Cambria Math" w:eastAsiaTheme="minorEastAsia" w:hAnsi="Cambria Math"/>
+                </w:rPr>
+                <m:t>q</m:t>
+              </m:r>
+            </m:e>
+            <m:sub>
+              <m:r>
+                <w:rPr>
+                  <w:rFonts w:ascii="Cambria Math" w:eastAsiaTheme="minorEastAsia" w:hAnsi="Cambria Math"/>
+                </w:rPr>
+                <m:t>0</m:t>
+              </m:r>
+            </m:sub>
+          </m:sSub>
+          <m:r>
+            <w:rPr>
+              <w:rFonts w:ascii="Cambria Math" w:eastAsiaTheme="minorEastAsia" w:hAnsi="Cambria Math"/>
+            </w:rPr>
+            <m:t xml:space="preserve">=1,  </m:t>
+          </m:r>
+          <m:sSub>
+            <m:sSubPr>
+              <m:ctrlPr>
+                <w:rPr>
+                  <w:rFonts w:ascii="Cambria Math" w:eastAsiaTheme="minorEastAsia" w:hAnsi="Cambria Math"/>
+                  <w:i/>
+                  <w:iCs/>
+                </w:rPr>
+              </m:ctrlPr>
+            </m:sSubPr>
+            <m:e>
+              <m:r>
+                <w:rPr>
+                  <w:rFonts w:ascii="Cambria Math" w:eastAsiaTheme="minorEastAsia" w:hAnsi="Cambria Math"/>
+                </w:rPr>
+                <m:t>q</m:t>
+              </m:r>
+            </m:e>
+            <m:sub>
+              <m:r>
+                <w:rPr>
+                  <w:rFonts w:ascii="Cambria Math" w:eastAsiaTheme="minorEastAsia" w:hAnsi="Cambria Math"/>
+                </w:rPr>
+                <m:t>n</m:t>
+              </m:r>
+            </m:sub>
+          </m:sSub>
+          <m:r>
+            <w:rPr>
+              <w:rFonts w:ascii="Cambria Math" w:eastAsiaTheme="minorEastAsia" w:hAnsi="Cambria Math"/>
+            </w:rPr>
+            <m:t>=</m:t>
+          </m:r>
+          <m:r>
+            <w:rPr>
+              <w:rFonts w:ascii="Cambria Math" w:eastAsiaTheme="minorEastAsia" w:hAnsi="Cambria Math"/>
+            </w:rPr>
+            <m:t>vn</m:t>
+          </m:r>
+        </m:oMath>
+      </m:oMathPara>
+    </w:p>
+    <w:p>
+      <w:pPr>
+        <w:rPr>
+          <w:rFonts w:eastAsiaTheme="minorEastAsia"/>
+          <w:iCs/>
+        </w:rPr>
+      </w:pPr>
     </w:p>
     <w:p>
       <w:pPr>
@@ -13038,6 +14226,7 @@
       </w:pPr>
       <w:bookmarkStart w:id="18" w:name="_Toc218619930"/>
       <w:r>
+        <w:lastRenderedPageBreak/>
         <w:t>Számológép megvalósítása</w:t>
       </w:r>
       <w:bookmarkEnd w:id="18"/>
@@ -13068,7 +14257,15 @@
       </w:pPr>
       <w:bookmarkStart w:id="21" w:name="_Toc218619933"/>
       <w:r>
-        <w:t>Euklideszi tér számológép (EuclideanSpace)</w:t>
+        <w:t>Euklideszi tér számológép (</w:t>
+      </w:r>
+      <w:proofErr w:type="spellStart"/>
+      <w:r>
+        <w:t>EuclideanSpace</w:t>
+      </w:r>
+      <w:proofErr w:type="spellEnd"/>
+      <w:r>
+        <w:t>)</w:t>
       </w:r>
       <w:bookmarkEnd w:id="21"/>
     </w:p>
@@ -13078,7 +14275,15 @@
       </w:pPr>
       <w:bookmarkStart w:id="22" w:name="_Toc218619934"/>
       <w:r>
-        <w:t>Polinom számológép (Polynomials)</w:t>
+        <w:t>Polinom számológép (</w:t>
+      </w:r>
+      <w:proofErr w:type="spellStart"/>
+      <w:r>
+        <w:t>Polynomials</w:t>
+      </w:r>
+      <w:proofErr w:type="spellEnd"/>
+      <w:r>
+        <w:t>)</w:t>
       </w:r>
       <w:bookmarkEnd w:id="22"/>
     </w:p>
@@ -13088,7 +14293,15 @@
       </w:pPr>
       <w:bookmarkStart w:id="23" w:name="_Toc218619935"/>
       <w:r>
-        <w:t>Integrálközelítés számológép (Integral)</w:t>
+        <w:t>Integrálközelítés számológép (</w:t>
+      </w:r>
+      <w:proofErr w:type="spellStart"/>
+      <w:r>
+        <w:t>Integral</w:t>
+      </w:r>
+      <w:proofErr w:type="spellEnd"/>
+      <w:r>
+        <w:t>)</w:t>
       </w:r>
       <w:bookmarkEnd w:id="23"/>
     </w:p>
@@ -14499,7 +15712,7 @@
   <w:style w:type="paragraph" w:default="1" w:styleId="Norml">
     <w:name w:val="Normal"/>
     <w:qFormat/>
-    <w:rsid w:val="00DF2404"/>
+    <w:rsid w:val="00502023"/>
     <w:pPr>
       <w:spacing w:line="360" w:lineRule="auto"/>
       <w:ind w:firstLine="227"/>

</xml_diff>

<commit_message>
Adding explanation to the parser of the calculator in the documentation.
</commit_message>
<xml_diff>
--- a/Documentation.docx
+++ b/Documentation.docx
@@ -12512,31 +12512,7 @@
                 <w:rPr>
                   <w:rFonts w:ascii="Cambria Math" w:eastAsiaTheme="minorEastAsia" w:hAnsi="Cambria Math"/>
                 </w:rPr>
-                <m:t>s</m:t>
-              </m:r>
-              <m:r>
-                <w:rPr>
-                  <w:rFonts w:ascii="Cambria Math" w:eastAsiaTheme="minorEastAsia" w:hAnsi="Cambria Math"/>
-                </w:rPr>
-                <m:t>≤</m:t>
-              </m:r>
-              <m:r>
-                <w:rPr>
-                  <w:rFonts w:ascii="Cambria Math" w:eastAsiaTheme="minorEastAsia" w:hAnsi="Cambria Math"/>
-                </w:rPr>
-                <m:t>k</m:t>
-              </m:r>
-              <m:r>
-                <w:rPr>
-                  <w:rFonts w:ascii="Cambria Math" w:eastAsiaTheme="minorEastAsia" w:hAnsi="Cambria Math"/>
-                </w:rPr>
-                <m:t>&lt;</m:t>
-              </m:r>
-              <m:r>
-                <w:rPr>
-                  <w:rFonts w:ascii="Cambria Math" w:eastAsiaTheme="minorEastAsia" w:hAnsi="Cambria Math"/>
-                </w:rPr>
-                <m:t>f</m:t>
+                <m:t>s≤k&lt;f</m:t>
               </m:r>
             </m:sub>
             <m:sup/>
@@ -12751,25 +12727,7 @@
             <w:rPr>
               <w:rFonts w:ascii="Cambria Math" w:eastAsiaTheme="minorEastAsia" w:hAnsi="Cambria Math"/>
             </w:rPr>
-            <m:t xml:space="preserve">    (</m:t>
-          </m:r>
-          <m:r>
-            <w:rPr>
-              <w:rFonts w:ascii="Cambria Math" w:eastAsiaTheme="minorEastAsia" w:hAnsi="Cambria Math"/>
-            </w:rPr>
-            <m:t>s</m:t>
-          </m:r>
-          <m:r>
-            <w:rPr>
-              <w:rFonts w:ascii="Cambria Math" w:eastAsiaTheme="minorEastAsia" w:hAnsi="Cambria Math"/>
-            </w:rPr>
-            <m:t xml:space="preserve">, </m:t>
-          </m:r>
-          <m:r>
-            <w:rPr>
-              <w:rFonts w:ascii="Cambria Math" w:eastAsiaTheme="minorEastAsia" w:hAnsi="Cambria Math"/>
-            </w:rPr>
-            <m:t>f</m:t>
+            <m:t xml:space="preserve">    (s, f</m:t>
           </m:r>
           <m:r>
             <m:rPr>
@@ -12890,13 +12848,7 @@
                 <w:rPr>
                   <w:rFonts w:ascii="Cambria Math" w:eastAsiaTheme="minorEastAsia" w:hAnsi="Cambria Math"/>
                 </w:rPr>
-                <m:t>f</m:t>
-              </m:r>
-              <m:r>
-                <w:rPr>
-                  <w:rFonts w:ascii="Cambria Math" w:eastAsiaTheme="minorEastAsia" w:hAnsi="Cambria Math"/>
-                </w:rPr>
-                <m:t>-1</m:t>
+                <m:t>f-1</m:t>
               </m:r>
             </m:sub>
           </m:sSub>
@@ -12974,13 +12926,7 @@
                 <w:rPr>
                   <w:rFonts w:ascii="Cambria Math" w:eastAsiaTheme="minorEastAsia" w:hAnsi="Cambria Math"/>
                 </w:rPr>
-                <m:t>f</m:t>
-              </m:r>
-              <m:r>
-                <w:rPr>
-                  <w:rFonts w:ascii="Cambria Math" w:eastAsiaTheme="minorEastAsia" w:hAnsi="Cambria Math"/>
-                </w:rPr>
-                <m:t>-1</m:t>
+                <m:t>f-1</m:t>
               </m:r>
             </m:sub>
           </m:sSub>
@@ -13059,13 +13005,7 @@
                 <w:rPr>
                   <w:rFonts w:ascii="Cambria Math" w:eastAsiaTheme="minorEastAsia" w:hAnsi="Cambria Math"/>
                 </w:rPr>
-                <m:t>f</m:t>
-              </m:r>
-              <m:r>
-                <w:rPr>
-                  <w:rFonts w:ascii="Cambria Math" w:eastAsiaTheme="minorEastAsia" w:hAnsi="Cambria Math"/>
-                </w:rPr>
-                <m:t>-1</m:t>
+                <m:t>f-1</m:t>
               </m:r>
             </m:sub>
           </m:sSub>
@@ -13146,34 +13086,7 @@
           <w:rPr>
             <w:rFonts w:ascii="Cambria Math" w:hAnsi="Cambria Math"/>
           </w:rPr>
-          <m:t>s</m:t>
-        </m:r>
-        <m:r>
-          <m:rPr>
-            <m:sty m:val="p"/>
-          </m:rPr>
-          <w:rPr>
-            <w:rFonts w:ascii="Cambria Math" w:hAnsi="Cambria Math"/>
-          </w:rPr>
-          <m:t>-</m:t>
-        </m:r>
-        <m:r>
-          <m:rPr>
-            <m:sty m:val="p"/>
-          </m:rPr>
-          <w:rPr>
-            <w:rFonts w:ascii="Cambria Math" w:hAnsi="Cambria Math"/>
-          </w:rPr>
-          <m:t>f</m:t>
-        </m:r>
-        <m:r>
-          <m:rPr>
-            <m:sty m:val="p"/>
-          </m:rPr>
-          <w:rPr>
-            <w:rFonts w:ascii="Cambria Math" w:hAnsi="Cambria Math"/>
-          </w:rPr>
-          <m:t>&lt;5</m:t>
+          <m:t>s-f&lt;5</m:t>
         </m:r>
       </m:oMath>
       <w:r>
@@ -13187,34 +13100,7 @@
           <w:rPr>
             <w:rFonts w:ascii="Cambria Math" w:hAnsi="Cambria Math"/>
           </w:rPr>
-          <m:t>s</m:t>
-        </m:r>
-        <m:r>
-          <m:rPr>
-            <m:sty m:val="p"/>
-          </m:rPr>
-          <w:rPr>
-            <w:rFonts w:ascii="Cambria Math" w:hAnsi="Cambria Math"/>
-          </w:rPr>
-          <m:t>-</m:t>
-        </m:r>
-        <m:r>
-          <m:rPr>
-            <m:sty m:val="p"/>
-          </m:rPr>
-          <w:rPr>
-            <w:rFonts w:ascii="Cambria Math" w:hAnsi="Cambria Math"/>
-          </w:rPr>
-          <m:t>f</m:t>
-        </m:r>
-        <m:r>
-          <m:rPr>
-            <m:sty m:val="p"/>
-          </m:rPr>
-          <w:rPr>
-            <w:rFonts w:ascii="Cambria Math" w:hAnsi="Cambria Math"/>
-          </w:rPr>
-          <m:t>≥5</m:t>
+          <m:t>s-f≥5</m:t>
         </m:r>
       </m:oMath>
       <w:r>
@@ -13302,16 +13188,7 @@
                   <w:rPr>
                     <w:rFonts w:ascii="Cambria Math" w:hAnsi="Cambria Math"/>
                   </w:rPr>
-                  <m:t>+</m:t>
-                </m:r>
-                <m:r>
-                  <m:rPr>
-                    <m:sty m:val="p"/>
-                  </m:rPr>
-                  <w:rPr>
-                    <w:rFonts w:ascii="Cambria Math" w:hAnsi="Cambria Math"/>
-                  </w:rPr>
-                  <m:t>f</m:t>
+                  <m:t>+f</m:t>
                 </m:r>
               </m:num>
               <m:den>
@@ -13460,16 +13337,7 @@
           <w:rPr>
             <w:rFonts w:ascii="Cambria Math" w:hAnsi="Cambria Math"/>
           </w:rPr>
-          <m:t>s</m:t>
-        </m:r>
-        <m:r>
-          <m:rPr>
-            <m:sty m:val="p"/>
-          </m:rPr>
-          <w:rPr>
-            <w:rFonts w:ascii="Cambria Math" w:hAnsi="Cambria Math"/>
-          </w:rPr>
-          <m:t>≤</m:t>
+          <m:t>s≤</m:t>
         </m:r>
         <m:r>
           <w:rPr>
@@ -13624,16 +13492,7 @@
           <w:rPr>
             <w:rFonts w:ascii="Cambria Math" w:hAnsi="Cambria Math"/>
           </w:rPr>
-          <m:t>m</m:t>
-        </m:r>
-        <m:r>
-          <m:rPr>
-            <m:sty m:val="p"/>
-          </m:rPr>
-          <w:rPr>
-            <w:rFonts w:ascii="Cambria Math" w:hAnsi="Cambria Math"/>
-          </w:rPr>
-          <m:t>≤</m:t>
+          <m:t>m≤</m:t>
         </m:r>
         <m:r>
           <w:rPr>
@@ -13648,16 +13507,7 @@
           <w:rPr>
             <w:rFonts w:ascii="Cambria Math" w:hAnsi="Cambria Math"/>
           </w:rPr>
-          <m:t>&lt;</m:t>
-        </m:r>
-        <m:r>
-          <m:rPr>
-            <m:sty m:val="p"/>
-          </m:rPr>
-          <w:rPr>
-            <w:rFonts w:ascii="Cambria Math" w:hAnsi="Cambria Math"/>
-          </w:rPr>
-          <m:t>s</m:t>
+          <m:t>&lt;s</m:t>
         </m:r>
       </m:oMath>
       <w:r>
@@ -14875,13 +14725,7 @@
           <w:rPr>
             <w:rFonts w:ascii="Cambria Math" w:eastAsiaTheme="minorEastAsia" w:hAnsi="Cambria Math"/>
           </w:rPr>
-          <m:t>T</m:t>
-        </m:r>
-        <m:r>
-          <w:rPr>
-            <w:rFonts w:ascii="Cambria Math" w:eastAsiaTheme="minorEastAsia" w:hAnsi="Cambria Math"/>
-          </w:rPr>
-          <m:t>=</m:t>
+          <m:t>T=</m:t>
         </m:r>
         <m:sSub>
           <m:sSubPr>
@@ -15537,13 +15381,7 @@
             <w:rPr>
               <w:rFonts w:ascii="Cambria Math" w:eastAsiaTheme="minorEastAsia" w:hAnsi="Cambria Math"/>
             </w:rPr>
-            <m:t>=</m:t>
-          </m:r>
-          <m:r>
-            <w:rPr>
-              <w:rFonts w:ascii="Cambria Math" w:eastAsiaTheme="minorEastAsia" w:hAnsi="Cambria Math"/>
-            </w:rPr>
-            <m:t>BQ</m:t>
+            <m:t>=BQ</m:t>
           </m:r>
           <m:sSub>
             <m:sSubPr>
@@ -15805,6 +15643,9 @@
             <m:t>=</m:t>
           </m:r>
           <m:r>
+            <m:rPr>
+              <m:sty m:val="p"/>
+            </m:rPr>
             <w:rPr>
               <w:rFonts w:ascii="Cambria Math" w:eastAsiaTheme="minorEastAsia" w:hAnsi="Cambria Math"/>
             </w:rPr>
@@ -15816,13 +15657,7 @@
             <w:rPr>
               <w:rFonts w:ascii="Cambria Math" w:eastAsiaTheme="minorEastAsia" w:hAnsi="Cambria Math"/>
             </w:rPr>
-            <m:t>=</m:t>
-          </m:r>
-          <m:r>
-            <w:rPr>
-              <w:rFonts w:ascii="Cambria Math" w:eastAsiaTheme="minorEastAsia" w:hAnsi="Cambria Math"/>
-            </w:rPr>
-            <m:t>B</m:t>
+            <m:t>=B</m:t>
           </m:r>
           <m:d>
             <m:dPr>
@@ -16030,13 +15865,7 @@
             <w:rPr>
               <w:rFonts w:ascii="Cambria Math" w:eastAsiaTheme="minorEastAsia" w:hAnsi="Cambria Math"/>
             </w:rPr>
-            <m:t>=</m:t>
-          </m:r>
-          <m:r>
-            <w:rPr>
-              <w:rFonts w:ascii="Cambria Math" w:eastAsiaTheme="minorEastAsia" w:hAnsi="Cambria Math"/>
-            </w:rPr>
-            <m:t>B</m:t>
+            <m:t>=B</m:t>
           </m:r>
           <m:d>
             <m:dPr>
@@ -16347,6 +16176,9 @@
             <m:t>=</m:t>
           </m:r>
           <m:r>
+            <m:rPr>
+              <m:sty m:val="p"/>
+            </m:rPr>
             <w:rPr>
               <w:rFonts w:ascii="Cambria Math" w:eastAsiaTheme="minorEastAsia" w:hAnsi="Cambria Math"/>
             </w:rPr>
@@ -16645,13 +16477,7 @@
                         <w:rPr>
                           <w:rFonts w:ascii="Cambria Math" w:eastAsiaTheme="minorEastAsia" w:hAnsi="Cambria Math"/>
                         </w:rPr>
-                        <m:t>s</m:t>
-                      </m:r>
-                      <m:r>
-                        <w:rPr>
-                          <w:rFonts w:ascii="Cambria Math" w:eastAsiaTheme="minorEastAsia" w:hAnsi="Cambria Math"/>
-                        </w:rPr>
-                        <m:t>+1</m:t>
+                        <m:t>s+1</m:t>
                       </m:r>
                     </m:sub>
                   </m:sSub>
@@ -16707,13 +16533,7 @@
                         <w:rPr>
                           <w:rFonts w:ascii="Cambria Math" w:eastAsiaTheme="minorEastAsia" w:hAnsi="Cambria Math"/>
                         </w:rPr>
-                        <m:t>s</m:t>
-                      </m:r>
-                      <m:r>
-                        <w:rPr>
-                          <w:rFonts w:ascii="Cambria Math" w:eastAsiaTheme="minorEastAsia" w:hAnsi="Cambria Math"/>
-                        </w:rPr>
-                        <m:t>+1</m:t>
+                        <m:t>s+1</m:t>
                       </m:r>
                     </m:sub>
                   </m:sSub>
@@ -16723,19 +16543,7 @@
                 <w:rPr>
                   <w:rFonts w:ascii="Cambria Math" w:eastAsiaTheme="minorEastAsia" w:hAnsi="Cambria Math"/>
                 </w:rPr>
-                <m:t>+</m:t>
-              </m:r>
-              <m:r>
-                <w:rPr>
-                  <w:rFonts w:ascii="Cambria Math" w:eastAsiaTheme="minorEastAsia" w:hAnsi="Cambria Math"/>
-                </w:rPr>
-                <m:t>∙∙∙</m:t>
-              </m:r>
-              <m:r>
-                <w:rPr>
-                  <w:rFonts w:ascii="Cambria Math" w:eastAsiaTheme="minorEastAsia" w:hAnsi="Cambria Math"/>
-                </w:rPr>
-                <m:t>+</m:t>
+                <m:t>+∙∙∙+</m:t>
               </m:r>
               <m:f>
                 <m:fPr>
@@ -16771,13 +16579,7 @@
                         <w:rPr>
                           <w:rFonts w:ascii="Cambria Math" w:eastAsiaTheme="minorEastAsia" w:hAnsi="Cambria Math"/>
                         </w:rPr>
-                        <m:t>m</m:t>
-                      </m:r>
-                      <m:r>
-                        <w:rPr>
-                          <w:rFonts w:ascii="Cambria Math" w:eastAsiaTheme="minorEastAsia" w:hAnsi="Cambria Math"/>
-                        </w:rPr>
-                        <m:t>-1</m:t>
+                        <m:t>m-1</m:t>
                       </m:r>
                     </m:sub>
                   </m:sSub>
@@ -16806,13 +16608,7 @@
                         <w:rPr>
                           <w:rFonts w:ascii="Cambria Math" w:eastAsiaTheme="minorEastAsia" w:hAnsi="Cambria Math"/>
                         </w:rPr>
-                        <m:t>m</m:t>
-                      </m:r>
-                      <m:r>
-                        <w:rPr>
-                          <w:rFonts w:ascii="Cambria Math" w:eastAsiaTheme="minorEastAsia" w:hAnsi="Cambria Math"/>
-                        </w:rPr>
-                        <m:t>-1</m:t>
+                        <m:t>m-1</m:t>
                       </m:r>
                     </m:sub>
                   </m:sSub>
@@ -16879,13 +16675,7 @@
                         <w:rPr>
                           <w:rFonts w:ascii="Cambria Math" w:eastAsiaTheme="minorEastAsia" w:hAnsi="Cambria Math"/>
                         </w:rPr>
-                        <m:t>s</m:t>
-                      </m:r>
-                      <m:r>
-                        <w:rPr>
-                          <w:rFonts w:ascii="Cambria Math" w:eastAsiaTheme="minorEastAsia" w:hAnsi="Cambria Math"/>
-                        </w:rPr>
-                        <m:t>+1</m:t>
+                        <m:t>s+1</m:t>
                       </m:r>
                     </m:sub>
                   </m:sSub>
@@ -16918,19 +16708,7 @@
                         <w:rPr>
                           <w:rFonts w:ascii="Cambria Math" w:eastAsiaTheme="minorEastAsia" w:hAnsi="Cambria Math"/>
                         </w:rPr>
-                        <m:t>m</m:t>
-                      </m:r>
-                      <m:r>
-                        <w:rPr>
-                          <w:rFonts w:ascii="Cambria Math" w:eastAsiaTheme="minorEastAsia" w:hAnsi="Cambria Math"/>
-                        </w:rPr>
-                        <m:t>-</m:t>
-                      </m:r>
-                      <m:r>
-                        <w:rPr>
-                          <w:rFonts w:ascii="Cambria Math" w:eastAsiaTheme="minorEastAsia" w:hAnsi="Cambria Math"/>
-                        </w:rPr>
-                        <m:t>1</m:t>
+                        <m:t>m-1</m:t>
                       </m:r>
                     </m:sub>
                   </m:sSub>
@@ -16986,13 +16764,7 @@
                         <w:rPr>
                           <w:rFonts w:ascii="Cambria Math" w:eastAsiaTheme="minorEastAsia" w:hAnsi="Cambria Math"/>
                         </w:rPr>
-                        <m:t>s</m:t>
-                      </m:r>
-                      <m:r>
-                        <w:rPr>
-                          <w:rFonts w:ascii="Cambria Math" w:eastAsiaTheme="minorEastAsia" w:hAnsi="Cambria Math"/>
-                        </w:rPr>
-                        <m:t>+1</m:t>
+                        <m:t>s+1</m:t>
                       </m:r>
                     </m:sub>
                   </m:sSub>
@@ -17025,13 +16797,7 @@
                         <w:rPr>
                           <w:rFonts w:ascii="Cambria Math" w:eastAsiaTheme="minorEastAsia" w:hAnsi="Cambria Math"/>
                         </w:rPr>
-                        <m:t>m</m:t>
-                      </m:r>
-                      <m:r>
-                        <w:rPr>
-                          <w:rFonts w:ascii="Cambria Math" w:eastAsiaTheme="minorEastAsia" w:hAnsi="Cambria Math"/>
-                        </w:rPr>
-                        <m:t>-1</m:t>
+                        <m:t>m-1</m:t>
                       </m:r>
                     </m:sub>
                   </m:sSub>
@@ -17421,13 +17187,7 @@
                             <w:rPr>
                               <w:rFonts w:ascii="Cambria Math" w:eastAsiaTheme="minorEastAsia" w:hAnsi="Cambria Math"/>
                             </w:rPr>
-                            <m:t>m</m:t>
-                          </m:r>
-                          <m:r>
-                            <w:rPr>
-                              <w:rFonts w:ascii="Cambria Math" w:eastAsiaTheme="minorEastAsia" w:hAnsi="Cambria Math"/>
-                            </w:rPr>
-                            <m:t>+1</m:t>
+                            <m:t>m+1</m:t>
                           </m:r>
                         </m:sub>
                       </m:sSub>
@@ -17456,13 +17216,7 @@
                             <w:rPr>
                               <w:rFonts w:ascii="Cambria Math" w:eastAsiaTheme="minorEastAsia" w:hAnsi="Cambria Math"/>
                             </w:rPr>
-                            <m:t>m</m:t>
-                          </m:r>
-                          <m:r>
-                            <w:rPr>
-                              <w:rFonts w:ascii="Cambria Math" w:eastAsiaTheme="minorEastAsia" w:hAnsi="Cambria Math"/>
-                            </w:rPr>
-                            <m:t>+1</m:t>
+                            <m:t>m+1</m:t>
                           </m:r>
                         </m:sub>
                       </m:sSub>
@@ -17529,13 +17283,7 @@
                             <w:rPr>
                               <w:rFonts w:ascii="Cambria Math" w:eastAsiaTheme="minorEastAsia" w:hAnsi="Cambria Math"/>
                             </w:rPr>
-                            <m:t>m</m:t>
-                          </m:r>
-                          <m:r>
-                            <w:rPr>
-                              <w:rFonts w:ascii="Cambria Math" w:eastAsiaTheme="minorEastAsia" w:hAnsi="Cambria Math"/>
-                            </w:rPr>
-                            <m:t>+1</m:t>
+                            <m:t>m+1</m:t>
                           </m:r>
                         </m:sub>
                       </m:sSub>
@@ -17591,13 +17339,7 @@
                             <w:rPr>
                               <w:rFonts w:ascii="Cambria Math" w:eastAsiaTheme="minorEastAsia" w:hAnsi="Cambria Math"/>
                             </w:rPr>
-                            <m:t>m</m:t>
-                          </m:r>
-                          <m:r>
-                            <w:rPr>
-                              <w:rFonts w:ascii="Cambria Math" w:eastAsiaTheme="minorEastAsia" w:hAnsi="Cambria Math"/>
-                            </w:rPr>
-                            <m:t>+1</m:t>
+                            <m:t>m+1</m:t>
                           </m:r>
                         </m:sub>
                       </m:sSub>
@@ -17607,19 +17349,7 @@
                     <w:rPr>
                       <w:rFonts w:ascii="Cambria Math" w:eastAsiaTheme="minorEastAsia" w:hAnsi="Cambria Math"/>
                     </w:rPr>
-                    <m:t>+</m:t>
-                  </m:r>
-                  <m:r>
-                    <w:rPr>
-                      <w:rFonts w:ascii="Cambria Math" w:eastAsiaTheme="minorEastAsia" w:hAnsi="Cambria Math"/>
-                    </w:rPr>
-                    <m:t>∙∙∙</m:t>
-                  </m:r>
-                  <m:r>
-                    <w:rPr>
-                      <w:rFonts w:ascii="Cambria Math" w:eastAsiaTheme="minorEastAsia" w:hAnsi="Cambria Math"/>
-                    </w:rPr>
-                    <m:t>+</m:t>
+                    <m:t>+∙∙∙+</m:t>
                   </m:r>
                   <m:f>
                     <m:fPr>
@@ -17655,13 +17385,7 @@
                             <w:rPr>
                               <w:rFonts w:ascii="Cambria Math" w:eastAsiaTheme="minorEastAsia" w:hAnsi="Cambria Math"/>
                             </w:rPr>
-                            <m:t>f</m:t>
-                          </m:r>
-                          <m:r>
-                            <w:rPr>
-                              <w:rFonts w:ascii="Cambria Math" w:eastAsiaTheme="minorEastAsia" w:hAnsi="Cambria Math"/>
-                            </w:rPr>
-                            <m:t>-1</m:t>
+                            <m:t>f-1</m:t>
                           </m:r>
                         </m:sub>
                       </m:sSub>
@@ -17690,13 +17414,7 @@
                             <w:rPr>
                               <w:rFonts w:ascii="Cambria Math" w:eastAsiaTheme="minorEastAsia" w:hAnsi="Cambria Math"/>
                             </w:rPr>
-                            <m:t>f</m:t>
-                          </m:r>
-                          <m:r>
-                            <w:rPr>
-                              <w:rFonts w:ascii="Cambria Math" w:eastAsiaTheme="minorEastAsia" w:hAnsi="Cambria Math"/>
-                            </w:rPr>
-                            <m:t>-1</m:t>
+                            <m:t>f-1</m:t>
                           </m:r>
                         </m:sub>
                       </m:sSub>
@@ -17763,13 +17481,7 @@
                             <w:rPr>
                               <w:rFonts w:ascii="Cambria Math" w:eastAsiaTheme="minorEastAsia" w:hAnsi="Cambria Math"/>
                             </w:rPr>
-                            <m:t>m</m:t>
-                          </m:r>
-                          <m:r>
-                            <w:rPr>
-                              <w:rFonts w:ascii="Cambria Math" w:eastAsiaTheme="minorEastAsia" w:hAnsi="Cambria Math"/>
-                            </w:rPr>
-                            <m:t>+1</m:t>
+                            <m:t>m+1</m:t>
                           </m:r>
                         </m:sub>
                       </m:sSub>
@@ -17802,13 +17514,7 @@
                             <w:rPr>
                               <w:rFonts w:ascii="Cambria Math" w:eastAsiaTheme="minorEastAsia" w:hAnsi="Cambria Math"/>
                             </w:rPr>
-                            <m:t>f</m:t>
-                          </m:r>
-                          <m:r>
-                            <w:rPr>
-                              <w:rFonts w:ascii="Cambria Math" w:eastAsiaTheme="minorEastAsia" w:hAnsi="Cambria Math"/>
-                            </w:rPr>
-                            <m:t>-1</m:t>
+                            <m:t>f-1</m:t>
                           </m:r>
                         </m:sub>
                       </m:sSub>
@@ -17864,13 +17570,7 @@
                             <w:rPr>
                               <w:rFonts w:ascii="Cambria Math" w:eastAsiaTheme="minorEastAsia" w:hAnsi="Cambria Math"/>
                             </w:rPr>
-                            <m:t>m</m:t>
-                          </m:r>
-                          <m:r>
-                            <w:rPr>
-                              <w:rFonts w:ascii="Cambria Math" w:eastAsiaTheme="minorEastAsia" w:hAnsi="Cambria Math"/>
-                            </w:rPr>
-                            <m:t>+1</m:t>
+                            <m:t>m+1</m:t>
                           </m:r>
                         </m:sub>
                       </m:sSub>
@@ -17903,13 +17603,7 @@
                             <w:rPr>
                               <w:rFonts w:ascii="Cambria Math" w:eastAsiaTheme="minorEastAsia" w:hAnsi="Cambria Math"/>
                             </w:rPr>
-                            <m:t>f</m:t>
-                          </m:r>
-                          <m:r>
-                            <w:rPr>
-                              <w:rFonts w:ascii="Cambria Math" w:eastAsiaTheme="minorEastAsia" w:hAnsi="Cambria Math"/>
-                            </w:rPr>
-                            <m:t>-1</m:t>
+                            <m:t>f-1</m:t>
                           </m:r>
                         </m:sub>
                       </m:sSub>
@@ -17926,6 +17620,9 @@
             <m:t>=</m:t>
           </m:r>
           <m:r>
+            <m:rPr>
+              <m:sty m:val="p"/>
+            </m:rPr>
             <w:rPr>
               <w:rFonts w:ascii="Cambria Math" w:eastAsiaTheme="minorEastAsia" w:hAnsi="Cambria Math"/>
             </w:rPr>
@@ -17937,13 +17634,7 @@
             <w:rPr>
               <w:rFonts w:ascii="Cambria Math" w:eastAsiaTheme="minorEastAsia" w:hAnsi="Cambria Math"/>
             </w:rPr>
-            <m:t>=</m:t>
-          </m:r>
-          <m:r>
-            <w:rPr>
-              <w:rFonts w:ascii="Cambria Math" w:eastAsiaTheme="minorEastAsia" w:hAnsi="Cambria Math"/>
-            </w:rPr>
-            <m:t>BQ</m:t>
+            <m:t>=BQ</m:t>
           </m:r>
           <m:d>
             <m:dPr>
@@ -18296,19 +17987,7 @@
                 <w:rPr>
                   <w:rFonts w:ascii="Cambria Math" w:eastAsiaTheme="minorEastAsia" w:hAnsi="Cambria Math"/>
                 </w:rPr>
-                <m:t>+</m:t>
-              </m:r>
-              <m:r>
-                <w:rPr>
-                  <w:rFonts w:ascii="Cambria Math" w:eastAsiaTheme="minorEastAsia" w:hAnsi="Cambria Math"/>
-                </w:rPr>
-                <m:t>∙∙∙</m:t>
-              </m:r>
-              <m:r>
-                <w:rPr>
-                  <w:rFonts w:ascii="Cambria Math" w:eastAsiaTheme="minorEastAsia" w:hAnsi="Cambria Math"/>
-                </w:rPr>
-                <m:t>+</m:t>
+                <m:t>+∙∙∙+</m:t>
               </m:r>
               <m:f>
                 <m:fPr>
@@ -19100,19 +18779,7 @@
                 <w:rPr>
                   <w:rFonts w:ascii="Cambria Math" w:eastAsiaTheme="minorEastAsia" w:hAnsi="Cambria Math"/>
                 </w:rPr>
-                <m:t>+</m:t>
-              </m:r>
-              <m:r>
-                <w:rPr>
-                  <w:rFonts w:ascii="Cambria Math" w:eastAsiaTheme="minorEastAsia" w:hAnsi="Cambria Math"/>
-                </w:rPr>
-                <m:t>∙∙∙</m:t>
-              </m:r>
-              <m:r>
-                <w:rPr>
-                  <w:rFonts w:ascii="Cambria Math" w:eastAsiaTheme="minorEastAsia" w:hAnsi="Cambria Math"/>
-                </w:rPr>
-                <m:t>+</m:t>
+                <m:t>+∙∙∙+</m:t>
               </m:r>
               <m:f>
                 <m:fPr>
@@ -19395,13 +19062,7 @@
             <w:rPr>
               <w:rFonts w:ascii="Cambria Math" w:eastAsiaTheme="minorEastAsia" w:hAnsi="Cambria Math"/>
             </w:rPr>
-            <m:t>=</m:t>
-          </m:r>
-          <m:r>
-            <w:rPr>
-              <w:rFonts w:ascii="Cambria Math" w:eastAsiaTheme="minorEastAsia" w:hAnsi="Cambria Math"/>
-            </w:rPr>
-            <m:t>BQS=T</m:t>
+            <m:t>=BQS=T</m:t>
           </m:r>
         </m:oMath>
       </m:oMathPara>
@@ -28742,11 +28403,21 @@
     </w:p>
     <w:p>
       <w:pPr>
+        <w:spacing w:line="259" w:lineRule="auto"/>
+        <w:ind w:firstLine="0"/>
+        <w:jc w:val="left"/>
         <w:rPr>
           <w:rFonts w:eastAsiaTheme="minorEastAsia"/>
           <w:iCs/>
         </w:rPr>
       </w:pPr>
+      <w:r>
+        <w:rPr>
+          <w:rFonts w:eastAsiaTheme="minorEastAsia"/>
+          <w:iCs/>
+        </w:rPr>
+        <w:br w:type="page"/>
+      </w:r>
     </w:p>
     <w:p>
       <w:pPr>
@@ -28754,9 +28425,28 @@
       </w:pPr>
       <w:bookmarkStart w:id="18" w:name="_Toc218619930"/>
       <w:r>
+        <w:lastRenderedPageBreak/>
         <w:t>Számológép megvalósítása</w:t>
       </w:r>
       <w:bookmarkEnd w:id="18"/>
+    </w:p>
+    <w:p>
+      <w:r>
+        <w:t>Ezen pont alatt a szöveg alapú formulákat kiértékelő rendszert kell érteni, nem pedig a vizuális felületet. Ezt azért tartottam fontosnak kiemelni, mivel manapság már természetes módon adottnak vesszük, hogy az emberek számára értelmes, egyszerű matematikai jelölésekkel a számítógép egyből képes legyen dolgozni. Ez azonban távol áll a valóságtól.</w:t>
+      </w:r>
+    </w:p>
+    <w:p>
+      <w:r>
+        <w:t>A számológép két részből – egy feldaraboló egységből (parser) és egy kiértékelő egységből (számológép) – áll.</w:t>
+      </w:r>
+    </w:p>
+    <w:p>
+      <w:pPr>
+        <w:jc w:val="center"/>
+      </w:pPr>
+      <w:r>
+        <w:t>&lt;Kép az algoritmus folyamatábrájáról&gt;</w:t>
+      </w:r>
     </w:p>
     <w:p>
       <w:pPr>
@@ -28767,6 +28457,175 @@
         <w:t>Parser</w:t>
       </w:r>
       <w:bookmarkEnd w:id="19"/>
+    </w:p>
+    <w:p>
+      <w:r>
+        <w:t>Ez a részleg felelős a szöveg feldarabolásáért.</w:t>
+      </w:r>
+      <w:r>
+        <w:t xml:space="preserve"> Hogy a parser tudja, milyen formájú egységekre kell felbontani a szöveget, minden egyes számológép egy reguláris kifejezésekből álló (Regex) listát tart fent magán belül. Ez a rendszer a leghosszabb illeszkedés elvét követi, miszerint </w:t>
+      </w:r>
+      <w:r>
+        <w:t>a következő vágást a sor elejétől számított leghosszabban a karaktersorozatra illeszkedő szakasz végén kell megejteni.</w:t>
+      </w:r>
+    </w:p>
+    <w:p>
+      <w:r>
+        <w:t>Implementálásnál ez a következőképp néz ki:</w:t>
+      </w:r>
+    </w:p>
+    <w:p>
+      <w:pPr>
+        <w:pStyle w:val="Listaszerbekezds"/>
+        <w:numPr>
+          <w:ilvl w:val="0"/>
+          <w:numId w:val="8"/>
+        </w:numPr>
+      </w:pPr>
+      <w:r>
+        <w:t>A kezdeti szavunk legyen az üres szó</w:t>
+      </w:r>
+    </w:p>
+    <w:p>
+      <w:pPr>
+        <w:pStyle w:val="Listaszerbekezds"/>
+        <w:numPr>
+          <w:ilvl w:val="0"/>
+          <w:numId w:val="8"/>
+        </w:numPr>
+      </w:pPr>
+      <w:r>
+        <w:t>Vegyünk hozzá a szavunk végére a kiértékelendő szöveg elejéről</w:t>
+      </w:r>
+    </w:p>
+    <w:p>
+      <w:pPr>
+        <w:pStyle w:val="Listaszerbekezds"/>
+        <w:numPr>
+          <w:ilvl w:val="0"/>
+          <w:numId w:val="8"/>
+        </w:numPr>
+      </w:pPr>
+      <w:r>
+        <w:t xml:space="preserve">Értékeljük ki, hogy illeszkedik-e erre a szóra reguláris kifejezés; </w:t>
+      </w:r>
+    </w:p>
+    <w:p>
+      <w:pPr>
+        <w:pStyle w:val="Listaszerbekezds"/>
+        <w:numPr>
+          <w:ilvl w:val="0"/>
+          <w:numId w:val="8"/>
+        </w:numPr>
+      </w:pPr>
+      <w:r>
+        <w:t>Amennyiben illeszkedik kifejezés</w:t>
+      </w:r>
+      <w:r>
+        <w:t>, tároljuk el</w:t>
+      </w:r>
+      <w:r>
+        <w:t xml:space="preserve"> az első ilyen kifejezést;</w:t>
+      </w:r>
+      <w:r>
+        <w:t xml:space="preserve"> ha pedig nem, akkor maradjon az előző eltárolt kifejezés az érték</w:t>
+      </w:r>
+    </w:p>
+    <w:p>
+      <w:pPr>
+        <w:pStyle w:val="Listaszerbekezds"/>
+        <w:numPr>
+          <w:ilvl w:val="0"/>
+          <w:numId w:val="8"/>
+        </w:numPr>
+      </w:pPr>
+      <w:r>
+        <w:t xml:space="preserve">Amennyiben </w:t>
+      </w:r>
+      <w:r>
+        <w:t>nem volt illeszkedés, akkor a szavunk az utolsó betűjén kívül a leghosszabb olyan szakasz, amely illeszkedik az adott reguláris kifejezések valamelyikére, az a reguláris kifejezés pedig pont az amit legutoljára eltároltunk</w:t>
+      </w:r>
+    </w:p>
+    <w:p>
+      <w:pPr>
+        <w:pStyle w:val="Listaszerbekezds"/>
+        <w:numPr>
+          <w:ilvl w:val="0"/>
+          <w:numId w:val="8"/>
+        </w:numPr>
+      </w:pPr>
+      <w:r>
+        <w:t>A szavunk utolsó betűje lesz az új szavunk, az eltárolt reguláris kifejezést pedig üresre állítjuk és folytatjuk az algoritmust a 2. ponttól</w:t>
+      </w:r>
+    </w:p>
+    <w:p>
+      <w:pPr>
+        <w:jc w:val="center"/>
+      </w:pPr>
+      <w:r>
+        <w:t>&lt;Struktogramm az algoritmusról&gt;</w:t>
+      </w:r>
+    </w:p>
+    <w:p>
+      <w:r>
+        <w:t>Viszont a</w:t>
+      </w:r>
+      <w:r>
+        <w:t>mennyiben a bemeneti érték helyes</w:t>
+      </w:r>
+      <w:r>
+        <w:t>, ez az algoritmus még nem biztos, hogy fel is fogja ismerni azt. Kelleni fog még pár szabály, ami lehetővé teszi ezt:</w:t>
+      </w:r>
+    </w:p>
+    <w:p>
+      <w:pPr>
+        <w:pStyle w:val="Listaszerbekezds"/>
+        <w:numPr>
+          <w:ilvl w:val="0"/>
+          <w:numId w:val="9"/>
+        </w:numPr>
+      </w:pPr>
+      <w:r>
+        <w:t xml:space="preserve">A reguláris kifejezések megalkotásánál figyelembe kell venni, hogy egy helyes szó a kiértékelés minden egyes fázisában felismerhető. Vagyis például a cica kulcsszó </w:t>
+      </w:r>
+      <w:r>
+        <w:lastRenderedPageBreak/>
+        <w:t>esetében legalább az egyik reguláris kifejezéssel felismerhetők a c, ci, cic és cica fázisok is.</w:t>
+      </w:r>
+    </w:p>
+    <w:p>
+      <w:pPr>
+        <w:jc w:val="center"/>
+      </w:pPr>
+      <w:r>
+        <w:t xml:space="preserve">&lt;Kép a </w:t>
+      </w:r>
+      <w:r>
+        <w:t>szavak töredékeinek felismerhetőségéről (formális nyelvek)</w:t>
+      </w:r>
+      <w:r>
+        <w:t>&gt;</w:t>
+      </w:r>
+    </w:p>
+    <w:p>
+      <w:pPr>
+        <w:pStyle w:val="Listaszerbekezds"/>
+        <w:numPr>
+          <w:ilvl w:val="0"/>
+          <w:numId w:val="9"/>
+        </w:numPr>
+      </w:pPr>
+      <w:r>
+        <w:t>Hogy a lehető legkevesebb munkát kelljen elvégezni és ne kelljen minden alkalommal végig nézni az összes reguláris kifejezést, használjuk az első felismert kifejezést. Viszont akkor úgy kell sorba állítanunk a kifejezések prioritását, hogy minél specifikusabb egy kifejezés, annál előrébb álljon. Ez azért fontos, hogy nehogy egy hasonló, de általánosabb kifejezés teljesen leárnyékolja.</w:t>
+      </w:r>
+    </w:p>
+    <w:p>
+      <w:pPr>
+        <w:jc w:val="center"/>
+      </w:pPr>
+      <w:r>
+        <w:t>&lt;Kép a specifikusabb és általánosabb kifejezések viszonyáról (formális nyelvek)&gt;</w:t>
+      </w:r>
     </w:p>
     <w:p>
       <w:pPr>
@@ -29448,6 +29307,92 @@
     </w:lvl>
   </w:abstractNum>
   <w:abstractNum w:abstractNumId="4" w15:restartNumberingAfterBreak="0">
+    <w:nsid w:val="57313CB6"/>
+    <w:multiLevelType w:val="hybridMultilevel"/>
+    <w:tmpl w:val="7FDA4F68"/>
+    <w:lvl w:ilvl="0" w:tplc="040E000F">
+      <w:start w:val="1"/>
+      <w:numFmt w:val="decimal"/>
+      <w:lvlText w:val="%1."/>
+      <w:lvlJc w:val="left"/>
+      <w:pPr>
+        <w:ind w:left="947" w:hanging="360"/>
+      </w:pPr>
+    </w:lvl>
+    <w:lvl w:ilvl="1" w:tplc="040E0019" w:tentative="1">
+      <w:start w:val="1"/>
+      <w:numFmt w:val="lowerLetter"/>
+      <w:lvlText w:val="%2."/>
+      <w:lvlJc w:val="left"/>
+      <w:pPr>
+        <w:ind w:left="1667" w:hanging="360"/>
+      </w:pPr>
+    </w:lvl>
+    <w:lvl w:ilvl="2" w:tplc="040E001B" w:tentative="1">
+      <w:start w:val="1"/>
+      <w:numFmt w:val="lowerRoman"/>
+      <w:lvlText w:val="%3."/>
+      <w:lvlJc w:val="right"/>
+      <w:pPr>
+        <w:ind w:left="2387" w:hanging="180"/>
+      </w:pPr>
+    </w:lvl>
+    <w:lvl w:ilvl="3" w:tplc="040E000F" w:tentative="1">
+      <w:start w:val="1"/>
+      <w:numFmt w:val="decimal"/>
+      <w:lvlText w:val="%4."/>
+      <w:lvlJc w:val="left"/>
+      <w:pPr>
+        <w:ind w:left="3107" w:hanging="360"/>
+      </w:pPr>
+    </w:lvl>
+    <w:lvl w:ilvl="4" w:tplc="040E0019" w:tentative="1">
+      <w:start w:val="1"/>
+      <w:numFmt w:val="lowerLetter"/>
+      <w:lvlText w:val="%5."/>
+      <w:lvlJc w:val="left"/>
+      <w:pPr>
+        <w:ind w:left="3827" w:hanging="360"/>
+      </w:pPr>
+    </w:lvl>
+    <w:lvl w:ilvl="5" w:tplc="040E001B" w:tentative="1">
+      <w:start w:val="1"/>
+      <w:numFmt w:val="lowerRoman"/>
+      <w:lvlText w:val="%6."/>
+      <w:lvlJc w:val="right"/>
+      <w:pPr>
+        <w:ind w:left="4547" w:hanging="180"/>
+      </w:pPr>
+    </w:lvl>
+    <w:lvl w:ilvl="6" w:tplc="040E000F" w:tentative="1">
+      <w:start w:val="1"/>
+      <w:numFmt w:val="decimal"/>
+      <w:lvlText w:val="%7."/>
+      <w:lvlJc w:val="left"/>
+      <w:pPr>
+        <w:ind w:left="5267" w:hanging="360"/>
+      </w:pPr>
+    </w:lvl>
+    <w:lvl w:ilvl="7" w:tplc="040E0019" w:tentative="1">
+      <w:start w:val="1"/>
+      <w:numFmt w:val="lowerLetter"/>
+      <w:lvlText w:val="%8."/>
+      <w:lvlJc w:val="left"/>
+      <w:pPr>
+        <w:ind w:left="5987" w:hanging="360"/>
+      </w:pPr>
+    </w:lvl>
+    <w:lvl w:ilvl="8" w:tplc="040E001B" w:tentative="1">
+      <w:start w:val="1"/>
+      <w:numFmt w:val="lowerRoman"/>
+      <w:lvlText w:val="%9."/>
+      <w:lvlJc w:val="right"/>
+      <w:pPr>
+        <w:ind w:left="6707" w:hanging="180"/>
+      </w:pPr>
+    </w:lvl>
+  </w:abstractNum>
+  <w:abstractNum w:abstractNumId="5" w15:restartNumberingAfterBreak="0">
     <w:nsid w:val="5D525599"/>
     <w:multiLevelType w:val="hybridMultilevel"/>
     <w:tmpl w:val="1B60AFBA"/>
@@ -29560,7 +29505,7 @@
       </w:rPr>
     </w:lvl>
   </w:abstractNum>
-  <w:abstractNum w:abstractNumId="5" w15:restartNumberingAfterBreak="0">
+  <w:abstractNum w:abstractNumId="6" w15:restartNumberingAfterBreak="0">
     <w:nsid w:val="66230B17"/>
     <w:multiLevelType w:val="hybridMultilevel"/>
     <w:tmpl w:val="3F062B98"/>
@@ -29673,7 +29618,7 @@
       </w:rPr>
     </w:lvl>
   </w:abstractNum>
-  <w:abstractNum w:abstractNumId="6" w15:restartNumberingAfterBreak="0">
+  <w:abstractNum w:abstractNumId="7" w15:restartNumberingAfterBreak="0">
     <w:nsid w:val="6CB36125"/>
     <w:multiLevelType w:val="hybridMultilevel"/>
     <w:tmpl w:val="47ACECFC"/>
@@ -29786,11 +29731,124 @@
       </w:rPr>
     </w:lvl>
   </w:abstractNum>
+  <w:abstractNum w:abstractNumId="8" w15:restartNumberingAfterBreak="0">
+    <w:nsid w:val="6D982FAC"/>
+    <w:multiLevelType w:val="hybridMultilevel"/>
+    <w:tmpl w:val="0A70C7EA"/>
+    <w:lvl w:ilvl="0" w:tplc="040E0001">
+      <w:start w:val="1"/>
+      <w:numFmt w:val="bullet"/>
+      <w:lvlText w:val=""/>
+      <w:lvlJc w:val="left"/>
+      <w:pPr>
+        <w:ind w:left="947" w:hanging="360"/>
+      </w:pPr>
+      <w:rPr>
+        <w:rFonts w:ascii="Symbol" w:hAnsi="Symbol" w:hint="default"/>
+      </w:rPr>
+    </w:lvl>
+    <w:lvl w:ilvl="1" w:tplc="040E0003" w:tentative="1">
+      <w:start w:val="1"/>
+      <w:numFmt w:val="bullet"/>
+      <w:lvlText w:val="o"/>
+      <w:lvlJc w:val="left"/>
+      <w:pPr>
+        <w:ind w:left="1667" w:hanging="360"/>
+      </w:pPr>
+      <w:rPr>
+        <w:rFonts w:ascii="Courier New" w:hAnsi="Courier New" w:cs="Courier New" w:hint="default"/>
+      </w:rPr>
+    </w:lvl>
+    <w:lvl w:ilvl="2" w:tplc="040E0005" w:tentative="1">
+      <w:start w:val="1"/>
+      <w:numFmt w:val="bullet"/>
+      <w:lvlText w:val=""/>
+      <w:lvlJc w:val="left"/>
+      <w:pPr>
+        <w:ind w:left="2387" w:hanging="360"/>
+      </w:pPr>
+      <w:rPr>
+        <w:rFonts w:ascii="Wingdings" w:hAnsi="Wingdings" w:hint="default"/>
+      </w:rPr>
+    </w:lvl>
+    <w:lvl w:ilvl="3" w:tplc="040E0001" w:tentative="1">
+      <w:start w:val="1"/>
+      <w:numFmt w:val="bullet"/>
+      <w:lvlText w:val=""/>
+      <w:lvlJc w:val="left"/>
+      <w:pPr>
+        <w:ind w:left="3107" w:hanging="360"/>
+      </w:pPr>
+      <w:rPr>
+        <w:rFonts w:ascii="Symbol" w:hAnsi="Symbol" w:hint="default"/>
+      </w:rPr>
+    </w:lvl>
+    <w:lvl w:ilvl="4" w:tplc="040E0003" w:tentative="1">
+      <w:start w:val="1"/>
+      <w:numFmt w:val="bullet"/>
+      <w:lvlText w:val="o"/>
+      <w:lvlJc w:val="left"/>
+      <w:pPr>
+        <w:ind w:left="3827" w:hanging="360"/>
+      </w:pPr>
+      <w:rPr>
+        <w:rFonts w:ascii="Courier New" w:hAnsi="Courier New" w:cs="Courier New" w:hint="default"/>
+      </w:rPr>
+    </w:lvl>
+    <w:lvl w:ilvl="5" w:tplc="040E0005" w:tentative="1">
+      <w:start w:val="1"/>
+      <w:numFmt w:val="bullet"/>
+      <w:lvlText w:val=""/>
+      <w:lvlJc w:val="left"/>
+      <w:pPr>
+        <w:ind w:left="4547" w:hanging="360"/>
+      </w:pPr>
+      <w:rPr>
+        <w:rFonts w:ascii="Wingdings" w:hAnsi="Wingdings" w:hint="default"/>
+      </w:rPr>
+    </w:lvl>
+    <w:lvl w:ilvl="6" w:tplc="040E0001" w:tentative="1">
+      <w:start w:val="1"/>
+      <w:numFmt w:val="bullet"/>
+      <w:lvlText w:val=""/>
+      <w:lvlJc w:val="left"/>
+      <w:pPr>
+        <w:ind w:left="5267" w:hanging="360"/>
+      </w:pPr>
+      <w:rPr>
+        <w:rFonts w:ascii="Symbol" w:hAnsi="Symbol" w:hint="default"/>
+      </w:rPr>
+    </w:lvl>
+    <w:lvl w:ilvl="7" w:tplc="040E0003" w:tentative="1">
+      <w:start w:val="1"/>
+      <w:numFmt w:val="bullet"/>
+      <w:lvlText w:val="o"/>
+      <w:lvlJc w:val="left"/>
+      <w:pPr>
+        <w:ind w:left="5987" w:hanging="360"/>
+      </w:pPr>
+      <w:rPr>
+        <w:rFonts w:ascii="Courier New" w:hAnsi="Courier New" w:cs="Courier New" w:hint="default"/>
+      </w:rPr>
+    </w:lvl>
+    <w:lvl w:ilvl="8" w:tplc="040E0005" w:tentative="1">
+      <w:start w:val="1"/>
+      <w:numFmt w:val="bullet"/>
+      <w:lvlText w:val=""/>
+      <w:lvlJc w:val="left"/>
+      <w:pPr>
+        <w:ind w:left="6707" w:hanging="360"/>
+      </w:pPr>
+      <w:rPr>
+        <w:rFonts w:ascii="Wingdings" w:hAnsi="Wingdings" w:hint="default"/>
+      </w:rPr>
+    </w:lvl>
+  </w:abstractNum>
   <w:num w:numId="1" w16cid:durableId="789907295">
-    <w:abstractNumId w:val="6"/>
+    <w:abstractNumId w:val="7"/>
   </w:num>
   <w:num w:numId="2" w16cid:durableId="1912694649">
-    <w:abstractNumId w:val="4"/>
+    <w:abstractNumId w:val="5"/>
   </w:num>
   <w:num w:numId="3" w16cid:durableId="2093620482">
     <w:abstractNumId w:val="0"/>
@@ -29805,7 +29863,13 @@
     <w:abstractNumId w:val="3"/>
   </w:num>
   <w:num w:numId="7" w16cid:durableId="1975480359">
-    <w:abstractNumId w:val="5"/>
+    <w:abstractNumId w:val="6"/>
+  </w:num>
+  <w:num w:numId="8" w16cid:durableId="612791505">
+    <w:abstractNumId w:val="4"/>
+  </w:num>
+  <w:num w:numId="9" w16cid:durableId="1634208837">
+    <w:abstractNumId w:val="8"/>
   </w:num>
 </w:numbering>
 </file>

</xml_diff>

<commit_message>
Starting to explain the abstract calculator class and its mechanics in the documention.
</commit_message>
<xml_diff>
--- a/Documentation.docx
+++ b/Documentation.docx
@@ -176,7 +176,7 @@
         </w:tc>
       </w:tr>
     </w:tbl>
-    <w:bookmarkStart w:id="0" w:name="_Toc218619912" w:displacedByCustomXml="next"/>
+    <w:bookmarkStart w:id="0" w:name="_Toc221883148" w:displacedByCustomXml="next"/>
     <w:sdt>
       <w:sdtPr>
         <w:rPr>
@@ -228,7 +228,7 @@
           <w:r>
             <w:fldChar w:fldCharType="separate"/>
           </w:r>
-          <w:hyperlink w:anchor="_Toc218619912" w:history="1">
+          <w:hyperlink w:anchor="_Toc221883148" w:history="1">
             <w:r>
               <w:rPr>
                 <w:rStyle w:val="Hiperhivatkozs"/>
@@ -255,7 +255,7 @@
                 <w:noProof/>
                 <w:webHidden/>
               </w:rPr>
-              <w:instrText xml:space="preserve"> PAGEREF _Toc218619912 \h </w:instrText>
+              <w:instrText xml:space="preserve"> PAGEREF _Toc221883148 \h </w:instrText>
             </w:r>
             <w:r>
               <w:rPr>
@@ -299,7 +299,7 @@
               <w:lang w:eastAsia="hu-HU"/>
             </w:rPr>
           </w:pPr>
-          <w:hyperlink w:anchor="_Toc218619913" w:history="1">
+          <w:hyperlink w:anchor="_Toc221883149" w:history="1">
             <w:r>
               <w:rPr>
                 <w:rStyle w:val="Hiperhivatkozs"/>
@@ -326,7 +326,7 @@
                 <w:noProof/>
                 <w:webHidden/>
               </w:rPr>
-              <w:instrText xml:space="preserve"> PAGEREF _Toc218619913 \h </w:instrText>
+              <w:instrText xml:space="preserve"> PAGEREF _Toc221883149 \h </w:instrText>
             </w:r>
             <w:r>
               <w:rPr>
@@ -370,7 +370,7 @@
               <w:lang w:eastAsia="hu-HU"/>
             </w:rPr>
           </w:pPr>
-          <w:hyperlink w:anchor="_Toc218619914" w:history="1">
+          <w:hyperlink w:anchor="_Toc221883150" w:history="1">
             <w:r>
               <w:rPr>
                 <w:rStyle w:val="Hiperhivatkozs"/>
@@ -397,7 +397,7 @@
                 <w:noProof/>
                 <w:webHidden/>
               </w:rPr>
-              <w:instrText xml:space="preserve"> PAGEREF _Toc218619914 \h </w:instrText>
+              <w:instrText xml:space="preserve"> PAGEREF _Toc221883150 \h </w:instrText>
             </w:r>
             <w:r>
               <w:rPr>
@@ -441,7 +441,7 @@
               <w:lang w:eastAsia="hu-HU"/>
             </w:rPr>
           </w:pPr>
-          <w:hyperlink w:anchor="_Toc218619915" w:history="1">
+          <w:hyperlink w:anchor="_Toc221883151" w:history="1">
             <w:r>
               <w:rPr>
                 <w:rStyle w:val="Hiperhivatkozs"/>
@@ -468,7 +468,7 @@
                 <w:noProof/>
                 <w:webHidden/>
               </w:rPr>
-              <w:instrText xml:space="preserve"> PAGEREF _Toc218619915 \h </w:instrText>
+              <w:instrText xml:space="preserve"> PAGEREF _Toc221883151 \h </w:instrText>
             </w:r>
             <w:r>
               <w:rPr>
@@ -512,7 +512,7 @@
               <w:lang w:eastAsia="hu-HU"/>
             </w:rPr>
           </w:pPr>
-          <w:hyperlink w:anchor="_Toc218619916" w:history="1">
+          <w:hyperlink w:anchor="_Toc221883152" w:history="1">
             <w:r>
               <w:rPr>
                 <w:rStyle w:val="Hiperhivatkozs"/>
@@ -539,7 +539,7 @@
                 <w:noProof/>
                 <w:webHidden/>
               </w:rPr>
-              <w:instrText xml:space="preserve"> PAGEREF _Toc218619916 \h </w:instrText>
+              <w:instrText xml:space="preserve"> PAGEREF _Toc221883152 \h </w:instrText>
             </w:r>
             <w:r>
               <w:rPr>
@@ -583,7 +583,7 @@
               <w:lang w:eastAsia="hu-HU"/>
             </w:rPr>
           </w:pPr>
-          <w:hyperlink w:anchor="_Toc218619917" w:history="1">
+          <w:hyperlink w:anchor="_Toc221883153" w:history="1">
             <w:r>
               <w:rPr>
                 <w:rStyle w:val="Hiperhivatkozs"/>
@@ -610,7 +610,7 @@
                 <w:noProof/>
                 <w:webHidden/>
               </w:rPr>
-              <w:instrText xml:space="preserve"> PAGEREF _Toc218619917 \h </w:instrText>
+              <w:instrText xml:space="preserve"> PAGEREF _Toc221883153 \h </w:instrText>
             </w:r>
             <w:r>
               <w:rPr>
@@ -654,7 +654,7 @@
               <w:lang w:eastAsia="hu-HU"/>
             </w:rPr>
           </w:pPr>
-          <w:hyperlink w:anchor="_Toc218619918" w:history="1">
+          <w:hyperlink w:anchor="_Toc221883154" w:history="1">
             <w:r>
               <w:rPr>
                 <w:rStyle w:val="Hiperhivatkozs"/>
@@ -681,7 +681,7 @@
                 <w:noProof/>
                 <w:webHidden/>
               </w:rPr>
-              <w:instrText xml:space="preserve"> PAGEREF _Toc218619918 \h </w:instrText>
+              <w:instrText xml:space="preserve"> PAGEREF _Toc221883154 \h </w:instrText>
             </w:r>
             <w:r>
               <w:rPr>
@@ -725,7 +725,7 @@
               <w:lang w:eastAsia="hu-HU"/>
             </w:rPr>
           </w:pPr>
-          <w:hyperlink w:anchor="_Toc218619919" w:history="1">
+          <w:hyperlink w:anchor="_Toc221883155" w:history="1">
             <w:r>
               <w:rPr>
                 <w:rStyle w:val="Hiperhivatkozs"/>
@@ -752,7 +752,7 @@
                 <w:noProof/>
                 <w:webHidden/>
               </w:rPr>
-              <w:instrText xml:space="preserve"> PAGEREF _Toc218619919 \h </w:instrText>
+              <w:instrText xml:space="preserve"> PAGEREF _Toc221883155 \h </w:instrText>
             </w:r>
             <w:r>
               <w:rPr>
@@ -796,7 +796,7 @@
               <w:lang w:eastAsia="hu-HU"/>
             </w:rPr>
           </w:pPr>
-          <w:hyperlink w:anchor="_Toc218619920" w:history="1">
+          <w:hyperlink w:anchor="_Toc221883156" w:history="1">
             <w:r>
               <w:rPr>
                 <w:rStyle w:val="Hiperhivatkozs"/>
@@ -823,7 +823,7 @@
                 <w:noProof/>
                 <w:webHidden/>
               </w:rPr>
-              <w:instrText xml:space="preserve"> PAGEREF _Toc218619920 \h </w:instrText>
+              <w:instrText xml:space="preserve"> PAGEREF _Toc221883156 \h </w:instrText>
             </w:r>
             <w:r>
               <w:rPr>
@@ -867,7 +867,7 @@
               <w:lang w:eastAsia="hu-HU"/>
             </w:rPr>
           </w:pPr>
-          <w:hyperlink w:anchor="_Toc218619921" w:history="1">
+          <w:hyperlink w:anchor="_Toc221883157" w:history="1">
             <w:r>
               <w:rPr>
                 <w:rStyle w:val="Hiperhivatkozs"/>
@@ -894,7 +894,7 @@
                 <w:noProof/>
                 <w:webHidden/>
               </w:rPr>
-              <w:instrText xml:space="preserve"> PAGEREF _Toc218619921 \h </w:instrText>
+              <w:instrText xml:space="preserve"> PAGEREF _Toc221883157 \h </w:instrText>
             </w:r>
             <w:r>
               <w:rPr>
@@ -938,7 +938,7 @@
               <w:lang w:eastAsia="hu-HU"/>
             </w:rPr>
           </w:pPr>
-          <w:hyperlink w:anchor="_Toc218619922" w:history="1">
+          <w:hyperlink w:anchor="_Toc221883158" w:history="1">
             <w:r>
               <w:rPr>
                 <w:rStyle w:val="Hiperhivatkozs"/>
@@ -965,7 +965,7 @@
                 <w:noProof/>
                 <w:webHidden/>
               </w:rPr>
-              <w:instrText xml:space="preserve"> PAGEREF _Toc218619922 \h </w:instrText>
+              <w:instrText xml:space="preserve"> PAGEREF _Toc221883158 \h </w:instrText>
             </w:r>
             <w:r>
               <w:rPr>
@@ -1009,7 +1009,7 @@
               <w:lang w:eastAsia="hu-HU"/>
             </w:rPr>
           </w:pPr>
-          <w:hyperlink w:anchor="_Toc218619923" w:history="1">
+          <w:hyperlink w:anchor="_Toc221883159" w:history="1">
             <w:r>
               <w:rPr>
                 <w:rStyle w:val="Hiperhivatkozs"/>
@@ -1036,7 +1036,7 @@
                 <w:noProof/>
                 <w:webHidden/>
               </w:rPr>
-              <w:instrText xml:space="preserve"> PAGEREF _Toc218619923 \h </w:instrText>
+              <w:instrText xml:space="preserve"> PAGEREF _Toc221883159 \h </w:instrText>
             </w:r>
             <w:r>
               <w:rPr>
@@ -1080,7 +1080,7 @@
               <w:lang w:eastAsia="hu-HU"/>
             </w:rPr>
           </w:pPr>
-          <w:hyperlink w:anchor="_Toc218619924" w:history="1">
+          <w:hyperlink w:anchor="_Toc221883160" w:history="1">
             <w:r>
               <w:rPr>
                 <w:rStyle w:val="Hiperhivatkozs"/>
@@ -1107,7 +1107,7 @@
                 <w:noProof/>
                 <w:webHidden/>
               </w:rPr>
-              <w:instrText xml:space="preserve"> PAGEREF _Toc218619924 \h </w:instrText>
+              <w:instrText xml:space="preserve"> PAGEREF _Toc221883160 \h </w:instrText>
             </w:r>
             <w:r>
               <w:rPr>
@@ -1151,7 +1151,7 @@
               <w:lang w:eastAsia="hu-HU"/>
             </w:rPr>
           </w:pPr>
-          <w:hyperlink w:anchor="_Toc218619925" w:history="1">
+          <w:hyperlink w:anchor="_Toc221883161" w:history="1">
             <w:r>
               <w:rPr>
                 <w:rStyle w:val="Hiperhivatkozs"/>
@@ -1178,7 +1178,7 @@
                 <w:noProof/>
                 <w:webHidden/>
               </w:rPr>
-              <w:instrText xml:space="preserve"> PAGEREF _Toc218619925 \h </w:instrText>
+              <w:instrText xml:space="preserve"> PAGEREF _Toc221883161 \h </w:instrText>
             </w:r>
             <w:r>
               <w:rPr>
@@ -1222,7 +1222,7 @@
               <w:lang w:eastAsia="hu-HU"/>
             </w:rPr>
           </w:pPr>
-          <w:hyperlink w:anchor="_Toc218619926" w:history="1">
+          <w:hyperlink w:anchor="_Toc221883162" w:history="1">
             <w:r>
               <w:rPr>
                 <w:rStyle w:val="Hiperhivatkozs"/>
@@ -1249,7 +1249,7 @@
                 <w:noProof/>
                 <w:webHidden/>
               </w:rPr>
-              <w:instrText xml:space="preserve"> PAGEREF _Toc218619926 \h </w:instrText>
+              <w:instrText xml:space="preserve"> PAGEREF _Toc221883162 \h </w:instrText>
             </w:r>
             <w:r>
               <w:rPr>
@@ -1269,7 +1269,7 @@
                 <w:noProof/>
                 <w:webHidden/>
               </w:rPr>
-              <w:t>9</w:t>
+              <w:t>11</w:t>
             </w:r>
             <w:r>
               <w:rPr>
@@ -1293,7 +1293,7 @@
               <w:lang w:eastAsia="hu-HU"/>
             </w:rPr>
           </w:pPr>
-          <w:hyperlink w:anchor="_Toc218619927" w:history="1">
+          <w:hyperlink w:anchor="_Toc221883163" w:history="1">
             <w:r>
               <w:rPr>
                 <w:rStyle w:val="Hiperhivatkozs"/>
@@ -1320,7 +1320,7 @@
                 <w:noProof/>
                 <w:webHidden/>
               </w:rPr>
-              <w:instrText xml:space="preserve"> PAGEREF _Toc218619927 \h </w:instrText>
+              <w:instrText xml:space="preserve"> PAGEREF _Toc221883163 \h </w:instrText>
             </w:r>
             <w:r>
               <w:rPr>
@@ -1340,7 +1340,7 @@
                 <w:noProof/>
                 <w:webHidden/>
               </w:rPr>
-              <w:t>9</w:t>
+              <w:t>12</w:t>
             </w:r>
             <w:r>
               <w:rPr>
@@ -1364,7 +1364,7 @@
               <w:lang w:eastAsia="hu-HU"/>
             </w:rPr>
           </w:pPr>
-          <w:hyperlink w:anchor="_Toc218619928" w:history="1">
+          <w:hyperlink w:anchor="_Toc221883164" w:history="1">
             <w:r>
               <w:rPr>
                 <w:rStyle w:val="Hiperhivatkozs"/>
@@ -1391,7 +1391,7 @@
                 <w:noProof/>
                 <w:webHidden/>
               </w:rPr>
-              <w:instrText xml:space="preserve"> PAGEREF _Toc218619928 \h </w:instrText>
+              <w:instrText xml:space="preserve"> PAGEREF _Toc221883164 \h </w:instrText>
             </w:r>
             <w:r>
               <w:rPr>
@@ -1411,7 +1411,7 @@
                 <w:noProof/>
                 <w:webHidden/>
               </w:rPr>
-              <w:t>10</w:t>
+              <w:t>14</w:t>
             </w:r>
             <w:r>
               <w:rPr>
@@ -1435,7 +1435,7 @@
               <w:lang w:eastAsia="hu-HU"/>
             </w:rPr>
           </w:pPr>
-          <w:hyperlink w:anchor="_Toc218619929" w:history="1">
+          <w:hyperlink w:anchor="_Toc221883165" w:history="1">
             <w:r>
               <w:rPr>
                 <w:rStyle w:val="Hiperhivatkozs"/>
@@ -1462,7 +1462,7 @@
                 <w:noProof/>
                 <w:webHidden/>
               </w:rPr>
-              <w:instrText xml:space="preserve"> PAGEREF _Toc218619929 \h </w:instrText>
+              <w:instrText xml:space="preserve"> PAGEREF _Toc221883165 \h </w:instrText>
             </w:r>
             <w:r>
               <w:rPr>
@@ -1482,7 +1482,7 @@
                 <w:noProof/>
                 <w:webHidden/>
               </w:rPr>
-              <w:t>11</w:t>
+              <w:t>14</w:t>
             </w:r>
             <w:r>
               <w:rPr>
@@ -1506,7 +1506,7 @@
               <w:lang w:eastAsia="hu-HU"/>
             </w:rPr>
           </w:pPr>
-          <w:hyperlink w:anchor="_Toc218619930" w:history="1">
+          <w:hyperlink w:anchor="_Toc221883166" w:history="1">
             <w:r>
               <w:rPr>
                 <w:rStyle w:val="Hiperhivatkozs"/>
@@ -1533,7 +1533,7 @@
                 <w:noProof/>
                 <w:webHidden/>
               </w:rPr>
-              <w:instrText xml:space="preserve"> PAGEREF _Toc218619930 \h </w:instrText>
+              <w:instrText xml:space="preserve"> PAGEREF _Toc221883166 \h </w:instrText>
             </w:r>
             <w:r>
               <w:rPr>
@@ -1553,7 +1553,7 @@
                 <w:noProof/>
                 <w:webHidden/>
               </w:rPr>
-              <w:t>11</w:t>
+              <w:t>22</w:t>
             </w:r>
             <w:r>
               <w:rPr>
@@ -1577,7 +1577,7 @@
               <w:lang w:eastAsia="hu-HU"/>
             </w:rPr>
           </w:pPr>
-          <w:hyperlink w:anchor="_Toc218619931" w:history="1">
+          <w:hyperlink w:anchor="_Toc221883167" w:history="1">
             <w:r>
               <w:rPr>
                 <w:rStyle w:val="Hiperhivatkozs"/>
@@ -1604,7 +1604,7 @@
                 <w:noProof/>
                 <w:webHidden/>
               </w:rPr>
-              <w:instrText xml:space="preserve"> PAGEREF _Toc218619931 \h </w:instrText>
+              <w:instrText xml:space="preserve"> PAGEREF _Toc221883167 \h </w:instrText>
             </w:r>
             <w:r>
               <w:rPr>
@@ -1624,7 +1624,7 @@
                 <w:noProof/>
                 <w:webHidden/>
               </w:rPr>
-              <w:t>11</w:t>
+              <w:t>22</w:t>
             </w:r>
             <w:r>
               <w:rPr>
@@ -1648,7 +1648,7 @@
               <w:lang w:eastAsia="hu-HU"/>
             </w:rPr>
           </w:pPr>
-          <w:hyperlink w:anchor="_Toc218619932" w:history="1">
+          <w:hyperlink w:anchor="_Toc221883168" w:history="1">
             <w:r>
               <w:rPr>
                 <w:rStyle w:val="Hiperhivatkozs"/>
@@ -1675,7 +1675,7 @@
                 <w:noProof/>
                 <w:webHidden/>
               </w:rPr>
-              <w:instrText xml:space="preserve"> PAGEREF _Toc218619932 \h </w:instrText>
+              <w:instrText xml:space="preserve"> PAGEREF _Toc221883168 \h </w:instrText>
             </w:r>
             <w:r>
               <w:rPr>
@@ -1695,7 +1695,7 @@
                 <w:noProof/>
                 <w:webHidden/>
               </w:rPr>
-              <w:t>11</w:t>
+              <w:t>23</w:t>
             </w:r>
             <w:r>
               <w:rPr>
@@ -1719,7 +1719,7 @@
               <w:lang w:eastAsia="hu-HU"/>
             </w:rPr>
           </w:pPr>
-          <w:hyperlink w:anchor="_Toc218619933" w:history="1">
+          <w:hyperlink w:anchor="_Toc221883169" w:history="1">
             <w:r>
               <w:rPr>
                 <w:rStyle w:val="Hiperhivatkozs"/>
@@ -1746,7 +1746,7 @@
                 <w:noProof/>
                 <w:webHidden/>
               </w:rPr>
-              <w:instrText xml:space="preserve"> PAGEREF _Toc218619933 \h </w:instrText>
+              <w:instrText xml:space="preserve"> PAGEREF _Toc221883169 \h </w:instrText>
             </w:r>
             <w:r>
               <w:rPr>
@@ -1766,7 +1766,7 @@
                 <w:noProof/>
                 <w:webHidden/>
               </w:rPr>
-              <w:t>11</w:t>
+              <w:t>23</w:t>
             </w:r>
             <w:r>
               <w:rPr>
@@ -1790,7 +1790,7 @@
               <w:lang w:eastAsia="hu-HU"/>
             </w:rPr>
           </w:pPr>
-          <w:hyperlink w:anchor="_Toc218619934" w:history="1">
+          <w:hyperlink w:anchor="_Toc221883170" w:history="1">
             <w:r>
               <w:rPr>
                 <w:rStyle w:val="Hiperhivatkozs"/>
@@ -1817,7 +1817,7 @@
                 <w:noProof/>
                 <w:webHidden/>
               </w:rPr>
-              <w:instrText xml:space="preserve"> PAGEREF _Toc218619934 \h </w:instrText>
+              <w:instrText xml:space="preserve"> PAGEREF _Toc221883170 \h </w:instrText>
             </w:r>
             <w:r>
               <w:rPr>
@@ -1837,7 +1837,7 @@
                 <w:noProof/>
                 <w:webHidden/>
               </w:rPr>
-              <w:t>11</w:t>
+              <w:t>23</w:t>
             </w:r>
             <w:r>
               <w:rPr>
@@ -1861,7 +1861,7 @@
               <w:lang w:eastAsia="hu-HU"/>
             </w:rPr>
           </w:pPr>
-          <w:hyperlink w:anchor="_Toc218619935" w:history="1">
+          <w:hyperlink w:anchor="_Toc221883171" w:history="1">
             <w:r>
               <w:rPr>
                 <w:rStyle w:val="Hiperhivatkozs"/>
@@ -1888,7 +1888,7 @@
                 <w:noProof/>
                 <w:webHidden/>
               </w:rPr>
-              <w:instrText xml:space="preserve"> PAGEREF _Toc218619935 \h </w:instrText>
+              <w:instrText xml:space="preserve"> PAGEREF _Toc221883171 \h </w:instrText>
             </w:r>
             <w:r>
               <w:rPr>
@@ -1908,7 +1908,7 @@
                 <w:noProof/>
                 <w:webHidden/>
               </w:rPr>
-              <w:t>11</w:t>
+              <w:t>23</w:t>
             </w:r>
             <w:r>
               <w:rPr>
@@ -1932,7 +1932,7 @@
               <w:lang w:eastAsia="hu-HU"/>
             </w:rPr>
           </w:pPr>
-          <w:hyperlink w:anchor="_Toc218619936" w:history="1">
+          <w:hyperlink w:anchor="_Toc221883172" w:history="1">
             <w:r>
               <w:rPr>
                 <w:rStyle w:val="Hiperhivatkozs"/>
@@ -1959,7 +1959,7 @@
                 <w:noProof/>
                 <w:webHidden/>
               </w:rPr>
-              <w:instrText xml:space="preserve"> PAGEREF _Toc218619936 \h </w:instrText>
+              <w:instrText xml:space="preserve"> PAGEREF _Toc221883172 \h </w:instrText>
             </w:r>
             <w:r>
               <w:rPr>
@@ -1979,7 +1979,7 @@
                 <w:noProof/>
                 <w:webHidden/>
               </w:rPr>
-              <w:t>11</w:t>
+              <w:t>23</w:t>
             </w:r>
             <w:r>
               <w:rPr>
@@ -2003,7 +2003,7 @@
               <w:lang w:eastAsia="hu-HU"/>
             </w:rPr>
           </w:pPr>
-          <w:hyperlink w:anchor="_Toc218619937" w:history="1">
+          <w:hyperlink w:anchor="_Toc221883173" w:history="1">
             <w:r>
               <w:rPr>
                 <w:rStyle w:val="Hiperhivatkozs"/>
@@ -2030,7 +2030,7 @@
                 <w:noProof/>
                 <w:webHidden/>
               </w:rPr>
-              <w:instrText xml:space="preserve"> PAGEREF _Toc218619937 \h </w:instrText>
+              <w:instrText xml:space="preserve"> PAGEREF _Toc221883173 \h </w:instrText>
             </w:r>
             <w:r>
               <w:rPr>
@@ -2050,7 +2050,7 @@
                 <w:noProof/>
                 <w:webHidden/>
               </w:rPr>
-              <w:t>11</w:t>
+              <w:t>23</w:t>
             </w:r>
             <w:r>
               <w:rPr>
@@ -2074,7 +2074,7 @@
               <w:lang w:eastAsia="hu-HU"/>
             </w:rPr>
           </w:pPr>
-          <w:hyperlink w:anchor="_Toc218619938" w:history="1">
+          <w:hyperlink w:anchor="_Toc221883174" w:history="1">
             <w:r>
               <w:rPr>
                 <w:rStyle w:val="Hiperhivatkozs"/>
@@ -2101,7 +2101,7 @@
                 <w:noProof/>
                 <w:webHidden/>
               </w:rPr>
-              <w:instrText xml:space="preserve"> PAGEREF _Toc218619938 \h </w:instrText>
+              <w:instrText xml:space="preserve"> PAGEREF _Toc221883174 \h </w:instrText>
             </w:r>
             <w:r>
               <w:rPr>
@@ -2121,7 +2121,7 @@
                 <w:noProof/>
                 <w:webHidden/>
               </w:rPr>
-              <w:t>11</w:t>
+              <w:t>23</w:t>
             </w:r>
             <w:r>
               <w:rPr>
@@ -2145,7 +2145,7 @@
               <w:lang w:eastAsia="hu-HU"/>
             </w:rPr>
           </w:pPr>
-          <w:hyperlink w:anchor="_Toc218619939" w:history="1">
+          <w:hyperlink w:anchor="_Toc221883175" w:history="1">
             <w:r>
               <w:rPr>
                 <w:rStyle w:val="Hiperhivatkozs"/>
@@ -2172,7 +2172,7 @@
                 <w:noProof/>
                 <w:webHidden/>
               </w:rPr>
-              <w:instrText xml:space="preserve"> PAGEREF _Toc218619939 \h </w:instrText>
+              <w:instrText xml:space="preserve"> PAGEREF _Toc221883175 \h </w:instrText>
             </w:r>
             <w:r>
               <w:rPr>
@@ -2192,7 +2192,7 @@
                 <w:noProof/>
                 <w:webHidden/>
               </w:rPr>
-              <w:t>11</w:t>
+              <w:t>23</w:t>
             </w:r>
             <w:r>
               <w:rPr>
@@ -2216,7 +2216,7 @@
               <w:lang w:eastAsia="hu-HU"/>
             </w:rPr>
           </w:pPr>
-          <w:hyperlink w:anchor="_Toc218619940" w:history="1">
+          <w:hyperlink w:anchor="_Toc221883176" w:history="1">
             <w:r>
               <w:rPr>
                 <w:rStyle w:val="Hiperhivatkozs"/>
@@ -2243,7 +2243,7 @@
                 <w:noProof/>
                 <w:webHidden/>
               </w:rPr>
-              <w:instrText xml:space="preserve"> PAGEREF _Toc218619940 \h </w:instrText>
+              <w:instrText xml:space="preserve"> PAGEREF _Toc221883176 \h </w:instrText>
             </w:r>
             <w:r>
               <w:rPr>
@@ -2263,7 +2263,7 @@
                 <w:noProof/>
                 <w:webHidden/>
               </w:rPr>
-              <w:t>11</w:t>
+              <w:t>23</w:t>
             </w:r>
             <w:r>
               <w:rPr>
@@ -2287,7 +2287,7 @@
               <w:lang w:eastAsia="hu-HU"/>
             </w:rPr>
           </w:pPr>
-          <w:hyperlink w:anchor="_Toc218619941" w:history="1">
+          <w:hyperlink w:anchor="_Toc221883177" w:history="1">
             <w:r>
               <w:rPr>
                 <w:rStyle w:val="Hiperhivatkozs"/>
@@ -2314,7 +2314,7 @@
                 <w:noProof/>
                 <w:webHidden/>
               </w:rPr>
-              <w:instrText xml:space="preserve"> PAGEREF _Toc218619941 \h </w:instrText>
+              <w:instrText xml:space="preserve"> PAGEREF _Toc221883177 \h </w:instrText>
             </w:r>
             <w:r>
               <w:rPr>
@@ -2334,7 +2334,7 @@
                 <w:noProof/>
                 <w:webHidden/>
               </w:rPr>
-              <w:t>11</w:t>
+              <w:t>23</w:t>
             </w:r>
             <w:r>
               <w:rPr>
@@ -2358,7 +2358,7 @@
               <w:lang w:eastAsia="hu-HU"/>
             </w:rPr>
           </w:pPr>
-          <w:hyperlink w:anchor="_Toc218619942" w:history="1">
+          <w:hyperlink w:anchor="_Toc221883178" w:history="1">
             <w:r>
               <w:rPr>
                 <w:rStyle w:val="Hiperhivatkozs"/>
@@ -2385,7 +2385,7 @@
                 <w:noProof/>
                 <w:webHidden/>
               </w:rPr>
-              <w:instrText xml:space="preserve"> PAGEREF _Toc218619942 \h </w:instrText>
+              <w:instrText xml:space="preserve"> PAGEREF _Toc221883178 \h </w:instrText>
             </w:r>
             <w:r>
               <w:rPr>
@@ -2405,7 +2405,7 @@
                 <w:noProof/>
                 <w:webHidden/>
               </w:rPr>
-              <w:t>11</w:t>
+              <w:t>23</w:t>
             </w:r>
             <w:r>
               <w:rPr>
@@ -2436,7 +2436,7 @@
       <w:pPr>
         <w:pStyle w:val="Cmsor1"/>
       </w:pPr>
-      <w:bookmarkStart w:id="1" w:name="_Toc218619913"/>
+      <w:bookmarkStart w:id="1" w:name="_Toc221883149"/>
       <w:r>
         <w:lastRenderedPageBreak/>
         <w:t>Bevezető</w:t>
@@ -2533,7 +2533,7 @@
       <w:pPr>
         <w:pStyle w:val="Cmsor2"/>
       </w:pPr>
-      <w:bookmarkStart w:id="2" w:name="_Toc218619914"/>
+      <w:bookmarkStart w:id="2" w:name="_Toc221883150"/>
       <w:r>
         <w:t>Probléma felvetés</w:t>
       </w:r>
@@ -2546,7 +2546,7 @@
       <w:pPr>
         <w:pStyle w:val="Cmsor3"/>
       </w:pPr>
-      <w:bookmarkStart w:id="3" w:name="_Toc218619915"/>
+      <w:bookmarkStart w:id="3" w:name="_Toc221883151"/>
       <w:r>
         <w:t>Bináris számrendszer</w:t>
       </w:r>
@@ -3358,7 +3358,7 @@
       <w:pPr>
         <w:pStyle w:val="Cmsor3"/>
       </w:pPr>
-      <w:bookmarkStart w:id="4" w:name="_Toc218619916"/>
+      <w:bookmarkStart w:id="4" w:name="_Toc221883152"/>
       <w:r>
         <w:t>Lebegőpontos számábrázolás</w:t>
       </w:r>
@@ -3477,7 +3477,7 @@
       <w:pPr>
         <w:pStyle w:val="Cmsor3"/>
       </w:pPr>
-      <w:bookmarkStart w:id="5" w:name="_Toc218619917"/>
+      <w:bookmarkStart w:id="5" w:name="_Toc221883153"/>
       <w:r>
         <w:t>Implementációk</w:t>
       </w:r>
@@ -3783,7 +3783,7 @@
           <w:rFonts w:eastAsiaTheme="minorEastAsia"/>
         </w:rPr>
       </w:pPr>
-      <w:bookmarkStart w:id="6" w:name="_Toc218619918"/>
+      <w:bookmarkStart w:id="6" w:name="_Toc221883154"/>
       <w:r>
         <w:rPr>
           <w:rFonts w:eastAsiaTheme="minorEastAsia"/>
@@ -3815,7 +3815,7 @@
       <w:pPr>
         <w:pStyle w:val="Cmsor2"/>
       </w:pPr>
-      <w:bookmarkStart w:id="7" w:name="_Toc218619919"/>
+      <w:bookmarkStart w:id="7" w:name="_Toc221883155"/>
       <w:r>
         <w:t>Megoldás megközelítése</w:t>
       </w:r>
@@ -3825,7 +3825,7 @@
       <w:pPr>
         <w:pStyle w:val="Cmsor3"/>
       </w:pPr>
-      <w:bookmarkStart w:id="8" w:name="_Toc218619920"/>
+      <w:bookmarkStart w:id="8" w:name="_Toc221883156"/>
       <w:r>
         <w:t>BCD számábrázolás</w:t>
       </w:r>
@@ -3857,7 +3857,15 @@
         <w:jc w:val="center"/>
       </w:pPr>
       <w:r>
-        <w:t>&lt;kép egy 0-nál kisebb számról ami rövidebb mint a fractionLength&gt;</w:t>
+        <w:t xml:space="preserve">&lt;kép egy 0-nál kisebb számról ami rövidebb mint a </w:t>
+      </w:r>
+      <w:proofErr w:type="spellStart"/>
+      <w:r>
+        <w:t>fractionLength</w:t>
+      </w:r>
+      <w:proofErr w:type="spellEnd"/>
+      <w:r>
+        <w:t>&gt;</w:t>
       </w:r>
     </w:p>
     <w:p>
@@ -3869,7 +3877,7 @@
       <w:pPr>
         <w:pStyle w:val="Cmsor3"/>
       </w:pPr>
-      <w:bookmarkStart w:id="9" w:name="_Toc218619921"/>
+      <w:bookmarkStart w:id="9" w:name="_Toc221883157"/>
       <w:r>
         <w:t>Előnyök és hátrányok</w:t>
       </w:r>
@@ -4068,7 +4076,7 @@
       <w:pPr>
         <w:pStyle w:val="Cmsor1"/>
       </w:pPr>
-      <w:bookmarkStart w:id="10" w:name="_Toc218619922"/>
+      <w:bookmarkStart w:id="10" w:name="_Toc221883158"/>
       <w:r>
         <w:lastRenderedPageBreak/>
         <w:t>Fejlesztői dokumentáció</w:t>
@@ -4079,7 +4087,7 @@
       <w:pPr>
         <w:pStyle w:val="Cmsor2"/>
       </w:pPr>
-      <w:bookmarkStart w:id="11" w:name="_Toc218619923"/>
+      <w:bookmarkStart w:id="11" w:name="_Toc221883159"/>
       <w:r>
         <w:t>Számtípusok m</w:t>
       </w:r>
@@ -4095,7 +4103,7 @@
       <w:pPr>
         <w:pStyle w:val="Cmsor3"/>
       </w:pPr>
-      <w:bookmarkStart w:id="12" w:name="_Toc218619924"/>
+      <w:bookmarkStart w:id="12" w:name="_Toc221883160"/>
       <w:r>
         <w:t>Számjegy típus (Digit)</w:t>
       </w:r>
@@ -4345,7 +4353,7 @@
       <w:pPr>
         <w:pStyle w:val="Cmsor3"/>
       </w:pPr>
-      <w:bookmarkStart w:id="13" w:name="_Toc218619925"/>
+      <w:bookmarkStart w:id="13" w:name="_Toc221883161"/>
       <w:r>
         <w:t>Természetes szám típus (Natural)</w:t>
       </w:r>
@@ -4382,8 +4390,13 @@
         <w:t>long</w:t>
       </w:r>
       <w:r>
-        <w:t xml:space="preserve"> long</w:t>
-      </w:r>
+        <w:t xml:space="preserve"> </w:t>
+      </w:r>
+      <w:proofErr w:type="spellStart"/>
+      <w:r>
+        <w:t>long</w:t>
+      </w:r>
+      <w:proofErr w:type="spellEnd"/>
       <w:r>
         <w:t xml:space="preserve"> számtípus</w:t>
       </w:r>
@@ -4750,7 +4763,6 @@
       </w:r>
     </w:p>
     <w:p>
-      <w:bookmarkStart w:id="14" w:name="_Toc218619926"/>
       <w:r>
         <w:t>Érdemes még pár szót ejteni a hatványozás és a gyökvonás megvalósításáról, ugyanis ezen értékek számítási technikája eltér az iskolában tanult módszerekétől.</w:t>
       </w:r>
@@ -5888,12 +5900,20 @@
         <w:rPr>
           <w:rFonts w:eastAsiaTheme="minorEastAsia"/>
         </w:rPr>
-        <w:t>François Viète</w:t>
-      </w:r>
+        <w:t xml:space="preserve">François </w:t>
+      </w:r>
+      <w:proofErr w:type="spellStart"/>
       <w:r>
         <w:rPr>
           <w:rFonts w:eastAsiaTheme="minorEastAsia"/>
         </w:rPr>
+        <w:t>Viète</w:t>
+      </w:r>
+      <w:proofErr w:type="spellEnd"/>
+      <w:r>
+        <w:rPr>
+          <w:rFonts w:eastAsiaTheme="minorEastAsia"/>
+        </w:rPr>
         <w:t>, híres matematikus</w:t>
       </w:r>
       <w:r>
@@ -5930,7 +5950,21 @@
         <w:rPr>
           <w:rFonts w:eastAsiaTheme="minorEastAsia"/>
         </w:rPr>
-        <w:t xml:space="preserve">amit Viète </w:t>
+        <w:t xml:space="preserve">amit </w:t>
+      </w:r>
+      <w:proofErr w:type="spellStart"/>
+      <w:r>
+        <w:rPr>
+          <w:rFonts w:eastAsiaTheme="minorEastAsia"/>
+        </w:rPr>
+        <w:t>Viète</w:t>
+      </w:r>
+      <w:proofErr w:type="spellEnd"/>
+      <w:r>
+        <w:rPr>
+          <w:rFonts w:eastAsiaTheme="minorEastAsia"/>
+        </w:rPr>
+        <w:t xml:space="preserve"> </w:t>
       </w:r>
       <w:r>
         <w:rPr>
@@ -7158,7 +7192,15 @@
     </w:p>
     <w:p>
       <w:r>
-        <w:t xml:space="preserve">Egyszerűbben úgy tudnánk elképzelni a fenti számítást, mint a kézi osztás (long division) műveletsorát. Itt is a legnagyobb helyiértékű számjegytől kezdve folyamatosan alulról közelítjük az eredményünket a valós értékhez. </w:t>
+        <w:t xml:space="preserve">Egyszerűbben úgy tudnánk elképzelni a fenti számítást, mint a kézi osztás (long </w:t>
+      </w:r>
+      <w:proofErr w:type="spellStart"/>
+      <w:r>
+        <w:t>division</w:t>
+      </w:r>
+      <w:proofErr w:type="spellEnd"/>
+      <w:r>
+        <w:t xml:space="preserve">) műveletsorát. Itt is a legnagyobb helyiértékű számjegytől kezdve folyamatosan alulról közelítjük az eredményünket a valós értékhez. </w:t>
       </w:r>
       <w:r>
         <w:t>Éppen</w:t>
@@ -7171,6 +7213,7 @@
       <w:pPr>
         <w:pStyle w:val="Cmsor3"/>
       </w:pPr>
+      <w:bookmarkStart w:id="14" w:name="_Toc221883162"/>
       <w:r>
         <w:t>Egész szám típus (Integer)</w:t>
       </w:r>
@@ -7502,7 +7545,7 @@
       <w:pPr>
         <w:pStyle w:val="Cmsor3"/>
       </w:pPr>
-      <w:bookmarkStart w:id="15" w:name="_Toc218619927"/>
+      <w:bookmarkStart w:id="15" w:name="_Toc221883163"/>
       <w:r>
         <w:t>Pozitív szám típus (Positive)</w:t>
       </w:r>
@@ -8183,7 +8226,7 @@
       <w:pPr>
         <w:pStyle w:val="Cmsor3"/>
       </w:pPr>
-      <w:bookmarkStart w:id="16" w:name="_Toc218619928"/>
+      <w:bookmarkStart w:id="16" w:name="_Toc221883164"/>
       <w:r>
         <w:t>Leírható</w:t>
       </w:r>
@@ -8603,7 +8646,7 @@
       <w:pPr>
         <w:pStyle w:val="Cmsor3"/>
       </w:pPr>
-      <w:bookmarkStart w:id="17" w:name="_Toc218619929"/>
+      <w:bookmarkStart w:id="17" w:name="_Toc221883165"/>
       <w:r>
         <w:t>Racionális szám típus (Rational)</w:t>
       </w:r>
@@ -9581,34 +9624,109 @@
           <w:rFonts w:eastAsiaTheme="minorEastAsia"/>
           <w:iCs/>
         </w:rPr>
-        <w:t xml:space="preserve"> (binary splitting</w:t>
-      </w:r>
+        <w:t xml:space="preserve"> (</w:t>
+      </w:r>
+      <w:proofErr w:type="spellStart"/>
       <w:r>
         <w:rPr>
           <w:rFonts w:eastAsiaTheme="minorEastAsia"/>
           <w:iCs/>
         </w:rPr>
-        <w:t xml:space="preserve">, másnéven </w:t>
-      </w:r>
+        <w:t>binary</w:t>
+      </w:r>
+      <w:proofErr w:type="spellEnd"/>
       <w:r>
         <w:rPr>
           <w:rFonts w:eastAsiaTheme="minorEastAsia"/>
           <w:iCs/>
         </w:rPr>
-        <w:t>divide-and-conquer summation</w:t>
-      </w:r>
+        <w:t xml:space="preserve"> </w:t>
+      </w:r>
+      <w:proofErr w:type="spellStart"/>
       <w:r>
         <w:rPr>
           <w:rFonts w:eastAsiaTheme="minorEastAsia"/>
           <w:iCs/>
         </w:rPr>
-        <w:t xml:space="preserve">/product </w:t>
-      </w:r>
+        <w:t>splitting</w:t>
+      </w:r>
+      <w:proofErr w:type="spellEnd"/>
       <w:r>
         <w:rPr>
           <w:rFonts w:eastAsiaTheme="minorEastAsia"/>
           <w:iCs/>
         </w:rPr>
+        <w:t xml:space="preserve">, másnéven </w:t>
+      </w:r>
+      <w:proofErr w:type="spellStart"/>
+      <w:r>
+        <w:rPr>
+          <w:rFonts w:eastAsiaTheme="minorEastAsia"/>
+          <w:iCs/>
+        </w:rPr>
+        <w:t>divide</w:t>
+      </w:r>
+      <w:proofErr w:type="spellEnd"/>
+      <w:r>
+        <w:rPr>
+          <w:rFonts w:eastAsiaTheme="minorEastAsia"/>
+          <w:iCs/>
+        </w:rPr>
+        <w:t>-and-</w:t>
+      </w:r>
+      <w:proofErr w:type="spellStart"/>
+      <w:r>
+        <w:rPr>
+          <w:rFonts w:eastAsiaTheme="minorEastAsia"/>
+          <w:iCs/>
+        </w:rPr>
+        <w:t>conquer</w:t>
+      </w:r>
+      <w:proofErr w:type="spellEnd"/>
+      <w:r>
+        <w:rPr>
+          <w:rFonts w:eastAsiaTheme="minorEastAsia"/>
+          <w:iCs/>
+        </w:rPr>
+        <w:t xml:space="preserve"> </w:t>
+      </w:r>
+      <w:proofErr w:type="spellStart"/>
+      <w:r>
+        <w:rPr>
+          <w:rFonts w:eastAsiaTheme="minorEastAsia"/>
+          <w:iCs/>
+        </w:rPr>
+        <w:t>summation</w:t>
+      </w:r>
+      <w:proofErr w:type="spellEnd"/>
+      <w:r>
+        <w:rPr>
+          <w:rFonts w:eastAsiaTheme="minorEastAsia"/>
+          <w:iCs/>
+        </w:rPr>
+        <w:t>/</w:t>
+      </w:r>
+      <w:proofErr w:type="spellStart"/>
+      <w:r>
+        <w:rPr>
+          <w:rFonts w:eastAsiaTheme="minorEastAsia"/>
+          <w:iCs/>
+        </w:rPr>
+        <w:t>product</w:t>
+      </w:r>
+      <w:proofErr w:type="spellEnd"/>
+      <w:r>
+        <w:rPr>
+          <w:rFonts w:eastAsiaTheme="minorEastAsia"/>
+          <w:iCs/>
+        </w:rPr>
+        <w:t xml:space="preserve"> </w:t>
+      </w:r>
+      <w:r>
+        <w:rPr>
+          <w:rFonts w:eastAsiaTheme="minorEastAsia"/>
+          <w:iCs/>
+        </w:rPr>
         <w:lastRenderedPageBreak/>
         <w:t xml:space="preserve">vagy </w:t>
       </w:r>
@@ -9617,8 +9735,17 @@
           <w:rFonts w:eastAsiaTheme="minorEastAsia"/>
           <w:iCs/>
         </w:rPr>
-        <w:t>prefix product</w:t>
-      </w:r>
+        <w:t xml:space="preserve">prefix </w:t>
+      </w:r>
+      <w:proofErr w:type="spellStart"/>
+      <w:r>
+        <w:rPr>
+          <w:rFonts w:eastAsiaTheme="minorEastAsia"/>
+          <w:iCs/>
+        </w:rPr>
+        <w:t>product</w:t>
+      </w:r>
+      <w:proofErr w:type="spellEnd"/>
       <w:r>
         <w:rPr>
           <w:rFonts w:eastAsiaTheme="minorEastAsia"/>
@@ -19111,13 +19238,15 @@
         </w:rPr>
         <w:t xml:space="preserve"> </w:t>
       </w:r>
+      <w:proofErr w:type="spellStart"/>
       <w:r>
         <w:rPr>
           <w:rFonts w:eastAsiaTheme="minorEastAsia"/>
           <w:iCs/>
         </w:rPr>
-        <w:t>Srinivasa Ramanujan</w:t>
-      </w:r>
+        <w:t>Srinivasa</w:t>
+      </w:r>
+      <w:proofErr w:type="spellEnd"/>
       <w:r>
         <w:rPr>
           <w:rFonts w:eastAsiaTheme="minorEastAsia"/>
@@ -19125,26 +19254,58 @@
         </w:rPr>
         <w:t xml:space="preserve"> </w:t>
       </w:r>
+      <w:proofErr w:type="spellStart"/>
       <w:r>
         <w:rPr>
           <w:rFonts w:eastAsiaTheme="minorEastAsia"/>
           <w:iCs/>
         </w:rPr>
-        <w:t>inspirált</w:t>
-      </w:r>
+        <w:t>Ramanujan</w:t>
+      </w:r>
+      <w:proofErr w:type="spellEnd"/>
       <w:r>
         <w:rPr>
           <w:rFonts w:eastAsiaTheme="minorEastAsia"/>
           <w:iCs/>
         </w:rPr>
-        <w:t>a</w:t>
+        <w:t xml:space="preserve"> </w:t>
       </w:r>
       <w:r>
         <w:rPr>
           <w:rFonts w:eastAsiaTheme="minorEastAsia"/>
           <w:iCs/>
         </w:rPr>
-        <w:t>, Chudnovsky fivérek</w:t>
+        <w:t>inspirált</w:t>
+      </w:r>
+      <w:r>
+        <w:rPr>
+          <w:rFonts w:eastAsiaTheme="minorEastAsia"/>
+          <w:iCs/>
+        </w:rPr>
+        <w:t>a</w:t>
+      </w:r>
+      <w:r>
+        <w:rPr>
+          <w:rFonts w:eastAsiaTheme="minorEastAsia"/>
+          <w:iCs/>
+        </w:rPr>
+        <w:t xml:space="preserve">, </w:t>
+      </w:r>
+      <w:proofErr w:type="spellStart"/>
+      <w:r>
+        <w:rPr>
+          <w:rFonts w:eastAsiaTheme="minorEastAsia"/>
+          <w:iCs/>
+        </w:rPr>
+        <w:t>Chudnovsky</w:t>
+      </w:r>
+      <w:proofErr w:type="spellEnd"/>
+      <w:r>
+        <w:rPr>
+          <w:rFonts w:eastAsiaTheme="minorEastAsia"/>
+          <w:iCs/>
+        </w:rPr>
+        <w:t xml:space="preserve"> fivérek</w:t>
       </w:r>
       <w:r>
         <w:rPr>
@@ -27798,12 +27959,21 @@
           <w:iCs/>
         </w:rPr>
       </w:pPr>
+      <w:proofErr w:type="spellStart"/>
       <w:r>
         <w:rPr>
           <w:rFonts w:eastAsiaTheme="minorEastAsia"/>
           <w:iCs/>
         </w:rPr>
-        <w:t>Leonhard Euler bizonyította, hogy ez az érték kifejezhető a következő végtelen sor használatával:</w:t>
+        <w:t>Leonhard</w:t>
+      </w:r>
+      <w:proofErr w:type="spellEnd"/>
+      <w:r>
+        <w:rPr>
+          <w:rFonts w:eastAsiaTheme="minorEastAsia"/>
+          <w:iCs/>
+        </w:rPr>
+        <w:t xml:space="preserve"> Euler bizonyította, hogy ez az érték kifejezhető a következő végtelen sor használatával:</w:t>
       </w:r>
     </w:p>
     <w:p>
@@ -28423,7 +28593,7 @@
       <w:pPr>
         <w:pStyle w:val="Cmsor2"/>
       </w:pPr>
-      <w:bookmarkStart w:id="18" w:name="_Toc218619930"/>
+      <w:bookmarkStart w:id="18" w:name="_Toc221883166"/>
       <w:r>
         <w:lastRenderedPageBreak/>
         <w:t>Számológép megvalósítása</w:t>
@@ -28452,7 +28622,7 @@
       <w:pPr>
         <w:pStyle w:val="Cmsor3"/>
       </w:pPr>
-      <w:bookmarkStart w:id="19" w:name="_Toc218619931"/>
+      <w:bookmarkStart w:id="19" w:name="_Toc221883167"/>
       <w:r>
         <w:t>Parser</w:t>
       </w:r>
@@ -28463,7 +28633,15 @@
         <w:t>Ez a részleg felelős a szöveg feldarabolásáért.</w:t>
       </w:r>
       <w:r>
-        <w:t xml:space="preserve"> Hogy a parser tudja, milyen formájú egységekre kell felbontani a szöveget, minden egyes számológép egy reguláris kifejezésekből álló (Regex) listát tart fent magán belül. Ez a rendszer a leghosszabb illeszkedés elvét követi, miszerint </w:t>
+        <w:t xml:space="preserve"> Hogy a parser tudja, milyen formájú egységekre kell felbontani a szöveget, minden egyes számológép egy reguláris kifejezésekből álló (</w:t>
+      </w:r>
+      <w:proofErr w:type="spellStart"/>
+      <w:r>
+        <w:t>Regex</w:t>
+      </w:r>
+      <w:proofErr w:type="spellEnd"/>
+      <w:r>
+        <w:t xml:space="preserve">) listát tart fent magán belül. Ez a rendszer a leghosszabb illeszkedés elvét követi, miszerint </w:t>
       </w:r>
       <w:r>
         <w:t>a következő vágást a sor elejétől számított leghosszabban a karaktersorozatra illeszkedő szakasz végén kell megejteni.</w:t>
@@ -28616,7 +28794,13 @@
         </w:numPr>
       </w:pPr>
       <w:r>
-        <w:t>Hogy a lehető legkevesebb munkát kelljen elvégezni és ne kelljen minden alkalommal végig nézni az összes reguláris kifejezést, használjuk az első felismert kifejezést. Viszont akkor úgy kell sorba állítanunk a kifejezések prioritását, hogy minél specifikusabb egy kifejezés, annál előrébb álljon. Ez azért fontos, hogy nehogy egy hasonló, de általánosabb kifejezés teljesen leárnyékolja.</w:t>
+        <w:t xml:space="preserve">Hogy a lehető legkevesebb munkát kelljen elvégezni és ne kelljen minden alkalommal végig nézni az összes reguláris kifejezést, használjuk az első felismert kifejezést. Viszont akkor úgy kell sorba állítanunk a </w:t>
+      </w:r>
+      <w:r>
+        <w:t>lista</w:t>
+      </w:r>
+      <w:r>
+        <w:t xml:space="preserve"> prioritását, hogy minél specifikusabb egy kifejezés, annál előrébb álljon. Ez azért fontos, hogy nehogy egy hasonló, de általánosabb kifejezés teljesen leárnyékolja.</w:t>
       </w:r>
     </w:p>
     <w:p>
@@ -28631,9 +28815,688 @@
       <w:pPr>
         <w:pStyle w:val="Cmsor3"/>
       </w:pPr>
-      <w:bookmarkStart w:id="20" w:name="_Toc218619932"/>
-      <w:r>
-        <w:t>Általános számológép (Standard)</w:t>
+      <w:r>
+        <w:t>Absztrakt számológép (</w:t>
+      </w:r>
+      <w:proofErr w:type="spellStart"/>
+      <w:r>
+        <w:t>Calculator</w:t>
+      </w:r>
+      <w:proofErr w:type="spellEnd"/>
+      <w:r>
+        <w:t>)</w:t>
+      </w:r>
+    </w:p>
+    <w:p>
+      <w:r>
+        <w:t>Említettük, hogy a reguláris kifejezéseket tartó lista tárolását rábíztuk a számológépre. Ez nekünk azért lesz kényelmes, mivel ez a szerkezet lehetőséget nyit különböző típusú számológépek egyszerű létrehozására.</w:t>
+      </w:r>
+      <w:r>
+        <w:t xml:space="preserve"> Ezt</w:t>
+      </w:r>
+      <w:r>
+        <w:t xml:space="preserve"> a könnyedséget</w:t>
+      </w:r>
+      <w:r>
+        <w:t xml:space="preserve"> teszi </w:t>
+      </w:r>
+      <w:r>
+        <w:t>lehetővé ez a szülőosztály, ami minden alap funkciót már magába foglal a kifejezés listán kívül.</w:t>
+      </w:r>
+      <w:r>
+        <w:t xml:space="preserve"> </w:t>
+      </w:r>
+      <w:r>
+        <w:t>Innentől s</w:t>
+      </w:r>
+      <w:r>
+        <w:t>zimplán annyi a dolgunk, hogy az új típusban</w:t>
+      </w:r>
+      <w:r>
+        <w:t xml:space="preserve"> felsoroljuk</w:t>
+      </w:r>
+      <w:r>
+        <w:t>, hogy milyen szavakat ismerjen fel a parser, vagyis a kifejezés lista tartalmát.</w:t>
+      </w:r>
+    </w:p>
+    <w:p>
+      <w:r>
+        <w:t>Tegyük fel. hogy van egy egyszerű számológép típusunk, amivel a parser dolgozik. A szöveg bemegy, majd kijön a szépen feldarabolt eredmény. Rá kell jönnünk, hogy ekkor még mindig nem vagyunk sehol. Ahhoz, hogy a program értelmezni tudja a szövegünket többre lesz szükség.</w:t>
+      </w:r>
+    </w:p>
+    <w:p>
+      <w:r>
+        <w:t>Hozzunk tehát létre mindegyik reguláris kifejezés mellé egy neki megfelelő osztályt</w:t>
+      </w:r>
+      <w:r>
+        <w:t xml:space="preserve">. Az osztály tartalmazza </w:t>
+      </w:r>
+      <w:r>
+        <w:t>a konstruktort és, amennyiben szükséges, egy érték lekérdező, egy szöveggé alakító és egy prioritási értéket visszaadó függvényt.</w:t>
+      </w:r>
+      <w:r>
+        <w:t xml:space="preserve"> Hogy </w:t>
+      </w:r>
+      <w:r>
+        <w:t>pedig egyetlen listában el tudjuk tárolni</w:t>
+      </w:r>
+      <w:r>
+        <w:t xml:space="preserve"> az egészet</w:t>
+      </w:r>
+      <w:r>
+        <w:t>, származtassuk le őket egyetlen nagy szülőosztályból (Expression). A különböző típusok közös vonásait az egyszerűbb leírhatóság érdekében új köztes szülőosztályok bevezetésével valósíthatjuk meg.</w:t>
+      </w:r>
+    </w:p>
+    <w:p>
+      <w:pPr>
+        <w:jc w:val="center"/>
+      </w:pPr>
+      <w:r>
+        <w:t xml:space="preserve">&lt;Kép az absztrakt </w:t>
+      </w:r>
+      <w:proofErr w:type="spellStart"/>
+      <w:r>
+        <w:t>Calculator</w:t>
+      </w:r>
+      <w:proofErr w:type="spellEnd"/>
+      <w:r>
+        <w:t xml:space="preserve"> osztály kifejezésfájáról</w:t>
+      </w:r>
+      <w:r>
+        <w:t xml:space="preserve"> (UML)</w:t>
+      </w:r>
+      <w:r>
+        <w:t>&gt;</w:t>
+      </w:r>
+    </w:p>
+    <w:p>
+      <w:r>
+        <w:t>Térjünk is ki rá, hogy mit is jelképeznek az egyes csúcsokon ülő osztályok:</w:t>
+      </w:r>
+    </w:p>
+    <w:p>
+      <w:r>
+        <w:t>Expression:</w:t>
+      </w:r>
+    </w:p>
+    <w:p>
+      <w:proofErr w:type="spellStart"/>
+      <w:r>
+        <w:lastRenderedPageBreak/>
+        <w:t>ValueHolder</w:t>
+      </w:r>
+      <w:proofErr w:type="spellEnd"/>
+      <w:r>
+        <w:t>:</w:t>
+      </w:r>
+    </w:p>
+    <w:p>
+      <w:r>
+        <w:t>Term:</w:t>
+      </w:r>
+    </w:p>
+    <w:p>
+      <w:proofErr w:type="spellStart"/>
+      <w:r>
+        <w:t>Parenthesized</w:t>
+      </w:r>
+      <w:proofErr w:type="spellEnd"/>
+      <w:r>
+        <w:t>:</w:t>
+      </w:r>
+    </w:p>
+    <w:p>
+      <w:proofErr w:type="spellStart"/>
+      <w:r>
+        <w:t>FunctionBase</w:t>
+      </w:r>
+      <w:proofErr w:type="spellEnd"/>
+      <w:r>
+        <w:t>:</w:t>
+      </w:r>
+    </w:p>
+    <w:p>
+      <w:r>
+        <w:t>Operator:</w:t>
+      </w:r>
+    </w:p>
+    <w:p>
+      <w:proofErr w:type="spellStart"/>
+      <w:r>
+        <w:t>Function</w:t>
+      </w:r>
+      <w:proofErr w:type="spellEnd"/>
+      <w:r>
+        <w:t>:</w:t>
+      </w:r>
+    </w:p>
+    <w:p>
+      <w:r>
+        <w:t>Coma:</w:t>
+      </w:r>
+    </w:p>
+    <w:p>
+      <w:proofErr w:type="spellStart"/>
+      <w:r>
+        <w:t>Parenthesis</w:t>
+      </w:r>
+      <w:proofErr w:type="spellEnd"/>
+      <w:r>
+        <w:t>:</w:t>
+      </w:r>
+    </w:p>
+    <w:p>
+      <w:proofErr w:type="spellStart"/>
+      <w:r>
+        <w:t>Opening</w:t>
+      </w:r>
+      <w:r>
+        <w:t>Parenthesis</w:t>
+      </w:r>
+      <w:proofErr w:type="spellEnd"/>
+      <w:r>
+        <w:t>:</w:t>
+      </w:r>
+    </w:p>
+    <w:p>
+      <w:proofErr w:type="spellStart"/>
+      <w:r>
+        <w:t>Closing</w:t>
+      </w:r>
+      <w:r>
+        <w:t>Parenthesis</w:t>
+      </w:r>
+      <w:proofErr w:type="spellEnd"/>
+      <w:r>
+        <w:t>:</w:t>
+      </w:r>
+    </w:p>
+    <w:p>
+      <w:r>
+        <w:t>Ennek a fá</w:t>
+      </w:r>
+      <w:r>
+        <w:t>nak</w:t>
+      </w:r>
+      <w:r>
+        <w:t xml:space="preserve"> a specifikus számológépek már csak levélcsúcsokat kell, hogy biztosítsanak</w:t>
+      </w:r>
+      <w:r>
+        <w:t>.</w:t>
+      </w:r>
+    </w:p>
+    <w:p>
+      <w:r>
+        <w:t xml:space="preserve">Ezzel már sokkal előrébb vagyunk. Az egyes </w:t>
+      </w:r>
+      <w:r>
+        <w:t>kifejezés osztályok által</w:t>
+      </w:r>
+      <w:r>
+        <w:t>, ha átalakítjuk a kifejezés listát, hogy reguláris kifejezés</w:t>
+      </w:r>
+      <w:r>
+        <w:t xml:space="preserve"> </w:t>
+      </w:r>
+      <w:r>
+        <w:t>-</w:t>
+      </w:r>
+      <w:r>
+        <w:t xml:space="preserve"> kifejezés objektumot gyártó függvény párokat tartalmazzon, a felismert reguláris kifejezésekkel a szavakból egyből objektumok gyárthatók. Vagyis ezentúl a parser nem szavak listáját adja vissza, hanem objektumok listáját, amivel sokkal könnyebb dolgoznunk.</w:t>
+      </w:r>
+    </w:p>
+    <w:p>
+      <w:pPr>
+        <w:jc w:val="center"/>
+      </w:pPr>
+      <w:r>
+        <w:t xml:space="preserve">&lt;Állapotdiagramm </w:t>
+      </w:r>
+      <w:r>
+        <w:t>mindkét</w:t>
+      </w:r>
+      <w:r>
+        <w:t xml:space="preserve"> műveletsorról&gt;</w:t>
+      </w:r>
+    </w:p>
+    <w:p>
+      <w:r>
+        <w:t>Ezt viszont még mindig nem vagyunk képesek kiértékelni. Ebben segít a lengyel formára alakítás, ami a műveleti sor szempontjából egy sokkal jobban kezelhető alak.</w:t>
+      </w:r>
+    </w:p>
+    <w:p>
+      <w:pPr>
+        <w:rPr>
+          <w:b/>
+          <w:bCs/>
+        </w:rPr>
+      </w:pPr>
+      <w:r>
+        <w:rPr>
+          <w:b/>
+          <w:bCs/>
+        </w:rPr>
+        <w:t>Aritmetikai kifejezés alakjai:</w:t>
+      </w:r>
+    </w:p>
+    <w:p>
+      <w:pPr>
+        <w:numPr>
+          <w:ilvl w:val="0"/>
+          <w:numId w:val="10"/>
+        </w:numPr>
+      </w:pPr>
+      <w:r>
+        <w:rPr>
+          <w:b/>
+          <w:bCs/>
+        </w:rPr>
+        <w:t>infix:</w:t>
+      </w:r>
+      <w:r>
+        <w:t xml:space="preserve"> </w:t>
+      </w:r>
+      <m:oMath>
+        <m:r>
+          <w:rPr>
+            <w:rFonts w:ascii="Cambria Math" w:hAnsi="Cambria Math"/>
+          </w:rPr>
+          <m:t>A+B</m:t>
+        </m:r>
+      </m:oMath>
+      <w:r>
+        <w:t>, az egyes műveleti jelek az operandusaik között helyezkednek el</w:t>
+      </w:r>
+    </w:p>
+    <w:p>
+      <w:pPr>
+        <w:numPr>
+          <w:ilvl w:val="0"/>
+          <w:numId w:val="10"/>
+        </w:numPr>
+      </w:pPr>
+      <w:r>
+        <w:rPr>
+          <w:b/>
+          <w:bCs/>
+        </w:rPr>
+        <w:t>postfix:</w:t>
+      </w:r>
+      <w:r>
+        <w:t xml:space="preserve"> </w:t>
+      </w:r>
+      <m:oMath>
+        <m:r>
+          <w:rPr>
+            <w:rFonts w:ascii="Cambria Math" w:hAnsi="Cambria Math"/>
+          </w:rPr>
+          <m:t>AB+</m:t>
+        </m:r>
+      </m:oMath>
+      <w:r>
+        <w:t>, az egyes műveleti jelek az operandusaik mögött helyezkednek el</w:t>
+      </w:r>
+    </w:p>
+    <w:p>
+      <w:pPr>
+        <w:numPr>
+          <w:ilvl w:val="0"/>
+          <w:numId w:val="10"/>
+        </w:numPr>
+      </w:pPr>
+      <w:r>
+        <w:rPr>
+          <w:b/>
+          <w:bCs/>
+        </w:rPr>
+        <w:t>prefix:</w:t>
+      </w:r>
+      <w:r>
+        <w:t xml:space="preserve"> </w:t>
+      </w:r>
+      <m:oMath>
+        <m:r>
+          <w:rPr>
+            <w:rFonts w:ascii="Cambria Math" w:hAnsi="Cambria Math"/>
+          </w:rPr>
+          <m:t>+AB</m:t>
+        </m:r>
+      </m:oMath>
+      <w:r>
+        <w:t>, az egyes műveleti jelek az operandusaik előtt helyezkednek el</w:t>
+      </w:r>
+    </w:p>
+    <w:p>
+      <w:r>
+        <w:t>Az emberek számára kényelmes és könnyen átlátható az infix alak</w:t>
+      </w:r>
+      <w:r>
+        <w:t>, ezért is használjuk. Viszont</w:t>
+      </w:r>
+      <w:r>
+        <w:t xml:space="preserve"> a fordítóprogramoknak egy olyan alakra van szükségük, amelyekből a műveletek elvégzésének a sorrendje egyértelműen adódik.</w:t>
+      </w:r>
+    </w:p>
+    <w:p>
+      <w:r>
+        <w:lastRenderedPageBreak/>
+        <w:t xml:space="preserve">A lengyel forma az </w:t>
+      </w:r>
+      <w:r>
+        <w:rPr>
+          <w:b/>
+          <w:bCs/>
+        </w:rPr>
+        <w:t>aritmetikai kifejezés postfix alakja.</w:t>
+      </w:r>
+      <w:r>
+        <w:t xml:space="preserve"> Nincsenek benne zárójelek, a kiértékelés mégis egyértelmű. Operandusok sorrendje nem változik. Operátorok sorrendje az elvégzésük sorrendjében szerepel, tehát balról jobbra. Minden operátort közvetlen megelőznek az operandusai, (az operandus lehet változó, konstans, de lehet postfix kifejezés is).</w:t>
+      </w:r>
+    </w:p>
+    <w:p>
+      <w:pPr>
+        <w:rPr>
+          <w:b/>
+          <w:bCs/>
+        </w:rPr>
+      </w:pPr>
+      <w:r>
+        <w:rPr>
+          <w:b/>
+          <w:bCs/>
+        </w:rPr>
+        <w:t xml:space="preserve">Operátorok </w:t>
+      </w:r>
+      <w:proofErr w:type="spellStart"/>
+      <w:r>
+        <w:rPr>
+          <w:b/>
+          <w:bCs/>
+        </w:rPr>
+        <w:t>precedenciája</w:t>
+      </w:r>
+      <w:proofErr w:type="spellEnd"/>
+      <w:r>
+        <w:rPr>
+          <w:b/>
+          <w:bCs/>
+        </w:rPr>
+        <w:t xml:space="preserve"> (elsősége):</w:t>
+      </w:r>
+    </w:p>
+    <w:p>
+      <w:r>
+        <w:t xml:space="preserve">Legkisebb </w:t>
+      </w:r>
+      <w:proofErr w:type="spellStart"/>
+      <w:r>
+        <w:t>precedenciájútól</w:t>
+      </w:r>
+      <w:proofErr w:type="spellEnd"/>
+      <w:r>
+        <w:t xml:space="preserve"> a legnagyobbig a sorrend a következő:</w:t>
+      </w:r>
+    </w:p>
+    <w:p>
+      <w:pPr>
+        <w:numPr>
+          <w:ilvl w:val="0"/>
+          <w:numId w:val="11"/>
+        </w:numPr>
+      </w:pPr>
+      <w:r>
+        <w:t>=</w:t>
+      </w:r>
+    </w:p>
+    <w:p>
+      <w:pPr>
+        <w:numPr>
+          <w:ilvl w:val="0"/>
+          <w:numId w:val="11"/>
+        </w:numPr>
+      </w:pPr>
+      <m:oMath>
+        <m:r>
+          <w:rPr>
+            <w:rFonts w:ascii="Cambria Math" w:hAnsi="Cambria Math"/>
+          </w:rPr>
+          <m:t>+</m:t>
+        </m:r>
+      </m:oMath>
+      <w:r>
+        <w:t xml:space="preserve"> </w:t>
+      </w:r>
+      <w:r>
+        <w:t>és</w:t>
+      </w:r>
+      <w:r>
+        <w:t xml:space="preserve"> </w:t>
+      </w:r>
+      <m:oMath>
+        <m:r>
+          <w:rPr>
+            <w:rFonts w:ascii="Cambria Math" w:hAnsi="Cambria Math"/>
+          </w:rPr>
+          <m:t>-</m:t>
+        </m:r>
+      </m:oMath>
+      <w:r>
+        <w:t xml:space="preserve"> (azonos rangúak)</w:t>
+      </w:r>
+    </w:p>
+    <w:p>
+      <w:pPr>
+        <w:numPr>
+          <w:ilvl w:val="0"/>
+          <w:numId w:val="11"/>
+        </w:numPr>
+      </w:pPr>
+      <m:oMath>
+        <m:r>
+          <w:rPr>
+            <w:rFonts w:ascii="Cambria Math" w:hAnsi="Cambria Math"/>
+          </w:rPr>
+          <m:t>×</m:t>
+        </m:r>
+      </m:oMath>
+      <w:r>
+        <w:t xml:space="preserve"> </w:t>
+      </w:r>
+      <w:r>
+        <w:t>és</w:t>
+      </w:r>
+      <w:r>
+        <w:t xml:space="preserve"> </w:t>
+      </w:r>
+      <m:oMath>
+        <m:r>
+          <w:rPr>
+            <w:rFonts w:ascii="Cambria Math" w:hAnsi="Cambria Math"/>
+          </w:rPr>
+          <m:t>/</m:t>
+        </m:r>
+      </m:oMath>
+      <w:r>
+        <w:t xml:space="preserve"> (azonos rangúak)</w:t>
+      </w:r>
+    </w:p>
+    <w:p>
+      <w:pPr>
+        <w:numPr>
+          <w:ilvl w:val="0"/>
+          <w:numId w:val="11"/>
+        </w:numPr>
+      </w:pPr>
+      <m:oMath>
+        <m:sSup>
+          <m:sSupPr>
+            <m:ctrlPr>
+              <w:rPr>
+                <w:rFonts w:ascii="Cambria Math" w:hAnsi="Cambria Math"/>
+                <w:i/>
+              </w:rPr>
+            </m:ctrlPr>
+          </m:sSupPr>
+          <m:e>
+            <m:r>
+              <w:rPr>
+                <w:rFonts w:ascii="Cambria Math" w:hAnsi="Cambria Math"/>
+              </w:rPr>
+              <m:t>x</m:t>
+            </m:r>
+          </m:e>
+          <m:sup>
+            <m:r>
+              <w:rPr>
+                <w:rFonts w:ascii="Cambria Math" w:hAnsi="Cambria Math"/>
+              </w:rPr>
+              <m:t>a</m:t>
+            </m:r>
+          </m:sup>
+        </m:sSup>
+      </m:oMath>
+      <w:r>
+        <w:t xml:space="preserve"> és </w:t>
+      </w:r>
+      <m:oMath>
+        <m:rad>
+          <m:radPr>
+            <m:ctrlPr>
+              <w:rPr>
+                <w:rFonts w:ascii="Cambria Math" w:hAnsi="Cambria Math"/>
+                <w:i/>
+              </w:rPr>
+            </m:ctrlPr>
+          </m:radPr>
+          <m:deg>
+            <m:r>
+              <w:rPr>
+                <w:rFonts w:ascii="Cambria Math" w:hAnsi="Cambria Math"/>
+              </w:rPr>
+              <m:t>a</m:t>
+            </m:r>
+          </m:deg>
+          <m:e>
+            <m:r>
+              <w:rPr>
+                <w:rFonts w:ascii="Cambria Math" w:hAnsi="Cambria Math"/>
+              </w:rPr>
+              <m:t>x</m:t>
+            </m:r>
+          </m:e>
+        </m:rad>
+      </m:oMath>
+    </w:p>
+    <w:p>
+      <w:r>
+        <w:t xml:space="preserve">Balról jobbra típusú (bal asszociatív) operátorok: </w:t>
+      </w:r>
+      <m:oMath>
+        <m:r>
+          <w:rPr>
+            <w:rFonts w:ascii="Cambria Math" w:hAnsi="Cambria Math"/>
+          </w:rPr>
+          <m:t>+</m:t>
+        </m:r>
+      </m:oMath>
+      <w:r>
+        <w:t xml:space="preserve">, </w:t>
+      </w:r>
+      <m:oMath>
+        <m:r>
+          <w:rPr>
+            <w:rFonts w:ascii="Cambria Math" w:hAnsi="Cambria Math"/>
+          </w:rPr>
+          <m:t>-</m:t>
+        </m:r>
+      </m:oMath>
+      <w:r>
+        <w:t xml:space="preserve">, </w:t>
+      </w:r>
+      <m:oMath>
+        <m:r>
+          <w:rPr>
+            <w:rFonts w:ascii="Cambria Math" w:hAnsi="Cambria Math"/>
+          </w:rPr>
+          <m:t>×</m:t>
+        </m:r>
+      </m:oMath>
+      <w:r>
+        <w:t xml:space="preserve">, </w:t>
+      </w:r>
+      <m:oMath>
+        <m:r>
+          <w:rPr>
+            <w:rFonts w:ascii="Cambria Math" w:hAnsi="Cambria Math"/>
+          </w:rPr>
+          <m:t>/</m:t>
+        </m:r>
+      </m:oMath>
+    </w:p>
+    <w:p>
+      <w:r>
+        <w:t xml:space="preserve">Jobbról balra típusú (jobb asszociatív) operátorok: </w:t>
+      </w:r>
+      <m:oMath>
+        <m:r>
+          <w:rPr>
+            <w:rFonts w:ascii="Cambria Math" w:hAnsi="Cambria Math"/>
+          </w:rPr>
+          <m:t>=</m:t>
+        </m:r>
+      </m:oMath>
+      <w:r>
+        <w:t xml:space="preserve">, </w:t>
+      </w:r>
+      <m:oMath>
+        <m:sSup>
+          <m:sSupPr>
+            <m:ctrlPr>
+              <w:rPr>
+                <w:rFonts w:ascii="Cambria Math" w:hAnsi="Cambria Math"/>
+                <w:i/>
+              </w:rPr>
+            </m:ctrlPr>
+          </m:sSupPr>
+          <m:e>
+            <m:r>
+              <w:rPr>
+                <w:rFonts w:ascii="Cambria Math" w:hAnsi="Cambria Math"/>
+              </w:rPr>
+              <m:t>x</m:t>
+            </m:r>
+          </m:e>
+          <m:sup>
+            <m:r>
+              <w:rPr>
+                <w:rFonts w:ascii="Cambria Math" w:hAnsi="Cambria Math"/>
+              </w:rPr>
+              <m:t>a</m:t>
+            </m:r>
+          </m:sup>
+        </m:sSup>
+      </m:oMath>
+    </w:p>
+    <w:p/>
+    <w:p>
+      <w:pPr>
+        <w:pStyle w:val="Cmsor3"/>
+      </w:pPr>
+      <w:bookmarkStart w:id="20" w:name="_Toc221883168"/>
+      <w:r>
+        <w:lastRenderedPageBreak/>
+        <w:t>Általános számológép (</w:t>
+      </w:r>
+      <w:proofErr w:type="spellStart"/>
+      <w:r>
+        <w:t>Standard</w:t>
+      </w:r>
+      <w:r>
+        <w:t>Calculator</w:t>
+      </w:r>
+      <w:proofErr w:type="spellEnd"/>
+      <w:r>
+        <w:t>)</w:t>
       </w:r>
       <w:bookmarkEnd w:id="20"/>
     </w:p>
@@ -28641,9 +29504,20 @@
       <w:pPr>
         <w:pStyle w:val="Cmsor3"/>
       </w:pPr>
-      <w:bookmarkStart w:id="21" w:name="_Toc218619933"/>
-      <w:r>
-        <w:t>Euklideszi tér számológép (EuclideanSpace)</w:t>
+      <w:bookmarkStart w:id="21" w:name="_Toc221883169"/>
+      <w:r>
+        <w:t>Euklideszi tér számológép (</w:t>
+      </w:r>
+      <w:proofErr w:type="spellStart"/>
+      <w:r>
+        <w:t>EuclideanSpace</w:t>
+      </w:r>
+      <w:r>
+        <w:t>Calculator</w:t>
+      </w:r>
+      <w:proofErr w:type="spellEnd"/>
+      <w:r>
+        <w:t>)</w:t>
       </w:r>
       <w:bookmarkEnd w:id="21"/>
     </w:p>
@@ -28651,9 +29525,20 @@
       <w:pPr>
         <w:pStyle w:val="Cmsor3"/>
       </w:pPr>
-      <w:bookmarkStart w:id="22" w:name="_Toc218619934"/>
-      <w:r>
-        <w:t>Polinom számológép (Polynomials)</w:t>
+      <w:bookmarkStart w:id="22" w:name="_Toc221883170"/>
+      <w:r>
+        <w:t>Polinom számológép (</w:t>
+      </w:r>
+      <w:proofErr w:type="spellStart"/>
+      <w:r>
+        <w:t>Polynomials</w:t>
+      </w:r>
+      <w:r>
+        <w:t>Calculator</w:t>
+      </w:r>
+      <w:proofErr w:type="spellEnd"/>
+      <w:r>
+        <w:t>)</w:t>
       </w:r>
       <w:bookmarkEnd w:id="22"/>
     </w:p>
@@ -28661,9 +29546,20 @@
       <w:pPr>
         <w:pStyle w:val="Cmsor3"/>
       </w:pPr>
-      <w:bookmarkStart w:id="23" w:name="_Toc218619935"/>
-      <w:r>
-        <w:t>Integrálközelítés számológép (Integral)</w:t>
+      <w:bookmarkStart w:id="23" w:name="_Toc221883171"/>
+      <w:r>
+        <w:t>Integrálközelítés számológép (</w:t>
+      </w:r>
+      <w:proofErr w:type="spellStart"/>
+      <w:r>
+        <w:t>Integral</w:t>
+      </w:r>
+      <w:r>
+        <w:t>Calculator</w:t>
+      </w:r>
+      <w:proofErr w:type="spellEnd"/>
+      <w:r>
+        <w:t>)</w:t>
       </w:r>
       <w:bookmarkEnd w:id="23"/>
     </w:p>
@@ -28671,7 +29567,7 @@
       <w:pPr>
         <w:pStyle w:val="Cmsor2"/>
       </w:pPr>
-      <w:bookmarkStart w:id="24" w:name="_Toc218619936"/>
+      <w:bookmarkStart w:id="24" w:name="_Toc221883172"/>
       <w:r>
         <w:t>Vizuális számológép megvalósítása</w:t>
       </w:r>
@@ -28681,7 +29577,7 @@
       <w:pPr>
         <w:pStyle w:val="Cmsor3"/>
       </w:pPr>
-      <w:bookmarkStart w:id="25" w:name="_Toc218619937"/>
+      <w:bookmarkStart w:id="25" w:name="_Toc221883173"/>
       <w:r>
         <w:t>Funkciók</w:t>
       </w:r>
@@ -28691,7 +29587,7 @@
       <w:pPr>
         <w:pStyle w:val="Cmsor2"/>
       </w:pPr>
-      <w:bookmarkStart w:id="26" w:name="_Toc218619938"/>
+      <w:bookmarkStart w:id="26" w:name="_Toc221883174"/>
       <w:r>
         <w:t>Jövőbeli fejlesztések</w:t>
       </w:r>
@@ -28701,7 +29597,7 @@
       <w:pPr>
         <w:pStyle w:val="Cmsor3"/>
       </w:pPr>
-      <w:bookmarkStart w:id="27" w:name="_Toc218619939"/>
+      <w:bookmarkStart w:id="27" w:name="_Toc221883175"/>
       <w:r>
         <w:t>Teljesítményt növelő fejlesztések</w:t>
       </w:r>
@@ -28711,7 +29607,7 @@
       <w:pPr>
         <w:pStyle w:val="Cmsor3"/>
       </w:pPr>
-      <w:bookmarkStart w:id="28" w:name="_Toc218619940"/>
+      <w:bookmarkStart w:id="28" w:name="_Toc221883176"/>
       <w:r>
         <w:t>Bővítmények</w:t>
       </w:r>
@@ -28721,7 +29617,7 @@
       <w:pPr>
         <w:pStyle w:val="Cmsor3"/>
       </w:pPr>
-      <w:bookmarkStart w:id="29" w:name="_Toc218619941"/>
+      <w:bookmarkStart w:id="29" w:name="_Toc221883177"/>
       <w:r>
         <w:t>Más nyelvekre kiterjesztés</w:t>
       </w:r>
@@ -28731,7 +29627,7 @@
       <w:pPr>
         <w:pStyle w:val="Cmsor2"/>
       </w:pPr>
-      <w:bookmarkStart w:id="30" w:name="_Toc218619942"/>
+      <w:bookmarkStart w:id="30" w:name="_Toc221883178"/>
       <w:r>
         <w:t>Köszönetnyilvánítás</w:t>
       </w:r>
@@ -29194,6 +30090,155 @@
     </w:lvl>
   </w:abstractNum>
   <w:abstractNum w:abstractNumId="3" w15:restartNumberingAfterBreak="0">
+    <w:nsid w:val="41E81218"/>
+    <w:multiLevelType w:val="multilevel"/>
+    <w:tmpl w:val="B136FE62"/>
+    <w:lvl w:ilvl="0">
+      <w:start w:val="1"/>
+      <w:numFmt w:val="decimal"/>
+      <w:lvlText w:val="%1."/>
+      <w:lvlJc w:val="left"/>
+      <w:pPr>
+        <w:tabs>
+          <w:tab w:val="num" w:pos="720"/>
+        </w:tabs>
+        <w:ind w:left="720" w:hanging="360"/>
+      </w:pPr>
+      <w:rPr>
+        <w:rFonts w:hint="default"/>
+        <w:sz w:val="20"/>
+      </w:rPr>
+    </w:lvl>
+    <w:lvl w:ilvl="1" w:tentative="1">
+      <w:start w:val="1"/>
+      <w:numFmt w:val="bullet"/>
+      <w:lvlText w:val="o"/>
+      <w:lvlJc w:val="left"/>
+      <w:pPr>
+        <w:tabs>
+          <w:tab w:val="num" w:pos="1440"/>
+        </w:tabs>
+        <w:ind w:left="1440" w:hanging="360"/>
+      </w:pPr>
+      <w:rPr>
+        <w:rFonts w:ascii="Courier New" w:hAnsi="Courier New" w:hint="default"/>
+        <w:sz w:val="20"/>
+      </w:rPr>
+    </w:lvl>
+    <w:lvl w:ilvl="2" w:tentative="1">
+      <w:start w:val="1"/>
+      <w:numFmt w:val="bullet"/>
+      <w:lvlText w:val=""/>
+      <w:lvlJc w:val="left"/>
+      <w:pPr>
+        <w:tabs>
+          <w:tab w:val="num" w:pos="2160"/>
+        </w:tabs>
+        <w:ind w:left="2160" w:hanging="360"/>
+      </w:pPr>
+      <w:rPr>
+        <w:rFonts w:ascii="Wingdings" w:hAnsi="Wingdings" w:hint="default"/>
+        <w:sz w:val="20"/>
+      </w:rPr>
+    </w:lvl>
+    <w:lvl w:ilvl="3" w:tentative="1">
+      <w:start w:val="1"/>
+      <w:numFmt w:val="bullet"/>
+      <w:lvlText w:val=""/>
+      <w:lvlJc w:val="left"/>
+      <w:pPr>
+        <w:tabs>
+          <w:tab w:val="num" w:pos="2880"/>
+        </w:tabs>
+        <w:ind w:left="2880" w:hanging="360"/>
+      </w:pPr>
+      <w:rPr>
+        <w:rFonts w:ascii="Wingdings" w:hAnsi="Wingdings" w:hint="default"/>
+        <w:sz w:val="20"/>
+      </w:rPr>
+    </w:lvl>
+    <w:lvl w:ilvl="4" w:tentative="1">
+      <w:start w:val="1"/>
+      <w:numFmt w:val="bullet"/>
+      <w:lvlText w:val=""/>
+      <w:lvlJc w:val="left"/>
+      <w:pPr>
+        <w:tabs>
+          <w:tab w:val="num" w:pos="3600"/>
+        </w:tabs>
+        <w:ind w:left="3600" w:hanging="360"/>
+      </w:pPr>
+      <w:rPr>
+        <w:rFonts w:ascii="Wingdings" w:hAnsi="Wingdings" w:hint="default"/>
+        <w:sz w:val="20"/>
+      </w:rPr>
+    </w:lvl>
+    <w:lvl w:ilvl="5" w:tentative="1">
+      <w:start w:val="1"/>
+      <w:numFmt w:val="bullet"/>
+      <w:lvlText w:val=""/>
+      <w:lvlJc w:val="left"/>
+      <w:pPr>
+        <w:tabs>
+          <w:tab w:val="num" w:pos="4320"/>
+        </w:tabs>
+        <w:ind w:left="4320" w:hanging="360"/>
+      </w:pPr>
+      <w:rPr>
+        <w:rFonts w:ascii="Wingdings" w:hAnsi="Wingdings" w:hint="default"/>
+        <w:sz w:val="20"/>
+      </w:rPr>
+    </w:lvl>
+    <w:lvl w:ilvl="6" w:tentative="1">
+      <w:start w:val="1"/>
+      <w:numFmt w:val="bullet"/>
+      <w:lvlText w:val=""/>
+      <w:lvlJc w:val="left"/>
+      <w:pPr>
+        <w:tabs>
+          <w:tab w:val="num" w:pos="5040"/>
+        </w:tabs>
+        <w:ind w:left="5040" w:hanging="360"/>
+      </w:pPr>
+      <w:rPr>
+        <w:rFonts w:ascii="Wingdings" w:hAnsi="Wingdings" w:hint="default"/>
+        <w:sz w:val="20"/>
+      </w:rPr>
+    </w:lvl>
+    <w:lvl w:ilvl="7" w:tentative="1">
+      <w:start w:val="1"/>
+      <w:numFmt w:val="bullet"/>
+      <w:lvlText w:val=""/>
+      <w:lvlJc w:val="left"/>
+      <w:pPr>
+        <w:tabs>
+          <w:tab w:val="num" w:pos="5760"/>
+        </w:tabs>
+        <w:ind w:left="5760" w:hanging="360"/>
+      </w:pPr>
+      <w:rPr>
+        <w:rFonts w:ascii="Wingdings" w:hAnsi="Wingdings" w:hint="default"/>
+        <w:sz w:val="20"/>
+      </w:rPr>
+    </w:lvl>
+    <w:lvl w:ilvl="8" w:tentative="1">
+      <w:start w:val="1"/>
+      <w:numFmt w:val="bullet"/>
+      <w:lvlText w:val=""/>
+      <w:lvlJc w:val="left"/>
+      <w:pPr>
+        <w:tabs>
+          <w:tab w:val="num" w:pos="6480"/>
+        </w:tabs>
+        <w:ind w:left="6480" w:hanging="360"/>
+      </w:pPr>
+      <w:rPr>
+        <w:rFonts w:ascii="Wingdings" w:hAnsi="Wingdings" w:hint="default"/>
+        <w:sz w:val="20"/>
+      </w:rPr>
+    </w:lvl>
+  </w:abstractNum>
+  <w:abstractNum w:abstractNumId="4" w15:restartNumberingAfterBreak="0">
     <w:nsid w:val="44BF1291"/>
     <w:multiLevelType w:val="hybridMultilevel"/>
     <w:tmpl w:val="F97E0F68"/>
@@ -29306,7 +30351,7 @@
       </w:rPr>
     </w:lvl>
   </w:abstractNum>
-  <w:abstractNum w:abstractNumId="4" w15:restartNumberingAfterBreak="0">
+  <w:abstractNum w:abstractNumId="5" w15:restartNumberingAfterBreak="0">
     <w:nsid w:val="57313CB6"/>
     <w:multiLevelType w:val="hybridMultilevel"/>
     <w:tmpl w:val="7FDA4F68"/>
@@ -29392,7 +30437,7 @@
       </w:pPr>
     </w:lvl>
   </w:abstractNum>
-  <w:abstractNum w:abstractNumId="5" w15:restartNumberingAfterBreak="0">
+  <w:abstractNum w:abstractNumId="6" w15:restartNumberingAfterBreak="0">
     <w:nsid w:val="5D525599"/>
     <w:multiLevelType w:val="hybridMultilevel"/>
     <w:tmpl w:val="1B60AFBA"/>
@@ -29505,7 +30550,7 @@
       </w:rPr>
     </w:lvl>
   </w:abstractNum>
-  <w:abstractNum w:abstractNumId="6" w15:restartNumberingAfterBreak="0">
+  <w:abstractNum w:abstractNumId="7" w15:restartNumberingAfterBreak="0">
     <w:nsid w:val="66230B17"/>
     <w:multiLevelType w:val="hybridMultilevel"/>
     <w:tmpl w:val="3F062B98"/>
@@ -29618,7 +30663,7 @@
       </w:rPr>
     </w:lvl>
   </w:abstractNum>
-  <w:abstractNum w:abstractNumId="7" w15:restartNumberingAfterBreak="0">
+  <w:abstractNum w:abstractNumId="8" w15:restartNumberingAfterBreak="0">
     <w:nsid w:val="6CB36125"/>
     <w:multiLevelType w:val="hybridMultilevel"/>
     <w:tmpl w:val="47ACECFC"/>
@@ -29731,7 +30776,7 @@
       </w:rPr>
     </w:lvl>
   </w:abstractNum>
-  <w:abstractNum w:abstractNumId="8" w15:restartNumberingAfterBreak="0">
+  <w:abstractNum w:abstractNumId="9" w15:restartNumberingAfterBreak="0">
     <w:nsid w:val="6D982FAC"/>
     <w:multiLevelType w:val="hybridMultilevel"/>
     <w:tmpl w:val="0A70C7EA"/>
@@ -29844,11 +30889,160 @@
       </w:rPr>
     </w:lvl>
   </w:abstractNum>
+  <w:abstractNum w:abstractNumId="10" w15:restartNumberingAfterBreak="0">
+    <w:nsid w:val="78E2550D"/>
+    <w:multiLevelType w:val="multilevel"/>
+    <w:tmpl w:val="52645B1A"/>
+    <w:lvl w:ilvl="0">
+      <w:start w:val="1"/>
+      <w:numFmt w:val="bullet"/>
+      <w:lvlText w:val=""/>
+      <w:lvlJc w:val="left"/>
+      <w:pPr>
+        <w:tabs>
+          <w:tab w:val="num" w:pos="720"/>
+        </w:tabs>
+        <w:ind w:left="720" w:hanging="360"/>
+      </w:pPr>
+      <w:rPr>
+        <w:rFonts w:ascii="Symbol" w:hAnsi="Symbol" w:hint="default"/>
+        <w:sz w:val="20"/>
+      </w:rPr>
+    </w:lvl>
+    <w:lvl w:ilvl="1" w:tentative="1">
+      <w:start w:val="1"/>
+      <w:numFmt w:val="bullet"/>
+      <w:lvlText w:val="o"/>
+      <w:lvlJc w:val="left"/>
+      <w:pPr>
+        <w:tabs>
+          <w:tab w:val="num" w:pos="1440"/>
+        </w:tabs>
+        <w:ind w:left="1440" w:hanging="360"/>
+      </w:pPr>
+      <w:rPr>
+        <w:rFonts w:ascii="Courier New" w:hAnsi="Courier New" w:hint="default"/>
+        <w:sz w:val="20"/>
+      </w:rPr>
+    </w:lvl>
+    <w:lvl w:ilvl="2" w:tentative="1">
+      <w:start w:val="1"/>
+      <w:numFmt w:val="bullet"/>
+      <w:lvlText w:val=""/>
+      <w:lvlJc w:val="left"/>
+      <w:pPr>
+        <w:tabs>
+          <w:tab w:val="num" w:pos="2160"/>
+        </w:tabs>
+        <w:ind w:left="2160" w:hanging="360"/>
+      </w:pPr>
+      <w:rPr>
+        <w:rFonts w:ascii="Wingdings" w:hAnsi="Wingdings" w:hint="default"/>
+        <w:sz w:val="20"/>
+      </w:rPr>
+    </w:lvl>
+    <w:lvl w:ilvl="3" w:tentative="1">
+      <w:start w:val="1"/>
+      <w:numFmt w:val="bullet"/>
+      <w:lvlText w:val=""/>
+      <w:lvlJc w:val="left"/>
+      <w:pPr>
+        <w:tabs>
+          <w:tab w:val="num" w:pos="2880"/>
+        </w:tabs>
+        <w:ind w:left="2880" w:hanging="360"/>
+      </w:pPr>
+      <w:rPr>
+        <w:rFonts w:ascii="Wingdings" w:hAnsi="Wingdings" w:hint="default"/>
+        <w:sz w:val="20"/>
+      </w:rPr>
+    </w:lvl>
+    <w:lvl w:ilvl="4" w:tentative="1">
+      <w:start w:val="1"/>
+      <w:numFmt w:val="bullet"/>
+      <w:lvlText w:val=""/>
+      <w:lvlJc w:val="left"/>
+      <w:pPr>
+        <w:tabs>
+          <w:tab w:val="num" w:pos="3600"/>
+        </w:tabs>
+        <w:ind w:left="3600" w:hanging="360"/>
+      </w:pPr>
+      <w:rPr>
+        <w:rFonts w:ascii="Wingdings" w:hAnsi="Wingdings" w:hint="default"/>
+        <w:sz w:val="20"/>
+      </w:rPr>
+    </w:lvl>
+    <w:lvl w:ilvl="5" w:tentative="1">
+      <w:start w:val="1"/>
+      <w:numFmt w:val="bullet"/>
+      <w:lvlText w:val=""/>
+      <w:lvlJc w:val="left"/>
+      <w:pPr>
+        <w:tabs>
+          <w:tab w:val="num" w:pos="4320"/>
+        </w:tabs>
+        <w:ind w:left="4320" w:hanging="360"/>
+      </w:pPr>
+      <w:rPr>
+        <w:rFonts w:ascii="Wingdings" w:hAnsi="Wingdings" w:hint="default"/>
+        <w:sz w:val="20"/>
+      </w:rPr>
+    </w:lvl>
+    <w:lvl w:ilvl="6" w:tentative="1">
+      <w:start w:val="1"/>
+      <w:numFmt w:val="bullet"/>
+      <w:lvlText w:val=""/>
+      <w:lvlJc w:val="left"/>
+      <w:pPr>
+        <w:tabs>
+          <w:tab w:val="num" w:pos="5040"/>
+        </w:tabs>
+        <w:ind w:left="5040" w:hanging="360"/>
+      </w:pPr>
+      <w:rPr>
+        <w:rFonts w:ascii="Wingdings" w:hAnsi="Wingdings" w:hint="default"/>
+        <w:sz w:val="20"/>
+      </w:rPr>
+    </w:lvl>
+    <w:lvl w:ilvl="7" w:tentative="1">
+      <w:start w:val="1"/>
+      <w:numFmt w:val="bullet"/>
+      <w:lvlText w:val=""/>
+      <w:lvlJc w:val="left"/>
+      <w:pPr>
+        <w:tabs>
+          <w:tab w:val="num" w:pos="5760"/>
+        </w:tabs>
+        <w:ind w:left="5760" w:hanging="360"/>
+      </w:pPr>
+      <w:rPr>
+        <w:rFonts w:ascii="Wingdings" w:hAnsi="Wingdings" w:hint="default"/>
+        <w:sz w:val="20"/>
+      </w:rPr>
+    </w:lvl>
+    <w:lvl w:ilvl="8" w:tentative="1">
+      <w:start w:val="1"/>
+      <w:numFmt w:val="bullet"/>
+      <w:lvlText w:val=""/>
+      <w:lvlJc w:val="left"/>
+      <w:pPr>
+        <w:tabs>
+          <w:tab w:val="num" w:pos="6480"/>
+        </w:tabs>
+        <w:ind w:left="6480" w:hanging="360"/>
+      </w:pPr>
+      <w:rPr>
+        <w:rFonts w:ascii="Wingdings" w:hAnsi="Wingdings" w:hint="default"/>
+        <w:sz w:val="20"/>
+      </w:rPr>
+    </w:lvl>
+  </w:abstractNum>
   <w:num w:numId="1" w16cid:durableId="789907295">
-    <w:abstractNumId w:val="7"/>
+    <w:abstractNumId w:val="8"/>
   </w:num>
   <w:num w:numId="2" w16cid:durableId="1912694649">
-    <w:abstractNumId w:val="5"/>
+    <w:abstractNumId w:val="6"/>
   </w:num>
   <w:num w:numId="3" w16cid:durableId="2093620482">
     <w:abstractNumId w:val="0"/>
@@ -29860,16 +31054,22 @@
     <w:abstractNumId w:val="2"/>
   </w:num>
   <w:num w:numId="6" w16cid:durableId="1060136177">
-    <w:abstractNumId w:val="3"/>
+    <w:abstractNumId w:val="4"/>
   </w:num>
   <w:num w:numId="7" w16cid:durableId="1975480359">
-    <w:abstractNumId w:val="6"/>
+    <w:abstractNumId w:val="7"/>
   </w:num>
   <w:num w:numId="8" w16cid:durableId="612791505">
-    <w:abstractNumId w:val="4"/>
+    <w:abstractNumId w:val="5"/>
   </w:num>
   <w:num w:numId="9" w16cid:durableId="1634208837">
-    <w:abstractNumId w:val="8"/>
+    <w:abstractNumId w:val="9"/>
+  </w:num>
+  <w:num w:numId="10" w16cid:durableId="676884607">
+    <w:abstractNumId w:val="10"/>
+  </w:num>
+  <w:num w:numId="11" w16cid:durableId="2078672351">
+    <w:abstractNumId w:val="3"/>
   </w:num>
 </w:numbering>
 </file>
@@ -30484,7 +31684,6 @@
   <w:style w:type="character" w:default="1" w:styleId="Bekezdsalapbettpusa">
     <w:name w:val="Default Paragraph Font"/>
     <w:uiPriority w:val="1"/>
-    <w:semiHidden/>
     <w:unhideWhenUsed/>
   </w:style>
   <w:style w:type="table" w:default="1" w:styleId="Normltblzat">

</xml_diff>

<commit_message>
Starting to explain the abstract calculator class and its mechanics.
</commit_message>
<xml_diff>
--- a/Documentation.docx
+++ b/Documentation.docx
@@ -176,7 +176,7 @@
         </w:tc>
       </w:tr>
     </w:tbl>
-    <w:bookmarkStart w:id="0" w:name="_Toc218619912" w:displacedByCustomXml="next"/>
+    <w:bookmarkStart w:id="0" w:name="_Toc221883148" w:displacedByCustomXml="next"/>
     <w:sdt>
       <w:sdtPr>
         <w:rPr>
@@ -228,7 +228,7 @@
           <w:r>
             <w:fldChar w:fldCharType="separate"/>
           </w:r>
-          <w:hyperlink w:anchor="_Toc218619912" w:history="1">
+          <w:hyperlink w:anchor="_Toc221883148" w:history="1">
             <w:r>
               <w:rPr>
                 <w:rStyle w:val="Hiperhivatkozs"/>
@@ -255,7 +255,7 @@
                 <w:noProof/>
                 <w:webHidden/>
               </w:rPr>
-              <w:instrText xml:space="preserve"> PAGEREF _Toc218619912 \h </w:instrText>
+              <w:instrText xml:space="preserve"> PAGEREF _Toc221883148 \h </w:instrText>
             </w:r>
             <w:r>
               <w:rPr>
@@ -299,7 +299,7 @@
               <w:lang w:eastAsia="hu-HU"/>
             </w:rPr>
           </w:pPr>
-          <w:hyperlink w:anchor="_Toc218619913" w:history="1">
+          <w:hyperlink w:anchor="_Toc221883149" w:history="1">
             <w:r>
               <w:rPr>
                 <w:rStyle w:val="Hiperhivatkozs"/>
@@ -326,7 +326,7 @@
                 <w:noProof/>
                 <w:webHidden/>
               </w:rPr>
-              <w:instrText xml:space="preserve"> PAGEREF _Toc218619913 \h </w:instrText>
+              <w:instrText xml:space="preserve"> PAGEREF _Toc221883149 \h </w:instrText>
             </w:r>
             <w:r>
               <w:rPr>
@@ -370,7 +370,7 @@
               <w:lang w:eastAsia="hu-HU"/>
             </w:rPr>
           </w:pPr>
-          <w:hyperlink w:anchor="_Toc218619914" w:history="1">
+          <w:hyperlink w:anchor="_Toc221883150" w:history="1">
             <w:r>
               <w:rPr>
                 <w:rStyle w:val="Hiperhivatkozs"/>
@@ -397,7 +397,7 @@
                 <w:noProof/>
                 <w:webHidden/>
               </w:rPr>
-              <w:instrText xml:space="preserve"> PAGEREF _Toc218619914 \h </w:instrText>
+              <w:instrText xml:space="preserve"> PAGEREF _Toc221883150 \h </w:instrText>
             </w:r>
             <w:r>
               <w:rPr>
@@ -441,7 +441,7 @@
               <w:lang w:eastAsia="hu-HU"/>
             </w:rPr>
           </w:pPr>
-          <w:hyperlink w:anchor="_Toc218619915" w:history="1">
+          <w:hyperlink w:anchor="_Toc221883151" w:history="1">
             <w:r>
               <w:rPr>
                 <w:rStyle w:val="Hiperhivatkozs"/>
@@ -468,7 +468,7 @@
                 <w:noProof/>
                 <w:webHidden/>
               </w:rPr>
-              <w:instrText xml:space="preserve"> PAGEREF _Toc218619915 \h </w:instrText>
+              <w:instrText xml:space="preserve"> PAGEREF _Toc221883151 \h </w:instrText>
             </w:r>
             <w:r>
               <w:rPr>
@@ -512,7 +512,7 @@
               <w:lang w:eastAsia="hu-HU"/>
             </w:rPr>
           </w:pPr>
-          <w:hyperlink w:anchor="_Toc218619916" w:history="1">
+          <w:hyperlink w:anchor="_Toc221883152" w:history="1">
             <w:r>
               <w:rPr>
                 <w:rStyle w:val="Hiperhivatkozs"/>
@@ -539,7 +539,7 @@
                 <w:noProof/>
                 <w:webHidden/>
               </w:rPr>
-              <w:instrText xml:space="preserve"> PAGEREF _Toc218619916 \h </w:instrText>
+              <w:instrText xml:space="preserve"> PAGEREF _Toc221883152 \h </w:instrText>
             </w:r>
             <w:r>
               <w:rPr>
@@ -583,7 +583,7 @@
               <w:lang w:eastAsia="hu-HU"/>
             </w:rPr>
           </w:pPr>
-          <w:hyperlink w:anchor="_Toc218619917" w:history="1">
+          <w:hyperlink w:anchor="_Toc221883153" w:history="1">
             <w:r>
               <w:rPr>
                 <w:rStyle w:val="Hiperhivatkozs"/>
@@ -610,7 +610,7 @@
                 <w:noProof/>
                 <w:webHidden/>
               </w:rPr>
-              <w:instrText xml:space="preserve"> PAGEREF _Toc218619917 \h </w:instrText>
+              <w:instrText xml:space="preserve"> PAGEREF _Toc221883153 \h </w:instrText>
             </w:r>
             <w:r>
               <w:rPr>
@@ -654,7 +654,7 @@
               <w:lang w:eastAsia="hu-HU"/>
             </w:rPr>
           </w:pPr>
-          <w:hyperlink w:anchor="_Toc218619918" w:history="1">
+          <w:hyperlink w:anchor="_Toc221883154" w:history="1">
             <w:r>
               <w:rPr>
                 <w:rStyle w:val="Hiperhivatkozs"/>
@@ -681,7 +681,7 @@
                 <w:noProof/>
                 <w:webHidden/>
               </w:rPr>
-              <w:instrText xml:space="preserve"> PAGEREF _Toc218619918 \h </w:instrText>
+              <w:instrText xml:space="preserve"> PAGEREF _Toc221883154 \h </w:instrText>
             </w:r>
             <w:r>
               <w:rPr>
@@ -725,7 +725,7 @@
               <w:lang w:eastAsia="hu-HU"/>
             </w:rPr>
           </w:pPr>
-          <w:hyperlink w:anchor="_Toc218619919" w:history="1">
+          <w:hyperlink w:anchor="_Toc221883155" w:history="1">
             <w:r>
               <w:rPr>
                 <w:rStyle w:val="Hiperhivatkozs"/>
@@ -752,7 +752,7 @@
                 <w:noProof/>
                 <w:webHidden/>
               </w:rPr>
-              <w:instrText xml:space="preserve"> PAGEREF _Toc218619919 \h </w:instrText>
+              <w:instrText xml:space="preserve"> PAGEREF _Toc221883155 \h </w:instrText>
             </w:r>
             <w:r>
               <w:rPr>
@@ -796,7 +796,7 @@
               <w:lang w:eastAsia="hu-HU"/>
             </w:rPr>
           </w:pPr>
-          <w:hyperlink w:anchor="_Toc218619920" w:history="1">
+          <w:hyperlink w:anchor="_Toc221883156" w:history="1">
             <w:r>
               <w:rPr>
                 <w:rStyle w:val="Hiperhivatkozs"/>
@@ -823,7 +823,7 @@
                 <w:noProof/>
                 <w:webHidden/>
               </w:rPr>
-              <w:instrText xml:space="preserve"> PAGEREF _Toc218619920 \h </w:instrText>
+              <w:instrText xml:space="preserve"> PAGEREF _Toc221883156 \h </w:instrText>
             </w:r>
             <w:r>
               <w:rPr>
@@ -867,7 +867,7 @@
               <w:lang w:eastAsia="hu-HU"/>
             </w:rPr>
           </w:pPr>
-          <w:hyperlink w:anchor="_Toc218619921" w:history="1">
+          <w:hyperlink w:anchor="_Toc221883157" w:history="1">
             <w:r>
               <w:rPr>
                 <w:rStyle w:val="Hiperhivatkozs"/>
@@ -894,7 +894,7 @@
                 <w:noProof/>
                 <w:webHidden/>
               </w:rPr>
-              <w:instrText xml:space="preserve"> PAGEREF _Toc218619921 \h </w:instrText>
+              <w:instrText xml:space="preserve"> PAGEREF _Toc221883157 \h </w:instrText>
             </w:r>
             <w:r>
               <w:rPr>
@@ -938,7 +938,7 @@
               <w:lang w:eastAsia="hu-HU"/>
             </w:rPr>
           </w:pPr>
-          <w:hyperlink w:anchor="_Toc218619922" w:history="1">
+          <w:hyperlink w:anchor="_Toc221883158" w:history="1">
             <w:r>
               <w:rPr>
                 <w:rStyle w:val="Hiperhivatkozs"/>
@@ -965,7 +965,7 @@
                 <w:noProof/>
                 <w:webHidden/>
               </w:rPr>
-              <w:instrText xml:space="preserve"> PAGEREF _Toc218619922 \h </w:instrText>
+              <w:instrText xml:space="preserve"> PAGEREF _Toc221883158 \h </w:instrText>
             </w:r>
             <w:r>
               <w:rPr>
@@ -1009,7 +1009,7 @@
               <w:lang w:eastAsia="hu-HU"/>
             </w:rPr>
           </w:pPr>
-          <w:hyperlink w:anchor="_Toc218619923" w:history="1">
+          <w:hyperlink w:anchor="_Toc221883159" w:history="1">
             <w:r>
               <w:rPr>
                 <w:rStyle w:val="Hiperhivatkozs"/>
@@ -1036,7 +1036,7 @@
                 <w:noProof/>
                 <w:webHidden/>
               </w:rPr>
-              <w:instrText xml:space="preserve"> PAGEREF _Toc218619923 \h </w:instrText>
+              <w:instrText xml:space="preserve"> PAGEREF _Toc221883159 \h </w:instrText>
             </w:r>
             <w:r>
               <w:rPr>
@@ -1080,7 +1080,7 @@
               <w:lang w:eastAsia="hu-HU"/>
             </w:rPr>
           </w:pPr>
-          <w:hyperlink w:anchor="_Toc218619924" w:history="1">
+          <w:hyperlink w:anchor="_Toc221883160" w:history="1">
             <w:r>
               <w:rPr>
                 <w:rStyle w:val="Hiperhivatkozs"/>
@@ -1107,7 +1107,7 @@
                 <w:noProof/>
                 <w:webHidden/>
               </w:rPr>
-              <w:instrText xml:space="preserve"> PAGEREF _Toc218619924 \h </w:instrText>
+              <w:instrText xml:space="preserve"> PAGEREF _Toc221883160 \h </w:instrText>
             </w:r>
             <w:r>
               <w:rPr>
@@ -1151,7 +1151,7 @@
               <w:lang w:eastAsia="hu-HU"/>
             </w:rPr>
           </w:pPr>
-          <w:hyperlink w:anchor="_Toc218619925" w:history="1">
+          <w:hyperlink w:anchor="_Toc221883161" w:history="1">
             <w:r>
               <w:rPr>
                 <w:rStyle w:val="Hiperhivatkozs"/>
@@ -1178,7 +1178,7 @@
                 <w:noProof/>
                 <w:webHidden/>
               </w:rPr>
-              <w:instrText xml:space="preserve"> PAGEREF _Toc218619925 \h </w:instrText>
+              <w:instrText xml:space="preserve"> PAGEREF _Toc221883161 \h </w:instrText>
             </w:r>
             <w:r>
               <w:rPr>
@@ -1222,7 +1222,7 @@
               <w:lang w:eastAsia="hu-HU"/>
             </w:rPr>
           </w:pPr>
-          <w:hyperlink w:anchor="_Toc218619926" w:history="1">
+          <w:hyperlink w:anchor="_Toc221883162" w:history="1">
             <w:r>
               <w:rPr>
                 <w:rStyle w:val="Hiperhivatkozs"/>
@@ -1249,7 +1249,7 @@
                 <w:noProof/>
                 <w:webHidden/>
               </w:rPr>
-              <w:instrText xml:space="preserve"> PAGEREF _Toc218619926 \h </w:instrText>
+              <w:instrText xml:space="preserve"> PAGEREF _Toc221883162 \h </w:instrText>
             </w:r>
             <w:r>
               <w:rPr>
@@ -1269,7 +1269,7 @@
                 <w:noProof/>
                 <w:webHidden/>
               </w:rPr>
-              <w:t>9</w:t>
+              <w:t>11</w:t>
             </w:r>
             <w:r>
               <w:rPr>
@@ -1293,7 +1293,7 @@
               <w:lang w:eastAsia="hu-HU"/>
             </w:rPr>
           </w:pPr>
-          <w:hyperlink w:anchor="_Toc218619927" w:history="1">
+          <w:hyperlink w:anchor="_Toc221883163" w:history="1">
             <w:r>
               <w:rPr>
                 <w:rStyle w:val="Hiperhivatkozs"/>
@@ -1320,7 +1320,7 @@
                 <w:noProof/>
                 <w:webHidden/>
               </w:rPr>
-              <w:instrText xml:space="preserve"> PAGEREF _Toc218619927 \h </w:instrText>
+              <w:instrText xml:space="preserve"> PAGEREF _Toc221883163 \h </w:instrText>
             </w:r>
             <w:r>
               <w:rPr>
@@ -1340,7 +1340,7 @@
                 <w:noProof/>
                 <w:webHidden/>
               </w:rPr>
-              <w:t>9</w:t>
+              <w:t>12</w:t>
             </w:r>
             <w:r>
               <w:rPr>
@@ -1364,7 +1364,7 @@
               <w:lang w:eastAsia="hu-HU"/>
             </w:rPr>
           </w:pPr>
-          <w:hyperlink w:anchor="_Toc218619928" w:history="1">
+          <w:hyperlink w:anchor="_Toc221883164" w:history="1">
             <w:r>
               <w:rPr>
                 <w:rStyle w:val="Hiperhivatkozs"/>
@@ -1391,7 +1391,7 @@
                 <w:noProof/>
                 <w:webHidden/>
               </w:rPr>
-              <w:instrText xml:space="preserve"> PAGEREF _Toc218619928 \h </w:instrText>
+              <w:instrText xml:space="preserve"> PAGEREF _Toc221883164 \h </w:instrText>
             </w:r>
             <w:r>
               <w:rPr>
@@ -1411,7 +1411,7 @@
                 <w:noProof/>
                 <w:webHidden/>
               </w:rPr>
-              <w:t>10</w:t>
+              <w:t>14</w:t>
             </w:r>
             <w:r>
               <w:rPr>
@@ -1435,7 +1435,7 @@
               <w:lang w:eastAsia="hu-HU"/>
             </w:rPr>
           </w:pPr>
-          <w:hyperlink w:anchor="_Toc218619929" w:history="1">
+          <w:hyperlink w:anchor="_Toc221883165" w:history="1">
             <w:r>
               <w:rPr>
                 <w:rStyle w:val="Hiperhivatkozs"/>
@@ -1462,7 +1462,7 @@
                 <w:noProof/>
                 <w:webHidden/>
               </w:rPr>
-              <w:instrText xml:space="preserve"> PAGEREF _Toc218619929 \h </w:instrText>
+              <w:instrText xml:space="preserve"> PAGEREF _Toc221883165 \h </w:instrText>
             </w:r>
             <w:r>
               <w:rPr>
@@ -1482,7 +1482,7 @@
                 <w:noProof/>
                 <w:webHidden/>
               </w:rPr>
-              <w:t>11</w:t>
+              <w:t>14</w:t>
             </w:r>
             <w:r>
               <w:rPr>
@@ -1506,7 +1506,7 @@
               <w:lang w:eastAsia="hu-HU"/>
             </w:rPr>
           </w:pPr>
-          <w:hyperlink w:anchor="_Toc218619930" w:history="1">
+          <w:hyperlink w:anchor="_Toc221883166" w:history="1">
             <w:r>
               <w:rPr>
                 <w:rStyle w:val="Hiperhivatkozs"/>
@@ -1533,7 +1533,7 @@
                 <w:noProof/>
                 <w:webHidden/>
               </w:rPr>
-              <w:instrText xml:space="preserve"> PAGEREF _Toc218619930 \h </w:instrText>
+              <w:instrText xml:space="preserve"> PAGEREF _Toc221883166 \h </w:instrText>
             </w:r>
             <w:r>
               <w:rPr>
@@ -1553,7 +1553,7 @@
                 <w:noProof/>
                 <w:webHidden/>
               </w:rPr>
-              <w:t>11</w:t>
+              <w:t>22</w:t>
             </w:r>
             <w:r>
               <w:rPr>
@@ -1577,7 +1577,7 @@
               <w:lang w:eastAsia="hu-HU"/>
             </w:rPr>
           </w:pPr>
-          <w:hyperlink w:anchor="_Toc218619931" w:history="1">
+          <w:hyperlink w:anchor="_Toc221883167" w:history="1">
             <w:r>
               <w:rPr>
                 <w:rStyle w:val="Hiperhivatkozs"/>
@@ -1604,7 +1604,7 @@
                 <w:noProof/>
                 <w:webHidden/>
               </w:rPr>
-              <w:instrText xml:space="preserve"> PAGEREF _Toc218619931 \h </w:instrText>
+              <w:instrText xml:space="preserve"> PAGEREF _Toc221883167 \h </w:instrText>
             </w:r>
             <w:r>
               <w:rPr>
@@ -1624,7 +1624,7 @@
                 <w:noProof/>
                 <w:webHidden/>
               </w:rPr>
-              <w:t>11</w:t>
+              <w:t>22</w:t>
             </w:r>
             <w:r>
               <w:rPr>
@@ -1648,7 +1648,7 @@
               <w:lang w:eastAsia="hu-HU"/>
             </w:rPr>
           </w:pPr>
-          <w:hyperlink w:anchor="_Toc218619932" w:history="1">
+          <w:hyperlink w:anchor="_Toc221883168" w:history="1">
             <w:r>
               <w:rPr>
                 <w:rStyle w:val="Hiperhivatkozs"/>
@@ -1675,7 +1675,7 @@
                 <w:noProof/>
                 <w:webHidden/>
               </w:rPr>
-              <w:instrText xml:space="preserve"> PAGEREF _Toc218619932 \h </w:instrText>
+              <w:instrText xml:space="preserve"> PAGEREF _Toc221883168 \h </w:instrText>
             </w:r>
             <w:r>
               <w:rPr>
@@ -1695,7 +1695,7 @@
                 <w:noProof/>
                 <w:webHidden/>
               </w:rPr>
-              <w:t>11</w:t>
+              <w:t>23</w:t>
             </w:r>
             <w:r>
               <w:rPr>
@@ -1719,7 +1719,7 @@
               <w:lang w:eastAsia="hu-HU"/>
             </w:rPr>
           </w:pPr>
-          <w:hyperlink w:anchor="_Toc218619933" w:history="1">
+          <w:hyperlink w:anchor="_Toc221883169" w:history="1">
             <w:r>
               <w:rPr>
                 <w:rStyle w:val="Hiperhivatkozs"/>
@@ -1746,7 +1746,7 @@
                 <w:noProof/>
                 <w:webHidden/>
               </w:rPr>
-              <w:instrText xml:space="preserve"> PAGEREF _Toc218619933 \h </w:instrText>
+              <w:instrText xml:space="preserve"> PAGEREF _Toc221883169 \h </w:instrText>
             </w:r>
             <w:r>
               <w:rPr>
@@ -1766,7 +1766,7 @@
                 <w:noProof/>
                 <w:webHidden/>
               </w:rPr>
-              <w:t>11</w:t>
+              <w:t>23</w:t>
             </w:r>
             <w:r>
               <w:rPr>
@@ -1790,7 +1790,7 @@
               <w:lang w:eastAsia="hu-HU"/>
             </w:rPr>
           </w:pPr>
-          <w:hyperlink w:anchor="_Toc218619934" w:history="1">
+          <w:hyperlink w:anchor="_Toc221883170" w:history="1">
             <w:r>
               <w:rPr>
                 <w:rStyle w:val="Hiperhivatkozs"/>
@@ -1817,7 +1817,7 @@
                 <w:noProof/>
                 <w:webHidden/>
               </w:rPr>
-              <w:instrText xml:space="preserve"> PAGEREF _Toc218619934 \h </w:instrText>
+              <w:instrText xml:space="preserve"> PAGEREF _Toc221883170 \h </w:instrText>
             </w:r>
             <w:r>
               <w:rPr>
@@ -1837,7 +1837,7 @@
                 <w:noProof/>
                 <w:webHidden/>
               </w:rPr>
-              <w:t>11</w:t>
+              <w:t>23</w:t>
             </w:r>
             <w:r>
               <w:rPr>
@@ -1861,7 +1861,7 @@
               <w:lang w:eastAsia="hu-HU"/>
             </w:rPr>
           </w:pPr>
-          <w:hyperlink w:anchor="_Toc218619935" w:history="1">
+          <w:hyperlink w:anchor="_Toc221883171" w:history="1">
             <w:r>
               <w:rPr>
                 <w:rStyle w:val="Hiperhivatkozs"/>
@@ -1888,7 +1888,7 @@
                 <w:noProof/>
                 <w:webHidden/>
               </w:rPr>
-              <w:instrText xml:space="preserve"> PAGEREF _Toc218619935 \h </w:instrText>
+              <w:instrText xml:space="preserve"> PAGEREF _Toc221883171 \h </w:instrText>
             </w:r>
             <w:r>
               <w:rPr>
@@ -1908,7 +1908,7 @@
                 <w:noProof/>
                 <w:webHidden/>
               </w:rPr>
-              <w:t>11</w:t>
+              <w:t>23</w:t>
             </w:r>
             <w:r>
               <w:rPr>
@@ -1932,7 +1932,7 @@
               <w:lang w:eastAsia="hu-HU"/>
             </w:rPr>
           </w:pPr>
-          <w:hyperlink w:anchor="_Toc218619936" w:history="1">
+          <w:hyperlink w:anchor="_Toc221883172" w:history="1">
             <w:r>
               <w:rPr>
                 <w:rStyle w:val="Hiperhivatkozs"/>
@@ -1959,7 +1959,7 @@
                 <w:noProof/>
                 <w:webHidden/>
               </w:rPr>
-              <w:instrText xml:space="preserve"> PAGEREF _Toc218619936 \h </w:instrText>
+              <w:instrText xml:space="preserve"> PAGEREF _Toc221883172 \h </w:instrText>
             </w:r>
             <w:r>
               <w:rPr>
@@ -1979,7 +1979,7 @@
                 <w:noProof/>
                 <w:webHidden/>
               </w:rPr>
-              <w:t>11</w:t>
+              <w:t>23</w:t>
             </w:r>
             <w:r>
               <w:rPr>
@@ -2003,7 +2003,7 @@
               <w:lang w:eastAsia="hu-HU"/>
             </w:rPr>
           </w:pPr>
-          <w:hyperlink w:anchor="_Toc218619937" w:history="1">
+          <w:hyperlink w:anchor="_Toc221883173" w:history="1">
             <w:r>
               <w:rPr>
                 <w:rStyle w:val="Hiperhivatkozs"/>
@@ -2030,7 +2030,7 @@
                 <w:noProof/>
                 <w:webHidden/>
               </w:rPr>
-              <w:instrText xml:space="preserve"> PAGEREF _Toc218619937 \h </w:instrText>
+              <w:instrText xml:space="preserve"> PAGEREF _Toc221883173 \h </w:instrText>
             </w:r>
             <w:r>
               <w:rPr>
@@ -2050,7 +2050,7 @@
                 <w:noProof/>
                 <w:webHidden/>
               </w:rPr>
-              <w:t>11</w:t>
+              <w:t>23</w:t>
             </w:r>
             <w:r>
               <w:rPr>
@@ -2074,7 +2074,7 @@
               <w:lang w:eastAsia="hu-HU"/>
             </w:rPr>
           </w:pPr>
-          <w:hyperlink w:anchor="_Toc218619938" w:history="1">
+          <w:hyperlink w:anchor="_Toc221883174" w:history="1">
             <w:r>
               <w:rPr>
                 <w:rStyle w:val="Hiperhivatkozs"/>
@@ -2101,7 +2101,7 @@
                 <w:noProof/>
                 <w:webHidden/>
               </w:rPr>
-              <w:instrText xml:space="preserve"> PAGEREF _Toc218619938 \h </w:instrText>
+              <w:instrText xml:space="preserve"> PAGEREF _Toc221883174 \h </w:instrText>
             </w:r>
             <w:r>
               <w:rPr>
@@ -2121,7 +2121,7 @@
                 <w:noProof/>
                 <w:webHidden/>
               </w:rPr>
-              <w:t>11</w:t>
+              <w:t>23</w:t>
             </w:r>
             <w:r>
               <w:rPr>
@@ -2145,7 +2145,7 @@
               <w:lang w:eastAsia="hu-HU"/>
             </w:rPr>
           </w:pPr>
-          <w:hyperlink w:anchor="_Toc218619939" w:history="1">
+          <w:hyperlink w:anchor="_Toc221883175" w:history="1">
             <w:r>
               <w:rPr>
                 <w:rStyle w:val="Hiperhivatkozs"/>
@@ -2172,7 +2172,7 @@
                 <w:noProof/>
                 <w:webHidden/>
               </w:rPr>
-              <w:instrText xml:space="preserve"> PAGEREF _Toc218619939 \h </w:instrText>
+              <w:instrText xml:space="preserve"> PAGEREF _Toc221883175 \h </w:instrText>
             </w:r>
             <w:r>
               <w:rPr>
@@ -2192,7 +2192,7 @@
                 <w:noProof/>
                 <w:webHidden/>
               </w:rPr>
-              <w:t>11</w:t>
+              <w:t>23</w:t>
             </w:r>
             <w:r>
               <w:rPr>
@@ -2216,7 +2216,7 @@
               <w:lang w:eastAsia="hu-HU"/>
             </w:rPr>
           </w:pPr>
-          <w:hyperlink w:anchor="_Toc218619940" w:history="1">
+          <w:hyperlink w:anchor="_Toc221883176" w:history="1">
             <w:r>
               <w:rPr>
                 <w:rStyle w:val="Hiperhivatkozs"/>
@@ -2243,7 +2243,7 @@
                 <w:noProof/>
                 <w:webHidden/>
               </w:rPr>
-              <w:instrText xml:space="preserve"> PAGEREF _Toc218619940 \h </w:instrText>
+              <w:instrText xml:space="preserve"> PAGEREF _Toc221883176 \h </w:instrText>
             </w:r>
             <w:r>
               <w:rPr>
@@ -2263,7 +2263,7 @@
                 <w:noProof/>
                 <w:webHidden/>
               </w:rPr>
-              <w:t>11</w:t>
+              <w:t>23</w:t>
             </w:r>
             <w:r>
               <w:rPr>
@@ -2287,7 +2287,7 @@
               <w:lang w:eastAsia="hu-HU"/>
             </w:rPr>
           </w:pPr>
-          <w:hyperlink w:anchor="_Toc218619941" w:history="1">
+          <w:hyperlink w:anchor="_Toc221883177" w:history="1">
             <w:r>
               <w:rPr>
                 <w:rStyle w:val="Hiperhivatkozs"/>
@@ -2314,7 +2314,7 @@
                 <w:noProof/>
                 <w:webHidden/>
               </w:rPr>
-              <w:instrText xml:space="preserve"> PAGEREF _Toc218619941 \h </w:instrText>
+              <w:instrText xml:space="preserve"> PAGEREF _Toc221883177 \h </w:instrText>
             </w:r>
             <w:r>
               <w:rPr>
@@ -2334,7 +2334,7 @@
                 <w:noProof/>
                 <w:webHidden/>
               </w:rPr>
-              <w:t>11</w:t>
+              <w:t>23</w:t>
             </w:r>
             <w:r>
               <w:rPr>
@@ -2358,7 +2358,7 @@
               <w:lang w:eastAsia="hu-HU"/>
             </w:rPr>
           </w:pPr>
-          <w:hyperlink w:anchor="_Toc218619942" w:history="1">
+          <w:hyperlink w:anchor="_Toc221883178" w:history="1">
             <w:r>
               <w:rPr>
                 <w:rStyle w:val="Hiperhivatkozs"/>
@@ -2385,7 +2385,7 @@
                 <w:noProof/>
                 <w:webHidden/>
               </w:rPr>
-              <w:instrText xml:space="preserve"> PAGEREF _Toc218619942 \h </w:instrText>
+              <w:instrText xml:space="preserve"> PAGEREF _Toc221883178 \h </w:instrText>
             </w:r>
             <w:r>
               <w:rPr>
@@ -2405,7 +2405,7 @@
                 <w:noProof/>
                 <w:webHidden/>
               </w:rPr>
-              <w:t>11</w:t>
+              <w:t>23</w:t>
             </w:r>
             <w:r>
               <w:rPr>
@@ -2436,7 +2436,7 @@
       <w:pPr>
         <w:pStyle w:val="Cmsor1"/>
       </w:pPr>
-      <w:bookmarkStart w:id="1" w:name="_Toc218619913"/>
+      <w:bookmarkStart w:id="1" w:name="_Toc221883149"/>
       <w:r>
         <w:lastRenderedPageBreak/>
         <w:t>Bevezető</w:t>
@@ -2533,7 +2533,7 @@
       <w:pPr>
         <w:pStyle w:val="Cmsor2"/>
       </w:pPr>
-      <w:bookmarkStart w:id="2" w:name="_Toc218619914"/>
+      <w:bookmarkStart w:id="2" w:name="_Toc221883150"/>
       <w:r>
         <w:t>Probléma felvetés</w:t>
       </w:r>
@@ -2546,7 +2546,7 @@
       <w:pPr>
         <w:pStyle w:val="Cmsor3"/>
       </w:pPr>
-      <w:bookmarkStart w:id="3" w:name="_Toc218619915"/>
+      <w:bookmarkStart w:id="3" w:name="_Toc221883151"/>
       <w:r>
         <w:t>Bináris számrendszer</w:t>
       </w:r>
@@ -3358,7 +3358,7 @@
       <w:pPr>
         <w:pStyle w:val="Cmsor3"/>
       </w:pPr>
-      <w:bookmarkStart w:id="4" w:name="_Toc218619916"/>
+      <w:bookmarkStart w:id="4" w:name="_Toc221883152"/>
       <w:r>
         <w:t>Lebegőpontos számábrázolás</w:t>
       </w:r>
@@ -3477,7 +3477,7 @@
       <w:pPr>
         <w:pStyle w:val="Cmsor3"/>
       </w:pPr>
-      <w:bookmarkStart w:id="5" w:name="_Toc218619917"/>
+      <w:bookmarkStart w:id="5" w:name="_Toc221883153"/>
       <w:r>
         <w:t>Implementációk</w:t>
       </w:r>
@@ -3783,7 +3783,7 @@
           <w:rFonts w:eastAsiaTheme="minorEastAsia"/>
         </w:rPr>
       </w:pPr>
-      <w:bookmarkStart w:id="6" w:name="_Toc218619918"/>
+      <w:bookmarkStart w:id="6" w:name="_Toc221883154"/>
       <w:r>
         <w:rPr>
           <w:rFonts w:eastAsiaTheme="minorEastAsia"/>
@@ -3815,7 +3815,7 @@
       <w:pPr>
         <w:pStyle w:val="Cmsor2"/>
       </w:pPr>
-      <w:bookmarkStart w:id="7" w:name="_Toc218619919"/>
+      <w:bookmarkStart w:id="7" w:name="_Toc221883155"/>
       <w:r>
         <w:t>Megoldás megközelítése</w:t>
       </w:r>
@@ -3825,7 +3825,7 @@
       <w:pPr>
         <w:pStyle w:val="Cmsor3"/>
       </w:pPr>
-      <w:bookmarkStart w:id="8" w:name="_Toc218619920"/>
+      <w:bookmarkStart w:id="8" w:name="_Toc221883156"/>
       <w:r>
         <w:t>BCD számábrázolás</w:t>
       </w:r>
@@ -3857,7 +3857,15 @@
         <w:jc w:val="center"/>
       </w:pPr>
       <w:r>
-        <w:t>&lt;kép egy 0-nál kisebb számról ami rövidebb mint a fractionLength&gt;</w:t>
+        <w:t xml:space="preserve">&lt;kép egy 0-nál kisebb számról ami rövidebb mint a </w:t>
+      </w:r>
+      <w:proofErr w:type="spellStart"/>
+      <w:r>
+        <w:t>fractionLength</w:t>
+      </w:r>
+      <w:proofErr w:type="spellEnd"/>
+      <w:r>
+        <w:t>&gt;</w:t>
       </w:r>
     </w:p>
     <w:p>
@@ -3869,7 +3877,7 @@
       <w:pPr>
         <w:pStyle w:val="Cmsor3"/>
       </w:pPr>
-      <w:bookmarkStart w:id="9" w:name="_Toc218619921"/>
+      <w:bookmarkStart w:id="9" w:name="_Toc221883157"/>
       <w:r>
         <w:t>Előnyök és hátrányok</w:t>
       </w:r>
@@ -4068,7 +4076,7 @@
       <w:pPr>
         <w:pStyle w:val="Cmsor1"/>
       </w:pPr>
-      <w:bookmarkStart w:id="10" w:name="_Toc218619922"/>
+      <w:bookmarkStart w:id="10" w:name="_Toc221883158"/>
       <w:r>
         <w:lastRenderedPageBreak/>
         <w:t>Fejlesztői dokumentáció</w:t>
@@ -4079,7 +4087,7 @@
       <w:pPr>
         <w:pStyle w:val="Cmsor2"/>
       </w:pPr>
-      <w:bookmarkStart w:id="11" w:name="_Toc218619923"/>
+      <w:bookmarkStart w:id="11" w:name="_Toc221883159"/>
       <w:r>
         <w:t>Számtípusok m</w:t>
       </w:r>
@@ -4095,7 +4103,7 @@
       <w:pPr>
         <w:pStyle w:val="Cmsor3"/>
       </w:pPr>
-      <w:bookmarkStart w:id="12" w:name="_Toc218619924"/>
+      <w:bookmarkStart w:id="12" w:name="_Toc221883160"/>
       <w:r>
         <w:t>Számjegy típus (Digit)</w:t>
       </w:r>
@@ -4345,7 +4353,7 @@
       <w:pPr>
         <w:pStyle w:val="Cmsor3"/>
       </w:pPr>
-      <w:bookmarkStart w:id="13" w:name="_Toc218619925"/>
+      <w:bookmarkStart w:id="13" w:name="_Toc221883161"/>
       <w:r>
         <w:t>Természetes szám típus (Natural)</w:t>
       </w:r>
@@ -4382,8 +4390,13 @@
         <w:t>long</w:t>
       </w:r>
       <w:r>
-        <w:t xml:space="preserve"> long</w:t>
-      </w:r>
+        <w:t xml:space="preserve"> </w:t>
+      </w:r>
+      <w:proofErr w:type="spellStart"/>
+      <w:r>
+        <w:t>long</w:t>
+      </w:r>
+      <w:proofErr w:type="spellEnd"/>
       <w:r>
         <w:t xml:space="preserve"> számtípus</w:t>
       </w:r>
@@ -4750,7 +4763,6 @@
       </w:r>
     </w:p>
     <w:p>
-      <w:bookmarkStart w:id="14" w:name="_Toc218619926"/>
       <w:r>
         <w:t>Érdemes még pár szót ejteni a hatványozás és a gyökvonás megvalósításáról, ugyanis ezen értékek számítási technikája eltér az iskolában tanult módszerekétől.</w:t>
       </w:r>
@@ -5888,12 +5900,20 @@
         <w:rPr>
           <w:rFonts w:eastAsiaTheme="minorEastAsia"/>
         </w:rPr>
-        <w:t>François Viète</w:t>
-      </w:r>
+        <w:t xml:space="preserve">François </w:t>
+      </w:r>
+      <w:proofErr w:type="spellStart"/>
       <w:r>
         <w:rPr>
           <w:rFonts w:eastAsiaTheme="minorEastAsia"/>
         </w:rPr>
+        <w:t>Viète</w:t>
+      </w:r>
+      <w:proofErr w:type="spellEnd"/>
+      <w:r>
+        <w:rPr>
+          <w:rFonts w:eastAsiaTheme="minorEastAsia"/>
+        </w:rPr>
         <w:t>, híres matematikus</w:t>
       </w:r>
       <w:r>
@@ -5930,7 +5950,21 @@
         <w:rPr>
           <w:rFonts w:eastAsiaTheme="minorEastAsia"/>
         </w:rPr>
-        <w:t xml:space="preserve">amit Viète </w:t>
+        <w:t xml:space="preserve">amit </w:t>
+      </w:r>
+      <w:proofErr w:type="spellStart"/>
+      <w:r>
+        <w:rPr>
+          <w:rFonts w:eastAsiaTheme="minorEastAsia"/>
+        </w:rPr>
+        <w:t>Viète</w:t>
+      </w:r>
+      <w:proofErr w:type="spellEnd"/>
+      <w:r>
+        <w:rPr>
+          <w:rFonts w:eastAsiaTheme="minorEastAsia"/>
+        </w:rPr>
+        <w:t xml:space="preserve"> </w:t>
       </w:r>
       <w:r>
         <w:rPr>
@@ -7158,7 +7192,15 @@
     </w:p>
     <w:p>
       <w:r>
-        <w:t xml:space="preserve">Egyszerűbben úgy tudnánk elképzelni a fenti számítást, mint a kézi osztás (long division) műveletsorát. Itt is a legnagyobb helyiértékű számjegytől kezdve folyamatosan alulról közelítjük az eredményünket a valós értékhez. </w:t>
+        <w:t xml:space="preserve">Egyszerűbben úgy tudnánk elképzelni a fenti számítást, mint a kézi osztás (long </w:t>
+      </w:r>
+      <w:proofErr w:type="spellStart"/>
+      <w:r>
+        <w:t>division</w:t>
+      </w:r>
+      <w:proofErr w:type="spellEnd"/>
+      <w:r>
+        <w:t xml:space="preserve">) műveletsorát. Itt is a legnagyobb helyiértékű számjegytől kezdve folyamatosan alulról közelítjük az eredményünket a valós értékhez. </w:t>
       </w:r>
       <w:r>
         <w:t>Éppen</w:t>
@@ -7171,6 +7213,7 @@
       <w:pPr>
         <w:pStyle w:val="Cmsor3"/>
       </w:pPr>
+      <w:bookmarkStart w:id="14" w:name="_Toc221883162"/>
       <w:r>
         <w:t>Egész szám típus (Integer)</w:t>
       </w:r>
@@ -7502,7 +7545,7 @@
       <w:pPr>
         <w:pStyle w:val="Cmsor3"/>
       </w:pPr>
-      <w:bookmarkStart w:id="15" w:name="_Toc218619927"/>
+      <w:bookmarkStart w:id="15" w:name="_Toc221883163"/>
       <w:r>
         <w:t>Pozitív szám típus (Positive)</w:t>
       </w:r>
@@ -8183,7 +8226,7 @@
       <w:pPr>
         <w:pStyle w:val="Cmsor3"/>
       </w:pPr>
-      <w:bookmarkStart w:id="16" w:name="_Toc218619928"/>
+      <w:bookmarkStart w:id="16" w:name="_Toc221883164"/>
       <w:r>
         <w:t>Leírható</w:t>
       </w:r>
@@ -8603,7 +8646,7 @@
       <w:pPr>
         <w:pStyle w:val="Cmsor3"/>
       </w:pPr>
-      <w:bookmarkStart w:id="17" w:name="_Toc218619929"/>
+      <w:bookmarkStart w:id="17" w:name="_Toc221883165"/>
       <w:r>
         <w:t>Racionális szám típus (Rational)</w:t>
       </w:r>
@@ -9581,34 +9624,109 @@
           <w:rFonts w:eastAsiaTheme="minorEastAsia"/>
           <w:iCs/>
         </w:rPr>
-        <w:t xml:space="preserve"> (binary splitting</w:t>
-      </w:r>
+        <w:t xml:space="preserve"> (</w:t>
+      </w:r>
+      <w:proofErr w:type="spellStart"/>
       <w:r>
         <w:rPr>
           <w:rFonts w:eastAsiaTheme="minorEastAsia"/>
           <w:iCs/>
         </w:rPr>
-        <w:t xml:space="preserve">, másnéven </w:t>
-      </w:r>
+        <w:t>binary</w:t>
+      </w:r>
+      <w:proofErr w:type="spellEnd"/>
       <w:r>
         <w:rPr>
           <w:rFonts w:eastAsiaTheme="minorEastAsia"/>
           <w:iCs/>
         </w:rPr>
-        <w:t>divide-and-conquer summation</w:t>
-      </w:r>
+        <w:t xml:space="preserve"> </w:t>
+      </w:r>
+      <w:proofErr w:type="spellStart"/>
       <w:r>
         <w:rPr>
           <w:rFonts w:eastAsiaTheme="minorEastAsia"/>
           <w:iCs/>
         </w:rPr>
-        <w:t xml:space="preserve">/product </w:t>
-      </w:r>
+        <w:t>splitting</w:t>
+      </w:r>
+      <w:proofErr w:type="spellEnd"/>
       <w:r>
         <w:rPr>
           <w:rFonts w:eastAsiaTheme="minorEastAsia"/>
           <w:iCs/>
         </w:rPr>
+        <w:t xml:space="preserve">, másnéven </w:t>
+      </w:r>
+      <w:proofErr w:type="spellStart"/>
+      <w:r>
+        <w:rPr>
+          <w:rFonts w:eastAsiaTheme="minorEastAsia"/>
+          <w:iCs/>
+        </w:rPr>
+        <w:t>divide</w:t>
+      </w:r>
+      <w:proofErr w:type="spellEnd"/>
+      <w:r>
+        <w:rPr>
+          <w:rFonts w:eastAsiaTheme="minorEastAsia"/>
+          <w:iCs/>
+        </w:rPr>
+        <w:t>-and-</w:t>
+      </w:r>
+      <w:proofErr w:type="spellStart"/>
+      <w:r>
+        <w:rPr>
+          <w:rFonts w:eastAsiaTheme="minorEastAsia"/>
+          <w:iCs/>
+        </w:rPr>
+        <w:t>conquer</w:t>
+      </w:r>
+      <w:proofErr w:type="spellEnd"/>
+      <w:r>
+        <w:rPr>
+          <w:rFonts w:eastAsiaTheme="minorEastAsia"/>
+          <w:iCs/>
+        </w:rPr>
+        <w:t xml:space="preserve"> </w:t>
+      </w:r>
+      <w:proofErr w:type="spellStart"/>
+      <w:r>
+        <w:rPr>
+          <w:rFonts w:eastAsiaTheme="minorEastAsia"/>
+          <w:iCs/>
+        </w:rPr>
+        <w:t>summation</w:t>
+      </w:r>
+      <w:proofErr w:type="spellEnd"/>
+      <w:r>
+        <w:rPr>
+          <w:rFonts w:eastAsiaTheme="minorEastAsia"/>
+          <w:iCs/>
+        </w:rPr>
+        <w:t>/</w:t>
+      </w:r>
+      <w:proofErr w:type="spellStart"/>
+      <w:r>
+        <w:rPr>
+          <w:rFonts w:eastAsiaTheme="minorEastAsia"/>
+          <w:iCs/>
+        </w:rPr>
+        <w:t>product</w:t>
+      </w:r>
+      <w:proofErr w:type="spellEnd"/>
+      <w:r>
+        <w:rPr>
+          <w:rFonts w:eastAsiaTheme="minorEastAsia"/>
+          <w:iCs/>
+        </w:rPr>
+        <w:t xml:space="preserve"> </w:t>
+      </w:r>
+      <w:r>
+        <w:rPr>
+          <w:rFonts w:eastAsiaTheme="minorEastAsia"/>
+          <w:iCs/>
+        </w:rPr>
         <w:lastRenderedPageBreak/>
         <w:t xml:space="preserve">vagy </w:t>
       </w:r>
@@ -9617,8 +9735,17 @@
           <w:rFonts w:eastAsiaTheme="minorEastAsia"/>
           <w:iCs/>
         </w:rPr>
-        <w:t>prefix product</w:t>
-      </w:r>
+        <w:t xml:space="preserve">prefix </w:t>
+      </w:r>
+      <w:proofErr w:type="spellStart"/>
+      <w:r>
+        <w:rPr>
+          <w:rFonts w:eastAsiaTheme="minorEastAsia"/>
+          <w:iCs/>
+        </w:rPr>
+        <w:t>product</w:t>
+      </w:r>
+      <w:proofErr w:type="spellEnd"/>
       <w:r>
         <w:rPr>
           <w:rFonts w:eastAsiaTheme="minorEastAsia"/>
@@ -19111,13 +19238,15 @@
         </w:rPr>
         <w:t xml:space="preserve"> </w:t>
       </w:r>
+      <w:proofErr w:type="spellStart"/>
       <w:r>
         <w:rPr>
           <w:rFonts w:eastAsiaTheme="minorEastAsia"/>
           <w:iCs/>
         </w:rPr>
-        <w:t>Srinivasa Ramanujan</w:t>
-      </w:r>
+        <w:t>Srinivasa</w:t>
+      </w:r>
+      <w:proofErr w:type="spellEnd"/>
       <w:r>
         <w:rPr>
           <w:rFonts w:eastAsiaTheme="minorEastAsia"/>
@@ -19125,26 +19254,58 @@
         </w:rPr>
         <w:t xml:space="preserve"> </w:t>
       </w:r>
+      <w:proofErr w:type="spellStart"/>
       <w:r>
         <w:rPr>
           <w:rFonts w:eastAsiaTheme="minorEastAsia"/>
           <w:iCs/>
         </w:rPr>
-        <w:t>inspirált</w:t>
-      </w:r>
+        <w:t>Ramanujan</w:t>
+      </w:r>
+      <w:proofErr w:type="spellEnd"/>
       <w:r>
         <w:rPr>
           <w:rFonts w:eastAsiaTheme="minorEastAsia"/>
           <w:iCs/>
         </w:rPr>
-        <w:t>a</w:t>
+        <w:t xml:space="preserve"> </w:t>
       </w:r>
       <w:r>
         <w:rPr>
           <w:rFonts w:eastAsiaTheme="minorEastAsia"/>
           <w:iCs/>
         </w:rPr>
-        <w:t>, Chudnovsky fivérek</w:t>
+        <w:t>inspirált</w:t>
+      </w:r>
+      <w:r>
+        <w:rPr>
+          <w:rFonts w:eastAsiaTheme="minorEastAsia"/>
+          <w:iCs/>
+        </w:rPr>
+        <w:t>a</w:t>
+      </w:r>
+      <w:r>
+        <w:rPr>
+          <w:rFonts w:eastAsiaTheme="minorEastAsia"/>
+          <w:iCs/>
+        </w:rPr>
+        <w:t xml:space="preserve">, </w:t>
+      </w:r>
+      <w:proofErr w:type="spellStart"/>
+      <w:r>
+        <w:rPr>
+          <w:rFonts w:eastAsiaTheme="minorEastAsia"/>
+          <w:iCs/>
+        </w:rPr>
+        <w:t>Chudnovsky</w:t>
+      </w:r>
+      <w:proofErr w:type="spellEnd"/>
+      <w:r>
+        <w:rPr>
+          <w:rFonts w:eastAsiaTheme="minorEastAsia"/>
+          <w:iCs/>
+        </w:rPr>
+        <w:t xml:space="preserve"> fivérek</w:t>
       </w:r>
       <w:r>
         <w:rPr>
@@ -27798,12 +27959,21 @@
           <w:iCs/>
         </w:rPr>
       </w:pPr>
+      <w:proofErr w:type="spellStart"/>
       <w:r>
         <w:rPr>
           <w:rFonts w:eastAsiaTheme="minorEastAsia"/>
           <w:iCs/>
         </w:rPr>
-        <w:t>Leonhard Euler bizonyította, hogy ez az érték kifejezhető a következő végtelen sor használatával:</w:t>
+        <w:t>Leonhard</w:t>
+      </w:r>
+      <w:proofErr w:type="spellEnd"/>
+      <w:r>
+        <w:rPr>
+          <w:rFonts w:eastAsiaTheme="minorEastAsia"/>
+          <w:iCs/>
+        </w:rPr>
+        <w:t xml:space="preserve"> Euler bizonyította, hogy ez az érték kifejezhető a következő végtelen sor használatával:</w:t>
       </w:r>
     </w:p>
     <w:p>
@@ -28423,7 +28593,7 @@
       <w:pPr>
         <w:pStyle w:val="Cmsor2"/>
       </w:pPr>
-      <w:bookmarkStart w:id="18" w:name="_Toc218619930"/>
+      <w:bookmarkStart w:id="18" w:name="_Toc221883166"/>
       <w:r>
         <w:lastRenderedPageBreak/>
         <w:t>Számológép megvalósítása</w:t>
@@ -28452,7 +28622,7 @@
       <w:pPr>
         <w:pStyle w:val="Cmsor3"/>
       </w:pPr>
-      <w:bookmarkStart w:id="19" w:name="_Toc218619931"/>
+      <w:bookmarkStart w:id="19" w:name="_Toc221883167"/>
       <w:r>
         <w:t>Parser</w:t>
       </w:r>
@@ -28463,7 +28633,15 @@
         <w:t>Ez a részleg felelős a szöveg feldarabolásáért.</w:t>
       </w:r>
       <w:r>
-        <w:t xml:space="preserve"> Hogy a parser tudja, milyen formájú egységekre kell felbontani a szöveget, minden egyes számológép egy reguláris kifejezésekből álló (Regex) listát tart fent magán belül. Ez a rendszer a leghosszabb illeszkedés elvét követi, miszerint </w:t>
+        <w:t xml:space="preserve"> Hogy a parser tudja, milyen formájú egységekre kell felbontani a szöveget, minden egyes számológép egy reguláris kifejezésekből álló (</w:t>
+      </w:r>
+      <w:proofErr w:type="spellStart"/>
+      <w:r>
+        <w:t>Regex</w:t>
+      </w:r>
+      <w:proofErr w:type="spellEnd"/>
+      <w:r>
+        <w:t xml:space="preserve">) listát tart fent magán belül. Ez a rendszer a leghosszabb illeszkedés elvét követi, miszerint </w:t>
       </w:r>
       <w:r>
         <w:t>a következő vágást a sor elejétől számított leghosszabban a karaktersorozatra illeszkedő szakasz végén kell megejteni.</w:t>
@@ -28616,7 +28794,13 @@
         </w:numPr>
       </w:pPr>
       <w:r>
-        <w:t>Hogy a lehető legkevesebb munkát kelljen elvégezni és ne kelljen minden alkalommal végig nézni az összes reguláris kifejezést, használjuk az első felismert kifejezést. Viszont akkor úgy kell sorba állítanunk a kifejezések prioritását, hogy minél specifikusabb egy kifejezés, annál előrébb álljon. Ez azért fontos, hogy nehogy egy hasonló, de általánosabb kifejezés teljesen leárnyékolja.</w:t>
+        <w:t xml:space="preserve">Hogy a lehető legkevesebb munkát kelljen elvégezni és ne kelljen minden alkalommal végig nézni az összes reguláris kifejezést, használjuk az első felismert kifejezést. Viszont akkor úgy kell sorba állítanunk a </w:t>
+      </w:r>
+      <w:r>
+        <w:t>lista</w:t>
+      </w:r>
+      <w:r>
+        <w:t xml:space="preserve"> prioritását, hogy minél specifikusabb egy kifejezés, annál előrébb álljon. Ez azért fontos, hogy nehogy egy hasonló, de általánosabb kifejezés teljesen leárnyékolja.</w:t>
       </w:r>
     </w:p>
     <w:p>
@@ -28631,9 +28815,688 @@
       <w:pPr>
         <w:pStyle w:val="Cmsor3"/>
       </w:pPr>
-      <w:bookmarkStart w:id="20" w:name="_Toc218619932"/>
-      <w:r>
-        <w:t>Általános számológép (Standard)</w:t>
+      <w:r>
+        <w:t>Absztrakt számológép (</w:t>
+      </w:r>
+      <w:proofErr w:type="spellStart"/>
+      <w:r>
+        <w:t>Calculator</w:t>
+      </w:r>
+      <w:proofErr w:type="spellEnd"/>
+      <w:r>
+        <w:t>)</w:t>
+      </w:r>
+    </w:p>
+    <w:p>
+      <w:r>
+        <w:t>Említettük, hogy a reguláris kifejezéseket tartó lista tárolását rábíztuk a számológépre. Ez nekünk azért lesz kényelmes, mivel ez a szerkezet lehetőséget nyit különböző típusú számológépek egyszerű létrehozására.</w:t>
+      </w:r>
+      <w:r>
+        <w:t xml:space="preserve"> Ezt</w:t>
+      </w:r>
+      <w:r>
+        <w:t xml:space="preserve"> a könnyedséget</w:t>
+      </w:r>
+      <w:r>
+        <w:t xml:space="preserve"> teszi </w:t>
+      </w:r>
+      <w:r>
+        <w:t>lehetővé ez a szülőosztály, ami minden alap funkciót már magába foglal a kifejezés listán kívül.</w:t>
+      </w:r>
+      <w:r>
+        <w:t xml:space="preserve"> </w:t>
+      </w:r>
+      <w:r>
+        <w:t>Innentől s</w:t>
+      </w:r>
+      <w:r>
+        <w:t>zimplán annyi a dolgunk, hogy az új típusban</w:t>
+      </w:r>
+      <w:r>
+        <w:t xml:space="preserve"> felsoroljuk</w:t>
+      </w:r>
+      <w:r>
+        <w:t>, hogy milyen szavakat ismerjen fel a parser, vagyis a kifejezés lista tartalmát.</w:t>
+      </w:r>
+    </w:p>
+    <w:p>
+      <w:r>
+        <w:t>Tegyük fel. hogy van egy egyszerű számológép típusunk, amivel a parser dolgozik. A szöveg bemegy, majd kijön a szépen feldarabolt eredmény. Rá kell jönnünk, hogy ekkor még mindig nem vagyunk sehol. Ahhoz, hogy a program értelmezni tudja a szövegünket többre lesz szükség.</w:t>
+      </w:r>
+    </w:p>
+    <w:p>
+      <w:r>
+        <w:t>Hozzunk tehát létre mindegyik reguláris kifejezés mellé egy neki megfelelő osztályt</w:t>
+      </w:r>
+      <w:r>
+        <w:t xml:space="preserve">. Az osztály tartalmazza </w:t>
+      </w:r>
+      <w:r>
+        <w:t>a konstruktort és, amennyiben szükséges, egy érték lekérdező, egy szöveggé alakító és egy prioritási értéket visszaadó függvényt.</w:t>
+      </w:r>
+      <w:r>
+        <w:t xml:space="preserve"> Hogy </w:t>
+      </w:r>
+      <w:r>
+        <w:t>pedig egyetlen listában el tudjuk tárolni</w:t>
+      </w:r>
+      <w:r>
+        <w:t xml:space="preserve"> az egészet</w:t>
+      </w:r>
+      <w:r>
+        <w:t>, származtassuk le őket egyetlen nagy szülőosztályból (Expression). A különböző típusok közös vonásait az egyszerűbb leírhatóság érdekében új köztes szülőosztályok bevezetésével valósíthatjuk meg.</w:t>
+      </w:r>
+    </w:p>
+    <w:p>
+      <w:pPr>
+        <w:jc w:val="center"/>
+      </w:pPr>
+      <w:r>
+        <w:t xml:space="preserve">&lt;Kép az absztrakt </w:t>
+      </w:r>
+      <w:proofErr w:type="spellStart"/>
+      <w:r>
+        <w:t>Calculator</w:t>
+      </w:r>
+      <w:proofErr w:type="spellEnd"/>
+      <w:r>
+        <w:t xml:space="preserve"> osztály kifejezésfájáról</w:t>
+      </w:r>
+      <w:r>
+        <w:t xml:space="preserve"> (UML)</w:t>
+      </w:r>
+      <w:r>
+        <w:t>&gt;</w:t>
+      </w:r>
+    </w:p>
+    <w:p>
+      <w:r>
+        <w:t>Térjünk is ki rá, hogy mit is jelképeznek az egyes csúcsokon ülő osztályok:</w:t>
+      </w:r>
+    </w:p>
+    <w:p>
+      <w:r>
+        <w:t>Expression:</w:t>
+      </w:r>
+    </w:p>
+    <w:p>
+      <w:proofErr w:type="spellStart"/>
+      <w:r>
+        <w:lastRenderedPageBreak/>
+        <w:t>ValueHolder</w:t>
+      </w:r>
+      <w:proofErr w:type="spellEnd"/>
+      <w:r>
+        <w:t>:</w:t>
+      </w:r>
+    </w:p>
+    <w:p>
+      <w:r>
+        <w:t>Term:</w:t>
+      </w:r>
+    </w:p>
+    <w:p>
+      <w:proofErr w:type="spellStart"/>
+      <w:r>
+        <w:t>Parenthesized</w:t>
+      </w:r>
+      <w:proofErr w:type="spellEnd"/>
+      <w:r>
+        <w:t>:</w:t>
+      </w:r>
+    </w:p>
+    <w:p>
+      <w:proofErr w:type="spellStart"/>
+      <w:r>
+        <w:t>FunctionBase</w:t>
+      </w:r>
+      <w:proofErr w:type="spellEnd"/>
+      <w:r>
+        <w:t>:</w:t>
+      </w:r>
+    </w:p>
+    <w:p>
+      <w:r>
+        <w:t>Operator:</w:t>
+      </w:r>
+    </w:p>
+    <w:p>
+      <w:proofErr w:type="spellStart"/>
+      <w:r>
+        <w:t>Function</w:t>
+      </w:r>
+      <w:proofErr w:type="spellEnd"/>
+      <w:r>
+        <w:t>:</w:t>
+      </w:r>
+    </w:p>
+    <w:p>
+      <w:r>
+        <w:t>Coma:</w:t>
+      </w:r>
+    </w:p>
+    <w:p>
+      <w:proofErr w:type="spellStart"/>
+      <w:r>
+        <w:t>Parenthesis</w:t>
+      </w:r>
+      <w:proofErr w:type="spellEnd"/>
+      <w:r>
+        <w:t>:</w:t>
+      </w:r>
+    </w:p>
+    <w:p>
+      <w:proofErr w:type="spellStart"/>
+      <w:r>
+        <w:t>Opening</w:t>
+      </w:r>
+      <w:r>
+        <w:t>Parenthesis</w:t>
+      </w:r>
+      <w:proofErr w:type="spellEnd"/>
+      <w:r>
+        <w:t>:</w:t>
+      </w:r>
+    </w:p>
+    <w:p>
+      <w:proofErr w:type="spellStart"/>
+      <w:r>
+        <w:t>Closing</w:t>
+      </w:r>
+      <w:r>
+        <w:t>Parenthesis</w:t>
+      </w:r>
+      <w:proofErr w:type="spellEnd"/>
+      <w:r>
+        <w:t>:</w:t>
+      </w:r>
+    </w:p>
+    <w:p>
+      <w:r>
+        <w:t>Ennek a fá</w:t>
+      </w:r>
+      <w:r>
+        <w:t>nak</w:t>
+      </w:r>
+      <w:r>
+        <w:t xml:space="preserve"> a specifikus számológépek már csak levélcsúcsokat kell, hogy biztosítsanak</w:t>
+      </w:r>
+      <w:r>
+        <w:t>.</w:t>
+      </w:r>
+    </w:p>
+    <w:p>
+      <w:r>
+        <w:t xml:space="preserve">Ezzel már sokkal előrébb vagyunk. Az egyes </w:t>
+      </w:r>
+      <w:r>
+        <w:t>kifejezés osztályok által</w:t>
+      </w:r>
+      <w:r>
+        <w:t>, ha átalakítjuk a kifejezés listát, hogy reguláris kifejezés</w:t>
+      </w:r>
+      <w:r>
+        <w:t xml:space="preserve"> </w:t>
+      </w:r>
+      <w:r>
+        <w:t>-</w:t>
+      </w:r>
+      <w:r>
+        <w:t xml:space="preserve"> kifejezés objektumot gyártó függvény párokat tartalmazzon, a felismert reguláris kifejezésekkel a szavakból egyből objektumok gyárthatók. Vagyis ezentúl a parser nem szavak listáját adja vissza, hanem objektumok listáját, amivel sokkal könnyebb dolgoznunk.</w:t>
+      </w:r>
+    </w:p>
+    <w:p>
+      <w:pPr>
+        <w:jc w:val="center"/>
+      </w:pPr>
+      <w:r>
+        <w:t xml:space="preserve">&lt;Állapotdiagramm </w:t>
+      </w:r>
+      <w:r>
+        <w:t>mindkét</w:t>
+      </w:r>
+      <w:r>
+        <w:t xml:space="preserve"> műveletsorról&gt;</w:t>
+      </w:r>
+    </w:p>
+    <w:p>
+      <w:r>
+        <w:t>Ezt viszont még mindig nem vagyunk képesek kiértékelni. Ebben segít a lengyel formára alakítás, ami a műveleti sor szempontjából egy sokkal jobban kezelhető alak.</w:t>
+      </w:r>
+    </w:p>
+    <w:p>
+      <w:pPr>
+        <w:rPr>
+          <w:b/>
+          <w:bCs/>
+        </w:rPr>
+      </w:pPr>
+      <w:r>
+        <w:rPr>
+          <w:b/>
+          <w:bCs/>
+        </w:rPr>
+        <w:t>Aritmetikai kifejezés alakjai:</w:t>
+      </w:r>
+    </w:p>
+    <w:p>
+      <w:pPr>
+        <w:numPr>
+          <w:ilvl w:val="0"/>
+          <w:numId w:val="10"/>
+        </w:numPr>
+      </w:pPr>
+      <w:r>
+        <w:rPr>
+          <w:b/>
+          <w:bCs/>
+        </w:rPr>
+        <w:t>infix:</w:t>
+      </w:r>
+      <w:r>
+        <w:t xml:space="preserve"> </w:t>
+      </w:r>
+      <m:oMath>
+        <m:r>
+          <w:rPr>
+            <w:rFonts w:ascii="Cambria Math" w:hAnsi="Cambria Math"/>
+          </w:rPr>
+          <m:t>A+B</m:t>
+        </m:r>
+      </m:oMath>
+      <w:r>
+        <w:t>, az egyes műveleti jelek az operandusaik között helyezkednek el</w:t>
+      </w:r>
+    </w:p>
+    <w:p>
+      <w:pPr>
+        <w:numPr>
+          <w:ilvl w:val="0"/>
+          <w:numId w:val="10"/>
+        </w:numPr>
+      </w:pPr>
+      <w:r>
+        <w:rPr>
+          <w:b/>
+          <w:bCs/>
+        </w:rPr>
+        <w:t>postfix:</w:t>
+      </w:r>
+      <w:r>
+        <w:t xml:space="preserve"> </w:t>
+      </w:r>
+      <m:oMath>
+        <m:r>
+          <w:rPr>
+            <w:rFonts w:ascii="Cambria Math" w:hAnsi="Cambria Math"/>
+          </w:rPr>
+          <m:t>AB+</m:t>
+        </m:r>
+      </m:oMath>
+      <w:r>
+        <w:t>, az egyes műveleti jelek az operandusaik mögött helyezkednek el</w:t>
+      </w:r>
+    </w:p>
+    <w:p>
+      <w:pPr>
+        <w:numPr>
+          <w:ilvl w:val="0"/>
+          <w:numId w:val="10"/>
+        </w:numPr>
+      </w:pPr>
+      <w:r>
+        <w:rPr>
+          <w:b/>
+          <w:bCs/>
+        </w:rPr>
+        <w:t>prefix:</w:t>
+      </w:r>
+      <w:r>
+        <w:t xml:space="preserve"> </w:t>
+      </w:r>
+      <m:oMath>
+        <m:r>
+          <w:rPr>
+            <w:rFonts w:ascii="Cambria Math" w:hAnsi="Cambria Math"/>
+          </w:rPr>
+          <m:t>+AB</m:t>
+        </m:r>
+      </m:oMath>
+      <w:r>
+        <w:t>, az egyes műveleti jelek az operandusaik előtt helyezkednek el</w:t>
+      </w:r>
+    </w:p>
+    <w:p>
+      <w:r>
+        <w:t>Az emberek számára kényelmes és könnyen átlátható az infix alak</w:t>
+      </w:r>
+      <w:r>
+        <w:t>, ezért is használjuk. Viszont</w:t>
+      </w:r>
+      <w:r>
+        <w:t xml:space="preserve"> a fordítóprogramoknak egy olyan alakra van szükségük, amelyekből a műveletek elvégzésének a sorrendje egyértelműen adódik.</w:t>
+      </w:r>
+    </w:p>
+    <w:p>
+      <w:r>
+        <w:lastRenderedPageBreak/>
+        <w:t xml:space="preserve">A lengyel forma az </w:t>
+      </w:r>
+      <w:r>
+        <w:rPr>
+          <w:b/>
+          <w:bCs/>
+        </w:rPr>
+        <w:t>aritmetikai kifejezés postfix alakja.</w:t>
+      </w:r>
+      <w:r>
+        <w:t xml:space="preserve"> Nincsenek benne zárójelek, a kiértékelés mégis egyértelmű. Operandusok sorrendje nem változik. Operátorok sorrendje az elvégzésük sorrendjében szerepel, tehát balról jobbra. Minden operátort közvetlen megelőznek az operandusai, (az operandus lehet változó, konstans, de lehet postfix kifejezés is).</w:t>
+      </w:r>
+    </w:p>
+    <w:p>
+      <w:pPr>
+        <w:rPr>
+          <w:b/>
+          <w:bCs/>
+        </w:rPr>
+      </w:pPr>
+      <w:r>
+        <w:rPr>
+          <w:b/>
+          <w:bCs/>
+        </w:rPr>
+        <w:t xml:space="preserve">Operátorok </w:t>
+      </w:r>
+      <w:proofErr w:type="spellStart"/>
+      <w:r>
+        <w:rPr>
+          <w:b/>
+          <w:bCs/>
+        </w:rPr>
+        <w:t>precedenciája</w:t>
+      </w:r>
+      <w:proofErr w:type="spellEnd"/>
+      <w:r>
+        <w:rPr>
+          <w:b/>
+          <w:bCs/>
+        </w:rPr>
+        <w:t xml:space="preserve"> (elsősége):</w:t>
+      </w:r>
+    </w:p>
+    <w:p>
+      <w:r>
+        <w:t xml:space="preserve">Legkisebb </w:t>
+      </w:r>
+      <w:proofErr w:type="spellStart"/>
+      <w:r>
+        <w:t>precedenciájútól</w:t>
+      </w:r>
+      <w:proofErr w:type="spellEnd"/>
+      <w:r>
+        <w:t xml:space="preserve"> a legnagyobbig a sorrend a következő:</w:t>
+      </w:r>
+    </w:p>
+    <w:p>
+      <w:pPr>
+        <w:numPr>
+          <w:ilvl w:val="0"/>
+          <w:numId w:val="11"/>
+        </w:numPr>
+      </w:pPr>
+      <w:r>
+        <w:t>=</w:t>
+      </w:r>
+    </w:p>
+    <w:p>
+      <w:pPr>
+        <w:numPr>
+          <w:ilvl w:val="0"/>
+          <w:numId w:val="11"/>
+        </w:numPr>
+      </w:pPr>
+      <m:oMath>
+        <m:r>
+          <w:rPr>
+            <w:rFonts w:ascii="Cambria Math" w:hAnsi="Cambria Math"/>
+          </w:rPr>
+          <m:t>+</m:t>
+        </m:r>
+      </m:oMath>
+      <w:r>
+        <w:t xml:space="preserve"> </w:t>
+      </w:r>
+      <w:r>
+        <w:t>és</w:t>
+      </w:r>
+      <w:r>
+        <w:t xml:space="preserve"> </w:t>
+      </w:r>
+      <m:oMath>
+        <m:r>
+          <w:rPr>
+            <w:rFonts w:ascii="Cambria Math" w:hAnsi="Cambria Math"/>
+          </w:rPr>
+          <m:t>-</m:t>
+        </m:r>
+      </m:oMath>
+      <w:r>
+        <w:t xml:space="preserve"> (azonos rangúak)</w:t>
+      </w:r>
+    </w:p>
+    <w:p>
+      <w:pPr>
+        <w:numPr>
+          <w:ilvl w:val="0"/>
+          <w:numId w:val="11"/>
+        </w:numPr>
+      </w:pPr>
+      <m:oMath>
+        <m:r>
+          <w:rPr>
+            <w:rFonts w:ascii="Cambria Math" w:hAnsi="Cambria Math"/>
+          </w:rPr>
+          <m:t>×</m:t>
+        </m:r>
+      </m:oMath>
+      <w:r>
+        <w:t xml:space="preserve"> </w:t>
+      </w:r>
+      <w:r>
+        <w:t>és</w:t>
+      </w:r>
+      <w:r>
+        <w:t xml:space="preserve"> </w:t>
+      </w:r>
+      <m:oMath>
+        <m:r>
+          <w:rPr>
+            <w:rFonts w:ascii="Cambria Math" w:hAnsi="Cambria Math"/>
+          </w:rPr>
+          <m:t>/</m:t>
+        </m:r>
+      </m:oMath>
+      <w:r>
+        <w:t xml:space="preserve"> (azonos rangúak)</w:t>
+      </w:r>
+    </w:p>
+    <w:p>
+      <w:pPr>
+        <w:numPr>
+          <w:ilvl w:val="0"/>
+          <w:numId w:val="11"/>
+        </w:numPr>
+      </w:pPr>
+      <m:oMath>
+        <m:sSup>
+          <m:sSupPr>
+            <m:ctrlPr>
+              <w:rPr>
+                <w:rFonts w:ascii="Cambria Math" w:hAnsi="Cambria Math"/>
+                <w:i/>
+              </w:rPr>
+            </m:ctrlPr>
+          </m:sSupPr>
+          <m:e>
+            <m:r>
+              <w:rPr>
+                <w:rFonts w:ascii="Cambria Math" w:hAnsi="Cambria Math"/>
+              </w:rPr>
+              <m:t>x</m:t>
+            </m:r>
+          </m:e>
+          <m:sup>
+            <m:r>
+              <w:rPr>
+                <w:rFonts w:ascii="Cambria Math" w:hAnsi="Cambria Math"/>
+              </w:rPr>
+              <m:t>a</m:t>
+            </m:r>
+          </m:sup>
+        </m:sSup>
+      </m:oMath>
+      <w:r>
+        <w:t xml:space="preserve"> és </w:t>
+      </w:r>
+      <m:oMath>
+        <m:rad>
+          <m:radPr>
+            <m:ctrlPr>
+              <w:rPr>
+                <w:rFonts w:ascii="Cambria Math" w:hAnsi="Cambria Math"/>
+                <w:i/>
+              </w:rPr>
+            </m:ctrlPr>
+          </m:radPr>
+          <m:deg>
+            <m:r>
+              <w:rPr>
+                <w:rFonts w:ascii="Cambria Math" w:hAnsi="Cambria Math"/>
+              </w:rPr>
+              <m:t>a</m:t>
+            </m:r>
+          </m:deg>
+          <m:e>
+            <m:r>
+              <w:rPr>
+                <w:rFonts w:ascii="Cambria Math" w:hAnsi="Cambria Math"/>
+              </w:rPr>
+              <m:t>x</m:t>
+            </m:r>
+          </m:e>
+        </m:rad>
+      </m:oMath>
+    </w:p>
+    <w:p>
+      <w:r>
+        <w:t xml:space="preserve">Balról jobbra típusú (bal asszociatív) operátorok: </w:t>
+      </w:r>
+      <m:oMath>
+        <m:r>
+          <w:rPr>
+            <w:rFonts w:ascii="Cambria Math" w:hAnsi="Cambria Math"/>
+          </w:rPr>
+          <m:t>+</m:t>
+        </m:r>
+      </m:oMath>
+      <w:r>
+        <w:t xml:space="preserve">, </w:t>
+      </w:r>
+      <m:oMath>
+        <m:r>
+          <w:rPr>
+            <w:rFonts w:ascii="Cambria Math" w:hAnsi="Cambria Math"/>
+          </w:rPr>
+          <m:t>-</m:t>
+        </m:r>
+      </m:oMath>
+      <w:r>
+        <w:t xml:space="preserve">, </w:t>
+      </w:r>
+      <m:oMath>
+        <m:r>
+          <w:rPr>
+            <w:rFonts w:ascii="Cambria Math" w:hAnsi="Cambria Math"/>
+          </w:rPr>
+          <m:t>×</m:t>
+        </m:r>
+      </m:oMath>
+      <w:r>
+        <w:t xml:space="preserve">, </w:t>
+      </w:r>
+      <m:oMath>
+        <m:r>
+          <w:rPr>
+            <w:rFonts w:ascii="Cambria Math" w:hAnsi="Cambria Math"/>
+          </w:rPr>
+          <m:t>/</m:t>
+        </m:r>
+      </m:oMath>
+    </w:p>
+    <w:p>
+      <w:r>
+        <w:t xml:space="preserve">Jobbról balra típusú (jobb asszociatív) operátorok: </w:t>
+      </w:r>
+      <m:oMath>
+        <m:r>
+          <w:rPr>
+            <w:rFonts w:ascii="Cambria Math" w:hAnsi="Cambria Math"/>
+          </w:rPr>
+          <m:t>=</m:t>
+        </m:r>
+      </m:oMath>
+      <w:r>
+        <w:t xml:space="preserve">, </w:t>
+      </w:r>
+      <m:oMath>
+        <m:sSup>
+          <m:sSupPr>
+            <m:ctrlPr>
+              <w:rPr>
+                <w:rFonts w:ascii="Cambria Math" w:hAnsi="Cambria Math"/>
+                <w:i/>
+              </w:rPr>
+            </m:ctrlPr>
+          </m:sSupPr>
+          <m:e>
+            <m:r>
+              <w:rPr>
+                <w:rFonts w:ascii="Cambria Math" w:hAnsi="Cambria Math"/>
+              </w:rPr>
+              <m:t>x</m:t>
+            </m:r>
+          </m:e>
+          <m:sup>
+            <m:r>
+              <w:rPr>
+                <w:rFonts w:ascii="Cambria Math" w:hAnsi="Cambria Math"/>
+              </w:rPr>
+              <m:t>a</m:t>
+            </m:r>
+          </m:sup>
+        </m:sSup>
+      </m:oMath>
+    </w:p>
+    <w:p/>
+    <w:p>
+      <w:pPr>
+        <w:pStyle w:val="Cmsor3"/>
+      </w:pPr>
+      <w:bookmarkStart w:id="20" w:name="_Toc221883168"/>
+      <w:r>
+        <w:lastRenderedPageBreak/>
+        <w:t>Általános számológép (</w:t>
+      </w:r>
+      <w:proofErr w:type="spellStart"/>
+      <w:r>
+        <w:t>Standard</w:t>
+      </w:r>
+      <w:r>
+        <w:t>Calculator</w:t>
+      </w:r>
+      <w:proofErr w:type="spellEnd"/>
+      <w:r>
+        <w:t>)</w:t>
       </w:r>
       <w:bookmarkEnd w:id="20"/>
     </w:p>
@@ -28641,9 +29504,20 @@
       <w:pPr>
         <w:pStyle w:val="Cmsor3"/>
       </w:pPr>
-      <w:bookmarkStart w:id="21" w:name="_Toc218619933"/>
-      <w:r>
-        <w:t>Euklideszi tér számológép (EuclideanSpace)</w:t>
+      <w:bookmarkStart w:id="21" w:name="_Toc221883169"/>
+      <w:r>
+        <w:t>Euklideszi tér számológép (</w:t>
+      </w:r>
+      <w:proofErr w:type="spellStart"/>
+      <w:r>
+        <w:t>EuclideanSpace</w:t>
+      </w:r>
+      <w:r>
+        <w:t>Calculator</w:t>
+      </w:r>
+      <w:proofErr w:type="spellEnd"/>
+      <w:r>
+        <w:t>)</w:t>
       </w:r>
       <w:bookmarkEnd w:id="21"/>
     </w:p>
@@ -28651,9 +29525,20 @@
       <w:pPr>
         <w:pStyle w:val="Cmsor3"/>
       </w:pPr>
-      <w:bookmarkStart w:id="22" w:name="_Toc218619934"/>
-      <w:r>
-        <w:t>Polinom számológép (Polynomials)</w:t>
+      <w:bookmarkStart w:id="22" w:name="_Toc221883170"/>
+      <w:r>
+        <w:t>Polinom számológép (</w:t>
+      </w:r>
+      <w:proofErr w:type="spellStart"/>
+      <w:r>
+        <w:t>Polynomials</w:t>
+      </w:r>
+      <w:r>
+        <w:t>Calculator</w:t>
+      </w:r>
+      <w:proofErr w:type="spellEnd"/>
+      <w:r>
+        <w:t>)</w:t>
       </w:r>
       <w:bookmarkEnd w:id="22"/>
     </w:p>
@@ -28661,9 +29546,20 @@
       <w:pPr>
         <w:pStyle w:val="Cmsor3"/>
       </w:pPr>
-      <w:bookmarkStart w:id="23" w:name="_Toc218619935"/>
-      <w:r>
-        <w:t>Integrálközelítés számológép (Integral)</w:t>
+      <w:bookmarkStart w:id="23" w:name="_Toc221883171"/>
+      <w:r>
+        <w:t>Integrálközelítés számológép (</w:t>
+      </w:r>
+      <w:proofErr w:type="spellStart"/>
+      <w:r>
+        <w:t>Integral</w:t>
+      </w:r>
+      <w:r>
+        <w:t>Calculator</w:t>
+      </w:r>
+      <w:proofErr w:type="spellEnd"/>
+      <w:r>
+        <w:t>)</w:t>
       </w:r>
       <w:bookmarkEnd w:id="23"/>
     </w:p>
@@ -28671,7 +29567,7 @@
       <w:pPr>
         <w:pStyle w:val="Cmsor2"/>
       </w:pPr>
-      <w:bookmarkStart w:id="24" w:name="_Toc218619936"/>
+      <w:bookmarkStart w:id="24" w:name="_Toc221883172"/>
       <w:r>
         <w:t>Vizuális számológép megvalósítása</w:t>
       </w:r>
@@ -28681,7 +29577,7 @@
       <w:pPr>
         <w:pStyle w:val="Cmsor3"/>
       </w:pPr>
-      <w:bookmarkStart w:id="25" w:name="_Toc218619937"/>
+      <w:bookmarkStart w:id="25" w:name="_Toc221883173"/>
       <w:r>
         <w:t>Funkciók</w:t>
       </w:r>
@@ -28691,7 +29587,7 @@
       <w:pPr>
         <w:pStyle w:val="Cmsor2"/>
       </w:pPr>
-      <w:bookmarkStart w:id="26" w:name="_Toc218619938"/>
+      <w:bookmarkStart w:id="26" w:name="_Toc221883174"/>
       <w:r>
         <w:t>Jövőbeli fejlesztések</w:t>
       </w:r>
@@ -28701,7 +29597,7 @@
       <w:pPr>
         <w:pStyle w:val="Cmsor3"/>
       </w:pPr>
-      <w:bookmarkStart w:id="27" w:name="_Toc218619939"/>
+      <w:bookmarkStart w:id="27" w:name="_Toc221883175"/>
       <w:r>
         <w:t>Teljesítményt növelő fejlesztések</w:t>
       </w:r>
@@ -28711,7 +29607,7 @@
       <w:pPr>
         <w:pStyle w:val="Cmsor3"/>
       </w:pPr>
-      <w:bookmarkStart w:id="28" w:name="_Toc218619940"/>
+      <w:bookmarkStart w:id="28" w:name="_Toc221883176"/>
       <w:r>
         <w:t>Bővítmények</w:t>
       </w:r>
@@ -28721,7 +29617,7 @@
       <w:pPr>
         <w:pStyle w:val="Cmsor3"/>
       </w:pPr>
-      <w:bookmarkStart w:id="29" w:name="_Toc218619941"/>
+      <w:bookmarkStart w:id="29" w:name="_Toc221883177"/>
       <w:r>
         <w:t>Más nyelvekre kiterjesztés</w:t>
       </w:r>
@@ -28731,7 +29627,7 @@
       <w:pPr>
         <w:pStyle w:val="Cmsor2"/>
       </w:pPr>
-      <w:bookmarkStart w:id="30" w:name="_Toc218619942"/>
+      <w:bookmarkStart w:id="30" w:name="_Toc221883178"/>
       <w:r>
         <w:t>Köszönetnyilvánítás</w:t>
       </w:r>
@@ -29194,6 +30090,155 @@
     </w:lvl>
   </w:abstractNum>
   <w:abstractNum w:abstractNumId="3" w15:restartNumberingAfterBreak="0">
+    <w:nsid w:val="41E81218"/>
+    <w:multiLevelType w:val="multilevel"/>
+    <w:tmpl w:val="B136FE62"/>
+    <w:lvl w:ilvl="0">
+      <w:start w:val="1"/>
+      <w:numFmt w:val="decimal"/>
+      <w:lvlText w:val="%1."/>
+      <w:lvlJc w:val="left"/>
+      <w:pPr>
+        <w:tabs>
+          <w:tab w:val="num" w:pos="720"/>
+        </w:tabs>
+        <w:ind w:left="720" w:hanging="360"/>
+      </w:pPr>
+      <w:rPr>
+        <w:rFonts w:hint="default"/>
+        <w:sz w:val="20"/>
+      </w:rPr>
+    </w:lvl>
+    <w:lvl w:ilvl="1" w:tentative="1">
+      <w:start w:val="1"/>
+      <w:numFmt w:val="bullet"/>
+      <w:lvlText w:val="o"/>
+      <w:lvlJc w:val="left"/>
+      <w:pPr>
+        <w:tabs>
+          <w:tab w:val="num" w:pos="1440"/>
+        </w:tabs>
+        <w:ind w:left="1440" w:hanging="360"/>
+      </w:pPr>
+      <w:rPr>
+        <w:rFonts w:ascii="Courier New" w:hAnsi="Courier New" w:hint="default"/>
+        <w:sz w:val="20"/>
+      </w:rPr>
+    </w:lvl>
+    <w:lvl w:ilvl="2" w:tentative="1">
+      <w:start w:val="1"/>
+      <w:numFmt w:val="bullet"/>
+      <w:lvlText w:val=""/>
+      <w:lvlJc w:val="left"/>
+      <w:pPr>
+        <w:tabs>
+          <w:tab w:val="num" w:pos="2160"/>
+        </w:tabs>
+        <w:ind w:left="2160" w:hanging="360"/>
+      </w:pPr>
+      <w:rPr>
+        <w:rFonts w:ascii="Wingdings" w:hAnsi="Wingdings" w:hint="default"/>
+        <w:sz w:val="20"/>
+      </w:rPr>
+    </w:lvl>
+    <w:lvl w:ilvl="3" w:tentative="1">
+      <w:start w:val="1"/>
+      <w:numFmt w:val="bullet"/>
+      <w:lvlText w:val=""/>
+      <w:lvlJc w:val="left"/>
+      <w:pPr>
+        <w:tabs>
+          <w:tab w:val="num" w:pos="2880"/>
+        </w:tabs>
+        <w:ind w:left="2880" w:hanging="360"/>
+      </w:pPr>
+      <w:rPr>
+        <w:rFonts w:ascii="Wingdings" w:hAnsi="Wingdings" w:hint="default"/>
+        <w:sz w:val="20"/>
+      </w:rPr>
+    </w:lvl>
+    <w:lvl w:ilvl="4" w:tentative="1">
+      <w:start w:val="1"/>
+      <w:numFmt w:val="bullet"/>
+      <w:lvlText w:val=""/>
+      <w:lvlJc w:val="left"/>
+      <w:pPr>
+        <w:tabs>
+          <w:tab w:val="num" w:pos="3600"/>
+        </w:tabs>
+        <w:ind w:left="3600" w:hanging="360"/>
+      </w:pPr>
+      <w:rPr>
+        <w:rFonts w:ascii="Wingdings" w:hAnsi="Wingdings" w:hint="default"/>
+        <w:sz w:val="20"/>
+      </w:rPr>
+    </w:lvl>
+    <w:lvl w:ilvl="5" w:tentative="1">
+      <w:start w:val="1"/>
+      <w:numFmt w:val="bullet"/>
+      <w:lvlText w:val=""/>
+      <w:lvlJc w:val="left"/>
+      <w:pPr>
+        <w:tabs>
+          <w:tab w:val="num" w:pos="4320"/>
+        </w:tabs>
+        <w:ind w:left="4320" w:hanging="360"/>
+      </w:pPr>
+      <w:rPr>
+        <w:rFonts w:ascii="Wingdings" w:hAnsi="Wingdings" w:hint="default"/>
+        <w:sz w:val="20"/>
+      </w:rPr>
+    </w:lvl>
+    <w:lvl w:ilvl="6" w:tentative="1">
+      <w:start w:val="1"/>
+      <w:numFmt w:val="bullet"/>
+      <w:lvlText w:val=""/>
+      <w:lvlJc w:val="left"/>
+      <w:pPr>
+        <w:tabs>
+          <w:tab w:val="num" w:pos="5040"/>
+        </w:tabs>
+        <w:ind w:left="5040" w:hanging="360"/>
+      </w:pPr>
+      <w:rPr>
+        <w:rFonts w:ascii="Wingdings" w:hAnsi="Wingdings" w:hint="default"/>
+        <w:sz w:val="20"/>
+      </w:rPr>
+    </w:lvl>
+    <w:lvl w:ilvl="7" w:tentative="1">
+      <w:start w:val="1"/>
+      <w:numFmt w:val="bullet"/>
+      <w:lvlText w:val=""/>
+      <w:lvlJc w:val="left"/>
+      <w:pPr>
+        <w:tabs>
+          <w:tab w:val="num" w:pos="5760"/>
+        </w:tabs>
+        <w:ind w:left="5760" w:hanging="360"/>
+      </w:pPr>
+      <w:rPr>
+        <w:rFonts w:ascii="Wingdings" w:hAnsi="Wingdings" w:hint="default"/>
+        <w:sz w:val="20"/>
+      </w:rPr>
+    </w:lvl>
+    <w:lvl w:ilvl="8" w:tentative="1">
+      <w:start w:val="1"/>
+      <w:numFmt w:val="bullet"/>
+      <w:lvlText w:val=""/>
+      <w:lvlJc w:val="left"/>
+      <w:pPr>
+        <w:tabs>
+          <w:tab w:val="num" w:pos="6480"/>
+        </w:tabs>
+        <w:ind w:left="6480" w:hanging="360"/>
+      </w:pPr>
+      <w:rPr>
+        <w:rFonts w:ascii="Wingdings" w:hAnsi="Wingdings" w:hint="default"/>
+        <w:sz w:val="20"/>
+      </w:rPr>
+    </w:lvl>
+  </w:abstractNum>
+  <w:abstractNum w:abstractNumId="4" w15:restartNumberingAfterBreak="0">
     <w:nsid w:val="44BF1291"/>
     <w:multiLevelType w:val="hybridMultilevel"/>
     <w:tmpl w:val="F97E0F68"/>
@@ -29306,7 +30351,7 @@
       </w:rPr>
     </w:lvl>
   </w:abstractNum>
-  <w:abstractNum w:abstractNumId="4" w15:restartNumberingAfterBreak="0">
+  <w:abstractNum w:abstractNumId="5" w15:restartNumberingAfterBreak="0">
     <w:nsid w:val="57313CB6"/>
     <w:multiLevelType w:val="hybridMultilevel"/>
     <w:tmpl w:val="7FDA4F68"/>
@@ -29392,7 +30437,7 @@
       </w:pPr>
     </w:lvl>
   </w:abstractNum>
-  <w:abstractNum w:abstractNumId="5" w15:restartNumberingAfterBreak="0">
+  <w:abstractNum w:abstractNumId="6" w15:restartNumberingAfterBreak="0">
     <w:nsid w:val="5D525599"/>
     <w:multiLevelType w:val="hybridMultilevel"/>
     <w:tmpl w:val="1B60AFBA"/>
@@ -29505,7 +30550,7 @@
       </w:rPr>
     </w:lvl>
   </w:abstractNum>
-  <w:abstractNum w:abstractNumId="6" w15:restartNumberingAfterBreak="0">
+  <w:abstractNum w:abstractNumId="7" w15:restartNumberingAfterBreak="0">
     <w:nsid w:val="66230B17"/>
     <w:multiLevelType w:val="hybridMultilevel"/>
     <w:tmpl w:val="3F062B98"/>
@@ -29618,7 +30663,7 @@
       </w:rPr>
     </w:lvl>
   </w:abstractNum>
-  <w:abstractNum w:abstractNumId="7" w15:restartNumberingAfterBreak="0">
+  <w:abstractNum w:abstractNumId="8" w15:restartNumberingAfterBreak="0">
     <w:nsid w:val="6CB36125"/>
     <w:multiLevelType w:val="hybridMultilevel"/>
     <w:tmpl w:val="47ACECFC"/>
@@ -29731,7 +30776,7 @@
       </w:rPr>
     </w:lvl>
   </w:abstractNum>
-  <w:abstractNum w:abstractNumId="8" w15:restartNumberingAfterBreak="0">
+  <w:abstractNum w:abstractNumId="9" w15:restartNumberingAfterBreak="0">
     <w:nsid w:val="6D982FAC"/>
     <w:multiLevelType w:val="hybridMultilevel"/>
     <w:tmpl w:val="0A70C7EA"/>
@@ -29844,11 +30889,160 @@
       </w:rPr>
     </w:lvl>
   </w:abstractNum>
+  <w:abstractNum w:abstractNumId="10" w15:restartNumberingAfterBreak="0">
+    <w:nsid w:val="78E2550D"/>
+    <w:multiLevelType w:val="multilevel"/>
+    <w:tmpl w:val="52645B1A"/>
+    <w:lvl w:ilvl="0">
+      <w:start w:val="1"/>
+      <w:numFmt w:val="bullet"/>
+      <w:lvlText w:val=""/>
+      <w:lvlJc w:val="left"/>
+      <w:pPr>
+        <w:tabs>
+          <w:tab w:val="num" w:pos="720"/>
+        </w:tabs>
+        <w:ind w:left="720" w:hanging="360"/>
+      </w:pPr>
+      <w:rPr>
+        <w:rFonts w:ascii="Symbol" w:hAnsi="Symbol" w:hint="default"/>
+        <w:sz w:val="20"/>
+      </w:rPr>
+    </w:lvl>
+    <w:lvl w:ilvl="1" w:tentative="1">
+      <w:start w:val="1"/>
+      <w:numFmt w:val="bullet"/>
+      <w:lvlText w:val="o"/>
+      <w:lvlJc w:val="left"/>
+      <w:pPr>
+        <w:tabs>
+          <w:tab w:val="num" w:pos="1440"/>
+        </w:tabs>
+        <w:ind w:left="1440" w:hanging="360"/>
+      </w:pPr>
+      <w:rPr>
+        <w:rFonts w:ascii="Courier New" w:hAnsi="Courier New" w:hint="default"/>
+        <w:sz w:val="20"/>
+      </w:rPr>
+    </w:lvl>
+    <w:lvl w:ilvl="2" w:tentative="1">
+      <w:start w:val="1"/>
+      <w:numFmt w:val="bullet"/>
+      <w:lvlText w:val=""/>
+      <w:lvlJc w:val="left"/>
+      <w:pPr>
+        <w:tabs>
+          <w:tab w:val="num" w:pos="2160"/>
+        </w:tabs>
+        <w:ind w:left="2160" w:hanging="360"/>
+      </w:pPr>
+      <w:rPr>
+        <w:rFonts w:ascii="Wingdings" w:hAnsi="Wingdings" w:hint="default"/>
+        <w:sz w:val="20"/>
+      </w:rPr>
+    </w:lvl>
+    <w:lvl w:ilvl="3" w:tentative="1">
+      <w:start w:val="1"/>
+      <w:numFmt w:val="bullet"/>
+      <w:lvlText w:val=""/>
+      <w:lvlJc w:val="left"/>
+      <w:pPr>
+        <w:tabs>
+          <w:tab w:val="num" w:pos="2880"/>
+        </w:tabs>
+        <w:ind w:left="2880" w:hanging="360"/>
+      </w:pPr>
+      <w:rPr>
+        <w:rFonts w:ascii="Wingdings" w:hAnsi="Wingdings" w:hint="default"/>
+        <w:sz w:val="20"/>
+      </w:rPr>
+    </w:lvl>
+    <w:lvl w:ilvl="4" w:tentative="1">
+      <w:start w:val="1"/>
+      <w:numFmt w:val="bullet"/>
+      <w:lvlText w:val=""/>
+      <w:lvlJc w:val="left"/>
+      <w:pPr>
+        <w:tabs>
+          <w:tab w:val="num" w:pos="3600"/>
+        </w:tabs>
+        <w:ind w:left="3600" w:hanging="360"/>
+      </w:pPr>
+      <w:rPr>
+        <w:rFonts w:ascii="Wingdings" w:hAnsi="Wingdings" w:hint="default"/>
+        <w:sz w:val="20"/>
+      </w:rPr>
+    </w:lvl>
+    <w:lvl w:ilvl="5" w:tentative="1">
+      <w:start w:val="1"/>
+      <w:numFmt w:val="bullet"/>
+      <w:lvlText w:val=""/>
+      <w:lvlJc w:val="left"/>
+      <w:pPr>
+        <w:tabs>
+          <w:tab w:val="num" w:pos="4320"/>
+        </w:tabs>
+        <w:ind w:left="4320" w:hanging="360"/>
+      </w:pPr>
+      <w:rPr>
+        <w:rFonts w:ascii="Wingdings" w:hAnsi="Wingdings" w:hint="default"/>
+        <w:sz w:val="20"/>
+      </w:rPr>
+    </w:lvl>
+    <w:lvl w:ilvl="6" w:tentative="1">
+      <w:start w:val="1"/>
+      <w:numFmt w:val="bullet"/>
+      <w:lvlText w:val=""/>
+      <w:lvlJc w:val="left"/>
+      <w:pPr>
+        <w:tabs>
+          <w:tab w:val="num" w:pos="5040"/>
+        </w:tabs>
+        <w:ind w:left="5040" w:hanging="360"/>
+      </w:pPr>
+      <w:rPr>
+        <w:rFonts w:ascii="Wingdings" w:hAnsi="Wingdings" w:hint="default"/>
+        <w:sz w:val="20"/>
+      </w:rPr>
+    </w:lvl>
+    <w:lvl w:ilvl="7" w:tentative="1">
+      <w:start w:val="1"/>
+      <w:numFmt w:val="bullet"/>
+      <w:lvlText w:val=""/>
+      <w:lvlJc w:val="left"/>
+      <w:pPr>
+        <w:tabs>
+          <w:tab w:val="num" w:pos="5760"/>
+        </w:tabs>
+        <w:ind w:left="5760" w:hanging="360"/>
+      </w:pPr>
+      <w:rPr>
+        <w:rFonts w:ascii="Wingdings" w:hAnsi="Wingdings" w:hint="default"/>
+        <w:sz w:val="20"/>
+      </w:rPr>
+    </w:lvl>
+    <w:lvl w:ilvl="8" w:tentative="1">
+      <w:start w:val="1"/>
+      <w:numFmt w:val="bullet"/>
+      <w:lvlText w:val=""/>
+      <w:lvlJc w:val="left"/>
+      <w:pPr>
+        <w:tabs>
+          <w:tab w:val="num" w:pos="6480"/>
+        </w:tabs>
+        <w:ind w:left="6480" w:hanging="360"/>
+      </w:pPr>
+      <w:rPr>
+        <w:rFonts w:ascii="Wingdings" w:hAnsi="Wingdings" w:hint="default"/>
+        <w:sz w:val="20"/>
+      </w:rPr>
+    </w:lvl>
+  </w:abstractNum>
   <w:num w:numId="1" w16cid:durableId="789907295">
-    <w:abstractNumId w:val="7"/>
+    <w:abstractNumId w:val="8"/>
   </w:num>
   <w:num w:numId="2" w16cid:durableId="1912694649">
-    <w:abstractNumId w:val="5"/>
+    <w:abstractNumId w:val="6"/>
   </w:num>
   <w:num w:numId="3" w16cid:durableId="2093620482">
     <w:abstractNumId w:val="0"/>
@@ -29860,16 +31054,22 @@
     <w:abstractNumId w:val="2"/>
   </w:num>
   <w:num w:numId="6" w16cid:durableId="1060136177">
-    <w:abstractNumId w:val="3"/>
+    <w:abstractNumId w:val="4"/>
   </w:num>
   <w:num w:numId="7" w16cid:durableId="1975480359">
-    <w:abstractNumId w:val="6"/>
+    <w:abstractNumId w:val="7"/>
   </w:num>
   <w:num w:numId="8" w16cid:durableId="612791505">
-    <w:abstractNumId w:val="4"/>
+    <w:abstractNumId w:val="5"/>
   </w:num>
   <w:num w:numId="9" w16cid:durableId="1634208837">
-    <w:abstractNumId w:val="8"/>
+    <w:abstractNumId w:val="9"/>
+  </w:num>
+  <w:num w:numId="10" w16cid:durableId="676884607">
+    <w:abstractNumId w:val="10"/>
+  </w:num>
+  <w:num w:numId="11" w16cid:durableId="2078672351">
+    <w:abstractNumId w:val="3"/>
   </w:num>
 </w:numbering>
 </file>
@@ -30484,7 +31684,6 @@
   <w:style w:type="character" w:default="1" w:styleId="Bekezdsalapbettpusa">
     <w:name w:val="Default Paragraph Font"/>
     <w:uiPriority w:val="1"/>
-    <w:semiHidden/>
     <w:unhideWhenUsed/>
   </w:style>
   <w:style w:type="table" w:default="1" w:styleId="Normltblzat">

</xml_diff>

<commit_message>
Adding explanation to the postfix form and expression tree making functions of the calculator in the documentation.
</commit_message>
<xml_diff>
--- a/Documentation.docx
+++ b/Documentation.docx
@@ -28988,10 +28988,7 @@
     <w:p>
       <w:proofErr w:type="spellStart"/>
       <w:r>
-        <w:t>Opening</w:t>
-      </w:r>
-      <w:r>
-        <w:t>Parenthesis</w:t>
+        <w:t>OpeningParenthesis</w:t>
       </w:r>
       <w:proofErr w:type="spellEnd"/>
       <w:r>
@@ -29001,10 +28998,7 @@
     <w:p>
       <w:proofErr w:type="spellStart"/>
       <w:r>
-        <w:t>Closing</w:t>
-      </w:r>
-      <w:r>
-        <w:t>Parenthesis</w:t>
+        <w:t>ClosingParenthesis</w:t>
       </w:r>
       <w:proofErr w:type="spellEnd"/>
       <w:r>
@@ -29205,36 +29199,19 @@
           <w:b/>
           <w:bCs/>
         </w:rPr>
-        <w:t xml:space="preserve">Operátorok </w:t>
-      </w:r>
-      <w:proofErr w:type="spellStart"/>
+        <w:t>Bináris o</w:t>
+      </w:r>
       <w:r>
         <w:rPr>
           <w:b/>
           <w:bCs/>
         </w:rPr>
-        <w:t>precedenciája</w:t>
-      </w:r>
-      <w:proofErr w:type="spellEnd"/>
-      <w:r>
-        <w:rPr>
-          <w:b/>
-          <w:bCs/>
-        </w:rPr>
-        <w:t xml:space="preserve"> (elsősége):</w:t>
-      </w:r>
-    </w:p>
-    <w:p>
-      <w:r>
-        <w:t xml:space="preserve">Legkisebb </w:t>
-      </w:r>
-      <w:proofErr w:type="spellStart"/>
-      <w:r>
-        <w:t>precedenciájútól</w:t>
-      </w:r>
-      <w:proofErr w:type="spellEnd"/>
-      <w:r>
-        <w:t xml:space="preserve"> a legnagyobbig a sorrend a következő:</w:t>
+        <w:t>perátorok precedenciája (elsősége):</w:t>
+      </w:r>
+    </w:p>
+    <w:p>
+      <w:r>
+        <w:t>Legkisebb precedenciájútól a legnagyobbig a sorrend a következő:</w:t>
       </w:r>
     </w:p>
     <w:p>
@@ -29244,9 +29221,64 @@
           <w:numId w:val="11"/>
         </w:numPr>
       </w:pPr>
-      <w:r>
-        <w:t>=</w:t>
-      </w:r>
+      <m:oMath>
+        <m:r>
+          <w:rPr>
+            <w:rFonts w:ascii="Cambria Math" w:hAnsi="Cambria Math"/>
+          </w:rPr>
+          <m:t>=</m:t>
+        </m:r>
+      </m:oMath>
+      <w:r>
+        <w:t xml:space="preserve">, </w:t>
+      </w:r>
+      <m:oMath>
+        <m:r>
+          <w:rPr>
+            <w:rFonts w:ascii="Cambria Math" w:hAnsi="Cambria Math"/>
+          </w:rPr>
+          <m:t>&gt;</m:t>
+        </m:r>
+      </m:oMath>
+      <w:r>
+        <w:t xml:space="preserve">, </w:t>
+      </w:r>
+      <m:oMath>
+        <m:r>
+          <w:rPr>
+            <w:rFonts w:ascii="Cambria Math" w:hAnsi="Cambria Math"/>
+          </w:rPr>
+          <m:t>&lt;</m:t>
+        </m:r>
+      </m:oMath>
+      <w:r>
+        <w:rPr>
+          <w:rFonts w:eastAsiaTheme="minorEastAsia"/>
+        </w:rPr>
+        <w:t xml:space="preserve">, </w:t>
+      </w:r>
+      <m:oMath>
+        <m:r>
+          <w:rPr>
+            <w:rFonts w:ascii="Cambria Math" w:eastAsiaTheme="minorEastAsia" w:hAnsi="Cambria Math"/>
+          </w:rPr>
+          <m:t>≥</m:t>
+        </m:r>
+      </m:oMath>
+      <w:r>
+        <w:rPr>
+          <w:rFonts w:eastAsiaTheme="minorEastAsia"/>
+        </w:rPr>
+        <w:t xml:space="preserve">, </w:t>
+      </w:r>
+      <m:oMath>
+        <m:r>
+          <w:rPr>
+            <w:rFonts w:ascii="Cambria Math" w:eastAsiaTheme="minorEastAsia" w:hAnsi="Cambria Math"/>
+          </w:rPr>
+          <m:t>≤</m:t>
+        </m:r>
+      </m:oMath>
     </w:p>
     <w:p>
       <w:pPr>
@@ -29328,6 +29360,27 @@
         </w:numPr>
       </w:pPr>
       <m:oMath>
+        <m:r>
+          <w:rPr>
+            <w:rFonts w:ascii="Cambria Math" w:eastAsiaTheme="minorEastAsia" w:hAnsi="Cambria Math"/>
+          </w:rPr>
+          <m:t>^</m:t>
+        </m:r>
+        <m:r>
+          <w:rPr>
+            <w:rFonts w:ascii="Cambria Math" w:eastAsiaTheme="minorEastAsia" w:hAnsi="Cambria Math"/>
+          </w:rPr>
+          <m:t xml:space="preserve"> </m:t>
+        </m:r>
+        <m:r>
+          <m:rPr>
+            <m:sty m:val="p"/>
+          </m:rPr>
+          <w:rPr>
+            <w:rFonts w:ascii="Cambria Math" w:eastAsiaTheme="minorEastAsia" w:hAnsi="Cambria Math"/>
+          </w:rPr>
+          <m:t>(</m:t>
+        </m:r>
         <m:sSup>
           <m:sSupPr>
             <m:ctrlPr>
@@ -29354,11 +29407,44 @@
             </m:r>
           </m:sup>
         </m:sSup>
+        <m:r>
+          <m:rPr>
+            <m:sty m:val="p"/>
+          </m:rPr>
+          <w:rPr>
+            <w:rFonts w:ascii="Cambria Math" w:eastAsiaTheme="minorEastAsia" w:hAnsi="Cambria Math"/>
+          </w:rPr>
+          <m:t>)</m:t>
+        </m:r>
       </m:oMath>
       <w:r>
-        <w:t xml:space="preserve"> és </w:t>
+        <w:t xml:space="preserve"> és</w:t>
+      </w:r>
+      <w:r>
+        <w:rPr>
+          <w:rFonts w:eastAsiaTheme="minorEastAsia"/>
+        </w:rPr>
+        <w:t xml:space="preserve"> </w:t>
       </w:r>
       <m:oMath>
+        <m:r>
+          <m:rPr>
+            <m:sty m:val="p"/>
+          </m:rPr>
+          <w:rPr>
+            <w:rFonts w:ascii="Cambria Math" w:eastAsiaTheme="minorEastAsia" w:hAnsi="Cambria Math"/>
+          </w:rPr>
+          <m:t>|</m:t>
+        </m:r>
+        <m:r>
+          <m:rPr>
+            <m:sty m:val="p"/>
+          </m:rPr>
+          <w:rPr>
+            <w:rFonts w:ascii="Cambria Math" w:eastAsiaTheme="minorEastAsia" w:hAnsi="Cambria Math"/>
+          </w:rPr>
+          <m:t xml:space="preserve"> (</m:t>
+        </m:r>
         <m:rad>
           <m:radPr>
             <m:ctrlPr>
@@ -29385,6 +29471,12 @@
             </m:r>
           </m:e>
         </m:rad>
+        <m:r>
+          <w:rPr>
+            <w:rFonts w:ascii="Cambria Math" w:eastAsiaTheme="minorEastAsia" w:hAnsi="Cambria Math"/>
+          </w:rPr>
+          <m:t>)</m:t>
+        </m:r>
       </m:oMath>
     </w:p>
     <w:p>
@@ -29432,6 +29524,20 @@
           <m:t>/</m:t>
         </m:r>
       </m:oMath>
+      <w:r>
+        <w:rPr>
+          <w:rFonts w:eastAsiaTheme="minorEastAsia"/>
+        </w:rPr>
+        <w:t xml:space="preserve">, </w:t>
+      </w:r>
+      <m:oMath>
+        <m:r>
+          <w:rPr>
+            <w:rFonts w:ascii="Cambria Math" w:eastAsiaTheme="minorEastAsia" w:hAnsi="Cambria Math"/>
+          </w:rPr>
+          <m:t>|</m:t>
+        </m:r>
+      </m:oMath>
     </w:p>
     <w:p>
       <w:r>
@@ -29446,38 +29552,431 @@
         </m:r>
       </m:oMath>
       <w:r>
+        <w:t>,</w:t>
+      </w:r>
+      <w:r>
+        <w:t xml:space="preserve"> </w:t>
+      </w:r>
+      <m:oMath>
+        <m:r>
+          <w:rPr>
+            <w:rFonts w:ascii="Cambria Math" w:hAnsi="Cambria Math"/>
+          </w:rPr>
+          <m:t>&gt;</m:t>
+        </m:r>
+      </m:oMath>
+      <w:r>
         <w:t xml:space="preserve">, </w:t>
       </w:r>
       <m:oMath>
-        <m:sSup>
-          <m:sSupPr>
-            <m:ctrlPr>
-              <w:rPr>
-                <w:rFonts w:ascii="Cambria Math" w:hAnsi="Cambria Math"/>
-                <w:i/>
-              </w:rPr>
-            </m:ctrlPr>
-          </m:sSupPr>
-          <m:e>
-            <m:r>
-              <w:rPr>
-                <w:rFonts w:ascii="Cambria Math" w:hAnsi="Cambria Math"/>
-              </w:rPr>
-              <m:t>x</m:t>
-            </m:r>
-          </m:e>
-          <m:sup>
-            <m:r>
-              <w:rPr>
-                <w:rFonts w:ascii="Cambria Math" w:hAnsi="Cambria Math"/>
-              </w:rPr>
-              <m:t>a</m:t>
-            </m:r>
-          </m:sup>
-        </m:sSup>
+        <m:r>
+          <w:rPr>
+            <w:rFonts w:ascii="Cambria Math" w:hAnsi="Cambria Math"/>
+          </w:rPr>
+          <m:t>&lt;</m:t>
+        </m:r>
       </m:oMath>
-    </w:p>
-    <w:p/>
+      <w:r>
+        <w:rPr>
+          <w:rFonts w:eastAsiaTheme="minorEastAsia"/>
+        </w:rPr>
+        <w:t xml:space="preserve">, </w:t>
+      </w:r>
+      <m:oMath>
+        <m:r>
+          <w:rPr>
+            <w:rFonts w:ascii="Cambria Math" w:eastAsiaTheme="minorEastAsia" w:hAnsi="Cambria Math"/>
+          </w:rPr>
+          <m:t>≥</m:t>
+        </m:r>
+      </m:oMath>
+      <w:r>
+        <w:rPr>
+          <w:rFonts w:eastAsiaTheme="minorEastAsia"/>
+        </w:rPr>
+        <w:t xml:space="preserve">, </w:t>
+      </w:r>
+      <m:oMath>
+        <m:r>
+          <w:rPr>
+            <w:rFonts w:ascii="Cambria Math" w:eastAsiaTheme="minorEastAsia" w:hAnsi="Cambria Math"/>
+          </w:rPr>
+          <m:t>≤</m:t>
+        </m:r>
+      </m:oMath>
+      <w:r>
+        <w:t>,</w:t>
+      </w:r>
+      <w:r>
+        <w:t xml:space="preserve"> </w:t>
+      </w:r>
+      <m:oMath>
+        <m:r>
+          <w:rPr>
+            <w:rFonts w:ascii="Cambria Math" w:hAnsi="Cambria Math"/>
+          </w:rPr>
+          <m:t>^</m:t>
+        </m:r>
+      </m:oMath>
+    </w:p>
+    <w:p>
+      <w:pPr>
+        <w:rPr>
+          <w:b/>
+          <w:bCs/>
+        </w:rPr>
+      </w:pPr>
+      <w:r>
+        <w:rPr>
+          <w:b/>
+          <w:bCs/>
+        </w:rPr>
+        <w:t>Lengyel forma (postfix alak) előállítása:</w:t>
+      </w:r>
+    </w:p>
+    <w:p>
+      <w:r>
+        <w:t xml:space="preserve">Az inputot szekvenciálisan dolgozzuk fel, és egy </w:t>
+      </w:r>
+      <w:r>
+        <w:rPr>
+          <w:b/>
+          <w:bCs/>
+        </w:rPr>
+        <w:t>verem</w:t>
+      </w:r>
+      <w:r>
+        <w:rPr>
+          <w:b/>
+          <w:bCs/>
+        </w:rPr>
+        <w:t xml:space="preserve"> (</w:t>
+      </w:r>
+      <w:proofErr w:type="spellStart"/>
+      <w:r>
+        <w:rPr>
+          <w:b/>
+          <w:bCs/>
+        </w:rPr>
+        <w:t>Stack</w:t>
+      </w:r>
+      <w:proofErr w:type="spellEnd"/>
+      <w:r>
+        <w:rPr>
+          <w:b/>
+          <w:bCs/>
+        </w:rPr>
+        <w:t>)</w:t>
+      </w:r>
+      <w:r>
+        <w:rPr>
+          <w:b/>
+          <w:bCs/>
+        </w:rPr>
+        <w:t xml:space="preserve"> segítségével</w:t>
+      </w:r>
+      <w:r>
+        <w:t xml:space="preserve"> állítjuk elő a lengyelformát.</w:t>
+      </w:r>
+    </w:p>
+    <w:p>
+      <w:r>
+        <w:t>Ha a soron következő karakter operandus (karakter, szám, stb.), kiírjuk a kimenetre. Ha a soron következő karakter operátor</w:t>
+      </w:r>
+      <w:r>
+        <w:t>,</w:t>
+      </w:r>
+      <w:r>
+        <w:t xml:space="preserve"> bekerül a verembe</w:t>
+      </w:r>
+      <w:r>
+        <w:t>, d</w:t>
+      </w:r>
+      <w:r>
+        <w:t>e mielőtt bekerülne a verembe</w:t>
+      </w:r>
+      <w:r>
+        <w:t>,</w:t>
+      </w:r>
+      <w:r>
+        <w:t xml:space="preserve"> meg kell vizsgálni magát az operátort, amit bele szeretnék helyezni a verembe és a már verem</w:t>
+      </w:r>
+      <w:r>
+        <w:t xml:space="preserve"> tetején</w:t>
+      </w:r>
+      <w:r>
+        <w:t xml:space="preserve"> lévő operátort is </w:t>
+      </w:r>
+      <w:proofErr w:type="spellStart"/>
+      <w:r>
+        <w:t>precedencia</w:t>
+      </w:r>
+      <w:proofErr w:type="spellEnd"/>
+      <w:r>
+        <w:t xml:space="preserve"> szerint</w:t>
+      </w:r>
+      <w:r>
+        <w:t>:</w:t>
+      </w:r>
+    </w:p>
+    <w:p>
+      <w:pPr>
+        <w:numPr>
+          <w:ilvl w:val="0"/>
+          <w:numId w:val="13"/>
+        </w:numPr>
+      </w:pPr>
+      <w:r>
+        <w:rPr>
+          <w:b/>
+          <w:bCs/>
+        </w:rPr>
+        <w:t>azonos rangúak</w:t>
+      </w:r>
+      <w:r>
+        <w:rPr>
+          <w:b/>
+          <w:bCs/>
+        </w:rPr>
+        <w:t>:</w:t>
+      </w:r>
+      <w:r>
+        <w:t xml:space="preserve"> kiírjuk a verem tetején lévő operátort a kimenetre (ezzel együtt ki is vesszük a veremből), feltéve, hogy balról jobbra típusú, ha jobbról balra, akkor nem történik semmi, mehet bele a verembe a beolvasott operátorunk</w:t>
+      </w:r>
+    </w:p>
+    <w:p>
+      <w:pPr>
+        <w:numPr>
+          <w:ilvl w:val="0"/>
+          <w:numId w:val="13"/>
+        </w:numPr>
+      </w:pPr>
+      <w:r>
+        <w:rPr>
+          <w:b/>
+          <w:bCs/>
+        </w:rPr>
+        <w:t xml:space="preserve">beolvasott operátor magasabb </w:t>
+      </w:r>
+      <w:proofErr w:type="spellStart"/>
+      <w:r>
+        <w:rPr>
+          <w:b/>
+          <w:bCs/>
+        </w:rPr>
+        <w:t>precedenciájú</w:t>
+      </w:r>
+      <w:proofErr w:type="spellEnd"/>
+      <w:r>
+        <w:rPr>
+          <w:b/>
+          <w:bCs/>
+        </w:rPr>
+        <w:t>:</w:t>
+      </w:r>
+      <w:r>
+        <w:t xml:space="preserve"> berakjuk a verembe</w:t>
+      </w:r>
+    </w:p>
+    <w:p>
+      <w:pPr>
+        <w:numPr>
+          <w:ilvl w:val="0"/>
+          <w:numId w:val="13"/>
+        </w:numPr>
+      </w:pPr>
+      <w:r>
+        <w:rPr>
+          <w:b/>
+          <w:bCs/>
+        </w:rPr>
+        <w:t xml:space="preserve">beolvasott operátor alacsonyabb </w:t>
+      </w:r>
+      <w:proofErr w:type="spellStart"/>
+      <w:r>
+        <w:rPr>
+          <w:b/>
+          <w:bCs/>
+        </w:rPr>
+        <w:t>precedenciájú</w:t>
+      </w:r>
+      <w:proofErr w:type="spellEnd"/>
+      <w:r>
+        <w:rPr>
+          <w:b/>
+          <w:bCs/>
+        </w:rPr>
+        <w:t>:</w:t>
+      </w:r>
+      <w:r>
+        <w:t xml:space="preserve"> kiírjuk a verem tetején lévő operátort és megvizsgáljuk az újdonsült verem tetején lévő elemet</w:t>
+      </w:r>
+    </w:p>
+    <w:p>
+      <w:pPr>
+        <w:numPr>
+          <w:ilvl w:val="0"/>
+          <w:numId w:val="14"/>
+        </w:numPr>
+      </w:pPr>
+      <w:r>
+        <w:rPr>
+          <w:b/>
+          <w:bCs/>
+        </w:rPr>
+        <w:t>nyitó zárójel</w:t>
+      </w:r>
+      <w:r>
+        <w:rPr>
+          <w:b/>
+          <w:bCs/>
+        </w:rPr>
+        <w:t>:</w:t>
+      </w:r>
+      <w:r>
+        <w:t xml:space="preserve"> a verembe kerül</w:t>
+      </w:r>
+    </w:p>
+    <w:p>
+      <w:pPr>
+        <w:numPr>
+          <w:ilvl w:val="0"/>
+          <w:numId w:val="14"/>
+        </w:numPr>
+      </w:pPr>
+      <w:r>
+        <w:rPr>
+          <w:b/>
+          <w:bCs/>
+        </w:rPr>
+        <w:lastRenderedPageBreak/>
+        <w:t>csukó zárójel</w:t>
+      </w:r>
+      <w:r>
+        <w:rPr>
+          <w:b/>
+          <w:bCs/>
+        </w:rPr>
+        <w:t>:</w:t>
+      </w:r>
+      <w:r>
+        <w:t xml:space="preserve"> a nyitó zárójelig mindent kiírunk a veremből sorrendben, a zárójelek nem kerülnek kiírásra, csak eldobjuk őket</w:t>
+      </w:r>
+    </w:p>
+    <w:p>
+      <w:r>
+        <w:t xml:space="preserve">Ezt addig ismételjük, amíg az utolsó beolvasott operátor precedenciája végül megengedi, hogy betegyük a verembe, vagy a verem kiürült. </w:t>
+      </w:r>
+      <w:r>
+        <w:t>Amikor az input végére értünk, a veremben levő összes maradék operátort kivesszük és kiírjuk a kimenetre.</w:t>
+      </w:r>
+    </w:p>
+    <w:p>
+      <w:pPr>
+        <w:jc w:val="center"/>
+      </w:pPr>
+      <w:r>
+        <w:t>&lt;Struktogramm a lengyel formára alakításról (</w:t>
+      </w:r>
+      <w:proofErr w:type="spellStart"/>
+      <w:r>
+        <w:t>Orosi</w:t>
+      </w:r>
+      <w:proofErr w:type="spellEnd"/>
+      <w:r>
+        <w:t xml:space="preserve"> Feri oldala)&gt;</w:t>
+      </w:r>
+    </w:p>
+    <w:p>
+      <w:r>
+        <w:t>Ahhoz, hogy a lengyel formás alakból rekonstruálható legyen az eredeti bemenet, a zárójelek esetében nem szabad csak úgy eldobnunk őket. Inkább hozzávesszük őket a kimeneti értékhez is. A nyitó zárójelet ahogy megkapjuk, a csukót pedig ahogy kiszedtünk minden a nyitó zárójelig a veremből</w:t>
+      </w:r>
+      <w:r>
+        <w:t>,</w:t>
+      </w:r>
+      <w:r>
+        <w:t xml:space="preserve"> írjuk az eredmény végére.</w:t>
+      </w:r>
+    </w:p>
+    <w:p>
+      <w:pPr>
+        <w:jc w:val="center"/>
+      </w:pPr>
+      <w:r>
+        <w:t>&lt;Struktogramm a</w:t>
+      </w:r>
+      <w:r>
+        <w:t xml:space="preserve"> zárójelekkel bővített</w:t>
+      </w:r>
+      <w:r>
+        <w:t xml:space="preserve"> lengyel formára alakításról&gt;</w:t>
+      </w:r>
+    </w:p>
+    <w:p>
+      <w:r>
+        <w:t>A lengyel forma már egy algoritmikusan jól</w:t>
+      </w:r>
+      <w:r>
+        <w:t xml:space="preserve"> </w:t>
+      </w:r>
+      <w:r>
+        <w:t xml:space="preserve">kezelhető alak és ki is tudnánk értékelni, viszont </w:t>
+      </w:r>
+      <w:r>
+        <w:t>hogy számítási lépésenként ki tudjuk írni a részeredményeket ez az alak még nem a legalkalmasabb.</w:t>
+      </w:r>
+      <w:r>
+        <w:t xml:space="preserve"> </w:t>
+      </w:r>
+      <w:r>
+        <w:t xml:space="preserve">Egyszerűsíteni </w:t>
+      </w:r>
+      <w:r>
+        <w:t>kifejezés fává alakítással tudunk.</w:t>
+      </w:r>
+      <w:r>
+        <w:t xml:space="preserve"> Ekkor a fa csomópontjaiban az operátorok és függvények, a leveleiben pedig számok állnak.</w:t>
+      </w:r>
+      <w:r>
+        <w:t xml:space="preserve"> </w:t>
+      </w:r>
+    </w:p>
+    <w:p>
+      <w:pPr>
+        <w:jc w:val="center"/>
+      </w:pPr>
+      <w:r>
+        <w:t>&lt;Ábra egy kifejezés fáról&gt;</w:t>
+      </w:r>
+    </w:p>
+    <w:p>
+      <w:r>
+        <w:t>Kiértékelni úgy tudjuk a fát, hogy a gyökérből elindítjuk az érték lekérdezését. Ha a gyökér operátor vagy függvény, akkor szükség van a paraméterek értékére, így azoknak is előbb le kell kérdezni az értékét. A rekurzió így folytatódik, amíg el nem ér a levelekig. Mivel a levelek tudják a pontos értéküket</w:t>
+      </w:r>
+      <w:r>
+        <w:t>,</w:t>
+      </w:r>
+      <w:r>
+        <w:t xml:space="preserve"> az algoritmus vissza</w:t>
+      </w:r>
+      <w:r>
+        <w:t>pörög</w:t>
+      </w:r>
+      <w:r>
+        <w:t xml:space="preserve"> és </w:t>
+      </w:r>
+      <w:r>
+        <w:t>a végén kijön a</w:t>
+      </w:r>
+      <w:r>
+        <w:t>z eredmény.</w:t>
+      </w:r>
+    </w:p>
+    <w:p>
+      <w:r>
+        <w:t>Na most vagyunk kész!</w:t>
+      </w:r>
+    </w:p>
     <w:p>
       <w:pPr>
         <w:pStyle w:val="Cmsor3"/>
@@ -29864,6 +30363,155 @@
     </w:lvl>
   </w:abstractNum>
   <w:abstractNum w:abstractNumId="1" w15:restartNumberingAfterBreak="0">
+    <w:nsid w:val="26B2350A"/>
+    <w:multiLevelType w:val="multilevel"/>
+    <w:tmpl w:val="F5DECE3E"/>
+    <w:lvl w:ilvl="0">
+      <w:start w:val="1"/>
+      <w:numFmt w:val="bullet"/>
+      <w:lvlText w:val=""/>
+      <w:lvlJc w:val="left"/>
+      <w:pPr>
+        <w:tabs>
+          <w:tab w:val="num" w:pos="720"/>
+        </w:tabs>
+        <w:ind w:left="720" w:hanging="360"/>
+      </w:pPr>
+      <w:rPr>
+        <w:rFonts w:ascii="Symbol" w:hAnsi="Symbol" w:hint="default"/>
+        <w:sz w:val="20"/>
+      </w:rPr>
+    </w:lvl>
+    <w:lvl w:ilvl="1" w:tentative="1">
+      <w:start w:val="1"/>
+      <w:numFmt w:val="bullet"/>
+      <w:lvlText w:val="o"/>
+      <w:lvlJc w:val="left"/>
+      <w:pPr>
+        <w:tabs>
+          <w:tab w:val="num" w:pos="1440"/>
+        </w:tabs>
+        <w:ind w:left="1440" w:hanging="360"/>
+      </w:pPr>
+      <w:rPr>
+        <w:rFonts w:ascii="Courier New" w:hAnsi="Courier New" w:hint="default"/>
+        <w:sz w:val="20"/>
+      </w:rPr>
+    </w:lvl>
+    <w:lvl w:ilvl="2" w:tentative="1">
+      <w:start w:val="1"/>
+      <w:numFmt w:val="bullet"/>
+      <w:lvlText w:val=""/>
+      <w:lvlJc w:val="left"/>
+      <w:pPr>
+        <w:tabs>
+          <w:tab w:val="num" w:pos="2160"/>
+        </w:tabs>
+        <w:ind w:left="2160" w:hanging="360"/>
+      </w:pPr>
+      <w:rPr>
+        <w:rFonts w:ascii="Wingdings" w:hAnsi="Wingdings" w:hint="default"/>
+        <w:sz w:val="20"/>
+      </w:rPr>
+    </w:lvl>
+    <w:lvl w:ilvl="3" w:tentative="1">
+      <w:start w:val="1"/>
+      <w:numFmt w:val="bullet"/>
+      <w:lvlText w:val=""/>
+      <w:lvlJc w:val="left"/>
+      <w:pPr>
+        <w:tabs>
+          <w:tab w:val="num" w:pos="2880"/>
+        </w:tabs>
+        <w:ind w:left="2880" w:hanging="360"/>
+      </w:pPr>
+      <w:rPr>
+        <w:rFonts w:ascii="Wingdings" w:hAnsi="Wingdings" w:hint="default"/>
+        <w:sz w:val="20"/>
+      </w:rPr>
+    </w:lvl>
+    <w:lvl w:ilvl="4" w:tentative="1">
+      <w:start w:val="1"/>
+      <w:numFmt w:val="bullet"/>
+      <w:lvlText w:val=""/>
+      <w:lvlJc w:val="left"/>
+      <w:pPr>
+        <w:tabs>
+          <w:tab w:val="num" w:pos="3600"/>
+        </w:tabs>
+        <w:ind w:left="3600" w:hanging="360"/>
+      </w:pPr>
+      <w:rPr>
+        <w:rFonts w:ascii="Wingdings" w:hAnsi="Wingdings" w:hint="default"/>
+        <w:sz w:val="20"/>
+      </w:rPr>
+    </w:lvl>
+    <w:lvl w:ilvl="5" w:tentative="1">
+      <w:start w:val="1"/>
+      <w:numFmt w:val="bullet"/>
+      <w:lvlText w:val=""/>
+      <w:lvlJc w:val="left"/>
+      <w:pPr>
+        <w:tabs>
+          <w:tab w:val="num" w:pos="4320"/>
+        </w:tabs>
+        <w:ind w:left="4320" w:hanging="360"/>
+      </w:pPr>
+      <w:rPr>
+        <w:rFonts w:ascii="Wingdings" w:hAnsi="Wingdings" w:hint="default"/>
+        <w:sz w:val="20"/>
+      </w:rPr>
+    </w:lvl>
+    <w:lvl w:ilvl="6" w:tentative="1">
+      <w:start w:val="1"/>
+      <w:numFmt w:val="bullet"/>
+      <w:lvlText w:val=""/>
+      <w:lvlJc w:val="left"/>
+      <w:pPr>
+        <w:tabs>
+          <w:tab w:val="num" w:pos="5040"/>
+        </w:tabs>
+        <w:ind w:left="5040" w:hanging="360"/>
+      </w:pPr>
+      <w:rPr>
+        <w:rFonts w:ascii="Wingdings" w:hAnsi="Wingdings" w:hint="default"/>
+        <w:sz w:val="20"/>
+      </w:rPr>
+    </w:lvl>
+    <w:lvl w:ilvl="7" w:tentative="1">
+      <w:start w:val="1"/>
+      <w:numFmt w:val="bullet"/>
+      <w:lvlText w:val=""/>
+      <w:lvlJc w:val="left"/>
+      <w:pPr>
+        <w:tabs>
+          <w:tab w:val="num" w:pos="5760"/>
+        </w:tabs>
+        <w:ind w:left="5760" w:hanging="360"/>
+      </w:pPr>
+      <w:rPr>
+        <w:rFonts w:ascii="Wingdings" w:hAnsi="Wingdings" w:hint="default"/>
+        <w:sz w:val="20"/>
+      </w:rPr>
+    </w:lvl>
+    <w:lvl w:ilvl="8" w:tentative="1">
+      <w:start w:val="1"/>
+      <w:numFmt w:val="bullet"/>
+      <w:lvlText w:val=""/>
+      <w:lvlJc w:val="left"/>
+      <w:pPr>
+        <w:tabs>
+          <w:tab w:val="num" w:pos="6480"/>
+        </w:tabs>
+        <w:ind w:left="6480" w:hanging="360"/>
+      </w:pPr>
+      <w:rPr>
+        <w:rFonts w:ascii="Wingdings" w:hAnsi="Wingdings" w:hint="default"/>
+        <w:sz w:val="20"/>
+      </w:rPr>
+    </w:lvl>
+  </w:abstractNum>
+  <w:abstractNum w:abstractNumId="2" w15:restartNumberingAfterBreak="0">
     <w:nsid w:val="2C4A5FE5"/>
     <w:multiLevelType w:val="hybridMultilevel"/>
     <w:tmpl w:val="4C0C01A8"/>
@@ -29976,7 +30624,7 @@
       </w:rPr>
     </w:lvl>
   </w:abstractNum>
-  <w:abstractNum w:abstractNumId="2" w15:restartNumberingAfterBreak="0">
+  <w:abstractNum w:abstractNumId="3" w15:restartNumberingAfterBreak="0">
     <w:nsid w:val="36DC41F9"/>
     <w:multiLevelType w:val="hybridMultilevel"/>
     <w:tmpl w:val="53E86A60"/>
@@ -30089,7 +30737,7 @@
       </w:rPr>
     </w:lvl>
   </w:abstractNum>
-  <w:abstractNum w:abstractNumId="3" w15:restartNumberingAfterBreak="0">
+  <w:abstractNum w:abstractNumId="4" w15:restartNumberingAfterBreak="0">
     <w:nsid w:val="41E81218"/>
     <w:multiLevelType w:val="multilevel"/>
     <w:tmpl w:val="B136FE62"/>
@@ -30238,7 +30886,7 @@
       </w:rPr>
     </w:lvl>
   </w:abstractNum>
-  <w:abstractNum w:abstractNumId="4" w15:restartNumberingAfterBreak="0">
+  <w:abstractNum w:abstractNumId="5" w15:restartNumberingAfterBreak="0">
     <w:nsid w:val="44BF1291"/>
     <w:multiLevelType w:val="hybridMultilevel"/>
     <w:tmpl w:val="F97E0F68"/>
@@ -30351,7 +30999,7 @@
       </w:rPr>
     </w:lvl>
   </w:abstractNum>
-  <w:abstractNum w:abstractNumId="5" w15:restartNumberingAfterBreak="0">
+  <w:abstractNum w:abstractNumId="6" w15:restartNumberingAfterBreak="0">
     <w:nsid w:val="57313CB6"/>
     <w:multiLevelType w:val="hybridMultilevel"/>
     <w:tmpl w:val="7FDA4F68"/>
@@ -30437,7 +31085,7 @@
       </w:pPr>
     </w:lvl>
   </w:abstractNum>
-  <w:abstractNum w:abstractNumId="6" w15:restartNumberingAfterBreak="0">
+  <w:abstractNum w:abstractNumId="7" w15:restartNumberingAfterBreak="0">
     <w:nsid w:val="5D525599"/>
     <w:multiLevelType w:val="hybridMultilevel"/>
     <w:tmpl w:val="1B60AFBA"/>
@@ -30550,7 +31198,7 @@
       </w:rPr>
     </w:lvl>
   </w:abstractNum>
-  <w:abstractNum w:abstractNumId="7" w15:restartNumberingAfterBreak="0">
+  <w:abstractNum w:abstractNumId="8" w15:restartNumberingAfterBreak="0">
     <w:nsid w:val="66230B17"/>
     <w:multiLevelType w:val="hybridMultilevel"/>
     <w:tmpl w:val="3F062B98"/>
@@ -30663,7 +31311,7 @@
       </w:rPr>
     </w:lvl>
   </w:abstractNum>
-  <w:abstractNum w:abstractNumId="8" w15:restartNumberingAfterBreak="0">
+  <w:abstractNum w:abstractNumId="9" w15:restartNumberingAfterBreak="0">
     <w:nsid w:val="6CB36125"/>
     <w:multiLevelType w:val="hybridMultilevel"/>
     <w:tmpl w:val="47ACECFC"/>
@@ -30776,7 +31424,7 @@
       </w:rPr>
     </w:lvl>
   </w:abstractNum>
-  <w:abstractNum w:abstractNumId="9" w15:restartNumberingAfterBreak="0">
+  <w:abstractNum w:abstractNumId="10" w15:restartNumberingAfterBreak="0">
     <w:nsid w:val="6D982FAC"/>
     <w:multiLevelType w:val="hybridMultilevel"/>
     <w:tmpl w:val="0A70C7EA"/>
@@ -30889,10 +31537,10 @@
       </w:rPr>
     </w:lvl>
   </w:abstractNum>
-  <w:abstractNum w:abstractNumId="10" w15:restartNumberingAfterBreak="0">
-    <w:nsid w:val="78E2550D"/>
+  <w:abstractNum w:abstractNumId="11" w15:restartNumberingAfterBreak="0">
+    <w:nsid w:val="6E0C05A4"/>
     <w:multiLevelType w:val="multilevel"/>
-    <w:tmpl w:val="52645B1A"/>
+    <w:tmpl w:val="0EB80E12"/>
     <w:lvl w:ilvl="0">
       <w:start w:val="1"/>
       <w:numFmt w:val="bullet"/>
@@ -31038,38 +31686,345 @@
       </w:rPr>
     </w:lvl>
   </w:abstractNum>
+  <w:abstractNum w:abstractNumId="12" w15:restartNumberingAfterBreak="0">
+    <w:nsid w:val="78E2550D"/>
+    <w:multiLevelType w:val="multilevel"/>
+    <w:tmpl w:val="52645B1A"/>
+    <w:lvl w:ilvl="0">
+      <w:start w:val="1"/>
+      <w:numFmt w:val="bullet"/>
+      <w:lvlText w:val=""/>
+      <w:lvlJc w:val="left"/>
+      <w:pPr>
+        <w:tabs>
+          <w:tab w:val="num" w:pos="720"/>
+        </w:tabs>
+        <w:ind w:left="720" w:hanging="360"/>
+      </w:pPr>
+      <w:rPr>
+        <w:rFonts w:ascii="Symbol" w:hAnsi="Symbol" w:hint="default"/>
+        <w:sz w:val="20"/>
+      </w:rPr>
+    </w:lvl>
+    <w:lvl w:ilvl="1" w:tentative="1">
+      <w:start w:val="1"/>
+      <w:numFmt w:val="bullet"/>
+      <w:lvlText w:val="o"/>
+      <w:lvlJc w:val="left"/>
+      <w:pPr>
+        <w:tabs>
+          <w:tab w:val="num" w:pos="1440"/>
+        </w:tabs>
+        <w:ind w:left="1440" w:hanging="360"/>
+      </w:pPr>
+      <w:rPr>
+        <w:rFonts w:ascii="Courier New" w:hAnsi="Courier New" w:hint="default"/>
+        <w:sz w:val="20"/>
+      </w:rPr>
+    </w:lvl>
+    <w:lvl w:ilvl="2" w:tentative="1">
+      <w:start w:val="1"/>
+      <w:numFmt w:val="bullet"/>
+      <w:lvlText w:val=""/>
+      <w:lvlJc w:val="left"/>
+      <w:pPr>
+        <w:tabs>
+          <w:tab w:val="num" w:pos="2160"/>
+        </w:tabs>
+        <w:ind w:left="2160" w:hanging="360"/>
+      </w:pPr>
+      <w:rPr>
+        <w:rFonts w:ascii="Wingdings" w:hAnsi="Wingdings" w:hint="default"/>
+        <w:sz w:val="20"/>
+      </w:rPr>
+    </w:lvl>
+    <w:lvl w:ilvl="3" w:tentative="1">
+      <w:start w:val="1"/>
+      <w:numFmt w:val="bullet"/>
+      <w:lvlText w:val=""/>
+      <w:lvlJc w:val="left"/>
+      <w:pPr>
+        <w:tabs>
+          <w:tab w:val="num" w:pos="2880"/>
+        </w:tabs>
+        <w:ind w:left="2880" w:hanging="360"/>
+      </w:pPr>
+      <w:rPr>
+        <w:rFonts w:ascii="Wingdings" w:hAnsi="Wingdings" w:hint="default"/>
+        <w:sz w:val="20"/>
+      </w:rPr>
+    </w:lvl>
+    <w:lvl w:ilvl="4" w:tentative="1">
+      <w:start w:val="1"/>
+      <w:numFmt w:val="bullet"/>
+      <w:lvlText w:val=""/>
+      <w:lvlJc w:val="left"/>
+      <w:pPr>
+        <w:tabs>
+          <w:tab w:val="num" w:pos="3600"/>
+        </w:tabs>
+        <w:ind w:left="3600" w:hanging="360"/>
+      </w:pPr>
+      <w:rPr>
+        <w:rFonts w:ascii="Wingdings" w:hAnsi="Wingdings" w:hint="default"/>
+        <w:sz w:val="20"/>
+      </w:rPr>
+    </w:lvl>
+    <w:lvl w:ilvl="5" w:tentative="1">
+      <w:start w:val="1"/>
+      <w:numFmt w:val="bullet"/>
+      <w:lvlText w:val=""/>
+      <w:lvlJc w:val="left"/>
+      <w:pPr>
+        <w:tabs>
+          <w:tab w:val="num" w:pos="4320"/>
+        </w:tabs>
+        <w:ind w:left="4320" w:hanging="360"/>
+      </w:pPr>
+      <w:rPr>
+        <w:rFonts w:ascii="Wingdings" w:hAnsi="Wingdings" w:hint="default"/>
+        <w:sz w:val="20"/>
+      </w:rPr>
+    </w:lvl>
+    <w:lvl w:ilvl="6" w:tentative="1">
+      <w:start w:val="1"/>
+      <w:numFmt w:val="bullet"/>
+      <w:lvlText w:val=""/>
+      <w:lvlJc w:val="left"/>
+      <w:pPr>
+        <w:tabs>
+          <w:tab w:val="num" w:pos="5040"/>
+        </w:tabs>
+        <w:ind w:left="5040" w:hanging="360"/>
+      </w:pPr>
+      <w:rPr>
+        <w:rFonts w:ascii="Wingdings" w:hAnsi="Wingdings" w:hint="default"/>
+        <w:sz w:val="20"/>
+      </w:rPr>
+    </w:lvl>
+    <w:lvl w:ilvl="7" w:tentative="1">
+      <w:start w:val="1"/>
+      <w:numFmt w:val="bullet"/>
+      <w:lvlText w:val=""/>
+      <w:lvlJc w:val="left"/>
+      <w:pPr>
+        <w:tabs>
+          <w:tab w:val="num" w:pos="5760"/>
+        </w:tabs>
+        <w:ind w:left="5760" w:hanging="360"/>
+      </w:pPr>
+      <w:rPr>
+        <w:rFonts w:ascii="Wingdings" w:hAnsi="Wingdings" w:hint="default"/>
+        <w:sz w:val="20"/>
+      </w:rPr>
+    </w:lvl>
+    <w:lvl w:ilvl="8" w:tentative="1">
+      <w:start w:val="1"/>
+      <w:numFmt w:val="bullet"/>
+      <w:lvlText w:val=""/>
+      <w:lvlJc w:val="left"/>
+      <w:pPr>
+        <w:tabs>
+          <w:tab w:val="num" w:pos="6480"/>
+        </w:tabs>
+        <w:ind w:left="6480" w:hanging="360"/>
+      </w:pPr>
+      <w:rPr>
+        <w:rFonts w:ascii="Wingdings" w:hAnsi="Wingdings" w:hint="default"/>
+        <w:sz w:val="20"/>
+      </w:rPr>
+    </w:lvl>
+  </w:abstractNum>
+  <w:abstractNum w:abstractNumId="13" w15:restartNumberingAfterBreak="0">
+    <w:nsid w:val="7E694FFE"/>
+    <w:multiLevelType w:val="multilevel"/>
+    <w:tmpl w:val="B136FE62"/>
+    <w:lvl w:ilvl="0">
+      <w:start w:val="1"/>
+      <w:numFmt w:val="decimal"/>
+      <w:lvlText w:val="%1."/>
+      <w:lvlJc w:val="left"/>
+      <w:pPr>
+        <w:tabs>
+          <w:tab w:val="num" w:pos="720"/>
+        </w:tabs>
+        <w:ind w:left="720" w:hanging="360"/>
+      </w:pPr>
+      <w:rPr>
+        <w:rFonts w:hint="default"/>
+        <w:sz w:val="20"/>
+      </w:rPr>
+    </w:lvl>
+    <w:lvl w:ilvl="1" w:tentative="1">
+      <w:start w:val="1"/>
+      <w:numFmt w:val="bullet"/>
+      <w:lvlText w:val="o"/>
+      <w:lvlJc w:val="left"/>
+      <w:pPr>
+        <w:tabs>
+          <w:tab w:val="num" w:pos="1440"/>
+        </w:tabs>
+        <w:ind w:left="1440" w:hanging="360"/>
+      </w:pPr>
+      <w:rPr>
+        <w:rFonts w:ascii="Courier New" w:hAnsi="Courier New" w:hint="default"/>
+        <w:sz w:val="20"/>
+      </w:rPr>
+    </w:lvl>
+    <w:lvl w:ilvl="2" w:tentative="1">
+      <w:start w:val="1"/>
+      <w:numFmt w:val="bullet"/>
+      <w:lvlText w:val=""/>
+      <w:lvlJc w:val="left"/>
+      <w:pPr>
+        <w:tabs>
+          <w:tab w:val="num" w:pos="2160"/>
+        </w:tabs>
+        <w:ind w:left="2160" w:hanging="360"/>
+      </w:pPr>
+      <w:rPr>
+        <w:rFonts w:ascii="Wingdings" w:hAnsi="Wingdings" w:hint="default"/>
+        <w:sz w:val="20"/>
+      </w:rPr>
+    </w:lvl>
+    <w:lvl w:ilvl="3" w:tentative="1">
+      <w:start w:val="1"/>
+      <w:numFmt w:val="bullet"/>
+      <w:lvlText w:val=""/>
+      <w:lvlJc w:val="left"/>
+      <w:pPr>
+        <w:tabs>
+          <w:tab w:val="num" w:pos="2880"/>
+        </w:tabs>
+        <w:ind w:left="2880" w:hanging="360"/>
+      </w:pPr>
+      <w:rPr>
+        <w:rFonts w:ascii="Wingdings" w:hAnsi="Wingdings" w:hint="default"/>
+        <w:sz w:val="20"/>
+      </w:rPr>
+    </w:lvl>
+    <w:lvl w:ilvl="4" w:tentative="1">
+      <w:start w:val="1"/>
+      <w:numFmt w:val="bullet"/>
+      <w:lvlText w:val=""/>
+      <w:lvlJc w:val="left"/>
+      <w:pPr>
+        <w:tabs>
+          <w:tab w:val="num" w:pos="3600"/>
+        </w:tabs>
+        <w:ind w:left="3600" w:hanging="360"/>
+      </w:pPr>
+      <w:rPr>
+        <w:rFonts w:ascii="Wingdings" w:hAnsi="Wingdings" w:hint="default"/>
+        <w:sz w:val="20"/>
+      </w:rPr>
+    </w:lvl>
+    <w:lvl w:ilvl="5" w:tentative="1">
+      <w:start w:val="1"/>
+      <w:numFmt w:val="bullet"/>
+      <w:lvlText w:val=""/>
+      <w:lvlJc w:val="left"/>
+      <w:pPr>
+        <w:tabs>
+          <w:tab w:val="num" w:pos="4320"/>
+        </w:tabs>
+        <w:ind w:left="4320" w:hanging="360"/>
+      </w:pPr>
+      <w:rPr>
+        <w:rFonts w:ascii="Wingdings" w:hAnsi="Wingdings" w:hint="default"/>
+        <w:sz w:val="20"/>
+      </w:rPr>
+    </w:lvl>
+    <w:lvl w:ilvl="6" w:tentative="1">
+      <w:start w:val="1"/>
+      <w:numFmt w:val="bullet"/>
+      <w:lvlText w:val=""/>
+      <w:lvlJc w:val="left"/>
+      <w:pPr>
+        <w:tabs>
+          <w:tab w:val="num" w:pos="5040"/>
+        </w:tabs>
+        <w:ind w:left="5040" w:hanging="360"/>
+      </w:pPr>
+      <w:rPr>
+        <w:rFonts w:ascii="Wingdings" w:hAnsi="Wingdings" w:hint="default"/>
+        <w:sz w:val="20"/>
+      </w:rPr>
+    </w:lvl>
+    <w:lvl w:ilvl="7" w:tentative="1">
+      <w:start w:val="1"/>
+      <w:numFmt w:val="bullet"/>
+      <w:lvlText w:val=""/>
+      <w:lvlJc w:val="left"/>
+      <w:pPr>
+        <w:tabs>
+          <w:tab w:val="num" w:pos="5760"/>
+        </w:tabs>
+        <w:ind w:left="5760" w:hanging="360"/>
+      </w:pPr>
+      <w:rPr>
+        <w:rFonts w:ascii="Wingdings" w:hAnsi="Wingdings" w:hint="default"/>
+        <w:sz w:val="20"/>
+      </w:rPr>
+    </w:lvl>
+    <w:lvl w:ilvl="8" w:tentative="1">
+      <w:start w:val="1"/>
+      <w:numFmt w:val="bullet"/>
+      <w:lvlText w:val=""/>
+      <w:lvlJc w:val="left"/>
+      <w:pPr>
+        <w:tabs>
+          <w:tab w:val="num" w:pos="6480"/>
+        </w:tabs>
+        <w:ind w:left="6480" w:hanging="360"/>
+      </w:pPr>
+      <w:rPr>
+        <w:rFonts w:ascii="Wingdings" w:hAnsi="Wingdings" w:hint="default"/>
+        <w:sz w:val="20"/>
+      </w:rPr>
+    </w:lvl>
+  </w:abstractNum>
   <w:num w:numId="1" w16cid:durableId="789907295">
-    <w:abstractNumId w:val="8"/>
+    <w:abstractNumId w:val="9"/>
   </w:num>
   <w:num w:numId="2" w16cid:durableId="1912694649">
-    <w:abstractNumId w:val="6"/>
+    <w:abstractNumId w:val="7"/>
   </w:num>
   <w:num w:numId="3" w16cid:durableId="2093620482">
     <w:abstractNumId w:val="0"/>
   </w:num>
   <w:num w:numId="4" w16cid:durableId="875193461">
-    <w:abstractNumId w:val="1"/>
+    <w:abstractNumId w:val="2"/>
   </w:num>
   <w:num w:numId="5" w16cid:durableId="779377634">
-    <w:abstractNumId w:val="2"/>
+    <w:abstractNumId w:val="3"/>
   </w:num>
   <w:num w:numId="6" w16cid:durableId="1060136177">
+    <w:abstractNumId w:val="5"/>
+  </w:num>
+  <w:num w:numId="7" w16cid:durableId="1975480359">
+    <w:abstractNumId w:val="8"/>
+  </w:num>
+  <w:num w:numId="8" w16cid:durableId="612791505">
+    <w:abstractNumId w:val="6"/>
+  </w:num>
+  <w:num w:numId="9" w16cid:durableId="1634208837">
+    <w:abstractNumId w:val="10"/>
+  </w:num>
+  <w:num w:numId="10" w16cid:durableId="676884607">
+    <w:abstractNumId w:val="12"/>
+  </w:num>
+  <w:num w:numId="11" w16cid:durableId="2078672351">
     <w:abstractNumId w:val="4"/>
   </w:num>
-  <w:num w:numId="7" w16cid:durableId="1975480359">
-    <w:abstractNumId w:val="7"/>
+  <w:num w:numId="12" w16cid:durableId="42294265">
+    <w:abstractNumId w:val="13"/>
   </w:num>
-  <w:num w:numId="8" w16cid:durableId="612791505">
-    <w:abstractNumId w:val="5"/>
+  <w:num w:numId="13" w16cid:durableId="186800348">
+    <w:abstractNumId w:val="11"/>
   </w:num>
-  <w:num w:numId="9" w16cid:durableId="1634208837">
-    <w:abstractNumId w:val="9"/>
-  </w:num>
-  <w:num w:numId="10" w16cid:durableId="676884607">
-    <w:abstractNumId w:val="10"/>
-  </w:num>
-  <w:num w:numId="11" w16cid:durableId="2078672351">
-    <w:abstractNumId w:val="3"/>
+  <w:num w:numId="14" w16cid:durableId="1720593312">
+    <w:abstractNumId w:val="1"/>
   </w:num>
 </w:numbering>
 </file>
@@ -31474,7 +32429,7 @@
   <w:style w:type="paragraph" w:default="1" w:styleId="Norml">
     <w:name w:val="Normal"/>
     <w:qFormat/>
-    <w:rsid w:val="00E109C6"/>
+    <w:rsid w:val="00956F21"/>
     <w:pPr>
       <w:spacing w:line="360" w:lineRule="auto"/>
       <w:ind w:firstLine="227"/>

</xml_diff>

<commit_message>
Adding explanation to StandardCalculator and EuclideanSpaceCalculator in the documentation.
</commit_message>
<xml_diff>
--- a/Documentation.docx
+++ b/Documentation.docx
@@ -3857,15 +3857,7 @@
         <w:jc w:val="center"/>
       </w:pPr>
       <w:r>
-        <w:t xml:space="preserve">&lt;kép egy 0-nál kisebb számról ami rövidebb mint a </w:t>
-      </w:r>
-      <w:proofErr w:type="spellStart"/>
-      <w:r>
-        <w:t>fractionLength</w:t>
-      </w:r>
-      <w:proofErr w:type="spellEnd"/>
-      <w:r>
-        <w:t>&gt;</w:t>
+        <w:t>&lt;kép egy 0-nál kisebb számról ami rövidebb mint a fractionLength&gt;</w:t>
       </w:r>
     </w:p>
     <w:p>
@@ -4390,13 +4382,8 @@
         <w:t>long</w:t>
       </w:r>
       <w:r>
-        <w:t xml:space="preserve"> </w:t>
-      </w:r>
-      <w:proofErr w:type="spellStart"/>
-      <w:r>
-        <w:t>long</w:t>
-      </w:r>
-      <w:proofErr w:type="spellEnd"/>
+        <w:t xml:space="preserve"> long</w:t>
+      </w:r>
       <w:r>
         <w:t xml:space="preserve"> számtípus</w:t>
       </w:r>
@@ -5900,71 +5887,49 @@
         <w:rPr>
           <w:rFonts w:eastAsiaTheme="minorEastAsia"/>
         </w:rPr>
-        <w:t xml:space="preserve">François </w:t>
-      </w:r>
-      <w:proofErr w:type="spellStart"/>
+        <w:t>François Viète</w:t>
+      </w:r>
       <w:r>
         <w:rPr>
           <w:rFonts w:eastAsiaTheme="minorEastAsia"/>
         </w:rPr>
-        <w:t>Viète</w:t>
-      </w:r>
-      <w:proofErr w:type="spellEnd"/>
+        <w:t>, híres matematikus</w:t>
+      </w:r>
       <w:r>
         <w:rPr>
           <w:rFonts w:eastAsiaTheme="minorEastAsia"/>
         </w:rPr>
-        <w:t>, híres matematikus</w:t>
+        <w:t xml:space="preserve"> által </w:t>
       </w:r>
       <w:r>
         <w:rPr>
           <w:rFonts w:eastAsiaTheme="minorEastAsia"/>
         </w:rPr>
-        <w:t xml:space="preserve"> által </w:t>
+        <w:t xml:space="preserve">kifejlesztett </w:t>
       </w:r>
       <w:r>
         <w:rPr>
           <w:rFonts w:eastAsiaTheme="minorEastAsia"/>
         </w:rPr>
-        <w:t xml:space="preserve">kifejlesztett </w:t>
+        <w:t xml:space="preserve">módszert </w:t>
       </w:r>
       <w:r>
         <w:rPr>
           <w:rFonts w:eastAsiaTheme="minorEastAsia"/>
         </w:rPr>
-        <w:t xml:space="preserve">módszert </w:t>
+        <w:t>alkalmaz a könyvtár</w:t>
       </w:r>
       <w:r>
         <w:rPr>
           <w:rFonts w:eastAsiaTheme="minorEastAsia"/>
         </w:rPr>
-        <w:t>alkalmaz a könyvtár</w:t>
+        <w:t xml:space="preserve">, </w:t>
       </w:r>
       <w:r>
         <w:rPr>
           <w:rFonts w:eastAsiaTheme="minorEastAsia"/>
         </w:rPr>
-        <w:t xml:space="preserve">, </w:t>
-      </w:r>
-      <w:r>
-        <w:rPr>
-          <w:rFonts w:eastAsiaTheme="minorEastAsia"/>
-        </w:rPr>
-        <w:t xml:space="preserve">amit </w:t>
-      </w:r>
-      <w:proofErr w:type="spellStart"/>
-      <w:r>
-        <w:rPr>
-          <w:rFonts w:eastAsiaTheme="minorEastAsia"/>
-        </w:rPr>
-        <w:t>Viète</w:t>
-      </w:r>
-      <w:proofErr w:type="spellEnd"/>
-      <w:r>
-        <w:rPr>
-          <w:rFonts w:eastAsiaTheme="minorEastAsia"/>
-        </w:rPr>
-        <w:t xml:space="preserve"> </w:t>
+        <w:t xml:space="preserve">amit Viète </w:t>
       </w:r>
       <w:r>
         <w:rPr>
@@ -7192,15 +7157,7 @@
     </w:p>
     <w:p>
       <w:r>
-        <w:t xml:space="preserve">Egyszerűbben úgy tudnánk elképzelni a fenti számítást, mint a kézi osztás (long </w:t>
-      </w:r>
-      <w:proofErr w:type="spellStart"/>
-      <w:r>
-        <w:t>division</w:t>
-      </w:r>
-      <w:proofErr w:type="spellEnd"/>
-      <w:r>
-        <w:t xml:space="preserve">) műveletsorát. Itt is a legnagyobb helyiértékű számjegytől kezdve folyamatosan alulról közelítjük az eredményünket a valós értékhez. </w:t>
+        <w:t xml:space="preserve">Egyszerűbben úgy tudnánk elképzelni a fenti számítást, mint a kézi osztás (long division) műveletsorát. Itt is a legnagyobb helyiértékű számjegytől kezdve folyamatosan alulról közelítjük az eredményünket a valós értékhez. </w:t>
       </w:r>
       <w:r>
         <w:t>Éppen</w:t>
@@ -9624,128 +9581,44 @@
           <w:rFonts w:eastAsiaTheme="minorEastAsia"/>
           <w:iCs/>
         </w:rPr>
-        <w:t xml:space="preserve"> (</w:t>
-      </w:r>
-      <w:proofErr w:type="spellStart"/>
+        <w:t xml:space="preserve"> (binary splitting</w:t>
+      </w:r>
       <w:r>
         <w:rPr>
           <w:rFonts w:eastAsiaTheme="minorEastAsia"/>
           <w:iCs/>
         </w:rPr>
-        <w:t>binary</w:t>
-      </w:r>
-      <w:proofErr w:type="spellEnd"/>
+        <w:t xml:space="preserve">, másnéven </w:t>
+      </w:r>
       <w:r>
         <w:rPr>
           <w:rFonts w:eastAsiaTheme="minorEastAsia"/>
           <w:iCs/>
         </w:rPr>
-        <w:t xml:space="preserve"> </w:t>
-      </w:r>
-      <w:proofErr w:type="spellStart"/>
+        <w:t>divide-and-conquer summation</w:t>
+      </w:r>
       <w:r>
         <w:rPr>
           <w:rFonts w:eastAsiaTheme="minorEastAsia"/>
           <w:iCs/>
         </w:rPr>
-        <w:t>splitting</w:t>
-      </w:r>
-      <w:proofErr w:type="spellEnd"/>
+        <w:t xml:space="preserve">/product </w:t>
+      </w:r>
       <w:r>
         <w:rPr>
           <w:rFonts w:eastAsiaTheme="minorEastAsia"/>
           <w:iCs/>
         </w:rPr>
-        <w:t xml:space="preserve">, másnéven </w:t>
-      </w:r>
-      <w:proofErr w:type="spellStart"/>
+        <w:lastRenderedPageBreak/>
+        <w:t xml:space="preserve">vagy </w:t>
+      </w:r>
       <w:r>
         <w:rPr>
           <w:rFonts w:eastAsiaTheme="minorEastAsia"/>
           <w:iCs/>
         </w:rPr>
-        <w:t>divide</w:t>
-      </w:r>
-      <w:proofErr w:type="spellEnd"/>
-      <w:r>
-        <w:rPr>
-          <w:rFonts w:eastAsiaTheme="minorEastAsia"/>
-          <w:iCs/>
-        </w:rPr>
-        <w:t>-and-</w:t>
-      </w:r>
-      <w:proofErr w:type="spellStart"/>
-      <w:r>
-        <w:rPr>
-          <w:rFonts w:eastAsiaTheme="minorEastAsia"/>
-          <w:iCs/>
-        </w:rPr>
-        <w:t>conquer</w:t>
-      </w:r>
-      <w:proofErr w:type="spellEnd"/>
-      <w:r>
-        <w:rPr>
-          <w:rFonts w:eastAsiaTheme="minorEastAsia"/>
-          <w:iCs/>
-        </w:rPr>
-        <w:t xml:space="preserve"> </w:t>
-      </w:r>
-      <w:proofErr w:type="spellStart"/>
-      <w:r>
-        <w:rPr>
-          <w:rFonts w:eastAsiaTheme="minorEastAsia"/>
-          <w:iCs/>
-        </w:rPr>
-        <w:t>summation</w:t>
-      </w:r>
-      <w:proofErr w:type="spellEnd"/>
-      <w:r>
-        <w:rPr>
-          <w:rFonts w:eastAsiaTheme="minorEastAsia"/>
-          <w:iCs/>
-        </w:rPr>
-        <w:t>/</w:t>
-      </w:r>
-      <w:proofErr w:type="spellStart"/>
-      <w:r>
-        <w:rPr>
-          <w:rFonts w:eastAsiaTheme="minorEastAsia"/>
-          <w:iCs/>
-        </w:rPr>
-        <w:t>product</w:t>
-      </w:r>
-      <w:proofErr w:type="spellEnd"/>
-      <w:r>
-        <w:rPr>
-          <w:rFonts w:eastAsiaTheme="minorEastAsia"/>
-          <w:iCs/>
-        </w:rPr>
-        <w:t xml:space="preserve"> </w:t>
-      </w:r>
-      <w:r>
-        <w:rPr>
-          <w:rFonts w:eastAsiaTheme="minorEastAsia"/>
-          <w:iCs/>
-        </w:rPr>
-        <w:lastRenderedPageBreak/>
-        <w:t xml:space="preserve">vagy </w:t>
-      </w:r>
-      <w:r>
-        <w:rPr>
-          <w:rFonts w:eastAsiaTheme="minorEastAsia"/>
-          <w:iCs/>
-        </w:rPr>
-        <w:t xml:space="preserve">prefix </w:t>
-      </w:r>
-      <w:proofErr w:type="spellStart"/>
-      <w:r>
-        <w:rPr>
-          <w:rFonts w:eastAsiaTheme="minorEastAsia"/>
-          <w:iCs/>
-        </w:rPr>
-        <w:t>product</w:t>
-      </w:r>
-      <w:proofErr w:type="spellEnd"/>
+        <w:t>prefix product</w:t>
+      </w:r>
       <w:r>
         <w:rPr>
           <w:rFonts w:eastAsiaTheme="minorEastAsia"/>
@@ -19238,15 +19111,13 @@
         </w:rPr>
         <w:t xml:space="preserve"> </w:t>
       </w:r>
-      <w:proofErr w:type="spellStart"/>
       <w:r>
         <w:rPr>
           <w:rFonts w:eastAsiaTheme="minorEastAsia"/>
           <w:iCs/>
         </w:rPr>
-        <w:t>Srinivasa</w:t>
-      </w:r>
-      <w:proofErr w:type="spellEnd"/>
+        <w:t>Srinivasa Ramanujan</w:t>
+      </w:r>
       <w:r>
         <w:rPr>
           <w:rFonts w:eastAsiaTheme="minorEastAsia"/>
@@ -19254,58 +19125,26 @@
         </w:rPr>
         <w:t xml:space="preserve"> </w:t>
       </w:r>
-      <w:proofErr w:type="spellStart"/>
       <w:r>
         <w:rPr>
           <w:rFonts w:eastAsiaTheme="minorEastAsia"/>
           <w:iCs/>
         </w:rPr>
-        <w:t>Ramanujan</w:t>
-      </w:r>
-      <w:proofErr w:type="spellEnd"/>
+        <w:t>inspirált</w:t>
+      </w:r>
       <w:r>
         <w:rPr>
           <w:rFonts w:eastAsiaTheme="minorEastAsia"/>
           <w:iCs/>
         </w:rPr>
-        <w:t xml:space="preserve"> </w:t>
+        <w:t>a</w:t>
       </w:r>
       <w:r>
         <w:rPr>
           <w:rFonts w:eastAsiaTheme="minorEastAsia"/>
           <w:iCs/>
         </w:rPr>
-        <w:t>inspirált</w:t>
-      </w:r>
-      <w:r>
-        <w:rPr>
-          <w:rFonts w:eastAsiaTheme="minorEastAsia"/>
-          <w:iCs/>
-        </w:rPr>
-        <w:t>a</w:t>
-      </w:r>
-      <w:r>
-        <w:rPr>
-          <w:rFonts w:eastAsiaTheme="minorEastAsia"/>
-          <w:iCs/>
-        </w:rPr>
-        <w:t xml:space="preserve">, </w:t>
-      </w:r>
-      <w:proofErr w:type="spellStart"/>
-      <w:r>
-        <w:rPr>
-          <w:rFonts w:eastAsiaTheme="minorEastAsia"/>
-          <w:iCs/>
-        </w:rPr>
-        <w:t>Chudnovsky</w:t>
-      </w:r>
-      <w:proofErr w:type="spellEnd"/>
-      <w:r>
-        <w:rPr>
-          <w:rFonts w:eastAsiaTheme="minorEastAsia"/>
-          <w:iCs/>
-        </w:rPr>
-        <w:t xml:space="preserve"> fivérek</w:t>
+        <w:t>, Chudnovsky fivérek</w:t>
       </w:r>
       <w:r>
         <w:rPr>
@@ -27959,21 +27798,12 @@
           <w:iCs/>
         </w:rPr>
       </w:pPr>
-      <w:proofErr w:type="spellStart"/>
       <w:r>
         <w:rPr>
           <w:rFonts w:eastAsiaTheme="minorEastAsia"/>
           <w:iCs/>
         </w:rPr>
-        <w:t>Leonhard</w:t>
-      </w:r>
-      <w:proofErr w:type="spellEnd"/>
-      <w:r>
-        <w:rPr>
-          <w:rFonts w:eastAsiaTheme="minorEastAsia"/>
-          <w:iCs/>
-        </w:rPr>
-        <w:t xml:space="preserve"> Euler bizonyította, hogy ez az érték kifejezhető a következő végtelen sor használatával:</w:t>
+        <w:t>Leonhard Euler bizonyította, hogy ez az érték kifejezhető a következő végtelen sor használatával:</w:t>
       </w:r>
     </w:p>
     <w:p>
@@ -28633,15 +28463,7 @@
         <w:t>Ez a részleg felelős a szöveg feldarabolásáért.</w:t>
       </w:r>
       <w:r>
-        <w:t xml:space="preserve"> Hogy a parser tudja, milyen formájú egységekre kell felbontani a szöveget, minden egyes számológép egy reguláris kifejezésekből álló (</w:t>
-      </w:r>
-      <w:proofErr w:type="spellStart"/>
-      <w:r>
-        <w:t>Regex</w:t>
-      </w:r>
-      <w:proofErr w:type="spellEnd"/>
-      <w:r>
-        <w:t xml:space="preserve">) listát tart fent magán belül. Ez a rendszer a leghosszabb illeszkedés elvét követi, miszerint </w:t>
+        <w:t xml:space="preserve"> Hogy a parser tudja, milyen formájú egységekre kell felbontani a szöveget, minden egyes számológép egy reguláris kifejezésekből álló (Regex) listát tart fent magán belül. Ez a rendszer a leghosszabb illeszkedés elvét követi, miszerint </w:t>
       </w:r>
       <w:r>
         <w:t>a következő vágást a sor elejétől számított leghosszabban a karaktersorozatra illeszkedő szakasz végén kell megejteni.</w:t>
@@ -28663,6 +28485,9 @@
       <w:r>
         <w:t>A kezdeti szavunk legyen az üres szó</w:t>
       </w:r>
+      <w:r>
+        <w:t>.</w:t>
+      </w:r>
     </w:p>
     <w:p>
       <w:pPr>
@@ -28675,6 +28500,9 @@
       <w:r>
         <w:t>Vegyünk hozzá a szavunk végére a kiértékelendő szöveg elejéről</w:t>
       </w:r>
+      <w:r>
+        <w:t>.</w:t>
+      </w:r>
     </w:p>
     <w:p>
       <w:pPr>
@@ -28685,7 +28513,10 @@
         </w:numPr>
       </w:pPr>
       <w:r>
-        <w:t xml:space="preserve">Értékeljük ki, hogy illeszkedik-e erre a szóra reguláris kifejezés; </w:t>
+        <w:t>Értékeljük ki, hogy illeszkedik-e erre a szóra reguláris kifejezés</w:t>
+      </w:r>
+      <w:r>
+        <w:t>.</w:t>
       </w:r>
     </w:p>
     <w:p>
@@ -28706,7 +28537,16 @@
         <w:t xml:space="preserve"> az első ilyen kifejezést;</w:t>
       </w:r>
       <w:r>
-        <w:t xml:space="preserve"> ha pedig nem, akkor maradjon az előző eltárolt kifejezés az érték</w:t>
+        <w:t xml:space="preserve"> </w:t>
+      </w:r>
+      <w:r>
+        <w:t>h</w:t>
+      </w:r>
+      <w:r>
+        <w:t>a pedig nem, akkor maradjon az előző eltárolt kifejezés az érték</w:t>
+      </w:r>
+      <w:r>
+        <w:t>.</w:t>
       </w:r>
     </w:p>
     <w:p>
@@ -28716,12 +28556,34 @@
           <w:ilvl w:val="0"/>
           <w:numId w:val="8"/>
         </w:numPr>
+        <w:jc w:val="center"/>
       </w:pPr>
       <w:r>
         <w:t xml:space="preserve">Amennyiben </w:t>
       </w:r>
       <w:r>
-        <w:t>nem volt illeszkedés, akkor a szavunk az utolsó betűjén kívül a leghosszabb olyan szakasz, amely illeszkedik az adott reguláris kifejezések valamelyikére, az a reguláris kifejezés pedig pont az amit legutoljára eltároltunk</w:t>
+        <w:t>nem volt illeszkedés, akkor a szavunk az utolsó betűjén kívül a leghosszabb olyan szakasz, amely illeszkedik az adott reguláris kifejezések valamelyikére</w:t>
+      </w:r>
+      <w:r>
+        <w:t>.</w:t>
+      </w:r>
+      <w:r>
+        <w:t xml:space="preserve"> </w:t>
+      </w:r>
+      <w:r>
+        <w:t>A</w:t>
+      </w:r>
+      <w:r>
+        <w:t>z a reguláris kifejezés pedig pont az</w:t>
+      </w:r>
+      <w:r>
+        <w:t>,</w:t>
+      </w:r>
+      <w:r>
+        <w:t xml:space="preserve"> amit legutoljára eltároltunk</w:t>
+      </w:r>
+      <w:r>
+        <w:t>.</w:t>
       </w:r>
     </w:p>
     <w:p>
@@ -28735,6 +28597,9 @@
       <w:r>
         <w:t>A szavunk utolsó betűje lesz az új szavunk, az eltárolt reguláris kifejezést pedig üresre állítjuk és folytatjuk az algoritmust a 2. ponttól</w:t>
       </w:r>
+      <w:r>
+        <w:t>.</w:t>
+      </w:r>
     </w:p>
     <w:p>
       <w:pPr>
@@ -28764,11 +28629,66 @@
         </w:numPr>
       </w:pPr>
       <w:r>
-        <w:t xml:space="preserve">A reguláris kifejezések megalkotásánál figyelembe kell venni, hogy egy helyes szó a kiértékelés minden egyes fázisában felismerhető. Vagyis például a cica kulcsszó </w:t>
+        <w:t xml:space="preserve">A reguláris kifejezések megalkotásánál figyelembe kell venni, hogy egy helyes szó a kiértékelés minden egyes fázisában felismerhető. Vagyis például a </w:t>
+      </w:r>
+      <m:oMath>
+        <m:r>
+          <w:rPr>
+            <w:rFonts w:ascii="Cambria Math" w:hAnsi="Cambria Math"/>
+          </w:rPr>
+          <m:t>cica</m:t>
+        </m:r>
+      </m:oMath>
+      <w:r>
+        <w:t xml:space="preserve"> kulcsszó </w:t>
       </w:r>
       <w:r>
         <w:lastRenderedPageBreak/>
-        <w:t>esetében legalább az egyik reguláris kifejezéssel felismerhetők a c, ci, cic és cica fázisok is.</w:t>
+        <w:t xml:space="preserve">esetében legalább az egyik reguláris kifejezéssel felismerhetők a </w:t>
+      </w:r>
+      <m:oMath>
+        <m:r>
+          <w:rPr>
+            <w:rFonts w:ascii="Cambria Math" w:hAnsi="Cambria Math"/>
+          </w:rPr>
+          <m:t>c</m:t>
+        </m:r>
+      </m:oMath>
+      <w:r>
+        <w:t xml:space="preserve">, </w:t>
+      </w:r>
+      <m:oMath>
+        <m:r>
+          <w:rPr>
+            <w:rFonts w:ascii="Cambria Math" w:hAnsi="Cambria Math"/>
+          </w:rPr>
+          <m:t>ci</m:t>
+        </m:r>
+      </m:oMath>
+      <w:r>
+        <w:t xml:space="preserve">, </w:t>
+      </w:r>
+      <m:oMath>
+        <m:r>
+          <w:rPr>
+            <w:rFonts w:ascii="Cambria Math" w:hAnsi="Cambria Math"/>
+          </w:rPr>
+          <m:t>cic</m:t>
+        </m:r>
+      </m:oMath>
+      <w:r>
+        <w:t xml:space="preserve"> és </w:t>
+      </w:r>
+      <m:oMath>
+        <m:r>
+          <w:rPr>
+            <w:rFonts w:ascii="Cambria Math" w:hAnsi="Cambria Math"/>
+          </w:rPr>
+          <m:t>cica</m:t>
+        </m:r>
+      </m:oMath>
+      <w:r>
+        <w:t xml:space="preserve"> fázisok is.</w:t>
       </w:r>
     </w:p>
     <w:p>
@@ -28794,7 +28714,7 @@
         </w:numPr>
       </w:pPr>
       <w:r>
-        <w:t xml:space="preserve">Hogy a lehető legkevesebb munkát kelljen elvégezni és ne kelljen minden alkalommal végig nézni az összes reguláris kifejezést, használjuk az első felismert kifejezést. Viszont akkor úgy kell sorba állítanunk a </w:t>
+        <w:t xml:space="preserve">Hogy a lehető legkevesebb munkát kelljen elvégezni és ne kelljen minden alkalommal végignézni az összes reguláris kifejezést, használjuk az első felismert kifejezést. Viszont akkor úgy kell sorba állítanunk a </w:t>
       </w:r>
       <w:r>
         <w:t>lista</w:t>
@@ -28816,15 +28736,7 @@
         <w:pStyle w:val="Cmsor3"/>
       </w:pPr>
       <w:r>
-        <w:t>Absztrakt számológép (</w:t>
-      </w:r>
-      <w:proofErr w:type="spellStart"/>
-      <w:r>
-        <w:t>Calculator</w:t>
-      </w:r>
-      <w:proofErr w:type="spellEnd"/>
-      <w:r>
-        <w:t>)</w:t>
+        <w:t>Absztrakt számológép (Calculator)</w:t>
       </w:r>
     </w:p>
     <w:p>
@@ -28861,7 +28773,19 @@
     </w:p>
     <w:p>
       <w:r>
-        <w:t>Tegyük fel. hogy van egy egyszerű számológép típusunk, amivel a parser dolgozik. A szöveg bemegy, majd kijön a szépen feldarabolt eredmény. Rá kell jönnünk, hogy ekkor még mindig nem vagyunk sehol. Ahhoz, hogy a program értelmezni tudja a szövegünket többre lesz szükség.</w:t>
+        <w:t>Tegyük fel</w:t>
+      </w:r>
+      <w:r>
+        <w:t>,</w:t>
+      </w:r>
+      <w:r>
+        <w:t xml:space="preserve"> hogy van egy egyszerű számológép típusunk, amivel a parser dolgozik. A szöveg bemegy, majd kijön a szépen feldarabolt eredmény. Rá kell jönnünk, hogy ekkor még mindig nem vagyunk sehol. Ahhoz, hogy a program értelmezni tudja a</w:t>
+      </w:r>
+      <w:r>
+        <w:t xml:space="preserve">z egyes szavakat és ezáltal végül a teljes szöveget </w:t>
+      </w:r>
+      <w:r>
+        <w:t>többre lesz szükség.</w:t>
       </w:r>
     </w:p>
     <w:p>
@@ -28892,15 +28816,7 @@
         <w:jc w:val="center"/>
       </w:pPr>
       <w:r>
-        <w:t xml:space="preserve">&lt;Kép az absztrakt </w:t>
-      </w:r>
-      <w:proofErr w:type="spellStart"/>
-      <w:r>
-        <w:t>Calculator</w:t>
-      </w:r>
-      <w:proofErr w:type="spellEnd"/>
-      <w:r>
-        <w:t xml:space="preserve"> osztály kifejezésfájáról</w:t>
+        <w:t>&lt;Kép az absztrakt Calculator osztály kifejezésfájáról</w:t>
       </w:r>
       <w:r>
         <w:t xml:space="preserve"> (UML)</w:t>
@@ -28915,95 +28831,380 @@
       </w:r>
     </w:p>
     <w:p>
-      <w:r>
-        <w:t>Expression:</w:t>
-      </w:r>
-    </w:p>
-    <w:p>
-      <w:proofErr w:type="spellStart"/>
+      <w:pPr>
+        <w:pStyle w:val="Listaszerbekezds"/>
+        <w:numPr>
+          <w:ilvl w:val="0"/>
+          <w:numId w:val="9"/>
+        </w:numPr>
+      </w:pPr>
+      <w:r>
+        <w:rPr>
+          <w:b/>
+          <w:bCs/>
+        </w:rPr>
+        <w:t>Expression</w:t>
+      </w:r>
+      <w:r>
+        <w:t>:</w:t>
+      </w:r>
+      <w:r>
+        <w:t xml:space="preserve"> </w:t>
+      </w:r>
+      <w:r>
+        <w:t>Egy kifejezés legáltalánosabb leírása.</w:t>
+      </w:r>
+      <w:r>
+        <w:t xml:space="preserve"> Akár inteface is lehetne.</w:t>
+      </w:r>
+    </w:p>
+    <w:p>
+      <w:pPr>
+        <w:jc w:val="center"/>
+      </w:pPr>
       <w:r>
         <w:lastRenderedPageBreak/>
+        <w:t>&lt;Kép az osztálydiagrammról&gt;</w:t>
+      </w:r>
+    </w:p>
+    <w:p>
+      <w:pPr>
+        <w:pStyle w:val="Listaszerbekezds"/>
+        <w:numPr>
+          <w:ilvl w:val="0"/>
+          <w:numId w:val="9"/>
+        </w:numPr>
+      </w:pPr>
+      <w:r>
+        <w:rPr>
+          <w:b/>
+          <w:bCs/>
+        </w:rPr>
         <w:t>ValueHolder</w:t>
       </w:r>
-      <w:proofErr w:type="spellEnd"/>
       <w:r>
         <w:t>:</w:t>
       </w:r>
-    </w:p>
-    <w:p>
-      <w:r>
-        <w:t>Term:</w:t>
-      </w:r>
-    </w:p>
-    <w:p>
-      <w:proofErr w:type="spellStart"/>
-      <w:r>
+      <w:r>
+        <w:t xml:space="preserve"> </w:t>
+      </w:r>
+      <w:r>
+        <w:t>Egy értéket képviselő elem. Mivel nem minden kifejezés hordoz magával értéket, így érdemes fenntartani egy ilyen csoportot.</w:t>
+      </w:r>
+    </w:p>
+    <w:p>
+      <w:pPr>
+        <w:jc w:val="center"/>
+      </w:pPr>
+      <w:r>
+        <w:t>&lt;Kép az osztálydiagrammról&gt;</w:t>
+      </w:r>
+    </w:p>
+    <w:p>
+      <w:pPr>
+        <w:pStyle w:val="Listaszerbekezds"/>
+        <w:numPr>
+          <w:ilvl w:val="0"/>
+          <w:numId w:val="9"/>
+        </w:numPr>
+      </w:pPr>
+      <w:r>
+        <w:rPr>
+          <w:b/>
+          <w:bCs/>
+        </w:rPr>
+        <w:t>Term</w:t>
+      </w:r>
+      <w:r>
+        <w:t>:</w:t>
+      </w:r>
+      <w:r>
+        <w:t xml:space="preserve"> </w:t>
+      </w:r>
+      <w:r>
+        <w:t>Egy önmagában értéket képviselő elem. Nem befolyásolja a környezete.</w:t>
+      </w:r>
+    </w:p>
+    <w:p>
+      <w:pPr>
+        <w:jc w:val="center"/>
+      </w:pPr>
+      <w:r>
+        <w:t>&lt;Kép az osztálydiagrammról&gt;</w:t>
+      </w:r>
+    </w:p>
+    <w:p>
+      <w:pPr>
+        <w:pStyle w:val="Listaszerbekezds"/>
+        <w:numPr>
+          <w:ilvl w:val="0"/>
+          <w:numId w:val="9"/>
+        </w:numPr>
+      </w:pPr>
+      <w:r>
+        <w:rPr>
+          <w:b/>
+          <w:bCs/>
+        </w:rPr>
         <w:t>Parenthesized</w:t>
       </w:r>
-      <w:proofErr w:type="spellEnd"/>
       <w:r>
         <w:t>:</w:t>
       </w:r>
-    </w:p>
-    <w:p>
-      <w:proofErr w:type="spellStart"/>
-      <w:r>
+      <w:r>
+        <w:t xml:space="preserve"> </w:t>
+      </w:r>
+      <w:r>
+        <w:t>Egy zárójelezett szakasz.</w:t>
+      </w:r>
+    </w:p>
+    <w:p>
+      <w:pPr>
+        <w:jc w:val="center"/>
+      </w:pPr>
+      <w:r>
+        <w:t>&lt;Kép az osztálydiagrammról&gt;</w:t>
+      </w:r>
+    </w:p>
+    <w:p>
+      <w:pPr>
+        <w:pStyle w:val="Listaszerbekezds"/>
+        <w:numPr>
+          <w:ilvl w:val="0"/>
+          <w:numId w:val="9"/>
+        </w:numPr>
+      </w:pPr>
+      <w:r>
+        <w:rPr>
+          <w:b/>
+          <w:bCs/>
+        </w:rPr>
         <w:t>FunctionBase</w:t>
       </w:r>
-      <w:proofErr w:type="spellEnd"/>
       <w:r>
         <w:t>:</w:t>
       </w:r>
-    </w:p>
-    <w:p>
-      <w:r>
-        <w:t>Operator:</w:t>
-      </w:r>
-    </w:p>
-    <w:p>
-      <w:proofErr w:type="spellStart"/>
-      <w:r>
+      <w:r>
+        <w:t xml:space="preserve"> </w:t>
+      </w:r>
+      <w:r>
+        <w:t>Egy függvény általánosított alakja.</w:t>
+      </w:r>
+    </w:p>
+    <w:p>
+      <w:pPr>
+        <w:jc w:val="center"/>
+      </w:pPr>
+      <w:r>
+        <w:t>&lt;Kép az osztálydiagrammról&gt;</w:t>
+      </w:r>
+    </w:p>
+    <w:p>
+      <w:pPr>
+        <w:pStyle w:val="Listaszerbekezds"/>
+        <w:numPr>
+          <w:ilvl w:val="0"/>
+          <w:numId w:val="9"/>
+        </w:numPr>
+      </w:pPr>
+      <w:r>
+        <w:rPr>
+          <w:b/>
+          <w:bCs/>
+        </w:rPr>
+        <w:t>Operator</w:t>
+      </w:r>
+      <w:r>
+        <w:t>:</w:t>
+      </w:r>
+      <w:r>
+        <w:t xml:space="preserve"> </w:t>
+      </w:r>
+      <w:r>
+        <w:t>Infix függvény megvalósítás.</w:t>
+      </w:r>
+    </w:p>
+    <w:p>
+      <w:pPr>
+        <w:jc w:val="center"/>
+      </w:pPr>
+      <w:r>
+        <w:t>&lt;Kép az osztálydiagrammról&gt;</w:t>
+      </w:r>
+    </w:p>
+    <w:p>
+      <w:pPr>
+        <w:pStyle w:val="Listaszerbekezds"/>
+        <w:numPr>
+          <w:ilvl w:val="0"/>
+          <w:numId w:val="9"/>
+        </w:numPr>
+      </w:pPr>
+      <w:r>
+        <w:rPr>
+          <w:b/>
+          <w:bCs/>
+        </w:rPr>
         <w:t>Function</w:t>
       </w:r>
-      <w:proofErr w:type="spellEnd"/>
       <w:r>
         <w:t>:</w:t>
       </w:r>
-    </w:p>
-    <w:p>
-      <w:r>
-        <w:t>Coma:</w:t>
-      </w:r>
-    </w:p>
-    <w:p>
-      <w:proofErr w:type="spellStart"/>
-      <w:r>
+      <w:r>
+        <w:t xml:space="preserve"> </w:t>
+      </w:r>
+      <w:r>
+        <w:t>Prefix függvény megvalósítás.</w:t>
+      </w:r>
+    </w:p>
+    <w:p>
+      <w:pPr>
+        <w:jc w:val="center"/>
+      </w:pPr>
+      <w:r>
+        <w:t>&lt;Kép az osztálydiagrammról&gt;</w:t>
+      </w:r>
+    </w:p>
+    <w:p>
+      <w:pPr>
+        <w:pStyle w:val="Listaszerbekezds"/>
+        <w:numPr>
+          <w:ilvl w:val="0"/>
+          <w:numId w:val="9"/>
+        </w:numPr>
+      </w:pPr>
+      <w:r>
+        <w:rPr>
+          <w:b/>
+          <w:bCs/>
+        </w:rPr>
+        <w:t>Coma</w:t>
+      </w:r>
+      <w:r>
+        <w:t>:</w:t>
+      </w:r>
+      <w:r>
+        <w:t xml:space="preserve"> </w:t>
+      </w:r>
+      <w:r>
+        <w:t>A függvények paramétereit elválasztó</w:t>
+      </w:r>
+      <w:r>
+        <w:t xml:space="preserve"> objektum</w:t>
+      </w:r>
+      <w:r>
+        <w:t>.</w:t>
+      </w:r>
+      <w:r>
+        <w:t xml:space="preserve"> Egy csukó-nyitó zárójelpárra fordul kiértékelésnél.</w:t>
+      </w:r>
+    </w:p>
+    <w:p>
+      <w:pPr>
+        <w:jc w:val="center"/>
+      </w:pPr>
+      <w:r>
+        <w:t>&lt;Kép az osztálydiagrammról&gt;</w:t>
+      </w:r>
+    </w:p>
+    <w:p>
+      <w:pPr>
+        <w:pStyle w:val="Listaszerbekezds"/>
+        <w:numPr>
+          <w:ilvl w:val="0"/>
+          <w:numId w:val="9"/>
+        </w:numPr>
+      </w:pPr>
+      <w:r>
+        <w:rPr>
+          <w:b/>
+          <w:bCs/>
+        </w:rPr>
         <w:t>Parenthesis</w:t>
       </w:r>
-      <w:proofErr w:type="spellEnd"/>
       <w:r>
         <w:t>:</w:t>
       </w:r>
-    </w:p>
-    <w:p>
-      <w:proofErr w:type="spellStart"/>
-      <w:r>
+      <w:r>
+        <w:t xml:space="preserve"> </w:t>
+      </w:r>
+      <w:r>
+        <w:t>Egy zárójel absztrakciója.</w:t>
+      </w:r>
+    </w:p>
+    <w:p>
+      <w:pPr>
+        <w:jc w:val="center"/>
+      </w:pPr>
+      <w:r>
+        <w:t>&lt;Kép az osztálydiagrammról&gt;</w:t>
+      </w:r>
+    </w:p>
+    <w:p>
+      <w:pPr>
+        <w:pStyle w:val="Listaszerbekezds"/>
+        <w:numPr>
+          <w:ilvl w:val="0"/>
+          <w:numId w:val="9"/>
+        </w:numPr>
+      </w:pPr>
+      <w:r>
+        <w:rPr>
+          <w:b/>
+          <w:bCs/>
+        </w:rPr>
         <w:t>OpeningParenthesis</w:t>
       </w:r>
-      <w:proofErr w:type="spellEnd"/>
       <w:r>
         <w:t>:</w:t>
       </w:r>
-    </w:p>
-    <w:p>
-      <w:proofErr w:type="spellStart"/>
-      <w:r>
+      <w:r>
+        <w:t xml:space="preserve"> </w:t>
+      </w:r>
+      <w:r>
+        <w:t>Egy nyitó zárójel reprezentáció.</w:t>
+      </w:r>
+    </w:p>
+    <w:p>
+      <w:pPr>
+        <w:jc w:val="center"/>
+      </w:pPr>
+      <w:r>
+        <w:t>&lt;Kép az osztálydiagrammról&gt;</w:t>
+      </w:r>
+    </w:p>
+    <w:p>
+      <w:pPr>
+        <w:pStyle w:val="Listaszerbekezds"/>
+        <w:numPr>
+          <w:ilvl w:val="0"/>
+          <w:numId w:val="9"/>
+        </w:numPr>
+      </w:pPr>
+      <w:r>
+        <w:rPr>
+          <w:b/>
+          <w:bCs/>
+        </w:rPr>
         <w:t>ClosingParenthesis</w:t>
       </w:r>
-      <w:proofErr w:type="spellEnd"/>
       <w:r>
         <w:t>:</w:t>
       </w:r>
+      <w:r>
+        <w:t xml:space="preserve"> </w:t>
+      </w:r>
+      <w:r>
+        <w:t>Egy nyitó zárójel reprezentáció.</w:t>
+      </w:r>
+    </w:p>
+    <w:p>
+      <w:pPr>
+        <w:jc w:val="center"/>
+      </w:pPr>
+      <w:r>
+        <w:t>&lt;Kép az osztálydiagrammról&gt;</w:t>
+      </w:r>
     </w:p>
     <w:p>
       <w:r>
@@ -29021,22 +29222,37 @@
     </w:p>
     <w:p>
       <w:r>
-        <w:t xml:space="preserve">Ezzel már sokkal előrébb vagyunk. Az egyes </w:t>
-      </w:r>
-      <w:r>
-        <w:t>kifejezés osztályok által</w:t>
-      </w:r>
-      <w:r>
-        <w:t>, ha átalakítjuk a kifejezés listát, hogy reguláris kifejezés</w:t>
+        <w:lastRenderedPageBreak/>
+        <w:t xml:space="preserve">Ezzel már sokkal előrébb vagyunk. Az </w:t>
+      </w:r>
+      <w:r>
+        <w:t>előbb létrehozott</w:t>
       </w:r>
       <w:r>
         <w:t xml:space="preserve"> </w:t>
       </w:r>
       <w:r>
-        <w:t>-</w:t>
-      </w:r>
-      <w:r>
-        <w:t xml:space="preserve"> kifejezés objektumot gyártó függvény párokat tartalmazzon, a felismert reguláris kifejezésekkel a szavakból egyből objektumok gyárthatók. Vagyis ezentúl a parser nem szavak listáját adja vissza, hanem objektumok listáját, amivel sokkal könnyebb dolgoznunk.</w:t>
+        <w:t xml:space="preserve">osztályok </w:t>
+      </w:r>
+      <w:r>
+        <w:t xml:space="preserve">, ha átalakítjuk a kifejezés listát, hogy </w:t>
+      </w:r>
+      <w:r>
+        <w:rPr>
+          <w:b/>
+          <w:bCs/>
+        </w:rPr>
+        <w:t>reguláris kifejezés-</w:t>
+      </w:r>
+      <w:r>
+        <w:rPr>
+          <w:b/>
+          <w:bCs/>
+        </w:rPr>
+        <w:t>objektumot gyártó függvény</w:t>
+      </w:r>
+      <w:r>
+        <w:t xml:space="preserve"> párokat tartalmazzon, a felismert reguláris kifejezésekkel a szavakból egyből objektumok gyárthatók. Vagyis ezentúl a parser nem szavak listáját adja vissza, hanem objektumok listáját, amivel sokkal könnyebb dolgoznunk.</w:t>
       </w:r>
     </w:p>
     <w:p>
@@ -29085,7 +29301,10 @@
           <w:b/>
           <w:bCs/>
         </w:rPr>
-        <w:t>infix:</w:t>
+        <w:t>infix</w:t>
+      </w:r>
+      <w:r>
+        <w:t>:</w:t>
       </w:r>
       <w:r>
         <w:t xml:space="preserve"> </w:t>
@@ -29114,7 +29333,10 @@
           <w:b/>
           <w:bCs/>
         </w:rPr>
-        <w:t>postfix:</w:t>
+        <w:t>postfix</w:t>
+      </w:r>
+      <w:r>
+        <w:t>:</w:t>
       </w:r>
       <w:r>
         <w:t xml:space="preserve"> </w:t>
@@ -29143,7 +29365,10 @@
           <w:b/>
           <w:bCs/>
         </w:rPr>
-        <w:t>prefix:</w:t>
+        <w:t>prefix</w:t>
+      </w:r>
+      <w:r>
+        <w:t>:</w:t>
       </w:r>
       <w:r>
         <w:t xml:space="preserve"> </w:t>
@@ -29173,7 +29398,6 @@
     </w:p>
     <w:p>
       <w:r>
-        <w:lastRenderedPageBreak/>
         <w:t xml:space="preserve">A lengyel forma az </w:t>
       </w:r>
       <w:r>
@@ -29269,7 +29493,7 @@
         <w:rPr>
           <w:rFonts w:eastAsiaTheme="minorEastAsia"/>
         </w:rPr>
-        <w:t xml:space="preserve">, </w:t>
+        <w:t xml:space="preserve"> és </w:t>
       </w:r>
       <m:oMath>
         <m:r>
@@ -29312,9 +29536,6 @@
           <m:t>-</m:t>
         </m:r>
       </m:oMath>
-      <w:r>
-        <w:t xml:space="preserve"> (azonos rangúak)</w:t>
-      </w:r>
     </w:p>
     <w:p>
       <w:pPr>
@@ -29348,9 +29569,6 @@
           <m:t>/</m:t>
         </m:r>
       </m:oMath>
-      <w:r>
-        <w:t xml:space="preserve"> (azonos rangúak)</w:t>
-      </w:r>
     </w:p>
     <w:p>
       <w:pPr>
@@ -29364,13 +29582,7 @@
           <w:rPr>
             <w:rFonts w:ascii="Cambria Math" w:eastAsiaTheme="minorEastAsia" w:hAnsi="Cambria Math"/>
           </w:rPr>
-          <m:t>^</m:t>
-        </m:r>
-        <m:r>
-          <w:rPr>
-            <w:rFonts w:ascii="Cambria Math" w:eastAsiaTheme="minorEastAsia" w:hAnsi="Cambria Math"/>
-          </w:rPr>
-          <m:t xml:space="preserve"> </m:t>
+          <m:t xml:space="preserve">^ </m:t>
         </m:r>
         <m:r>
           <m:rPr>
@@ -29434,16 +29646,7 @@
           <w:rPr>
             <w:rFonts w:ascii="Cambria Math" w:eastAsiaTheme="minorEastAsia" w:hAnsi="Cambria Math"/>
           </w:rPr>
-          <m:t>|</m:t>
-        </m:r>
-        <m:r>
-          <m:rPr>
-            <m:sty m:val="p"/>
-          </m:rPr>
-          <w:rPr>
-            <w:rFonts w:ascii="Cambria Math" w:eastAsiaTheme="minorEastAsia" w:hAnsi="Cambria Math"/>
-          </w:rPr>
-          <m:t xml:space="preserve"> (</m:t>
+          <m:t>| (</m:t>
         </m:r>
         <m:rad>
           <m:radPr>
@@ -29631,6 +29834,7 @@
           <w:b/>
           <w:bCs/>
         </w:rPr>
+        <w:lastRenderedPageBreak/>
         <w:t>Lengyel forma (postfix alak) előállítása:</w:t>
       </w:r>
     </w:p>
@@ -29650,29 +29854,13 @@
           <w:b/>
           <w:bCs/>
         </w:rPr>
-        <w:t xml:space="preserve"> (</w:t>
-      </w:r>
-      <w:proofErr w:type="spellStart"/>
+        <w:t xml:space="preserve"> (Stack)</w:t>
+      </w:r>
       <w:r>
         <w:rPr>
           <w:b/>
           <w:bCs/>
         </w:rPr>
-        <w:t>Stack</w:t>
-      </w:r>
-      <w:proofErr w:type="spellEnd"/>
-      <w:r>
-        <w:rPr>
-          <w:b/>
-          <w:bCs/>
-        </w:rPr>
-        <w:t>)</w:t>
-      </w:r>
-      <w:r>
-        <w:rPr>
-          <w:b/>
-          <w:bCs/>
-        </w:rPr>
         <w:t xml:space="preserve"> segítségével</w:t>
       </w:r>
       <w:r>
@@ -29705,15 +29893,7 @@
         <w:t xml:space="preserve"> tetején</w:t>
       </w:r>
       <w:r>
-        <w:t xml:space="preserve"> lévő operátort is </w:t>
-      </w:r>
-      <w:proofErr w:type="spellStart"/>
-      <w:r>
-        <w:t>precedencia</w:t>
-      </w:r>
-      <w:proofErr w:type="spellEnd"/>
-      <w:r>
-        <w:t xml:space="preserve"> szerint</w:t>
+        <w:t xml:space="preserve"> lévő operátort is precedencia szerint</w:t>
       </w:r>
       <w:r>
         <w:t>:</w:t>
@@ -29756,17 +29936,8 @@
           <w:b/>
           <w:bCs/>
         </w:rPr>
-        <w:t xml:space="preserve">beolvasott operátor magasabb </w:t>
-      </w:r>
-      <w:proofErr w:type="spellStart"/>
-      <w:r>
-        <w:rPr>
-          <w:b/>
-          <w:bCs/>
-        </w:rPr>
-        <w:t>precedenciájú</w:t>
-      </w:r>
-      <w:proofErr w:type="spellEnd"/>
+        <w:t>beolvasott operátor magasabb precedenciájú</w:t>
+      </w:r>
       <w:r>
         <w:rPr>
           <w:b/>
@@ -29790,17 +29961,8 @@
           <w:b/>
           <w:bCs/>
         </w:rPr>
-        <w:t xml:space="preserve">beolvasott operátor alacsonyabb </w:t>
-      </w:r>
-      <w:proofErr w:type="spellStart"/>
-      <w:r>
-        <w:rPr>
-          <w:b/>
-          <w:bCs/>
-        </w:rPr>
-        <w:t>precedenciájú</w:t>
-      </w:r>
-      <w:proofErr w:type="spellEnd"/>
+        <w:t>beolvasott operátor alacsonyabb precedenciájú</w:t>
+      </w:r>
       <w:r>
         <w:rPr>
           <w:b/>
@@ -29849,7 +30011,6 @@
           <w:b/>
           <w:bCs/>
         </w:rPr>
-        <w:lastRenderedPageBreak/>
         <w:t>csukó zárójel</w:t>
       </w:r>
       <w:r>
@@ -29876,20 +30037,24 @@
         <w:jc w:val="center"/>
       </w:pPr>
       <w:r>
-        <w:t>&lt;Struktogramm a lengyel formára alakításról (</w:t>
-      </w:r>
-      <w:proofErr w:type="spellStart"/>
-      <w:r>
-        <w:t>Orosi</w:t>
-      </w:r>
-      <w:proofErr w:type="spellEnd"/>
-      <w:r>
-        <w:t xml:space="preserve"> Feri oldala)&gt;</w:t>
-      </w:r>
-    </w:p>
-    <w:p>
-      <w:r>
-        <w:t>Ahhoz, hogy a lengyel formás alakból rekonstruálható legyen az eredeti bemenet, a zárójelek esetében nem szabad csak úgy eldobnunk őket. Inkább hozzávesszük őket a kimeneti értékhez is. A nyitó zárójelet ahogy megkapjuk, a csukót pedig ahogy kiszedtünk minden a nyitó zárójelig a veremből</w:t>
+        <w:t>&lt;Struktogramm a lengyel formára alakításról (Orosi Feri oldala)&gt;</w:t>
+      </w:r>
+    </w:p>
+    <w:p>
+      <w:r>
+        <w:t xml:space="preserve">Ahhoz, hogy a lengyel formás alakból rekonstruálható legyen az eredeti bemenet, a zárójelek esetében nem szabad csak úgy eldobnunk őket. Inkább hozzávesszük őket a kimeneti értékhez is. A nyitó zárójelet ahogy megkapjuk, a csukót pedig </w:t>
+      </w:r>
+      <w:r>
+        <w:t>miután</w:t>
+      </w:r>
+      <w:r>
+        <w:t xml:space="preserve"> kiszedtünk minden</w:t>
+      </w:r>
+      <w:r>
+        <w:t>t</w:t>
+      </w:r>
+      <w:r>
+        <w:t xml:space="preserve"> a nyitó zárójelig a veremből</w:t>
       </w:r>
       <w:r>
         <w:t>,</w:t>
@@ -29903,13 +30068,7 @@
         <w:jc w:val="center"/>
       </w:pPr>
       <w:r>
-        <w:t>&lt;Struktogramm a</w:t>
-      </w:r>
-      <w:r>
-        <w:t xml:space="preserve"> zárójelekkel bővített</w:t>
-      </w:r>
-      <w:r>
-        <w:t xml:space="preserve"> lengyel formára alakításról&gt;</w:t>
+        <w:t>&lt;Struktogramm a zárójelekkel bővített lengyel formára alakításról&gt;</w:t>
       </w:r>
     </w:p>
     <w:p>
@@ -29946,6 +30105,7 @@
         <w:jc w:val="center"/>
       </w:pPr>
       <w:r>
+        <w:lastRenderedPageBreak/>
         <w:t>&lt;Ábra egy kifejezés fáról&gt;</w:t>
       </w:r>
     </w:p>
@@ -29983,151 +30143,966 @@
       </w:pPr>
       <w:bookmarkStart w:id="20" w:name="_Toc221883168"/>
       <w:r>
+        <w:t>Általános számológép (Standard</w:t>
+      </w:r>
+      <w:r>
+        <w:t>Calculator</w:t>
+      </w:r>
+      <w:r>
+        <w:t>)</w:t>
+      </w:r>
+      <w:bookmarkEnd w:id="20"/>
+    </w:p>
+    <w:p>
+      <w:r>
+        <w:t>Ez a számológép típus felel a racionális számokkal leírt kifejezések kiértékeléséért. Az absztrakt számológép típusból származik le és az alábbiak szerint bővíti a kifejezésfa ágait:</w:t>
+      </w:r>
+    </w:p>
+    <w:p>
+      <w:pPr>
+        <w:jc w:val="center"/>
+      </w:pPr>
+      <w:r>
+        <w:t>&lt;Kép az osztálydiagrammról&gt;</w:t>
+      </w:r>
+    </w:p>
+    <w:p>
+      <w:pPr>
+        <w:pStyle w:val="Listaszerbekezds"/>
+        <w:numPr>
+          <w:ilvl w:val="0"/>
+          <w:numId w:val="9"/>
+        </w:numPr>
+      </w:pPr>
+      <w:r>
+        <w:rPr>
+          <w:b/>
+          <w:bCs/>
+        </w:rPr>
+        <w:t>E</w:t>
+      </w:r>
+      <w:r>
+        <w:t>:</w:t>
+      </w:r>
+      <w:r>
+        <w:t xml:space="preserve"> </w:t>
+      </w:r>
+      <w:r>
+        <w:t>Az e szám megvalósítása.</w:t>
+      </w:r>
+    </w:p>
+    <w:p>
+      <w:pPr>
+        <w:jc w:val="center"/>
+      </w:pPr>
+      <w:r>
+        <w:t>&lt;Kép az osztálydiagrammról&gt;</w:t>
+      </w:r>
+    </w:p>
+    <w:p>
+      <w:pPr>
+        <w:pStyle w:val="Listaszerbekezds"/>
+        <w:numPr>
+          <w:ilvl w:val="0"/>
+          <w:numId w:val="9"/>
+        </w:numPr>
+      </w:pPr>
+      <w:r>
+        <w:rPr>
+          <w:b/>
+          <w:bCs/>
+        </w:rPr>
+        <w:t>Pi</w:t>
+      </w:r>
+      <w:r>
+        <w:t>: A pi megvalósítása.</w:t>
+      </w:r>
+    </w:p>
+    <w:p>
+      <w:pPr>
+        <w:jc w:val="center"/>
+      </w:pPr>
+      <w:r>
+        <w:t>&lt;Kép az osztálydiagrammról&gt;</w:t>
+      </w:r>
+    </w:p>
+    <w:p>
+      <w:pPr>
+        <w:pStyle w:val="Listaszerbekezds"/>
+        <w:numPr>
+          <w:ilvl w:val="0"/>
+          <w:numId w:val="9"/>
+        </w:numPr>
+      </w:pPr>
+      <w:r>
+        <w:rPr>
+          <w:b/>
+          <w:bCs/>
+        </w:rPr>
+        <w:t>Number</w:t>
+      </w:r>
+      <w:r>
+        <w:t xml:space="preserve">: A </w:t>
+      </w:r>
+      <w:r>
+        <w:t>racionális szám</w:t>
+      </w:r>
+      <w:r>
+        <w:t xml:space="preserve"> megvalósítása.</w:t>
+      </w:r>
+    </w:p>
+    <w:p>
+      <w:pPr>
+        <w:jc w:val="center"/>
+      </w:pPr>
+      <w:r>
+        <w:t>&lt;Kép az osztálydiagrammról&gt;</w:t>
+      </w:r>
+    </w:p>
+    <w:p>
+      <w:pPr>
+        <w:pStyle w:val="Listaszerbekezds"/>
+        <w:numPr>
+          <w:ilvl w:val="0"/>
+          <w:numId w:val="9"/>
+        </w:numPr>
+      </w:pPr>
+      <w:r>
+        <w:rPr>
+          <w:b/>
+          <w:bCs/>
+        </w:rPr>
+        <w:t>UnaryOperator</w:t>
+      </w:r>
+      <w:r>
+        <w:t>: A</w:t>
+      </w:r>
+      <w:r>
+        <w:t>z egyparaméteres operátor általánosítása</w:t>
+      </w:r>
+      <w:r>
+        <w:t>.</w:t>
+      </w:r>
+    </w:p>
+    <w:p>
+      <w:pPr>
+        <w:jc w:val="center"/>
+      </w:pPr>
+      <w:r>
+        <w:t>&lt;Kép az osztálydiagrammról&gt;</w:t>
+      </w:r>
+    </w:p>
+    <w:p>
+      <w:pPr>
+        <w:pStyle w:val="Listaszerbekezds"/>
+        <w:numPr>
+          <w:ilvl w:val="0"/>
+          <w:numId w:val="9"/>
+        </w:numPr>
+      </w:pPr>
+      <w:r>
+        <w:rPr>
+          <w:b/>
+          <w:bCs/>
+        </w:rPr>
+        <w:t>Binary</w:t>
+      </w:r>
+      <w:r>
+        <w:rPr>
+          <w:b/>
+          <w:bCs/>
+        </w:rPr>
+        <w:t>Operator</w:t>
+      </w:r>
+      <w:r>
+        <w:t xml:space="preserve">: Az </w:t>
+      </w:r>
+      <w:r>
+        <w:t>két</w:t>
+      </w:r>
+      <w:r>
+        <w:t>paraméteres operátor általánosítása.</w:t>
+      </w:r>
+    </w:p>
+    <w:p>
+      <w:pPr>
+        <w:jc w:val="center"/>
+      </w:pPr>
+      <w:r>
+        <w:t>&lt;Kép az osztálydiagrammról&gt;</w:t>
+      </w:r>
+    </w:p>
+    <w:p>
+      <w:pPr>
+        <w:pStyle w:val="Listaszerbekezds"/>
+        <w:numPr>
+          <w:ilvl w:val="0"/>
+          <w:numId w:val="9"/>
+        </w:numPr>
+      </w:pPr>
+      <w:r>
+        <w:rPr>
+          <w:b/>
+          <w:bCs/>
+        </w:rPr>
+        <w:t>Add</w:t>
+      </w:r>
+      <w:r>
+        <w:t xml:space="preserve">: Az </w:t>
+      </w:r>
+      <w:r>
+        <w:t>összeadás műveletének megvalósítása</w:t>
+      </w:r>
+      <w:r>
+        <w:t>.</w:t>
+      </w:r>
+    </w:p>
+    <w:p>
+      <w:pPr>
+        <w:jc w:val="center"/>
+      </w:pPr>
+      <w:r>
+        <w:t>&lt;Kép az osztálydiagrammról&gt;</w:t>
+      </w:r>
+    </w:p>
+    <w:p>
+      <w:pPr>
+        <w:pStyle w:val="Listaszerbekezds"/>
+        <w:numPr>
+          <w:ilvl w:val="0"/>
+          <w:numId w:val="9"/>
+        </w:numPr>
+      </w:pPr>
+      <w:r>
+        <w:rPr>
+          <w:b/>
+          <w:bCs/>
+        </w:rPr>
+        <w:t>Subtract</w:t>
+      </w:r>
+      <w:r>
+        <w:t xml:space="preserve">: Az </w:t>
+      </w:r>
+      <w:r>
+        <w:t>kivonás</w:t>
+      </w:r>
+      <w:r>
+        <w:t xml:space="preserve"> műveletének megvalósítása.</w:t>
+      </w:r>
+    </w:p>
+    <w:p>
+      <w:pPr>
+        <w:jc w:val="center"/>
+      </w:pPr>
+      <w:r>
+        <w:t>&lt;Kép az osztálydiagrammról&gt;</w:t>
+      </w:r>
+    </w:p>
+    <w:p>
+      <w:pPr>
+        <w:pStyle w:val="Listaszerbekezds"/>
+        <w:numPr>
+          <w:ilvl w:val="0"/>
+          <w:numId w:val="9"/>
+        </w:numPr>
+      </w:pPr>
+      <w:r>
+        <w:rPr>
+          <w:b/>
+          <w:bCs/>
+        </w:rPr>
+        <w:t>Multiply</w:t>
+      </w:r>
+      <w:r>
+        <w:t xml:space="preserve">: Az </w:t>
+      </w:r>
+      <w:r>
+        <w:t>szorzás</w:t>
+      </w:r>
+      <w:r>
+        <w:t xml:space="preserve"> műveletének megvalósítása.</w:t>
+      </w:r>
+    </w:p>
+    <w:p>
+      <w:pPr>
+        <w:jc w:val="center"/>
+      </w:pPr>
+      <w:r>
         <w:lastRenderedPageBreak/>
-        <w:t>Általános számológép (</w:t>
-      </w:r>
-      <w:proofErr w:type="spellStart"/>
-      <w:r>
-        <w:t>Standard</w:t>
+        <w:t>&lt;Kép az osztálydiagrammról&gt;</w:t>
+      </w:r>
+    </w:p>
+    <w:p>
+      <w:pPr>
+        <w:pStyle w:val="Listaszerbekezds"/>
+        <w:numPr>
+          <w:ilvl w:val="0"/>
+          <w:numId w:val="9"/>
+        </w:numPr>
+      </w:pPr>
+      <w:r>
+        <w:rPr>
+          <w:b/>
+          <w:bCs/>
+        </w:rPr>
+        <w:t>Divide</w:t>
+      </w:r>
+      <w:r>
+        <w:t xml:space="preserve">: Az </w:t>
+      </w:r>
+      <w:r>
+        <w:t>osztás</w:t>
+      </w:r>
+      <w:r>
+        <w:t xml:space="preserve"> műveletének megvalósítása.</w:t>
+      </w:r>
+    </w:p>
+    <w:p>
+      <w:pPr>
+        <w:jc w:val="center"/>
+      </w:pPr>
+      <w:r>
+        <w:t>&lt;Kép az osztálydiagrammról&gt;</w:t>
+      </w:r>
+    </w:p>
+    <w:p>
+      <w:pPr>
+        <w:pStyle w:val="Listaszerbekezds"/>
+        <w:numPr>
+          <w:ilvl w:val="0"/>
+          <w:numId w:val="9"/>
+        </w:numPr>
+      </w:pPr>
+      <w:r>
+        <w:rPr>
+          <w:b/>
+          <w:bCs/>
+        </w:rPr>
+        <w:t>Power</w:t>
+      </w:r>
+      <w:r>
+        <w:t xml:space="preserve">: Az </w:t>
+      </w:r>
+      <w:r>
+        <w:t>hatványozás</w:t>
+      </w:r>
+      <w:r>
+        <w:t xml:space="preserve"> műveletének megvalósítása.</w:t>
+      </w:r>
+    </w:p>
+    <w:p>
+      <w:pPr>
+        <w:jc w:val="center"/>
+      </w:pPr>
+      <w:r>
+        <w:t>&lt;Kép az osztálydiagrammról&gt;</w:t>
+      </w:r>
+    </w:p>
+    <w:p>
+      <w:pPr>
+        <w:pStyle w:val="Listaszerbekezds"/>
+        <w:numPr>
+          <w:ilvl w:val="0"/>
+          <w:numId w:val="9"/>
+        </w:numPr>
+      </w:pPr>
+      <w:r>
+        <w:rPr>
+          <w:b/>
+          <w:bCs/>
+        </w:rPr>
+        <w:t>Root</w:t>
+      </w:r>
+      <w:r>
+        <w:t xml:space="preserve">: Az </w:t>
+      </w:r>
+      <w:r>
+        <w:t>gyökvonás</w:t>
+      </w:r>
+      <w:r>
+        <w:t xml:space="preserve"> műveletének megvalósítása.</w:t>
+      </w:r>
+    </w:p>
+    <w:p>
+      <w:pPr>
+        <w:jc w:val="center"/>
+      </w:pPr>
+      <w:r>
+        <w:t>&lt;Kép az osztálydiagrammról&gt;</w:t>
+      </w:r>
+    </w:p>
+    <w:p>
+      <w:pPr>
+        <w:pStyle w:val="Listaszerbekezds"/>
+        <w:numPr>
+          <w:ilvl w:val="0"/>
+          <w:numId w:val="9"/>
+        </w:numPr>
+      </w:pPr>
+      <w:r>
+        <w:rPr>
+          <w:b/>
+          <w:bCs/>
+        </w:rPr>
+        <w:t>Abs</w:t>
+      </w:r>
+      <w:r>
+        <w:t xml:space="preserve">: Az </w:t>
+      </w:r>
+      <w:r>
+        <w:t>abszolútérték</w:t>
+      </w:r>
+      <w:r>
+        <w:t xml:space="preserve"> </w:t>
+      </w:r>
+      <w:r>
+        <w:t>függvény</w:t>
+      </w:r>
+      <w:r>
+        <w:t xml:space="preserve"> megvalósítása.</w:t>
+      </w:r>
+    </w:p>
+    <w:p>
+      <w:pPr>
+        <w:jc w:val="center"/>
+      </w:pPr>
+      <w:r>
+        <w:t>&lt;Kép az osztálydiagrammról&gt;</w:t>
+      </w:r>
+    </w:p>
+    <w:p>
+      <w:pPr>
+        <w:pStyle w:val="Listaszerbekezds"/>
+        <w:numPr>
+          <w:ilvl w:val="0"/>
+          <w:numId w:val="9"/>
+        </w:numPr>
+      </w:pPr>
+      <w:r>
+        <w:rPr>
+          <w:b/>
+          <w:bCs/>
+        </w:rPr>
+        <w:t>Min</w:t>
+      </w:r>
+      <w:r>
+        <w:t xml:space="preserve">: Az </w:t>
+      </w:r>
+      <w:r>
+        <w:t>minimum érték</w:t>
+      </w:r>
+      <w:r>
+        <w:t xml:space="preserve"> függvény megvalósítása.</w:t>
+      </w:r>
+    </w:p>
+    <w:p>
+      <w:pPr>
+        <w:jc w:val="center"/>
+      </w:pPr>
+      <w:r>
+        <w:t>&lt;Kép az osztálydiagrammról&gt;</w:t>
+      </w:r>
+    </w:p>
+    <w:p>
+      <w:pPr>
+        <w:pStyle w:val="Listaszerbekezds"/>
+        <w:numPr>
+          <w:ilvl w:val="0"/>
+          <w:numId w:val="9"/>
+        </w:numPr>
+      </w:pPr>
+      <w:r>
+        <w:rPr>
+          <w:b/>
+          <w:bCs/>
+        </w:rPr>
+        <w:t>Max</w:t>
+      </w:r>
+      <w:r>
+        <w:t xml:space="preserve">: Az </w:t>
+      </w:r>
+      <w:r>
+        <w:t>maximum érték</w:t>
+      </w:r>
+      <w:r>
+        <w:t xml:space="preserve"> függvény megvalósítása.</w:t>
+      </w:r>
+    </w:p>
+    <w:p>
+      <w:pPr>
+        <w:jc w:val="center"/>
+      </w:pPr>
+      <w:r>
+        <w:t>&lt;Kép az osztálydiagrammról&gt;</w:t>
+      </w:r>
+    </w:p>
+    <w:p>
+      <w:pPr>
+        <w:pStyle w:val="Listaszerbekezds"/>
+        <w:numPr>
+          <w:ilvl w:val="0"/>
+          <w:numId w:val="9"/>
+        </w:numPr>
+      </w:pPr>
+      <w:r>
+        <w:rPr>
+          <w:b/>
+          <w:bCs/>
+        </w:rPr>
+        <w:t>Floor</w:t>
+      </w:r>
+      <w:r>
+        <w:t xml:space="preserve">: Az </w:t>
+      </w:r>
+      <w:r>
+        <w:t>lefele kerekítés</w:t>
+      </w:r>
+      <w:r>
+        <w:t xml:space="preserve"> függvény megvalósítása.</w:t>
+      </w:r>
+    </w:p>
+    <w:p>
+      <w:pPr>
+        <w:jc w:val="center"/>
+      </w:pPr>
+      <w:r>
+        <w:t>&lt;Kép az osztálydiagrammról&gt;</w:t>
+      </w:r>
+    </w:p>
+    <w:p>
+      <w:pPr>
+        <w:pStyle w:val="Listaszerbekezds"/>
+        <w:numPr>
+          <w:ilvl w:val="0"/>
+          <w:numId w:val="9"/>
+        </w:numPr>
+      </w:pPr>
+      <w:r>
+        <w:rPr>
+          <w:b/>
+          <w:bCs/>
+        </w:rPr>
+        <w:t>Round</w:t>
+      </w:r>
+      <w:r>
+        <w:t xml:space="preserve">: Az </w:t>
+      </w:r>
+      <w:r>
+        <w:t>kerekítés</w:t>
+      </w:r>
+      <w:r>
+        <w:t xml:space="preserve"> függvény megvalósítása.</w:t>
+      </w:r>
+    </w:p>
+    <w:p>
+      <w:pPr>
+        <w:jc w:val="center"/>
+      </w:pPr>
+      <w:r>
+        <w:t>&lt;Kép az osztálydiagrammról&gt;</w:t>
+      </w:r>
+    </w:p>
+    <w:p>
+      <w:pPr>
+        <w:pStyle w:val="Listaszerbekezds"/>
+        <w:numPr>
+          <w:ilvl w:val="0"/>
+          <w:numId w:val="9"/>
+        </w:numPr>
+      </w:pPr>
+      <w:r>
+        <w:rPr>
+          <w:b/>
+          <w:bCs/>
+        </w:rPr>
+        <w:t>Ceiling</w:t>
+      </w:r>
+      <w:r>
+        <w:t xml:space="preserve">: Az </w:t>
+      </w:r>
+      <w:r>
+        <w:t>felfele kerekítés</w:t>
+      </w:r>
+      <w:r>
+        <w:t xml:space="preserve"> függvény megvalósítása.</w:t>
+      </w:r>
+    </w:p>
+    <w:p>
+      <w:pPr>
+        <w:jc w:val="center"/>
+      </w:pPr>
+      <w:r>
+        <w:t>&lt;Kép az osztálydiagrammról&gt;</w:t>
+      </w:r>
+    </w:p>
+    <w:p>
+      <w:pPr>
+        <w:pStyle w:val="Cmsor3"/>
+      </w:pPr>
+      <w:bookmarkStart w:id="21" w:name="_Toc221883169"/>
+      <w:r>
+        <w:t>Euklideszi tér számológép (EuclideanSpace</w:t>
       </w:r>
       <w:r>
         <w:t>Calculator</w:t>
       </w:r>
-      <w:proofErr w:type="spellEnd"/>
       <w:r>
         <w:t>)</w:t>
       </w:r>
-      <w:bookmarkEnd w:id="20"/>
+      <w:bookmarkEnd w:id="21"/>
+    </w:p>
+    <w:p>
+      <w:r>
+        <w:t xml:space="preserve">Ez a számológép típus felel a </w:t>
+      </w:r>
+      <w:r>
+        <w:t>mátrixokkal</w:t>
+      </w:r>
+      <w:r>
+        <w:t xml:space="preserve"> leírt kifejezések kiértékeléséért. Az absztrakt számológép típusból származik le és az alábbiak szerint bővíti a kifejezésfa ágait:</w:t>
+      </w:r>
+    </w:p>
+    <w:p>
+      <w:pPr>
+        <w:jc w:val="center"/>
+      </w:pPr>
+      <w:r>
+        <w:t>&lt;Kép az osztálydiagrammról&gt;</w:t>
+      </w:r>
+    </w:p>
+    <w:p>
+      <w:pPr>
+        <w:pStyle w:val="Listaszerbekezds"/>
+        <w:numPr>
+          <w:ilvl w:val="0"/>
+          <w:numId w:val="9"/>
+        </w:numPr>
+      </w:pPr>
+      <w:r>
+        <w:rPr>
+          <w:b/>
+          <w:bCs/>
+        </w:rPr>
+        <w:t>Matrix</w:t>
+      </w:r>
+      <w:r>
+        <w:t>: Az</w:t>
+      </w:r>
+      <w:r>
+        <w:t xml:space="preserve"> racionális számokra kiértékelődő kifejezésekből álló mátrix</w:t>
+      </w:r>
+      <w:r>
+        <w:t xml:space="preserve"> megvalósítása.</w:t>
+      </w:r>
+    </w:p>
+    <w:p>
+      <w:pPr>
+        <w:jc w:val="center"/>
+      </w:pPr>
+      <w:r>
+        <w:lastRenderedPageBreak/>
+        <w:t>&lt;Kép az osztálydiagrammról&gt;</w:t>
+      </w:r>
+    </w:p>
+    <w:p>
+      <w:pPr>
+        <w:pStyle w:val="Listaszerbekezds"/>
+        <w:numPr>
+          <w:ilvl w:val="0"/>
+          <w:numId w:val="9"/>
+        </w:numPr>
+      </w:pPr>
+      <w:r>
+        <w:rPr>
+          <w:b/>
+          <w:bCs/>
+        </w:rPr>
+        <w:t>MatrixHolder</w:t>
+      </w:r>
+      <w:r>
+        <w:t xml:space="preserve">: A </w:t>
+      </w:r>
+      <w:r>
+        <w:t>Matrix osztály Term típussá alakítását teszi lehetővé</w:t>
+      </w:r>
+      <w:r>
+        <w:t>.</w:t>
+      </w:r>
+    </w:p>
+    <w:p>
+      <w:pPr>
+        <w:jc w:val="center"/>
+      </w:pPr>
+      <w:r>
+        <w:t>&lt;Kép az osztálydiagrammról&gt;</w:t>
+      </w:r>
+    </w:p>
+    <w:p>
+      <w:pPr>
+        <w:pStyle w:val="Listaszerbekezds"/>
+        <w:numPr>
+          <w:ilvl w:val="0"/>
+          <w:numId w:val="9"/>
+        </w:numPr>
+      </w:pPr>
+      <w:r>
+        <w:rPr>
+          <w:b/>
+          <w:bCs/>
+        </w:rPr>
+        <w:t>Number</w:t>
+      </w:r>
+      <w:r>
+        <w:t>: A racionális szám megvalósítása.</w:t>
+      </w:r>
+    </w:p>
+    <w:p>
+      <w:pPr>
+        <w:jc w:val="center"/>
+      </w:pPr>
+      <w:r>
+        <w:t>&lt;Kép az osztálydiagrammról&gt;</w:t>
+      </w:r>
+    </w:p>
+    <w:p>
+      <w:pPr>
+        <w:pStyle w:val="Listaszerbekezds"/>
+        <w:numPr>
+          <w:ilvl w:val="0"/>
+          <w:numId w:val="9"/>
+        </w:numPr>
+      </w:pPr>
+      <w:r>
+        <w:rPr>
+          <w:b/>
+          <w:bCs/>
+        </w:rPr>
+        <w:t>BinaryOperator</w:t>
+      </w:r>
+      <w:r>
+        <w:t>: Az kétparaméteres operátor általánosítása.</w:t>
+      </w:r>
+    </w:p>
+    <w:p>
+      <w:pPr>
+        <w:jc w:val="center"/>
+      </w:pPr>
+      <w:r>
+        <w:t>&lt;Kép az osztálydiagrammról&gt;</w:t>
+      </w:r>
+    </w:p>
+    <w:p>
+      <w:pPr>
+        <w:pStyle w:val="Listaszerbekezds"/>
+        <w:numPr>
+          <w:ilvl w:val="0"/>
+          <w:numId w:val="9"/>
+        </w:numPr>
+      </w:pPr>
+      <w:r>
+        <w:rPr>
+          <w:b/>
+          <w:bCs/>
+        </w:rPr>
+        <w:t>Add</w:t>
+      </w:r>
+      <w:r>
+        <w:t>: Az összeadás műveletének megvalósítása.</w:t>
+      </w:r>
+    </w:p>
+    <w:p>
+      <w:pPr>
+        <w:jc w:val="center"/>
+      </w:pPr>
+      <w:r>
+        <w:t>&lt;Kép az osztálydiagrammról&gt;</w:t>
+      </w:r>
+    </w:p>
+    <w:p>
+      <w:pPr>
+        <w:pStyle w:val="Listaszerbekezds"/>
+        <w:numPr>
+          <w:ilvl w:val="0"/>
+          <w:numId w:val="9"/>
+        </w:numPr>
+      </w:pPr>
+      <w:r>
+        <w:rPr>
+          <w:b/>
+          <w:bCs/>
+        </w:rPr>
+        <w:t>Subtract</w:t>
+      </w:r>
+      <w:r>
+        <w:t>: Az kivonás műveletének megvalósítása.</w:t>
+      </w:r>
+    </w:p>
+    <w:p>
+      <w:pPr>
+        <w:jc w:val="center"/>
+      </w:pPr>
+      <w:r>
+        <w:t>&lt;Kép az osztálydiagrammról&gt;</w:t>
+      </w:r>
+    </w:p>
+    <w:p>
+      <w:pPr>
+        <w:pStyle w:val="Listaszerbekezds"/>
+        <w:numPr>
+          <w:ilvl w:val="0"/>
+          <w:numId w:val="9"/>
+        </w:numPr>
+      </w:pPr>
+      <w:r>
+        <w:rPr>
+          <w:b/>
+          <w:bCs/>
+        </w:rPr>
+        <w:t>Product</w:t>
+      </w:r>
+      <w:r>
+        <w:t>: Az szorzás műveletének megvalósítása.</w:t>
+      </w:r>
+    </w:p>
+    <w:p>
+      <w:pPr>
+        <w:jc w:val="center"/>
+      </w:pPr>
+      <w:r>
+        <w:t>&lt;Kép az osztálydiagrammról&gt;</w:t>
+      </w:r>
     </w:p>
     <w:p>
       <w:pPr>
         <w:pStyle w:val="Cmsor3"/>
       </w:pPr>
-      <w:bookmarkStart w:id="21" w:name="_Toc221883169"/>
-      <w:r>
-        <w:t>Euklideszi tér számológép (</w:t>
-      </w:r>
-      <w:proofErr w:type="spellStart"/>
-      <w:r>
-        <w:t>EuclideanSpace</w:t>
+      <w:bookmarkStart w:id="22" w:name="_Toc221883170"/>
+      <w:r>
+        <w:t>Polinom számológép (Polynomials</w:t>
       </w:r>
       <w:r>
         <w:t>Calculator</w:t>
       </w:r>
-      <w:proofErr w:type="spellEnd"/>
       <w:r>
         <w:t>)</w:t>
       </w:r>
-      <w:bookmarkEnd w:id="21"/>
+      <w:bookmarkEnd w:id="22"/>
     </w:p>
     <w:p>
       <w:pPr>
         <w:pStyle w:val="Cmsor3"/>
       </w:pPr>
-      <w:bookmarkStart w:id="22" w:name="_Toc221883170"/>
-      <w:r>
-        <w:t>Polinom számológép (</w:t>
-      </w:r>
-      <w:proofErr w:type="spellStart"/>
-      <w:r>
-        <w:t>Polynomials</w:t>
+      <w:bookmarkStart w:id="23" w:name="_Toc221883171"/>
+      <w:r>
+        <w:t>Integrálközelítés számológép (Integral</w:t>
       </w:r>
       <w:r>
         <w:t>Calculator</w:t>
       </w:r>
-      <w:proofErr w:type="spellEnd"/>
       <w:r>
         <w:t>)</w:t>
       </w:r>
-      <w:bookmarkEnd w:id="22"/>
+      <w:bookmarkEnd w:id="23"/>
+    </w:p>
+    <w:p>
+      <w:pPr>
+        <w:spacing w:line="259" w:lineRule="auto"/>
+        <w:ind w:firstLine="0"/>
+        <w:jc w:val="left"/>
+      </w:pPr>
+      <w:r>
+        <w:br w:type="page"/>
+      </w:r>
+    </w:p>
+    <w:p>
+      <w:pPr>
+        <w:pStyle w:val="Cmsor2"/>
+      </w:pPr>
+      <w:bookmarkStart w:id="24" w:name="_Toc221883172"/>
+      <w:r>
+        <w:lastRenderedPageBreak/>
+        <w:t>Vizuális számológép megvalósítása</w:t>
+      </w:r>
+      <w:bookmarkEnd w:id="24"/>
     </w:p>
     <w:p>
       <w:pPr>
         <w:pStyle w:val="Cmsor3"/>
       </w:pPr>
-      <w:bookmarkStart w:id="23" w:name="_Toc221883171"/>
-      <w:r>
-        <w:t>Integrálközelítés számológép (</w:t>
-      </w:r>
-      <w:proofErr w:type="spellStart"/>
-      <w:r>
-        <w:t>Integral</w:t>
-      </w:r>
-      <w:r>
-        <w:t>Calculator</w:t>
-      </w:r>
-      <w:proofErr w:type="spellEnd"/>
-      <w:r>
-        <w:t>)</w:t>
-      </w:r>
-      <w:bookmarkEnd w:id="23"/>
+      <w:bookmarkStart w:id="25" w:name="_Toc221883173"/>
+      <w:r>
+        <w:t>Funkciók</w:t>
+      </w:r>
+      <w:bookmarkEnd w:id="25"/>
+    </w:p>
+    <w:p>
+      <w:pPr>
+        <w:spacing w:line="259" w:lineRule="auto"/>
+        <w:ind w:firstLine="0"/>
+        <w:jc w:val="left"/>
+      </w:pPr>
+      <w:r>
+        <w:br w:type="page"/>
+      </w:r>
     </w:p>
     <w:p>
       <w:pPr>
         <w:pStyle w:val="Cmsor2"/>
       </w:pPr>
-      <w:bookmarkStart w:id="24" w:name="_Toc221883172"/>
-      <w:r>
-        <w:t>Vizuális számológép megvalósítása</w:t>
-      </w:r>
-      <w:bookmarkEnd w:id="24"/>
+      <w:bookmarkStart w:id="26" w:name="_Toc221883174"/>
+      <w:r>
+        <w:lastRenderedPageBreak/>
+        <w:t>Jövőbeli fejlesztések</w:t>
+      </w:r>
+      <w:bookmarkEnd w:id="26"/>
     </w:p>
     <w:p>
       <w:pPr>
         <w:pStyle w:val="Cmsor3"/>
       </w:pPr>
-      <w:bookmarkStart w:id="25" w:name="_Toc221883173"/>
-      <w:r>
-        <w:t>Funkciók</w:t>
-      </w:r>
-      <w:bookmarkEnd w:id="25"/>
+      <w:bookmarkStart w:id="27" w:name="_Toc221883175"/>
+      <w:r>
+        <w:t>Teljesítményt növelő fejlesztések</w:t>
+      </w:r>
+      <w:bookmarkEnd w:id="27"/>
+    </w:p>
+    <w:p>
+      <w:pPr>
+        <w:pStyle w:val="Cmsor3"/>
+      </w:pPr>
+      <w:bookmarkStart w:id="28" w:name="_Toc221883176"/>
+      <w:r>
+        <w:t>Bővítmények</w:t>
+      </w:r>
+      <w:bookmarkEnd w:id="28"/>
+    </w:p>
+    <w:p>
+      <w:pPr>
+        <w:pStyle w:val="Cmsor3"/>
+      </w:pPr>
+      <w:bookmarkStart w:id="29" w:name="_Toc221883177"/>
+      <w:r>
+        <w:t>Más nyelvekre kiterjesztés</w:t>
+      </w:r>
+      <w:bookmarkEnd w:id="29"/>
+    </w:p>
+    <w:p>
+      <w:pPr>
+        <w:spacing w:line="259" w:lineRule="auto"/>
+        <w:ind w:firstLine="0"/>
+        <w:jc w:val="left"/>
+      </w:pPr>
+      <w:r>
+        <w:br w:type="page"/>
+      </w:r>
     </w:p>
     <w:p>
       <w:pPr>
         <w:pStyle w:val="Cmsor2"/>
       </w:pPr>
-      <w:bookmarkStart w:id="26" w:name="_Toc221883174"/>
-      <w:r>
-        <w:t>Jövőbeli fejlesztések</w:t>
-      </w:r>
-      <w:bookmarkEnd w:id="26"/>
-    </w:p>
-    <w:p>
-      <w:pPr>
-        <w:pStyle w:val="Cmsor3"/>
-      </w:pPr>
-      <w:bookmarkStart w:id="27" w:name="_Toc221883175"/>
-      <w:r>
-        <w:t>Teljesítményt növelő fejlesztések</w:t>
-      </w:r>
-      <w:bookmarkEnd w:id="27"/>
-    </w:p>
-    <w:p>
-      <w:pPr>
-        <w:pStyle w:val="Cmsor3"/>
-      </w:pPr>
-      <w:bookmarkStart w:id="28" w:name="_Toc221883176"/>
-      <w:r>
-        <w:t>Bővítmények</w:t>
-      </w:r>
-      <w:bookmarkEnd w:id="28"/>
-    </w:p>
-    <w:p>
-      <w:pPr>
-        <w:pStyle w:val="Cmsor3"/>
-      </w:pPr>
-      <w:bookmarkStart w:id="29" w:name="_Toc221883177"/>
-      <w:r>
-        <w:t>Más nyelvekre kiterjesztés</w:t>
-      </w:r>
-      <w:bookmarkEnd w:id="29"/>
-    </w:p>
-    <w:p>
-      <w:pPr>
-        <w:pStyle w:val="Cmsor2"/>
-      </w:pPr>
       <w:bookmarkStart w:id="30" w:name="_Toc221883178"/>
       <w:r>
+        <w:lastRenderedPageBreak/>
         <w:t>Köszönetnyilvánítás</w:t>
       </w:r>
       <w:bookmarkEnd w:id="30"/>
@@ -31427,7 +32402,7 @@
   <w:abstractNum w:abstractNumId="10" w15:restartNumberingAfterBreak="0">
     <w:nsid w:val="6D982FAC"/>
     <w:multiLevelType w:val="hybridMultilevel"/>
-    <w:tmpl w:val="0A70C7EA"/>
+    <w:tmpl w:val="3AA2DE46"/>
     <w:lvl w:ilvl="0" w:tplc="040E0001">
       <w:start w:val="1"/>
       <w:numFmt w:val="bullet"/>
@@ -32429,7 +33404,7 @@
   <w:style w:type="paragraph" w:default="1" w:styleId="Norml">
     <w:name w:val="Normal"/>
     <w:qFormat/>
-    <w:rsid w:val="00956F21"/>
+    <w:rsid w:val="003B52F2"/>
     <w:pPr>
       <w:spacing w:line="360" w:lineRule="auto"/>
       <w:ind w:firstLine="227"/>
@@ -32639,6 +33614,7 @@
   <w:style w:type="character" w:default="1" w:styleId="Bekezdsalapbettpusa">
     <w:name w:val="Default Paragraph Font"/>
     <w:uiPriority w:val="1"/>
+    <w:semiHidden/>
     <w:unhideWhenUsed/>
   </w:style>
   <w:style w:type="table" w:default="1" w:styleId="Normltblzat">

</xml_diff>

<commit_message>
Adding "Upcoming updates" section to the documentation.
</commit_message>
<xml_diff>
--- a/Documentation.docx
+++ b/Documentation.docx
@@ -3901,10 +3901,7 @@
         <w:t xml:space="preserve">a hétköznapi helyzetek többségére tökéletesen megfelelő </w:t>
       </w:r>
       <w:r>
-        <w:t>az IEEE</w:t>
-      </w:r>
-      <w:r>
-        <w:t xml:space="preserve"> 754</w:t>
+        <w:t>az IEEE 754</w:t>
       </w:r>
       <w:r>
         <w:t xml:space="preserve"> számformátum</w:t>
@@ -4975,13 +4972,7 @@
           <w:rPr>
             <w:rFonts w:ascii="Cambria Math" w:hAnsi="Cambria Math"/>
           </w:rPr>
-          <m:t>a</m:t>
-        </m:r>
-        <m:r>
-          <w:rPr>
-            <w:rFonts w:ascii="Cambria Math" w:hAnsi="Cambria Math"/>
-          </w:rPr>
-          <m:t>≠b</m:t>
+          <m:t>a≠b</m:t>
         </m:r>
         <m:r>
           <w:rPr>
@@ -5105,13 +5096,7 @@
           <w:rPr>
             <w:rFonts w:ascii="Cambria Math" w:hAnsi="Cambria Math"/>
           </w:rPr>
-          <m:t>&gt;</m:t>
-        </m:r>
-        <m:r>
-          <w:rPr>
-            <w:rFonts w:ascii="Cambria Math" w:hAnsi="Cambria Math"/>
-          </w:rPr>
-          <m:t>b)</m:t>
+          <m:t>&gt;b)</m:t>
         </m:r>
       </m:oMath>
     </w:p>
@@ -5217,13 +5202,7 @@
     </w:p>
     <w:p>
       <w:r>
-        <w:t>A</w:t>
-      </w:r>
-      <w:r>
-        <w:t xml:space="preserve"> hatványozás és a gyökvonás megvalósításáról</w:t>
-      </w:r>
-      <w:r>
-        <w:t xml:space="preserve"> é</w:t>
+        <w:t>A hatványozás és a gyökvonás megvalósításáról é</w:t>
       </w:r>
       <w:r>
         <w:t xml:space="preserve">rdemes </w:t>
@@ -9799,19 +9778,7 @@
                 <w:rPr>
                   <w:rFonts w:ascii="Cambria Math" w:eastAsiaTheme="minorEastAsia" w:hAnsi="Cambria Math"/>
                 </w:rPr>
-                <m:t>a</m:t>
-              </m:r>
-              <m:r>
-                <w:rPr>
-                  <w:rFonts w:ascii="Cambria Math" w:eastAsiaTheme="minorEastAsia" w:hAnsi="Cambria Math"/>
-                </w:rPr>
-                <m:t>∙</m:t>
-              </m:r>
-              <m:r>
-                <w:rPr>
-                  <w:rFonts w:ascii="Cambria Math" w:eastAsiaTheme="minorEastAsia" w:hAnsi="Cambria Math"/>
-                </w:rPr>
-                <m:t>d</m:t>
+                <m:t>a∙d</m:t>
               </m:r>
             </m:num>
             <m:den>
@@ -9819,19 +9786,7 @@
                 <w:rPr>
                   <w:rFonts w:ascii="Cambria Math" w:eastAsiaTheme="minorEastAsia" w:hAnsi="Cambria Math"/>
                 </w:rPr>
-                <m:t>b</m:t>
-              </m:r>
-              <m:r>
-                <w:rPr>
-                  <w:rFonts w:ascii="Cambria Math" w:eastAsiaTheme="minorEastAsia" w:hAnsi="Cambria Math"/>
-                </w:rPr>
-                <m:t>∙</m:t>
-              </m:r>
-              <m:r>
-                <w:rPr>
-                  <w:rFonts w:ascii="Cambria Math" w:eastAsiaTheme="minorEastAsia" w:hAnsi="Cambria Math"/>
-                </w:rPr>
-                <m:t>d</m:t>
+                <m:t>b∙d</m:t>
               </m:r>
             </m:den>
           </m:f>
@@ -9856,19 +9811,7 @@
                 <w:rPr>
                   <w:rFonts w:ascii="Cambria Math" w:eastAsiaTheme="minorEastAsia" w:hAnsi="Cambria Math"/>
                 </w:rPr>
-                <m:t>b</m:t>
-              </m:r>
-              <m:r>
-                <w:rPr>
-                  <w:rFonts w:ascii="Cambria Math" w:eastAsiaTheme="minorEastAsia" w:hAnsi="Cambria Math"/>
-                </w:rPr>
-                <m:t>∙</m:t>
-              </m:r>
-              <m:r>
-                <w:rPr>
-                  <w:rFonts w:ascii="Cambria Math" w:eastAsiaTheme="minorEastAsia" w:hAnsi="Cambria Math"/>
-                </w:rPr>
-                <m:t>c</m:t>
+                <m:t>b∙c</m:t>
               </m:r>
               <m:ctrlPr>
                 <w:rPr>
@@ -9882,19 +9825,7 @@
                 <w:rPr>
                   <w:rFonts w:ascii="Cambria Math" w:eastAsiaTheme="minorEastAsia" w:hAnsi="Cambria Math"/>
                 </w:rPr>
-                <m:t>b</m:t>
-              </m:r>
-              <m:r>
-                <w:rPr>
-                  <w:rFonts w:ascii="Cambria Math" w:eastAsiaTheme="minorEastAsia" w:hAnsi="Cambria Math"/>
-                </w:rPr>
-                <m:t>∙</m:t>
-              </m:r>
-              <m:r>
-                <w:rPr>
-                  <w:rFonts w:ascii="Cambria Math" w:eastAsiaTheme="minorEastAsia" w:hAnsi="Cambria Math"/>
-                </w:rPr>
-                <m:t>d</m:t>
+                <m:t>b∙d</m:t>
               </m:r>
             </m:den>
           </m:f>
@@ -9953,19 +9884,7 @@
                     <w:rPr>
                       <w:rFonts w:ascii="Cambria Math" w:eastAsiaTheme="minorEastAsia" w:hAnsi="Cambria Math"/>
                     </w:rPr>
-                    <m:t>b</m:t>
-                  </m:r>
-                  <m:r>
-                    <w:rPr>
-                      <w:rFonts w:ascii="Cambria Math" w:eastAsiaTheme="minorEastAsia" w:hAnsi="Cambria Math"/>
-                    </w:rPr>
-                    <m:t>∙</m:t>
-                  </m:r>
-                  <m:r>
-                    <w:rPr>
-                      <w:rFonts w:ascii="Cambria Math" w:eastAsiaTheme="minorEastAsia" w:hAnsi="Cambria Math"/>
-                    </w:rPr>
-                    <m:t>c</m:t>
+                    <m:t>b∙c</m:t>
                   </m:r>
                   <m:ctrlPr>
                     <w:rPr>
@@ -10203,19 +10122,7 @@
                 <w:rPr>
                   <w:rFonts w:ascii="Cambria Math" w:hAnsi="Cambria Math"/>
                 </w:rPr>
-                <m:t>a</m:t>
-              </m:r>
-              <m:r>
-                <w:rPr>
-                  <w:rFonts w:ascii="Cambria Math" w:hAnsi="Cambria Math"/>
-                </w:rPr>
-                <m:t>∙</m:t>
-              </m:r>
-              <m:r>
-                <w:rPr>
-                  <w:rFonts w:ascii="Cambria Math" w:hAnsi="Cambria Math"/>
-                </w:rPr>
-                <m:t>c</m:t>
+                <m:t>a∙c</m:t>
               </m:r>
             </m:num>
             <m:den>
@@ -10223,19 +10130,7 @@
                 <w:rPr>
                   <w:rFonts w:ascii="Cambria Math" w:hAnsi="Cambria Math"/>
                 </w:rPr>
-                <m:t>b</m:t>
-              </m:r>
-              <m:r>
-                <w:rPr>
-                  <w:rFonts w:ascii="Cambria Math" w:hAnsi="Cambria Math"/>
-                </w:rPr>
-                <m:t>∙</m:t>
-              </m:r>
-              <m:r>
-                <w:rPr>
-                  <w:rFonts w:ascii="Cambria Math" w:hAnsi="Cambria Math"/>
-                </w:rPr>
-                <m:t>d</m:t>
+                <m:t>b∙d</m:t>
               </m:r>
             </m:den>
           </m:f>
@@ -10630,13 +10525,7 @@
         <w:t>gyökvonás</w:t>
       </w:r>
       <w:r>
-        <w:t xml:space="preserve"> </w:t>
-      </w:r>
-      <w:r>
-        <w:t xml:space="preserve">az </w:t>
-      </w:r>
-      <w:r>
-        <w:t xml:space="preserve">egyetlen </w:t>
+        <w:t xml:space="preserve"> az egyetlen </w:t>
       </w:r>
       <w:r>
         <w:t>művelet</w:t>
@@ -13139,6 +13028,9 @@
             <m:t>=</m:t>
           </m:r>
           <m:r>
+            <m:rPr>
+              <m:sty m:val="p"/>
+            </m:rPr>
             <w:rPr>
               <w:rFonts w:ascii="Cambria Math" w:eastAsiaTheme="minorEastAsia" w:hAnsi="Cambria Math"/>
             </w:rPr>
@@ -13965,6 +13857,9 @@
             <m:t>=</m:t>
           </m:r>
           <m:r>
+            <m:rPr>
+              <m:sty m:val="p"/>
+            </m:rPr>
             <w:rPr>
               <w:rFonts w:ascii="Cambria Math" w:eastAsiaTheme="minorEastAsia" w:hAnsi="Cambria Math"/>
             </w:rPr>
@@ -25880,13 +25775,7 @@
             <w:rPr>
               <w:rFonts w:ascii="Cambria Math" w:eastAsiaTheme="minorEastAsia" w:hAnsi="Cambria Math"/>
             </w:rPr>
-            <m:t>A</m:t>
-          </m:r>
-          <m:r>
-            <w:rPr>
-              <w:rFonts w:ascii="Cambria Math" w:eastAsiaTheme="minorEastAsia" w:hAnsi="Cambria Math"/>
-            </w:rPr>
-            <m:t>=</m:t>
+            <m:t>A=</m:t>
           </m:r>
           <m:nary>
             <m:naryPr>
@@ -26094,13 +25983,7 @@
             <w:rPr>
               <w:rFonts w:ascii="Cambria Math" w:eastAsiaTheme="minorEastAsia" w:hAnsi="Cambria Math"/>
             </w:rPr>
-            <m:t>B</m:t>
-          </m:r>
-          <m:r>
-            <w:rPr>
-              <w:rFonts w:ascii="Cambria Math" w:eastAsiaTheme="minorEastAsia" w:hAnsi="Cambria Math"/>
-            </w:rPr>
-            <m:t>=</m:t>
+            <m:t>B=</m:t>
           </m:r>
           <m:nary>
             <m:naryPr>
@@ -26550,31 +26433,7 @@
             <w:rPr>
               <w:rFonts w:ascii="Cambria Math" w:eastAsiaTheme="minorEastAsia" w:hAnsi="Cambria Math"/>
             </w:rPr>
-            <m:t>13591409</m:t>
-          </m:r>
-          <m:r>
-            <w:rPr>
-              <w:rFonts w:ascii="Cambria Math" w:eastAsiaTheme="minorEastAsia" w:hAnsi="Cambria Math"/>
-            </w:rPr>
-            <m:t>A</m:t>
-          </m:r>
-          <m:r>
-            <w:rPr>
-              <w:rFonts w:ascii="Cambria Math" w:eastAsiaTheme="minorEastAsia" w:hAnsi="Cambria Math"/>
-            </w:rPr>
-            <m:t>+ 545140134</m:t>
-          </m:r>
-          <m:r>
-            <w:rPr>
-              <w:rFonts w:ascii="Cambria Math" w:eastAsiaTheme="minorEastAsia" w:hAnsi="Cambria Math"/>
-            </w:rPr>
-            <m:t>B</m:t>
-          </m:r>
-          <m:r>
-            <w:rPr>
-              <w:rFonts w:ascii="Cambria Math" w:eastAsiaTheme="minorEastAsia" w:hAnsi="Cambria Math"/>
-            </w:rPr>
-            <m:t>=</m:t>
+            <m:t>13591409A+ 545140134B=</m:t>
           </m:r>
           <m:f>
             <m:fPr>
@@ -26591,25 +26450,7 @@
                 <w:rPr>
                   <w:rFonts w:ascii="Cambria Math" w:eastAsiaTheme="minorEastAsia" w:hAnsi="Cambria Math"/>
                 </w:rPr>
-                <m:t>13591409</m:t>
-              </m:r>
-              <m:r>
-                <w:rPr>
-                  <w:rFonts w:ascii="Cambria Math" w:eastAsiaTheme="minorEastAsia" w:hAnsi="Cambria Math"/>
-                </w:rPr>
-                <m:t>A</m:t>
-              </m:r>
-              <m:r>
-                <w:rPr>
-                  <w:rFonts w:ascii="Cambria Math" w:eastAsiaTheme="minorEastAsia" w:hAnsi="Cambria Math"/>
-                </w:rPr>
-                <m:t>+ 545140134</m:t>
-              </m:r>
-              <m:r>
-                <w:rPr>
-                  <w:rFonts w:ascii="Cambria Math" w:eastAsiaTheme="minorEastAsia" w:hAnsi="Cambria Math"/>
-                </w:rPr>
-                <m:t>B</m:t>
+                <m:t>13591409A+ 545140134B</m:t>
               </m:r>
             </m:num>
             <m:den>
@@ -34042,7 +33883,7 @@
     </w:p>
     <w:p>
       <w:pPr>
-        <w:pStyle w:val="Cmsor2"/>
+        <w:pStyle w:val="Cmsor1"/>
       </w:pPr>
       <w:bookmarkStart w:id="27" w:name="_Toc224580525"/>
       <w:r>
@@ -34053,18 +33894,75 @@
     </w:p>
     <w:p>
       <w:pPr>
+        <w:pStyle w:val="Cmsor2"/>
+      </w:pPr>
+      <w:bookmarkStart w:id="28" w:name="_Toc224580526"/>
+      <w:r>
+        <w:t>Teljesítményt növelő fejlesztések</w:t>
+      </w:r>
+      <w:bookmarkEnd w:id="28"/>
+    </w:p>
+    <w:p>
+      <w:pPr>
         <w:pStyle w:val="Cmsor3"/>
       </w:pPr>
-      <w:bookmarkStart w:id="28" w:name="_Toc224580526"/>
-      <w:r>
-        <w:t>Teljesítményt növelő fejlesztések</w:t>
-      </w:r>
-      <w:bookmarkEnd w:id="28"/>
+      <w:r>
+        <w:t>Digit típus egyszerűsítése</w:t>
+      </w:r>
+    </w:p>
+    <w:p>
+      <w:r>
+        <w:t xml:space="preserve">Jelen állapotában a Digit típus csak egy kiegészítő osztály az alap beépített byte típus köré építve. Segíti, hogy a bájt semmiképp se vehessen fel </w:t>
+      </w:r>
+      <w:r>
+        <w:t>helytelen értéket és ellehetetleníti a helytelen kezelést.</w:t>
+      </w:r>
+    </w:p>
+    <w:p>
+      <w:r>
+        <w:t>A probléma ezzel</w:t>
+      </w:r>
+      <w:r>
+        <w:t xml:space="preserve"> a felépítéssel</w:t>
+      </w:r>
+      <w:r>
+        <w:t xml:space="preserve">, hogy plusz memóriát foglal és </w:t>
+      </w:r>
+      <w:r>
+        <w:t>lassítja a számítást. Ideális esetben a Natural típus csak egy bájt tömbbel dolgozhatna és egy statikus Digit osztály biztosíthatná hozzá a megfelelő műveleteket, ezzel elkerülve a fölösleges körítést.</w:t>
+      </w:r>
     </w:p>
     <w:p>
       <w:pPr>
         <w:pStyle w:val="Cmsor3"/>
       </w:pPr>
+      <w:r>
+        <w:t>Műveletek memóriaigényének csökkentése</w:t>
+      </w:r>
+    </w:p>
+    <w:p>
+      <w:r>
+        <w:t>Az eddigi implementációjában a Natural és a Positive típus minden metódusa kibővíti a számokat nullákkal egyenlő hosszúságúra. Ezzel az a probléma, hogy mivel nincs korlátozva a számjegyek hosszúsága, így borzasztó hosszú számok esetén (mondjuk magas precizitású pi vagy e szám számítások során) a memória újra allokálások nagyban csökkentik az algoritmus hatékonyságát.</w:t>
+      </w:r>
+    </w:p>
+    <w:p>
+      <w:r>
+        <w:t>Az egyetlen ok, ami miatt így lettek megalkotva a könyvtár függvényei, hogy nagyban növeli az algoritmus komplexitását, ha figyelni kell a kiindexelésre.</w:t>
+      </w:r>
+    </w:p>
+    <w:p>
+      <w:pPr>
+        <w:pStyle w:val="Cmsor3"/>
+      </w:pPr>
+      <w:r>
+        <w:t>Hatékonyabb algoritmusok használata</w:t>
+      </w:r>
+    </w:p>
+    <w:p/>
+    <w:p>
+      <w:pPr>
+        <w:pStyle w:val="Cmsor2"/>
+      </w:pPr>
       <w:bookmarkStart w:id="29" w:name="_Toc224580527"/>
       <w:r>
         <w:t>Bővítmények</w:t>
@@ -34075,11 +33973,161 @@
       <w:pPr>
         <w:pStyle w:val="Cmsor3"/>
       </w:pPr>
+      <w:r>
+        <w:t>Több számítási eljárás támogatása</w:t>
+      </w:r>
+    </w:p>
+    <w:p>
+      <w:r>
+        <w:t>A mátrixműveletek elvégzése, a Lagrange interpolációs polinom megalkotása és a derivál számítás mellett a könyvtár úgy lett megalkotva, hogy nagyban elősegítse a fejlesztőt még több funkció hozzáadásában.</w:t>
+      </w:r>
+      <w:r>
+        <w:t xml:space="preserve"> Hasznosnak mondható lenne:</w:t>
+      </w:r>
+    </w:p>
+    <w:p>
+      <w:pPr>
+        <w:pStyle w:val="Listaszerbekezds"/>
+        <w:numPr>
+          <w:ilvl w:val="0"/>
+          <w:numId w:val="9"/>
+        </w:numPr>
+      </w:pPr>
+      <w:r>
+        <w:t>Még több interpolációs eljárás implementálása és a köztük való váltás támogatása (</w:t>
+      </w:r>
+      <w:proofErr w:type="spellStart"/>
+      <w:r>
+        <w:t>Hermite</w:t>
+      </w:r>
+      <w:proofErr w:type="spellEnd"/>
+      <w:r>
+        <w:t xml:space="preserve">, </w:t>
+      </w:r>
+      <w:proofErr w:type="spellStart"/>
+      <w:r>
+        <w:t>Catmull</w:t>
+      </w:r>
+      <w:proofErr w:type="spellEnd"/>
+      <w:r>
+        <w:t>-Rom</w:t>
+      </w:r>
+      <w:r>
+        <w:t>,</w:t>
+      </w:r>
+      <w:r>
+        <w:t xml:space="preserve"> </w:t>
+      </w:r>
+      <w:r>
+        <w:t>B-</w:t>
+      </w:r>
+      <w:proofErr w:type="spellStart"/>
+      <w:r>
+        <w:t>spline</w:t>
+      </w:r>
+      <w:proofErr w:type="spellEnd"/>
+      <w:r>
+        <w:t>)</w:t>
+      </w:r>
+    </w:p>
+    <w:p>
+      <w:pPr>
+        <w:pStyle w:val="Listaszerbekezds"/>
+        <w:numPr>
+          <w:ilvl w:val="0"/>
+          <w:numId w:val="9"/>
+        </w:numPr>
+      </w:pPr>
+      <w:r>
+        <w:t>Integrálközelítés algoritmusának implementálása</w:t>
+      </w:r>
+    </w:p>
+    <w:p>
+      <w:pPr>
+        <w:pStyle w:val="Listaszerbekezds"/>
+        <w:numPr>
+          <w:ilvl w:val="0"/>
+          <w:numId w:val="9"/>
+        </w:numPr>
+      </w:pPr>
+      <w:r>
+        <w:lastRenderedPageBreak/>
+        <w:t>Euklideszi algoritmus hozzáadása a vizuális számológéphez, mivel az alap könyvtár már úgy is tartalmazza</w:t>
+      </w:r>
+    </w:p>
+    <w:p>
+      <w:pPr>
+        <w:pStyle w:val="Listaszerbekezds"/>
+        <w:numPr>
+          <w:ilvl w:val="0"/>
+          <w:numId w:val="9"/>
+        </w:numPr>
+      </w:pPr>
+      <w:r>
+        <w:t xml:space="preserve">Gauss-Jordan elimináció </w:t>
+      </w:r>
+      <w:r>
+        <w:t>hozzáadása a vizuális számológéphez, mivel az alap könyvtár már úgy is tartalmazza</w:t>
+      </w:r>
+    </w:p>
+    <w:p>
+      <w:pPr>
+        <w:pStyle w:val="Listaszerbekezds"/>
+        <w:numPr>
+          <w:ilvl w:val="0"/>
+          <w:numId w:val="9"/>
+        </w:numPr>
+      </w:pPr>
+      <w:r>
+        <w:t>Fizikai</w:t>
+      </w:r>
+      <w:r>
+        <w:t xml:space="preserve"> és kémiai</w:t>
+      </w:r>
+      <w:r>
+        <w:t xml:space="preserve"> képletek és mértékegységek implementálása</w:t>
+      </w:r>
+    </w:p>
+    <w:p>
+      <w:pPr>
+        <w:pStyle w:val="Cmsor3"/>
+      </w:pPr>
+      <w:r>
+        <w:t>Függvény kirajzoló ablak támogatása</w:t>
+      </w:r>
+    </w:p>
+    <w:p>
+      <w:r>
+        <w:t>Nagy segítséget nyújthatna az interpoláció elvégzése után, ha egy gomb megnyomásával már láthatná is a felhasználó a kapott függvényt. Így több információhoz juthatna mit, hogy tudja hogy valahogy átmegy a kért pontokon.</w:t>
+      </w:r>
+    </w:p>
+    <w:p>
+      <w:r>
+        <w:t>Az ablak akár állítható is lehetne a görgő és az egér mozgatásával, hogy éppen milyen értékek közt szeretné a felhasználó szemügyre venni a görbét.</w:t>
+      </w:r>
+    </w:p>
+    <w:p>
+      <w:pPr>
+        <w:pStyle w:val="Cmsor3"/>
+      </w:pPr>
       <w:bookmarkStart w:id="30" w:name="_Toc224580528"/>
       <w:r>
         <w:t>Más nyelvekre kiterjesztés</w:t>
       </w:r>
       <w:bookmarkEnd w:id="30"/>
+    </w:p>
+    <w:p>
+      <w:r>
+        <w:t>Az alkalmazás, bár nem tartalmaz túl sok szöveget, angol sztenderdek alapján van megírva</w:t>
+      </w:r>
+      <w:r>
+        <w:t xml:space="preserve"> és tizedespontot használ szeparátor gyanánt.</w:t>
+      </w:r>
+    </w:p>
+    <w:p>
+      <w:r>
+        <w:t>Azt a kevés energiát tekintve, amit egy többnyelvűsítés igényelne, nyugodtan bele lehetne venni a programba. Más szemszögből pedig, mivel manapság már az angol nyelv ilyen szintű ismerete szinte alapvetőnek vehető, alacsony prioritású fejlesztésnek vehető.</w:t>
+      </w:r>
     </w:p>
     <w:p>
       <w:pPr>
@@ -34093,7 +34141,7 @@
     </w:p>
     <w:p>
       <w:pPr>
-        <w:pStyle w:val="Cmsor2"/>
+        <w:pStyle w:val="Cmsor1"/>
       </w:pPr>
       <w:bookmarkStart w:id="31" w:name="_Toc224580529"/>
       <w:r>
@@ -35623,7 +35671,7 @@
   <w:abstractNum w:abstractNumId="12" w15:restartNumberingAfterBreak="0">
     <w:nsid w:val="6D982FAC"/>
     <w:multiLevelType w:val="hybridMultilevel"/>
-    <w:tmpl w:val="3AA2DE46"/>
+    <w:tmpl w:val="D8280CA6"/>
     <w:lvl w:ilvl="0" w:tplc="040E0001">
       <w:start w:val="1"/>
       <w:numFmt w:val="bullet"/>

</xml_diff>

<commit_message>
Small changes to previously written parts in the documentation.
</commit_message>
<xml_diff>
--- a/Documentation.docx
+++ b/Documentation.docx
@@ -179,7 +179,10 @@
               <w:t>Budapest, 202</w:t>
             </w:r>
             <w:r>
-              <w:t>5-2026</w:t>
+              <w:t>4</w:t>
+            </w:r>
+            <w:r>
+              <w:t>-2026</w:t>
             </w:r>
           </w:p>
         </w:tc>
@@ -3970,15 +3973,7 @@
         <w:jc w:val="center"/>
       </w:pPr>
       <w:r>
-        <w:t xml:space="preserve">&lt;kép egy 0-nál kisebb számról ami rövidebb mint a </w:t>
-      </w:r>
-      <w:proofErr w:type="spellStart"/>
-      <w:r>
-        <w:t>fractionLength</w:t>
-      </w:r>
-      <w:proofErr w:type="spellEnd"/>
-      <w:r>
-        <w:t>&gt;</w:t>
+        <w:t>&lt;kép egy 0-nál kisebb számról ami rövidebb mint a fractionLength&gt;</w:t>
       </w:r>
     </w:p>
     <w:p>
@@ -4529,13 +4524,8 @@
         <w:t>long</w:t>
       </w:r>
       <w:r>
-        <w:t xml:space="preserve"> </w:t>
-      </w:r>
-      <w:proofErr w:type="spellStart"/>
-      <w:r>
-        <w:t>long</w:t>
-      </w:r>
-      <w:proofErr w:type="spellEnd"/>
+        <w:t xml:space="preserve"> long</w:t>
+      </w:r>
       <w:r>
         <w:t xml:space="preserve"> számtípus</w:t>
       </w:r>
@@ -5189,15 +5179,7 @@
         <w:t xml:space="preserve"> esetén a</w:t>
       </w:r>
       <w:r>
-        <w:t xml:space="preserve">z úgy nevezett „long </w:t>
-      </w:r>
-      <w:proofErr w:type="spellStart"/>
-      <w:r>
-        <w:t>division</w:t>
-      </w:r>
-      <w:proofErr w:type="spellEnd"/>
-      <w:r>
-        <w:t>” algoritmust alkalmazzuk. Az osztandó legnagyobb helyiértékétől elszeparálunk egy az osztó számjegyeivel megegyező hosszúságú szakaszt, majd elvégezzük az osztást (vagyis kivonjuk az osztót az elszeparált szakaszunkból ahányszor csak tudjuk). Megjegyezzük az osztás eredményét és hozzáveszünk még egy számjegyet az osztandóból a maradékhoz. A maradék adja meg az új szakaszt és kezdődhet újra a ciklus ameddig el nem fogynak a számjegyek.</w:t>
+        <w:t>z úgy nevezett „long division” algoritmust alkalmazzuk. Az osztandó legnagyobb helyiértékétől elszeparálunk egy az osztó számjegyeivel megegyező hosszúságú szakaszt, majd elvégezzük az osztást (vagyis kivonjuk az osztót az elszeparált szakaszunkból ahányszor csak tudjuk). Megjegyezzük az osztás eredményét és hozzáveszünk még egy számjegyet az osztandóból a maradékhoz. A maradék adja meg az új szakaszt és kezdődhet újra a ciklus ameddig el nem fogynak a számjegyek.</w:t>
       </w:r>
     </w:p>
     <w:p>
@@ -6347,71 +6329,49 @@
         <w:rPr>
           <w:rFonts w:eastAsiaTheme="minorEastAsia"/>
         </w:rPr>
-        <w:t xml:space="preserve">François </w:t>
-      </w:r>
-      <w:proofErr w:type="spellStart"/>
+        <w:t>François Viète</w:t>
+      </w:r>
       <w:r>
         <w:rPr>
           <w:rFonts w:eastAsiaTheme="minorEastAsia"/>
         </w:rPr>
-        <w:t>Viète</w:t>
-      </w:r>
-      <w:proofErr w:type="spellEnd"/>
+        <w:t>, híres matematikus</w:t>
+      </w:r>
       <w:r>
         <w:rPr>
           <w:rFonts w:eastAsiaTheme="minorEastAsia"/>
         </w:rPr>
-        <w:t>, híres matematikus</w:t>
+        <w:t xml:space="preserve"> által </w:t>
       </w:r>
       <w:r>
         <w:rPr>
           <w:rFonts w:eastAsiaTheme="minorEastAsia"/>
         </w:rPr>
-        <w:t xml:space="preserve"> által </w:t>
+        <w:t xml:space="preserve">kifejlesztett </w:t>
       </w:r>
       <w:r>
         <w:rPr>
           <w:rFonts w:eastAsiaTheme="minorEastAsia"/>
         </w:rPr>
-        <w:t xml:space="preserve">kifejlesztett </w:t>
+        <w:t xml:space="preserve">módszert </w:t>
       </w:r>
       <w:r>
         <w:rPr>
           <w:rFonts w:eastAsiaTheme="minorEastAsia"/>
         </w:rPr>
-        <w:t xml:space="preserve">módszert </w:t>
+        <w:t>alkalmaz a könyvtár</w:t>
       </w:r>
       <w:r>
         <w:rPr>
           <w:rFonts w:eastAsiaTheme="minorEastAsia"/>
         </w:rPr>
-        <w:t>alkalmaz a könyvtár</w:t>
+        <w:t xml:space="preserve">, </w:t>
       </w:r>
       <w:r>
         <w:rPr>
           <w:rFonts w:eastAsiaTheme="minorEastAsia"/>
         </w:rPr>
-        <w:t xml:space="preserve">, </w:t>
-      </w:r>
-      <w:r>
-        <w:rPr>
-          <w:rFonts w:eastAsiaTheme="minorEastAsia"/>
-        </w:rPr>
-        <w:t xml:space="preserve">amit </w:t>
-      </w:r>
-      <w:proofErr w:type="spellStart"/>
-      <w:r>
-        <w:rPr>
-          <w:rFonts w:eastAsiaTheme="minorEastAsia"/>
-        </w:rPr>
-        <w:t>Viète</w:t>
-      </w:r>
-      <w:proofErr w:type="spellEnd"/>
-      <w:r>
-        <w:rPr>
-          <w:rFonts w:eastAsiaTheme="minorEastAsia"/>
-        </w:rPr>
-        <w:t xml:space="preserve"> </w:t>
+        <w:t xml:space="preserve">amit Viète </w:t>
       </w:r>
       <w:r>
         <w:rPr>
@@ -7639,15 +7599,7 @@
     </w:p>
     <w:p>
       <w:r>
-        <w:t xml:space="preserve">Egyszerűbben úgy tudnánk elképzelni a fenti számítást, mint a kézi osztás (long </w:t>
-      </w:r>
-      <w:proofErr w:type="spellStart"/>
-      <w:r>
-        <w:t>division</w:t>
-      </w:r>
-      <w:proofErr w:type="spellEnd"/>
-      <w:r>
-        <w:t xml:space="preserve">) műveletsorát. Itt is a legnagyobb helyiértékű számjegytől kezdve folyamatosan alulról közelítjük az eredményünket a valós értékhez. </w:t>
+        <w:t xml:space="preserve">Egyszerűbben úgy tudnánk elképzelni a fenti számítást, mint a kézi osztás (long division) műveletsorát. Itt is a legnagyobb helyiértékű számjegytől kezdve folyamatosan alulról közelítjük az eredményünket a valós értékhez. </w:t>
       </w:r>
       <w:r>
         <w:t>Éppen</w:t>
@@ -10954,120 +10906,36 @@
           <w:rFonts w:eastAsiaTheme="minorEastAsia"/>
           <w:iCs/>
         </w:rPr>
-        <w:t xml:space="preserve"> (</w:t>
-      </w:r>
-      <w:proofErr w:type="spellStart"/>
+        <w:t xml:space="preserve"> (binary splitting</w:t>
+      </w:r>
       <w:r>
         <w:rPr>
           <w:rFonts w:eastAsiaTheme="minorEastAsia"/>
           <w:iCs/>
         </w:rPr>
-        <w:t>binary</w:t>
-      </w:r>
-      <w:proofErr w:type="spellEnd"/>
+        <w:t xml:space="preserve">, másnéven </w:t>
+      </w:r>
       <w:r>
         <w:rPr>
           <w:rFonts w:eastAsiaTheme="minorEastAsia"/>
           <w:iCs/>
         </w:rPr>
-        <w:t xml:space="preserve"> </w:t>
-      </w:r>
-      <w:proofErr w:type="spellStart"/>
+        <w:t>divide-and-conquer summation</w:t>
+      </w:r>
       <w:r>
         <w:rPr>
           <w:rFonts w:eastAsiaTheme="minorEastAsia"/>
           <w:iCs/>
         </w:rPr>
-        <w:t>splitting</w:t>
-      </w:r>
-      <w:proofErr w:type="spellEnd"/>
+        <w:t xml:space="preserve">/product vagy </w:t>
+      </w:r>
       <w:r>
         <w:rPr>
           <w:rFonts w:eastAsiaTheme="minorEastAsia"/>
           <w:iCs/>
         </w:rPr>
-        <w:t xml:space="preserve">, másnéven </w:t>
-      </w:r>
-      <w:proofErr w:type="spellStart"/>
-      <w:r>
-        <w:rPr>
-          <w:rFonts w:eastAsiaTheme="minorEastAsia"/>
-          <w:iCs/>
-        </w:rPr>
-        <w:t>divide</w:t>
-      </w:r>
-      <w:proofErr w:type="spellEnd"/>
-      <w:r>
-        <w:rPr>
-          <w:rFonts w:eastAsiaTheme="minorEastAsia"/>
-          <w:iCs/>
-        </w:rPr>
-        <w:t>-and-</w:t>
-      </w:r>
-      <w:proofErr w:type="spellStart"/>
-      <w:r>
-        <w:rPr>
-          <w:rFonts w:eastAsiaTheme="minorEastAsia"/>
-          <w:iCs/>
-        </w:rPr>
-        <w:t>conquer</w:t>
-      </w:r>
-      <w:proofErr w:type="spellEnd"/>
-      <w:r>
-        <w:rPr>
-          <w:rFonts w:eastAsiaTheme="minorEastAsia"/>
-          <w:iCs/>
-        </w:rPr>
-        <w:t xml:space="preserve"> </w:t>
-      </w:r>
-      <w:proofErr w:type="spellStart"/>
-      <w:r>
-        <w:rPr>
-          <w:rFonts w:eastAsiaTheme="minorEastAsia"/>
-          <w:iCs/>
-        </w:rPr>
-        <w:t>summation</w:t>
-      </w:r>
-      <w:proofErr w:type="spellEnd"/>
-      <w:r>
-        <w:rPr>
-          <w:rFonts w:eastAsiaTheme="minorEastAsia"/>
-          <w:iCs/>
-        </w:rPr>
-        <w:t>/</w:t>
-      </w:r>
-      <w:proofErr w:type="spellStart"/>
-      <w:r>
-        <w:rPr>
-          <w:rFonts w:eastAsiaTheme="minorEastAsia"/>
-          <w:iCs/>
-        </w:rPr>
-        <w:t>product</w:t>
-      </w:r>
-      <w:proofErr w:type="spellEnd"/>
-      <w:r>
-        <w:rPr>
-          <w:rFonts w:eastAsiaTheme="minorEastAsia"/>
-          <w:iCs/>
-        </w:rPr>
-        <w:t xml:space="preserve"> vagy </w:t>
-      </w:r>
-      <w:r>
-        <w:rPr>
-          <w:rFonts w:eastAsiaTheme="minorEastAsia"/>
-          <w:iCs/>
-        </w:rPr>
-        <w:t xml:space="preserve">prefix </w:t>
-      </w:r>
-      <w:proofErr w:type="spellStart"/>
-      <w:r>
-        <w:rPr>
-          <w:rFonts w:eastAsiaTheme="minorEastAsia"/>
-          <w:iCs/>
-        </w:rPr>
-        <w:t>product</w:t>
-      </w:r>
-      <w:proofErr w:type="spellEnd"/>
+        <w:t>prefix product</w:t>
+      </w:r>
       <w:r>
         <w:rPr>
           <w:rFonts w:eastAsiaTheme="minorEastAsia"/>
@@ -21854,15 +21722,13 @@
         </w:rPr>
         <w:t xml:space="preserve"> </w:t>
       </w:r>
-      <w:proofErr w:type="spellStart"/>
       <w:r>
         <w:rPr>
           <w:rFonts w:eastAsiaTheme="minorEastAsia"/>
           <w:iCs/>
         </w:rPr>
-        <w:t>Srinivasa</w:t>
-      </w:r>
-      <w:proofErr w:type="spellEnd"/>
+        <w:t>Srinivasa Ramanujan</w:t>
+      </w:r>
       <w:r>
         <w:rPr>
           <w:rFonts w:eastAsiaTheme="minorEastAsia"/>
@@ -21870,58 +21736,26 @@
         </w:rPr>
         <w:t xml:space="preserve"> </w:t>
       </w:r>
-      <w:proofErr w:type="spellStart"/>
       <w:r>
         <w:rPr>
           <w:rFonts w:eastAsiaTheme="minorEastAsia"/>
           <w:iCs/>
         </w:rPr>
-        <w:t>Ramanujan</w:t>
-      </w:r>
-      <w:proofErr w:type="spellEnd"/>
+        <w:t>inspirált</w:t>
+      </w:r>
       <w:r>
         <w:rPr>
           <w:rFonts w:eastAsiaTheme="minorEastAsia"/>
           <w:iCs/>
         </w:rPr>
-        <w:t xml:space="preserve"> </w:t>
+        <w:t>a</w:t>
       </w:r>
       <w:r>
         <w:rPr>
           <w:rFonts w:eastAsiaTheme="minorEastAsia"/>
           <w:iCs/>
         </w:rPr>
-        <w:t>inspirált</w:t>
-      </w:r>
-      <w:r>
-        <w:rPr>
-          <w:rFonts w:eastAsiaTheme="minorEastAsia"/>
-          <w:iCs/>
-        </w:rPr>
-        <w:t>a</w:t>
-      </w:r>
-      <w:r>
-        <w:rPr>
-          <w:rFonts w:eastAsiaTheme="minorEastAsia"/>
-          <w:iCs/>
-        </w:rPr>
-        <w:t xml:space="preserve">, </w:t>
-      </w:r>
-      <w:proofErr w:type="spellStart"/>
-      <w:r>
-        <w:rPr>
-          <w:rFonts w:eastAsiaTheme="minorEastAsia"/>
-          <w:iCs/>
-        </w:rPr>
-        <w:t>Chudnovsky</w:t>
-      </w:r>
-      <w:proofErr w:type="spellEnd"/>
-      <w:r>
-        <w:rPr>
-          <w:rFonts w:eastAsiaTheme="minorEastAsia"/>
-          <w:iCs/>
-        </w:rPr>
-        <w:t xml:space="preserve"> fivérek</w:t>
+        <w:t>, Chudnovsky fivérek</w:t>
       </w:r>
       <w:r>
         <w:rPr>
@@ -26558,7 +26392,25 @@
                 <w:rPr>
                   <w:rFonts w:ascii="Cambria Math" w:eastAsiaTheme="minorEastAsia" w:hAnsi="Cambria Math"/>
                 </w:rPr>
-                <m:t>13591409a+ 545140134b</m:t>
+                <m:t>13591409</m:t>
+              </m:r>
+              <m:r>
+                <w:rPr>
+                  <w:rFonts w:ascii="Cambria Math" w:eastAsiaTheme="minorEastAsia" w:hAnsi="Cambria Math"/>
+                </w:rPr>
+                <m:t>A</m:t>
+              </m:r>
+              <m:r>
+                <w:rPr>
+                  <w:rFonts w:ascii="Cambria Math" w:eastAsiaTheme="minorEastAsia" w:hAnsi="Cambria Math"/>
+                </w:rPr>
+                <m:t>+ 545140134</m:t>
+              </m:r>
+              <m:r>
+                <w:rPr>
+                  <w:rFonts w:ascii="Cambria Math" w:eastAsiaTheme="minorEastAsia" w:hAnsi="Cambria Math"/>
+                </w:rPr>
+                <m:t>B</m:t>
               </m:r>
             </m:den>
           </m:f>
@@ -30386,25 +30238,7 @@
           <w:bCs/>
           <w:iCs/>
         </w:rPr>
-        <w:t>e</w:t>
-      </w:r>
-      <w:r>
-        <w:rPr>
-          <w:rFonts w:eastAsiaTheme="minorEastAsia"/>
-          <w:b/>
-          <w:bCs/>
-          <w:iCs/>
-        </w:rPr>
-        <w:t>xponenciális függvén</w:t>
-      </w:r>
-      <w:r>
-        <w:rPr>
-          <w:rFonts w:eastAsiaTheme="minorEastAsia"/>
-          <w:b/>
-          <w:bCs/>
-          <w:iCs/>
-        </w:rPr>
-        <w:t>y</w:t>
+        <w:t>e szám</w:t>
       </w:r>
       <w:r>
         <w:rPr>
@@ -30574,21 +30408,12 @@
           <w:iCs/>
         </w:rPr>
       </w:pPr>
-      <w:proofErr w:type="spellStart"/>
       <w:r>
         <w:rPr>
           <w:rFonts w:eastAsiaTheme="minorEastAsia"/>
           <w:iCs/>
         </w:rPr>
-        <w:t>Leonhard</w:t>
-      </w:r>
-      <w:proofErr w:type="spellEnd"/>
-      <w:r>
-        <w:rPr>
-          <w:rFonts w:eastAsiaTheme="minorEastAsia"/>
-          <w:iCs/>
-        </w:rPr>
-        <w:t xml:space="preserve"> Euler bizonyította, hogy ez az érték kifejezhető a következő végtelen sor használatával:</w:t>
+        <w:t>Leonhard Euler bizonyította, hogy ez az érték kifejezhető a következő végtelen sor használatával:</w:t>
       </w:r>
     </w:p>
     <w:p>
@@ -30672,6 +30497,7 @@
       <w:pPr>
         <w:rPr>
           <w:rFonts w:eastAsiaTheme="minorEastAsia"/>
+          <w:iCs/>
         </w:rPr>
       </w:pPr>
       <w:r>
@@ -30842,6 +30668,209 @@
           <w:iCs/>
         </w:rPr>
       </w:pPr>
+    </w:p>
+    <w:p>
+      <w:pPr>
+        <w:rPr>
+          <w:rFonts w:eastAsiaTheme="minorEastAsia"/>
+        </w:rPr>
+      </w:pPr>
+      <w:r>
+        <w:rPr>
+          <w:rFonts w:eastAsiaTheme="minorEastAsia"/>
+        </w:rPr>
+        <w:t xml:space="preserve">Az </w:t>
+      </w:r>
+      <w:r>
+        <w:rPr>
+          <w:rFonts w:eastAsiaTheme="minorEastAsia"/>
+          <w:b/>
+          <w:bCs/>
+        </w:rPr>
+        <w:t>exponenciális függvény</w:t>
+      </w:r>
+      <w:r>
+        <w:rPr>
+          <w:rFonts w:eastAsiaTheme="minorEastAsia"/>
+        </w:rPr>
+        <w:t xml:space="preserve"> az e szám sorösszegének segítségével kifejezhető a következő módon:</w:t>
+      </w:r>
+    </w:p>
+    <w:p>
+      <w:pPr>
+        <w:rPr>
+          <w:rFonts w:eastAsiaTheme="minorEastAsia"/>
+          <w:iCs/>
+        </w:rPr>
+      </w:pPr>
+      <m:oMathPara>
+        <m:oMath>
+          <m:func>
+            <m:funcPr>
+              <m:ctrlPr>
+                <w:rPr>
+                  <w:rFonts w:ascii="Cambria Math" w:eastAsiaTheme="minorEastAsia" w:hAnsi="Cambria Math"/>
+                </w:rPr>
+              </m:ctrlPr>
+            </m:funcPr>
+            <m:fName>
+              <m:r>
+                <m:rPr>
+                  <m:sty m:val="p"/>
+                </m:rPr>
+                <w:rPr>
+                  <w:rFonts w:ascii="Cambria Math" w:eastAsiaTheme="minorEastAsia" w:hAnsi="Cambria Math"/>
+                </w:rPr>
+                <m:t>exp</m:t>
+              </m:r>
+            </m:fName>
+            <m:e>
+              <m:d>
+                <m:dPr>
+                  <m:ctrlPr>
+                    <w:rPr>
+                      <w:rFonts w:ascii="Cambria Math" w:eastAsiaTheme="minorEastAsia" w:hAnsi="Cambria Math"/>
+                      <w:i/>
+                    </w:rPr>
+                  </m:ctrlPr>
+                </m:dPr>
+                <m:e>
+                  <m:r>
+                    <w:rPr>
+                      <w:rFonts w:ascii="Cambria Math" w:eastAsiaTheme="minorEastAsia" w:hAnsi="Cambria Math"/>
+                    </w:rPr>
+                    <m:t>x</m:t>
+                  </m:r>
+                </m:e>
+              </m:d>
+            </m:e>
+          </m:func>
+          <m:r>
+            <w:rPr>
+              <w:rFonts w:ascii="Cambria Math" w:eastAsiaTheme="minorEastAsia" w:hAnsi="Cambria Math"/>
+            </w:rPr>
+            <m:t>=</m:t>
+          </m:r>
+          <m:sSup>
+            <m:sSupPr>
+              <m:ctrlPr>
+                <w:rPr>
+                  <w:rFonts w:ascii="Cambria Math" w:eastAsiaTheme="minorEastAsia" w:hAnsi="Cambria Math"/>
+                  <w:i/>
+                </w:rPr>
+              </m:ctrlPr>
+            </m:sSupPr>
+            <m:e>
+              <m:r>
+                <w:rPr>
+                  <w:rFonts w:ascii="Cambria Math" w:eastAsiaTheme="minorEastAsia" w:hAnsi="Cambria Math"/>
+                </w:rPr>
+                <m:t>e</m:t>
+              </m:r>
+            </m:e>
+            <m:sup>
+              <m:r>
+                <w:rPr>
+                  <w:rFonts w:ascii="Cambria Math" w:eastAsiaTheme="minorEastAsia" w:hAnsi="Cambria Math"/>
+                </w:rPr>
+                <m:t>x</m:t>
+              </m:r>
+            </m:sup>
+          </m:sSup>
+          <m:r>
+            <w:rPr>
+              <w:rFonts w:ascii="Cambria Math" w:eastAsiaTheme="minorEastAsia" w:hAnsi="Cambria Math"/>
+            </w:rPr>
+            <m:t>=</m:t>
+          </m:r>
+          <m:nary>
+            <m:naryPr>
+              <m:chr m:val="∑"/>
+              <m:limLoc m:val="undOvr"/>
+              <m:ctrlPr>
+                <w:rPr>
+                  <w:rFonts w:ascii="Cambria Math" w:eastAsiaTheme="minorEastAsia" w:hAnsi="Cambria Math"/>
+                  <w:i/>
+                  <w:iCs/>
+                </w:rPr>
+              </m:ctrlPr>
+            </m:naryPr>
+            <m:sub>
+              <m:r>
+                <w:rPr>
+                  <w:rFonts w:ascii="Cambria Math" w:eastAsiaTheme="minorEastAsia" w:hAnsi="Cambria Math"/>
+                </w:rPr>
+                <m:t>k=0</m:t>
+              </m:r>
+            </m:sub>
+            <m:sup>
+              <m:r>
+                <w:rPr>
+                  <w:rFonts w:ascii="Cambria Math" w:eastAsiaTheme="minorEastAsia" w:hAnsi="Cambria Math"/>
+                </w:rPr>
+                <m:t>∞</m:t>
+              </m:r>
+            </m:sup>
+            <m:e>
+              <m:f>
+                <m:fPr>
+                  <m:ctrlPr>
+                    <w:rPr>
+                      <w:rFonts w:ascii="Cambria Math" w:eastAsiaTheme="minorEastAsia" w:hAnsi="Cambria Math"/>
+                      <w:i/>
+                      <w:iCs/>
+                    </w:rPr>
+                  </m:ctrlPr>
+                </m:fPr>
+                <m:num>
+                  <m:sSup>
+                    <m:sSupPr>
+                      <m:ctrlPr>
+                        <w:rPr>
+                          <w:rFonts w:ascii="Cambria Math" w:eastAsiaTheme="minorEastAsia" w:hAnsi="Cambria Math"/>
+                          <w:i/>
+                        </w:rPr>
+                      </m:ctrlPr>
+                    </m:sSupPr>
+                    <m:e>
+                      <m:r>
+                        <w:rPr>
+                          <w:rFonts w:ascii="Cambria Math" w:eastAsiaTheme="minorEastAsia" w:hAnsi="Cambria Math"/>
+                        </w:rPr>
+                        <m:t>x</m:t>
+                      </m:r>
+                    </m:e>
+                    <m:sup>
+                      <m:r>
+                        <w:rPr>
+                          <w:rFonts w:ascii="Cambria Math" w:eastAsiaTheme="minorEastAsia" w:hAnsi="Cambria Math"/>
+                        </w:rPr>
+                        <m:t>k</m:t>
+                      </m:r>
+                    </m:sup>
+                  </m:sSup>
+                </m:num>
+                <m:den>
+                  <m:r>
+                    <w:rPr>
+                      <w:rFonts w:ascii="Cambria Math" w:eastAsiaTheme="minorEastAsia" w:hAnsi="Cambria Math"/>
+                    </w:rPr>
+                    <m:t>k!</m:t>
+                  </m:r>
+                </m:den>
+              </m:f>
+            </m:e>
+          </m:nary>
+        </m:oMath>
+      </m:oMathPara>
+    </w:p>
+    <w:p>
+      <w:pPr>
+        <w:rPr>
+          <w:rFonts w:eastAsiaTheme="minorEastAsia"/>
+          <w:iCs/>
+        </w:rPr>
+      </w:pPr>
       <w:r>
         <w:rPr>
           <w:rFonts w:eastAsiaTheme="minorEastAsia"/>
@@ -31113,7 +31142,6 @@
       <w:pPr>
         <w:rPr>
           <w:rFonts w:eastAsiaTheme="minorEastAsia"/>
-          <w:iCs/>
         </w:rPr>
       </w:pPr>
       <m:oMathPara>
@@ -31249,15 +31277,7 @@
         <w:t>Ez a részleg felelős a szöveg feldarabolásáért.</w:t>
       </w:r>
       <w:r>
-        <w:t xml:space="preserve"> Hogy a parser tudja, milyen formájú egységekre kell felbontani a szöveget, minden egyes számológép egy reguláris kifejezésekből álló (</w:t>
-      </w:r>
-      <w:proofErr w:type="spellStart"/>
-      <w:r>
-        <w:t>Regex</w:t>
-      </w:r>
-      <w:proofErr w:type="spellEnd"/>
-      <w:r>
-        <w:t xml:space="preserve">) listát tart fent magán belül. Ez a rendszer a leghosszabb illeszkedés elvét követi, miszerint </w:t>
+        <w:t xml:space="preserve"> Hogy a parser tudja, milyen formájú egységekre kell felbontani a szöveget, minden egyes számológép egy reguláris kifejezésekből álló (Regex) listát tart fent magán belül. Ez a rendszer a leghosszabb illeszkedés elvét követi, miszerint </w:t>
       </w:r>
       <w:r>
         <w:t>a következő vágást a sor elejétől számított leghosszabban a karaktersorozatra illeszkedő szakasz végén kell megejteni.</w:t>
@@ -31531,15 +31551,7 @@
       </w:pPr>
       <w:bookmarkStart w:id="20" w:name="_Toc224580518"/>
       <w:r>
-        <w:t>Absztrakt számológép (</w:t>
-      </w:r>
-      <w:proofErr w:type="spellStart"/>
-      <w:r>
-        <w:t>Calculator</w:t>
-      </w:r>
-      <w:proofErr w:type="spellEnd"/>
-      <w:r>
-        <w:t>)</w:t>
+        <w:t>Absztrakt számológép (Calculator)</w:t>
       </w:r>
       <w:bookmarkEnd w:id="20"/>
     </w:p>
@@ -31620,15 +31632,7 @@
         <w:jc w:val="center"/>
       </w:pPr>
       <w:r>
-        <w:t xml:space="preserve">&lt;Kép az absztrakt </w:t>
-      </w:r>
-      <w:proofErr w:type="spellStart"/>
-      <w:r>
-        <w:t>Calculator</w:t>
-      </w:r>
-      <w:proofErr w:type="spellEnd"/>
-      <w:r>
-        <w:t xml:space="preserve"> osztály kifejezésfájáról</w:t>
+        <w:t>&lt;Kép az absztrakt Calculator osztály kifejezésfájáról</w:t>
       </w:r>
       <w:r>
         <w:t xml:space="preserve"> (UML)</w:t>
@@ -31667,15 +31671,7 @@
         <w:t>Egy kifejezés legáltalánosabb leírása.</w:t>
       </w:r>
       <w:r>
-        <w:t xml:space="preserve"> Akár </w:t>
-      </w:r>
-      <w:proofErr w:type="spellStart"/>
-      <w:r>
-        <w:t>inteface</w:t>
-      </w:r>
-      <w:proofErr w:type="spellEnd"/>
-      <w:r>
-        <w:t xml:space="preserve"> is lehetne.</w:t>
+        <w:t xml:space="preserve"> Akár inteface is lehetne.</w:t>
       </w:r>
     </w:p>
     <w:p>
@@ -31695,7 +31691,6 @@
           <w:numId w:val="9"/>
         </w:numPr>
       </w:pPr>
-      <w:proofErr w:type="spellStart"/>
       <w:r>
         <w:rPr>
           <w:b/>
@@ -31703,7 +31698,6 @@
         </w:rPr>
         <w:t>ValueHolder</w:t>
       </w:r>
-      <w:proofErr w:type="spellEnd"/>
       <w:r>
         <w:t>:</w:t>
       </w:r>
@@ -31763,7 +31757,6 @@
           <w:numId w:val="9"/>
         </w:numPr>
       </w:pPr>
-      <w:proofErr w:type="spellStart"/>
       <w:r>
         <w:rPr>
           <w:b/>
@@ -31771,7 +31764,6 @@
         </w:rPr>
         <w:t>Parenthesized</w:t>
       </w:r>
-      <w:proofErr w:type="spellEnd"/>
       <w:r>
         <w:t>:</w:t>
       </w:r>
@@ -31798,7 +31790,6 @@
           <w:numId w:val="9"/>
         </w:numPr>
       </w:pPr>
-      <w:proofErr w:type="spellStart"/>
       <w:r>
         <w:rPr>
           <w:b/>
@@ -31806,7 +31797,6 @@
         </w:rPr>
         <w:t>FunctionBase</w:t>
       </w:r>
-      <w:proofErr w:type="spellEnd"/>
       <w:r>
         <w:t>:</w:t>
       </w:r>
@@ -31866,7 +31856,6 @@
           <w:numId w:val="9"/>
         </w:numPr>
       </w:pPr>
-      <w:proofErr w:type="spellStart"/>
       <w:r>
         <w:rPr>
           <w:b/>
@@ -31874,7 +31863,6 @@
         </w:rPr>
         <w:t>Function</w:t>
       </w:r>
-      <w:proofErr w:type="spellEnd"/>
       <w:r>
         <w:t>:</w:t>
       </w:r>
@@ -31943,7 +31931,6 @@
           <w:numId w:val="9"/>
         </w:numPr>
       </w:pPr>
-      <w:proofErr w:type="spellStart"/>
       <w:r>
         <w:rPr>
           <w:b/>
@@ -31951,7 +31938,6 @@
         </w:rPr>
         <w:t>Parenthesis</w:t>
       </w:r>
-      <w:proofErr w:type="spellEnd"/>
       <w:r>
         <w:t>:</w:t>
       </w:r>
@@ -31978,7 +31964,6 @@
           <w:numId w:val="9"/>
         </w:numPr>
       </w:pPr>
-      <w:proofErr w:type="spellStart"/>
       <w:r>
         <w:rPr>
           <w:b/>
@@ -31986,7 +31971,6 @@
         </w:rPr>
         <w:t>OpeningParenthesis</w:t>
       </w:r>
-      <w:proofErr w:type="spellEnd"/>
       <w:r>
         <w:t>:</w:t>
       </w:r>
@@ -32013,7 +31997,6 @@
           <w:numId w:val="9"/>
         </w:numPr>
       </w:pPr>
-      <w:proofErr w:type="spellStart"/>
       <w:r>
         <w:rPr>
           <w:b/>
@@ -32021,7 +32004,6 @@
         </w:rPr>
         <w:t>ClosingParenthesis</w:t>
       </w:r>
-      <w:proofErr w:type="spellEnd"/>
       <w:r>
         <w:t>:</w:t>
       </w:r>
@@ -32688,29 +32670,13 @@
           <w:b/>
           <w:bCs/>
         </w:rPr>
-        <w:t xml:space="preserve"> (</w:t>
-      </w:r>
-      <w:proofErr w:type="spellStart"/>
+        <w:t xml:space="preserve"> (Stack)</w:t>
+      </w:r>
       <w:r>
         <w:rPr>
           <w:b/>
           <w:bCs/>
         </w:rPr>
-        <w:t>Stack</w:t>
-      </w:r>
-      <w:proofErr w:type="spellEnd"/>
-      <w:r>
-        <w:rPr>
-          <w:b/>
-          <w:bCs/>
-        </w:rPr>
-        <w:t>)</w:t>
-      </w:r>
-      <w:r>
-        <w:rPr>
-          <w:b/>
-          <w:bCs/>
-        </w:rPr>
         <w:t xml:space="preserve"> segítségével</w:t>
       </w:r>
       <w:r>
@@ -32743,15 +32709,7 @@
         <w:t xml:space="preserve"> tetején</w:t>
       </w:r>
       <w:r>
-        <w:t xml:space="preserve"> lévő operátort is </w:t>
-      </w:r>
-      <w:proofErr w:type="spellStart"/>
-      <w:r>
-        <w:t>precedencia</w:t>
-      </w:r>
-      <w:proofErr w:type="spellEnd"/>
-      <w:r>
-        <w:t xml:space="preserve"> szerint</w:t>
+        <w:t xml:space="preserve"> lévő operátort is precedencia szerint</w:t>
       </w:r>
       <w:r>
         <w:t>:</w:t>
@@ -32794,17 +32752,8 @@
           <w:b/>
           <w:bCs/>
         </w:rPr>
-        <w:t xml:space="preserve">beolvasott operátor magasabb </w:t>
-      </w:r>
-      <w:proofErr w:type="spellStart"/>
-      <w:r>
-        <w:rPr>
-          <w:b/>
-          <w:bCs/>
-        </w:rPr>
-        <w:t>precedenciájú</w:t>
-      </w:r>
-      <w:proofErr w:type="spellEnd"/>
+        <w:t>beolvasott operátor magasabb precedenciájú</w:t>
+      </w:r>
       <w:r>
         <w:rPr>
           <w:b/>
@@ -32828,17 +32777,8 @@
           <w:b/>
           <w:bCs/>
         </w:rPr>
-        <w:t xml:space="preserve">beolvasott operátor alacsonyabb </w:t>
-      </w:r>
-      <w:proofErr w:type="spellStart"/>
-      <w:r>
-        <w:rPr>
-          <w:b/>
-          <w:bCs/>
-        </w:rPr>
-        <w:t>precedenciájú</w:t>
-      </w:r>
-      <w:proofErr w:type="spellEnd"/>
+        <w:t>beolvasott operátor alacsonyabb precedenciájú</w:t>
+      </w:r>
       <w:r>
         <w:rPr>
           <w:b/>
@@ -32913,15 +32853,7 @@
         <w:jc w:val="center"/>
       </w:pPr>
       <w:r>
-        <w:t>&lt;Struktogramm a lengyel formára alakításról (</w:t>
-      </w:r>
-      <w:proofErr w:type="spellStart"/>
-      <w:r>
-        <w:t>Orosi</w:t>
-      </w:r>
-      <w:proofErr w:type="spellEnd"/>
-      <w:r>
-        <w:t xml:space="preserve"> Feri oldala)&gt;</w:t>
+        <w:t>&lt;Struktogramm a lengyel formára alakításról (Orosi Feri oldala)&gt;</w:t>
       </w:r>
     </w:p>
     <w:p>
@@ -33027,16 +32959,11 @@
       </w:pPr>
       <w:bookmarkStart w:id="21" w:name="_Toc224580519"/>
       <w:r>
-        <w:t>Általános számológép (</w:t>
-      </w:r>
-      <w:proofErr w:type="spellStart"/>
-      <w:r>
-        <w:t>Standard</w:t>
+        <w:t>Általános számológép (Standard</w:t>
       </w:r>
       <w:r>
         <w:t>Calculator</w:t>
       </w:r>
-      <w:proofErr w:type="spellEnd"/>
       <w:r>
         <w:t>)</w:t>
       </w:r>
@@ -33123,7 +33050,6 @@
           <w:numId w:val="9"/>
         </w:numPr>
       </w:pPr>
-      <w:proofErr w:type="spellStart"/>
       <w:r>
         <w:rPr>
           <w:b/>
@@ -33131,7 +33057,6 @@
         </w:rPr>
         <w:t>Number</w:t>
       </w:r>
-      <w:proofErr w:type="spellEnd"/>
       <w:r>
         <w:t>: A racionális szám megvalósítása.</w:t>
       </w:r>
@@ -33152,7 +33077,6 @@
           <w:numId w:val="9"/>
         </w:numPr>
       </w:pPr>
-      <w:proofErr w:type="spellStart"/>
       <w:r>
         <w:rPr>
           <w:b/>
@@ -33160,7 +33084,6 @@
         </w:rPr>
         <w:t>UnaryOperator</w:t>
       </w:r>
-      <w:proofErr w:type="spellEnd"/>
       <w:r>
         <w:t>: Az egyparaméteres operátor általánosítása.</w:t>
       </w:r>
@@ -33181,7 +33104,6 @@
           <w:numId w:val="9"/>
         </w:numPr>
       </w:pPr>
-      <w:proofErr w:type="spellStart"/>
       <w:r>
         <w:rPr>
           <w:b/>
@@ -33189,7 +33111,6 @@
         </w:rPr>
         <w:t>BinaryOperator</w:t>
       </w:r>
-      <w:proofErr w:type="spellEnd"/>
       <w:r>
         <w:t>: Az kétparaméteres operátor általánosítása.</w:t>
       </w:r>
@@ -33237,7 +33158,6 @@
           <w:numId w:val="9"/>
         </w:numPr>
       </w:pPr>
-      <w:proofErr w:type="spellStart"/>
       <w:r>
         <w:rPr>
           <w:b/>
@@ -33245,7 +33165,6 @@
         </w:rPr>
         <w:t>Subtract</w:t>
       </w:r>
-      <w:proofErr w:type="spellEnd"/>
       <w:r>
         <w:t>: Az kivonás műveletének megvalósítása.</w:t>
       </w:r>
@@ -33266,7 +33185,6 @@
           <w:numId w:val="9"/>
         </w:numPr>
       </w:pPr>
-      <w:proofErr w:type="spellStart"/>
       <w:r>
         <w:rPr>
           <w:b/>
@@ -33274,7 +33192,6 @@
         </w:rPr>
         <w:t>Multiply</w:t>
       </w:r>
-      <w:proofErr w:type="spellEnd"/>
       <w:r>
         <w:t>: Az szorzás műveletének megvalósítása.</w:t>
       </w:r>
@@ -33296,7 +33213,6 @@
           <w:numId w:val="9"/>
         </w:numPr>
       </w:pPr>
-      <w:proofErr w:type="spellStart"/>
       <w:r>
         <w:rPr>
           <w:b/>
@@ -33304,7 +33220,6 @@
         </w:rPr>
         <w:t>Divide</w:t>
       </w:r>
-      <w:proofErr w:type="spellEnd"/>
       <w:r>
         <w:t>: Az osztás műveletének megvalósítása.</w:t>
       </w:r>
@@ -33325,7 +33240,6 @@
           <w:numId w:val="9"/>
         </w:numPr>
       </w:pPr>
-      <w:proofErr w:type="spellStart"/>
       <w:r>
         <w:rPr>
           <w:b/>
@@ -33333,7 +33247,6 @@
         </w:rPr>
         <w:t>Power</w:t>
       </w:r>
-      <w:proofErr w:type="spellEnd"/>
       <w:r>
         <w:t>: Az hatványozás műveletének megvalósítása.</w:t>
       </w:r>
@@ -33354,7 +33267,6 @@
           <w:numId w:val="9"/>
         </w:numPr>
       </w:pPr>
-      <w:proofErr w:type="spellStart"/>
       <w:r>
         <w:rPr>
           <w:b/>
@@ -33362,7 +33274,6 @@
         </w:rPr>
         <w:t>Root</w:t>
       </w:r>
-      <w:proofErr w:type="spellEnd"/>
       <w:r>
         <w:t>: Az gyökvonás műveletének megvalósítása.</w:t>
       </w:r>
@@ -33383,7 +33294,6 @@
           <w:numId w:val="9"/>
         </w:numPr>
       </w:pPr>
-      <w:proofErr w:type="spellStart"/>
       <w:r>
         <w:rPr>
           <w:b/>
@@ -33391,7 +33301,6 @@
         </w:rPr>
         <w:t>Abs</w:t>
       </w:r>
-      <w:proofErr w:type="spellEnd"/>
       <w:r>
         <w:t>: Az abszolútérték függvény megvalósítása.</w:t>
       </w:r>
@@ -33466,7 +33375,6 @@
           <w:numId w:val="9"/>
         </w:numPr>
       </w:pPr>
-      <w:proofErr w:type="spellStart"/>
       <w:r>
         <w:rPr>
           <w:b/>
@@ -33474,7 +33382,6 @@
         </w:rPr>
         <w:t>Floor</w:t>
       </w:r>
-      <w:proofErr w:type="spellEnd"/>
       <w:r>
         <w:t>: Az lefele kerekítés függvény megvalósítása.</w:t>
       </w:r>
@@ -33495,7 +33402,6 @@
           <w:numId w:val="9"/>
         </w:numPr>
       </w:pPr>
-      <w:proofErr w:type="spellStart"/>
       <w:r>
         <w:rPr>
           <w:b/>
@@ -33503,7 +33409,6 @@
         </w:rPr>
         <w:t>Round</w:t>
       </w:r>
-      <w:proofErr w:type="spellEnd"/>
       <w:r>
         <w:t>: Az kerekítés függvény megvalósítása.</w:t>
       </w:r>
@@ -33524,7 +33429,6 @@
           <w:numId w:val="9"/>
         </w:numPr>
       </w:pPr>
-      <w:proofErr w:type="spellStart"/>
       <w:r>
         <w:rPr>
           <w:b/>
@@ -33532,7 +33436,6 @@
         </w:rPr>
         <w:t>Ceiling</w:t>
       </w:r>
-      <w:proofErr w:type="spellEnd"/>
       <w:r>
         <w:t>: Az felfele kerekítés függvény megvalósítása.</w:t>
       </w:r>
@@ -33551,16 +33454,11 @@
       </w:pPr>
       <w:bookmarkStart w:id="22" w:name="_Toc224580520"/>
       <w:r>
-        <w:t>Euklideszi tér számológép (</w:t>
-      </w:r>
-      <w:proofErr w:type="spellStart"/>
-      <w:r>
-        <w:t>EuclideanSpace</w:t>
+        <w:t>Euklideszi tér számológép (EuclideanSpace</w:t>
       </w:r>
       <w:r>
         <w:t>Calculator</w:t>
       </w:r>
-      <w:proofErr w:type="spellEnd"/>
       <w:r>
         <w:t>)</w:t>
       </w:r>
@@ -33593,7 +33491,6 @@
           <w:numId w:val="9"/>
         </w:numPr>
       </w:pPr>
-      <w:proofErr w:type="spellStart"/>
       <w:r>
         <w:rPr>
           <w:b/>
@@ -33601,7 +33498,6 @@
         </w:rPr>
         <w:t>Matrix</w:t>
       </w:r>
-      <w:proofErr w:type="spellEnd"/>
       <w:r>
         <w:t>: Az racionális számokra kiértékelődő kifejezésekből álló mátrix megvalósítása.</w:t>
       </w:r>
@@ -33623,7 +33519,6 @@
           <w:numId w:val="9"/>
         </w:numPr>
       </w:pPr>
-      <w:proofErr w:type="spellStart"/>
       <w:r>
         <w:rPr>
           <w:b/>
@@ -33631,17 +33526,11 @@
         </w:rPr>
         <w:t>MatrixHolder</w:t>
       </w:r>
-      <w:proofErr w:type="spellEnd"/>
       <w:r>
         <w:t xml:space="preserve">: A </w:t>
       </w:r>
-      <w:proofErr w:type="spellStart"/>
-      <w:r>
-        <w:t>Matrix</w:t>
-      </w:r>
-      <w:proofErr w:type="spellEnd"/>
-      <w:r>
-        <w:t xml:space="preserve"> osztály Term típussá alakítását teszi lehetővé</w:t>
+      <w:r>
+        <w:t>Matrix osztály Term típussá alakítását teszi lehetővé</w:t>
       </w:r>
       <w:r>
         <w:t>.</w:t>
@@ -33663,7 +33552,6 @@
           <w:numId w:val="9"/>
         </w:numPr>
       </w:pPr>
-      <w:proofErr w:type="spellStart"/>
       <w:r>
         <w:rPr>
           <w:b/>
@@ -33671,7 +33559,6 @@
         </w:rPr>
         <w:t>Number</w:t>
       </w:r>
-      <w:proofErr w:type="spellEnd"/>
       <w:r>
         <w:t>: A racionális szám megvalósítása.</w:t>
       </w:r>
@@ -33692,7 +33579,6 @@
           <w:numId w:val="9"/>
         </w:numPr>
       </w:pPr>
-      <w:proofErr w:type="spellStart"/>
       <w:r>
         <w:rPr>
           <w:b/>
@@ -33700,7 +33586,6 @@
         </w:rPr>
         <w:t>BinaryOperator</w:t>
       </w:r>
-      <w:proofErr w:type="spellEnd"/>
       <w:r>
         <w:t>: Az kétparaméteres operátor általánosítása.</w:t>
       </w:r>
@@ -33748,7 +33633,6 @@
           <w:numId w:val="9"/>
         </w:numPr>
       </w:pPr>
-      <w:proofErr w:type="spellStart"/>
       <w:r>
         <w:rPr>
           <w:b/>
@@ -33756,7 +33640,6 @@
         </w:rPr>
         <w:t>Subtract</w:t>
       </w:r>
-      <w:proofErr w:type="spellEnd"/>
       <w:r>
         <w:t>: Az kivonás műveletének megvalósítása.</w:t>
       </w:r>
@@ -33777,7 +33660,6 @@
           <w:numId w:val="9"/>
         </w:numPr>
       </w:pPr>
-      <w:proofErr w:type="spellStart"/>
       <w:r>
         <w:rPr>
           <w:b/>
@@ -33785,7 +33667,6 @@
         </w:rPr>
         <w:t>Product</w:t>
       </w:r>
-      <w:proofErr w:type="spellEnd"/>
       <w:r>
         <w:t>: Az szorzás műveletének megvalósítása.</w:t>
       </w:r>
@@ -33804,16 +33685,11 @@
       </w:pPr>
       <w:bookmarkStart w:id="23" w:name="_Toc224580521"/>
       <w:r>
-        <w:t>Polinom számológép (</w:t>
-      </w:r>
-      <w:proofErr w:type="spellStart"/>
-      <w:r>
-        <w:t>Polynomials</w:t>
+        <w:t>Polinom számológép (Polynomials</w:t>
       </w:r>
       <w:r>
         <w:t>Calculator</w:t>
       </w:r>
-      <w:proofErr w:type="spellEnd"/>
       <w:r>
         <w:t>)</w:t>
       </w:r>
@@ -33825,16 +33701,11 @@
       </w:pPr>
       <w:bookmarkStart w:id="24" w:name="_Toc224580522"/>
       <w:r>
-        <w:t>Integrálközelítés számológép (</w:t>
-      </w:r>
-      <w:proofErr w:type="spellStart"/>
-      <w:r>
-        <w:t>Integral</w:t>
+        <w:t>Integrálközelítés számológép (Integral</w:t>
       </w:r>
       <w:r>
         <w:t>Calculator</w:t>
       </w:r>
-      <w:proofErr w:type="spellEnd"/>
       <w:r>
         <w:t>)</w:t>
       </w:r>
@@ -33955,10 +33826,32 @@
         <w:pStyle w:val="Cmsor3"/>
       </w:pPr>
       <w:r>
-        <w:t>Hatékonyabb algoritmusok használata</w:t>
-      </w:r>
-    </w:p>
-    <w:p/>
+        <w:t>Hatékonyabb</w:t>
+      </w:r>
+      <w:r>
+        <w:t xml:space="preserve"> szorzás</w:t>
+      </w:r>
+      <w:r>
+        <w:t xml:space="preserve"> algoritmus használata</w:t>
+      </w:r>
+    </w:p>
+    <w:p>
+      <w:r>
+        <w:t>Egész számok szorzása</w:t>
+      </w:r>
+      <w:r>
+        <w:t xml:space="preserve"> esetén lehetőségünk nyílik rá, hogy</w:t>
+      </w:r>
+      <w:r>
+        <w:t xml:space="preserve"> gyors Fourier-transzformáció segítségével</w:t>
+      </w:r>
+      <w:r>
+        <w:t xml:space="preserve"> lecsökkentsük a nagy számok okozta magas számításigényt.</w:t>
+      </w:r>
+      <w:r>
+        <w:t xml:space="preserve"> Mivel az egész számokkal való szorzást valójában majdnem minden számtípus alkalmazza, így az egész könyvtár számításigényére nagy hatással lenne.</w:t>
+      </w:r>
+    </w:p>
     <w:p>
       <w:pPr>
         <w:pStyle w:val="Cmsor2"/>
@@ -33968,6 +33861,44 @@
         <w:t>Bővítmények</w:t>
       </w:r>
       <w:bookmarkEnd w:id="29"/>
+    </w:p>
+    <w:p>
+      <w:pPr>
+        <w:pStyle w:val="Cmsor3"/>
+      </w:pPr>
+      <w:r>
+        <w:t>Memória és előzmények elérésének támogatása</w:t>
+      </w:r>
+    </w:p>
+    <w:p>
+      <w:r>
+        <w:t>Manapság már természetesnek vehető, hogy egy jó számológép tartalmazza a memória funkciót, ami lehetőséget biztosít rá, hogy részszámításokat össze tudjunk adni és ezt a gép egy külön változóban tárolja le későbbi használatra.</w:t>
+      </w:r>
+    </w:p>
+    <w:p>
+      <w:r>
+        <w:lastRenderedPageBreak/>
+        <w:t>Mivel a dolgozat témája nem egy közhasználati szoftver lefejlesztése és az ergonómia elveire való szigorú támaszkodás, ezért ez a verzió még nem támogatja ezt a funkciót.</w:t>
+      </w:r>
+    </w:p>
+    <w:p>
+      <w:pPr>
+        <w:pStyle w:val="Cmsor3"/>
+      </w:pPr>
+      <w:r>
+        <w:t>Komplex számok bevezetése</w:t>
+      </w:r>
+    </w:p>
+    <w:p>
+      <w:r>
+        <w:t>Az egyedüli ok amiért jelenleg nem támogatott a típus, hogy</w:t>
+      </w:r>
+      <w:r>
+        <w:t xml:space="preserve"> nincs benne a dolgozat témájában és</w:t>
+      </w:r>
+      <w:r>
+        <w:t xml:space="preserve"> extra összetettséget okozna a hatványozás műveletének implementálása. Minden más egyszerűen megoldható az eddig megalkotott műveletekkel.</w:t>
+      </w:r>
     </w:p>
     <w:p>
       <w:pPr>
@@ -33996,21 +33927,14 @@
       <w:r>
         <w:t>Még több interpolációs eljárás implementálása és a köztük való váltás támogatása (</w:t>
       </w:r>
-      <w:proofErr w:type="spellStart"/>
       <w:r>
         <w:t>Hermite</w:t>
       </w:r>
-      <w:proofErr w:type="spellEnd"/>
       <w:r>
         <w:t xml:space="preserve">, </w:t>
       </w:r>
-      <w:proofErr w:type="spellStart"/>
-      <w:r>
-        <w:t>Catmull</w:t>
-      </w:r>
-      <w:proofErr w:type="spellEnd"/>
-      <w:r>
-        <w:t>-Rom</w:t>
+      <w:r>
+        <w:t>Catmull-Rom</w:t>
       </w:r>
       <w:r>
         <w:t>,</w:t>
@@ -34019,15 +33943,7 @@
         <w:t xml:space="preserve"> </w:t>
       </w:r>
       <w:r>
-        <w:t>B-</w:t>
-      </w:r>
-      <w:proofErr w:type="spellStart"/>
-      <w:r>
-        <w:t>spline</w:t>
-      </w:r>
-      <w:proofErr w:type="spellEnd"/>
-      <w:r>
-        <w:t>)</w:t>
+        <w:t>B-spline)</w:t>
       </w:r>
     </w:p>
     <w:p>
@@ -34051,7 +33967,6 @@
         </w:numPr>
       </w:pPr>
       <w:r>
-        <w:lastRenderedPageBreak/>
         <w:t>Euklideszi algoritmus hozzáadása a vizuális számológéphez, mivel az alap könyvtár már úgy is tartalmazza</w:t>
       </w:r>
     </w:p>
@@ -34064,10 +33979,7 @@
         </w:numPr>
       </w:pPr>
       <w:r>
-        <w:t xml:space="preserve">Gauss-Jordan elimináció </w:t>
-      </w:r>
-      <w:r>
-        <w:t>hozzáadása a vizuális számológéphez, mivel az alap könyvtár már úgy is tartalmazza</w:t>
+        <w:t>Gauss-Jordan elimináció hozzáadása a vizuális számológéphez, mivel az alap könyvtár már úgy is tartalmazza</w:t>
       </w:r>
     </w:p>
     <w:p>
@@ -34100,8 +34012,9 @@
       <w:r>
         <w:t>Nagy segítséget nyújthatna az interpoláció elvégzése után, ha egy gomb megnyomásával már láthatná is a felhasználó a kapott függvényt. Így több információhoz juthatna mit, hogy tudja hogy valahogy átmegy a kért pontokon.</w:t>
       </w:r>
-    </w:p>
-    <w:p>
+      <w:r>
+        <w:t xml:space="preserve"> </w:t>
+      </w:r>
       <w:r>
         <w:t>Az ablak akár állítható is lehetne a görgő és az egér mozgatásával, hogy éppen milyen értékek közt szeretné a felhasználó szemügyre venni a görbét.</w:t>
       </w:r>
@@ -34128,13 +34041,6 @@
       <w:r>
         <w:t>Azt a kevés energiát tekintve, amit egy többnyelvűsítés igényelne, nyugodtan bele lehetne venni a programba. Más szemszögből pedig, mivel manapság már az angol nyelv ilyen szintű ismerete szinte alapvetőnek vehető, alacsony prioritású fejlesztésnek vehető.</w:t>
       </w:r>
-    </w:p>
-    <w:p>
-      <w:pPr>
-        <w:spacing w:line="259" w:lineRule="auto"/>
-        <w:ind w:firstLine="0"/>
-        <w:jc w:val="left"/>
-      </w:pPr>
       <w:r>
         <w:br w:type="page"/>
       </w:r>
@@ -35671,7 +35577,7 @@
   <w:abstractNum w:abstractNumId="12" w15:restartNumberingAfterBreak="0">
     <w:nsid w:val="6D982FAC"/>
     <w:multiLevelType w:val="hybridMultilevel"/>
-    <w:tmpl w:val="D8280CA6"/>
+    <w:tmpl w:val="E4180BF8"/>
     <w:lvl w:ilvl="0" w:tplc="040E0001">
       <w:start w:val="1"/>
       <w:numFmt w:val="bullet"/>
@@ -36679,7 +36585,7 @@
   <w:style w:type="paragraph" w:default="1" w:styleId="Norml">
     <w:name w:val="Normal"/>
     <w:qFormat/>
-    <w:rsid w:val="00556201"/>
+    <w:rsid w:val="00AB1C83"/>
     <w:pPr>
       <w:spacing w:line="360" w:lineRule="auto"/>
       <w:ind w:firstLine="227"/>
@@ -36889,6 +36795,7 @@
   <w:style w:type="character" w:default="1" w:styleId="Bekezdsalapbettpusa">
     <w:name w:val="Default Paragraph Font"/>
     <w:uiPriority w:val="1"/>
+    <w:semiHidden/>
     <w:unhideWhenUsed/>
   </w:style>
   <w:style w:type="table" w:default="1" w:styleId="Normltblzat">

</xml_diff>